<commit_message>
dodanie diagramu przypadków urzycia
</commit_message>
<xml_diff>
--- a/Downloads/ProjektIO/Projekt IO.docx
+++ b/Downloads/ProjektIO/Projekt IO.docx
@@ -1,7 +1,12 @@
 
 <file path=word/document.xml><?xml version="1.0" encoding="utf-8"?>
-<w:document xmlns:wpc="http://schemas.microsoft.com/office/word/2010/wordprocessingCanvas" xmlns:cx="http://schemas.microsoft.com/office/drawing/2014/chartex" xmlns:cx1="http://schemas.microsoft.com/office/drawing/2015/9/8/chartex" xmlns:cx2="http://schemas.microsoft.com/office/drawing/2015/10/21/chartex" xmlns:cx3="http://schemas.microsoft.com/office/drawing/2016/5/9/chartex" xmlns:cx4="http://schemas.microsoft.com/office/drawing/2016/5/10/chartex" xmlns:cx5="http://schemas.microsoft.com/office/drawing/2016/5/11/chartex" xmlns:cx6="http://schemas.microsoft.com/office/drawing/2016/5/12/chartex" xmlns:cx7="http://schemas.microsoft.com/office/drawing/2016/5/13/chartex" xmlns:cx8="http://schemas.microsoft.com/office/drawing/2016/5/14/chartex" xmlns:mc="http://schemas.openxmlformats.org/markup-compatibility/2006" xmlns:aink="http://schemas.microsoft.com/office/drawing/2016/ink" xmlns:am3d="http://schemas.microsoft.com/office/drawing/2017/model3d" xmlns:o="urn:schemas-microsoft-com:office:office" xmlns:oel="http://schemas.microsoft.com/office/2019/extlst" xmlns:r="http://schemas.openxmlformats.org/officeDocument/2006/relationships" xmlns:m="http://schemas.openxmlformats.org/officeDocument/2006/math" xmlns:v="urn:schemas-microsoft-com:vml" xmlns:wp14="http://schemas.microsoft.com/office/word/2010/wordprocessingDrawing" xmlns:wp="http://schemas.openxmlformats.org/drawingml/2006/wordprocessingDrawing" xmlns:w10="urn:schemas-microsoft-com:office:word" xmlns:w="http://schemas.openxmlformats.org/wordprocessingml/2006/main" xmlns:w14="http://schemas.microsoft.com/office/word/2010/wordml" xmlns:w15="http://schemas.microsoft.com/office/word/2012/wordml" xmlns:w16cex="http://schemas.microsoft.com/office/word/2018/wordml/cex" xmlns:w16cid="http://schemas.microsoft.com/office/word/2016/wordml/cid" xmlns:w16="http://schemas.microsoft.com/office/word/2018/wordml" xmlns:w16du="http://schemas.microsoft.com/office/word/2023/wordml/word16du" xmlns:w16sdtdh="http://schemas.microsoft.com/office/word/2020/wordml/sdtdatahash" xmlns:w16sdtfl="http://schemas.microsoft.com/office/word/2024/wordml/sdtformatlock" xmlns:w16se="http://schemas.microsoft.com/office/word/2015/wordml/symex" xmlns:wpg="http://schemas.microsoft.com/office/word/2010/wordprocessingGroup" xmlns:wpi="http://schemas.microsoft.com/office/word/2010/wordprocessingInk" xmlns:wne="http://schemas.microsoft.com/office/word/2006/wordml" xmlns:wps="http://schemas.microsoft.com/office/word/2010/wordprocessingShape" mc:Ignorable="w14 w15 w16se w16cid w16 w16cex w16sdtdh w16sdtfl w16du wp14">
+<w:document xmlns:wpc="http://schemas.microsoft.com/office/word/2010/wordprocessingCanvas" xmlns:cx="http://schemas.microsoft.com/office/drawing/2014/chartex" xmlns:cx1="http://schemas.microsoft.com/office/drawing/2015/9/8/chartex" xmlns:cx2="http://schemas.microsoft.com/office/drawing/2015/10/21/chartex" xmlns:cx3="http://schemas.microsoft.com/office/drawing/2016/5/9/chartex" xmlns:cx4="http://schemas.microsoft.com/office/drawing/2016/5/10/chartex" xmlns:cx5="http://schemas.microsoft.com/office/drawing/2016/5/11/chartex" xmlns:cx6="http://schemas.microsoft.com/office/drawing/2016/5/12/chartex" xmlns:cx7="http://schemas.microsoft.com/office/drawing/2016/5/13/chartex" xmlns:cx8="http://schemas.microsoft.com/office/drawing/2016/5/14/chartex" xmlns:mc="http://schemas.openxmlformats.org/markup-compatibility/2006" xmlns:aink="http://schemas.microsoft.com/office/drawing/2016/ink" xmlns:am3d="http://schemas.microsoft.com/office/drawing/2017/model3d" xmlns:o="urn:schemas-microsoft-com:office:office" xmlns:oel="http://schemas.microsoft.com/office/2019/extlst" xmlns:r="http://schemas.openxmlformats.org/officeDocument/2006/relationships" xmlns:m="http://schemas.openxmlformats.org/officeDocument/2006/math" xmlns:v="urn:schemas-microsoft-com:vml" xmlns:wp14="http://schemas.microsoft.com/office/word/2010/wordprocessingDrawing" xmlns:wp="http://schemas.openxmlformats.org/drawingml/2006/wordprocessingDrawing" xmlns:w10="urn:schemas-microsoft-com:office:word" xmlns:w="http://schemas.openxmlformats.org/wordprocessingml/2006/main" xmlns:w14="http://schemas.microsoft.com/office/word/2010/wordml" xmlns:w15="http://schemas.microsoft.com/office/word/2012/wordml" xmlns:w16cex="http://schemas.microsoft.com/office/word/2018/wordml/cex" xmlns:w16cid="http://schemas.microsoft.com/office/word/2016/wordml/cid" xmlns:w16="http://schemas.microsoft.com/office/word/2018/wordml" xmlns:w16du="http://schemas.microsoft.com/office/word/2023/wordml/word16du" xmlns:w16sdtdh="http://schemas.microsoft.com/office/word/2020/wordml/sdtdatahash" xmlns:w16sdtfl="http://schemas.microsoft.com/office/word/2024/wordml/sdtformatlock" xmlns:w16se="http://schemas.microsoft.com/office/word/2015/wordml/symex" xmlns:wpg="http://schemas.microsoft.com/office/word/2010/wordprocessingGroup" xmlns:wpi="http://schemas.microsoft.com/office/word/2010/wordprocessingInk" xmlns:wne="http://schemas.microsoft.com/office/word/2006/wordml" xmlns:wps="http://schemas.microsoft.com/office/word/2010/wordprocessingShape" xmlns:a="http://schemas.openxmlformats.org/drawingml/2006/main" xmlns:pic="http://schemas.openxmlformats.org/drawingml/2006/picture" xmlns:a14="http://schemas.microsoft.com/office/drawing/2010/main" mc:Ignorable="w14 w15 w16se w16cid w16 w16cex w16sdtdh w16sdtfl w16du wp14">
   <w:body>
+    <w:p>
+      <w:pPr>
+        <w:jc w:val="center"/>
+      </w:pPr>
+    </w:p>
     <w:p>
       <w:pPr>
         <w:jc w:val="center"/>
@@ -16,6 +21,66 @@
         <w:keepNext w:val="0"/>
         <w:keepLines w:val="0"/>
         <w:spacing w:after="80"/>
+        <w:rPr>
+          <w:b w:val="1"/>
+          <w:bCs w:val="1"/>
+          <w:color w:val="000000"/>
+          <w:sz w:val="26"/>
+          <w:szCs w:val="26"/>
+        </w:rPr>
+      </w:pPr>
+      <w:r>
+        <w:rPr>
+          <w:b w:val="1"/>
+          <w:bCs w:val="1"/>
+          <w:sz w:val="34"/>
+          <w:szCs w:val="34"/>
+        </w:rPr>
+        <w:t>2</w:t>
+      </w:r>
+      <w:r>
+        <w:rPr>
+          <w:b w:val="1"/>
+          <w:bCs w:val="1"/>
+          <w:sz w:val="34"/>
+          <w:szCs w:val="34"/>
+        </w:rPr>
+        <w:t>. Cel, zakres i kontekst systemu</w:t>
+      </w:r>
+      <w:r>
+        <w:rPr>
+          <w:b/>
+          <w:bCs/>
+          <w:sz w:val="34"/>
+          <w:szCs w:val="34"/>
+        </w:rPr>
+        <w:t>1. Cel, zakres i kontekst systemu</w:t>
+      </w:r>
+    </w:p>
+    <w:p>
+      <w:pPr>
+        <w:spacing w:before="240" w:after="240"/>
+      </w:pPr>
+      <w:r>
+        <w:t xml:space="preserve">Głównym celem jest </w:t>
+      </w:r>
+      <w:r>
+        <w:rPr>
+          <w:b/>
+          <w:bCs/>
+        </w:rPr>
+        <w:t>cyfryzacja i automatyzacja procesów operacyjnych strzelnicy</w:t>
+      </w:r>
+      <w:r>
+        <w:t>, co ma prowadzić do skrócenia czasu obsługi klienta, optymalizacji zarządzania zasobami (broń, amunicja) oraz zwiększenia zaangażowania użytkowników poprzez udostępnienie im ich statystyk treningowych.</w:t>
+      </w:r>
+    </w:p>
+    <w:p>
+      <w:pPr>
+        <w:pStyle w:val="Nagwek3"/>
+        <w:keepNext w:val="0"/>
+        <w:keepLines w:val="0"/>
+        <w:spacing w:before="280"/>
         <w:rPr>
           <w:b/>
           <w:bCs/>
@@ -24,42 +89,9 @@
           <w:szCs w:val="26"/>
         </w:rPr>
       </w:pPr>
-      <w:bookmarkStart w:id="0" w:name="_2qddhcz8vdgh" w:colFirst="0" w:colLast="0"/>
-      <w:bookmarkEnd w:id="0"/>
-      <w:r>
-        <w:rPr>
-          <w:b/>
-          <w:bCs/>
-          <w:sz w:val="34"/>
-          <w:szCs w:val="34"/>
-        </w:rPr>
-        <w:t>1. Cel, zakres i kontekst systemu</w:t>
-      </w:r>
-    </w:p>
-    <w:p>
-      <w:pPr>
-        <w:spacing w:before="240" w:after="240"/>
-      </w:pPr>
-      <w:r>
-        <w:t xml:space="preserve">Głównym celem jest </w:t>
-      </w:r>
-      <w:r>
-        <w:rPr>
-          <w:b/>
-          <w:bCs/>
-        </w:rPr>
-        <w:t>cyfryzacja i automatyzacja procesów operacyjnych strzelnicy</w:t>
-      </w:r>
-      <w:r>
-        <w:t>, co ma prowadzić do skrócenia czasu obsługi klienta, optymalizacji zarządzania zasobami (broń, amunicja) oraz zwiększenia zaangażowania użytkowników poprzez udostępnienie im ich statystyk treningowych.</w:t>
-      </w:r>
-    </w:p>
-    <w:p>
-      <w:pPr>
-        <w:pStyle w:val="Nagwek3"/>
-        <w:keepNext w:val="0"/>
-        <w:keepLines w:val="0"/>
-        <w:spacing w:before="280"/>
+      <w:bookmarkStart w:name="_pi2c812ikv4c" w:colFirst="0" w:colLast="0" w:id="1"/>
+      <w:bookmarkEnd w:id="1"/>
+      <w:r>
         <w:rPr>
           <w:b/>
           <w:bCs/>
@@ -67,10 +99,33 @@
           <w:sz w:val="26"/>
           <w:szCs w:val="26"/>
         </w:rPr>
-      </w:pPr>
-      <w:bookmarkStart w:id="1" w:name="_pi2c812ikv4c" w:colFirst="0" w:colLast="0"/>
-      <w:bookmarkEnd w:id="1"/>
-      <w:r>
+        <w:t>Cel projektu</w:t>
+      </w:r>
+    </w:p>
+    <w:p>
+      <w:pPr>
+        <w:spacing w:before="240" w:after="240"/>
+      </w:pPr>
+      <w:r>
+        <w:t xml:space="preserve">Głównym celem jest </w:t>
+      </w:r>
+      <w:r>
+        <w:rPr>
+          <w:b/>
+          <w:bCs/>
+        </w:rPr>
+        <w:t>cyfryzacja i automatyzacja procesów operacyjnych strzelnicy</w:t>
+      </w:r>
+      <w:r>
+        <w:t>, co ma prowadzić do skrócenia czasu obsługi klienta, optymalizacji zarządzania zasobami (broń, amunicja) oraz zwiększenia zaangażowania użytkowników poprzez udostępnienie im ich statystyk treningowych.</w:t>
+      </w:r>
+    </w:p>
+    <w:p>
+      <w:pPr>
+        <w:pStyle w:val="Nagwek3"/>
+        <w:keepNext w:val="0"/>
+        <w:keepLines w:val="0"/>
+        <w:spacing w:before="280"/>
         <w:rPr>
           <w:b/>
           <w:bCs/>
@@ -78,33 +133,10 @@
           <w:sz w:val="26"/>
           <w:szCs w:val="26"/>
         </w:rPr>
-        <w:t>Cel projektu</w:t>
-      </w:r>
-    </w:p>
-    <w:p>
-      <w:pPr>
-        <w:spacing w:before="240" w:after="240"/>
-      </w:pPr>
-      <w:r>
-        <w:t xml:space="preserve">Głównym celem jest </w:t>
-      </w:r>
-      <w:r>
-        <w:rPr>
-          <w:b/>
-          <w:bCs/>
-        </w:rPr>
-        <w:t>cyfryzacja i automatyzacja procesów operacyjnych strzelnicy</w:t>
-      </w:r>
-      <w:r>
-        <w:t>, co ma prowadzić do skrócenia czasu obsługi klienta, optymalizacji zarządzania zasobami (broń, amunicja) oraz zwiększenia zaangażowania użytkowników poprzez udostępnienie im ich statystyk treningowych.</w:t>
-      </w:r>
-    </w:p>
-    <w:p>
-      <w:pPr>
-        <w:pStyle w:val="Nagwek3"/>
-        <w:keepNext w:val="0"/>
-        <w:keepLines w:val="0"/>
-        <w:spacing w:before="280"/>
+      </w:pPr>
+      <w:bookmarkStart w:name="_xn7v3pcdbd1p" w:colFirst="0" w:colLast="0" w:id="2"/>
+      <w:bookmarkEnd w:id="2"/>
+      <w:r>
         <w:rPr>
           <w:b/>
           <w:bCs/>
@@ -112,10 +144,79 @@
           <w:sz w:val="26"/>
           <w:szCs w:val="26"/>
         </w:rPr>
-      </w:pPr>
-      <w:bookmarkStart w:id="2" w:name="_xn7v3pcdbd1p" w:colFirst="0" w:colLast="0"/>
-      <w:bookmarkEnd w:id="2"/>
-      <w:r>
+        <w:t>Zakres systemu</w:t>
+      </w:r>
+    </w:p>
+    <w:p>
+      <w:pPr>
+        <w:spacing w:before="240" w:after="240"/>
+      </w:pPr>
+      <w:r>
+        <w:t>System obejmuje trzy kluczowe obszary:</w:t>
+      </w:r>
+    </w:p>
+    <w:p>
+      <w:pPr>
+        <w:numPr>
+          <w:ilvl w:val="0"/>
+          <w:numId w:val="2"/>
+        </w:numPr>
+        <w:spacing w:before="240"/>
+      </w:pPr>
+      <w:r>
+        <w:rPr>
+          <w:b/>
+          <w:bCs/>
+        </w:rPr>
+        <w:t>Zarządzanie zasobami (ERP):</w:t>
+      </w:r>
+      <w:r>
+        <w:t xml:space="preserve"> Ewidencja jednostek broni, monitorowanie stanów amunicji i automatyczne powiadomienia o serwisowaniu.</w:t>
+      </w:r>
+    </w:p>
+    <w:p>
+      <w:pPr>
+        <w:numPr>
+          <w:ilvl w:val="0"/>
+          <w:numId w:val="2"/>
+        </w:numPr>
+      </w:pPr>
+      <w:r>
+        <w:rPr>
+          <w:b/>
+          <w:bCs/>
+        </w:rPr>
+        <w:t>Obsługa klienta (CRM/Booking):</w:t>
+      </w:r>
+      <w:r>
+        <w:t xml:space="preserve"> System rezerwacji online, weryfikacja tożsamości na miejscu oraz panel osobisty strzelca.</w:t>
+      </w:r>
+    </w:p>
+    <w:p>
+      <w:pPr>
+        <w:numPr>
+          <w:ilvl w:val="0"/>
+          <w:numId w:val="2"/>
+        </w:numPr>
+        <w:spacing w:after="240"/>
+      </w:pPr>
+      <w:r>
+        <w:rPr>
+          <w:b/>
+          <w:bCs/>
+        </w:rPr>
+        <w:t>Analityka i bezpieczeństwo:</w:t>
+      </w:r>
+      <w:r>
+        <w:t xml:space="preserve"> Generowanie obowiązkowych rejestrów strzelań oraz zbieranie danych o postępach (celność, historia wizyt).</w:t>
+      </w:r>
+    </w:p>
+    <w:p>
+      <w:pPr>
+        <w:pStyle w:val="Nagwek3"/>
+        <w:keepNext w:val="0"/>
+        <w:keepLines w:val="0"/>
+        <w:spacing w:before="280"/>
         <w:rPr>
           <w:b/>
           <w:bCs/>
@@ -123,79 +224,10 @@
           <w:sz w:val="26"/>
           <w:szCs w:val="26"/>
         </w:rPr>
-        <w:t>Zakres systemu</w:t>
-      </w:r>
-    </w:p>
-    <w:p>
-      <w:pPr>
-        <w:spacing w:before="240" w:after="240"/>
-      </w:pPr>
-      <w:r>
-        <w:t>System obejmuje trzy kluczowe obszary:</w:t>
-      </w:r>
-    </w:p>
-    <w:p>
-      <w:pPr>
-        <w:numPr>
-          <w:ilvl w:val="0"/>
-          <w:numId w:val="2"/>
-        </w:numPr>
-        <w:spacing w:before="240"/>
-      </w:pPr>
-      <w:r>
-        <w:rPr>
-          <w:b/>
-          <w:bCs/>
-        </w:rPr>
-        <w:t>Zarządzanie zasobami (ERP):</w:t>
-      </w:r>
-      <w:r>
-        <w:t xml:space="preserve"> Ewidencja jednostek broni, monitorowanie stanów amunicji i automatyczne powiadomienia o serwisowaniu.</w:t>
-      </w:r>
-    </w:p>
-    <w:p>
-      <w:pPr>
-        <w:numPr>
-          <w:ilvl w:val="0"/>
-          <w:numId w:val="2"/>
-        </w:numPr>
-      </w:pPr>
-      <w:r>
-        <w:rPr>
-          <w:b/>
-          <w:bCs/>
-        </w:rPr>
-        <w:t>Obsługa klienta (CRM/Booking):</w:t>
-      </w:r>
-      <w:r>
-        <w:t xml:space="preserve"> System rezerwacji online, weryfikacja tożsamości na miejscu oraz panel osobisty strzelca.</w:t>
-      </w:r>
-    </w:p>
-    <w:p>
-      <w:pPr>
-        <w:numPr>
-          <w:ilvl w:val="0"/>
-          <w:numId w:val="2"/>
-        </w:numPr>
-        <w:spacing w:after="240"/>
-      </w:pPr>
-      <w:r>
-        <w:rPr>
-          <w:b/>
-          <w:bCs/>
-        </w:rPr>
-        <w:t>Analityka i bezpieczeństwo:</w:t>
-      </w:r>
-      <w:r>
-        <w:t xml:space="preserve"> Generowanie obowiązkowych rejestrów strzelań oraz zbieranie danych o postępach (celność, historia wizyt).</w:t>
-      </w:r>
-    </w:p>
-    <w:p>
-      <w:pPr>
-        <w:pStyle w:val="Nagwek3"/>
-        <w:keepNext w:val="0"/>
-        <w:keepLines w:val="0"/>
-        <w:spacing w:before="280"/>
+      </w:pPr>
+      <w:bookmarkStart w:name="_kw3qfs4blvtt" w:colFirst="0" w:colLast="0" w:id="3"/>
+      <w:bookmarkEnd w:id="3"/>
+      <w:r>
         <w:rPr>
           <w:b/>
           <w:bCs/>
@@ -203,10 +235,68 @@
           <w:sz w:val="26"/>
           <w:szCs w:val="26"/>
         </w:rPr>
-      </w:pPr>
-      <w:bookmarkStart w:id="3" w:name="_kw3qfs4blvtt" w:colFirst="0" w:colLast="0"/>
-      <w:bookmarkEnd w:id="3"/>
-      <w:r>
+        <w:t>Kontekst</w:t>
+      </w:r>
+    </w:p>
+    <w:p>
+      <w:pPr>
+        <w:spacing w:before="240" w:after="240"/>
+      </w:pPr>
+      <w:r>
+        <w:t xml:space="preserve">System funkcjonuje w środowisku o zaostrzonych rygorach prawnych (wymóg ewidencji osób i zużycia amunicji). (mobile/web), </w:t>
+      </w:r>
+      <w:r>
+        <w:rPr>
+          <w:b/>
+          <w:bCs/>
+        </w:rPr>
+        <w:t>Instruktora</w:t>
+      </w:r>
+      <w:r>
+        <w:t xml:space="preserve"> (tablet/terminal na osi) oraz </w:t>
+      </w:r>
+      <w:r>
+        <w:rPr>
+          <w:b/>
+          <w:bCs/>
+        </w:rPr>
+        <w:t>Właściciela/Admina</w:t>
+      </w:r>
+      <w:r>
+        <w:t xml:space="preserve"> (zarządzanie biznesem). </w:t>
+      </w:r>
+    </w:p>
+    <w:p>
+      <w:pPr>
+        <w:pStyle w:val="Nagwek2"/>
+        <w:keepNext w:val="0"/>
+        <w:keepLines w:val="0"/>
+        <w:spacing w:after="80"/>
+        <w:rPr>
+          <w:b/>
+          <w:bCs/>
+          <w:sz w:val="34"/>
+          <w:szCs w:val="34"/>
+        </w:rPr>
+      </w:pPr>
+      <w:bookmarkStart w:name="_fanm5vcgg4zd" w:colFirst="0" w:colLast="0" w:id="4"/>
+      <w:bookmarkEnd w:id="4"/>
+      <w:r>
+        <w:rPr>
+          <w:b/>
+          <w:bCs/>
+          <w:sz w:val="34"/>
+          <w:szCs w:val="34"/>
+        </w:rPr>
+        <w:t>2. Przewidywane korzyści z wdrożenia</w:t>
+      </w:r>
+    </w:p>
+    <w:p>
+      <w:pPr>
+        <w:pStyle w:val="Nagwek3"/>
+        <w:keepNext w:val="0"/>
+        <w:keepLines w:val="0"/>
+        <w:spacing w:before="280"/>
         <w:rPr>
           <w:b/>
           <w:bCs/>
@@ -214,68 +304,10 @@
           <w:sz w:val="26"/>
           <w:szCs w:val="26"/>
         </w:rPr>
-        <w:t>Kontekst</w:t>
-      </w:r>
-    </w:p>
-    <w:p>
-      <w:pPr>
-        <w:spacing w:before="240" w:after="240"/>
-      </w:pPr>
-      <w:r>
-        <w:t xml:space="preserve">System funkcjonuje w środowisku o zaostrzonych rygorach prawnych (wymóg ewidencji osób i zużycia amunicji). (mobile/web), </w:t>
-      </w:r>
-      <w:r>
-        <w:rPr>
-          <w:b/>
-          <w:bCs/>
-        </w:rPr>
-        <w:t>Instruktora</w:t>
-      </w:r>
-      <w:r>
-        <w:t xml:space="preserve"> (tablet/terminal na osi) oraz </w:t>
-      </w:r>
-      <w:r>
-        <w:rPr>
-          <w:b/>
-          <w:bCs/>
-        </w:rPr>
-        <w:t>Właściciela/Admina</w:t>
-      </w:r>
-      <w:r>
-        <w:t xml:space="preserve"> (zarządzanie biznesem). </w:t>
-      </w:r>
-    </w:p>
-    <w:p>
-      <w:pPr>
-        <w:pStyle w:val="Nagwek2"/>
-        <w:keepNext w:val="0"/>
-        <w:keepLines w:val="0"/>
-        <w:spacing w:after="80"/>
-        <w:rPr>
-          <w:b/>
-          <w:bCs/>
-          <w:sz w:val="34"/>
-          <w:szCs w:val="34"/>
-        </w:rPr>
-      </w:pPr>
-      <w:bookmarkStart w:id="4" w:name="_fanm5vcgg4zd" w:colFirst="0" w:colLast="0"/>
-      <w:bookmarkEnd w:id="4"/>
-      <w:r>
-        <w:rPr>
-          <w:b/>
-          <w:bCs/>
-          <w:sz w:val="34"/>
-          <w:szCs w:val="34"/>
-        </w:rPr>
-        <w:t>2. Przewidywane korzyści z wdrożenia</w:t>
-      </w:r>
-    </w:p>
-    <w:p>
-      <w:pPr>
-        <w:pStyle w:val="Nagwek3"/>
-        <w:keepNext w:val="0"/>
-        <w:keepLines w:val="0"/>
-        <w:spacing w:before="280"/>
+      </w:pPr>
+      <w:bookmarkStart w:name="_25uwo9o5o2fq" w:colFirst="0" w:colLast="0" w:id="5"/>
+      <w:bookmarkEnd w:id="5"/>
+      <w:r>
         <w:rPr>
           <w:b/>
           <w:bCs/>
@@ -283,10 +315,71 @@
           <w:sz w:val="26"/>
           <w:szCs w:val="26"/>
         </w:rPr>
-      </w:pPr>
-      <w:bookmarkStart w:id="5" w:name="_25uwo9o5o2fq" w:colFirst="0" w:colLast="0"/>
-      <w:bookmarkEnd w:id="5"/>
-      <w:r>
+        <w:t>Mierzalne (Ilościowe)</w:t>
+      </w:r>
+    </w:p>
+    <w:p>
+      <w:pPr>
+        <w:numPr>
+          <w:ilvl w:val="0"/>
+          <w:numId w:val="3"/>
+        </w:numPr>
+        <w:spacing w:before="240"/>
+      </w:pPr>
+      <w:r>
+        <w:rPr>
+          <w:b/>
+          <w:bCs/>
+        </w:rPr>
+        <w:t>Zwiększenie przepustowości:</w:t>
+      </w:r>
+      <w:r>
+        <w:t xml:space="preserve"> Skrócenie czasu odprawy klienta (check-in) o np. 40% dzięki wcześniejszej rezerwacji danych w systemie.</w:t>
+      </w:r>
+    </w:p>
+    <w:p>
+      <w:pPr>
+        <w:numPr>
+          <w:ilvl w:val="0"/>
+          <w:numId w:val="3"/>
+        </w:numPr>
+      </w:pPr>
+      <w:r>
+        <w:rPr>
+          <w:b/>
+          <w:bCs/>
+        </w:rPr>
+        <w:t>Optymalizacja kosztów serwisu:</w:t>
+      </w:r>
+      <w:r>
+        <w:t xml:space="preserve"> Wydłużenie żywotności broni dzięki regularnej konserwacji opartej na rzeczywistym przebiegu (liczba wystrzelonych naboi), a nie na "wyczuciu".</w:t>
+      </w:r>
+    </w:p>
+    <w:p>
+      <w:pPr>
+        <w:numPr>
+          <w:ilvl w:val="0"/>
+          <w:numId w:val="3"/>
+        </w:numPr>
+        <w:spacing w:after="240"/>
+      </w:pPr>
+      <w:r>
+        <w:rPr>
+          <w:b/>
+          <w:bCs/>
+        </w:rPr>
+        <w:t>Precyzyjna kontrola stanów:</w:t>
+      </w:r>
+      <w:r>
+        <w:t xml:space="preserve"> Redukcja różnic inwentaryzacyjnych amunicji do 0% dzięki ścisłemu powiązaniu wydania magazynowego z logiem wizyty.</w:t>
+      </w:r>
+    </w:p>
+    <w:p>
+      <w:pPr>
+        <w:pStyle w:val="Nagwek3"/>
+        <w:keepNext w:val="0"/>
+        <w:keepLines w:val="0"/>
+        <w:spacing w:before="280"/>
         <w:rPr>
           <w:b/>
           <w:bCs/>
@@ -294,71 +387,10 @@
           <w:sz w:val="26"/>
           <w:szCs w:val="26"/>
         </w:rPr>
-        <w:t>Mierzalne (Ilościowe)</w:t>
-      </w:r>
-    </w:p>
-    <w:p>
-      <w:pPr>
-        <w:numPr>
-          <w:ilvl w:val="0"/>
-          <w:numId w:val="3"/>
-        </w:numPr>
-        <w:spacing w:before="240"/>
-      </w:pPr>
-      <w:r>
-        <w:rPr>
-          <w:b/>
-          <w:bCs/>
-        </w:rPr>
-        <w:t>Zwiększenie przepustowości:</w:t>
-      </w:r>
-      <w:r>
-        <w:t xml:space="preserve"> Skrócenie czasu odprawy klienta (check-in) o np. 40% dzięki wcześniejszej rezerwacji danych w systemie.</w:t>
-      </w:r>
-    </w:p>
-    <w:p>
-      <w:pPr>
-        <w:numPr>
-          <w:ilvl w:val="0"/>
-          <w:numId w:val="3"/>
-        </w:numPr>
-      </w:pPr>
-      <w:r>
-        <w:rPr>
-          <w:b/>
-          <w:bCs/>
-        </w:rPr>
-        <w:t>Optymalizacja kosztów serwisu:</w:t>
-      </w:r>
-      <w:r>
-        <w:t xml:space="preserve"> Wydłużenie żywotności broni dzięki regularnej konserwacji opartej na rzeczywistym przebiegu (liczba wystrzelonych naboi), a nie na "wyczuciu".</w:t>
-      </w:r>
-    </w:p>
-    <w:p>
-      <w:pPr>
-        <w:numPr>
-          <w:ilvl w:val="0"/>
-          <w:numId w:val="3"/>
-        </w:numPr>
-        <w:spacing w:after="240"/>
-      </w:pPr>
-      <w:r>
-        <w:rPr>
-          <w:b/>
-          <w:bCs/>
-        </w:rPr>
-        <w:t>Precyzyjna kontrola stanów:</w:t>
-      </w:r>
-      <w:r>
-        <w:t xml:space="preserve"> Redukcja różnic inwentaryzacyjnych amunicji do 0% dzięki ścisłemu powiązaniu wydania magazynowego z logiem wizyty.</w:t>
-      </w:r>
-    </w:p>
-    <w:p>
-      <w:pPr>
-        <w:pStyle w:val="Nagwek3"/>
-        <w:keepNext w:val="0"/>
-        <w:keepLines w:val="0"/>
-        <w:spacing w:before="280"/>
+      </w:pPr>
+      <w:bookmarkStart w:name="_chphprtmquhu" w:colFirst="0" w:colLast="0" w:id="6"/>
+      <w:bookmarkEnd w:id="6"/>
+      <w:r>
         <w:rPr>
           <w:b/>
           <w:bCs/>
@@ -366,17 +398,6 @@
           <w:sz w:val="26"/>
           <w:szCs w:val="26"/>
         </w:rPr>
-      </w:pPr>
-      <w:bookmarkStart w:id="6" w:name="_chphprtmquhu" w:colFirst="0" w:colLast="0"/>
-      <w:bookmarkEnd w:id="6"/>
-      <w:r>
-        <w:rPr>
-          <w:b/>
-          <w:bCs/>
-          <w:color w:val="000000"/>
-          <w:sz w:val="26"/>
-          <w:szCs w:val="26"/>
-        </w:rPr>
         <w:t>Niemierzalne (Jakościowe)</w:t>
       </w:r>
     </w:p>
@@ -442,7 +463,7 @@
         <w:pStyle w:val="Nagwek2"/>
         <w:spacing w:before="240" w:after="240"/>
       </w:pPr>
-      <w:bookmarkStart w:id="7" w:name="_hev6j5i0hsa8" w:colFirst="0" w:colLast="0"/>
+      <w:bookmarkStart w:name="_hev6j5i0hsa8" w:colFirst="0" w:colLast="0" w:id="7"/>
       <w:bookmarkEnd w:id="7"/>
       <w:r>
         <w:t xml:space="preserve">3. Słownik terminów (Business Glossary) </w:t>
@@ -476,10 +497,10 @@
           <w:tcPr>
             <w:tcW w:w="2175" w:type="dxa"/>
             <w:tcBorders>
-              <w:top w:val="single" w:sz="6" w:space="0" w:color="1F1F1F"/>
-              <w:left w:val="single" w:sz="6" w:space="0" w:color="1F1F1F"/>
-              <w:bottom w:val="single" w:sz="6" w:space="0" w:color="1F1F1F"/>
-              <w:right w:val="single" w:sz="6" w:space="0" w:color="1F1F1F"/>
+              <w:top w:val="single" w:color="1F1F1F" w:sz="6" w:space="0"/>
+              <w:left w:val="single" w:color="1F1F1F" w:sz="6" w:space="0"/>
+              <w:bottom w:val="single" w:color="1F1F1F" w:sz="6" w:space="0"/>
+              <w:right w:val="single" w:color="1F1F1F" w:sz="6" w:space="0"/>
             </w:tcBorders>
             <w:shd w:val="clear" w:color="auto" w:fill="EFEFEF"/>
             <w:tcMar>
@@ -510,10 +531,10 @@
           <w:tcPr>
             <w:tcW w:w="6645" w:type="dxa"/>
             <w:tcBorders>
-              <w:top w:val="single" w:sz="6" w:space="0" w:color="1F1F1F"/>
-              <w:left w:val="single" w:sz="6" w:space="0" w:color="1F1F1F"/>
-              <w:bottom w:val="single" w:sz="6" w:space="0" w:color="1F1F1F"/>
-              <w:right w:val="single" w:sz="6" w:space="0" w:color="1F1F1F"/>
+              <w:top w:val="single" w:color="1F1F1F" w:sz="6" w:space="0"/>
+              <w:left w:val="single" w:color="1F1F1F" w:sz="6" w:space="0"/>
+              <w:bottom w:val="single" w:color="1F1F1F" w:sz="6" w:space="0"/>
+              <w:right w:val="single" w:color="1F1F1F" w:sz="6" w:space="0"/>
             </w:tcBorders>
             <w:shd w:val="clear" w:color="auto" w:fill="EFEFEF"/>
             <w:tcMar>
@@ -549,10 +570,10 @@
           <w:tcPr>
             <w:tcW w:w="2175" w:type="dxa"/>
             <w:tcBorders>
-              <w:top w:val="single" w:sz="6" w:space="0" w:color="1F1F1F"/>
-              <w:left w:val="single" w:sz="6" w:space="0" w:color="1F1F1F"/>
-              <w:bottom w:val="single" w:sz="6" w:space="0" w:color="1F1F1F"/>
-              <w:right w:val="single" w:sz="6" w:space="0" w:color="1F1F1F"/>
+              <w:top w:val="single" w:color="1F1F1F" w:sz="6" w:space="0"/>
+              <w:left w:val="single" w:color="1F1F1F" w:sz="6" w:space="0"/>
+              <w:bottom w:val="single" w:color="1F1F1F" w:sz="6" w:space="0"/>
+              <w:right w:val="single" w:color="1F1F1F" w:sz="6" w:space="0"/>
             </w:tcBorders>
             <w:tcMar>
               <w:top w:w="240" w:type="dxa"/>
@@ -582,10 +603,10 @@
           <w:tcPr>
             <w:tcW w:w="6645" w:type="dxa"/>
             <w:tcBorders>
-              <w:top w:val="single" w:sz="6" w:space="0" w:color="1F1F1F"/>
-              <w:left w:val="single" w:sz="6" w:space="0" w:color="1F1F1F"/>
-              <w:bottom w:val="single" w:sz="6" w:space="0" w:color="1F1F1F"/>
-              <w:right w:val="single" w:sz="6" w:space="0" w:color="1F1F1F"/>
+              <w:top w:val="single" w:color="1F1F1F" w:sz="6" w:space="0"/>
+              <w:left w:val="single" w:color="1F1F1F" w:sz="6" w:space="0"/>
+              <w:bottom w:val="single" w:color="1F1F1F" w:sz="6" w:space="0"/>
+              <w:right w:val="single" w:color="1F1F1F" w:sz="6" w:space="0"/>
             </w:tcBorders>
             <w:tcMar>
               <w:top w:w="240" w:type="dxa"/>
@@ -618,10 +639,10 @@
           <w:tcPr>
             <w:tcW w:w="2175" w:type="dxa"/>
             <w:tcBorders>
-              <w:top w:val="single" w:sz="6" w:space="0" w:color="1F1F1F"/>
-              <w:left w:val="single" w:sz="6" w:space="0" w:color="1F1F1F"/>
-              <w:bottom w:val="single" w:sz="6" w:space="0" w:color="1F1F1F"/>
-              <w:right w:val="single" w:sz="6" w:space="0" w:color="1F1F1F"/>
+              <w:top w:val="single" w:color="1F1F1F" w:sz="6" w:space="0"/>
+              <w:left w:val="single" w:color="1F1F1F" w:sz="6" w:space="0"/>
+              <w:bottom w:val="single" w:color="1F1F1F" w:sz="6" w:space="0"/>
+              <w:right w:val="single" w:color="1F1F1F" w:sz="6" w:space="0"/>
             </w:tcBorders>
             <w:tcMar>
               <w:top w:w="240" w:type="dxa"/>
@@ -651,10 +672,10 @@
           <w:tcPr>
             <w:tcW w:w="6645" w:type="dxa"/>
             <w:tcBorders>
-              <w:top w:val="single" w:sz="6" w:space="0" w:color="1F1F1F"/>
-              <w:left w:val="single" w:sz="6" w:space="0" w:color="1F1F1F"/>
-              <w:bottom w:val="single" w:sz="6" w:space="0" w:color="1F1F1F"/>
-              <w:right w:val="single" w:sz="6" w:space="0" w:color="1F1F1F"/>
+              <w:top w:val="single" w:color="1F1F1F" w:sz="6" w:space="0"/>
+              <w:left w:val="single" w:color="1F1F1F" w:sz="6" w:space="0"/>
+              <w:bottom w:val="single" w:color="1F1F1F" w:sz="6" w:space="0"/>
+              <w:right w:val="single" w:color="1F1F1F" w:sz="6" w:space="0"/>
             </w:tcBorders>
             <w:tcMar>
               <w:top w:w="240" w:type="dxa"/>
@@ -687,10 +708,10 @@
           <w:tcPr>
             <w:tcW w:w="2175" w:type="dxa"/>
             <w:tcBorders>
-              <w:top w:val="single" w:sz="6" w:space="0" w:color="1F1F1F"/>
-              <w:left w:val="single" w:sz="6" w:space="0" w:color="1F1F1F"/>
-              <w:bottom w:val="single" w:sz="6" w:space="0" w:color="1F1F1F"/>
-              <w:right w:val="single" w:sz="6" w:space="0" w:color="1F1F1F"/>
+              <w:top w:val="single" w:color="1F1F1F" w:sz="6" w:space="0"/>
+              <w:left w:val="single" w:color="1F1F1F" w:sz="6" w:space="0"/>
+              <w:bottom w:val="single" w:color="1F1F1F" w:sz="6" w:space="0"/>
+              <w:right w:val="single" w:color="1F1F1F" w:sz="6" w:space="0"/>
             </w:tcBorders>
             <w:tcMar>
               <w:top w:w="240" w:type="dxa"/>
@@ -720,10 +741,10 @@
           <w:tcPr>
             <w:tcW w:w="6645" w:type="dxa"/>
             <w:tcBorders>
-              <w:top w:val="single" w:sz="6" w:space="0" w:color="1F1F1F"/>
-              <w:left w:val="single" w:sz="6" w:space="0" w:color="1F1F1F"/>
-              <w:bottom w:val="single" w:sz="6" w:space="0" w:color="1F1F1F"/>
-              <w:right w:val="single" w:sz="6" w:space="0" w:color="1F1F1F"/>
+              <w:top w:val="single" w:color="1F1F1F" w:sz="6" w:space="0"/>
+              <w:left w:val="single" w:color="1F1F1F" w:sz="6" w:space="0"/>
+              <w:bottom w:val="single" w:color="1F1F1F" w:sz="6" w:space="0"/>
+              <w:right w:val="single" w:color="1F1F1F" w:sz="6" w:space="0"/>
             </w:tcBorders>
             <w:tcMar>
               <w:top w:w="240" w:type="dxa"/>
@@ -756,10 +777,10 @@
           <w:tcPr>
             <w:tcW w:w="2175" w:type="dxa"/>
             <w:tcBorders>
-              <w:top w:val="single" w:sz="6" w:space="0" w:color="1F1F1F"/>
-              <w:left w:val="single" w:sz="6" w:space="0" w:color="1F1F1F"/>
-              <w:bottom w:val="single" w:sz="6" w:space="0" w:color="1F1F1F"/>
-              <w:right w:val="single" w:sz="6" w:space="0" w:color="1F1F1F"/>
+              <w:top w:val="single" w:color="1F1F1F" w:sz="6" w:space="0"/>
+              <w:left w:val="single" w:color="1F1F1F" w:sz="6" w:space="0"/>
+              <w:bottom w:val="single" w:color="1F1F1F" w:sz="6" w:space="0"/>
+              <w:right w:val="single" w:color="1F1F1F" w:sz="6" w:space="0"/>
             </w:tcBorders>
             <w:tcMar>
               <w:top w:w="240" w:type="dxa"/>
@@ -789,10 +810,10 @@
           <w:tcPr>
             <w:tcW w:w="6645" w:type="dxa"/>
             <w:tcBorders>
-              <w:top w:val="single" w:sz="6" w:space="0" w:color="1F1F1F"/>
-              <w:left w:val="single" w:sz="6" w:space="0" w:color="1F1F1F"/>
-              <w:bottom w:val="single" w:sz="6" w:space="0" w:color="1F1F1F"/>
-              <w:right w:val="single" w:sz="6" w:space="0" w:color="1F1F1F"/>
+              <w:top w:val="single" w:color="1F1F1F" w:sz="6" w:space="0"/>
+              <w:left w:val="single" w:color="1F1F1F" w:sz="6" w:space="0"/>
+              <w:bottom w:val="single" w:color="1F1F1F" w:sz="6" w:space="0"/>
+              <w:right w:val="single" w:color="1F1F1F" w:sz="6" w:space="0"/>
             </w:tcBorders>
             <w:tcMar>
               <w:top w:w="240" w:type="dxa"/>
@@ -825,10 +846,10 @@
           <w:tcPr>
             <w:tcW w:w="2175" w:type="dxa"/>
             <w:tcBorders>
-              <w:top w:val="single" w:sz="6" w:space="0" w:color="1F1F1F"/>
-              <w:left w:val="single" w:sz="6" w:space="0" w:color="1F1F1F"/>
-              <w:bottom w:val="single" w:sz="6" w:space="0" w:color="1F1F1F"/>
-              <w:right w:val="single" w:sz="6" w:space="0" w:color="1F1F1F"/>
+              <w:top w:val="single" w:color="1F1F1F" w:sz="6" w:space="0"/>
+              <w:left w:val="single" w:color="1F1F1F" w:sz="6" w:space="0"/>
+              <w:bottom w:val="single" w:color="1F1F1F" w:sz="6" w:space="0"/>
+              <w:right w:val="single" w:color="1F1F1F" w:sz="6" w:space="0"/>
             </w:tcBorders>
             <w:tcMar>
               <w:top w:w="240" w:type="dxa"/>
@@ -858,10 +879,10 @@
           <w:tcPr>
             <w:tcW w:w="6645" w:type="dxa"/>
             <w:tcBorders>
-              <w:top w:val="single" w:sz="6" w:space="0" w:color="1F1F1F"/>
-              <w:left w:val="single" w:sz="6" w:space="0" w:color="1F1F1F"/>
-              <w:bottom w:val="single" w:sz="6" w:space="0" w:color="1F1F1F"/>
-              <w:right w:val="single" w:sz="6" w:space="0" w:color="1F1F1F"/>
+              <w:top w:val="single" w:color="1F1F1F" w:sz="6" w:space="0"/>
+              <w:left w:val="single" w:color="1F1F1F" w:sz="6" w:space="0"/>
+              <w:bottom w:val="single" w:color="1F1F1F" w:sz="6" w:space="0"/>
+              <w:right w:val="single" w:color="1F1F1F" w:sz="6" w:space="0"/>
             </w:tcBorders>
             <w:tcMar>
               <w:top w:w="240" w:type="dxa"/>
@@ -894,10 +915,10 @@
           <w:tcPr>
             <w:tcW w:w="2175" w:type="dxa"/>
             <w:tcBorders>
-              <w:top w:val="single" w:sz="6" w:space="0" w:color="1F1F1F"/>
-              <w:left w:val="single" w:sz="6" w:space="0" w:color="1F1F1F"/>
-              <w:bottom w:val="single" w:sz="6" w:space="0" w:color="1F1F1F"/>
-              <w:right w:val="single" w:sz="6" w:space="0" w:color="1F1F1F"/>
+              <w:top w:val="single" w:color="1F1F1F" w:sz="6" w:space="0"/>
+              <w:left w:val="single" w:color="1F1F1F" w:sz="6" w:space="0"/>
+              <w:bottom w:val="single" w:color="1F1F1F" w:sz="6" w:space="0"/>
+              <w:right w:val="single" w:color="1F1F1F" w:sz="6" w:space="0"/>
             </w:tcBorders>
             <w:tcMar>
               <w:top w:w="240" w:type="dxa"/>
@@ -927,10 +948,10 @@
           <w:tcPr>
             <w:tcW w:w="6645" w:type="dxa"/>
             <w:tcBorders>
-              <w:top w:val="single" w:sz="6" w:space="0" w:color="1F1F1F"/>
-              <w:left w:val="single" w:sz="6" w:space="0" w:color="1F1F1F"/>
-              <w:bottom w:val="single" w:sz="6" w:space="0" w:color="1F1F1F"/>
-              <w:right w:val="single" w:sz="6" w:space="0" w:color="1F1F1F"/>
+              <w:top w:val="single" w:color="1F1F1F" w:sz="6" w:space="0"/>
+              <w:left w:val="single" w:color="1F1F1F" w:sz="6" w:space="0"/>
+              <w:bottom w:val="single" w:color="1F1F1F" w:sz="6" w:space="0"/>
+              <w:right w:val="single" w:color="1F1F1F" w:sz="6" w:space="0"/>
             </w:tcBorders>
             <w:tcMar>
               <w:top w:w="240" w:type="dxa"/>
@@ -963,10 +984,10 @@
           <w:tcPr>
             <w:tcW w:w="2175" w:type="dxa"/>
             <w:tcBorders>
-              <w:top w:val="single" w:sz="6" w:space="0" w:color="1F1F1F"/>
-              <w:left w:val="single" w:sz="6" w:space="0" w:color="1F1F1F"/>
-              <w:bottom w:val="single" w:sz="6" w:space="0" w:color="1F1F1F"/>
-              <w:right w:val="single" w:sz="6" w:space="0" w:color="1F1F1F"/>
+              <w:top w:val="single" w:color="1F1F1F" w:sz="6" w:space="0"/>
+              <w:left w:val="single" w:color="1F1F1F" w:sz="6" w:space="0"/>
+              <w:bottom w:val="single" w:color="1F1F1F" w:sz="6" w:space="0"/>
+              <w:right w:val="single" w:color="1F1F1F" w:sz="6" w:space="0"/>
             </w:tcBorders>
             <w:tcMar>
               <w:top w:w="240" w:type="dxa"/>
@@ -997,10 +1018,10 @@
           <w:tcPr>
             <w:tcW w:w="6645" w:type="dxa"/>
             <w:tcBorders>
-              <w:top w:val="single" w:sz="6" w:space="0" w:color="1F1F1F"/>
-              <w:left w:val="single" w:sz="6" w:space="0" w:color="1F1F1F"/>
-              <w:bottom w:val="single" w:sz="6" w:space="0" w:color="1F1F1F"/>
-              <w:right w:val="single" w:sz="6" w:space="0" w:color="1F1F1F"/>
+              <w:top w:val="single" w:color="1F1F1F" w:sz="6" w:space="0"/>
+              <w:left w:val="single" w:color="1F1F1F" w:sz="6" w:space="0"/>
+              <w:bottom w:val="single" w:color="1F1F1F" w:sz="6" w:space="0"/>
+              <w:right w:val="single" w:color="1F1F1F" w:sz="6" w:space="0"/>
             </w:tcBorders>
             <w:tcMar>
               <w:top w:w="240" w:type="dxa"/>
@@ -1031,14 +1052,14 @@
         <w:pStyle w:val="Nagwek2"/>
         <w:spacing w:before="240" w:after="240"/>
       </w:pPr>
-      <w:bookmarkStart w:id="8" w:name="_cts42h3dtku0" w:colFirst="0" w:colLast="0"/>
+      <w:bookmarkStart w:name="_cts42h3dtku0" w:colFirst="0" w:colLast="0" w:id="8"/>
       <w:bookmarkEnd w:id="8"/>
     </w:p>
     <w:p>
       <w:pPr>
         <w:pStyle w:val="Nagwek2"/>
       </w:pPr>
-      <w:bookmarkStart w:id="9" w:name="_1cz1enrmpf6u" w:colFirst="0" w:colLast="0"/>
+      <w:bookmarkStart w:name="_1cz1enrmpf6u" w:colFirst="0" w:colLast="0" w:id="9"/>
       <w:bookmarkEnd w:id="9"/>
       <w:r>
         <w:t>4.Interfejs użytkownika</w:t>
@@ -1474,12 +1495,31 @@
     <w:p>
       <w:pPr>
         <w:pStyle w:val="Nagwek2"/>
+      </w:pPr>
+      <w:r>
+        <w:rPr/>
+        <w:t>4. Perspektywy przypadków użycia</w:t>
+      </w:r>
+    </w:p>
+    <w:p>
+      <w:pPr>
+        <w:pStyle w:val="Nagwek2"/>
         <w:rPr>
           <w:noProof/>
         </w:rPr>
       </w:pPr>
-      <w:bookmarkStart w:id="10" w:name="_u6uw153jg72q" w:colFirst="0" w:colLast="0"/>
-      <w:bookmarkEnd w:id="10"/>
+      <w:r>
+        <w:rPr/>
+        <w:t>4</w:t>
+      </w:r>
+      <w:r>
+        <w:rPr/>
+        <w:t>.1</w:t>
+      </w:r>
+      <w:r>
+        <w:rPr/>
+        <w:t>.Diagram Przypadków użycia</w:t>
+      </w:r>
       <w:r>
         <w:t>4.Diagram Przypadków użycia</w:t>
       </w:r>
@@ -1530,7 +1570,15 @@
         <w:pStyle w:val="Nagwek2"/>
       </w:pPr>
       <w:r>
-        <w:lastRenderedPageBreak/>
+        <w:rPr/>
+        <w:t>4.1</w:t>
+      </w:r>
+      <w:r>
+        <w:rPr/>
+        <w:t>.2.</w:t>
+      </w:r>
+      <w:r>
+        <w:rPr/>
         <w:t>Opisy przypadków użycia</w:t>
       </w:r>
     </w:p>
@@ -2901,9 +2949,74 @@
         <w:t xml:space="preserve">Zaktualizowane role i uprawnienia użytkowników w systemie (np. nadanie nowemu pracownikowi dostępu do panelu instruktora). </w:t>
       </w:r>
     </w:p>
+    <w:p>
+      <w:pPr>
+        <w:ind w:left="720"/>
+        <w:rPr>
+          <w:lang w:val="pl-PL"/>
+        </w:rPr>
+      </w:pPr>
+    </w:p>
+    <w:p>
+      <w:pPr>
+        <w:pStyle w:val="Nagwek2"/>
+      </w:pPr>
+      <w:r>
+        <w:rPr/>
+        <w:t>4.2.Opisy przypadków użycia</w:t>
+      </w:r>
+    </w:p>
+    <w:p>
+      <w:pPr>
+        <w:pStyle w:val="Normalny"/>
+      </w:pPr>
+      <w:r>
+        <w:drawing>
+          <wp:inline wp14:editId="3B5C66BA" wp14:anchorId="62A6F070">
+            <wp:extent cx="5724525" cy="5133975"/>
+            <wp:effectExtent l="0" t="0" r="0" b="0"/>
+            <wp:docPr id="1956112328" name="drawing"/>
+            <wp:cNvGraphicFramePr>
+              <a:graphicFrameLocks noChangeAspect="1"/>
+            </wp:cNvGraphicFramePr>
+            <a:graphic>
+              <a:graphicData xmlns:a="http://schemas.openxmlformats.org/drawingml/2006/main" uri="http://schemas.openxmlformats.org/drawingml/2006/picture">
+                <pic:pic xmlns:pic="http://schemas.openxmlformats.org/drawingml/2006/picture">
+                  <pic:nvPicPr>
+                    <pic:cNvPr id="1956112328" name="Picture 1956112328"/>
+                    <pic:cNvPicPr/>
+                  </pic:nvPicPr>
+                  <pic:blipFill>
+                    <a:blip xmlns:r="http://schemas.openxmlformats.org/officeDocument/2006/relationships" r:embed="rId1987841104">
+                      <a:extLst>
+                        <a:ext uri="{28A0092B-C50C-407E-A947-70E740481C1C}">
+                          <a14:useLocalDpi xmlns:a14="http://schemas.microsoft.com/office/drawing/2010/main"/>
+                        </a:ext>
+                      </a:extLst>
+                    </a:blip>
+                    <a:stretch>
+                      <a:fillRect/>
+                    </a:stretch>
+                  </pic:blipFill>
+                  <pic:spPr>
+                    <a:xfrm>
+                      <a:off x="0" y="0"/>
+                      <a:ext cx="5724525" cy="5133975"/>
+                    </a:xfrm>
+                    <a:prstGeom prst="rect">
+                      <a:avLst/>
+                    </a:prstGeom>
+                  </pic:spPr>
+                </pic:pic>
+              </a:graphicData>
+            </a:graphic>
+          </wp:inline>
+        </w:drawing>
+      </w:r>
+    </w:p>
     <w:p/>
     <w:sectPr>
-      <w:pgSz w:w="11909" w:h="16834"/>
+      <w:pgSz w:w="11909" w:h="16834" w:orient="portrait"/>
       <w:pgMar w:top="1440" w:right="1440" w:bottom="1440" w:left="1440" w:header="720" w:footer="720" w:gutter="0"/>
       <w:pgNumType w:start="1"/>
       <w:cols w:space="708"/>
@@ -3043,7 +3156,7 @@
         <w:ind w:left="720" w:hanging="360"/>
       </w:pPr>
       <w:rPr>
-        <w:rFonts w:ascii="Symbol" w:hAnsi="Symbol" w:hint="default"/>
+        <w:rFonts w:hint="default" w:ascii="Symbol" w:hAnsi="Symbol"/>
         <w:sz w:val="20"/>
       </w:rPr>
     </w:lvl>
@@ -3059,7 +3172,7 @@
         <w:ind w:left="1440" w:hanging="360"/>
       </w:pPr>
       <w:rPr>
-        <w:rFonts w:ascii="Courier New" w:hAnsi="Courier New" w:hint="default"/>
+        <w:rFonts w:hint="default" w:ascii="Courier New" w:hAnsi="Courier New"/>
         <w:sz w:val="20"/>
       </w:rPr>
     </w:lvl>
@@ -3075,7 +3188,7 @@
         <w:ind w:left="2160" w:hanging="360"/>
       </w:pPr>
       <w:rPr>
-        <w:rFonts w:ascii="Wingdings" w:hAnsi="Wingdings" w:hint="default"/>
+        <w:rFonts w:hint="default" w:ascii="Wingdings" w:hAnsi="Wingdings"/>
         <w:sz w:val="20"/>
       </w:rPr>
     </w:lvl>
@@ -3091,7 +3204,7 @@
         <w:ind w:left="2880" w:hanging="360"/>
       </w:pPr>
       <w:rPr>
-        <w:rFonts w:ascii="Wingdings" w:hAnsi="Wingdings" w:hint="default"/>
+        <w:rFonts w:hint="default" w:ascii="Wingdings" w:hAnsi="Wingdings"/>
         <w:sz w:val="20"/>
       </w:rPr>
     </w:lvl>
@@ -3107,7 +3220,7 @@
         <w:ind w:left="3600" w:hanging="360"/>
       </w:pPr>
       <w:rPr>
-        <w:rFonts w:ascii="Wingdings" w:hAnsi="Wingdings" w:hint="default"/>
+        <w:rFonts w:hint="default" w:ascii="Wingdings" w:hAnsi="Wingdings"/>
         <w:sz w:val="20"/>
       </w:rPr>
     </w:lvl>
@@ -3123,7 +3236,7 @@
         <w:ind w:left="4320" w:hanging="360"/>
       </w:pPr>
       <w:rPr>
-        <w:rFonts w:ascii="Wingdings" w:hAnsi="Wingdings" w:hint="default"/>
+        <w:rFonts w:hint="default" w:ascii="Wingdings" w:hAnsi="Wingdings"/>
         <w:sz w:val="20"/>
       </w:rPr>
     </w:lvl>
@@ -3139,7 +3252,7 @@
         <w:ind w:left="5040" w:hanging="360"/>
       </w:pPr>
       <w:rPr>
-        <w:rFonts w:ascii="Wingdings" w:hAnsi="Wingdings" w:hint="default"/>
+        <w:rFonts w:hint="default" w:ascii="Wingdings" w:hAnsi="Wingdings"/>
         <w:sz w:val="20"/>
       </w:rPr>
     </w:lvl>
@@ -3155,7 +3268,7 @@
         <w:ind w:left="5760" w:hanging="360"/>
       </w:pPr>
       <w:rPr>
-        <w:rFonts w:ascii="Wingdings" w:hAnsi="Wingdings" w:hint="default"/>
+        <w:rFonts w:hint="default" w:ascii="Wingdings" w:hAnsi="Wingdings"/>
         <w:sz w:val="20"/>
       </w:rPr>
     </w:lvl>
@@ -3171,7 +3284,7 @@
         <w:ind w:left="6480" w:hanging="360"/>
       </w:pPr>
       <w:rPr>
-        <w:rFonts w:ascii="Wingdings" w:hAnsi="Wingdings" w:hint="default"/>
+        <w:rFonts w:hint="default" w:ascii="Wingdings" w:hAnsi="Wingdings"/>
         <w:sz w:val="20"/>
       </w:rPr>
     </w:lvl>
@@ -3192,7 +3305,7 @@
         <w:ind w:left="720" w:hanging="360"/>
       </w:pPr>
       <w:rPr>
-        <w:rFonts w:ascii="Symbol" w:hAnsi="Symbol" w:hint="default"/>
+        <w:rFonts w:hint="default" w:ascii="Symbol" w:hAnsi="Symbol"/>
         <w:sz w:val="20"/>
       </w:rPr>
     </w:lvl>
@@ -3208,7 +3321,7 @@
         <w:ind w:left="1440" w:hanging="360"/>
       </w:pPr>
       <w:rPr>
-        <w:rFonts w:ascii="Courier New" w:hAnsi="Courier New" w:hint="default"/>
+        <w:rFonts w:hint="default" w:ascii="Courier New" w:hAnsi="Courier New"/>
         <w:sz w:val="20"/>
       </w:rPr>
     </w:lvl>
@@ -3224,7 +3337,7 @@
         <w:ind w:left="2160" w:hanging="360"/>
       </w:pPr>
       <w:rPr>
-        <w:rFonts w:ascii="Wingdings" w:hAnsi="Wingdings" w:hint="default"/>
+        <w:rFonts w:hint="default" w:ascii="Wingdings" w:hAnsi="Wingdings"/>
         <w:sz w:val="20"/>
       </w:rPr>
     </w:lvl>
@@ -3240,7 +3353,7 @@
         <w:ind w:left="2880" w:hanging="360"/>
       </w:pPr>
       <w:rPr>
-        <w:rFonts w:ascii="Wingdings" w:hAnsi="Wingdings" w:hint="default"/>
+        <w:rFonts w:hint="default" w:ascii="Wingdings" w:hAnsi="Wingdings"/>
         <w:sz w:val="20"/>
       </w:rPr>
     </w:lvl>
@@ -3256,7 +3369,7 @@
         <w:ind w:left="3600" w:hanging="360"/>
       </w:pPr>
       <w:rPr>
-        <w:rFonts w:ascii="Wingdings" w:hAnsi="Wingdings" w:hint="default"/>
+        <w:rFonts w:hint="default" w:ascii="Wingdings" w:hAnsi="Wingdings"/>
         <w:sz w:val="20"/>
       </w:rPr>
     </w:lvl>
@@ -3272,7 +3385,7 @@
         <w:ind w:left="4320" w:hanging="360"/>
       </w:pPr>
       <w:rPr>
-        <w:rFonts w:ascii="Wingdings" w:hAnsi="Wingdings" w:hint="default"/>
+        <w:rFonts w:hint="default" w:ascii="Wingdings" w:hAnsi="Wingdings"/>
         <w:sz w:val="20"/>
       </w:rPr>
     </w:lvl>
@@ -3288,7 +3401,7 @@
         <w:ind w:left="5040" w:hanging="360"/>
       </w:pPr>
       <w:rPr>
-        <w:rFonts w:ascii="Wingdings" w:hAnsi="Wingdings" w:hint="default"/>
+        <w:rFonts w:hint="default" w:ascii="Wingdings" w:hAnsi="Wingdings"/>
         <w:sz w:val="20"/>
       </w:rPr>
     </w:lvl>
@@ -3304,7 +3417,7 @@
         <w:ind w:left="5760" w:hanging="360"/>
       </w:pPr>
       <w:rPr>
-        <w:rFonts w:ascii="Wingdings" w:hAnsi="Wingdings" w:hint="default"/>
+        <w:rFonts w:hint="default" w:ascii="Wingdings" w:hAnsi="Wingdings"/>
         <w:sz w:val="20"/>
       </w:rPr>
     </w:lvl>
@@ -3320,7 +3433,7 @@
         <w:ind w:left="6480" w:hanging="360"/>
       </w:pPr>
       <w:rPr>
-        <w:rFonts w:ascii="Wingdings" w:hAnsi="Wingdings" w:hint="default"/>
+        <w:rFonts w:hint="default" w:ascii="Wingdings" w:hAnsi="Wingdings"/>
         <w:sz w:val="20"/>
       </w:rPr>
     </w:lvl>
@@ -3341,7 +3454,7 @@
         <w:ind w:left="720" w:hanging="360"/>
       </w:pPr>
       <w:rPr>
-        <w:rFonts w:ascii="Symbol" w:hAnsi="Symbol" w:hint="default"/>
+        <w:rFonts w:hint="default" w:ascii="Symbol" w:hAnsi="Symbol"/>
         <w:sz w:val="20"/>
       </w:rPr>
     </w:lvl>
@@ -3357,7 +3470,7 @@
         <w:ind w:left="1440" w:hanging="360"/>
       </w:pPr>
       <w:rPr>
-        <w:rFonts w:ascii="Courier New" w:hAnsi="Courier New" w:hint="default"/>
+        <w:rFonts w:hint="default" w:ascii="Courier New" w:hAnsi="Courier New"/>
         <w:sz w:val="20"/>
       </w:rPr>
     </w:lvl>
@@ -3373,7 +3486,7 @@
         <w:ind w:left="2160" w:hanging="360"/>
       </w:pPr>
       <w:rPr>
-        <w:rFonts w:ascii="Wingdings" w:hAnsi="Wingdings" w:hint="default"/>
+        <w:rFonts w:hint="default" w:ascii="Wingdings" w:hAnsi="Wingdings"/>
         <w:sz w:val="20"/>
       </w:rPr>
     </w:lvl>
@@ -3389,7 +3502,7 @@
         <w:ind w:left="2880" w:hanging="360"/>
       </w:pPr>
       <w:rPr>
-        <w:rFonts w:ascii="Wingdings" w:hAnsi="Wingdings" w:hint="default"/>
+        <w:rFonts w:hint="default" w:ascii="Wingdings" w:hAnsi="Wingdings"/>
         <w:sz w:val="20"/>
       </w:rPr>
     </w:lvl>
@@ -3405,7 +3518,7 @@
         <w:ind w:left="3600" w:hanging="360"/>
       </w:pPr>
       <w:rPr>
-        <w:rFonts w:ascii="Wingdings" w:hAnsi="Wingdings" w:hint="default"/>
+        <w:rFonts w:hint="default" w:ascii="Wingdings" w:hAnsi="Wingdings"/>
         <w:sz w:val="20"/>
       </w:rPr>
     </w:lvl>
@@ -3421,7 +3534,7 @@
         <w:ind w:left="4320" w:hanging="360"/>
       </w:pPr>
       <w:rPr>
-        <w:rFonts w:ascii="Wingdings" w:hAnsi="Wingdings" w:hint="default"/>
+        <w:rFonts w:hint="default" w:ascii="Wingdings" w:hAnsi="Wingdings"/>
         <w:sz w:val="20"/>
       </w:rPr>
     </w:lvl>
@@ -3437,7 +3550,7 @@
         <w:ind w:left="5040" w:hanging="360"/>
       </w:pPr>
       <w:rPr>
-        <w:rFonts w:ascii="Wingdings" w:hAnsi="Wingdings" w:hint="default"/>
+        <w:rFonts w:hint="default" w:ascii="Wingdings" w:hAnsi="Wingdings"/>
         <w:sz w:val="20"/>
       </w:rPr>
     </w:lvl>
@@ -3453,7 +3566,7 @@
         <w:ind w:left="5760" w:hanging="360"/>
       </w:pPr>
       <w:rPr>
-        <w:rFonts w:ascii="Wingdings" w:hAnsi="Wingdings" w:hint="default"/>
+        <w:rFonts w:hint="default" w:ascii="Wingdings" w:hAnsi="Wingdings"/>
         <w:sz w:val="20"/>
       </w:rPr>
     </w:lvl>
@@ -3469,7 +3582,7 @@
         <w:ind w:left="6480" w:hanging="360"/>
       </w:pPr>
       <w:rPr>
-        <w:rFonts w:ascii="Wingdings" w:hAnsi="Wingdings" w:hint="default"/>
+        <w:rFonts w:hint="default" w:ascii="Wingdings" w:hAnsi="Wingdings"/>
         <w:sz w:val="20"/>
       </w:rPr>
     </w:lvl>
@@ -3490,7 +3603,7 @@
         <w:ind w:left="720" w:hanging="360"/>
       </w:pPr>
       <w:rPr>
-        <w:rFonts w:ascii="Symbol" w:hAnsi="Symbol" w:hint="default"/>
+        <w:rFonts w:hint="default" w:ascii="Symbol" w:hAnsi="Symbol"/>
         <w:sz w:val="20"/>
       </w:rPr>
     </w:lvl>
@@ -3506,7 +3619,7 @@
         <w:ind w:left="1440" w:hanging="360"/>
       </w:pPr>
       <w:rPr>
-        <w:rFonts w:ascii="Courier New" w:hAnsi="Courier New" w:hint="default"/>
+        <w:rFonts w:hint="default" w:ascii="Courier New" w:hAnsi="Courier New"/>
         <w:sz w:val="20"/>
       </w:rPr>
     </w:lvl>
@@ -3522,7 +3635,7 @@
         <w:ind w:left="2160" w:hanging="360"/>
       </w:pPr>
       <w:rPr>
-        <w:rFonts w:ascii="Wingdings" w:hAnsi="Wingdings" w:hint="default"/>
+        <w:rFonts w:hint="default" w:ascii="Wingdings" w:hAnsi="Wingdings"/>
         <w:sz w:val="20"/>
       </w:rPr>
     </w:lvl>
@@ -3538,7 +3651,7 @@
         <w:ind w:left="2880" w:hanging="360"/>
       </w:pPr>
       <w:rPr>
-        <w:rFonts w:ascii="Wingdings" w:hAnsi="Wingdings" w:hint="default"/>
+        <w:rFonts w:hint="default" w:ascii="Wingdings" w:hAnsi="Wingdings"/>
         <w:sz w:val="20"/>
       </w:rPr>
     </w:lvl>
@@ -3554,7 +3667,7 @@
         <w:ind w:left="3600" w:hanging="360"/>
       </w:pPr>
       <w:rPr>
-        <w:rFonts w:ascii="Wingdings" w:hAnsi="Wingdings" w:hint="default"/>
+        <w:rFonts w:hint="default" w:ascii="Wingdings" w:hAnsi="Wingdings"/>
         <w:sz w:val="20"/>
       </w:rPr>
     </w:lvl>
@@ -3570,7 +3683,7 @@
         <w:ind w:left="4320" w:hanging="360"/>
       </w:pPr>
       <w:rPr>
-        <w:rFonts w:ascii="Wingdings" w:hAnsi="Wingdings" w:hint="default"/>
+        <w:rFonts w:hint="default" w:ascii="Wingdings" w:hAnsi="Wingdings"/>
         <w:sz w:val="20"/>
       </w:rPr>
     </w:lvl>
@@ -3586,7 +3699,7 @@
         <w:ind w:left="5040" w:hanging="360"/>
       </w:pPr>
       <w:rPr>
-        <w:rFonts w:ascii="Wingdings" w:hAnsi="Wingdings" w:hint="default"/>
+        <w:rFonts w:hint="default" w:ascii="Wingdings" w:hAnsi="Wingdings"/>
         <w:sz w:val="20"/>
       </w:rPr>
     </w:lvl>
@@ -3602,7 +3715,7 @@
         <w:ind w:left="5760" w:hanging="360"/>
       </w:pPr>
       <w:rPr>
-        <w:rFonts w:ascii="Wingdings" w:hAnsi="Wingdings" w:hint="default"/>
+        <w:rFonts w:hint="default" w:ascii="Wingdings" w:hAnsi="Wingdings"/>
         <w:sz w:val="20"/>
       </w:rPr>
     </w:lvl>
@@ -3618,7 +3731,7 @@
         <w:ind w:left="6480" w:hanging="360"/>
       </w:pPr>
       <w:rPr>
-        <w:rFonts w:ascii="Wingdings" w:hAnsi="Wingdings" w:hint="default"/>
+        <w:rFonts w:hint="default" w:ascii="Wingdings" w:hAnsi="Wingdings"/>
         <w:sz w:val="20"/>
       </w:rPr>
     </w:lvl>
@@ -3639,7 +3752,7 @@
         <w:ind w:left="720" w:hanging="360"/>
       </w:pPr>
       <w:rPr>
-        <w:rFonts w:ascii="Symbol" w:hAnsi="Symbol" w:hint="default"/>
+        <w:rFonts w:hint="default" w:ascii="Symbol" w:hAnsi="Symbol"/>
         <w:sz w:val="20"/>
       </w:rPr>
     </w:lvl>
@@ -3655,7 +3768,7 @@
         <w:ind w:left="1440" w:hanging="360"/>
       </w:pPr>
       <w:rPr>
-        <w:rFonts w:ascii="Courier New" w:hAnsi="Courier New" w:hint="default"/>
+        <w:rFonts w:hint="default" w:ascii="Courier New" w:hAnsi="Courier New"/>
         <w:sz w:val="20"/>
       </w:rPr>
     </w:lvl>
@@ -3671,7 +3784,7 @@
         <w:ind w:left="2160" w:hanging="360"/>
       </w:pPr>
       <w:rPr>
-        <w:rFonts w:ascii="Wingdings" w:hAnsi="Wingdings" w:hint="default"/>
+        <w:rFonts w:hint="default" w:ascii="Wingdings" w:hAnsi="Wingdings"/>
         <w:sz w:val="20"/>
       </w:rPr>
     </w:lvl>
@@ -3687,7 +3800,7 @@
         <w:ind w:left="2880" w:hanging="360"/>
       </w:pPr>
       <w:rPr>
-        <w:rFonts w:ascii="Wingdings" w:hAnsi="Wingdings" w:hint="default"/>
+        <w:rFonts w:hint="default" w:ascii="Wingdings" w:hAnsi="Wingdings"/>
         <w:sz w:val="20"/>
       </w:rPr>
     </w:lvl>
@@ -3703,7 +3816,7 @@
         <w:ind w:left="3600" w:hanging="360"/>
       </w:pPr>
       <w:rPr>
-        <w:rFonts w:ascii="Wingdings" w:hAnsi="Wingdings" w:hint="default"/>
+        <w:rFonts w:hint="default" w:ascii="Wingdings" w:hAnsi="Wingdings"/>
         <w:sz w:val="20"/>
       </w:rPr>
     </w:lvl>
@@ -3719,7 +3832,7 @@
         <w:ind w:left="4320" w:hanging="360"/>
       </w:pPr>
       <w:rPr>
-        <w:rFonts w:ascii="Wingdings" w:hAnsi="Wingdings" w:hint="default"/>
+        <w:rFonts w:hint="default" w:ascii="Wingdings" w:hAnsi="Wingdings"/>
         <w:sz w:val="20"/>
       </w:rPr>
     </w:lvl>
@@ -3735,7 +3848,7 @@
         <w:ind w:left="5040" w:hanging="360"/>
       </w:pPr>
       <w:rPr>
-        <w:rFonts w:ascii="Wingdings" w:hAnsi="Wingdings" w:hint="default"/>
+        <w:rFonts w:hint="default" w:ascii="Wingdings" w:hAnsi="Wingdings"/>
         <w:sz w:val="20"/>
       </w:rPr>
     </w:lvl>
@@ -3751,7 +3864,7 @@
         <w:ind w:left="5760" w:hanging="360"/>
       </w:pPr>
       <w:rPr>
-        <w:rFonts w:ascii="Wingdings" w:hAnsi="Wingdings" w:hint="default"/>
+        <w:rFonts w:hint="default" w:ascii="Wingdings" w:hAnsi="Wingdings"/>
         <w:sz w:val="20"/>
       </w:rPr>
     </w:lvl>
@@ -3767,7 +3880,7 @@
         <w:ind w:left="6480" w:hanging="360"/>
       </w:pPr>
       <w:rPr>
-        <w:rFonts w:ascii="Wingdings" w:hAnsi="Wingdings" w:hint="default"/>
+        <w:rFonts w:hint="default" w:ascii="Wingdings" w:hAnsi="Wingdings"/>
         <w:sz w:val="20"/>
       </w:rPr>
     </w:lvl>
@@ -3788,7 +3901,7 @@
         <w:ind w:left="720" w:hanging="360"/>
       </w:pPr>
       <w:rPr>
-        <w:rFonts w:ascii="Symbol" w:hAnsi="Symbol" w:hint="default"/>
+        <w:rFonts w:hint="default" w:ascii="Symbol" w:hAnsi="Symbol"/>
         <w:sz w:val="20"/>
       </w:rPr>
     </w:lvl>
@@ -3804,7 +3917,7 @@
         <w:ind w:left="1440" w:hanging="360"/>
       </w:pPr>
       <w:rPr>
-        <w:rFonts w:ascii="Courier New" w:hAnsi="Courier New" w:hint="default"/>
+        <w:rFonts w:hint="default" w:ascii="Courier New" w:hAnsi="Courier New"/>
         <w:sz w:val="20"/>
       </w:rPr>
     </w:lvl>
@@ -3820,7 +3933,7 @@
         <w:ind w:left="2160" w:hanging="360"/>
       </w:pPr>
       <w:rPr>
-        <w:rFonts w:ascii="Wingdings" w:hAnsi="Wingdings" w:hint="default"/>
+        <w:rFonts w:hint="default" w:ascii="Wingdings" w:hAnsi="Wingdings"/>
         <w:sz w:val="20"/>
       </w:rPr>
     </w:lvl>
@@ -3836,7 +3949,7 @@
         <w:ind w:left="2880" w:hanging="360"/>
       </w:pPr>
       <w:rPr>
-        <w:rFonts w:ascii="Wingdings" w:hAnsi="Wingdings" w:hint="default"/>
+        <w:rFonts w:hint="default" w:ascii="Wingdings" w:hAnsi="Wingdings"/>
         <w:sz w:val="20"/>
       </w:rPr>
     </w:lvl>
@@ -3852,7 +3965,7 @@
         <w:ind w:left="3600" w:hanging="360"/>
       </w:pPr>
       <w:rPr>
-        <w:rFonts w:ascii="Wingdings" w:hAnsi="Wingdings" w:hint="default"/>
+        <w:rFonts w:hint="default" w:ascii="Wingdings" w:hAnsi="Wingdings"/>
         <w:sz w:val="20"/>
       </w:rPr>
     </w:lvl>
@@ -3868,7 +3981,7 @@
         <w:ind w:left="4320" w:hanging="360"/>
       </w:pPr>
       <w:rPr>
-        <w:rFonts w:ascii="Wingdings" w:hAnsi="Wingdings" w:hint="default"/>
+        <w:rFonts w:hint="default" w:ascii="Wingdings" w:hAnsi="Wingdings"/>
         <w:sz w:val="20"/>
       </w:rPr>
     </w:lvl>
@@ -3884,7 +3997,7 @@
         <w:ind w:left="5040" w:hanging="360"/>
       </w:pPr>
       <w:rPr>
-        <w:rFonts w:ascii="Wingdings" w:hAnsi="Wingdings" w:hint="default"/>
+        <w:rFonts w:hint="default" w:ascii="Wingdings" w:hAnsi="Wingdings"/>
         <w:sz w:val="20"/>
       </w:rPr>
     </w:lvl>
@@ -3900,7 +4013,7 @@
         <w:ind w:left="5760" w:hanging="360"/>
       </w:pPr>
       <w:rPr>
-        <w:rFonts w:ascii="Wingdings" w:hAnsi="Wingdings" w:hint="default"/>
+        <w:rFonts w:hint="default" w:ascii="Wingdings" w:hAnsi="Wingdings"/>
         <w:sz w:val="20"/>
       </w:rPr>
     </w:lvl>
@@ -3916,7 +4029,7 @@
         <w:ind w:left="6480" w:hanging="360"/>
       </w:pPr>
       <w:rPr>
-        <w:rFonts w:ascii="Wingdings" w:hAnsi="Wingdings" w:hint="default"/>
+        <w:rFonts w:hint="default" w:ascii="Wingdings" w:hAnsi="Wingdings"/>
         <w:sz w:val="20"/>
       </w:rPr>
     </w:lvl>
@@ -3937,7 +4050,7 @@
         <w:ind w:left="1800" w:hanging="360"/>
       </w:pPr>
       <w:rPr>
-        <w:rFonts w:ascii="Symbol" w:hAnsi="Symbol" w:hint="default"/>
+        <w:rFonts w:hint="default" w:ascii="Symbol" w:hAnsi="Symbol"/>
         <w:sz w:val="20"/>
       </w:rPr>
     </w:lvl>
@@ -3950,7 +4063,7 @@
         <w:ind w:left="2520" w:hanging="360"/>
       </w:pPr>
       <w:rPr>
-        <w:rFonts w:ascii="Courier New" w:hAnsi="Courier New" w:cs="Courier New" w:hint="default"/>
+        <w:rFonts w:hint="default" w:ascii="Courier New" w:hAnsi="Courier New" w:cs="Courier New"/>
       </w:rPr>
     </w:lvl>
     <w:lvl w:ilvl="2" w:tentative="1">
@@ -3965,7 +4078,7 @@
         <w:ind w:left="3240" w:hanging="360"/>
       </w:pPr>
       <w:rPr>
-        <w:rFonts w:ascii="Wingdings" w:hAnsi="Wingdings" w:hint="default"/>
+        <w:rFonts w:hint="default" w:ascii="Wingdings" w:hAnsi="Wingdings"/>
         <w:sz w:val="20"/>
       </w:rPr>
     </w:lvl>
@@ -3981,7 +4094,7 @@
         <w:ind w:left="3960" w:hanging="360"/>
       </w:pPr>
       <w:rPr>
-        <w:rFonts w:ascii="Wingdings" w:hAnsi="Wingdings" w:hint="default"/>
+        <w:rFonts w:hint="default" w:ascii="Wingdings" w:hAnsi="Wingdings"/>
         <w:sz w:val="20"/>
       </w:rPr>
     </w:lvl>
@@ -3997,7 +4110,7 @@
         <w:ind w:left="4680" w:hanging="360"/>
       </w:pPr>
       <w:rPr>
-        <w:rFonts w:ascii="Wingdings" w:hAnsi="Wingdings" w:hint="default"/>
+        <w:rFonts w:hint="default" w:ascii="Wingdings" w:hAnsi="Wingdings"/>
         <w:sz w:val="20"/>
       </w:rPr>
     </w:lvl>
@@ -4013,7 +4126,7 @@
         <w:ind w:left="5400" w:hanging="360"/>
       </w:pPr>
       <w:rPr>
-        <w:rFonts w:ascii="Wingdings" w:hAnsi="Wingdings" w:hint="default"/>
+        <w:rFonts w:hint="default" w:ascii="Wingdings" w:hAnsi="Wingdings"/>
         <w:sz w:val="20"/>
       </w:rPr>
     </w:lvl>
@@ -4029,7 +4142,7 @@
         <w:ind w:left="6120" w:hanging="360"/>
       </w:pPr>
       <w:rPr>
-        <w:rFonts w:ascii="Wingdings" w:hAnsi="Wingdings" w:hint="default"/>
+        <w:rFonts w:hint="default" w:ascii="Wingdings" w:hAnsi="Wingdings"/>
         <w:sz w:val="20"/>
       </w:rPr>
     </w:lvl>
@@ -4045,7 +4158,7 @@
         <w:ind w:left="6840" w:hanging="360"/>
       </w:pPr>
       <w:rPr>
-        <w:rFonts w:ascii="Wingdings" w:hAnsi="Wingdings" w:hint="default"/>
+        <w:rFonts w:hint="default" w:ascii="Wingdings" w:hAnsi="Wingdings"/>
         <w:sz w:val="20"/>
       </w:rPr>
     </w:lvl>
@@ -4061,7 +4174,7 @@
         <w:ind w:left="7560" w:hanging="360"/>
       </w:pPr>
       <w:rPr>
-        <w:rFonts w:ascii="Wingdings" w:hAnsi="Wingdings" w:hint="default"/>
+        <w:rFonts w:hint="default" w:ascii="Wingdings" w:hAnsi="Wingdings"/>
         <w:sz w:val="20"/>
       </w:rPr>
     </w:lvl>
@@ -4082,7 +4195,7 @@
         <w:ind w:left="720" w:hanging="360"/>
       </w:pPr>
       <w:rPr>
-        <w:rFonts w:ascii="Symbol" w:hAnsi="Symbol" w:hint="default"/>
+        <w:rFonts w:hint="default" w:ascii="Symbol" w:hAnsi="Symbol"/>
         <w:sz w:val="20"/>
       </w:rPr>
     </w:lvl>
@@ -4098,7 +4211,7 @@
         <w:ind w:left="1440" w:hanging="360"/>
       </w:pPr>
       <w:rPr>
-        <w:rFonts w:ascii="Courier New" w:hAnsi="Courier New" w:hint="default"/>
+        <w:rFonts w:hint="default" w:ascii="Courier New" w:hAnsi="Courier New"/>
         <w:sz w:val="20"/>
       </w:rPr>
     </w:lvl>
@@ -4114,7 +4227,7 @@
         <w:ind w:left="2160" w:hanging="360"/>
       </w:pPr>
       <w:rPr>
-        <w:rFonts w:ascii="Wingdings" w:hAnsi="Wingdings" w:hint="default"/>
+        <w:rFonts w:hint="default" w:ascii="Wingdings" w:hAnsi="Wingdings"/>
         <w:sz w:val="20"/>
       </w:rPr>
     </w:lvl>
@@ -4130,7 +4243,7 @@
         <w:ind w:left="2880" w:hanging="360"/>
       </w:pPr>
       <w:rPr>
-        <w:rFonts w:ascii="Wingdings" w:hAnsi="Wingdings" w:hint="default"/>
+        <w:rFonts w:hint="default" w:ascii="Wingdings" w:hAnsi="Wingdings"/>
         <w:sz w:val="20"/>
       </w:rPr>
     </w:lvl>
@@ -4146,7 +4259,7 @@
         <w:ind w:left="3600" w:hanging="360"/>
       </w:pPr>
       <w:rPr>
-        <w:rFonts w:ascii="Wingdings" w:hAnsi="Wingdings" w:hint="default"/>
+        <w:rFonts w:hint="default" w:ascii="Wingdings" w:hAnsi="Wingdings"/>
         <w:sz w:val="20"/>
       </w:rPr>
     </w:lvl>
@@ -4162,7 +4275,7 @@
         <w:ind w:left="4320" w:hanging="360"/>
       </w:pPr>
       <w:rPr>
-        <w:rFonts w:ascii="Wingdings" w:hAnsi="Wingdings" w:hint="default"/>
+        <w:rFonts w:hint="default" w:ascii="Wingdings" w:hAnsi="Wingdings"/>
         <w:sz w:val="20"/>
       </w:rPr>
     </w:lvl>
@@ -4178,7 +4291,7 @@
         <w:ind w:left="5040" w:hanging="360"/>
       </w:pPr>
       <w:rPr>
-        <w:rFonts w:ascii="Wingdings" w:hAnsi="Wingdings" w:hint="default"/>
+        <w:rFonts w:hint="default" w:ascii="Wingdings" w:hAnsi="Wingdings"/>
         <w:sz w:val="20"/>
       </w:rPr>
     </w:lvl>
@@ -4194,7 +4307,7 @@
         <w:ind w:left="5760" w:hanging="360"/>
       </w:pPr>
       <w:rPr>
-        <w:rFonts w:ascii="Wingdings" w:hAnsi="Wingdings" w:hint="default"/>
+        <w:rFonts w:hint="default" w:ascii="Wingdings" w:hAnsi="Wingdings"/>
         <w:sz w:val="20"/>
       </w:rPr>
     </w:lvl>
@@ -4210,7 +4323,7 @@
         <w:ind w:left="6480" w:hanging="360"/>
       </w:pPr>
       <w:rPr>
-        <w:rFonts w:ascii="Wingdings" w:hAnsi="Wingdings" w:hint="default"/>
+        <w:rFonts w:hint="default" w:ascii="Wingdings" w:hAnsi="Wingdings"/>
         <w:sz w:val="20"/>
       </w:rPr>
     </w:lvl>
@@ -4231,7 +4344,7 @@
         <w:ind w:left="720" w:hanging="360"/>
       </w:pPr>
       <w:rPr>
-        <w:rFonts w:ascii="Symbol" w:hAnsi="Symbol" w:hint="default"/>
+        <w:rFonts w:hint="default" w:ascii="Symbol" w:hAnsi="Symbol"/>
         <w:sz w:val="20"/>
       </w:rPr>
     </w:lvl>
@@ -4247,7 +4360,7 @@
         <w:ind w:left="1440" w:hanging="360"/>
       </w:pPr>
       <w:rPr>
-        <w:rFonts w:ascii="Courier New" w:hAnsi="Courier New" w:hint="default"/>
+        <w:rFonts w:hint="default" w:ascii="Courier New" w:hAnsi="Courier New"/>
         <w:sz w:val="20"/>
       </w:rPr>
     </w:lvl>
@@ -4263,7 +4376,7 @@
         <w:ind w:left="2160" w:hanging="360"/>
       </w:pPr>
       <w:rPr>
-        <w:rFonts w:ascii="Wingdings" w:hAnsi="Wingdings" w:hint="default"/>
+        <w:rFonts w:hint="default" w:ascii="Wingdings" w:hAnsi="Wingdings"/>
         <w:sz w:val="20"/>
       </w:rPr>
     </w:lvl>
@@ -4279,7 +4392,7 @@
         <w:ind w:left="2880" w:hanging="360"/>
       </w:pPr>
       <w:rPr>
-        <w:rFonts w:ascii="Wingdings" w:hAnsi="Wingdings" w:hint="default"/>
+        <w:rFonts w:hint="default" w:ascii="Wingdings" w:hAnsi="Wingdings"/>
         <w:sz w:val="20"/>
       </w:rPr>
     </w:lvl>
@@ -4295,7 +4408,7 @@
         <w:ind w:left="3600" w:hanging="360"/>
       </w:pPr>
       <w:rPr>
-        <w:rFonts w:ascii="Wingdings" w:hAnsi="Wingdings" w:hint="default"/>
+        <w:rFonts w:hint="default" w:ascii="Wingdings" w:hAnsi="Wingdings"/>
         <w:sz w:val="20"/>
       </w:rPr>
     </w:lvl>
@@ -4311,7 +4424,7 @@
         <w:ind w:left="4320" w:hanging="360"/>
       </w:pPr>
       <w:rPr>
-        <w:rFonts w:ascii="Wingdings" w:hAnsi="Wingdings" w:hint="default"/>
+        <w:rFonts w:hint="default" w:ascii="Wingdings" w:hAnsi="Wingdings"/>
         <w:sz w:val="20"/>
       </w:rPr>
     </w:lvl>
@@ -4327,7 +4440,7 @@
         <w:ind w:left="5040" w:hanging="360"/>
       </w:pPr>
       <w:rPr>
-        <w:rFonts w:ascii="Wingdings" w:hAnsi="Wingdings" w:hint="default"/>
+        <w:rFonts w:hint="default" w:ascii="Wingdings" w:hAnsi="Wingdings"/>
         <w:sz w:val="20"/>
       </w:rPr>
     </w:lvl>
@@ -4343,7 +4456,7 @@
         <w:ind w:left="5760" w:hanging="360"/>
       </w:pPr>
       <w:rPr>
-        <w:rFonts w:ascii="Wingdings" w:hAnsi="Wingdings" w:hint="default"/>
+        <w:rFonts w:hint="default" w:ascii="Wingdings" w:hAnsi="Wingdings"/>
         <w:sz w:val="20"/>
       </w:rPr>
     </w:lvl>
@@ -4359,7 +4472,7 @@
         <w:ind w:left="6480" w:hanging="360"/>
       </w:pPr>
       <w:rPr>
-        <w:rFonts w:ascii="Wingdings" w:hAnsi="Wingdings" w:hint="default"/>
+        <w:rFonts w:hint="default" w:ascii="Wingdings" w:hAnsi="Wingdings"/>
         <w:sz w:val="20"/>
       </w:rPr>
     </w:lvl>
@@ -4380,7 +4493,7 @@
         <w:ind w:left="720" w:hanging="360"/>
       </w:pPr>
       <w:rPr>
-        <w:rFonts w:ascii="Symbol" w:hAnsi="Symbol" w:hint="default"/>
+        <w:rFonts w:hint="default" w:ascii="Symbol" w:hAnsi="Symbol"/>
         <w:sz w:val="20"/>
       </w:rPr>
     </w:lvl>
@@ -4396,7 +4509,7 @@
         <w:ind w:left="1440" w:hanging="360"/>
       </w:pPr>
       <w:rPr>
-        <w:rFonts w:ascii="Courier New" w:hAnsi="Courier New" w:hint="default"/>
+        <w:rFonts w:hint="default" w:ascii="Courier New" w:hAnsi="Courier New"/>
         <w:sz w:val="20"/>
       </w:rPr>
     </w:lvl>
@@ -4412,7 +4525,7 @@
         <w:ind w:left="2160" w:hanging="360"/>
       </w:pPr>
       <w:rPr>
-        <w:rFonts w:ascii="Wingdings" w:hAnsi="Wingdings" w:hint="default"/>
+        <w:rFonts w:hint="default" w:ascii="Wingdings" w:hAnsi="Wingdings"/>
         <w:sz w:val="20"/>
       </w:rPr>
     </w:lvl>
@@ -4428,7 +4541,7 @@
         <w:ind w:left="2880" w:hanging="360"/>
       </w:pPr>
       <w:rPr>
-        <w:rFonts w:ascii="Wingdings" w:hAnsi="Wingdings" w:hint="default"/>
+        <w:rFonts w:hint="default" w:ascii="Wingdings" w:hAnsi="Wingdings"/>
         <w:sz w:val="20"/>
       </w:rPr>
     </w:lvl>
@@ -4444,7 +4557,7 @@
         <w:ind w:left="3600" w:hanging="360"/>
       </w:pPr>
       <w:rPr>
-        <w:rFonts w:ascii="Wingdings" w:hAnsi="Wingdings" w:hint="default"/>
+        <w:rFonts w:hint="default" w:ascii="Wingdings" w:hAnsi="Wingdings"/>
         <w:sz w:val="20"/>
       </w:rPr>
     </w:lvl>
@@ -4460,7 +4573,7 @@
         <w:ind w:left="4320" w:hanging="360"/>
       </w:pPr>
       <w:rPr>
-        <w:rFonts w:ascii="Wingdings" w:hAnsi="Wingdings" w:hint="default"/>
+        <w:rFonts w:hint="default" w:ascii="Wingdings" w:hAnsi="Wingdings"/>
         <w:sz w:val="20"/>
       </w:rPr>
     </w:lvl>
@@ -4476,7 +4589,7 @@
         <w:ind w:left="5040" w:hanging="360"/>
       </w:pPr>
       <w:rPr>
-        <w:rFonts w:ascii="Wingdings" w:hAnsi="Wingdings" w:hint="default"/>
+        <w:rFonts w:hint="default" w:ascii="Wingdings" w:hAnsi="Wingdings"/>
         <w:sz w:val="20"/>
       </w:rPr>
     </w:lvl>
@@ -4492,7 +4605,7 @@
         <w:ind w:left="5760" w:hanging="360"/>
       </w:pPr>
       <w:rPr>
-        <w:rFonts w:ascii="Wingdings" w:hAnsi="Wingdings" w:hint="default"/>
+        <w:rFonts w:hint="default" w:ascii="Wingdings" w:hAnsi="Wingdings"/>
         <w:sz w:val="20"/>
       </w:rPr>
     </w:lvl>
@@ -4508,7 +4621,7 @@
         <w:ind w:left="6480" w:hanging="360"/>
       </w:pPr>
       <w:rPr>
-        <w:rFonts w:ascii="Wingdings" w:hAnsi="Wingdings" w:hint="default"/>
+        <w:rFonts w:hint="default" w:ascii="Wingdings" w:hAnsi="Wingdings"/>
         <w:sz w:val="20"/>
       </w:rPr>
     </w:lvl>
@@ -4529,7 +4642,7 @@
         <w:ind w:left="720" w:hanging="360"/>
       </w:pPr>
       <w:rPr>
-        <w:rFonts w:ascii="Symbol" w:hAnsi="Symbol" w:hint="default"/>
+        <w:rFonts w:hint="default" w:ascii="Symbol" w:hAnsi="Symbol"/>
         <w:sz w:val="20"/>
       </w:rPr>
     </w:lvl>
@@ -4545,7 +4658,7 @@
         <w:ind w:left="1440" w:hanging="360"/>
       </w:pPr>
       <w:rPr>
-        <w:rFonts w:ascii="Courier New" w:hAnsi="Courier New" w:hint="default"/>
+        <w:rFonts w:hint="default" w:ascii="Courier New" w:hAnsi="Courier New"/>
         <w:sz w:val="20"/>
       </w:rPr>
     </w:lvl>
@@ -4561,7 +4674,7 @@
         <w:ind w:left="2160" w:hanging="360"/>
       </w:pPr>
       <w:rPr>
-        <w:rFonts w:ascii="Wingdings" w:hAnsi="Wingdings" w:hint="default"/>
+        <w:rFonts w:hint="default" w:ascii="Wingdings" w:hAnsi="Wingdings"/>
         <w:sz w:val="20"/>
       </w:rPr>
     </w:lvl>
@@ -4577,7 +4690,7 @@
         <w:ind w:left="2880" w:hanging="360"/>
       </w:pPr>
       <w:rPr>
-        <w:rFonts w:ascii="Wingdings" w:hAnsi="Wingdings" w:hint="default"/>
+        <w:rFonts w:hint="default" w:ascii="Wingdings" w:hAnsi="Wingdings"/>
         <w:sz w:val="20"/>
       </w:rPr>
     </w:lvl>
@@ -4593,7 +4706,7 @@
         <w:ind w:left="3600" w:hanging="360"/>
       </w:pPr>
       <w:rPr>
-        <w:rFonts w:ascii="Wingdings" w:hAnsi="Wingdings" w:hint="default"/>
+        <w:rFonts w:hint="default" w:ascii="Wingdings" w:hAnsi="Wingdings"/>
         <w:sz w:val="20"/>
       </w:rPr>
     </w:lvl>
@@ -4609,7 +4722,7 @@
         <w:ind w:left="4320" w:hanging="360"/>
       </w:pPr>
       <w:rPr>
-        <w:rFonts w:ascii="Wingdings" w:hAnsi="Wingdings" w:hint="default"/>
+        <w:rFonts w:hint="default" w:ascii="Wingdings" w:hAnsi="Wingdings"/>
         <w:sz w:val="20"/>
       </w:rPr>
     </w:lvl>
@@ -4625,7 +4738,7 @@
         <w:ind w:left="5040" w:hanging="360"/>
       </w:pPr>
       <w:rPr>
-        <w:rFonts w:ascii="Wingdings" w:hAnsi="Wingdings" w:hint="default"/>
+        <w:rFonts w:hint="default" w:ascii="Wingdings" w:hAnsi="Wingdings"/>
         <w:sz w:val="20"/>
       </w:rPr>
     </w:lvl>
@@ -4641,7 +4754,7 @@
         <w:ind w:left="5760" w:hanging="360"/>
       </w:pPr>
       <w:rPr>
-        <w:rFonts w:ascii="Wingdings" w:hAnsi="Wingdings" w:hint="default"/>
+        <w:rFonts w:hint="default" w:ascii="Wingdings" w:hAnsi="Wingdings"/>
         <w:sz w:val="20"/>
       </w:rPr>
     </w:lvl>
@@ -4657,7 +4770,7 @@
         <w:ind w:left="6480" w:hanging="360"/>
       </w:pPr>
       <w:rPr>
-        <w:rFonts w:ascii="Wingdings" w:hAnsi="Wingdings" w:hint="default"/>
+        <w:rFonts w:hint="default" w:ascii="Wingdings" w:hAnsi="Wingdings"/>
         <w:sz w:val="20"/>
       </w:rPr>
     </w:lvl>
@@ -4678,7 +4791,7 @@
         <w:ind w:left="1080" w:hanging="360"/>
       </w:pPr>
       <w:rPr>
-        <w:rFonts w:ascii="Symbol" w:hAnsi="Symbol" w:hint="default"/>
+        <w:rFonts w:hint="default" w:ascii="Symbol" w:hAnsi="Symbol"/>
         <w:sz w:val="20"/>
       </w:rPr>
     </w:lvl>
@@ -4691,7 +4804,7 @@
         <w:ind w:left="1800" w:hanging="360"/>
       </w:pPr>
       <w:rPr>
-        <w:rFonts w:ascii="Symbol" w:hAnsi="Symbol" w:hint="default"/>
+        <w:rFonts w:hint="default" w:ascii="Symbol" w:hAnsi="Symbol"/>
       </w:rPr>
     </w:lvl>
     <w:lvl w:ilvl="2" w:tentative="1">
@@ -4706,7 +4819,7 @@
         <w:ind w:left="2520" w:hanging="360"/>
       </w:pPr>
       <w:rPr>
-        <w:rFonts w:ascii="Wingdings" w:hAnsi="Wingdings" w:hint="default"/>
+        <w:rFonts w:hint="default" w:ascii="Wingdings" w:hAnsi="Wingdings"/>
         <w:sz w:val="20"/>
       </w:rPr>
     </w:lvl>
@@ -4722,7 +4835,7 @@
         <w:ind w:left="3240" w:hanging="360"/>
       </w:pPr>
       <w:rPr>
-        <w:rFonts w:ascii="Wingdings" w:hAnsi="Wingdings" w:hint="default"/>
+        <w:rFonts w:hint="default" w:ascii="Wingdings" w:hAnsi="Wingdings"/>
         <w:sz w:val="20"/>
       </w:rPr>
     </w:lvl>
@@ -4738,7 +4851,7 @@
         <w:ind w:left="3960" w:hanging="360"/>
       </w:pPr>
       <w:rPr>
-        <w:rFonts w:ascii="Wingdings" w:hAnsi="Wingdings" w:hint="default"/>
+        <w:rFonts w:hint="default" w:ascii="Wingdings" w:hAnsi="Wingdings"/>
         <w:sz w:val="20"/>
       </w:rPr>
     </w:lvl>
@@ -4754,7 +4867,7 @@
         <w:ind w:left="4680" w:hanging="360"/>
       </w:pPr>
       <w:rPr>
-        <w:rFonts w:ascii="Wingdings" w:hAnsi="Wingdings" w:hint="default"/>
+        <w:rFonts w:hint="default" w:ascii="Wingdings" w:hAnsi="Wingdings"/>
         <w:sz w:val="20"/>
       </w:rPr>
     </w:lvl>
@@ -4770,7 +4883,7 @@
         <w:ind w:left="5400" w:hanging="360"/>
       </w:pPr>
       <w:rPr>
-        <w:rFonts w:ascii="Wingdings" w:hAnsi="Wingdings" w:hint="default"/>
+        <w:rFonts w:hint="default" w:ascii="Wingdings" w:hAnsi="Wingdings"/>
         <w:sz w:val="20"/>
       </w:rPr>
     </w:lvl>
@@ -4786,7 +4899,7 @@
         <w:ind w:left="6120" w:hanging="360"/>
       </w:pPr>
       <w:rPr>
-        <w:rFonts w:ascii="Wingdings" w:hAnsi="Wingdings" w:hint="default"/>
+        <w:rFonts w:hint="default" w:ascii="Wingdings" w:hAnsi="Wingdings"/>
         <w:sz w:val="20"/>
       </w:rPr>
     </w:lvl>
@@ -4802,7 +4915,7 @@
         <w:ind w:left="6840" w:hanging="360"/>
       </w:pPr>
       <w:rPr>
-        <w:rFonts w:ascii="Wingdings" w:hAnsi="Wingdings" w:hint="default"/>
+        <w:rFonts w:hint="default" w:ascii="Wingdings" w:hAnsi="Wingdings"/>
         <w:sz w:val="20"/>
       </w:rPr>
     </w:lvl>
@@ -4823,7 +4936,7 @@
         <w:ind w:left="1080" w:hanging="360"/>
       </w:pPr>
       <w:rPr>
-        <w:rFonts w:ascii="Symbol" w:hAnsi="Symbol" w:hint="default"/>
+        <w:rFonts w:hint="default" w:ascii="Symbol" w:hAnsi="Symbol"/>
         <w:sz w:val="20"/>
       </w:rPr>
     </w:lvl>
@@ -4836,7 +4949,7 @@
         <w:ind w:left="1800" w:hanging="360"/>
       </w:pPr>
       <w:rPr>
-        <w:rFonts w:ascii="Symbol" w:hAnsi="Symbol" w:hint="default"/>
+        <w:rFonts w:hint="default" w:ascii="Symbol" w:hAnsi="Symbol"/>
       </w:rPr>
     </w:lvl>
     <w:lvl w:ilvl="2" w:tentative="1">
@@ -4851,7 +4964,7 @@
         <w:ind w:left="2520" w:hanging="360"/>
       </w:pPr>
       <w:rPr>
-        <w:rFonts w:ascii="Wingdings" w:hAnsi="Wingdings" w:hint="default"/>
+        <w:rFonts w:hint="default" w:ascii="Wingdings" w:hAnsi="Wingdings"/>
         <w:sz w:val="20"/>
       </w:rPr>
     </w:lvl>
@@ -4867,7 +4980,7 @@
         <w:ind w:left="3240" w:hanging="360"/>
       </w:pPr>
       <w:rPr>
-        <w:rFonts w:ascii="Wingdings" w:hAnsi="Wingdings" w:hint="default"/>
+        <w:rFonts w:hint="default" w:ascii="Wingdings" w:hAnsi="Wingdings"/>
         <w:sz w:val="20"/>
       </w:rPr>
     </w:lvl>
@@ -4883,7 +4996,7 @@
         <w:ind w:left="3960" w:hanging="360"/>
       </w:pPr>
       <w:rPr>
-        <w:rFonts w:ascii="Wingdings" w:hAnsi="Wingdings" w:hint="default"/>
+        <w:rFonts w:hint="default" w:ascii="Wingdings" w:hAnsi="Wingdings"/>
         <w:sz w:val="20"/>
       </w:rPr>
     </w:lvl>
@@ -4899,7 +5012,7 @@
         <w:ind w:left="4680" w:hanging="360"/>
       </w:pPr>
       <w:rPr>
-        <w:rFonts w:ascii="Wingdings" w:hAnsi="Wingdings" w:hint="default"/>
+        <w:rFonts w:hint="default" w:ascii="Wingdings" w:hAnsi="Wingdings"/>
         <w:sz w:val="20"/>
       </w:rPr>
     </w:lvl>
@@ -4915,7 +5028,7 @@
         <w:ind w:left="5400" w:hanging="360"/>
       </w:pPr>
       <w:rPr>
-        <w:rFonts w:ascii="Wingdings" w:hAnsi="Wingdings" w:hint="default"/>
+        <w:rFonts w:hint="default" w:ascii="Wingdings" w:hAnsi="Wingdings"/>
         <w:sz w:val="20"/>
       </w:rPr>
     </w:lvl>
@@ -4931,7 +5044,7 @@
         <w:ind w:left="6120" w:hanging="360"/>
       </w:pPr>
       <w:rPr>
-        <w:rFonts w:ascii="Wingdings" w:hAnsi="Wingdings" w:hint="default"/>
+        <w:rFonts w:hint="default" w:ascii="Wingdings" w:hAnsi="Wingdings"/>
         <w:sz w:val="20"/>
       </w:rPr>
     </w:lvl>
@@ -4947,7 +5060,7 @@
         <w:ind w:left="6840" w:hanging="360"/>
       </w:pPr>
       <w:rPr>
-        <w:rFonts w:ascii="Wingdings" w:hAnsi="Wingdings" w:hint="default"/>
+        <w:rFonts w:hint="default" w:ascii="Wingdings" w:hAnsi="Wingdings"/>
         <w:sz w:val="20"/>
       </w:rPr>
     </w:lvl>
@@ -4968,7 +5081,7 @@
         <w:ind w:left="720" w:hanging="360"/>
       </w:pPr>
       <w:rPr>
-        <w:rFonts w:ascii="Symbol" w:hAnsi="Symbol" w:hint="default"/>
+        <w:rFonts w:hint="default" w:ascii="Symbol" w:hAnsi="Symbol"/>
         <w:sz w:val="20"/>
       </w:rPr>
     </w:lvl>
@@ -4984,7 +5097,7 @@
         <w:ind w:left="1440" w:hanging="360"/>
       </w:pPr>
       <w:rPr>
-        <w:rFonts w:ascii="Courier New" w:hAnsi="Courier New" w:hint="default"/>
+        <w:rFonts w:hint="default" w:ascii="Courier New" w:hAnsi="Courier New"/>
         <w:sz w:val="20"/>
       </w:rPr>
     </w:lvl>
@@ -5000,7 +5113,7 @@
         <w:ind w:left="2160" w:hanging="360"/>
       </w:pPr>
       <w:rPr>
-        <w:rFonts w:ascii="Wingdings" w:hAnsi="Wingdings" w:hint="default"/>
+        <w:rFonts w:hint="default" w:ascii="Wingdings" w:hAnsi="Wingdings"/>
         <w:sz w:val="20"/>
       </w:rPr>
     </w:lvl>
@@ -5016,7 +5129,7 @@
         <w:ind w:left="2880" w:hanging="360"/>
       </w:pPr>
       <w:rPr>
-        <w:rFonts w:ascii="Wingdings" w:hAnsi="Wingdings" w:hint="default"/>
+        <w:rFonts w:hint="default" w:ascii="Wingdings" w:hAnsi="Wingdings"/>
         <w:sz w:val="20"/>
       </w:rPr>
     </w:lvl>
@@ -5032,7 +5145,7 @@
         <w:ind w:left="3600" w:hanging="360"/>
       </w:pPr>
       <w:rPr>
-        <w:rFonts w:ascii="Wingdings" w:hAnsi="Wingdings" w:hint="default"/>
+        <w:rFonts w:hint="default" w:ascii="Wingdings" w:hAnsi="Wingdings"/>
         <w:sz w:val="20"/>
       </w:rPr>
     </w:lvl>
@@ -5048,7 +5161,7 @@
         <w:ind w:left="4320" w:hanging="360"/>
       </w:pPr>
       <w:rPr>
-        <w:rFonts w:ascii="Wingdings" w:hAnsi="Wingdings" w:hint="default"/>
+        <w:rFonts w:hint="default" w:ascii="Wingdings" w:hAnsi="Wingdings"/>
         <w:sz w:val="20"/>
       </w:rPr>
     </w:lvl>
@@ -5064,7 +5177,7 @@
         <w:ind w:left="5040" w:hanging="360"/>
       </w:pPr>
       <w:rPr>
-        <w:rFonts w:ascii="Wingdings" w:hAnsi="Wingdings" w:hint="default"/>
+        <w:rFonts w:hint="default" w:ascii="Wingdings" w:hAnsi="Wingdings"/>
         <w:sz w:val="20"/>
       </w:rPr>
     </w:lvl>
@@ -5080,7 +5193,7 @@
         <w:ind w:left="5760" w:hanging="360"/>
       </w:pPr>
       <w:rPr>
-        <w:rFonts w:ascii="Wingdings" w:hAnsi="Wingdings" w:hint="default"/>
+        <w:rFonts w:hint="default" w:ascii="Wingdings" w:hAnsi="Wingdings"/>
         <w:sz w:val="20"/>
       </w:rPr>
     </w:lvl>
@@ -5096,7 +5209,7 @@
         <w:ind w:left="6480" w:hanging="360"/>
       </w:pPr>
       <w:rPr>
-        <w:rFonts w:ascii="Wingdings" w:hAnsi="Wingdings" w:hint="default"/>
+        <w:rFonts w:hint="default" w:ascii="Wingdings" w:hAnsi="Wingdings"/>
         <w:sz w:val="20"/>
       </w:rPr>
     </w:lvl>
@@ -5117,7 +5230,7 @@
         <w:ind w:left="720" w:hanging="360"/>
       </w:pPr>
       <w:rPr>
-        <w:rFonts w:ascii="Symbol" w:hAnsi="Symbol" w:hint="default"/>
+        <w:rFonts w:hint="default" w:ascii="Symbol" w:hAnsi="Symbol"/>
         <w:sz w:val="20"/>
       </w:rPr>
     </w:lvl>
@@ -5133,7 +5246,7 @@
         <w:ind w:left="1440" w:hanging="360"/>
       </w:pPr>
       <w:rPr>
-        <w:rFonts w:ascii="Courier New" w:hAnsi="Courier New" w:hint="default"/>
+        <w:rFonts w:hint="default" w:ascii="Courier New" w:hAnsi="Courier New"/>
         <w:sz w:val="20"/>
       </w:rPr>
     </w:lvl>
@@ -5149,7 +5262,7 @@
         <w:ind w:left="2160" w:hanging="360"/>
       </w:pPr>
       <w:rPr>
-        <w:rFonts w:ascii="Wingdings" w:hAnsi="Wingdings" w:hint="default"/>
+        <w:rFonts w:hint="default" w:ascii="Wingdings" w:hAnsi="Wingdings"/>
         <w:sz w:val="20"/>
       </w:rPr>
     </w:lvl>
@@ -5165,7 +5278,7 @@
         <w:ind w:left="2880" w:hanging="360"/>
       </w:pPr>
       <w:rPr>
-        <w:rFonts w:ascii="Wingdings" w:hAnsi="Wingdings" w:hint="default"/>
+        <w:rFonts w:hint="default" w:ascii="Wingdings" w:hAnsi="Wingdings"/>
         <w:sz w:val="20"/>
       </w:rPr>
     </w:lvl>
@@ -5181,7 +5294,7 @@
         <w:ind w:left="3600" w:hanging="360"/>
       </w:pPr>
       <w:rPr>
-        <w:rFonts w:ascii="Wingdings" w:hAnsi="Wingdings" w:hint="default"/>
+        <w:rFonts w:hint="default" w:ascii="Wingdings" w:hAnsi="Wingdings"/>
         <w:sz w:val="20"/>
       </w:rPr>
     </w:lvl>
@@ -5197,7 +5310,7 @@
         <w:ind w:left="4320" w:hanging="360"/>
       </w:pPr>
       <w:rPr>
-        <w:rFonts w:ascii="Wingdings" w:hAnsi="Wingdings" w:hint="default"/>
+        <w:rFonts w:hint="default" w:ascii="Wingdings" w:hAnsi="Wingdings"/>
         <w:sz w:val="20"/>
       </w:rPr>
     </w:lvl>
@@ -5213,7 +5326,7 @@
         <w:ind w:left="5040" w:hanging="360"/>
       </w:pPr>
       <w:rPr>
-        <w:rFonts w:ascii="Wingdings" w:hAnsi="Wingdings" w:hint="default"/>
+        <w:rFonts w:hint="default" w:ascii="Wingdings" w:hAnsi="Wingdings"/>
         <w:sz w:val="20"/>
       </w:rPr>
     </w:lvl>
@@ -5229,7 +5342,7 @@
         <w:ind w:left="5760" w:hanging="360"/>
       </w:pPr>
       <w:rPr>
-        <w:rFonts w:ascii="Wingdings" w:hAnsi="Wingdings" w:hint="default"/>
+        <w:rFonts w:hint="default" w:ascii="Wingdings" w:hAnsi="Wingdings"/>
         <w:sz w:val="20"/>
       </w:rPr>
     </w:lvl>
@@ -5245,7 +5358,7 @@
         <w:ind w:left="6480" w:hanging="360"/>
       </w:pPr>
       <w:rPr>
-        <w:rFonts w:ascii="Wingdings" w:hAnsi="Wingdings" w:hint="default"/>
+        <w:rFonts w:hint="default" w:ascii="Wingdings" w:hAnsi="Wingdings"/>
         <w:sz w:val="20"/>
       </w:rPr>
     </w:lvl>
@@ -5379,7 +5492,7 @@
         <w:ind w:left="720" w:hanging="360"/>
       </w:pPr>
       <w:rPr>
-        <w:rFonts w:ascii="Symbol" w:hAnsi="Symbol" w:hint="default"/>
+        <w:rFonts w:hint="default" w:ascii="Symbol" w:hAnsi="Symbol"/>
         <w:sz w:val="20"/>
       </w:rPr>
     </w:lvl>
@@ -5395,7 +5508,7 @@
         <w:ind w:left="1440" w:hanging="360"/>
       </w:pPr>
       <w:rPr>
-        <w:rFonts w:ascii="Courier New" w:hAnsi="Courier New" w:hint="default"/>
+        <w:rFonts w:hint="default" w:ascii="Courier New" w:hAnsi="Courier New"/>
         <w:sz w:val="20"/>
       </w:rPr>
     </w:lvl>
@@ -5411,7 +5524,7 @@
         <w:ind w:left="2160" w:hanging="360"/>
       </w:pPr>
       <w:rPr>
-        <w:rFonts w:ascii="Wingdings" w:hAnsi="Wingdings" w:hint="default"/>
+        <w:rFonts w:hint="default" w:ascii="Wingdings" w:hAnsi="Wingdings"/>
         <w:sz w:val="20"/>
       </w:rPr>
     </w:lvl>
@@ -5427,7 +5540,7 @@
         <w:ind w:left="2880" w:hanging="360"/>
       </w:pPr>
       <w:rPr>
-        <w:rFonts w:ascii="Wingdings" w:hAnsi="Wingdings" w:hint="default"/>
+        <w:rFonts w:hint="default" w:ascii="Wingdings" w:hAnsi="Wingdings"/>
         <w:sz w:val="20"/>
       </w:rPr>
     </w:lvl>
@@ -5443,7 +5556,7 @@
         <w:ind w:left="3600" w:hanging="360"/>
       </w:pPr>
       <w:rPr>
-        <w:rFonts w:ascii="Wingdings" w:hAnsi="Wingdings" w:hint="default"/>
+        <w:rFonts w:hint="default" w:ascii="Wingdings" w:hAnsi="Wingdings"/>
         <w:sz w:val="20"/>
       </w:rPr>
     </w:lvl>
@@ -5459,7 +5572,7 @@
         <w:ind w:left="4320" w:hanging="360"/>
       </w:pPr>
       <w:rPr>
-        <w:rFonts w:ascii="Wingdings" w:hAnsi="Wingdings" w:hint="default"/>
+        <w:rFonts w:hint="default" w:ascii="Wingdings" w:hAnsi="Wingdings"/>
         <w:sz w:val="20"/>
       </w:rPr>
     </w:lvl>
@@ -5475,7 +5588,7 @@
         <w:ind w:left="5040" w:hanging="360"/>
       </w:pPr>
       <w:rPr>
-        <w:rFonts w:ascii="Wingdings" w:hAnsi="Wingdings" w:hint="default"/>
+        <w:rFonts w:hint="default" w:ascii="Wingdings" w:hAnsi="Wingdings"/>
         <w:sz w:val="20"/>
       </w:rPr>
     </w:lvl>
@@ -5491,7 +5604,7 @@
         <w:ind w:left="5760" w:hanging="360"/>
       </w:pPr>
       <w:rPr>
-        <w:rFonts w:ascii="Wingdings" w:hAnsi="Wingdings" w:hint="default"/>
+        <w:rFonts w:hint="default" w:ascii="Wingdings" w:hAnsi="Wingdings"/>
         <w:sz w:val="20"/>
       </w:rPr>
     </w:lvl>
@@ -5507,7 +5620,7 @@
         <w:ind w:left="6480" w:hanging="360"/>
       </w:pPr>
       <w:rPr>
-        <w:rFonts w:ascii="Wingdings" w:hAnsi="Wingdings" w:hint="default"/>
+        <w:rFonts w:hint="default" w:ascii="Wingdings" w:hAnsi="Wingdings"/>
         <w:sz w:val="20"/>
       </w:rPr>
     </w:lvl>
@@ -5690,7 +5803,7 @@
   <w:docDefaults>
     <w:rPrDefault>
       <w:rPr>
-        <w:rFonts w:ascii="Arial" w:eastAsia="Arial" w:hAnsi="Arial" w:cs="Arial"/>
+        <w:rFonts w:ascii="Arial" w:hAnsi="Arial" w:eastAsia="Arial" w:cs="Arial"/>
         <w:sz w:val="22"/>
         <w:szCs w:val="22"/>
         <w:lang w:val="pl" w:eastAsia="pl-PL" w:bidi="ar-SA"/>
@@ -5705,14 +5818,14 @@
   <w:latentStyles w:defLockedState="0" w:defUIPriority="99" w:defSemiHidden="0" w:defUnhideWhenUsed="0" w:defQFormat="0" w:count="376">
     <w:lsdException w:name="Normal" w:uiPriority="0" w:qFormat="1"/>
     <w:lsdException w:name="heading 1" w:uiPriority="9" w:qFormat="1"/>
-    <w:lsdException w:name="heading 2" w:semiHidden="1" w:uiPriority="9" w:unhideWhenUsed="1" w:qFormat="1"/>
-    <w:lsdException w:name="heading 3" w:semiHidden="1" w:uiPriority="9" w:unhideWhenUsed="1" w:qFormat="1"/>
-    <w:lsdException w:name="heading 4" w:semiHidden="1" w:uiPriority="9" w:unhideWhenUsed="1" w:qFormat="1"/>
-    <w:lsdException w:name="heading 5" w:semiHidden="1" w:uiPriority="9" w:unhideWhenUsed="1" w:qFormat="1"/>
-    <w:lsdException w:name="heading 6" w:semiHidden="1" w:uiPriority="9" w:unhideWhenUsed="1" w:qFormat="1"/>
-    <w:lsdException w:name="heading 7" w:semiHidden="1" w:uiPriority="9" w:unhideWhenUsed="1" w:qFormat="1"/>
-    <w:lsdException w:name="heading 8" w:semiHidden="1" w:uiPriority="9" w:unhideWhenUsed="1" w:qFormat="1"/>
-    <w:lsdException w:name="heading 9" w:semiHidden="1" w:uiPriority="9" w:unhideWhenUsed="1" w:qFormat="1"/>
+    <w:lsdException w:name="heading 2" w:uiPriority="9" w:semiHidden="1" w:unhideWhenUsed="1" w:qFormat="1"/>
+    <w:lsdException w:name="heading 3" w:uiPriority="9" w:semiHidden="1" w:unhideWhenUsed="1" w:qFormat="1"/>
+    <w:lsdException w:name="heading 4" w:uiPriority="9" w:semiHidden="1" w:unhideWhenUsed="1" w:qFormat="1"/>
+    <w:lsdException w:name="heading 5" w:uiPriority="9" w:semiHidden="1" w:unhideWhenUsed="1" w:qFormat="1"/>
+    <w:lsdException w:name="heading 6" w:uiPriority="9" w:semiHidden="1" w:unhideWhenUsed="1" w:qFormat="1"/>
+    <w:lsdException w:name="heading 7" w:uiPriority="9" w:semiHidden="1" w:unhideWhenUsed="1" w:qFormat="1"/>
+    <w:lsdException w:name="heading 8" w:uiPriority="9" w:semiHidden="1" w:unhideWhenUsed="1" w:qFormat="1"/>
+    <w:lsdException w:name="heading 9" w:uiPriority="9" w:semiHidden="1" w:unhideWhenUsed="1" w:qFormat="1"/>
     <w:lsdException w:name="index 1" w:semiHidden="1" w:unhideWhenUsed="1"/>
     <w:lsdException w:name="index 2" w:semiHidden="1" w:unhideWhenUsed="1"/>
     <w:lsdException w:name="index 3" w:semiHidden="1" w:unhideWhenUsed="1"/>
@@ -5722,22 +5835,22 @@
     <w:lsdException w:name="index 7" w:semiHidden="1" w:unhideWhenUsed="1"/>
     <w:lsdException w:name="index 8" w:semiHidden="1" w:unhideWhenUsed="1"/>
     <w:lsdException w:name="index 9" w:semiHidden="1" w:unhideWhenUsed="1"/>
-    <w:lsdException w:name="toc 1" w:semiHidden="1" w:uiPriority="39" w:unhideWhenUsed="1"/>
-    <w:lsdException w:name="toc 2" w:semiHidden="1" w:uiPriority="39" w:unhideWhenUsed="1"/>
-    <w:lsdException w:name="toc 3" w:semiHidden="1" w:uiPriority="39" w:unhideWhenUsed="1"/>
-    <w:lsdException w:name="toc 4" w:semiHidden="1" w:uiPriority="39" w:unhideWhenUsed="1"/>
-    <w:lsdException w:name="toc 5" w:semiHidden="1" w:uiPriority="39" w:unhideWhenUsed="1"/>
-    <w:lsdException w:name="toc 6" w:semiHidden="1" w:uiPriority="39" w:unhideWhenUsed="1"/>
-    <w:lsdException w:name="toc 7" w:semiHidden="1" w:uiPriority="39" w:unhideWhenUsed="1"/>
-    <w:lsdException w:name="toc 8" w:semiHidden="1" w:uiPriority="39" w:unhideWhenUsed="1"/>
-    <w:lsdException w:name="toc 9" w:semiHidden="1" w:uiPriority="39" w:unhideWhenUsed="1"/>
+    <w:lsdException w:name="toc 1" w:uiPriority="39" w:semiHidden="1" w:unhideWhenUsed="1"/>
+    <w:lsdException w:name="toc 2" w:uiPriority="39" w:semiHidden="1" w:unhideWhenUsed="1"/>
+    <w:lsdException w:name="toc 3" w:uiPriority="39" w:semiHidden="1" w:unhideWhenUsed="1"/>
+    <w:lsdException w:name="toc 4" w:uiPriority="39" w:semiHidden="1" w:unhideWhenUsed="1"/>
+    <w:lsdException w:name="toc 5" w:uiPriority="39" w:semiHidden="1" w:unhideWhenUsed="1"/>
+    <w:lsdException w:name="toc 6" w:uiPriority="39" w:semiHidden="1" w:unhideWhenUsed="1"/>
+    <w:lsdException w:name="toc 7" w:uiPriority="39" w:semiHidden="1" w:unhideWhenUsed="1"/>
+    <w:lsdException w:name="toc 8" w:uiPriority="39" w:semiHidden="1" w:unhideWhenUsed="1"/>
+    <w:lsdException w:name="toc 9" w:uiPriority="39" w:semiHidden="1" w:unhideWhenUsed="1"/>
     <w:lsdException w:name="Normal Indent" w:semiHidden="1" w:unhideWhenUsed="1"/>
     <w:lsdException w:name="footnote text" w:semiHidden="1" w:unhideWhenUsed="1"/>
     <w:lsdException w:name="annotation text" w:semiHidden="1" w:unhideWhenUsed="1"/>
     <w:lsdException w:name="header" w:semiHidden="1" w:unhideWhenUsed="1"/>
     <w:lsdException w:name="footer" w:semiHidden="1" w:unhideWhenUsed="1"/>
     <w:lsdException w:name="index heading" w:semiHidden="1" w:unhideWhenUsed="1"/>
-    <w:lsdException w:name="caption" w:semiHidden="1" w:uiPriority="35" w:unhideWhenUsed="1" w:qFormat="1"/>
+    <w:lsdException w:name="caption" w:uiPriority="35" w:semiHidden="1" w:unhideWhenUsed="1" w:qFormat="1"/>
     <w:lsdException w:name="table of figures" w:semiHidden="1" w:unhideWhenUsed="1"/>
     <w:lsdException w:name="envelope address" w:semiHidden="1" w:unhideWhenUsed="1"/>
     <w:lsdException w:name="envelope return" w:semiHidden="1" w:unhideWhenUsed="1"/>
@@ -5768,7 +5881,7 @@
     <w:lsdException w:name="Title" w:uiPriority="10" w:qFormat="1"/>
     <w:lsdException w:name="Closing" w:semiHidden="1" w:unhideWhenUsed="1"/>
     <w:lsdException w:name="Signature" w:semiHidden="1" w:unhideWhenUsed="1"/>
-    <w:lsdException w:name="Default Paragraph Font" w:semiHidden="1" w:uiPriority="1" w:unhideWhenUsed="1"/>
+    <w:lsdException w:name="Default Paragraph Font" w:uiPriority="1" w:semiHidden="1" w:unhideWhenUsed="1"/>
     <w:lsdException w:name="Body Text" w:semiHidden="1" w:unhideWhenUsed="1"/>
     <w:lsdException w:name="Body Text Indent" w:semiHidden="1" w:unhideWhenUsed="1"/>
     <w:lsdException w:name="List Continue" w:semiHidden="1" w:unhideWhenUsed="1"/>
@@ -5968,8 +6081,8 @@
     <w:lsdException w:name="Subtle Reference" w:uiPriority="31" w:qFormat="1"/>
     <w:lsdException w:name="Intense Reference" w:uiPriority="32" w:qFormat="1"/>
     <w:lsdException w:name="Book Title" w:uiPriority="33" w:qFormat="1"/>
-    <w:lsdException w:name="Bibliography" w:semiHidden="1" w:uiPriority="37" w:unhideWhenUsed="1"/>
-    <w:lsdException w:name="TOC Heading" w:semiHidden="1" w:uiPriority="39" w:unhideWhenUsed="1" w:qFormat="1"/>
+    <w:lsdException w:name="Bibliography" w:uiPriority="37" w:semiHidden="1" w:unhideWhenUsed="1"/>
+    <w:lsdException w:name="TOC Heading" w:uiPriority="39" w:semiHidden="1" w:unhideWhenUsed="1" w:qFormat="1"/>
     <w:lsdException w:name="Plain Table 1" w:uiPriority="41"/>
     <w:lsdException w:name="Plain Table 2" w:uiPriority="42"/>
     <w:lsdException w:name="Plain Table 3" w:uiPriority="43"/>
@@ -6080,7 +6193,7 @@
     <w:lsdException w:name="Unresolved Mention" w:semiHidden="1" w:unhideWhenUsed="1"/>
     <w:lsdException w:name="Smart Link" w:semiHidden="1" w:unhideWhenUsed="1"/>
   </w:latentStyles>
-  <w:style w:type="paragraph" w:default="1" w:styleId="Normalny">
+  <w:style w:type="paragraph" w:styleId="Normalny" w:default="1">
     <w:name w:val="Normal"/>
     <w:qFormat/>
   </w:style>
@@ -6196,13 +6309,13 @@
       <w:color w:val="666666"/>
     </w:rPr>
   </w:style>
-  <w:style w:type="character" w:default="1" w:styleId="Domylnaczcionkaakapitu">
+  <w:style w:type="character" w:styleId="Domylnaczcionkaakapitu" w:default="1">
     <w:name w:val="Default Paragraph Font"/>
     <w:uiPriority w:val="1"/>
     <w:semiHidden/>
     <w:unhideWhenUsed/>
   </w:style>
-  <w:style w:type="table" w:default="1" w:styleId="Standardowy">
+  <w:style w:type="table" w:styleId="Standardowy" w:default="1">
     <w:name w:val="Normal Table"/>
     <w:uiPriority w:val="99"/>
     <w:semiHidden/>
@@ -6217,13 +6330,13 @@
       </w:tblCellMar>
     </w:tblPr>
   </w:style>
-  <w:style w:type="numbering" w:default="1" w:styleId="Bezlisty">
+  <w:style w:type="numbering" w:styleId="Bezlisty" w:default="1">
     <w:name w:val="No List"/>
     <w:uiPriority w:val="99"/>
     <w:semiHidden/>
     <w:unhideWhenUsed/>
   </w:style>
-  <w:style w:type="table" w:customStyle="1" w:styleId="TableNormal">
+  <w:style w:type="table" w:styleId="TableNormal" w:customStyle="1">
     <w:name w:val="TableNormal"/>
     <w:tblPr>
       <w:tblCellMar>
@@ -6267,7 +6380,7 @@
       <w:szCs w:val="30"/>
     </w:rPr>
   </w:style>
-  <w:style w:type="table" w:customStyle="1" w:styleId="a">
+  <w:style w:type="table" w:styleId="a" w:customStyle="1">
     <w:basedOn w:val="TableNormal"/>
     <w:tblPr>
       <w:tblStyleRowBandSize w:val="1"/>

</xml_diff>

<commit_message>
dodanie diagramu interakcji z opisem
</commit_message>
<xml_diff>
--- a/Downloads/ProjektIO/Projekt IO.docx
+++ b/Downloads/ProjektIO/Projekt IO.docx
@@ -1514,10 +1514,7 @@
         <w:t>.1</w:t>
       </w:r>
       <w:r>
-        <w:t>.Diagram Przypadków użycia</w:t>
-      </w:r>
-      <w:r>
-        <w:t>4.Diagram Przypadków użycia</w:t>
+        <w:t>.Diagram Przypadków użycia4.Diagram Przypadków użycia</w:t>
       </w:r>
     </w:p>
     <w:p>
@@ -1672,6 +1669,7 @@
         </w:rPr>
         <w:t xml:space="preserve">Użytkownik (po uprzednim przejściu przez przypadek użycia </w:t>
       </w:r>
+      <w:proofErr w:type="gramStart"/>
       <w:r>
         <w:rPr>
           <w:i/>
@@ -1684,7 +1682,14 @@
         <w:rPr>
           <w:lang w:val="pl-PL"/>
         </w:rPr>
-        <w:t xml:space="preserve"> ) określa datę, godzinę rozpoczęcia oraz godzinę zakończenia. </w:t>
+        <w:t xml:space="preserve"> )</w:t>
+      </w:r>
+      <w:proofErr w:type="gramEnd"/>
+      <w:r>
+        <w:rPr>
+          <w:lang w:val="pl-PL"/>
+        </w:rPr>
+        <w:t xml:space="preserve"> określa datę, godzinę rozpoczęcia oraz godzinę zakończenia. </w:t>
       </w:r>
     </w:p>
     <w:p>
@@ -1929,7 +1934,21 @@
         <w:rPr>
           <w:lang w:val="pl-PL"/>
         </w:rPr>
-        <w:t>c) typowy czas realizacji:  około 2 min.</w:t>
+        <w:t xml:space="preserve">c) typowy czas </w:t>
+      </w:r>
+      <w:proofErr w:type="gramStart"/>
+      <w:r>
+        <w:rPr>
+          <w:lang w:val="pl-PL"/>
+        </w:rPr>
+        <w:t>realizacji:  około</w:t>
+      </w:r>
+      <w:proofErr w:type="gramEnd"/>
+      <w:r>
+        <w:rPr>
+          <w:lang w:val="pl-PL"/>
+        </w:rPr>
+        <w:t xml:space="preserve"> 2 min.</w:t>
       </w:r>
     </w:p>
     <w:p>
@@ -2609,7 +2628,21 @@
         <w:rPr>
           <w:lang w:val="pl-PL"/>
         </w:rPr>
-        <w:t xml:space="preserve">Administrator (w ramach zarządzania biznesem ) odszukuje konkretnego użytkownika na liście. </w:t>
+        <w:t xml:space="preserve">Administrator (w ramach zarządzania </w:t>
+      </w:r>
+      <w:proofErr w:type="gramStart"/>
+      <w:r>
+        <w:rPr>
+          <w:lang w:val="pl-PL"/>
+        </w:rPr>
+        <w:t>biznesem )</w:t>
+      </w:r>
+      <w:proofErr w:type="gramEnd"/>
+      <w:r>
+        <w:rPr>
+          <w:lang w:val="pl-PL"/>
+        </w:rPr>
+        <w:t xml:space="preserve"> odszukuje konkretnego użytkownika na liście. </w:t>
       </w:r>
     </w:p>
     <w:p>
@@ -2881,13 +2914,27 @@
         <w:rPr>
           <w:lang w:val="pl-PL"/>
         </w:rPr>
-        <w:t xml:space="preserve">c) typowy czas realizacji: </w:t>
-      </w:r>
-      <w:r>
-        <w:rPr>
-          <w:lang w:val="pl-PL"/>
-        </w:rPr>
-        <w:t xml:space="preserve"> około </w:t>
+        <w:t xml:space="preserve">c) typowy czas </w:t>
+      </w:r>
+      <w:proofErr w:type="gramStart"/>
+      <w:r>
+        <w:rPr>
+          <w:lang w:val="pl-PL"/>
+        </w:rPr>
+        <w:t xml:space="preserve">realizacji: </w:t>
+      </w:r>
+      <w:r>
+        <w:rPr>
+          <w:lang w:val="pl-PL"/>
+        </w:rPr>
+        <w:t xml:space="preserve"> około</w:t>
+      </w:r>
+      <w:proofErr w:type="gramEnd"/>
+      <w:r>
+        <w:rPr>
+          <w:lang w:val="pl-PL"/>
+        </w:rPr>
+        <w:t xml:space="preserve"> </w:t>
       </w:r>
       <w:r>
         <w:rPr>
@@ -3036,29 +3083,885 @@
     </w:p>
     <w:p/>
     <w:p/>
+    <w:p/>
     <w:p>
       <w:pPr>
         <w:pStyle w:val="Nagwek2"/>
       </w:pPr>
       <w:r>
-        <w:t>5</w:t>
-      </w:r>
-      <w:r>
-        <w:t>.</w:t>
-      </w:r>
-      <w:r>
-        <w:t>1</w:t>
-      </w:r>
-      <w:r>
-        <w:t>.</w:t>
-      </w:r>
-      <w:r>
-        <w:t>Diagram klas</w:t>
+        <w:lastRenderedPageBreak/>
+        <w:t>4.</w:t>
+      </w:r>
+      <w:r>
+        <w:t>3. Diagramy interakcji z opisem tekstowym komunikatów</w:t>
+      </w:r>
+    </w:p>
+    <w:p>
+      <w:r>
+        <w:drawing>
+          <wp:inline distT="0" distB="0" distL="0" distR="0" wp14:anchorId="00E1434D" wp14:editId="6938D168">
+            <wp:extent cx="5733415" cy="2947670"/>
+            <wp:effectExtent l="0" t="0" r="0" b="0"/>
+            <wp:docPr id="1298766519" name="Obraz 1" descr="Obraz zawierający zrzut ekranu, diagram, tekst, linia&#10;&#10;Zawartość wygenerowana przez sztuczną inteligencję może być niepoprawna."/>
+            <wp:cNvGraphicFramePr>
+              <a:graphicFrameLocks xmlns:a="http://schemas.openxmlformats.org/drawingml/2006/main" noChangeAspect="1"/>
+            </wp:cNvGraphicFramePr>
+            <a:graphic xmlns:a="http://schemas.openxmlformats.org/drawingml/2006/main">
+              <a:graphicData uri="http://schemas.openxmlformats.org/drawingml/2006/picture">
+                <pic:pic xmlns:pic="http://schemas.openxmlformats.org/drawingml/2006/picture">
+                  <pic:nvPicPr>
+                    <pic:cNvPr id="1298766519" name="Obraz 1" descr="Obraz zawierający zrzut ekranu, diagram, tekst, linia&#10;&#10;Zawartość wygenerowana przez sztuczną inteligencję może być niepoprawna."/>
+                    <pic:cNvPicPr/>
+                  </pic:nvPicPr>
+                  <pic:blipFill>
+                    <a:blip r:embed="rId17"/>
+                    <a:stretch>
+                      <a:fillRect/>
+                    </a:stretch>
+                  </pic:blipFill>
+                  <pic:spPr>
+                    <a:xfrm>
+                      <a:off x="0" y="0"/>
+                      <a:ext cx="5733415" cy="2947670"/>
+                    </a:xfrm>
+                    <a:prstGeom prst="rect">
+                      <a:avLst/>
+                    </a:prstGeom>
+                  </pic:spPr>
+                </pic:pic>
+              </a:graphicData>
+            </a:graphic>
+          </wp:inline>
+        </w:drawing>
       </w:r>
     </w:p>
     <w:p/>
     <w:p>
-      <w:r>
+      <w:pPr>
+        <w:pStyle w:val="NormalnyWeb"/>
+        <w:spacing w:before="0" w:beforeAutospacing="0"/>
+        <w:rPr>
+          <w:rFonts w:ascii="Arial" w:hAnsi="Arial" w:cs="Arial"/>
+        </w:rPr>
+      </w:pPr>
+      <w:r>
+        <w:rPr>
+          <w:rFonts w:ascii="Arial" w:hAnsi="Arial" w:cs="Arial"/>
+          <w:b/>
+          <w:bCs/>
+        </w:rPr>
+        <w:t>. UI: Kliknięcie "Weryfikuj"</w:t>
+      </w:r>
+      <w:r>
+        <w:rPr>
+          <w:rFonts w:ascii="Arial" w:hAnsi="Arial" w:cs="Arial"/>
+        </w:rPr>
+        <w:t xml:space="preserve"> (Instruktor </w:t>
+      </w:r>
+      <w:r>
+        <w:rPr>
+          <w:rStyle w:val="math-inline"/>
+          <w:rFonts w:ascii="Arial" w:hAnsi="Arial" w:cs="Arial"/>
+        </w:rPr>
+        <w:t>$\rightarrow$</w:t>
+      </w:r>
+      <w:r>
+        <w:rPr>
+          <w:rFonts w:ascii="Arial" w:hAnsi="Arial" w:cs="Arial"/>
+        </w:rPr>
+        <w:t xml:space="preserve"> Widok: Lista wizyt)</w:t>
+      </w:r>
+    </w:p>
+    <w:p>
+      <w:pPr>
+        <w:pStyle w:val="NormalnyWeb"/>
+        <w:numPr>
+          <w:ilvl w:val="0"/>
+          <w:numId w:val="20"/>
+        </w:numPr>
+        <w:spacing w:before="0" w:beforeAutospacing="0"/>
+        <w:rPr>
+          <w:rFonts w:ascii="Arial" w:hAnsi="Arial" w:cs="Arial"/>
+        </w:rPr>
+      </w:pPr>
+      <w:r>
+        <w:rPr>
+          <w:rFonts w:ascii="Arial" w:hAnsi="Arial" w:cs="Arial"/>
+          <w:b/>
+          <w:bCs/>
+        </w:rPr>
+        <w:t>Typ komunikatu:</w:t>
+      </w:r>
+      <w:r>
+        <w:rPr>
+          <w:rFonts w:ascii="Arial" w:hAnsi="Arial" w:cs="Arial"/>
+        </w:rPr>
+        <w:t xml:space="preserve"> Synchroniczny (ciągła linia)</w:t>
+      </w:r>
+    </w:p>
+    <w:p>
+      <w:pPr>
+        <w:pStyle w:val="NormalnyWeb"/>
+        <w:numPr>
+          <w:ilvl w:val="0"/>
+          <w:numId w:val="20"/>
+        </w:numPr>
+        <w:spacing w:before="0" w:beforeAutospacing="0"/>
+        <w:rPr>
+          <w:rFonts w:ascii="Arial" w:hAnsi="Arial" w:cs="Arial"/>
+        </w:rPr>
+      </w:pPr>
+      <w:r>
+        <w:rPr>
+          <w:rFonts w:ascii="Arial" w:hAnsi="Arial" w:cs="Arial"/>
+          <w:b/>
+          <w:bCs/>
+        </w:rPr>
+        <w:t>Opis:</w:t>
+      </w:r>
+      <w:r>
+        <w:rPr>
+          <w:rFonts w:ascii="Arial" w:hAnsi="Arial" w:cs="Arial"/>
+        </w:rPr>
+        <w:t xml:space="preserve"> Instruktor wybiera opcję weryfikacji przy nazwisku klienta w głównym widoku aplikacji.</w:t>
+      </w:r>
+    </w:p>
+    <w:p>
+      <w:pPr>
+        <w:pStyle w:val="NormalnyWeb"/>
+        <w:spacing w:before="0" w:beforeAutospacing="0"/>
+        <w:rPr>
+          <w:rFonts w:ascii="Arial" w:hAnsi="Arial" w:cs="Arial"/>
+        </w:rPr>
+      </w:pPr>
+      <w:r>
+        <w:rPr>
+          <w:rFonts w:ascii="Arial" w:hAnsi="Arial" w:cs="Arial"/>
+          <w:b/>
+          <w:bCs/>
+        </w:rPr>
+        <w:t>2. Otwórz okienko</w:t>
+      </w:r>
+      <w:r>
+        <w:rPr>
+          <w:rFonts w:ascii="Arial" w:hAnsi="Arial" w:cs="Arial"/>
+        </w:rPr>
+        <w:t xml:space="preserve"> (Widok: Lista wizyt </w:t>
+      </w:r>
+      <w:r>
+        <w:rPr>
+          <w:rStyle w:val="math-inline"/>
+          <w:rFonts w:ascii="Arial" w:hAnsi="Arial" w:cs="Arial"/>
+        </w:rPr>
+        <w:t>$\rightarrow$</w:t>
+      </w:r>
+      <w:r>
+        <w:rPr>
+          <w:rFonts w:ascii="Arial" w:hAnsi="Arial" w:cs="Arial"/>
+        </w:rPr>
+        <w:t xml:space="preserve"> Okienko (Formularz))</w:t>
+      </w:r>
+    </w:p>
+    <w:p>
+      <w:pPr>
+        <w:pStyle w:val="NormalnyWeb"/>
+        <w:numPr>
+          <w:ilvl w:val="0"/>
+          <w:numId w:val="21"/>
+        </w:numPr>
+        <w:spacing w:before="0" w:beforeAutospacing="0"/>
+        <w:rPr>
+          <w:rFonts w:ascii="Arial" w:hAnsi="Arial" w:cs="Arial"/>
+        </w:rPr>
+      </w:pPr>
+      <w:r>
+        <w:rPr>
+          <w:rFonts w:ascii="Arial" w:hAnsi="Arial" w:cs="Arial"/>
+          <w:b/>
+          <w:bCs/>
+        </w:rPr>
+        <w:t>Typ komunikatu:</w:t>
+      </w:r>
+      <w:r>
+        <w:rPr>
+          <w:rFonts w:ascii="Arial" w:hAnsi="Arial" w:cs="Arial"/>
+        </w:rPr>
+        <w:t xml:space="preserve"> Synchroniczny / Tworzący (Create)</w:t>
+      </w:r>
+    </w:p>
+    <w:p>
+      <w:pPr>
+        <w:pStyle w:val="NormalnyWeb"/>
+        <w:numPr>
+          <w:ilvl w:val="0"/>
+          <w:numId w:val="21"/>
+        </w:numPr>
+        <w:spacing w:before="0" w:beforeAutospacing="0"/>
+        <w:rPr>
+          <w:rFonts w:ascii="Arial" w:hAnsi="Arial" w:cs="Arial"/>
+        </w:rPr>
+      </w:pPr>
+      <w:r>
+        <w:rPr>
+          <w:rFonts w:ascii="Arial" w:hAnsi="Arial" w:cs="Arial"/>
+          <w:b/>
+          <w:bCs/>
+        </w:rPr>
+        <w:t>Opis:</w:t>
+      </w:r>
+      <w:r>
+        <w:rPr>
+          <w:rFonts w:ascii="Arial" w:hAnsi="Arial" w:cs="Arial"/>
+        </w:rPr>
+        <w:t xml:space="preserve"> Główny widok inicjuje powstanie nowego obiektu na ekranie – wyskakującego formularza. Zauważ, że linia życia okienka zaczyna się dopiero w tym miejscu.</w:t>
+      </w:r>
+    </w:p>
+    <w:p>
+      <w:pPr>
+        <w:pStyle w:val="NormalnyWeb"/>
+        <w:spacing w:before="0" w:beforeAutospacing="0"/>
+        <w:rPr>
+          <w:rFonts w:ascii="Arial" w:hAnsi="Arial" w:cs="Arial"/>
+        </w:rPr>
+      </w:pPr>
+      <w:r>
+        <w:rPr>
+          <w:rFonts w:ascii="Arial" w:hAnsi="Arial" w:cs="Arial"/>
+          <w:b/>
+          <w:bCs/>
+        </w:rPr>
+        <w:t>3. Wpisanie danych i "Zatwierdź"</w:t>
+      </w:r>
+      <w:r>
+        <w:rPr>
+          <w:rFonts w:ascii="Arial" w:hAnsi="Arial" w:cs="Arial"/>
+        </w:rPr>
+        <w:t xml:space="preserve"> (Instruktor </w:t>
+      </w:r>
+      <w:r>
+        <w:rPr>
+          <w:rStyle w:val="math-inline"/>
+          <w:rFonts w:ascii="Arial" w:hAnsi="Arial" w:cs="Arial"/>
+        </w:rPr>
+        <w:t>$\rightarrow$</w:t>
+      </w:r>
+      <w:r>
+        <w:rPr>
+          <w:rFonts w:ascii="Arial" w:hAnsi="Arial" w:cs="Arial"/>
+        </w:rPr>
+        <w:t xml:space="preserve"> Okienko (Formularz))</w:t>
+      </w:r>
+    </w:p>
+    <w:p>
+      <w:pPr>
+        <w:pStyle w:val="NormalnyWeb"/>
+        <w:numPr>
+          <w:ilvl w:val="0"/>
+          <w:numId w:val="22"/>
+        </w:numPr>
+        <w:spacing w:before="0" w:beforeAutospacing="0"/>
+        <w:rPr>
+          <w:rFonts w:ascii="Arial" w:hAnsi="Arial" w:cs="Arial"/>
+        </w:rPr>
+      </w:pPr>
+      <w:r>
+        <w:rPr>
+          <w:rFonts w:ascii="Arial" w:hAnsi="Arial" w:cs="Arial"/>
+          <w:b/>
+          <w:bCs/>
+        </w:rPr>
+        <w:t>Typ komunikatu:</w:t>
+      </w:r>
+      <w:r>
+        <w:rPr>
+          <w:rFonts w:ascii="Arial" w:hAnsi="Arial" w:cs="Arial"/>
+        </w:rPr>
+        <w:t xml:space="preserve"> Synchroniczny</w:t>
+      </w:r>
+    </w:p>
+    <w:p>
+      <w:pPr>
+        <w:pStyle w:val="NormalnyWeb"/>
+        <w:numPr>
+          <w:ilvl w:val="0"/>
+          <w:numId w:val="22"/>
+        </w:numPr>
+        <w:spacing w:before="0" w:beforeAutospacing="0"/>
+        <w:rPr>
+          <w:rFonts w:ascii="Arial" w:hAnsi="Arial" w:cs="Arial"/>
+        </w:rPr>
+      </w:pPr>
+      <w:r>
+        <w:rPr>
+          <w:rFonts w:ascii="Arial" w:hAnsi="Arial" w:cs="Arial"/>
+          <w:b/>
+          <w:bCs/>
+        </w:rPr>
+        <w:t>Opis:</w:t>
+      </w:r>
+      <w:r>
+        <w:rPr>
+          <w:rFonts w:ascii="Arial" w:hAnsi="Arial" w:cs="Arial"/>
+        </w:rPr>
+        <w:t xml:space="preserve"> Pracownik fizycznie wprowadza dane z dowodu (PESEL) do formularza i klika przycisk zatwierdzający.</w:t>
+      </w:r>
+    </w:p>
+    <w:p>
+      <w:pPr>
+        <w:pStyle w:val="NormalnyWeb"/>
+        <w:spacing w:before="0" w:beforeAutospacing="0"/>
+        <w:rPr>
+          <w:rFonts w:ascii="Arial" w:hAnsi="Arial" w:cs="Arial"/>
+        </w:rPr>
+      </w:pPr>
+      <w:r>
+        <w:rPr>
+          <w:rFonts w:ascii="Arial" w:hAnsi="Arial" w:cs="Arial"/>
+          <w:b/>
+          <w:bCs/>
+        </w:rPr>
+        <w:t>4. Prześlij formularz</w:t>
+      </w:r>
+      <w:r>
+        <w:rPr>
+          <w:rFonts w:ascii="Arial" w:hAnsi="Arial" w:cs="Arial"/>
+        </w:rPr>
+        <w:t xml:space="preserve"> (Okienko (Formularz) </w:t>
+      </w:r>
+      <w:r>
+        <w:rPr>
+          <w:rStyle w:val="math-inline"/>
+          <w:rFonts w:ascii="Arial" w:hAnsi="Arial" w:cs="Arial"/>
+        </w:rPr>
+        <w:t>$\rightarrow$</w:t>
+      </w:r>
+      <w:r>
+        <w:rPr>
+          <w:rFonts w:ascii="Arial" w:hAnsi="Arial" w:cs="Arial"/>
+        </w:rPr>
+        <w:t xml:space="preserve"> Serwer)</w:t>
+      </w:r>
+    </w:p>
+    <w:p>
+      <w:pPr>
+        <w:pStyle w:val="NormalnyWeb"/>
+        <w:numPr>
+          <w:ilvl w:val="0"/>
+          <w:numId w:val="23"/>
+        </w:numPr>
+        <w:spacing w:before="0" w:beforeAutospacing="0"/>
+        <w:rPr>
+          <w:rFonts w:ascii="Arial" w:hAnsi="Arial" w:cs="Arial"/>
+        </w:rPr>
+      </w:pPr>
+      <w:r>
+        <w:rPr>
+          <w:rFonts w:ascii="Arial" w:hAnsi="Arial" w:cs="Arial"/>
+          <w:b/>
+          <w:bCs/>
+        </w:rPr>
+        <w:t>Typ komunikatu:</w:t>
+      </w:r>
+      <w:r>
+        <w:rPr>
+          <w:rFonts w:ascii="Arial" w:hAnsi="Arial" w:cs="Arial"/>
+        </w:rPr>
+        <w:t xml:space="preserve"> Synchroniczny</w:t>
+      </w:r>
+    </w:p>
+    <w:p>
+      <w:pPr>
+        <w:pStyle w:val="NormalnyWeb"/>
+        <w:numPr>
+          <w:ilvl w:val="0"/>
+          <w:numId w:val="23"/>
+        </w:numPr>
+        <w:spacing w:before="0" w:beforeAutospacing="0"/>
+        <w:rPr>
+          <w:rFonts w:ascii="Arial" w:hAnsi="Arial" w:cs="Arial"/>
+        </w:rPr>
+      </w:pPr>
+      <w:r>
+        <w:rPr>
+          <w:rFonts w:ascii="Arial" w:hAnsi="Arial" w:cs="Arial"/>
+          <w:b/>
+          <w:bCs/>
+        </w:rPr>
+        <w:t>Opis:</w:t>
+      </w:r>
+      <w:r>
+        <w:rPr>
+          <w:rFonts w:ascii="Arial" w:hAnsi="Arial" w:cs="Arial"/>
+        </w:rPr>
+        <w:t xml:space="preserve"> Formularz wysyła paczkę z wpisanymi danymi na serwer i oczekuje na ich przetworzenie.</w:t>
+      </w:r>
+    </w:p>
+    <w:p>
+      <w:pPr>
+        <w:pStyle w:val="NormalnyWeb"/>
+        <w:spacing w:before="0" w:beforeAutospacing="0"/>
+        <w:rPr>
+          <w:rFonts w:ascii="Arial" w:hAnsi="Arial" w:cs="Arial"/>
+        </w:rPr>
+      </w:pPr>
+      <w:r>
+        <w:rPr>
+          <w:rFonts w:ascii="Arial" w:hAnsi="Arial" w:cs="Arial"/>
+          <w:b/>
+          <w:bCs/>
+        </w:rPr>
+        <w:t>5. Zapisz dane</w:t>
+      </w:r>
+      <w:r>
+        <w:rPr>
+          <w:rFonts w:ascii="Arial" w:hAnsi="Arial" w:cs="Arial"/>
+        </w:rPr>
+        <w:t xml:space="preserve"> (Serwer </w:t>
+      </w:r>
+      <w:r>
+        <w:rPr>
+          <w:rStyle w:val="math-inline"/>
+          <w:rFonts w:ascii="Arial" w:hAnsi="Arial" w:cs="Arial"/>
+        </w:rPr>
+        <w:t>$\rightarrow$</w:t>
+      </w:r>
+      <w:r>
+        <w:rPr>
+          <w:rFonts w:ascii="Arial" w:hAnsi="Arial" w:cs="Arial"/>
+        </w:rPr>
+        <w:t xml:space="preserve"> Baza danych)</w:t>
+      </w:r>
+    </w:p>
+    <w:p>
+      <w:pPr>
+        <w:pStyle w:val="NormalnyWeb"/>
+        <w:numPr>
+          <w:ilvl w:val="0"/>
+          <w:numId w:val="24"/>
+        </w:numPr>
+        <w:spacing w:before="0" w:beforeAutospacing="0"/>
+        <w:rPr>
+          <w:rFonts w:ascii="Arial" w:hAnsi="Arial" w:cs="Arial"/>
+        </w:rPr>
+      </w:pPr>
+      <w:r>
+        <w:rPr>
+          <w:rFonts w:ascii="Arial" w:hAnsi="Arial" w:cs="Arial"/>
+          <w:b/>
+          <w:bCs/>
+        </w:rPr>
+        <w:t>Typ komunikatu:</w:t>
+      </w:r>
+      <w:r>
+        <w:rPr>
+          <w:rFonts w:ascii="Arial" w:hAnsi="Arial" w:cs="Arial"/>
+        </w:rPr>
+        <w:t xml:space="preserve"> Synchroniczny</w:t>
+      </w:r>
+    </w:p>
+    <w:p>
+      <w:pPr>
+        <w:pStyle w:val="NormalnyWeb"/>
+        <w:numPr>
+          <w:ilvl w:val="0"/>
+          <w:numId w:val="24"/>
+        </w:numPr>
+        <w:spacing w:before="0" w:beforeAutospacing="0"/>
+        <w:rPr>
+          <w:rFonts w:ascii="Arial" w:hAnsi="Arial" w:cs="Arial"/>
+        </w:rPr>
+      </w:pPr>
+      <w:r>
+        <w:rPr>
+          <w:rFonts w:ascii="Arial" w:hAnsi="Arial" w:cs="Arial"/>
+          <w:b/>
+          <w:bCs/>
+        </w:rPr>
+        <w:t>Opis:</w:t>
+      </w:r>
+      <w:r>
+        <w:rPr>
+          <w:rFonts w:ascii="Arial" w:hAnsi="Arial" w:cs="Arial"/>
+        </w:rPr>
+        <w:t xml:space="preserve"> Serwer przekazuje żądanie zapisu danych do bazy PostgreSQL, aby zaktualizować profil klienta.</w:t>
+      </w:r>
+    </w:p>
+    <w:p>
+      <w:pPr>
+        <w:pStyle w:val="NormalnyWeb"/>
+        <w:spacing w:before="0" w:beforeAutospacing="0"/>
+        <w:rPr>
+          <w:rFonts w:ascii="Arial" w:hAnsi="Arial" w:cs="Arial"/>
+        </w:rPr>
+      </w:pPr>
+      <w:r>
+        <w:rPr>
+          <w:rFonts w:ascii="Arial" w:hAnsi="Arial" w:cs="Arial"/>
+          <w:b/>
+          <w:bCs/>
+        </w:rPr>
+        <w:lastRenderedPageBreak/>
+        <w:t>6. Potwierdzenie zapisu</w:t>
+      </w:r>
+      <w:r>
+        <w:rPr>
+          <w:rFonts w:ascii="Arial" w:hAnsi="Arial" w:cs="Arial"/>
+        </w:rPr>
+        <w:t xml:space="preserve"> (Baza danych </w:t>
+      </w:r>
+      <w:r>
+        <w:rPr>
+          <w:rStyle w:val="math-inline"/>
+          <w:rFonts w:ascii="Arial" w:hAnsi="Arial" w:cs="Arial"/>
+        </w:rPr>
+        <w:t>$\rightarrow$</w:t>
+      </w:r>
+      <w:r>
+        <w:rPr>
+          <w:rFonts w:ascii="Arial" w:hAnsi="Arial" w:cs="Arial"/>
+        </w:rPr>
+        <w:t xml:space="preserve"> Serwer)</w:t>
+      </w:r>
+    </w:p>
+    <w:p>
+      <w:pPr>
+        <w:pStyle w:val="NormalnyWeb"/>
+        <w:numPr>
+          <w:ilvl w:val="0"/>
+          <w:numId w:val="25"/>
+        </w:numPr>
+        <w:spacing w:before="0" w:beforeAutospacing="0"/>
+        <w:rPr>
+          <w:rFonts w:ascii="Arial" w:hAnsi="Arial" w:cs="Arial"/>
+        </w:rPr>
+      </w:pPr>
+      <w:r>
+        <w:rPr>
+          <w:rFonts w:ascii="Arial" w:hAnsi="Arial" w:cs="Arial"/>
+          <w:b/>
+          <w:bCs/>
+        </w:rPr>
+        <w:t>Typ komunikatu:</w:t>
+      </w:r>
+      <w:r>
+        <w:rPr>
+          <w:rFonts w:ascii="Arial" w:hAnsi="Arial" w:cs="Arial"/>
+        </w:rPr>
+        <w:t xml:space="preserve"> Zwrotny (przerywana linia)</w:t>
+      </w:r>
+    </w:p>
+    <w:p>
+      <w:pPr>
+        <w:pStyle w:val="NormalnyWeb"/>
+        <w:numPr>
+          <w:ilvl w:val="0"/>
+          <w:numId w:val="25"/>
+        </w:numPr>
+        <w:spacing w:before="0" w:beforeAutospacing="0"/>
+        <w:rPr>
+          <w:rFonts w:ascii="Arial" w:hAnsi="Arial" w:cs="Arial"/>
+        </w:rPr>
+      </w:pPr>
+      <w:r>
+        <w:rPr>
+          <w:rFonts w:ascii="Arial" w:hAnsi="Arial" w:cs="Arial"/>
+          <w:b/>
+          <w:bCs/>
+        </w:rPr>
+        <w:t>Opis:</w:t>
+      </w:r>
+      <w:r>
+        <w:rPr>
+          <w:rFonts w:ascii="Arial" w:hAnsi="Arial" w:cs="Arial"/>
+        </w:rPr>
+        <w:t xml:space="preserve"> Baza danych zgłasza sukces operacji zapisu. Od tego momentu informacje wracają do użytkownika.</w:t>
+      </w:r>
+    </w:p>
+    <w:p>
+      <w:pPr>
+        <w:pStyle w:val="NormalnyWeb"/>
+        <w:spacing w:before="0" w:beforeAutospacing="0"/>
+        <w:rPr>
+          <w:rFonts w:ascii="Arial" w:hAnsi="Arial" w:cs="Arial"/>
+        </w:rPr>
+      </w:pPr>
+      <w:r>
+        <w:rPr>
+          <w:rFonts w:ascii="Arial" w:hAnsi="Arial" w:cs="Arial"/>
+          <w:b/>
+          <w:bCs/>
+        </w:rPr>
+        <w:t>7. Odpowiedź: Weryfikacja poprawna</w:t>
+      </w:r>
+      <w:r>
+        <w:rPr>
+          <w:rFonts w:ascii="Arial" w:hAnsi="Arial" w:cs="Arial"/>
+        </w:rPr>
+        <w:t xml:space="preserve"> (Serwer </w:t>
+      </w:r>
+      <w:r>
+        <w:rPr>
+          <w:rStyle w:val="math-inline"/>
+          <w:rFonts w:ascii="Arial" w:hAnsi="Arial" w:cs="Arial"/>
+        </w:rPr>
+        <w:t>$\rightarrow$</w:t>
+      </w:r>
+      <w:r>
+        <w:rPr>
+          <w:rFonts w:ascii="Arial" w:hAnsi="Arial" w:cs="Arial"/>
+        </w:rPr>
+        <w:t xml:space="preserve"> Okienko (Formularz))</w:t>
+      </w:r>
+    </w:p>
+    <w:p>
+      <w:pPr>
+        <w:pStyle w:val="NormalnyWeb"/>
+        <w:numPr>
+          <w:ilvl w:val="0"/>
+          <w:numId w:val="26"/>
+        </w:numPr>
+        <w:spacing w:before="0" w:beforeAutospacing="0"/>
+        <w:rPr>
+          <w:rFonts w:ascii="Arial" w:hAnsi="Arial" w:cs="Arial"/>
+        </w:rPr>
+      </w:pPr>
+      <w:r>
+        <w:rPr>
+          <w:rFonts w:ascii="Arial" w:hAnsi="Arial" w:cs="Arial"/>
+          <w:b/>
+          <w:bCs/>
+        </w:rPr>
+        <w:t>Typ komunikatu:</w:t>
+      </w:r>
+      <w:r>
+        <w:rPr>
+          <w:rFonts w:ascii="Arial" w:hAnsi="Arial" w:cs="Arial"/>
+        </w:rPr>
+        <w:t xml:space="preserve"> Zwrotny</w:t>
+      </w:r>
+    </w:p>
+    <w:p>
+      <w:pPr>
+        <w:pStyle w:val="NormalnyWeb"/>
+        <w:numPr>
+          <w:ilvl w:val="0"/>
+          <w:numId w:val="26"/>
+        </w:numPr>
+        <w:spacing w:before="0" w:beforeAutospacing="0"/>
+        <w:rPr>
+          <w:rFonts w:ascii="Arial" w:hAnsi="Arial" w:cs="Arial"/>
+        </w:rPr>
+      </w:pPr>
+      <w:r>
+        <w:rPr>
+          <w:rFonts w:ascii="Arial" w:hAnsi="Arial" w:cs="Arial"/>
+          <w:b/>
+          <w:bCs/>
+        </w:rPr>
+        <w:t>Opis:</w:t>
+      </w:r>
+      <w:r>
+        <w:rPr>
+          <w:rFonts w:ascii="Arial" w:hAnsi="Arial" w:cs="Arial"/>
+        </w:rPr>
+        <w:t xml:space="preserve"> Serwer informuje formularz, że cała procedura przeszła pomyślnie.</w:t>
+      </w:r>
+    </w:p>
+    <w:p>
+      <w:pPr>
+        <w:pStyle w:val="NormalnyWeb"/>
+        <w:spacing w:before="0" w:beforeAutospacing="0"/>
+        <w:rPr>
+          <w:rFonts w:ascii="Arial" w:hAnsi="Arial" w:cs="Arial"/>
+        </w:rPr>
+      </w:pPr>
+      <w:r>
+        <w:rPr>
+          <w:rFonts w:ascii="Arial" w:hAnsi="Arial" w:cs="Arial"/>
+          <w:b/>
+          <w:bCs/>
+        </w:rPr>
+        <w:t>8. Sygnał o sukcesie</w:t>
+      </w:r>
+      <w:r>
+        <w:rPr>
+          <w:rFonts w:ascii="Arial" w:hAnsi="Arial" w:cs="Arial"/>
+        </w:rPr>
+        <w:t xml:space="preserve"> (Okienko (Formularz) </w:t>
+      </w:r>
+      <w:r>
+        <w:rPr>
+          <w:rStyle w:val="math-inline"/>
+          <w:rFonts w:ascii="Arial" w:hAnsi="Arial" w:cs="Arial"/>
+        </w:rPr>
+        <w:t>$\rightarrow$</w:t>
+      </w:r>
+      <w:r>
+        <w:rPr>
+          <w:rFonts w:ascii="Arial" w:hAnsi="Arial" w:cs="Arial"/>
+        </w:rPr>
+        <w:t xml:space="preserve"> Widok: Lista wizyt)</w:t>
+      </w:r>
+    </w:p>
+    <w:p>
+      <w:pPr>
+        <w:pStyle w:val="NormalnyWeb"/>
+        <w:numPr>
+          <w:ilvl w:val="0"/>
+          <w:numId w:val="27"/>
+        </w:numPr>
+        <w:spacing w:before="0" w:beforeAutospacing="0"/>
+        <w:rPr>
+          <w:rFonts w:ascii="Arial" w:hAnsi="Arial" w:cs="Arial"/>
+        </w:rPr>
+      </w:pPr>
+      <w:r>
+        <w:rPr>
+          <w:rFonts w:ascii="Arial" w:hAnsi="Arial" w:cs="Arial"/>
+          <w:b/>
+          <w:bCs/>
+        </w:rPr>
+        <w:t>Typ komunikatu:</w:t>
+      </w:r>
+      <w:r>
+        <w:rPr>
+          <w:rFonts w:ascii="Arial" w:hAnsi="Arial" w:cs="Arial"/>
+        </w:rPr>
+        <w:t xml:space="preserve"> Zwrotny / Niszczący (Destroy)</w:t>
+      </w:r>
+    </w:p>
+    <w:p>
+      <w:pPr>
+        <w:pStyle w:val="NormalnyWeb"/>
+        <w:numPr>
+          <w:ilvl w:val="0"/>
+          <w:numId w:val="27"/>
+        </w:numPr>
+        <w:spacing w:before="0" w:beforeAutospacing="0"/>
+        <w:rPr>
+          <w:rFonts w:ascii="Arial" w:hAnsi="Arial" w:cs="Arial"/>
+        </w:rPr>
+      </w:pPr>
+      <w:r>
+        <w:rPr>
+          <w:rFonts w:ascii="Arial" w:hAnsi="Arial" w:cs="Arial"/>
+          <w:b/>
+          <w:bCs/>
+        </w:rPr>
+        <w:t>Opis:</w:t>
+      </w:r>
+      <w:r>
+        <w:rPr>
+          <w:rFonts w:ascii="Arial" w:hAnsi="Arial" w:cs="Arial"/>
+        </w:rPr>
+        <w:t xml:space="preserve"> Okienko przekazuje potwierdzenie do głównego widoku. Posiada symbol "X" na końcu linii życia, co oznacza, że w tym momencie obiekt formularza zostaje zamknięty i usunięty z pamięci ekranu.</w:t>
+      </w:r>
+    </w:p>
+    <w:p>
+      <w:pPr>
+        <w:pStyle w:val="NormalnyWeb"/>
+        <w:spacing w:before="0" w:beforeAutospacing="0"/>
+        <w:rPr>
+          <w:rFonts w:ascii="Arial" w:hAnsi="Arial" w:cs="Arial"/>
+        </w:rPr>
+      </w:pPr>
+      <w:r>
+        <w:rPr>
+          <w:rFonts w:ascii="Arial" w:hAnsi="Arial" w:cs="Arial"/>
+          <w:b/>
+          <w:bCs/>
+        </w:rPr>
+        <w:t>9. Odśwież widok na "Zweryfikowany"</w:t>
+      </w:r>
+      <w:r>
+        <w:rPr>
+          <w:rFonts w:ascii="Arial" w:hAnsi="Arial" w:cs="Arial"/>
+        </w:rPr>
+        <w:t xml:space="preserve"> (Widok: Lista wizyt </w:t>
+      </w:r>
+      <w:r>
+        <w:rPr>
+          <w:rStyle w:val="math-inline"/>
+          <w:rFonts w:ascii="Arial" w:hAnsi="Arial" w:cs="Arial"/>
+        </w:rPr>
+        <w:t>$\rightarrow$</w:t>
+      </w:r>
+      <w:r>
+        <w:rPr>
+          <w:rFonts w:ascii="Arial" w:hAnsi="Arial" w:cs="Arial"/>
+        </w:rPr>
+        <w:t xml:space="preserve"> Instruktor)</w:t>
+      </w:r>
+    </w:p>
+    <w:p>
+      <w:pPr>
+        <w:pStyle w:val="NormalnyWeb"/>
+        <w:numPr>
+          <w:ilvl w:val="0"/>
+          <w:numId w:val="28"/>
+        </w:numPr>
+        <w:spacing w:before="0" w:beforeAutospacing="0"/>
+        <w:rPr>
+          <w:rFonts w:ascii="Arial" w:hAnsi="Arial" w:cs="Arial"/>
+        </w:rPr>
+      </w:pPr>
+      <w:r>
+        <w:rPr>
+          <w:rFonts w:ascii="Arial" w:hAnsi="Arial" w:cs="Arial"/>
+          <w:b/>
+          <w:bCs/>
+        </w:rPr>
+        <w:t>Typ komunikatu:</w:t>
+      </w:r>
+      <w:r>
+        <w:rPr>
+          <w:rFonts w:ascii="Arial" w:hAnsi="Arial" w:cs="Arial"/>
+        </w:rPr>
+        <w:t xml:space="preserve"> Zwrotny</w:t>
+      </w:r>
+    </w:p>
+    <w:p>
+      <w:pPr>
+        <w:pStyle w:val="NormalnyWeb"/>
+        <w:numPr>
+          <w:ilvl w:val="0"/>
+          <w:numId w:val="28"/>
+        </w:numPr>
+        <w:spacing w:before="0" w:beforeAutospacing="0"/>
+        <w:rPr>
+          <w:rFonts w:ascii="Arial" w:hAnsi="Arial" w:cs="Arial"/>
+        </w:rPr>
+      </w:pPr>
+      <w:r>
+        <w:rPr>
+          <w:rFonts w:ascii="Arial" w:hAnsi="Arial" w:cs="Arial"/>
+          <w:b/>
+          <w:bCs/>
+        </w:rPr>
+        <w:t>Opis:</w:t>
+      </w:r>
+      <w:r>
+        <w:rPr>
+          <w:rFonts w:ascii="Arial" w:hAnsi="Arial" w:cs="Arial"/>
+        </w:rPr>
+        <w:t xml:space="preserve"> Interfejs główny aktualizuje się na ekranie instruktora, pokazując zielony status przy nazwisku klienta, co kończy cały proces.</w:t>
+      </w:r>
+    </w:p>
+    <w:p/>
+    <w:p>
+      <w:pPr>
+        <w:pStyle w:val="Nagwek2"/>
+      </w:pPr>
+      <w:r>
+        <w:t>5.1.Diagram klas</w:t>
+      </w:r>
+    </w:p>
+    <w:p/>
+    <w:p>
+      <w:r>
+        <w:rPr>
+          <w:noProof/>
+        </w:rPr>
         <w:lastRenderedPageBreak/>
         <w:drawing>
           <wp:inline distT="0" distB="0" distL="0" distR="0" wp14:anchorId="7849F836" wp14:editId="293D503A">
@@ -3076,7 +3979,7 @@
                     <pic:cNvPicPr/>
                   </pic:nvPicPr>
                   <pic:blipFill>
-                    <a:blip r:embed="rId17"/>
+                    <a:blip r:embed="rId18"/>
                     <a:stretch>
                       <a:fillRect/>
                     </a:stretch>
@@ -3372,6 +4275,304 @@
     </w:lvl>
   </w:abstractNum>
   <w:abstractNum w:abstractNumId="2" w15:restartNumberingAfterBreak="0">
+    <w:nsid w:val="0492056F"/>
+    <w:multiLevelType w:val="multilevel"/>
+    <w:tmpl w:val="65BC6A48"/>
+    <w:lvl w:ilvl="0">
+      <w:start w:val="1"/>
+      <w:numFmt w:val="bullet"/>
+      <w:lvlText w:val=""/>
+      <w:lvlJc w:val="left"/>
+      <w:pPr>
+        <w:tabs>
+          <w:tab w:val="num" w:pos="720"/>
+        </w:tabs>
+        <w:ind w:left="720" w:hanging="360"/>
+      </w:pPr>
+      <w:rPr>
+        <w:rFonts w:ascii="Symbol" w:hAnsi="Symbol" w:hint="default"/>
+        <w:sz w:val="20"/>
+      </w:rPr>
+    </w:lvl>
+    <w:lvl w:ilvl="1" w:tentative="1">
+      <w:start w:val="1"/>
+      <w:numFmt w:val="bullet"/>
+      <w:lvlText w:val="o"/>
+      <w:lvlJc w:val="left"/>
+      <w:pPr>
+        <w:tabs>
+          <w:tab w:val="num" w:pos="1440"/>
+        </w:tabs>
+        <w:ind w:left="1440" w:hanging="360"/>
+      </w:pPr>
+      <w:rPr>
+        <w:rFonts w:ascii="Courier New" w:hAnsi="Courier New" w:hint="default"/>
+        <w:sz w:val="20"/>
+      </w:rPr>
+    </w:lvl>
+    <w:lvl w:ilvl="2" w:tentative="1">
+      <w:start w:val="1"/>
+      <w:numFmt w:val="bullet"/>
+      <w:lvlText w:val=""/>
+      <w:lvlJc w:val="left"/>
+      <w:pPr>
+        <w:tabs>
+          <w:tab w:val="num" w:pos="2160"/>
+        </w:tabs>
+        <w:ind w:left="2160" w:hanging="360"/>
+      </w:pPr>
+      <w:rPr>
+        <w:rFonts w:ascii="Wingdings" w:hAnsi="Wingdings" w:hint="default"/>
+        <w:sz w:val="20"/>
+      </w:rPr>
+    </w:lvl>
+    <w:lvl w:ilvl="3" w:tentative="1">
+      <w:start w:val="1"/>
+      <w:numFmt w:val="bullet"/>
+      <w:lvlText w:val=""/>
+      <w:lvlJc w:val="left"/>
+      <w:pPr>
+        <w:tabs>
+          <w:tab w:val="num" w:pos="2880"/>
+        </w:tabs>
+        <w:ind w:left="2880" w:hanging="360"/>
+      </w:pPr>
+      <w:rPr>
+        <w:rFonts w:ascii="Wingdings" w:hAnsi="Wingdings" w:hint="default"/>
+        <w:sz w:val="20"/>
+      </w:rPr>
+    </w:lvl>
+    <w:lvl w:ilvl="4" w:tentative="1">
+      <w:start w:val="1"/>
+      <w:numFmt w:val="bullet"/>
+      <w:lvlText w:val=""/>
+      <w:lvlJc w:val="left"/>
+      <w:pPr>
+        <w:tabs>
+          <w:tab w:val="num" w:pos="3600"/>
+        </w:tabs>
+        <w:ind w:left="3600" w:hanging="360"/>
+      </w:pPr>
+      <w:rPr>
+        <w:rFonts w:ascii="Wingdings" w:hAnsi="Wingdings" w:hint="default"/>
+        <w:sz w:val="20"/>
+      </w:rPr>
+    </w:lvl>
+    <w:lvl w:ilvl="5" w:tentative="1">
+      <w:start w:val="1"/>
+      <w:numFmt w:val="bullet"/>
+      <w:lvlText w:val=""/>
+      <w:lvlJc w:val="left"/>
+      <w:pPr>
+        <w:tabs>
+          <w:tab w:val="num" w:pos="4320"/>
+        </w:tabs>
+        <w:ind w:left="4320" w:hanging="360"/>
+      </w:pPr>
+      <w:rPr>
+        <w:rFonts w:ascii="Wingdings" w:hAnsi="Wingdings" w:hint="default"/>
+        <w:sz w:val="20"/>
+      </w:rPr>
+    </w:lvl>
+    <w:lvl w:ilvl="6" w:tentative="1">
+      <w:start w:val="1"/>
+      <w:numFmt w:val="bullet"/>
+      <w:lvlText w:val=""/>
+      <w:lvlJc w:val="left"/>
+      <w:pPr>
+        <w:tabs>
+          <w:tab w:val="num" w:pos="5040"/>
+        </w:tabs>
+        <w:ind w:left="5040" w:hanging="360"/>
+      </w:pPr>
+      <w:rPr>
+        <w:rFonts w:ascii="Wingdings" w:hAnsi="Wingdings" w:hint="default"/>
+        <w:sz w:val="20"/>
+      </w:rPr>
+    </w:lvl>
+    <w:lvl w:ilvl="7" w:tentative="1">
+      <w:start w:val="1"/>
+      <w:numFmt w:val="bullet"/>
+      <w:lvlText w:val=""/>
+      <w:lvlJc w:val="left"/>
+      <w:pPr>
+        <w:tabs>
+          <w:tab w:val="num" w:pos="5760"/>
+        </w:tabs>
+        <w:ind w:left="5760" w:hanging="360"/>
+      </w:pPr>
+      <w:rPr>
+        <w:rFonts w:ascii="Wingdings" w:hAnsi="Wingdings" w:hint="default"/>
+        <w:sz w:val="20"/>
+      </w:rPr>
+    </w:lvl>
+    <w:lvl w:ilvl="8" w:tentative="1">
+      <w:start w:val="1"/>
+      <w:numFmt w:val="bullet"/>
+      <w:lvlText w:val=""/>
+      <w:lvlJc w:val="left"/>
+      <w:pPr>
+        <w:tabs>
+          <w:tab w:val="num" w:pos="6480"/>
+        </w:tabs>
+        <w:ind w:left="6480" w:hanging="360"/>
+      </w:pPr>
+      <w:rPr>
+        <w:rFonts w:ascii="Wingdings" w:hAnsi="Wingdings" w:hint="default"/>
+        <w:sz w:val="20"/>
+      </w:rPr>
+    </w:lvl>
+  </w:abstractNum>
+  <w:abstractNum w:abstractNumId="3" w15:restartNumberingAfterBreak="0">
+    <w:nsid w:val="07405C6C"/>
+    <w:multiLevelType w:val="multilevel"/>
+    <w:tmpl w:val="C770A500"/>
+    <w:lvl w:ilvl="0">
+      <w:start w:val="1"/>
+      <w:numFmt w:val="bullet"/>
+      <w:lvlText w:val=""/>
+      <w:lvlJc w:val="left"/>
+      <w:pPr>
+        <w:tabs>
+          <w:tab w:val="num" w:pos="720"/>
+        </w:tabs>
+        <w:ind w:left="720" w:hanging="360"/>
+      </w:pPr>
+      <w:rPr>
+        <w:rFonts w:ascii="Symbol" w:hAnsi="Symbol" w:hint="default"/>
+        <w:sz w:val="20"/>
+      </w:rPr>
+    </w:lvl>
+    <w:lvl w:ilvl="1" w:tentative="1">
+      <w:start w:val="1"/>
+      <w:numFmt w:val="bullet"/>
+      <w:lvlText w:val="o"/>
+      <w:lvlJc w:val="left"/>
+      <w:pPr>
+        <w:tabs>
+          <w:tab w:val="num" w:pos="1440"/>
+        </w:tabs>
+        <w:ind w:left="1440" w:hanging="360"/>
+      </w:pPr>
+      <w:rPr>
+        <w:rFonts w:ascii="Courier New" w:hAnsi="Courier New" w:hint="default"/>
+        <w:sz w:val="20"/>
+      </w:rPr>
+    </w:lvl>
+    <w:lvl w:ilvl="2" w:tentative="1">
+      <w:start w:val="1"/>
+      <w:numFmt w:val="bullet"/>
+      <w:lvlText w:val=""/>
+      <w:lvlJc w:val="left"/>
+      <w:pPr>
+        <w:tabs>
+          <w:tab w:val="num" w:pos="2160"/>
+        </w:tabs>
+        <w:ind w:left="2160" w:hanging="360"/>
+      </w:pPr>
+      <w:rPr>
+        <w:rFonts w:ascii="Wingdings" w:hAnsi="Wingdings" w:hint="default"/>
+        <w:sz w:val="20"/>
+      </w:rPr>
+    </w:lvl>
+    <w:lvl w:ilvl="3" w:tentative="1">
+      <w:start w:val="1"/>
+      <w:numFmt w:val="bullet"/>
+      <w:lvlText w:val=""/>
+      <w:lvlJc w:val="left"/>
+      <w:pPr>
+        <w:tabs>
+          <w:tab w:val="num" w:pos="2880"/>
+        </w:tabs>
+        <w:ind w:left="2880" w:hanging="360"/>
+      </w:pPr>
+      <w:rPr>
+        <w:rFonts w:ascii="Wingdings" w:hAnsi="Wingdings" w:hint="default"/>
+        <w:sz w:val="20"/>
+      </w:rPr>
+    </w:lvl>
+    <w:lvl w:ilvl="4" w:tentative="1">
+      <w:start w:val="1"/>
+      <w:numFmt w:val="bullet"/>
+      <w:lvlText w:val=""/>
+      <w:lvlJc w:val="left"/>
+      <w:pPr>
+        <w:tabs>
+          <w:tab w:val="num" w:pos="3600"/>
+        </w:tabs>
+        <w:ind w:left="3600" w:hanging="360"/>
+      </w:pPr>
+      <w:rPr>
+        <w:rFonts w:ascii="Wingdings" w:hAnsi="Wingdings" w:hint="default"/>
+        <w:sz w:val="20"/>
+      </w:rPr>
+    </w:lvl>
+    <w:lvl w:ilvl="5" w:tentative="1">
+      <w:start w:val="1"/>
+      <w:numFmt w:val="bullet"/>
+      <w:lvlText w:val=""/>
+      <w:lvlJc w:val="left"/>
+      <w:pPr>
+        <w:tabs>
+          <w:tab w:val="num" w:pos="4320"/>
+        </w:tabs>
+        <w:ind w:left="4320" w:hanging="360"/>
+      </w:pPr>
+      <w:rPr>
+        <w:rFonts w:ascii="Wingdings" w:hAnsi="Wingdings" w:hint="default"/>
+        <w:sz w:val="20"/>
+      </w:rPr>
+    </w:lvl>
+    <w:lvl w:ilvl="6" w:tentative="1">
+      <w:start w:val="1"/>
+      <w:numFmt w:val="bullet"/>
+      <w:lvlText w:val=""/>
+      <w:lvlJc w:val="left"/>
+      <w:pPr>
+        <w:tabs>
+          <w:tab w:val="num" w:pos="5040"/>
+        </w:tabs>
+        <w:ind w:left="5040" w:hanging="360"/>
+      </w:pPr>
+      <w:rPr>
+        <w:rFonts w:ascii="Wingdings" w:hAnsi="Wingdings" w:hint="default"/>
+        <w:sz w:val="20"/>
+      </w:rPr>
+    </w:lvl>
+    <w:lvl w:ilvl="7" w:tentative="1">
+      <w:start w:val="1"/>
+      <w:numFmt w:val="bullet"/>
+      <w:lvlText w:val=""/>
+      <w:lvlJc w:val="left"/>
+      <w:pPr>
+        <w:tabs>
+          <w:tab w:val="num" w:pos="5760"/>
+        </w:tabs>
+        <w:ind w:left="5760" w:hanging="360"/>
+      </w:pPr>
+      <w:rPr>
+        <w:rFonts w:ascii="Wingdings" w:hAnsi="Wingdings" w:hint="default"/>
+        <w:sz w:val="20"/>
+      </w:rPr>
+    </w:lvl>
+    <w:lvl w:ilvl="8" w:tentative="1">
+      <w:start w:val="1"/>
+      <w:numFmt w:val="bullet"/>
+      <w:lvlText w:val=""/>
+      <w:lvlJc w:val="left"/>
+      <w:pPr>
+        <w:tabs>
+          <w:tab w:val="num" w:pos="6480"/>
+        </w:tabs>
+        <w:ind w:left="6480" w:hanging="360"/>
+      </w:pPr>
+      <w:rPr>
+        <w:rFonts w:ascii="Wingdings" w:hAnsi="Wingdings" w:hint="default"/>
+        <w:sz w:val="20"/>
+      </w:rPr>
+    </w:lvl>
+  </w:abstractNum>
+  <w:abstractNum w:abstractNumId="4" w15:restartNumberingAfterBreak="0">
     <w:nsid w:val="07587360"/>
     <w:multiLevelType w:val="multilevel"/>
     <w:tmpl w:val="113217FE"/>
@@ -3520,7 +4721,7 @@
       </w:rPr>
     </w:lvl>
   </w:abstractNum>
-  <w:abstractNum w:abstractNumId="3" w15:restartNumberingAfterBreak="0">
+  <w:abstractNum w:abstractNumId="5" w15:restartNumberingAfterBreak="0">
     <w:nsid w:val="0CD63013"/>
     <w:multiLevelType w:val="multilevel"/>
     <w:tmpl w:val="0DAAA6F8"/>
@@ -3669,7 +4870,7 @@
       </w:rPr>
     </w:lvl>
   </w:abstractNum>
-  <w:abstractNum w:abstractNumId="4" w15:restartNumberingAfterBreak="0">
+  <w:abstractNum w:abstractNumId="6" w15:restartNumberingAfterBreak="0">
     <w:nsid w:val="110E6C06"/>
     <w:multiLevelType w:val="multilevel"/>
     <w:tmpl w:val="FA2064DE"/>
@@ -3818,7 +5019,7 @@
       </w:rPr>
     </w:lvl>
   </w:abstractNum>
-  <w:abstractNum w:abstractNumId="5" w15:restartNumberingAfterBreak="0">
+  <w:abstractNum w:abstractNumId="7" w15:restartNumberingAfterBreak="0">
     <w:nsid w:val="125B5BE0"/>
     <w:multiLevelType w:val="multilevel"/>
     <w:tmpl w:val="EC8AE780"/>
@@ -3967,7 +5168,156 @@
       </w:rPr>
     </w:lvl>
   </w:abstractNum>
-  <w:abstractNum w:abstractNumId="6" w15:restartNumberingAfterBreak="0">
+  <w:abstractNum w:abstractNumId="8" w15:restartNumberingAfterBreak="0">
+    <w:nsid w:val="14704865"/>
+    <w:multiLevelType w:val="multilevel"/>
+    <w:tmpl w:val="3AB47482"/>
+    <w:lvl w:ilvl="0">
+      <w:start w:val="1"/>
+      <w:numFmt w:val="bullet"/>
+      <w:lvlText w:val=""/>
+      <w:lvlJc w:val="left"/>
+      <w:pPr>
+        <w:tabs>
+          <w:tab w:val="num" w:pos="720"/>
+        </w:tabs>
+        <w:ind w:left="720" w:hanging="360"/>
+      </w:pPr>
+      <w:rPr>
+        <w:rFonts w:ascii="Symbol" w:hAnsi="Symbol" w:hint="default"/>
+        <w:sz w:val="20"/>
+      </w:rPr>
+    </w:lvl>
+    <w:lvl w:ilvl="1" w:tentative="1">
+      <w:start w:val="1"/>
+      <w:numFmt w:val="bullet"/>
+      <w:lvlText w:val="o"/>
+      <w:lvlJc w:val="left"/>
+      <w:pPr>
+        <w:tabs>
+          <w:tab w:val="num" w:pos="1440"/>
+        </w:tabs>
+        <w:ind w:left="1440" w:hanging="360"/>
+      </w:pPr>
+      <w:rPr>
+        <w:rFonts w:ascii="Courier New" w:hAnsi="Courier New" w:hint="default"/>
+        <w:sz w:val="20"/>
+      </w:rPr>
+    </w:lvl>
+    <w:lvl w:ilvl="2" w:tentative="1">
+      <w:start w:val="1"/>
+      <w:numFmt w:val="bullet"/>
+      <w:lvlText w:val=""/>
+      <w:lvlJc w:val="left"/>
+      <w:pPr>
+        <w:tabs>
+          <w:tab w:val="num" w:pos="2160"/>
+        </w:tabs>
+        <w:ind w:left="2160" w:hanging="360"/>
+      </w:pPr>
+      <w:rPr>
+        <w:rFonts w:ascii="Wingdings" w:hAnsi="Wingdings" w:hint="default"/>
+        <w:sz w:val="20"/>
+      </w:rPr>
+    </w:lvl>
+    <w:lvl w:ilvl="3" w:tentative="1">
+      <w:start w:val="1"/>
+      <w:numFmt w:val="bullet"/>
+      <w:lvlText w:val=""/>
+      <w:lvlJc w:val="left"/>
+      <w:pPr>
+        <w:tabs>
+          <w:tab w:val="num" w:pos="2880"/>
+        </w:tabs>
+        <w:ind w:left="2880" w:hanging="360"/>
+      </w:pPr>
+      <w:rPr>
+        <w:rFonts w:ascii="Wingdings" w:hAnsi="Wingdings" w:hint="default"/>
+        <w:sz w:val="20"/>
+      </w:rPr>
+    </w:lvl>
+    <w:lvl w:ilvl="4" w:tentative="1">
+      <w:start w:val="1"/>
+      <w:numFmt w:val="bullet"/>
+      <w:lvlText w:val=""/>
+      <w:lvlJc w:val="left"/>
+      <w:pPr>
+        <w:tabs>
+          <w:tab w:val="num" w:pos="3600"/>
+        </w:tabs>
+        <w:ind w:left="3600" w:hanging="360"/>
+      </w:pPr>
+      <w:rPr>
+        <w:rFonts w:ascii="Wingdings" w:hAnsi="Wingdings" w:hint="default"/>
+        <w:sz w:val="20"/>
+      </w:rPr>
+    </w:lvl>
+    <w:lvl w:ilvl="5" w:tentative="1">
+      <w:start w:val="1"/>
+      <w:numFmt w:val="bullet"/>
+      <w:lvlText w:val=""/>
+      <w:lvlJc w:val="left"/>
+      <w:pPr>
+        <w:tabs>
+          <w:tab w:val="num" w:pos="4320"/>
+        </w:tabs>
+        <w:ind w:left="4320" w:hanging="360"/>
+      </w:pPr>
+      <w:rPr>
+        <w:rFonts w:ascii="Wingdings" w:hAnsi="Wingdings" w:hint="default"/>
+        <w:sz w:val="20"/>
+      </w:rPr>
+    </w:lvl>
+    <w:lvl w:ilvl="6" w:tentative="1">
+      <w:start w:val="1"/>
+      <w:numFmt w:val="bullet"/>
+      <w:lvlText w:val=""/>
+      <w:lvlJc w:val="left"/>
+      <w:pPr>
+        <w:tabs>
+          <w:tab w:val="num" w:pos="5040"/>
+        </w:tabs>
+        <w:ind w:left="5040" w:hanging="360"/>
+      </w:pPr>
+      <w:rPr>
+        <w:rFonts w:ascii="Wingdings" w:hAnsi="Wingdings" w:hint="default"/>
+        <w:sz w:val="20"/>
+      </w:rPr>
+    </w:lvl>
+    <w:lvl w:ilvl="7" w:tentative="1">
+      <w:start w:val="1"/>
+      <w:numFmt w:val="bullet"/>
+      <w:lvlText w:val=""/>
+      <w:lvlJc w:val="left"/>
+      <w:pPr>
+        <w:tabs>
+          <w:tab w:val="num" w:pos="5760"/>
+        </w:tabs>
+        <w:ind w:left="5760" w:hanging="360"/>
+      </w:pPr>
+      <w:rPr>
+        <w:rFonts w:ascii="Wingdings" w:hAnsi="Wingdings" w:hint="default"/>
+        <w:sz w:val="20"/>
+      </w:rPr>
+    </w:lvl>
+    <w:lvl w:ilvl="8" w:tentative="1">
+      <w:start w:val="1"/>
+      <w:numFmt w:val="bullet"/>
+      <w:lvlText w:val=""/>
+      <w:lvlJc w:val="left"/>
+      <w:pPr>
+        <w:tabs>
+          <w:tab w:val="num" w:pos="6480"/>
+        </w:tabs>
+        <w:ind w:left="6480" w:hanging="360"/>
+      </w:pPr>
+      <w:rPr>
+        <w:rFonts w:ascii="Wingdings" w:hAnsi="Wingdings" w:hint="default"/>
+        <w:sz w:val="20"/>
+      </w:rPr>
+    </w:lvl>
+  </w:abstractNum>
+  <w:abstractNum w:abstractNumId="9" w15:restartNumberingAfterBreak="0">
     <w:nsid w:val="155A5289"/>
     <w:multiLevelType w:val="multilevel"/>
     <w:tmpl w:val="5754B56E"/>
@@ -4116,7 +5466,7 @@
       </w:rPr>
     </w:lvl>
   </w:abstractNum>
-  <w:abstractNum w:abstractNumId="7" w15:restartNumberingAfterBreak="0">
+  <w:abstractNum w:abstractNumId="10" w15:restartNumberingAfterBreak="0">
     <w:nsid w:val="1B9016D0"/>
     <w:multiLevelType w:val="multilevel"/>
     <w:tmpl w:val="BE428F12"/>
@@ -4261,7 +5611,7 @@
       </w:rPr>
     </w:lvl>
   </w:abstractNum>
-  <w:abstractNum w:abstractNumId="8" w15:restartNumberingAfterBreak="0">
+  <w:abstractNum w:abstractNumId="11" w15:restartNumberingAfterBreak="0">
     <w:nsid w:val="2C0876D3"/>
     <w:multiLevelType w:val="multilevel"/>
     <w:tmpl w:val="851E5E6A"/>
@@ -4410,7 +5760,7 @@
       </w:rPr>
     </w:lvl>
   </w:abstractNum>
-  <w:abstractNum w:abstractNumId="9" w15:restartNumberingAfterBreak="0">
+  <w:abstractNum w:abstractNumId="12" w15:restartNumberingAfterBreak="0">
     <w:nsid w:val="2CA15019"/>
     <w:multiLevelType w:val="multilevel"/>
     <w:tmpl w:val="1F2AD544"/>
@@ -4559,7 +5909,7 @@
       </w:rPr>
     </w:lvl>
   </w:abstractNum>
-  <w:abstractNum w:abstractNumId="10" w15:restartNumberingAfterBreak="0">
+  <w:abstractNum w:abstractNumId="13" w15:restartNumberingAfterBreak="0">
     <w:nsid w:val="2D751BDF"/>
     <w:multiLevelType w:val="multilevel"/>
     <w:tmpl w:val="FE7A3A3E"/>
@@ -4708,7 +6058,7 @@
       </w:rPr>
     </w:lvl>
   </w:abstractNum>
-  <w:abstractNum w:abstractNumId="11" w15:restartNumberingAfterBreak="0">
+  <w:abstractNum w:abstractNumId="14" w15:restartNumberingAfterBreak="0">
     <w:nsid w:val="2F482656"/>
     <w:multiLevelType w:val="multilevel"/>
     <w:tmpl w:val="E960CF18"/>
@@ -4857,7 +6207,156 @@
       </w:rPr>
     </w:lvl>
   </w:abstractNum>
-  <w:abstractNum w:abstractNumId="12" w15:restartNumberingAfterBreak="0">
+  <w:abstractNum w:abstractNumId="15" w15:restartNumberingAfterBreak="0">
+    <w:nsid w:val="36761323"/>
+    <w:multiLevelType w:val="multilevel"/>
+    <w:tmpl w:val="9B3A65EE"/>
+    <w:lvl w:ilvl="0">
+      <w:start w:val="1"/>
+      <w:numFmt w:val="bullet"/>
+      <w:lvlText w:val=""/>
+      <w:lvlJc w:val="left"/>
+      <w:pPr>
+        <w:tabs>
+          <w:tab w:val="num" w:pos="720"/>
+        </w:tabs>
+        <w:ind w:left="720" w:hanging="360"/>
+      </w:pPr>
+      <w:rPr>
+        <w:rFonts w:ascii="Symbol" w:hAnsi="Symbol" w:hint="default"/>
+        <w:sz w:val="20"/>
+      </w:rPr>
+    </w:lvl>
+    <w:lvl w:ilvl="1" w:tentative="1">
+      <w:start w:val="1"/>
+      <w:numFmt w:val="bullet"/>
+      <w:lvlText w:val="o"/>
+      <w:lvlJc w:val="left"/>
+      <w:pPr>
+        <w:tabs>
+          <w:tab w:val="num" w:pos="1440"/>
+        </w:tabs>
+        <w:ind w:left="1440" w:hanging="360"/>
+      </w:pPr>
+      <w:rPr>
+        <w:rFonts w:ascii="Courier New" w:hAnsi="Courier New" w:hint="default"/>
+        <w:sz w:val="20"/>
+      </w:rPr>
+    </w:lvl>
+    <w:lvl w:ilvl="2" w:tentative="1">
+      <w:start w:val="1"/>
+      <w:numFmt w:val="bullet"/>
+      <w:lvlText w:val=""/>
+      <w:lvlJc w:val="left"/>
+      <w:pPr>
+        <w:tabs>
+          <w:tab w:val="num" w:pos="2160"/>
+        </w:tabs>
+        <w:ind w:left="2160" w:hanging="360"/>
+      </w:pPr>
+      <w:rPr>
+        <w:rFonts w:ascii="Wingdings" w:hAnsi="Wingdings" w:hint="default"/>
+        <w:sz w:val="20"/>
+      </w:rPr>
+    </w:lvl>
+    <w:lvl w:ilvl="3" w:tentative="1">
+      <w:start w:val="1"/>
+      <w:numFmt w:val="bullet"/>
+      <w:lvlText w:val=""/>
+      <w:lvlJc w:val="left"/>
+      <w:pPr>
+        <w:tabs>
+          <w:tab w:val="num" w:pos="2880"/>
+        </w:tabs>
+        <w:ind w:left="2880" w:hanging="360"/>
+      </w:pPr>
+      <w:rPr>
+        <w:rFonts w:ascii="Wingdings" w:hAnsi="Wingdings" w:hint="default"/>
+        <w:sz w:val="20"/>
+      </w:rPr>
+    </w:lvl>
+    <w:lvl w:ilvl="4" w:tentative="1">
+      <w:start w:val="1"/>
+      <w:numFmt w:val="bullet"/>
+      <w:lvlText w:val=""/>
+      <w:lvlJc w:val="left"/>
+      <w:pPr>
+        <w:tabs>
+          <w:tab w:val="num" w:pos="3600"/>
+        </w:tabs>
+        <w:ind w:left="3600" w:hanging="360"/>
+      </w:pPr>
+      <w:rPr>
+        <w:rFonts w:ascii="Wingdings" w:hAnsi="Wingdings" w:hint="default"/>
+        <w:sz w:val="20"/>
+      </w:rPr>
+    </w:lvl>
+    <w:lvl w:ilvl="5" w:tentative="1">
+      <w:start w:val="1"/>
+      <w:numFmt w:val="bullet"/>
+      <w:lvlText w:val=""/>
+      <w:lvlJc w:val="left"/>
+      <w:pPr>
+        <w:tabs>
+          <w:tab w:val="num" w:pos="4320"/>
+        </w:tabs>
+        <w:ind w:left="4320" w:hanging="360"/>
+      </w:pPr>
+      <w:rPr>
+        <w:rFonts w:ascii="Wingdings" w:hAnsi="Wingdings" w:hint="default"/>
+        <w:sz w:val="20"/>
+      </w:rPr>
+    </w:lvl>
+    <w:lvl w:ilvl="6" w:tentative="1">
+      <w:start w:val="1"/>
+      <w:numFmt w:val="bullet"/>
+      <w:lvlText w:val=""/>
+      <w:lvlJc w:val="left"/>
+      <w:pPr>
+        <w:tabs>
+          <w:tab w:val="num" w:pos="5040"/>
+        </w:tabs>
+        <w:ind w:left="5040" w:hanging="360"/>
+      </w:pPr>
+      <w:rPr>
+        <w:rFonts w:ascii="Wingdings" w:hAnsi="Wingdings" w:hint="default"/>
+        <w:sz w:val="20"/>
+      </w:rPr>
+    </w:lvl>
+    <w:lvl w:ilvl="7" w:tentative="1">
+      <w:start w:val="1"/>
+      <w:numFmt w:val="bullet"/>
+      <w:lvlText w:val=""/>
+      <w:lvlJc w:val="left"/>
+      <w:pPr>
+        <w:tabs>
+          <w:tab w:val="num" w:pos="5760"/>
+        </w:tabs>
+        <w:ind w:left="5760" w:hanging="360"/>
+      </w:pPr>
+      <w:rPr>
+        <w:rFonts w:ascii="Wingdings" w:hAnsi="Wingdings" w:hint="default"/>
+        <w:sz w:val="20"/>
+      </w:rPr>
+    </w:lvl>
+    <w:lvl w:ilvl="8" w:tentative="1">
+      <w:start w:val="1"/>
+      <w:numFmt w:val="bullet"/>
+      <w:lvlText w:val=""/>
+      <w:lvlJc w:val="left"/>
+      <w:pPr>
+        <w:tabs>
+          <w:tab w:val="num" w:pos="6480"/>
+        </w:tabs>
+        <w:ind w:left="6480" w:hanging="360"/>
+      </w:pPr>
+      <w:rPr>
+        <w:rFonts w:ascii="Wingdings" w:hAnsi="Wingdings" w:hint="default"/>
+        <w:sz w:val="20"/>
+      </w:rPr>
+    </w:lvl>
+  </w:abstractNum>
+  <w:abstractNum w:abstractNumId="16" w15:restartNumberingAfterBreak="0">
     <w:nsid w:val="384E59F2"/>
     <w:multiLevelType w:val="multilevel"/>
     <w:tmpl w:val="E6804330"/>
@@ -5002,7 +6501,156 @@
       </w:rPr>
     </w:lvl>
   </w:abstractNum>
-  <w:abstractNum w:abstractNumId="13" w15:restartNumberingAfterBreak="0">
+  <w:abstractNum w:abstractNumId="17" w15:restartNumberingAfterBreak="0">
+    <w:nsid w:val="50366D62"/>
+    <w:multiLevelType w:val="multilevel"/>
+    <w:tmpl w:val="4364DAF2"/>
+    <w:lvl w:ilvl="0">
+      <w:start w:val="1"/>
+      <w:numFmt w:val="bullet"/>
+      <w:lvlText w:val=""/>
+      <w:lvlJc w:val="left"/>
+      <w:pPr>
+        <w:tabs>
+          <w:tab w:val="num" w:pos="720"/>
+        </w:tabs>
+        <w:ind w:left="720" w:hanging="360"/>
+      </w:pPr>
+      <w:rPr>
+        <w:rFonts w:ascii="Symbol" w:hAnsi="Symbol" w:hint="default"/>
+        <w:sz w:val="20"/>
+      </w:rPr>
+    </w:lvl>
+    <w:lvl w:ilvl="1" w:tentative="1">
+      <w:start w:val="1"/>
+      <w:numFmt w:val="bullet"/>
+      <w:lvlText w:val="o"/>
+      <w:lvlJc w:val="left"/>
+      <w:pPr>
+        <w:tabs>
+          <w:tab w:val="num" w:pos="1440"/>
+        </w:tabs>
+        <w:ind w:left="1440" w:hanging="360"/>
+      </w:pPr>
+      <w:rPr>
+        <w:rFonts w:ascii="Courier New" w:hAnsi="Courier New" w:hint="default"/>
+        <w:sz w:val="20"/>
+      </w:rPr>
+    </w:lvl>
+    <w:lvl w:ilvl="2" w:tentative="1">
+      <w:start w:val="1"/>
+      <w:numFmt w:val="bullet"/>
+      <w:lvlText w:val=""/>
+      <w:lvlJc w:val="left"/>
+      <w:pPr>
+        <w:tabs>
+          <w:tab w:val="num" w:pos="2160"/>
+        </w:tabs>
+        <w:ind w:left="2160" w:hanging="360"/>
+      </w:pPr>
+      <w:rPr>
+        <w:rFonts w:ascii="Wingdings" w:hAnsi="Wingdings" w:hint="default"/>
+        <w:sz w:val="20"/>
+      </w:rPr>
+    </w:lvl>
+    <w:lvl w:ilvl="3" w:tentative="1">
+      <w:start w:val="1"/>
+      <w:numFmt w:val="bullet"/>
+      <w:lvlText w:val=""/>
+      <w:lvlJc w:val="left"/>
+      <w:pPr>
+        <w:tabs>
+          <w:tab w:val="num" w:pos="2880"/>
+        </w:tabs>
+        <w:ind w:left="2880" w:hanging="360"/>
+      </w:pPr>
+      <w:rPr>
+        <w:rFonts w:ascii="Wingdings" w:hAnsi="Wingdings" w:hint="default"/>
+        <w:sz w:val="20"/>
+      </w:rPr>
+    </w:lvl>
+    <w:lvl w:ilvl="4" w:tentative="1">
+      <w:start w:val="1"/>
+      <w:numFmt w:val="bullet"/>
+      <w:lvlText w:val=""/>
+      <w:lvlJc w:val="left"/>
+      <w:pPr>
+        <w:tabs>
+          <w:tab w:val="num" w:pos="3600"/>
+        </w:tabs>
+        <w:ind w:left="3600" w:hanging="360"/>
+      </w:pPr>
+      <w:rPr>
+        <w:rFonts w:ascii="Wingdings" w:hAnsi="Wingdings" w:hint="default"/>
+        <w:sz w:val="20"/>
+      </w:rPr>
+    </w:lvl>
+    <w:lvl w:ilvl="5" w:tentative="1">
+      <w:start w:val="1"/>
+      <w:numFmt w:val="bullet"/>
+      <w:lvlText w:val=""/>
+      <w:lvlJc w:val="left"/>
+      <w:pPr>
+        <w:tabs>
+          <w:tab w:val="num" w:pos="4320"/>
+        </w:tabs>
+        <w:ind w:left="4320" w:hanging="360"/>
+      </w:pPr>
+      <w:rPr>
+        <w:rFonts w:ascii="Wingdings" w:hAnsi="Wingdings" w:hint="default"/>
+        <w:sz w:val="20"/>
+      </w:rPr>
+    </w:lvl>
+    <w:lvl w:ilvl="6" w:tentative="1">
+      <w:start w:val="1"/>
+      <w:numFmt w:val="bullet"/>
+      <w:lvlText w:val=""/>
+      <w:lvlJc w:val="left"/>
+      <w:pPr>
+        <w:tabs>
+          <w:tab w:val="num" w:pos="5040"/>
+        </w:tabs>
+        <w:ind w:left="5040" w:hanging="360"/>
+      </w:pPr>
+      <w:rPr>
+        <w:rFonts w:ascii="Wingdings" w:hAnsi="Wingdings" w:hint="default"/>
+        <w:sz w:val="20"/>
+      </w:rPr>
+    </w:lvl>
+    <w:lvl w:ilvl="7" w:tentative="1">
+      <w:start w:val="1"/>
+      <w:numFmt w:val="bullet"/>
+      <w:lvlText w:val=""/>
+      <w:lvlJc w:val="left"/>
+      <w:pPr>
+        <w:tabs>
+          <w:tab w:val="num" w:pos="5760"/>
+        </w:tabs>
+        <w:ind w:left="5760" w:hanging="360"/>
+      </w:pPr>
+      <w:rPr>
+        <w:rFonts w:ascii="Wingdings" w:hAnsi="Wingdings" w:hint="default"/>
+        <w:sz w:val="20"/>
+      </w:rPr>
+    </w:lvl>
+    <w:lvl w:ilvl="8" w:tentative="1">
+      <w:start w:val="1"/>
+      <w:numFmt w:val="bullet"/>
+      <w:lvlText w:val=""/>
+      <w:lvlJc w:val="left"/>
+      <w:pPr>
+        <w:tabs>
+          <w:tab w:val="num" w:pos="6480"/>
+        </w:tabs>
+        <w:ind w:left="6480" w:hanging="360"/>
+      </w:pPr>
+      <w:rPr>
+        <w:rFonts w:ascii="Wingdings" w:hAnsi="Wingdings" w:hint="default"/>
+        <w:sz w:val="20"/>
+      </w:rPr>
+    </w:lvl>
+  </w:abstractNum>
+  <w:abstractNum w:abstractNumId="18" w15:restartNumberingAfterBreak="0">
     <w:nsid w:val="51185237"/>
     <w:multiLevelType w:val="multilevel"/>
     <w:tmpl w:val="E6804330"/>
@@ -5147,7 +6795,7 @@
       </w:rPr>
     </w:lvl>
   </w:abstractNum>
-  <w:abstractNum w:abstractNumId="14" w15:restartNumberingAfterBreak="0">
+  <w:abstractNum w:abstractNumId="19" w15:restartNumberingAfterBreak="0">
     <w:nsid w:val="525B3D4A"/>
     <w:multiLevelType w:val="multilevel"/>
     <w:tmpl w:val="1DB86164"/>
@@ -5296,7 +6944,7 @@
       </w:rPr>
     </w:lvl>
   </w:abstractNum>
-  <w:abstractNum w:abstractNumId="15" w15:restartNumberingAfterBreak="0">
+  <w:abstractNum w:abstractNumId="20" w15:restartNumberingAfterBreak="0">
     <w:nsid w:val="5E332311"/>
     <w:multiLevelType w:val="multilevel"/>
     <w:tmpl w:val="FD56597C"/>
@@ -5445,7 +7093,603 @@
       </w:rPr>
     </w:lvl>
   </w:abstractNum>
-  <w:abstractNum w:abstractNumId="16" w15:restartNumberingAfterBreak="0">
+  <w:abstractNum w:abstractNumId="21" w15:restartNumberingAfterBreak="0">
+    <w:nsid w:val="64A67214"/>
+    <w:multiLevelType w:val="multilevel"/>
+    <w:tmpl w:val="5832EF0A"/>
+    <w:lvl w:ilvl="0">
+      <w:start w:val="1"/>
+      <w:numFmt w:val="bullet"/>
+      <w:lvlText w:val=""/>
+      <w:lvlJc w:val="left"/>
+      <w:pPr>
+        <w:tabs>
+          <w:tab w:val="num" w:pos="720"/>
+        </w:tabs>
+        <w:ind w:left="720" w:hanging="360"/>
+      </w:pPr>
+      <w:rPr>
+        <w:rFonts w:ascii="Symbol" w:hAnsi="Symbol" w:hint="default"/>
+        <w:sz w:val="20"/>
+      </w:rPr>
+    </w:lvl>
+    <w:lvl w:ilvl="1" w:tentative="1">
+      <w:start w:val="1"/>
+      <w:numFmt w:val="bullet"/>
+      <w:lvlText w:val="o"/>
+      <w:lvlJc w:val="left"/>
+      <w:pPr>
+        <w:tabs>
+          <w:tab w:val="num" w:pos="1440"/>
+        </w:tabs>
+        <w:ind w:left="1440" w:hanging="360"/>
+      </w:pPr>
+      <w:rPr>
+        <w:rFonts w:ascii="Courier New" w:hAnsi="Courier New" w:hint="default"/>
+        <w:sz w:val="20"/>
+      </w:rPr>
+    </w:lvl>
+    <w:lvl w:ilvl="2" w:tentative="1">
+      <w:start w:val="1"/>
+      <w:numFmt w:val="bullet"/>
+      <w:lvlText w:val=""/>
+      <w:lvlJc w:val="left"/>
+      <w:pPr>
+        <w:tabs>
+          <w:tab w:val="num" w:pos="2160"/>
+        </w:tabs>
+        <w:ind w:left="2160" w:hanging="360"/>
+      </w:pPr>
+      <w:rPr>
+        <w:rFonts w:ascii="Wingdings" w:hAnsi="Wingdings" w:hint="default"/>
+        <w:sz w:val="20"/>
+      </w:rPr>
+    </w:lvl>
+    <w:lvl w:ilvl="3" w:tentative="1">
+      <w:start w:val="1"/>
+      <w:numFmt w:val="bullet"/>
+      <w:lvlText w:val=""/>
+      <w:lvlJc w:val="left"/>
+      <w:pPr>
+        <w:tabs>
+          <w:tab w:val="num" w:pos="2880"/>
+        </w:tabs>
+        <w:ind w:left="2880" w:hanging="360"/>
+      </w:pPr>
+      <w:rPr>
+        <w:rFonts w:ascii="Wingdings" w:hAnsi="Wingdings" w:hint="default"/>
+        <w:sz w:val="20"/>
+      </w:rPr>
+    </w:lvl>
+    <w:lvl w:ilvl="4" w:tentative="1">
+      <w:start w:val="1"/>
+      <w:numFmt w:val="bullet"/>
+      <w:lvlText w:val=""/>
+      <w:lvlJc w:val="left"/>
+      <w:pPr>
+        <w:tabs>
+          <w:tab w:val="num" w:pos="3600"/>
+        </w:tabs>
+        <w:ind w:left="3600" w:hanging="360"/>
+      </w:pPr>
+      <w:rPr>
+        <w:rFonts w:ascii="Wingdings" w:hAnsi="Wingdings" w:hint="default"/>
+        <w:sz w:val="20"/>
+      </w:rPr>
+    </w:lvl>
+    <w:lvl w:ilvl="5" w:tentative="1">
+      <w:start w:val="1"/>
+      <w:numFmt w:val="bullet"/>
+      <w:lvlText w:val=""/>
+      <w:lvlJc w:val="left"/>
+      <w:pPr>
+        <w:tabs>
+          <w:tab w:val="num" w:pos="4320"/>
+        </w:tabs>
+        <w:ind w:left="4320" w:hanging="360"/>
+      </w:pPr>
+      <w:rPr>
+        <w:rFonts w:ascii="Wingdings" w:hAnsi="Wingdings" w:hint="default"/>
+        <w:sz w:val="20"/>
+      </w:rPr>
+    </w:lvl>
+    <w:lvl w:ilvl="6" w:tentative="1">
+      <w:start w:val="1"/>
+      <w:numFmt w:val="bullet"/>
+      <w:lvlText w:val=""/>
+      <w:lvlJc w:val="left"/>
+      <w:pPr>
+        <w:tabs>
+          <w:tab w:val="num" w:pos="5040"/>
+        </w:tabs>
+        <w:ind w:left="5040" w:hanging="360"/>
+      </w:pPr>
+      <w:rPr>
+        <w:rFonts w:ascii="Wingdings" w:hAnsi="Wingdings" w:hint="default"/>
+        <w:sz w:val="20"/>
+      </w:rPr>
+    </w:lvl>
+    <w:lvl w:ilvl="7" w:tentative="1">
+      <w:start w:val="1"/>
+      <w:numFmt w:val="bullet"/>
+      <w:lvlText w:val=""/>
+      <w:lvlJc w:val="left"/>
+      <w:pPr>
+        <w:tabs>
+          <w:tab w:val="num" w:pos="5760"/>
+        </w:tabs>
+        <w:ind w:left="5760" w:hanging="360"/>
+      </w:pPr>
+      <w:rPr>
+        <w:rFonts w:ascii="Wingdings" w:hAnsi="Wingdings" w:hint="default"/>
+        <w:sz w:val="20"/>
+      </w:rPr>
+    </w:lvl>
+    <w:lvl w:ilvl="8" w:tentative="1">
+      <w:start w:val="1"/>
+      <w:numFmt w:val="bullet"/>
+      <w:lvlText w:val=""/>
+      <w:lvlJc w:val="left"/>
+      <w:pPr>
+        <w:tabs>
+          <w:tab w:val="num" w:pos="6480"/>
+        </w:tabs>
+        <w:ind w:left="6480" w:hanging="360"/>
+      </w:pPr>
+      <w:rPr>
+        <w:rFonts w:ascii="Wingdings" w:hAnsi="Wingdings" w:hint="default"/>
+        <w:sz w:val="20"/>
+      </w:rPr>
+    </w:lvl>
+  </w:abstractNum>
+  <w:abstractNum w:abstractNumId="22" w15:restartNumberingAfterBreak="0">
+    <w:nsid w:val="66C25ECD"/>
+    <w:multiLevelType w:val="multilevel"/>
+    <w:tmpl w:val="64B00C14"/>
+    <w:lvl w:ilvl="0">
+      <w:start w:val="1"/>
+      <w:numFmt w:val="bullet"/>
+      <w:lvlText w:val=""/>
+      <w:lvlJc w:val="left"/>
+      <w:pPr>
+        <w:tabs>
+          <w:tab w:val="num" w:pos="720"/>
+        </w:tabs>
+        <w:ind w:left="720" w:hanging="360"/>
+      </w:pPr>
+      <w:rPr>
+        <w:rFonts w:ascii="Symbol" w:hAnsi="Symbol" w:hint="default"/>
+        <w:sz w:val="20"/>
+      </w:rPr>
+    </w:lvl>
+    <w:lvl w:ilvl="1" w:tentative="1">
+      <w:start w:val="1"/>
+      <w:numFmt w:val="bullet"/>
+      <w:lvlText w:val="o"/>
+      <w:lvlJc w:val="left"/>
+      <w:pPr>
+        <w:tabs>
+          <w:tab w:val="num" w:pos="1440"/>
+        </w:tabs>
+        <w:ind w:left="1440" w:hanging="360"/>
+      </w:pPr>
+      <w:rPr>
+        <w:rFonts w:ascii="Courier New" w:hAnsi="Courier New" w:hint="default"/>
+        <w:sz w:val="20"/>
+      </w:rPr>
+    </w:lvl>
+    <w:lvl w:ilvl="2" w:tentative="1">
+      <w:start w:val="1"/>
+      <w:numFmt w:val="bullet"/>
+      <w:lvlText w:val=""/>
+      <w:lvlJc w:val="left"/>
+      <w:pPr>
+        <w:tabs>
+          <w:tab w:val="num" w:pos="2160"/>
+        </w:tabs>
+        <w:ind w:left="2160" w:hanging="360"/>
+      </w:pPr>
+      <w:rPr>
+        <w:rFonts w:ascii="Wingdings" w:hAnsi="Wingdings" w:hint="default"/>
+        <w:sz w:val="20"/>
+      </w:rPr>
+    </w:lvl>
+    <w:lvl w:ilvl="3" w:tentative="1">
+      <w:start w:val="1"/>
+      <w:numFmt w:val="bullet"/>
+      <w:lvlText w:val=""/>
+      <w:lvlJc w:val="left"/>
+      <w:pPr>
+        <w:tabs>
+          <w:tab w:val="num" w:pos="2880"/>
+        </w:tabs>
+        <w:ind w:left="2880" w:hanging="360"/>
+      </w:pPr>
+      <w:rPr>
+        <w:rFonts w:ascii="Wingdings" w:hAnsi="Wingdings" w:hint="default"/>
+        <w:sz w:val="20"/>
+      </w:rPr>
+    </w:lvl>
+    <w:lvl w:ilvl="4" w:tentative="1">
+      <w:start w:val="1"/>
+      <w:numFmt w:val="bullet"/>
+      <w:lvlText w:val=""/>
+      <w:lvlJc w:val="left"/>
+      <w:pPr>
+        <w:tabs>
+          <w:tab w:val="num" w:pos="3600"/>
+        </w:tabs>
+        <w:ind w:left="3600" w:hanging="360"/>
+      </w:pPr>
+      <w:rPr>
+        <w:rFonts w:ascii="Wingdings" w:hAnsi="Wingdings" w:hint="default"/>
+        <w:sz w:val="20"/>
+      </w:rPr>
+    </w:lvl>
+    <w:lvl w:ilvl="5" w:tentative="1">
+      <w:start w:val="1"/>
+      <w:numFmt w:val="bullet"/>
+      <w:lvlText w:val=""/>
+      <w:lvlJc w:val="left"/>
+      <w:pPr>
+        <w:tabs>
+          <w:tab w:val="num" w:pos="4320"/>
+        </w:tabs>
+        <w:ind w:left="4320" w:hanging="360"/>
+      </w:pPr>
+      <w:rPr>
+        <w:rFonts w:ascii="Wingdings" w:hAnsi="Wingdings" w:hint="default"/>
+        <w:sz w:val="20"/>
+      </w:rPr>
+    </w:lvl>
+    <w:lvl w:ilvl="6" w:tentative="1">
+      <w:start w:val="1"/>
+      <w:numFmt w:val="bullet"/>
+      <w:lvlText w:val=""/>
+      <w:lvlJc w:val="left"/>
+      <w:pPr>
+        <w:tabs>
+          <w:tab w:val="num" w:pos="5040"/>
+        </w:tabs>
+        <w:ind w:left="5040" w:hanging="360"/>
+      </w:pPr>
+      <w:rPr>
+        <w:rFonts w:ascii="Wingdings" w:hAnsi="Wingdings" w:hint="default"/>
+        <w:sz w:val="20"/>
+      </w:rPr>
+    </w:lvl>
+    <w:lvl w:ilvl="7" w:tentative="1">
+      <w:start w:val="1"/>
+      <w:numFmt w:val="bullet"/>
+      <w:lvlText w:val=""/>
+      <w:lvlJc w:val="left"/>
+      <w:pPr>
+        <w:tabs>
+          <w:tab w:val="num" w:pos="5760"/>
+        </w:tabs>
+        <w:ind w:left="5760" w:hanging="360"/>
+      </w:pPr>
+      <w:rPr>
+        <w:rFonts w:ascii="Wingdings" w:hAnsi="Wingdings" w:hint="default"/>
+        <w:sz w:val="20"/>
+      </w:rPr>
+    </w:lvl>
+    <w:lvl w:ilvl="8" w:tentative="1">
+      <w:start w:val="1"/>
+      <w:numFmt w:val="bullet"/>
+      <w:lvlText w:val=""/>
+      <w:lvlJc w:val="left"/>
+      <w:pPr>
+        <w:tabs>
+          <w:tab w:val="num" w:pos="6480"/>
+        </w:tabs>
+        <w:ind w:left="6480" w:hanging="360"/>
+      </w:pPr>
+      <w:rPr>
+        <w:rFonts w:ascii="Wingdings" w:hAnsi="Wingdings" w:hint="default"/>
+        <w:sz w:val="20"/>
+      </w:rPr>
+    </w:lvl>
+  </w:abstractNum>
+  <w:abstractNum w:abstractNumId="23" w15:restartNumberingAfterBreak="0">
+    <w:nsid w:val="6753371C"/>
+    <w:multiLevelType w:val="multilevel"/>
+    <w:tmpl w:val="DFB22E06"/>
+    <w:lvl w:ilvl="0">
+      <w:start w:val="1"/>
+      <w:numFmt w:val="bullet"/>
+      <w:lvlText w:val=""/>
+      <w:lvlJc w:val="left"/>
+      <w:pPr>
+        <w:tabs>
+          <w:tab w:val="num" w:pos="720"/>
+        </w:tabs>
+        <w:ind w:left="720" w:hanging="360"/>
+      </w:pPr>
+      <w:rPr>
+        <w:rFonts w:ascii="Symbol" w:hAnsi="Symbol" w:hint="default"/>
+        <w:sz w:val="20"/>
+      </w:rPr>
+    </w:lvl>
+    <w:lvl w:ilvl="1" w:tentative="1">
+      <w:start w:val="1"/>
+      <w:numFmt w:val="bullet"/>
+      <w:lvlText w:val="o"/>
+      <w:lvlJc w:val="left"/>
+      <w:pPr>
+        <w:tabs>
+          <w:tab w:val="num" w:pos="1440"/>
+        </w:tabs>
+        <w:ind w:left="1440" w:hanging="360"/>
+      </w:pPr>
+      <w:rPr>
+        <w:rFonts w:ascii="Courier New" w:hAnsi="Courier New" w:hint="default"/>
+        <w:sz w:val="20"/>
+      </w:rPr>
+    </w:lvl>
+    <w:lvl w:ilvl="2" w:tentative="1">
+      <w:start w:val="1"/>
+      <w:numFmt w:val="bullet"/>
+      <w:lvlText w:val=""/>
+      <w:lvlJc w:val="left"/>
+      <w:pPr>
+        <w:tabs>
+          <w:tab w:val="num" w:pos="2160"/>
+        </w:tabs>
+        <w:ind w:left="2160" w:hanging="360"/>
+      </w:pPr>
+      <w:rPr>
+        <w:rFonts w:ascii="Wingdings" w:hAnsi="Wingdings" w:hint="default"/>
+        <w:sz w:val="20"/>
+      </w:rPr>
+    </w:lvl>
+    <w:lvl w:ilvl="3" w:tentative="1">
+      <w:start w:val="1"/>
+      <w:numFmt w:val="bullet"/>
+      <w:lvlText w:val=""/>
+      <w:lvlJc w:val="left"/>
+      <w:pPr>
+        <w:tabs>
+          <w:tab w:val="num" w:pos="2880"/>
+        </w:tabs>
+        <w:ind w:left="2880" w:hanging="360"/>
+      </w:pPr>
+      <w:rPr>
+        <w:rFonts w:ascii="Wingdings" w:hAnsi="Wingdings" w:hint="default"/>
+        <w:sz w:val="20"/>
+      </w:rPr>
+    </w:lvl>
+    <w:lvl w:ilvl="4" w:tentative="1">
+      <w:start w:val="1"/>
+      <w:numFmt w:val="bullet"/>
+      <w:lvlText w:val=""/>
+      <w:lvlJc w:val="left"/>
+      <w:pPr>
+        <w:tabs>
+          <w:tab w:val="num" w:pos="3600"/>
+        </w:tabs>
+        <w:ind w:left="3600" w:hanging="360"/>
+      </w:pPr>
+      <w:rPr>
+        <w:rFonts w:ascii="Wingdings" w:hAnsi="Wingdings" w:hint="default"/>
+        <w:sz w:val="20"/>
+      </w:rPr>
+    </w:lvl>
+    <w:lvl w:ilvl="5" w:tentative="1">
+      <w:start w:val="1"/>
+      <w:numFmt w:val="bullet"/>
+      <w:lvlText w:val=""/>
+      <w:lvlJc w:val="left"/>
+      <w:pPr>
+        <w:tabs>
+          <w:tab w:val="num" w:pos="4320"/>
+        </w:tabs>
+        <w:ind w:left="4320" w:hanging="360"/>
+      </w:pPr>
+      <w:rPr>
+        <w:rFonts w:ascii="Wingdings" w:hAnsi="Wingdings" w:hint="default"/>
+        <w:sz w:val="20"/>
+      </w:rPr>
+    </w:lvl>
+    <w:lvl w:ilvl="6" w:tentative="1">
+      <w:start w:val="1"/>
+      <w:numFmt w:val="bullet"/>
+      <w:lvlText w:val=""/>
+      <w:lvlJc w:val="left"/>
+      <w:pPr>
+        <w:tabs>
+          <w:tab w:val="num" w:pos="5040"/>
+        </w:tabs>
+        <w:ind w:left="5040" w:hanging="360"/>
+      </w:pPr>
+      <w:rPr>
+        <w:rFonts w:ascii="Wingdings" w:hAnsi="Wingdings" w:hint="default"/>
+        <w:sz w:val="20"/>
+      </w:rPr>
+    </w:lvl>
+    <w:lvl w:ilvl="7" w:tentative="1">
+      <w:start w:val="1"/>
+      <w:numFmt w:val="bullet"/>
+      <w:lvlText w:val=""/>
+      <w:lvlJc w:val="left"/>
+      <w:pPr>
+        <w:tabs>
+          <w:tab w:val="num" w:pos="5760"/>
+        </w:tabs>
+        <w:ind w:left="5760" w:hanging="360"/>
+      </w:pPr>
+      <w:rPr>
+        <w:rFonts w:ascii="Wingdings" w:hAnsi="Wingdings" w:hint="default"/>
+        <w:sz w:val="20"/>
+      </w:rPr>
+    </w:lvl>
+    <w:lvl w:ilvl="8" w:tentative="1">
+      <w:start w:val="1"/>
+      <w:numFmt w:val="bullet"/>
+      <w:lvlText w:val=""/>
+      <w:lvlJc w:val="left"/>
+      <w:pPr>
+        <w:tabs>
+          <w:tab w:val="num" w:pos="6480"/>
+        </w:tabs>
+        <w:ind w:left="6480" w:hanging="360"/>
+      </w:pPr>
+      <w:rPr>
+        <w:rFonts w:ascii="Wingdings" w:hAnsi="Wingdings" w:hint="default"/>
+        <w:sz w:val="20"/>
+      </w:rPr>
+    </w:lvl>
+  </w:abstractNum>
+  <w:abstractNum w:abstractNumId="24" w15:restartNumberingAfterBreak="0">
+    <w:nsid w:val="68780586"/>
+    <w:multiLevelType w:val="multilevel"/>
+    <w:tmpl w:val="0D98D3BC"/>
+    <w:lvl w:ilvl="0">
+      <w:start w:val="1"/>
+      <w:numFmt w:val="bullet"/>
+      <w:lvlText w:val=""/>
+      <w:lvlJc w:val="left"/>
+      <w:pPr>
+        <w:tabs>
+          <w:tab w:val="num" w:pos="720"/>
+        </w:tabs>
+        <w:ind w:left="720" w:hanging="360"/>
+      </w:pPr>
+      <w:rPr>
+        <w:rFonts w:ascii="Symbol" w:hAnsi="Symbol" w:hint="default"/>
+        <w:sz w:val="20"/>
+      </w:rPr>
+    </w:lvl>
+    <w:lvl w:ilvl="1" w:tentative="1">
+      <w:start w:val="1"/>
+      <w:numFmt w:val="bullet"/>
+      <w:lvlText w:val="o"/>
+      <w:lvlJc w:val="left"/>
+      <w:pPr>
+        <w:tabs>
+          <w:tab w:val="num" w:pos="1440"/>
+        </w:tabs>
+        <w:ind w:left="1440" w:hanging="360"/>
+      </w:pPr>
+      <w:rPr>
+        <w:rFonts w:ascii="Courier New" w:hAnsi="Courier New" w:hint="default"/>
+        <w:sz w:val="20"/>
+      </w:rPr>
+    </w:lvl>
+    <w:lvl w:ilvl="2" w:tentative="1">
+      <w:start w:val="1"/>
+      <w:numFmt w:val="bullet"/>
+      <w:lvlText w:val=""/>
+      <w:lvlJc w:val="left"/>
+      <w:pPr>
+        <w:tabs>
+          <w:tab w:val="num" w:pos="2160"/>
+        </w:tabs>
+        <w:ind w:left="2160" w:hanging="360"/>
+      </w:pPr>
+      <w:rPr>
+        <w:rFonts w:ascii="Wingdings" w:hAnsi="Wingdings" w:hint="default"/>
+        <w:sz w:val="20"/>
+      </w:rPr>
+    </w:lvl>
+    <w:lvl w:ilvl="3" w:tentative="1">
+      <w:start w:val="1"/>
+      <w:numFmt w:val="bullet"/>
+      <w:lvlText w:val=""/>
+      <w:lvlJc w:val="left"/>
+      <w:pPr>
+        <w:tabs>
+          <w:tab w:val="num" w:pos="2880"/>
+        </w:tabs>
+        <w:ind w:left="2880" w:hanging="360"/>
+      </w:pPr>
+      <w:rPr>
+        <w:rFonts w:ascii="Wingdings" w:hAnsi="Wingdings" w:hint="default"/>
+        <w:sz w:val="20"/>
+      </w:rPr>
+    </w:lvl>
+    <w:lvl w:ilvl="4" w:tentative="1">
+      <w:start w:val="1"/>
+      <w:numFmt w:val="bullet"/>
+      <w:lvlText w:val=""/>
+      <w:lvlJc w:val="left"/>
+      <w:pPr>
+        <w:tabs>
+          <w:tab w:val="num" w:pos="3600"/>
+        </w:tabs>
+        <w:ind w:left="3600" w:hanging="360"/>
+      </w:pPr>
+      <w:rPr>
+        <w:rFonts w:ascii="Wingdings" w:hAnsi="Wingdings" w:hint="default"/>
+        <w:sz w:val="20"/>
+      </w:rPr>
+    </w:lvl>
+    <w:lvl w:ilvl="5" w:tentative="1">
+      <w:start w:val="1"/>
+      <w:numFmt w:val="bullet"/>
+      <w:lvlText w:val=""/>
+      <w:lvlJc w:val="left"/>
+      <w:pPr>
+        <w:tabs>
+          <w:tab w:val="num" w:pos="4320"/>
+        </w:tabs>
+        <w:ind w:left="4320" w:hanging="360"/>
+      </w:pPr>
+      <w:rPr>
+        <w:rFonts w:ascii="Wingdings" w:hAnsi="Wingdings" w:hint="default"/>
+        <w:sz w:val="20"/>
+      </w:rPr>
+    </w:lvl>
+    <w:lvl w:ilvl="6" w:tentative="1">
+      <w:start w:val="1"/>
+      <w:numFmt w:val="bullet"/>
+      <w:lvlText w:val=""/>
+      <w:lvlJc w:val="left"/>
+      <w:pPr>
+        <w:tabs>
+          <w:tab w:val="num" w:pos="5040"/>
+        </w:tabs>
+        <w:ind w:left="5040" w:hanging="360"/>
+      </w:pPr>
+      <w:rPr>
+        <w:rFonts w:ascii="Wingdings" w:hAnsi="Wingdings" w:hint="default"/>
+        <w:sz w:val="20"/>
+      </w:rPr>
+    </w:lvl>
+    <w:lvl w:ilvl="7" w:tentative="1">
+      <w:start w:val="1"/>
+      <w:numFmt w:val="bullet"/>
+      <w:lvlText w:val=""/>
+      <w:lvlJc w:val="left"/>
+      <w:pPr>
+        <w:tabs>
+          <w:tab w:val="num" w:pos="5760"/>
+        </w:tabs>
+        <w:ind w:left="5760" w:hanging="360"/>
+      </w:pPr>
+      <w:rPr>
+        <w:rFonts w:ascii="Wingdings" w:hAnsi="Wingdings" w:hint="default"/>
+        <w:sz w:val="20"/>
+      </w:rPr>
+    </w:lvl>
+    <w:lvl w:ilvl="8" w:tentative="1">
+      <w:start w:val="1"/>
+      <w:numFmt w:val="bullet"/>
+      <w:lvlText w:val=""/>
+      <w:lvlJc w:val="left"/>
+      <w:pPr>
+        <w:tabs>
+          <w:tab w:val="num" w:pos="6480"/>
+        </w:tabs>
+        <w:ind w:left="6480" w:hanging="360"/>
+      </w:pPr>
+      <w:rPr>
+        <w:rFonts w:ascii="Wingdings" w:hAnsi="Wingdings" w:hint="default"/>
+        <w:sz w:val="20"/>
+      </w:rPr>
+    </w:lvl>
+  </w:abstractNum>
+  <w:abstractNum w:abstractNumId="25" w15:restartNumberingAfterBreak="0">
     <w:nsid w:val="705C59C3"/>
     <w:multiLevelType w:val="multilevel"/>
     <w:tmpl w:val="A17CC40E"/>
@@ -5558,7 +7802,7 @@
       </w:rPr>
     </w:lvl>
   </w:abstractNum>
-  <w:abstractNum w:abstractNumId="17" w15:restartNumberingAfterBreak="0">
+  <w:abstractNum w:abstractNumId="26" w15:restartNumberingAfterBreak="0">
     <w:nsid w:val="7B83239D"/>
     <w:multiLevelType w:val="multilevel"/>
     <w:tmpl w:val="F7CE4D54"/>
@@ -5707,7 +7951,7 @@
       </w:rPr>
     </w:lvl>
   </w:abstractNum>
-  <w:abstractNum w:abstractNumId="18" w15:restartNumberingAfterBreak="0">
+  <w:abstractNum w:abstractNumId="27" w15:restartNumberingAfterBreak="0">
     <w:nsid w:val="7CAD52F7"/>
     <w:multiLevelType w:val="multilevel"/>
     <w:tmpl w:val="4844C838"/>
@@ -5824,58 +8068,85 @@
     <w:abstractNumId w:val="0"/>
   </w:num>
   <w:num w:numId="2" w16cid:durableId="1095515092">
-    <w:abstractNumId w:val="18"/>
+    <w:abstractNumId w:val="27"/>
   </w:num>
   <w:num w:numId="3" w16cid:durableId="1685980699">
-    <w:abstractNumId w:val="16"/>
+    <w:abstractNumId w:val="25"/>
   </w:num>
   <w:num w:numId="4" w16cid:durableId="1642424421">
+    <w:abstractNumId w:val="13"/>
+  </w:num>
+  <w:num w:numId="5" w16cid:durableId="871652371">
+    <w:abstractNumId w:val="14"/>
+  </w:num>
+  <w:num w:numId="6" w16cid:durableId="152574065">
+    <w:abstractNumId w:val="5"/>
+  </w:num>
+  <w:num w:numId="7" w16cid:durableId="1809665043">
+    <w:abstractNumId w:val="19"/>
+  </w:num>
+  <w:num w:numId="8" w16cid:durableId="85539847">
+    <w:abstractNumId w:val="12"/>
+  </w:num>
+  <w:num w:numId="9" w16cid:durableId="1909992907">
+    <w:abstractNumId w:val="4"/>
+  </w:num>
+  <w:num w:numId="10" w16cid:durableId="1976793676">
+    <w:abstractNumId w:val="26"/>
+  </w:num>
+  <w:num w:numId="11" w16cid:durableId="1560284771">
+    <w:abstractNumId w:val="9"/>
+  </w:num>
+  <w:num w:numId="12" w16cid:durableId="1788234374">
+    <w:abstractNumId w:val="7"/>
+  </w:num>
+  <w:num w:numId="13" w16cid:durableId="439910382">
     <w:abstractNumId w:val="10"/>
   </w:num>
-  <w:num w:numId="5" w16cid:durableId="871652371">
-    <w:abstractNumId w:val="11"/>
-  </w:num>
-  <w:num w:numId="6" w16cid:durableId="152574065">
-    <w:abstractNumId w:val="3"/>
-  </w:num>
-  <w:num w:numId="7" w16cid:durableId="1809665043">
-    <w:abstractNumId w:val="14"/>
-  </w:num>
-  <w:num w:numId="8" w16cid:durableId="85539847">
-    <w:abstractNumId w:val="9"/>
-  </w:num>
-  <w:num w:numId="9" w16cid:durableId="1909992907">
-    <w:abstractNumId w:val="2"/>
-  </w:num>
-  <w:num w:numId="10" w16cid:durableId="1976793676">
-    <w:abstractNumId w:val="17"/>
-  </w:num>
-  <w:num w:numId="11" w16cid:durableId="1560284771">
+  <w:num w:numId="14" w16cid:durableId="220094796">
     <w:abstractNumId w:val="6"/>
   </w:num>
-  <w:num w:numId="12" w16cid:durableId="1788234374">
-    <w:abstractNumId w:val="5"/>
-  </w:num>
-  <w:num w:numId="13" w16cid:durableId="439910382">
-    <w:abstractNumId w:val="7"/>
-  </w:num>
-  <w:num w:numId="14" w16cid:durableId="220094796">
-    <w:abstractNumId w:val="4"/>
-  </w:num>
   <w:num w:numId="15" w16cid:durableId="1081415116">
-    <w:abstractNumId w:val="15"/>
+    <w:abstractNumId w:val="20"/>
   </w:num>
   <w:num w:numId="16" w16cid:durableId="914120843">
-    <w:abstractNumId w:val="8"/>
+    <w:abstractNumId w:val="11"/>
   </w:num>
   <w:num w:numId="17" w16cid:durableId="1522746502">
     <w:abstractNumId w:val="1"/>
   </w:num>
   <w:num w:numId="18" w16cid:durableId="58404851">
-    <w:abstractNumId w:val="12"/>
+    <w:abstractNumId w:val="16"/>
   </w:num>
   <w:num w:numId="19" w16cid:durableId="1383409678">
-    <w:abstractNumId w:val="13"/>
+    <w:abstractNumId w:val="18"/>
+  </w:num>
+  <w:num w:numId="20" w16cid:durableId="209615472">
+    <w:abstractNumId w:val="17"/>
+  </w:num>
+  <w:num w:numId="21" w16cid:durableId="1999379974">
+    <w:abstractNumId w:val="23"/>
+  </w:num>
+  <w:num w:numId="22" w16cid:durableId="411659035">
+    <w:abstractNumId w:val="8"/>
+  </w:num>
+  <w:num w:numId="23" w16cid:durableId="2099397295">
+    <w:abstractNumId w:val="15"/>
+  </w:num>
+  <w:num w:numId="24" w16cid:durableId="1138493796">
+    <w:abstractNumId w:val="3"/>
+  </w:num>
+  <w:num w:numId="25" w16cid:durableId="1031496963">
+    <w:abstractNumId w:val="24"/>
+  </w:num>
+  <w:num w:numId="26" w16cid:durableId="1714421965">
+    <w:abstractNumId w:val="22"/>
+  </w:num>
+  <w:num w:numId="27" w16cid:durableId="1757942047">
+    <w:abstractNumId w:val="21"/>
+  </w:num>
+  <w:num w:numId="28" w16cid:durableId="1758751858">
+    <w:abstractNumId w:val="2"/>
   </w:num>
 </w:numbering>
 </file>
@@ -6488,6 +8759,28 @@
       <w:szCs w:val="18"/>
     </w:rPr>
   </w:style>
+  <w:style w:type="paragraph" w:styleId="NormalnyWeb">
+    <w:name w:val="Normal (Web)"/>
+    <w:basedOn w:val="Normalny"/>
+    <w:uiPriority w:val="99"/>
+    <w:semiHidden/>
+    <w:unhideWhenUsed/>
+    <w:rsid w:val="00795694"/>
+    <w:pPr>
+      <w:spacing w:before="100" w:beforeAutospacing="1" w:after="100" w:afterAutospacing="1" w:line="240" w:lineRule="auto"/>
+    </w:pPr>
+    <w:rPr>
+      <w:rFonts w:ascii="Times New Roman" w:eastAsia="Times New Roman" w:hAnsi="Times New Roman" w:cs="Times New Roman"/>
+      <w:sz w:val="24"/>
+      <w:szCs w:val="24"/>
+      <w:lang w:val="pl-PL"/>
+    </w:rPr>
+  </w:style>
+  <w:style w:type="character" w:customStyle="1" w:styleId="math-inline">
+    <w:name w:val="math-inline"/>
+    <w:basedOn w:val="Domylnaczcionkaakapitu"/>
+    <w:rsid w:val="00795694"/>
+  </w:style>
 </w:styles>
 </file>
 

</xml_diff>

<commit_message>
dodanie diagramu przebiegu, stanu, wdrozenia
</commit_message>
<xml_diff>
--- a/Downloads/ProjektIO/Projekt IO.docx
+++ b/Downloads/ProjektIO/Projekt IO.docx
@@ -36,7 +36,7 @@
           <w:sz w:val="34"/>
           <w:szCs w:val="34"/>
         </w:rPr>
-        <w:t>2</w:t>
+        <w:t>1</w:t>
       </w:r>
       <w:r>
         <w:rPr>
@@ -46,15 +46,6 @@
           <w:szCs w:val="34"/>
         </w:rPr>
         <w:t>. Cel, zakres i kontekst systemu</w:t>
-      </w:r>
-      <w:r>
-        <w:rPr>
-          <w:b/>
-          <w:bCs/>
-          <w:sz w:val="34"/>
-          <w:szCs w:val="34"/>
-        </w:rPr>
-        <w:t>1. Cel, zakres i kontekst systemu</w:t>
       </w:r>
     </w:p>
     <w:p>
@@ -90,51 +81,8 @@
         </w:rPr>
       </w:pPr>
       <w:bookmarkStart w:id="0" w:name="_pi2c812ikv4c" w:colFirst="0" w:colLast="0"/>
+      <w:bookmarkStart w:id="1" w:name="_xn7v3pcdbd1p" w:colFirst="0" w:colLast="0"/>
       <w:bookmarkEnd w:id="0"/>
-      <w:r>
-        <w:rPr>
-          <w:b/>
-          <w:bCs/>
-          <w:color w:val="000000"/>
-          <w:sz w:val="26"/>
-          <w:szCs w:val="26"/>
-        </w:rPr>
-        <w:t>Cel projektu</w:t>
-      </w:r>
-    </w:p>
-    <w:p>
-      <w:pPr>
-        <w:spacing w:before="240" w:after="240"/>
-      </w:pPr>
-      <w:r>
-        <w:t xml:space="preserve">Głównym celem jest </w:t>
-      </w:r>
-      <w:r>
-        <w:rPr>
-          <w:b/>
-          <w:bCs/>
-        </w:rPr>
-        <w:t>cyfryzacja i automatyzacja procesów operacyjnych strzelnicy</w:t>
-      </w:r>
-      <w:r>
-        <w:t>, co ma prowadzić do skrócenia czasu obsługi klienta, optymalizacji zarządzania zasobami (broń, amunicja) oraz zwiększenia zaangażowania użytkowników poprzez udostępnienie im ich statystyk treningowych.</w:t>
-      </w:r>
-    </w:p>
-    <w:p>
-      <w:pPr>
-        <w:pStyle w:val="Nagwek3"/>
-        <w:keepNext w:val="0"/>
-        <w:keepLines w:val="0"/>
-        <w:spacing w:before="280"/>
-        <w:rPr>
-          <w:b/>
-          <w:bCs/>
-          <w:color w:val="000000"/>
-          <w:sz w:val="26"/>
-          <w:szCs w:val="26"/>
-        </w:rPr>
-      </w:pPr>
-      <w:bookmarkStart w:id="1" w:name="_xn7v3pcdbd1p" w:colFirst="0" w:colLast="0"/>
       <w:bookmarkEnd w:id="1"/>
       <w:r>
         <w:rPr>
@@ -186,7 +134,23 @@
           <w:b/>
           <w:bCs/>
         </w:rPr>
-        <w:t>Obsługa klienta (CRM/Booking):</w:t>
+        <w:t>Obsługa klienta (CRM/</w:t>
+      </w:r>
+      <w:proofErr w:type="spellStart"/>
+      <w:r>
+        <w:rPr>
+          <w:b/>
+          <w:bCs/>
+        </w:rPr>
+        <w:t>Booking</w:t>
+      </w:r>
+      <w:proofErr w:type="spellEnd"/>
+      <w:r>
+        <w:rPr>
+          <w:b/>
+          <w:bCs/>
+        </w:rPr>
+        <w:t>):</w:t>
       </w:r>
       <w:r>
         <w:t xml:space="preserve"> System rezerwacji online, weryfikacja tożsamości na miejscu oraz panel osobisty strzelca.</w:t>
@@ -334,7 +298,15 @@
         <w:t>Zwiększenie przepustowości:</w:t>
       </w:r>
       <w:r>
-        <w:t xml:space="preserve"> Skrócenie czasu odprawy klienta (check-in) o np. 40% dzięki wcześniejszej rezerwacji danych w systemie.</w:t>
+        <w:t xml:space="preserve"> Skrócenie czasu odprawy klienta (</w:t>
+      </w:r>
+      <w:proofErr w:type="spellStart"/>
+      <w:r>
+        <w:t>check</w:t>
+      </w:r>
+      <w:proofErr w:type="spellEnd"/>
+      <w:r>
+        <w:t>-in) o np. 40% dzięki wcześniejszej rezerwacji danych w systemie.</w:t>
       </w:r>
     </w:p>
     <w:p>
@@ -398,7 +370,6 @@
           <w:sz w:val="26"/>
           <w:szCs w:val="26"/>
         </w:rPr>
-        <w:lastRenderedPageBreak/>
         <w:t>Niemierzalne (Jakościowe)</w:t>
       </w:r>
     </w:p>
@@ -466,7 +437,16 @@
       <w:bookmarkStart w:id="6" w:name="_hev6j5i0hsa8" w:colFirst="0" w:colLast="0"/>
       <w:bookmarkEnd w:id="6"/>
       <w:r>
-        <w:t xml:space="preserve">3. Słownik terminów (Business Glossary) </w:t>
+        <w:lastRenderedPageBreak/>
+        <w:t xml:space="preserve">3. Słownik terminów (Business </w:t>
+      </w:r>
+      <w:proofErr w:type="spellStart"/>
+      <w:r>
+        <w:t>Glossary</w:t>
+      </w:r>
+      <w:proofErr w:type="spellEnd"/>
+      <w:r>
+        <w:t xml:space="preserve">) </w:t>
       </w:r>
     </w:p>
     <w:tbl>
@@ -940,7 +920,6 @@
                 <w:bCs/>
                 <w:color w:val="1F1F1F"/>
               </w:rPr>
-              <w:lastRenderedPageBreak/>
               <w:t>Metryka celności</w:t>
             </w:r>
           </w:p>
@@ -1004,13 +983,41 @@
                 <w:color w:val="1F1F1F"/>
               </w:rPr>
             </w:pPr>
+            <w:proofErr w:type="spellStart"/>
             <w:r>
               <w:rPr>
                 <w:b/>
                 <w:bCs/>
                 <w:color w:val="1F1F1F"/>
               </w:rPr>
-              <w:t>Check-in / Check-out</w:t>
+              <w:t>Check</w:t>
+            </w:r>
+            <w:proofErr w:type="spellEnd"/>
+            <w:r>
+              <w:rPr>
+                <w:b/>
+                <w:bCs/>
+                <w:color w:val="1F1F1F"/>
+              </w:rPr>
+              <w:t xml:space="preserve">-in / </w:t>
+            </w:r>
+            <w:proofErr w:type="spellStart"/>
+            <w:r>
+              <w:rPr>
+                <w:b/>
+                <w:bCs/>
+                <w:color w:val="1F1F1F"/>
+              </w:rPr>
+              <w:t>Check</w:t>
+            </w:r>
+            <w:proofErr w:type="spellEnd"/>
+            <w:r>
+              <w:rPr>
+                <w:b/>
+                <w:bCs/>
+                <w:color w:val="1F1F1F"/>
+              </w:rPr>
+              <w:t>-out</w:t>
             </w:r>
           </w:p>
         </w:tc>
@@ -1113,7 +1120,6 @@
         <w:rPr>
           <w:noProof/>
         </w:rPr>
-        <w:lastRenderedPageBreak/>
         <w:drawing>
           <wp:inline distT="114300" distB="114300" distL="114300" distR="114300" wp14:anchorId="47A86026" wp14:editId="217D5D2F">
             <wp:extent cx="5731200" cy="3467100"/>
@@ -1156,6 +1162,7 @@
         <w:rPr>
           <w:noProof/>
         </w:rPr>
+        <w:lastRenderedPageBreak/>
         <w:drawing>
           <wp:inline distT="114300" distB="114300" distL="114300" distR="114300" wp14:anchorId="616CA392" wp14:editId="1FCC0D87">
             <wp:extent cx="5731200" cy="3479800"/>
@@ -1198,7 +1205,6 @@
         <w:rPr>
           <w:noProof/>
         </w:rPr>
-        <w:lastRenderedPageBreak/>
         <w:drawing>
           <wp:inline distT="114300" distB="114300" distL="114300" distR="114300" wp14:anchorId="722FC6B0" wp14:editId="2DE63531">
             <wp:extent cx="5731200" cy="3467100"/>
@@ -1241,6 +1247,7 @@
         <w:rPr>
           <w:noProof/>
         </w:rPr>
+        <w:lastRenderedPageBreak/>
         <w:drawing>
           <wp:inline distT="114300" distB="114300" distL="114300" distR="114300" wp14:anchorId="739357F6" wp14:editId="76A27D49">
             <wp:extent cx="5731200" cy="3454400"/>
@@ -1283,7 +1290,6 @@
         <w:rPr>
           <w:noProof/>
         </w:rPr>
-        <w:lastRenderedPageBreak/>
         <w:drawing>
           <wp:inline distT="114300" distB="114300" distL="114300" distR="114300" wp14:anchorId="52AD62B6" wp14:editId="60B0D06F">
             <wp:extent cx="5731200" cy="3479800"/>
@@ -1326,6 +1332,7 @@
         <w:rPr>
           <w:noProof/>
         </w:rPr>
+        <w:lastRenderedPageBreak/>
         <w:drawing>
           <wp:inline distT="114300" distB="114300" distL="114300" distR="114300" wp14:anchorId="7A3916E0" wp14:editId="7B2F866F">
             <wp:extent cx="5731200" cy="3543300"/>
@@ -1368,7 +1375,6 @@
         <w:rPr>
           <w:noProof/>
         </w:rPr>
-        <w:lastRenderedPageBreak/>
         <w:drawing>
           <wp:inline distT="114300" distB="114300" distL="114300" distR="114300" wp14:anchorId="6945424A" wp14:editId="210CF55D">
             <wp:extent cx="5731200" cy="3517900"/>
@@ -1411,6 +1417,7 @@
         <w:rPr>
           <w:noProof/>
         </w:rPr>
+        <w:lastRenderedPageBreak/>
         <w:drawing>
           <wp:inline distT="114300" distB="114300" distL="114300" distR="114300" wp14:anchorId="092DBA85" wp14:editId="3A59299A">
             <wp:extent cx="5731200" cy="3467100"/>
@@ -1453,7 +1460,6 @@
         <w:rPr>
           <w:noProof/>
         </w:rPr>
-        <w:lastRenderedPageBreak/>
         <w:drawing>
           <wp:inline distT="114300" distB="114300" distL="114300" distR="114300" wp14:anchorId="099DD603" wp14:editId="0727D522">
             <wp:extent cx="5731200" cy="3492500"/>
@@ -1497,12 +1503,13 @@
         <w:pStyle w:val="Nagwek2"/>
       </w:pPr>
       <w:r>
+        <w:lastRenderedPageBreak/>
         <w:t>4. Perspektywy przypadków użycia</w:t>
       </w:r>
     </w:p>
     <w:p>
       <w:pPr>
-        <w:pStyle w:val="Nagwek2"/>
+        <w:pStyle w:val="Nagwek3"/>
         <w:rPr>
           <w:noProof/>
         </w:rPr>
@@ -1514,7 +1521,13 @@
         <w:t>.1</w:t>
       </w:r>
       <w:r>
-        <w:t>.Diagram Przypadków użycia4.Diagram Przypadków użycia</w:t>
+        <w:t>.</w:t>
+      </w:r>
+      <w:r>
+        <w:t xml:space="preserve"> </w:t>
+      </w:r>
+      <w:r>
+        <w:t>Diagram Przypadków użycia</w:t>
       </w:r>
     </w:p>
     <w:p>
@@ -1560,16 +1573,292 @@
       </w:r>
     </w:p>
     <w:p/>
+    <w:p>
+      <w:pPr>
+        <w:pStyle w:val="Nagwek3"/>
+        <w:rPr>
+          <w:lang w:val="pl-PL"/>
+        </w:rPr>
+      </w:pPr>
+      <w:r>
+        <w:rPr>
+          <w:lang w:val="pl-PL"/>
+        </w:rPr>
+        <w:t>4.1.1</w:t>
+      </w:r>
+      <w:r>
+        <w:rPr>
+          <w:lang w:val="pl-PL"/>
+        </w:rPr>
+        <w:t>.</w:t>
+      </w:r>
+      <w:r>
+        <w:rPr>
+          <w:lang w:val="pl-PL"/>
+        </w:rPr>
+        <w:t xml:space="preserve"> Opisy tekstowe aktorów</w:t>
+      </w:r>
+    </w:p>
+    <w:p>
+      <w:pPr>
+        <w:rPr>
+          <w:b/>
+          <w:bCs/>
+          <w:lang w:val="pl-PL"/>
+        </w:rPr>
+      </w:pPr>
+      <w:r>
+        <w:rPr>
+          <w:b/>
+          <w:bCs/>
+          <w:lang w:val="pl-PL"/>
+        </w:rPr>
+        <w:t>Użytkownik (Klient)</w:t>
+      </w:r>
+    </w:p>
+    <w:p>
+      <w:pPr>
+        <w:rPr>
+          <w:lang w:val="pl-PL"/>
+        </w:rPr>
+      </w:pPr>
+      <w:r>
+        <w:rPr>
+          <w:lang w:val="pl-PL"/>
+        </w:rPr>
+        <w:t xml:space="preserve">Użytkownik jest podstawowym aktorem systemu </w:t>
+      </w:r>
+      <w:r>
+        <w:rPr>
+          <w:lang w:val="pl-PL"/>
+        </w:rPr>
+        <w:t>-</w:t>
+      </w:r>
+      <w:r>
+        <w:rPr>
+          <w:lang w:val="pl-PL"/>
+        </w:rPr>
+        <w:t xml:space="preserve"> osobą fizyczną korzystającą ze strzelnicy w celach rekreacyjnych lub szkoleniowych. Wchodzi w interakcję z systemem za pośrednictwem aplikacji mobilnej lub przeglądarki internetowej (interfejs web). Przed pierwszą wizytą zakłada konto w systemie (przypadek użycia </w:t>
+      </w:r>
+      <w:r>
+        <w:rPr>
+          <w:i/>
+          <w:lang w:val="pl-PL"/>
+        </w:rPr>
+        <w:t>Rejestracja</w:t>
+      </w:r>
+      <w:r>
+        <w:rPr>
+          <w:lang w:val="pl-PL"/>
+        </w:rPr>
+        <w:t>), a przy każdym kolejnym wejściu uwierzytelnia się loginem i hasłem (</w:t>
+      </w:r>
+      <w:r>
+        <w:rPr>
+          <w:i/>
+          <w:lang w:val="pl-PL"/>
+        </w:rPr>
+        <w:t>Logowanie</w:t>
+      </w:r>
+      <w:r>
+        <w:rPr>
+          <w:lang w:val="pl-PL"/>
+        </w:rPr>
+        <w:t>). Do jego głównych działań należy: przeglądanie oferty strzelnicy, samodzielne dokonywanie rezerwacji stanowisk strzeleckich z wyprzedzeniem oraz śledzenie własnych statystyk treningowych (metryki celności, historia wizyt) w panelu osobistym. Użytkownik nie posiada uprawnień do zarządzania zasobami strzelnicy ani kontami innych osób</w:t>
+      </w:r>
+      <w:r>
+        <w:rPr>
+          <w:lang w:val="pl-PL"/>
+        </w:rPr>
+        <w:t xml:space="preserve">. </w:t>
+      </w:r>
+    </w:p>
+    <w:p>
+      <w:pPr>
+        <w:rPr>
+          <w:lang w:val="pl-PL"/>
+        </w:rPr>
+      </w:pPr>
+    </w:p>
+    <w:p>
+      <w:pPr>
+        <w:rPr>
+          <w:lang w:val="pl-PL"/>
+        </w:rPr>
+      </w:pPr>
+      <w:r>
+        <w:rPr>
+          <w:b/>
+          <w:bCs/>
+          <w:lang w:val="pl-PL"/>
+        </w:rPr>
+        <w:t>Instruktor</w:t>
+      </w:r>
+    </w:p>
+    <w:p>
+      <w:pPr>
+        <w:rPr>
+          <w:lang w:val="pl-PL"/>
+        </w:rPr>
+      </w:pPr>
+      <w:r>
+        <w:rPr>
+          <w:lang w:val="pl-PL"/>
+        </w:rPr>
+        <w:t>Instruktor jest pracownikiem strzelnicy odpowiedzialnym za bezpośrednią obsługę klientów na osi strzeleckiej. Korzysta z systemu za pośrednictwem tabletu lub terminala zainstalowanego przy stanowisku. Jego rola w systemie koncentruje się na czynnościach operacyjnych wykonywanych podczas wizyty klienta: weryfikacji tożsamości dokumentem (</w:t>
+      </w:r>
+      <w:r>
+        <w:rPr>
+          <w:i/>
+          <w:lang w:val="pl-PL"/>
+        </w:rPr>
+        <w:t>Potwierdzenie danych</w:t>
+      </w:r>
+      <w:r>
+        <w:rPr>
+          <w:lang w:val="pl-PL"/>
+        </w:rPr>
+        <w:t xml:space="preserve">), przeprowadzeniu procesu </w:t>
+      </w:r>
+      <w:proofErr w:type="spellStart"/>
+      <w:r>
+        <w:rPr>
+          <w:lang w:val="pl-PL"/>
+        </w:rPr>
+        <w:t>check</w:t>
+      </w:r>
+      <w:proofErr w:type="spellEnd"/>
+      <w:r>
+        <w:rPr>
+          <w:lang w:val="pl-PL"/>
+        </w:rPr>
+        <w:t>-in (</w:t>
+      </w:r>
+      <w:r>
+        <w:rPr>
+          <w:i/>
+          <w:lang w:val="pl-PL"/>
+        </w:rPr>
+        <w:t>Potwierdzenie przybycia</w:t>
+      </w:r>
+      <w:r>
+        <w:rPr>
+          <w:lang w:val="pl-PL"/>
+        </w:rPr>
+        <w:t>) oraz zakończeniu sesji z rozliczeniem zużytej amunicji i przypisanej broni (</w:t>
+      </w:r>
+      <w:r>
+        <w:rPr>
+          <w:i/>
+          <w:lang w:val="pl-PL"/>
+        </w:rPr>
+        <w:t>Zakończenie wizyty</w:t>
+      </w:r>
+      <w:r>
+        <w:rPr>
+          <w:lang w:val="pl-PL"/>
+        </w:rPr>
+        <w:t xml:space="preserve">). Instruktor odpowiada ponadto za stan techniczny broni </w:t>
+      </w:r>
+      <w:r>
+        <w:rPr>
+          <w:lang w:val="pl-PL"/>
+        </w:rPr>
+        <w:t>-</w:t>
+      </w:r>
+      <w:r>
+        <w:rPr>
+          <w:lang w:val="pl-PL"/>
+        </w:rPr>
+        <w:t xml:space="preserve"> system powiadamia go o </w:t>
+      </w:r>
+      <w:r>
+        <w:rPr>
+          <w:lang w:val="pl-PL"/>
+        </w:rPr>
+        <w:lastRenderedPageBreak/>
+        <w:t>osiągnięciu progów konserwacyjnych, a on potwierdza wykonanie serwisu (</w:t>
+      </w:r>
+      <w:r>
+        <w:rPr>
+          <w:i/>
+          <w:lang w:val="pl-PL"/>
+        </w:rPr>
+        <w:t>Amunicja, Konserwacja</w:t>
+      </w:r>
+      <w:r>
+        <w:rPr>
+          <w:lang w:val="pl-PL"/>
+        </w:rPr>
+        <w:t>). Instruktor nie posiada uprawnień administracyjnych do zarządzania kontami użytkowników ani konfiguracją systemu.</w:t>
+      </w:r>
+    </w:p>
+    <w:p>
+      <w:pPr>
+        <w:rPr>
+          <w:lang w:val="pl-PL"/>
+        </w:rPr>
+      </w:pPr>
+    </w:p>
+    <w:p>
+      <w:pPr>
+        <w:rPr>
+          <w:b/>
+          <w:bCs/>
+          <w:lang w:val="pl-PL"/>
+        </w:rPr>
+      </w:pPr>
+      <w:r>
+        <w:rPr>
+          <w:b/>
+          <w:bCs/>
+          <w:lang w:val="pl-PL"/>
+        </w:rPr>
+        <w:t>Administrator</w:t>
+      </w:r>
+    </w:p>
+    <w:p>
+      <w:r>
+        <w:rPr>
+          <w:b/>
+          <w:bCs/>
+        </w:rPr>
+        <w:t>Administrator</w:t>
+      </w:r>
+      <w:r>
+        <w:t xml:space="preserve"> jest aktorem o najszerszym zakresie uprawnień w systemie </w:t>
+      </w:r>
+      <w:r>
+        <w:t>-</w:t>
+      </w:r>
+      <w:r>
+        <w:t xml:space="preserve"> pełni rolę właściciela lub wyznaczonego menedżera strzelnicy. W odróżnieniu od Użytkownika i Instruktora, ma wgląd w dane wszystkich uczestników systemu oraz pełną kontrolę nad ich dostępem. Do jego kompetencji należy zarządzanie kontami: tworzenie kont pracowników, przypisywanie i modyfikacja ról (np. zmiana roli z „Klient" na „Instruktor"), ręczna weryfikacja statusów oraz dezaktywacja kont (przypadek użycia </w:t>
+      </w:r>
+      <w:r>
+        <w:rPr>
+          <w:i/>
+          <w:iCs/>
+        </w:rPr>
+        <w:t>Kontrola użytkowników</w:t>
+      </w:r>
+      <w:r>
+        <w:t>). Administrator Nie uczestniczy bezpośrednio w codziennej obsłudze klientów na stanowiskach strzeleckich.</w:t>
+      </w:r>
+    </w:p>
     <w:p/>
+    <w:p/>
     <w:p>
       <w:pPr>
         <w:pStyle w:val="Nagwek2"/>
       </w:pPr>
       <w:r>
-        <w:t>4.1</w:t>
-      </w:r>
-      <w:r>
-        <w:t>.2.</w:t>
+        <w:t>4.</w:t>
+      </w:r>
+      <w:r>
+        <w:t>1.2.</w:t>
+      </w:r>
+      <w:r>
+        <w:t xml:space="preserve"> </w:t>
       </w:r>
       <w:r>
         <w:t>Opisy przypadków użycia</w:t>
@@ -1669,7 +1958,6 @@
         </w:rPr>
         <w:t xml:space="preserve">Użytkownik (po uprzednim przejściu przez przypadek użycia </w:t>
       </w:r>
-      <w:proofErr w:type="gramStart"/>
       <w:r>
         <w:rPr>
           <w:i/>
@@ -1682,14 +1970,7 @@
         <w:rPr>
           <w:lang w:val="pl-PL"/>
         </w:rPr>
-        <w:t xml:space="preserve"> )</w:t>
-      </w:r>
-      <w:proofErr w:type="gramEnd"/>
-      <w:r>
-        <w:rPr>
-          <w:lang w:val="pl-PL"/>
-        </w:rPr>
-        <w:t xml:space="preserve"> określa datę, godzinę rozpoczęcia oraz godzinę zakończenia. </w:t>
+        <w:t xml:space="preserve"> ) określa datę, godzinę rozpoczęcia oraz godzinę zakończenia. </w:t>
       </w:r>
     </w:p>
     <w:p>
@@ -1934,21 +2215,7 @@
         <w:rPr>
           <w:lang w:val="pl-PL"/>
         </w:rPr>
-        <w:t xml:space="preserve">c) typowy czas </w:t>
-      </w:r>
-      <w:proofErr w:type="gramStart"/>
-      <w:r>
-        <w:rPr>
-          <w:lang w:val="pl-PL"/>
-        </w:rPr>
-        <w:t>realizacji:  około</w:t>
-      </w:r>
-      <w:proofErr w:type="gramEnd"/>
-      <w:r>
-        <w:rPr>
-          <w:lang w:val="pl-PL"/>
-        </w:rPr>
-        <w:t xml:space="preserve"> 2 min.</w:t>
+        <w:t>c) typowy czas realizacji:  około 2 min.</w:t>
       </w:r>
     </w:p>
     <w:p>
@@ -1994,6 +2261,7 @@
         <w:rPr>
           <w:lang w:val="pl-PL"/>
         </w:rPr>
+        <w:lastRenderedPageBreak/>
         <w:t xml:space="preserve">wpis w tabeli rezerwacji widoczny dla Użytkownika w zakładce "Moje rezerwacje" ze statusem "Oczekująca". </w:t>
       </w:r>
     </w:p>
@@ -2156,7 +2424,6 @@
         <w:rPr>
           <w:lang w:val="pl-PL"/>
         </w:rPr>
-        <w:lastRenderedPageBreak/>
         <w:t xml:space="preserve">Instruktor wybiera rodzaj dokumentu (np. Dowód osobisty, Paszport) oraz wpisuje serię, numer dokumentu i numer PESEL klienta (realizując zawarty przypadek użycia </w:t>
       </w:r>
       <w:r>
@@ -2239,7 +2506,21 @@
         <w:rPr>
           <w:lang w:val="pl-PL"/>
         </w:rPr>
-        <w:t>Instruktor inicjuje sesję strzelecką, klikając przycisk "Check-in".</w:t>
+        <w:t>Instruktor inicjuje sesję strzelecką, klikając przycisk "</w:t>
+      </w:r>
+      <w:proofErr w:type="spellStart"/>
+      <w:r>
+        <w:rPr>
+          <w:lang w:val="pl-PL"/>
+        </w:rPr>
+        <w:t>Check</w:t>
+      </w:r>
+      <w:proofErr w:type="spellEnd"/>
+      <w:r>
+        <w:rPr>
+          <w:lang w:val="pl-PL"/>
+        </w:rPr>
+        <w:t>-in".</w:t>
       </w:r>
     </w:p>
     <w:p>
@@ -2562,6 +2843,7 @@
         <w:rPr>
           <w:lang w:val="pl-PL"/>
         </w:rPr>
+        <w:lastRenderedPageBreak/>
         <w:t xml:space="preserve">Administrator </w:t>
       </w:r>
     </w:p>
@@ -2628,21 +2910,7 @@
         <w:rPr>
           <w:lang w:val="pl-PL"/>
         </w:rPr>
-        <w:t xml:space="preserve">Administrator (w ramach zarządzania </w:t>
-      </w:r>
-      <w:proofErr w:type="gramStart"/>
-      <w:r>
-        <w:rPr>
-          <w:lang w:val="pl-PL"/>
-        </w:rPr>
-        <w:t>biznesem )</w:t>
-      </w:r>
-      <w:proofErr w:type="gramEnd"/>
-      <w:r>
-        <w:rPr>
-          <w:lang w:val="pl-PL"/>
-        </w:rPr>
-        <w:t xml:space="preserve"> odszukuje konkretnego użytkownika na liście. </w:t>
+        <w:t xml:space="preserve">Administrator (w ramach zarządzania biznesem ) odszukuje konkretnego użytkownika na liście. </w:t>
       </w:r>
     </w:p>
     <w:p>
@@ -2693,7 +2961,6 @@
         <w:rPr>
           <w:lang w:val="pl-PL"/>
         </w:rPr>
-        <w:lastRenderedPageBreak/>
         <w:t>System weryfikuje poprawność operacji i zapisuje nowe dane w bazie.</w:t>
       </w:r>
     </w:p>
@@ -2914,27 +3181,13 @@
         <w:rPr>
           <w:lang w:val="pl-PL"/>
         </w:rPr>
-        <w:t xml:space="preserve">c) typowy czas </w:t>
-      </w:r>
-      <w:proofErr w:type="gramStart"/>
-      <w:r>
-        <w:rPr>
-          <w:lang w:val="pl-PL"/>
-        </w:rPr>
-        <w:t xml:space="preserve">realizacji: </w:t>
-      </w:r>
-      <w:r>
-        <w:rPr>
-          <w:lang w:val="pl-PL"/>
-        </w:rPr>
-        <w:t xml:space="preserve"> około</w:t>
-      </w:r>
-      <w:proofErr w:type="gramEnd"/>
-      <w:r>
-        <w:rPr>
-          <w:lang w:val="pl-PL"/>
-        </w:rPr>
-        <w:t xml:space="preserve"> </w:t>
+        <w:t xml:space="preserve">c) typowy czas realizacji: </w:t>
+      </w:r>
+      <w:r>
+        <w:rPr>
+          <w:lang w:val="pl-PL"/>
+        </w:rPr>
+        <w:t xml:space="preserve"> około </w:t>
       </w:r>
       <w:r>
         <w:rPr>
@@ -3002,12 +3255,129 @@
     </w:p>
     <w:p>
       <w:pPr>
+        <w:ind w:left="720"/>
+        <w:rPr>
+          <w:lang w:val="pl-PL"/>
+        </w:rPr>
+      </w:pPr>
+    </w:p>
+    <w:p>
+      <w:pPr>
+        <w:ind w:left="720"/>
+        <w:rPr>
+          <w:lang w:val="pl-PL"/>
+        </w:rPr>
+      </w:pPr>
+    </w:p>
+    <w:p>
+      <w:pPr>
+        <w:ind w:left="720"/>
+        <w:rPr>
+          <w:lang w:val="pl-PL"/>
+        </w:rPr>
+      </w:pPr>
+    </w:p>
+    <w:p>
+      <w:pPr>
+        <w:ind w:left="720"/>
+        <w:rPr>
+          <w:lang w:val="pl-PL"/>
+        </w:rPr>
+      </w:pPr>
+    </w:p>
+    <w:p>
+      <w:pPr>
+        <w:ind w:left="720"/>
+        <w:rPr>
+          <w:lang w:val="pl-PL"/>
+        </w:rPr>
+      </w:pPr>
+    </w:p>
+    <w:p>
+      <w:pPr>
+        <w:ind w:left="720"/>
+        <w:rPr>
+          <w:lang w:val="pl-PL"/>
+        </w:rPr>
+      </w:pPr>
+    </w:p>
+    <w:p>
+      <w:pPr>
+        <w:ind w:left="720"/>
+        <w:rPr>
+          <w:lang w:val="pl-PL"/>
+        </w:rPr>
+      </w:pPr>
+    </w:p>
+    <w:p>
+      <w:pPr>
+        <w:ind w:left="720"/>
+        <w:rPr>
+          <w:lang w:val="pl-PL"/>
+        </w:rPr>
+      </w:pPr>
+    </w:p>
+    <w:p>
+      <w:pPr>
+        <w:ind w:left="720"/>
+        <w:rPr>
+          <w:lang w:val="pl-PL"/>
+        </w:rPr>
+      </w:pPr>
+    </w:p>
+    <w:p>
+      <w:pPr>
         <w:pStyle w:val="Nagwek2"/>
       </w:pPr>
       <w:r>
         <w:lastRenderedPageBreak/>
-        <w:t>4.2.Opisy przypadków użycia</w:t>
-      </w:r>
+        <w:t>4.</w:t>
+      </w:r>
+      <w:r>
+        <w:t>2</w:t>
+      </w:r>
+      <w:r>
+        <w:t xml:space="preserve"> </w:t>
+      </w:r>
+      <w:r>
+        <w:t>Diagramy czynności</w:t>
+      </w:r>
+    </w:p>
+    <w:p>
+      <w:pPr>
+        <w:rPr>
+          <w:b/>
+          <w:bCs/>
+        </w:rPr>
+      </w:pPr>
+      <w:r>
+        <w:rPr>
+          <w:b/>
+          <w:bCs/>
+        </w:rPr>
+        <w:t>Igor Wróblewski</w:t>
+      </w:r>
+    </w:p>
+    <w:p>
+      <w:pPr>
+        <w:pStyle w:val="Akapitzlist"/>
+        <w:numPr>
+          <w:ilvl w:val="0"/>
+          <w:numId w:val="29"/>
+        </w:numPr>
+      </w:pPr>
+      <w:r>
+        <w:t>Rejestracja terminu na strzelnicy</w:t>
+      </w:r>
+    </w:p>
+    <w:p>
+      <w:pPr>
+        <w:ind w:left="360"/>
+        <w:rPr>
+          <w:b/>
+          <w:bCs/>
+        </w:rPr>
+      </w:pPr>
     </w:p>
     <w:p>
       <w:pPr>
@@ -3066,17 +3436,35 @@
         <w:pStyle w:val="Legenda"/>
         <w:jc w:val="center"/>
       </w:pPr>
-      <w:r>
-        <w:t xml:space="preserve">Figure </w:t>
-      </w:r>
-      <w:fldSimple w:instr=" SEQ Figure \* ARABIC ">
-        <w:r>
-          <w:rPr>
-            <w:noProof/>
-          </w:rPr>
-          <w:t>1</w:t>
-        </w:r>
-      </w:fldSimple>
+      <w:proofErr w:type="spellStart"/>
+      <w:r>
+        <w:t>Figure</w:t>
+      </w:r>
+      <w:proofErr w:type="spellEnd"/>
+      <w:r>
+        <w:t xml:space="preserve"> </w:t>
+      </w:r>
+      <w:r>
+        <w:fldChar w:fldCharType="begin"/>
+      </w:r>
+      <w:r>
+        <w:instrText xml:space="preserve"> SEQ Figure \* ARABIC </w:instrText>
+      </w:r>
+      <w:r>
+        <w:fldChar w:fldCharType="separate"/>
+      </w:r>
+      <w:r>
+        <w:rPr>
+          <w:noProof/>
+        </w:rPr>
+        <w:t>1</w:t>
+      </w:r>
+      <w:r>
+        <w:rPr>
+          <w:noProof/>
+        </w:rPr>
+        <w:fldChar w:fldCharType="end"/>
+      </w:r>
       <w:r>
         <w:t xml:space="preserve"> Igor Wróblewski</w:t>
       </w:r>
@@ -3084,6 +3472,115 @@
     <w:p/>
     <w:p/>
     <w:p/>
+    <w:p/>
+    <w:p/>
+    <w:p/>
+    <w:p/>
+    <w:p/>
+    <w:p/>
+    <w:p/>
+    <w:p/>
+    <w:p/>
+    <w:p/>
+    <w:p>
+      <w:pPr>
+        <w:rPr>
+          <w:b/>
+          <w:bCs/>
+        </w:rPr>
+      </w:pPr>
+      <w:r>
+        <w:rPr>
+          <w:b/>
+          <w:bCs/>
+        </w:rPr>
+        <w:lastRenderedPageBreak/>
+        <w:t>Wojciech Cimochowski</w:t>
+      </w:r>
+    </w:p>
+    <w:p>
+      <w:pPr>
+        <w:pStyle w:val="Akapitzlist"/>
+        <w:numPr>
+          <w:ilvl w:val="0"/>
+          <w:numId w:val="29"/>
+        </w:numPr>
+      </w:pPr>
+      <w:proofErr w:type="spellStart"/>
+      <w:r>
+        <w:t>Potwiedzenie</w:t>
+      </w:r>
+      <w:proofErr w:type="spellEnd"/>
+      <w:r>
+        <w:t xml:space="preserve"> przybycia</w:t>
+      </w:r>
+    </w:p>
+    <w:p>
+      <w:pPr>
+        <w:rPr>
+          <w:lang w:val="pl-PL"/>
+        </w:rPr>
+      </w:pPr>
+      <w:r>
+        <w:rPr>
+          <w:lang w:val="pl-PL"/>
+        </w:rPr>
+        <w:drawing>
+          <wp:inline distT="0" distB="0" distL="0" distR="0" wp14:anchorId="6FA5D7EA" wp14:editId="289433A6">
+            <wp:extent cx="5733415" cy="6621780"/>
+            <wp:effectExtent l="0" t="0" r="635" b="7620"/>
+            <wp:docPr id="1283055645" name="Obraz 2"/>
+            <wp:cNvGraphicFramePr>
+              <a:graphicFrameLocks xmlns:a="http://schemas.openxmlformats.org/drawingml/2006/main" noChangeAspect="1"/>
+            </wp:cNvGraphicFramePr>
+            <a:graphic xmlns:a="http://schemas.openxmlformats.org/drawingml/2006/main">
+              <a:graphicData uri="http://schemas.openxmlformats.org/drawingml/2006/picture">
+                <pic:pic xmlns:pic="http://schemas.openxmlformats.org/drawingml/2006/picture">
+                  <pic:nvPicPr>
+                    <pic:cNvPr id="0" name="Picture 6"/>
+                    <pic:cNvPicPr>
+                      <a:picLocks noChangeAspect="1" noChangeArrowheads="1"/>
+                    </pic:cNvPicPr>
+                  </pic:nvPicPr>
+                  <pic:blipFill>
+                    <a:blip r:embed="rId17">
+                      <a:extLst>
+                        <a:ext uri="{28A0092B-C50C-407E-A947-70E740481C1C}">
+                          <a14:useLocalDpi xmlns:a14="http://schemas.microsoft.com/office/drawing/2010/main" val="0"/>
+                        </a:ext>
+                      </a:extLst>
+                    </a:blip>
+                    <a:srcRect/>
+                    <a:stretch>
+                      <a:fillRect/>
+                    </a:stretch>
+                  </pic:blipFill>
+                  <pic:spPr bwMode="auto">
+                    <a:xfrm>
+                      <a:off x="0" y="0"/>
+                      <a:ext cx="5733415" cy="6621780"/>
+                    </a:xfrm>
+                    <a:prstGeom prst="rect">
+                      <a:avLst/>
+                    </a:prstGeom>
+                    <a:noFill/>
+                    <a:ln>
+                      <a:noFill/>
+                    </a:ln>
+                  </pic:spPr>
+                </pic:pic>
+              </a:graphicData>
+            </a:graphic>
+          </wp:inline>
+        </w:drawing>
+      </w:r>
+    </w:p>
+    <w:p/>
+    <w:p/>
+    <w:p/>
+    <w:p/>
+    <w:p/>
+    <w:p/>
     <w:p>
       <w:pPr>
         <w:pStyle w:val="Nagwek2"/>
@@ -3093,11 +3590,32 @@
         <w:t>4.</w:t>
       </w:r>
       <w:r>
-        <w:t>3. Diagramy interakcji z opisem tekstowym komunikatów</w:t>
-      </w:r>
-    </w:p>
-    <w:p>
-      <w:r>
+        <w:t>3</w:t>
+      </w:r>
+      <w:r>
+        <w:t>. Diagramy interakcji z opisem tekstowym komunikatów</w:t>
+      </w:r>
+    </w:p>
+    <w:p>
+      <w:pPr>
+        <w:rPr>
+          <w:b/>
+          <w:bCs/>
+        </w:rPr>
+      </w:pPr>
+      <w:r>
+        <w:rPr>
+          <w:b/>
+          <w:bCs/>
+        </w:rPr>
+        <w:t>Igor Wróblewski</w:t>
+      </w:r>
+    </w:p>
+    <w:p>
+      <w:r>
+        <w:rPr>
+          <w:noProof/>
+        </w:rPr>
         <w:drawing>
           <wp:inline distT="0" distB="0" distL="0" distR="0" wp14:anchorId="00E1434D" wp14:editId="6938D168">
             <wp:extent cx="5733415" cy="2947670"/>
@@ -3114,7 +3632,7 @@
                     <pic:cNvPicPr/>
                   </pic:nvPicPr>
                   <pic:blipFill>
-                    <a:blip r:embed="rId17"/>
+                    <a:blip r:embed="rId18"/>
                     <a:stretch>
                       <a:fillRect/>
                     </a:stretch>
@@ -3163,7 +3681,23 @@
           <w:rStyle w:val="math-inline"/>
           <w:rFonts w:ascii="Arial" w:hAnsi="Arial" w:cs="Arial"/>
         </w:rPr>
-        <w:t>$\rightarrow$</w:t>
+        <w:t>$\</w:t>
+      </w:r>
+      <w:proofErr w:type="spellStart"/>
+      <w:r>
+        <w:rPr>
+          <w:rStyle w:val="math-inline"/>
+          <w:rFonts w:ascii="Arial" w:hAnsi="Arial" w:cs="Arial"/>
+        </w:rPr>
+        <w:t>rightarrow</w:t>
+      </w:r>
+      <w:proofErr w:type="spellEnd"/>
+      <w:r>
+        <w:rPr>
+          <w:rStyle w:val="math-inline"/>
+          <w:rFonts w:ascii="Arial" w:hAnsi="Arial" w:cs="Arial"/>
+        </w:rPr>
+        <w:t>$</w:t>
       </w:r>
       <w:r>
         <w:rPr>
@@ -3253,7 +3787,23 @@
           <w:rStyle w:val="math-inline"/>
           <w:rFonts w:ascii="Arial" w:hAnsi="Arial" w:cs="Arial"/>
         </w:rPr>
-        <w:t>$\rightarrow$</w:t>
+        <w:t>$\</w:t>
+      </w:r>
+      <w:proofErr w:type="spellStart"/>
+      <w:r>
+        <w:rPr>
+          <w:rStyle w:val="math-inline"/>
+          <w:rFonts w:ascii="Arial" w:hAnsi="Arial" w:cs="Arial"/>
+        </w:rPr>
+        <w:t>rightarrow</w:t>
+      </w:r>
+      <w:proofErr w:type="spellEnd"/>
+      <w:r>
+        <w:rPr>
+          <w:rStyle w:val="math-inline"/>
+          <w:rFonts w:ascii="Arial" w:hAnsi="Arial" w:cs="Arial"/>
+        </w:rPr>
+        <w:t>$</w:t>
       </w:r>
       <w:r>
         <w:rPr>
@@ -3286,7 +3836,21 @@
         <w:rPr>
           <w:rFonts w:ascii="Arial" w:hAnsi="Arial" w:cs="Arial"/>
         </w:rPr>
-        <w:t xml:space="preserve"> Synchroniczny / Tworzący (Create)</w:t>
+        <w:t xml:space="preserve"> Synchroniczny / Tworzący (</w:t>
+      </w:r>
+      <w:proofErr w:type="spellStart"/>
+      <w:r>
+        <w:rPr>
+          <w:rFonts w:ascii="Arial" w:hAnsi="Arial" w:cs="Arial"/>
+        </w:rPr>
+        <w:t>Create</w:t>
+      </w:r>
+      <w:proofErr w:type="spellEnd"/>
+      <w:r>
+        <w:rPr>
+          <w:rFonts w:ascii="Arial" w:hAnsi="Arial" w:cs="Arial"/>
+        </w:rPr>
+        <w:t>)</w:t>
       </w:r>
     </w:p>
     <w:p>
@@ -3343,7 +3907,23 @@
           <w:rStyle w:val="math-inline"/>
           <w:rFonts w:ascii="Arial" w:hAnsi="Arial" w:cs="Arial"/>
         </w:rPr>
-        <w:t>$\rightarrow$</w:t>
+        <w:t>$\</w:t>
+      </w:r>
+      <w:proofErr w:type="spellStart"/>
+      <w:r>
+        <w:rPr>
+          <w:rStyle w:val="math-inline"/>
+          <w:rFonts w:ascii="Arial" w:hAnsi="Arial" w:cs="Arial"/>
+        </w:rPr>
+        <w:t>rightarrow</w:t>
+      </w:r>
+      <w:proofErr w:type="spellEnd"/>
+      <w:r>
+        <w:rPr>
+          <w:rStyle w:val="math-inline"/>
+          <w:rFonts w:ascii="Arial" w:hAnsi="Arial" w:cs="Arial"/>
+        </w:rPr>
+        <w:t>$</w:t>
       </w:r>
       <w:r>
         <w:rPr>
@@ -3433,7 +4013,23 @@
           <w:rStyle w:val="math-inline"/>
           <w:rFonts w:ascii="Arial" w:hAnsi="Arial" w:cs="Arial"/>
         </w:rPr>
-        <w:t>$\rightarrow$</w:t>
+        <w:t>$\</w:t>
+      </w:r>
+      <w:proofErr w:type="spellStart"/>
+      <w:r>
+        <w:rPr>
+          <w:rStyle w:val="math-inline"/>
+          <w:rFonts w:ascii="Arial" w:hAnsi="Arial" w:cs="Arial"/>
+        </w:rPr>
+        <w:t>rightarrow</w:t>
+      </w:r>
+      <w:proofErr w:type="spellEnd"/>
+      <w:r>
+        <w:rPr>
+          <w:rStyle w:val="math-inline"/>
+          <w:rFonts w:ascii="Arial" w:hAnsi="Arial" w:cs="Arial"/>
+        </w:rPr>
+        <w:t>$</w:t>
       </w:r>
       <w:r>
         <w:rPr>
@@ -3523,7 +4119,23 @@
           <w:rStyle w:val="math-inline"/>
           <w:rFonts w:ascii="Arial" w:hAnsi="Arial" w:cs="Arial"/>
         </w:rPr>
-        <w:t>$\rightarrow$</w:t>
+        <w:t>$\</w:t>
+      </w:r>
+      <w:proofErr w:type="spellStart"/>
+      <w:r>
+        <w:rPr>
+          <w:rStyle w:val="math-inline"/>
+          <w:rFonts w:ascii="Arial" w:hAnsi="Arial" w:cs="Arial"/>
+        </w:rPr>
+        <w:t>rightarrow</w:t>
+      </w:r>
+      <w:proofErr w:type="spellEnd"/>
+      <w:r>
+        <w:rPr>
+          <w:rStyle w:val="math-inline"/>
+          <w:rFonts w:ascii="Arial" w:hAnsi="Arial" w:cs="Arial"/>
+        </w:rPr>
+        <w:t>$</w:t>
       </w:r>
       <w:r>
         <w:rPr>
@@ -3577,13 +4189,28 @@
           <w:b/>
           <w:bCs/>
         </w:rPr>
+        <w:lastRenderedPageBreak/>
         <w:t>Opis:</w:t>
       </w:r>
       <w:r>
         <w:rPr>
           <w:rFonts w:ascii="Arial" w:hAnsi="Arial" w:cs="Arial"/>
         </w:rPr>
-        <w:t xml:space="preserve"> Serwer przekazuje żądanie zapisu danych do bazy PostgreSQL, aby zaktualizować profil klienta.</w:t>
+        <w:t xml:space="preserve"> Serwer przekazuje żądanie zapisu danych do bazy </w:t>
+      </w:r>
+      <w:proofErr w:type="spellStart"/>
+      <w:r>
+        <w:rPr>
+          <w:rFonts w:ascii="Arial" w:hAnsi="Arial" w:cs="Arial"/>
+        </w:rPr>
+        <w:t>PostgreSQL</w:t>
+      </w:r>
+      <w:proofErr w:type="spellEnd"/>
+      <w:r>
+        <w:rPr>
+          <w:rFonts w:ascii="Arial" w:hAnsi="Arial" w:cs="Arial"/>
+        </w:rPr>
+        <w:t>, aby zaktualizować profil klienta.</w:t>
       </w:r>
     </w:p>
     <w:p>
@@ -3600,7 +4227,6 @@
           <w:b/>
           <w:bCs/>
         </w:rPr>
-        <w:lastRenderedPageBreak/>
         <w:t>6. Potwierdzenie zapisu</w:t>
       </w:r>
       <w:r>
@@ -3614,7 +4240,23 @@
           <w:rStyle w:val="math-inline"/>
           <w:rFonts w:ascii="Arial" w:hAnsi="Arial" w:cs="Arial"/>
         </w:rPr>
-        <w:t>$\rightarrow$</w:t>
+        <w:t>$\</w:t>
+      </w:r>
+      <w:proofErr w:type="spellStart"/>
+      <w:r>
+        <w:rPr>
+          <w:rStyle w:val="math-inline"/>
+          <w:rFonts w:ascii="Arial" w:hAnsi="Arial" w:cs="Arial"/>
+        </w:rPr>
+        <w:t>rightarrow</w:t>
+      </w:r>
+      <w:proofErr w:type="spellEnd"/>
+      <w:r>
+        <w:rPr>
+          <w:rStyle w:val="math-inline"/>
+          <w:rFonts w:ascii="Arial" w:hAnsi="Arial" w:cs="Arial"/>
+        </w:rPr>
+        <w:t>$</w:t>
       </w:r>
       <w:r>
         <w:rPr>
@@ -3704,7 +4346,23 @@
           <w:rStyle w:val="math-inline"/>
           <w:rFonts w:ascii="Arial" w:hAnsi="Arial" w:cs="Arial"/>
         </w:rPr>
-        <w:t>$\rightarrow$</w:t>
+        <w:t>$\</w:t>
+      </w:r>
+      <w:proofErr w:type="spellStart"/>
+      <w:r>
+        <w:rPr>
+          <w:rStyle w:val="math-inline"/>
+          <w:rFonts w:ascii="Arial" w:hAnsi="Arial" w:cs="Arial"/>
+        </w:rPr>
+        <w:t>rightarrow</w:t>
+      </w:r>
+      <w:proofErr w:type="spellEnd"/>
+      <w:r>
+        <w:rPr>
+          <w:rStyle w:val="math-inline"/>
+          <w:rFonts w:ascii="Arial" w:hAnsi="Arial" w:cs="Arial"/>
+        </w:rPr>
+        <w:t>$</w:t>
       </w:r>
       <w:r>
         <w:rPr>
@@ -3794,7 +4452,23 @@
           <w:rStyle w:val="math-inline"/>
           <w:rFonts w:ascii="Arial" w:hAnsi="Arial" w:cs="Arial"/>
         </w:rPr>
-        <w:t>$\rightarrow$</w:t>
+        <w:t>$\</w:t>
+      </w:r>
+      <w:proofErr w:type="spellStart"/>
+      <w:r>
+        <w:rPr>
+          <w:rStyle w:val="math-inline"/>
+          <w:rFonts w:ascii="Arial" w:hAnsi="Arial" w:cs="Arial"/>
+        </w:rPr>
+        <w:t>rightarrow</w:t>
+      </w:r>
+      <w:proofErr w:type="spellEnd"/>
+      <w:r>
+        <w:rPr>
+          <w:rStyle w:val="math-inline"/>
+          <w:rFonts w:ascii="Arial" w:hAnsi="Arial" w:cs="Arial"/>
+        </w:rPr>
+        <w:t>$</w:t>
       </w:r>
       <w:r>
         <w:rPr>
@@ -3827,7 +4501,21 @@
         <w:rPr>
           <w:rFonts w:ascii="Arial" w:hAnsi="Arial" w:cs="Arial"/>
         </w:rPr>
-        <w:t xml:space="preserve"> Zwrotny / Niszczący (Destroy)</w:t>
+        <w:t xml:space="preserve"> Zwrotny / Niszczący (</w:t>
+      </w:r>
+      <w:proofErr w:type="spellStart"/>
+      <w:r>
+        <w:rPr>
+          <w:rFonts w:ascii="Arial" w:hAnsi="Arial" w:cs="Arial"/>
+        </w:rPr>
+        <w:t>Destroy</w:t>
+      </w:r>
+      <w:proofErr w:type="spellEnd"/>
+      <w:r>
+        <w:rPr>
+          <w:rFonts w:ascii="Arial" w:hAnsi="Arial" w:cs="Arial"/>
+        </w:rPr>
+        <w:t>)</w:t>
       </w:r>
     </w:p>
     <w:p>
@@ -3884,7 +4572,23 @@
           <w:rStyle w:val="math-inline"/>
           <w:rFonts w:ascii="Arial" w:hAnsi="Arial" w:cs="Arial"/>
         </w:rPr>
-        <w:t>$\rightarrow$</w:t>
+        <w:t>$\</w:t>
+      </w:r>
+      <w:proofErr w:type="spellStart"/>
+      <w:r>
+        <w:rPr>
+          <w:rStyle w:val="math-inline"/>
+          <w:rFonts w:ascii="Arial" w:hAnsi="Arial" w:cs="Arial"/>
+        </w:rPr>
+        <w:t>rightarrow</w:t>
+      </w:r>
+      <w:proofErr w:type="spellEnd"/>
+      <w:r>
+        <w:rPr>
+          <w:rStyle w:val="math-inline"/>
+          <w:rFonts w:ascii="Arial" w:hAnsi="Arial" w:cs="Arial"/>
+        </w:rPr>
+        <w:t>$</w:t>
       </w:r>
       <w:r>
         <w:rPr>
@@ -3948,11 +4652,780 @@
       </w:r>
     </w:p>
     <w:p/>
+    <w:p/>
+    <w:p/>
+    <w:p/>
+    <w:p/>
+    <w:p/>
+    <w:p/>
+    <w:p/>
+    <w:p/>
+    <w:p/>
+    <w:p/>
+    <w:p/>
+    <w:p/>
+    <w:p/>
+    <w:p/>
+    <w:p/>
+    <w:p/>
+    <w:p/>
+    <w:p/>
+    <w:p/>
+    <w:p/>
+    <w:p/>
+    <w:p>
+      <w:pPr>
+        <w:rPr>
+          <w:b/>
+          <w:bCs/>
+        </w:rPr>
+      </w:pPr>
+      <w:r>
+        <w:rPr>
+          <w:b/>
+          <w:bCs/>
+        </w:rPr>
+        <w:lastRenderedPageBreak/>
+        <w:t>Wojciech Cimochowski</w:t>
+      </w:r>
+    </w:p>
+    <w:p>
+      <w:pPr>
+        <w:pStyle w:val="Akapitzlist"/>
+        <w:numPr>
+          <w:ilvl w:val="0"/>
+          <w:numId w:val="29"/>
+        </w:numPr>
+        <w:rPr>
+          <w:b/>
+          <w:bCs/>
+        </w:rPr>
+      </w:pPr>
+      <w:r>
+        <w:rPr>
+          <w:b/>
+          <w:bCs/>
+        </w:rPr>
+        <w:t>Potwierdzenie przybycia</w:t>
+      </w:r>
+    </w:p>
+    <w:p>
+      <w:r>
+        <w:rPr>
+          <w:noProof/>
+        </w:rPr>
+        <w:drawing>
+          <wp:inline distT="0" distB="0" distL="0" distR="0" wp14:anchorId="009C8796" wp14:editId="264CA7CC">
+            <wp:extent cx="5727700" cy="6203315"/>
+            <wp:effectExtent l="0" t="0" r="6350" b="6985"/>
+            <wp:docPr id="509128624" name="Obraz 5"/>
+            <wp:cNvGraphicFramePr>
+              <a:graphicFrameLocks xmlns:a="http://schemas.openxmlformats.org/drawingml/2006/main" noChangeAspect="1"/>
+            </wp:cNvGraphicFramePr>
+            <a:graphic xmlns:a="http://schemas.openxmlformats.org/drawingml/2006/main">
+              <a:graphicData uri="http://schemas.openxmlformats.org/drawingml/2006/picture">
+                <pic:pic xmlns:pic="http://schemas.openxmlformats.org/drawingml/2006/picture">
+                  <pic:nvPicPr>
+                    <pic:cNvPr id="0" name="Picture 18"/>
+                    <pic:cNvPicPr>
+                      <a:picLocks noChangeAspect="1" noChangeArrowheads="1"/>
+                    </pic:cNvPicPr>
+                  </pic:nvPicPr>
+                  <pic:blipFill>
+                    <a:blip r:embed="rId19">
+                      <a:extLst>
+                        <a:ext uri="{28A0092B-C50C-407E-A947-70E740481C1C}">
+                          <a14:useLocalDpi xmlns:a14="http://schemas.microsoft.com/office/drawing/2010/main" val="0"/>
+                        </a:ext>
+                      </a:extLst>
+                    </a:blip>
+                    <a:srcRect/>
+                    <a:stretch>
+                      <a:fillRect/>
+                    </a:stretch>
+                  </pic:blipFill>
+                  <pic:spPr bwMode="auto">
+                    <a:xfrm>
+                      <a:off x="0" y="0"/>
+                      <a:ext cx="5727700" cy="6203315"/>
+                    </a:xfrm>
+                    <a:prstGeom prst="rect">
+                      <a:avLst/>
+                    </a:prstGeom>
+                    <a:noFill/>
+                    <a:ln>
+                      <a:noFill/>
+                    </a:ln>
+                  </pic:spPr>
+                </pic:pic>
+              </a:graphicData>
+            </a:graphic>
+          </wp:inline>
+        </w:drawing>
+      </w:r>
+    </w:p>
+    <w:p>
+      <w:pPr>
+        <w:rPr>
+          <w:lang w:val="pl-PL"/>
+        </w:rPr>
+      </w:pPr>
+      <w:r>
+        <w:rPr>
+          <w:b/>
+          <w:bCs/>
+          <w:lang w:val="pl-PL"/>
+        </w:rPr>
+        <w:t>1. Wybór rezerwacji</w:t>
+      </w:r>
+    </w:p>
+    <w:p>
+      <w:pPr>
+        <w:rPr>
+          <w:lang w:val="pl-PL"/>
+        </w:rPr>
+      </w:pPr>
+      <w:r>
+        <w:rPr>
+          <w:lang w:val="pl-PL"/>
+        </w:rPr>
+        <w:t>Instruktor wybiera zakładkę „obsługa wizyt” i wskazuje rezerwację o statusie „Wymaga weryfikacji”.</w:t>
+      </w:r>
+    </w:p>
+    <w:p>
+      <w:pPr>
+        <w:rPr>
+          <w:lang w:val="pl-PL"/>
+        </w:rPr>
+      </w:pPr>
+      <w:r>
+        <w:rPr>
+          <w:b/>
+          <w:bCs/>
+          <w:lang w:val="pl-PL"/>
+        </w:rPr>
+        <w:t>Komunikat 1:</w:t>
+      </w:r>
+      <w:r>
+        <w:rPr>
+          <w:lang w:val="pl-PL"/>
+        </w:rPr>
+        <w:t> Aktor wywołuje na obiekcie rezerwacja metodę </w:t>
+      </w:r>
+      <w:proofErr w:type="spellStart"/>
+      <w:r>
+        <w:rPr>
+          <w:lang w:val="pl-PL"/>
+        </w:rPr>
+        <w:t>pobierzKlienta</w:t>
+      </w:r>
+      <w:proofErr w:type="spellEnd"/>
+      <w:r>
+        <w:rPr>
+          <w:lang w:val="pl-PL"/>
+        </w:rPr>
+        <w:t>().</w:t>
+      </w:r>
+    </w:p>
+    <w:p>
+      <w:pPr>
+        <w:rPr>
+          <w:lang w:val="pl-PL"/>
+        </w:rPr>
+      </w:pPr>
+      <w:r>
+        <w:rPr>
+          <w:b/>
+          <w:bCs/>
+          <w:lang w:val="pl-PL"/>
+        </w:rPr>
+        <w:t>Komunikat 2 (zwrot):</w:t>
+      </w:r>
+      <w:r>
+        <w:rPr>
+          <w:lang w:val="pl-PL"/>
+        </w:rPr>
+        <w:t> Obiekt rezerwacja zwraca dane klienta (klient) powiązanego z rezerwacją.</w:t>
+      </w:r>
+    </w:p>
+    <w:p>
+      <w:pPr>
+        <w:rPr>
+          <w:lang w:val="pl-PL"/>
+        </w:rPr>
+      </w:pPr>
+      <w:r>
+        <w:rPr>
+          <w:lang w:val="pl-PL"/>
+        </w:rPr>
+        <w:t>System wyświetla formularz weryfikacji z danymi klienta (imię, nazwisko, PESEL).</w:t>
+      </w:r>
+    </w:p>
+    <w:p>
+      <w:pPr>
+        <w:rPr>
+          <w:lang w:val="pl-PL"/>
+        </w:rPr>
+      </w:pPr>
+    </w:p>
+    <w:p>
+      <w:pPr>
+        <w:rPr>
+          <w:lang w:val="pl-PL"/>
+        </w:rPr>
+      </w:pPr>
+      <w:r>
+        <w:rPr>
+          <w:b/>
+          <w:bCs/>
+          <w:lang w:val="pl-PL"/>
+        </w:rPr>
+        <w:t>2. Weryfikacja dokumentu</w:t>
+      </w:r>
+      <w:r>
+        <w:rPr>
+          <w:lang w:val="pl-PL"/>
+        </w:rPr>
+        <w:t> — fragment </w:t>
+      </w:r>
+      <w:proofErr w:type="spellStart"/>
+      <w:r>
+        <w:rPr>
+          <w:lang w:val="pl-PL"/>
+        </w:rPr>
+        <w:t>loop</w:t>
+      </w:r>
+      <w:proofErr w:type="spellEnd"/>
+      <w:r>
+        <w:rPr>
+          <w:lang w:val="pl-PL"/>
+        </w:rPr>
+        <w:t xml:space="preserve"> [dopóki dane niepoprawne]</w:t>
+      </w:r>
+    </w:p>
+    <w:p>
+      <w:pPr>
+        <w:rPr>
+          <w:lang w:val="pl-PL"/>
+        </w:rPr>
+      </w:pPr>
+      <w:r>
+        <w:rPr>
+          <w:lang w:val="pl-PL"/>
+        </w:rPr>
+        <w:t>Pętla powtarza się, dopóki instruktor nie poda poprawnych danych dokumentu.</w:t>
+      </w:r>
+    </w:p>
+    <w:p>
+      <w:pPr>
+        <w:rPr>
+          <w:lang w:val="pl-PL"/>
+        </w:rPr>
+      </w:pPr>
+      <w:r>
+        <w:rPr>
+          <w:lang w:val="pl-PL"/>
+        </w:rPr>
+        <w:t>Instruktor wprowadza rodzaj dokumentu i numer PESEL.</w:t>
+      </w:r>
+    </w:p>
+    <w:p>
+      <w:pPr>
+        <w:rPr>
+          <w:lang w:val="pl-PL"/>
+        </w:rPr>
+      </w:pPr>
+      <w:r>
+        <w:rPr>
+          <w:b/>
+          <w:bCs/>
+          <w:lang w:val="pl-PL"/>
+        </w:rPr>
+        <w:lastRenderedPageBreak/>
+        <w:t>Komunikat 3:</w:t>
+      </w:r>
+      <w:r>
+        <w:rPr>
+          <w:lang w:val="pl-PL"/>
+        </w:rPr>
+        <w:t> Aktor wywołuje na obiekcie instruktor metodę</w:t>
+      </w:r>
+      <w:r>
+        <w:rPr>
+          <w:lang w:val="pl-PL"/>
+        </w:rPr>
+        <w:br/>
+      </w:r>
+      <w:proofErr w:type="spellStart"/>
+      <w:r>
+        <w:rPr>
+          <w:lang w:val="pl-PL"/>
+        </w:rPr>
+        <w:t>weryfikujDokument</w:t>
+      </w:r>
+      <w:proofErr w:type="spellEnd"/>
+      <w:r>
+        <w:rPr>
+          <w:lang w:val="pl-PL"/>
+        </w:rPr>
+        <w:t>(klient, rodzaj, PESEL).</w:t>
+      </w:r>
+    </w:p>
+    <w:p>
+      <w:pPr>
+        <w:rPr>
+          <w:lang w:val="pl-PL"/>
+        </w:rPr>
+      </w:pPr>
+      <w:r>
+        <w:rPr>
+          <w:lang w:val="pl-PL"/>
+        </w:rPr>
+        <w:t>Weryfikacja przebiega w gałęzi alt:</w:t>
+      </w:r>
+    </w:p>
+    <w:p>
+      <w:pPr>
+        <w:rPr>
+          <w:lang w:val="pl-PL"/>
+        </w:rPr>
+      </w:pPr>
+      <w:r>
+        <w:rPr>
+          <w:b/>
+          <w:bCs/>
+          <w:lang w:val="pl-PL"/>
+        </w:rPr>
+        <w:t>Gałąź [z błędami]:</w:t>
+      </w:r>
+    </w:p>
+    <w:p>
+      <w:pPr>
+        <w:rPr>
+          <w:lang w:val="pl-PL"/>
+        </w:rPr>
+      </w:pPr>
+      <w:r>
+        <w:rPr>
+          <w:b/>
+          <w:bCs/>
+          <w:lang w:val="pl-PL"/>
+        </w:rPr>
+        <w:t>Komunikat 4:</w:t>
+      </w:r>
+      <w:r>
+        <w:rPr>
+          <w:lang w:val="pl-PL"/>
+        </w:rPr>
+        <w:t> Obiekt instruktor zwraca wartość </w:t>
+      </w:r>
+      <w:proofErr w:type="spellStart"/>
+      <w:r>
+        <w:rPr>
+          <w:lang w:val="pl-PL"/>
+        </w:rPr>
+        <w:t>false</w:t>
+      </w:r>
+      <w:proofErr w:type="spellEnd"/>
+      <w:r>
+        <w:rPr>
+          <w:lang w:val="pl-PL"/>
+        </w:rPr>
+        <w:t>. System informuje o błędach w formularzu; instruktor poprawia dane i pętla się powtarza.</w:t>
+      </w:r>
+    </w:p>
+    <w:p>
+      <w:pPr>
+        <w:rPr>
+          <w:lang w:val="pl-PL"/>
+        </w:rPr>
+      </w:pPr>
+      <w:r>
+        <w:rPr>
+          <w:b/>
+          <w:bCs/>
+          <w:lang w:val="pl-PL"/>
+        </w:rPr>
+        <w:t>Gałąź [poprawne]:</w:t>
+      </w:r>
+    </w:p>
+    <w:p>
+      <w:pPr>
+        <w:rPr>
+          <w:lang w:val="pl-PL"/>
+        </w:rPr>
+      </w:pPr>
+      <w:r>
+        <w:rPr>
+          <w:lang w:val="pl-PL"/>
+        </w:rPr>
+        <w:t>Wewnątrz </w:t>
+      </w:r>
+      <w:proofErr w:type="spellStart"/>
+      <w:r>
+        <w:rPr>
+          <w:lang w:val="pl-PL"/>
+        </w:rPr>
+        <w:t>weryfikujDokument</w:t>
+      </w:r>
+      <w:proofErr w:type="spellEnd"/>
+      <w:r>
+        <w:rPr>
+          <w:lang w:val="pl-PL"/>
+        </w:rPr>
+        <w:t> ustawiany jest atrybut </w:t>
+      </w:r>
+      <w:proofErr w:type="spellStart"/>
+      <w:r>
+        <w:rPr>
+          <w:lang w:val="pl-PL"/>
+        </w:rPr>
+        <w:t>Status_weryfikacji</w:t>
+      </w:r>
+      <w:proofErr w:type="spellEnd"/>
+      <w:r>
+        <w:rPr>
+          <w:lang w:val="pl-PL"/>
+        </w:rPr>
+        <w:t> klienta na </w:t>
+      </w:r>
+      <w:proofErr w:type="spellStart"/>
+      <w:r>
+        <w:rPr>
+          <w:lang w:val="pl-PL"/>
+        </w:rPr>
+        <w:t>true</w:t>
+      </w:r>
+      <w:proofErr w:type="spellEnd"/>
+      <w:r>
+        <w:rPr>
+          <w:lang w:val="pl-PL"/>
+        </w:rPr>
+        <w:t>.</w:t>
+      </w:r>
+    </w:p>
+    <w:p>
+      <w:pPr>
+        <w:rPr>
+          <w:lang w:val="pl-PL"/>
+        </w:rPr>
+      </w:pPr>
+      <w:r>
+        <w:rPr>
+          <w:b/>
+          <w:bCs/>
+          <w:lang w:val="pl-PL"/>
+        </w:rPr>
+        <w:t>Komunikat 5:</w:t>
+      </w:r>
+      <w:r>
+        <w:rPr>
+          <w:lang w:val="pl-PL"/>
+        </w:rPr>
+        <w:t> Obiekt instruktor wywołuje na rezerwacja metodę </w:t>
+      </w:r>
+      <w:proofErr w:type="spellStart"/>
+      <w:r>
+        <w:rPr>
+          <w:lang w:val="pl-PL"/>
+        </w:rPr>
+        <w:t>zmienStatus</w:t>
+      </w:r>
+      <w:proofErr w:type="spellEnd"/>
+      <w:r>
+        <w:rPr>
+          <w:lang w:val="pl-PL"/>
+        </w:rPr>
+        <w:t>("zweryfikowany").</w:t>
+      </w:r>
+    </w:p>
+    <w:p>
+      <w:pPr>
+        <w:rPr>
+          <w:lang w:val="pl-PL"/>
+        </w:rPr>
+      </w:pPr>
+      <w:r>
+        <w:rPr>
+          <w:b/>
+          <w:bCs/>
+          <w:lang w:val="pl-PL"/>
+        </w:rPr>
+        <w:t>Komunikat 6:</w:t>
+      </w:r>
+      <w:r>
+        <w:rPr>
+          <w:lang w:val="pl-PL"/>
+        </w:rPr>
+        <w:t> Obiekt instruktor zwraca wartość </w:t>
+      </w:r>
+      <w:proofErr w:type="spellStart"/>
+      <w:r>
+        <w:rPr>
+          <w:lang w:val="pl-PL"/>
+        </w:rPr>
+        <w:t>true</w:t>
+      </w:r>
+      <w:proofErr w:type="spellEnd"/>
+      <w:r>
+        <w:rPr>
+          <w:lang w:val="pl-PL"/>
+        </w:rPr>
+        <w:t>. Rezerwacja zostaje zweryfikowana; pętla się kończy.</w:t>
+      </w:r>
+    </w:p>
+    <w:p>
+      <w:pPr>
+        <w:rPr>
+          <w:lang w:val="pl-PL"/>
+        </w:rPr>
+      </w:pPr>
+    </w:p>
+    <w:p>
+      <w:pPr>
+        <w:rPr>
+          <w:lang w:val="pl-PL"/>
+        </w:rPr>
+      </w:pPr>
+      <w:r>
+        <w:rPr>
+          <w:b/>
+          <w:bCs/>
+          <w:lang w:val="pl-PL"/>
+        </w:rPr>
+        <w:t xml:space="preserve">3. </w:t>
+      </w:r>
+      <w:proofErr w:type="spellStart"/>
+      <w:r>
+        <w:rPr>
+          <w:b/>
+          <w:bCs/>
+          <w:lang w:val="pl-PL"/>
+        </w:rPr>
+        <w:t>Check</w:t>
+      </w:r>
+      <w:proofErr w:type="spellEnd"/>
+      <w:r>
+        <w:rPr>
+          <w:b/>
+          <w:bCs/>
+          <w:lang w:val="pl-PL"/>
+        </w:rPr>
+        <w:t>-in</w:t>
+      </w:r>
+    </w:p>
+    <w:p>
+      <w:pPr>
+        <w:rPr>
+          <w:lang w:val="pl-PL"/>
+        </w:rPr>
+      </w:pPr>
+      <w:r>
+        <w:rPr>
+          <w:lang w:val="pl-PL"/>
+        </w:rPr>
+        <w:t>Instruktor klika przycisk „</w:t>
+      </w:r>
+      <w:proofErr w:type="spellStart"/>
+      <w:r>
+        <w:rPr>
+          <w:lang w:val="pl-PL"/>
+        </w:rPr>
+        <w:t>Check</w:t>
+      </w:r>
+      <w:proofErr w:type="spellEnd"/>
+      <w:r>
+        <w:rPr>
+          <w:lang w:val="pl-PL"/>
+        </w:rPr>
+        <w:t>-in”.</w:t>
+      </w:r>
+    </w:p>
+    <w:p>
+      <w:pPr>
+        <w:rPr>
+          <w:lang w:val="pl-PL"/>
+        </w:rPr>
+      </w:pPr>
+      <w:r>
+        <w:rPr>
+          <w:b/>
+          <w:bCs/>
+          <w:lang w:val="pl-PL"/>
+        </w:rPr>
+        <w:t>Komunikat 7:</w:t>
+      </w:r>
+      <w:r>
+        <w:rPr>
+          <w:lang w:val="pl-PL"/>
+        </w:rPr>
+        <w:t> Aktor wywołuje na obiekcie instruktor metodę </w:t>
+      </w:r>
+      <w:proofErr w:type="spellStart"/>
+      <w:r>
+        <w:rPr>
+          <w:lang w:val="pl-PL"/>
+        </w:rPr>
+        <w:t>wykonajCheckIn</w:t>
+      </w:r>
+      <w:proofErr w:type="spellEnd"/>
+      <w:r>
+        <w:rPr>
+          <w:lang w:val="pl-PL"/>
+        </w:rPr>
+        <w:t>(rezerwacja).</w:t>
+      </w:r>
+    </w:p>
+    <w:p>
+      <w:pPr>
+        <w:rPr>
+          <w:lang w:val="pl-PL"/>
+        </w:rPr>
+      </w:pPr>
+      <w:r>
+        <w:rPr>
+          <w:b/>
+          <w:bCs/>
+          <w:lang w:val="pl-PL"/>
+        </w:rPr>
+        <w:t>Komunikat 8:</w:t>
+      </w:r>
+      <w:r>
+        <w:rPr>
+          <w:lang w:val="pl-PL"/>
+        </w:rPr>
+        <w:t> Obiekt instruktor tworzy nowy obiekt </w:t>
+      </w:r>
+      <w:proofErr w:type="spellStart"/>
+      <w:r>
+        <w:rPr>
+          <w:lang w:val="pl-PL"/>
+        </w:rPr>
+        <w:t>sesja:SesjaStrzelecka</w:t>
+      </w:r>
+      <w:proofErr w:type="spellEnd"/>
+      <w:r>
+        <w:rPr>
+          <w:lang w:val="pl-PL"/>
+        </w:rPr>
+        <w:t> (&lt;&lt;</w:t>
+      </w:r>
+      <w:proofErr w:type="spellStart"/>
+      <w:r>
+        <w:rPr>
+          <w:lang w:val="pl-PL"/>
+        </w:rPr>
+        <w:t>create</w:t>
+      </w:r>
+      <w:proofErr w:type="spellEnd"/>
+      <w:r>
+        <w:rPr>
+          <w:lang w:val="pl-PL"/>
+        </w:rPr>
+        <w:t>&gt;&gt;).</w:t>
+      </w:r>
+    </w:p>
+    <w:p>
+      <w:pPr>
+        <w:rPr>
+          <w:lang w:val="pl-PL"/>
+        </w:rPr>
+      </w:pPr>
+      <w:r>
+        <w:rPr>
+          <w:b/>
+          <w:bCs/>
+          <w:lang w:val="pl-PL"/>
+        </w:rPr>
+        <w:t>Komunikat 9:</w:t>
+      </w:r>
+      <w:r>
+        <w:rPr>
+          <w:lang w:val="pl-PL"/>
+        </w:rPr>
+        <w:t> Obiekt instruktor wywołuje na rezerwacja metodę </w:t>
+      </w:r>
+      <w:proofErr w:type="spellStart"/>
+      <w:r>
+        <w:rPr>
+          <w:lang w:val="pl-PL"/>
+        </w:rPr>
+        <w:t>zmienStatus</w:t>
+      </w:r>
+      <w:proofErr w:type="spellEnd"/>
+      <w:r>
+        <w:rPr>
+          <w:lang w:val="pl-PL"/>
+        </w:rPr>
+        <w:t>("w trakcie wizyty").</w:t>
+      </w:r>
+    </w:p>
+    <w:p>
+      <w:pPr>
+        <w:rPr>
+          <w:lang w:val="pl-PL"/>
+        </w:rPr>
+      </w:pPr>
+      <w:r>
+        <w:rPr>
+          <w:b/>
+          <w:bCs/>
+          <w:lang w:val="pl-PL"/>
+        </w:rPr>
+        <w:t>Komunikat 10 (zwrot):</w:t>
+      </w:r>
+      <w:r>
+        <w:rPr>
+          <w:lang w:val="pl-PL"/>
+        </w:rPr>
+        <w:t xml:space="preserve"> Obiekt instruktor zwraca utworzony obiekt sesja do aktora. </w:t>
+      </w:r>
+      <w:proofErr w:type="spellStart"/>
+      <w:r>
+        <w:rPr>
+          <w:lang w:val="pl-PL"/>
+        </w:rPr>
+        <w:t>Check</w:t>
+      </w:r>
+      <w:proofErr w:type="spellEnd"/>
+      <w:r>
+        <w:rPr>
+          <w:lang w:val="pl-PL"/>
+        </w:rPr>
+        <w:t>-in zostaje zakończony; rozpoczyna się sesja strzelecka.</w:t>
+      </w:r>
+    </w:p>
+    <w:p/>
+    <w:p/>
+    <w:p/>
+    <w:p/>
+    <w:p/>
+    <w:p/>
+    <w:p/>
+    <w:p/>
+    <w:p/>
+    <w:p/>
+    <w:p/>
+    <w:p/>
+    <w:p/>
+    <w:p/>
+    <w:p/>
+    <w:p/>
+    <w:p/>
+    <w:p/>
+    <w:p/>
+    <w:p/>
+    <w:p/>
+    <w:p/>
+    <w:p/>
+    <w:p/>
+    <w:p/>
     <w:p>
       <w:pPr>
         <w:pStyle w:val="Nagwek2"/>
       </w:pPr>
       <w:r>
+        <w:lastRenderedPageBreak/>
         <w:t>5.1.Diagram klas</w:t>
       </w:r>
     </w:p>
@@ -3962,7 +5435,6 @@
         <w:rPr>
           <w:noProof/>
         </w:rPr>
-        <w:lastRenderedPageBreak/>
         <w:drawing>
           <wp:inline distT="0" distB="0" distL="0" distR="0" wp14:anchorId="7849F836" wp14:editId="293D503A">
             <wp:extent cx="5733415" cy="3727450"/>
@@ -3979,7 +5451,7 @@
                     <pic:cNvPicPr/>
                   </pic:nvPicPr>
                   <pic:blipFill>
-                    <a:blip r:embed="rId18"/>
+                    <a:blip r:embed="rId20"/>
                     <a:stretch>
                       <a:fillRect/>
                     </a:stretch>
@@ -4000,6 +5472,2318 @@
         </w:drawing>
       </w:r>
     </w:p>
+    <w:p>
+      <w:pPr>
+        <w:pStyle w:val="Nagwek3"/>
+      </w:pPr>
+      <w:r>
+        <w:t>5.2. Uporządkowany alfabetycznie wykaz wszystkich klas</w:t>
+      </w:r>
+    </w:p>
+    <w:p/>
+    <w:p/>
+    <w:p/>
+    <w:p/>
+    <w:p/>
+    <w:p/>
+    <w:p/>
+    <w:p/>
+    <w:p/>
+    <w:p/>
+    <w:p/>
+    <w:p/>
+    <w:p/>
+    <w:p/>
+    <w:p/>
+    <w:p/>
+    <w:p/>
+    <w:p/>
+    <w:p/>
+    <w:p>
+      <w:pPr>
+        <w:pStyle w:val="Nagwek3"/>
+      </w:pPr>
+      <w:r>
+        <w:lastRenderedPageBreak/>
+        <w:t>5.3. Diagramy stanów</w:t>
+      </w:r>
+    </w:p>
+    <w:p>
+      <w:pPr>
+        <w:rPr>
+          <w:b/>
+          <w:bCs/>
+        </w:rPr>
+      </w:pPr>
+      <w:r>
+        <w:rPr>
+          <w:b/>
+          <w:bCs/>
+        </w:rPr>
+        <w:t>Igor Wróblewski</w:t>
+      </w:r>
+    </w:p>
+    <w:p>
+      <w:pPr>
+        <w:rPr>
+          <w:b/>
+          <w:bCs/>
+        </w:rPr>
+      </w:pPr>
+    </w:p>
+    <w:p>
+      <w:pPr>
+        <w:rPr>
+          <w:b/>
+          <w:bCs/>
+        </w:rPr>
+      </w:pPr>
+    </w:p>
+    <w:p>
+      <w:pPr>
+        <w:rPr>
+          <w:b/>
+          <w:bCs/>
+        </w:rPr>
+      </w:pPr>
+    </w:p>
+    <w:p>
+      <w:pPr>
+        <w:rPr>
+          <w:b/>
+          <w:bCs/>
+        </w:rPr>
+      </w:pPr>
+    </w:p>
+    <w:p>
+      <w:pPr>
+        <w:rPr>
+          <w:b/>
+          <w:bCs/>
+        </w:rPr>
+      </w:pPr>
+    </w:p>
+    <w:p>
+      <w:pPr>
+        <w:rPr>
+          <w:b/>
+          <w:bCs/>
+        </w:rPr>
+      </w:pPr>
+    </w:p>
+    <w:p>
+      <w:pPr>
+        <w:rPr>
+          <w:b/>
+          <w:bCs/>
+        </w:rPr>
+      </w:pPr>
+    </w:p>
+    <w:p>
+      <w:pPr>
+        <w:rPr>
+          <w:b/>
+          <w:bCs/>
+        </w:rPr>
+      </w:pPr>
+    </w:p>
+    <w:p>
+      <w:pPr>
+        <w:rPr>
+          <w:b/>
+          <w:bCs/>
+        </w:rPr>
+      </w:pPr>
+    </w:p>
+    <w:p>
+      <w:pPr>
+        <w:rPr>
+          <w:b/>
+          <w:bCs/>
+        </w:rPr>
+      </w:pPr>
+    </w:p>
+    <w:p>
+      <w:pPr>
+        <w:rPr>
+          <w:b/>
+          <w:bCs/>
+        </w:rPr>
+      </w:pPr>
+    </w:p>
+    <w:p>
+      <w:pPr>
+        <w:rPr>
+          <w:b/>
+          <w:bCs/>
+        </w:rPr>
+      </w:pPr>
+    </w:p>
+    <w:p>
+      <w:pPr>
+        <w:rPr>
+          <w:b/>
+          <w:bCs/>
+        </w:rPr>
+      </w:pPr>
+    </w:p>
+    <w:p>
+      <w:pPr>
+        <w:rPr>
+          <w:b/>
+          <w:bCs/>
+        </w:rPr>
+      </w:pPr>
+    </w:p>
+    <w:p>
+      <w:pPr>
+        <w:rPr>
+          <w:b/>
+          <w:bCs/>
+        </w:rPr>
+      </w:pPr>
+    </w:p>
+    <w:p>
+      <w:pPr>
+        <w:rPr>
+          <w:b/>
+          <w:bCs/>
+        </w:rPr>
+      </w:pPr>
+    </w:p>
+    <w:p>
+      <w:pPr>
+        <w:rPr>
+          <w:b/>
+          <w:bCs/>
+        </w:rPr>
+      </w:pPr>
+    </w:p>
+    <w:p>
+      <w:pPr>
+        <w:rPr>
+          <w:b/>
+          <w:bCs/>
+        </w:rPr>
+      </w:pPr>
+    </w:p>
+    <w:p>
+      <w:pPr>
+        <w:rPr>
+          <w:b/>
+          <w:bCs/>
+        </w:rPr>
+      </w:pPr>
+    </w:p>
+    <w:p>
+      <w:pPr>
+        <w:rPr>
+          <w:b/>
+          <w:bCs/>
+        </w:rPr>
+      </w:pPr>
+    </w:p>
+    <w:p>
+      <w:pPr>
+        <w:rPr>
+          <w:b/>
+          <w:bCs/>
+        </w:rPr>
+      </w:pPr>
+    </w:p>
+    <w:p>
+      <w:pPr>
+        <w:rPr>
+          <w:b/>
+          <w:bCs/>
+        </w:rPr>
+      </w:pPr>
+    </w:p>
+    <w:p>
+      <w:pPr>
+        <w:rPr>
+          <w:b/>
+          <w:bCs/>
+        </w:rPr>
+      </w:pPr>
+    </w:p>
+    <w:p>
+      <w:pPr>
+        <w:rPr>
+          <w:b/>
+          <w:bCs/>
+        </w:rPr>
+      </w:pPr>
+    </w:p>
+    <w:p>
+      <w:pPr>
+        <w:rPr>
+          <w:b/>
+          <w:bCs/>
+        </w:rPr>
+      </w:pPr>
+    </w:p>
+    <w:p>
+      <w:pPr>
+        <w:rPr>
+          <w:b/>
+          <w:bCs/>
+        </w:rPr>
+      </w:pPr>
+    </w:p>
+    <w:p>
+      <w:pPr>
+        <w:rPr>
+          <w:b/>
+          <w:bCs/>
+        </w:rPr>
+      </w:pPr>
+    </w:p>
+    <w:p>
+      <w:pPr>
+        <w:rPr>
+          <w:b/>
+          <w:bCs/>
+        </w:rPr>
+      </w:pPr>
+    </w:p>
+    <w:p>
+      <w:pPr>
+        <w:rPr>
+          <w:b/>
+          <w:bCs/>
+        </w:rPr>
+      </w:pPr>
+    </w:p>
+    <w:p>
+      <w:pPr>
+        <w:rPr>
+          <w:b/>
+          <w:bCs/>
+        </w:rPr>
+      </w:pPr>
+    </w:p>
+    <w:p>
+      <w:pPr>
+        <w:rPr>
+          <w:b/>
+          <w:bCs/>
+        </w:rPr>
+      </w:pPr>
+    </w:p>
+    <w:p>
+      <w:pPr>
+        <w:rPr>
+          <w:b/>
+          <w:bCs/>
+        </w:rPr>
+      </w:pPr>
+    </w:p>
+    <w:p>
+      <w:pPr>
+        <w:rPr>
+          <w:b/>
+          <w:bCs/>
+        </w:rPr>
+      </w:pPr>
+    </w:p>
+    <w:p>
+      <w:pPr>
+        <w:rPr>
+          <w:b/>
+          <w:bCs/>
+        </w:rPr>
+      </w:pPr>
+    </w:p>
+    <w:p>
+      <w:pPr>
+        <w:rPr>
+          <w:b/>
+          <w:bCs/>
+        </w:rPr>
+      </w:pPr>
+    </w:p>
+    <w:p>
+      <w:pPr>
+        <w:rPr>
+          <w:b/>
+          <w:bCs/>
+        </w:rPr>
+      </w:pPr>
+    </w:p>
+    <w:p>
+      <w:pPr>
+        <w:rPr>
+          <w:b/>
+          <w:bCs/>
+        </w:rPr>
+      </w:pPr>
+    </w:p>
+    <w:p>
+      <w:pPr>
+        <w:rPr>
+          <w:b/>
+          <w:bCs/>
+        </w:rPr>
+      </w:pPr>
+    </w:p>
+    <w:p>
+      <w:pPr>
+        <w:rPr>
+          <w:b/>
+          <w:bCs/>
+        </w:rPr>
+      </w:pPr>
+    </w:p>
+    <w:p>
+      <w:pPr>
+        <w:rPr>
+          <w:b/>
+          <w:bCs/>
+        </w:rPr>
+      </w:pPr>
+    </w:p>
+    <w:p>
+      <w:pPr>
+        <w:rPr>
+          <w:b/>
+          <w:bCs/>
+        </w:rPr>
+      </w:pPr>
+    </w:p>
+    <w:p>
+      <w:pPr>
+        <w:rPr>
+          <w:b/>
+          <w:bCs/>
+        </w:rPr>
+      </w:pPr>
+    </w:p>
+    <w:p>
+      <w:pPr>
+        <w:rPr>
+          <w:b/>
+          <w:bCs/>
+        </w:rPr>
+      </w:pPr>
+    </w:p>
+    <w:p>
+      <w:pPr>
+        <w:rPr>
+          <w:b/>
+          <w:bCs/>
+        </w:rPr>
+      </w:pPr>
+    </w:p>
+    <w:p>
+      <w:pPr>
+        <w:rPr>
+          <w:b/>
+          <w:bCs/>
+        </w:rPr>
+      </w:pPr>
+    </w:p>
+    <w:p>
+      <w:pPr>
+        <w:rPr>
+          <w:b/>
+          <w:bCs/>
+        </w:rPr>
+      </w:pPr>
+      <w:r>
+        <w:rPr>
+          <w:b/>
+          <w:bCs/>
+        </w:rPr>
+        <w:lastRenderedPageBreak/>
+        <w:t>Wojciech Cimochowski</w:t>
+      </w:r>
+    </w:p>
+    <w:p>
+      <w:pPr>
+        <w:pStyle w:val="Akapitzlist"/>
+        <w:numPr>
+          <w:ilvl w:val="0"/>
+          <w:numId w:val="29"/>
+        </w:numPr>
+        <w:rPr>
+          <w:b/>
+          <w:bCs/>
+        </w:rPr>
+      </w:pPr>
+      <w:r>
+        <w:t>Diagram stanów dla klasy Rezerwacja</w:t>
+      </w:r>
+    </w:p>
+    <w:p>
+      <w:pPr>
+        <w:ind w:left="360"/>
+        <w:rPr>
+          <w:b/>
+          <w:bCs/>
+        </w:rPr>
+      </w:pPr>
+      <w:r>
+        <w:rPr>
+          <w:b/>
+          <w:bCs/>
+          <w:noProof/>
+        </w:rPr>
+        <w:drawing>
+          <wp:inline distT="0" distB="0" distL="0" distR="0" wp14:anchorId="4B4B123D" wp14:editId="4A3BCBAF">
+            <wp:extent cx="5727700" cy="6496050"/>
+            <wp:effectExtent l="0" t="0" r="6350" b="0"/>
+            <wp:docPr id="1185606472" name="Obraz 7"/>
+            <wp:cNvGraphicFramePr>
+              <a:graphicFrameLocks xmlns:a="http://schemas.openxmlformats.org/drawingml/2006/main" noChangeAspect="1"/>
+            </wp:cNvGraphicFramePr>
+            <a:graphic xmlns:a="http://schemas.openxmlformats.org/drawingml/2006/main">
+              <a:graphicData uri="http://schemas.openxmlformats.org/drawingml/2006/picture">
+                <pic:pic xmlns:pic="http://schemas.openxmlformats.org/drawingml/2006/picture">
+                  <pic:nvPicPr>
+                    <pic:cNvPr id="0" name="Picture 38"/>
+                    <pic:cNvPicPr>
+                      <a:picLocks noChangeAspect="1" noChangeArrowheads="1"/>
+                    </pic:cNvPicPr>
+                  </pic:nvPicPr>
+                  <pic:blipFill>
+                    <a:blip r:embed="rId21">
+                      <a:extLst>
+                        <a:ext uri="{28A0092B-C50C-407E-A947-70E740481C1C}">
+                          <a14:useLocalDpi xmlns:a14="http://schemas.microsoft.com/office/drawing/2010/main" val="0"/>
+                        </a:ext>
+                      </a:extLst>
+                    </a:blip>
+                    <a:srcRect/>
+                    <a:stretch>
+                      <a:fillRect/>
+                    </a:stretch>
+                  </pic:blipFill>
+                  <pic:spPr bwMode="auto">
+                    <a:xfrm>
+                      <a:off x="0" y="0"/>
+                      <a:ext cx="5727700" cy="6496050"/>
+                    </a:xfrm>
+                    <a:prstGeom prst="rect">
+                      <a:avLst/>
+                    </a:prstGeom>
+                    <a:noFill/>
+                    <a:ln>
+                      <a:noFill/>
+                    </a:ln>
+                  </pic:spPr>
+                </pic:pic>
+              </a:graphicData>
+            </a:graphic>
+          </wp:inline>
+        </w:drawing>
+      </w:r>
+    </w:p>
+    <w:p>
+      <w:pPr>
+        <w:ind w:left="360"/>
+        <w:rPr>
+          <w:b/>
+          <w:bCs/>
+        </w:rPr>
+      </w:pPr>
+    </w:p>
+    <w:p>
+      <w:pPr>
+        <w:ind w:left="360"/>
+        <w:rPr>
+          <w:b/>
+          <w:bCs/>
+        </w:rPr>
+      </w:pPr>
+    </w:p>
+    <w:p>
+      <w:pPr>
+        <w:ind w:left="360"/>
+        <w:rPr>
+          <w:b/>
+          <w:bCs/>
+        </w:rPr>
+      </w:pPr>
+    </w:p>
+    <w:p>
+      <w:pPr>
+        <w:ind w:left="360"/>
+        <w:rPr>
+          <w:b/>
+          <w:bCs/>
+        </w:rPr>
+      </w:pPr>
+    </w:p>
+    <w:p>
+      <w:pPr>
+        <w:ind w:left="360"/>
+        <w:rPr>
+          <w:b/>
+          <w:bCs/>
+        </w:rPr>
+      </w:pPr>
+    </w:p>
+    <w:p>
+      <w:pPr>
+        <w:ind w:left="360"/>
+        <w:rPr>
+          <w:b/>
+          <w:bCs/>
+        </w:rPr>
+      </w:pPr>
+    </w:p>
+    <w:p>
+      <w:pPr>
+        <w:ind w:left="360"/>
+        <w:rPr>
+          <w:b/>
+          <w:bCs/>
+        </w:rPr>
+      </w:pPr>
+    </w:p>
+    <w:p>
+      <w:pPr>
+        <w:ind w:left="360"/>
+        <w:rPr>
+          <w:b/>
+          <w:bCs/>
+        </w:rPr>
+      </w:pPr>
+    </w:p>
+    <w:p>
+      <w:pPr>
+        <w:ind w:left="360"/>
+        <w:rPr>
+          <w:b/>
+          <w:bCs/>
+        </w:rPr>
+      </w:pPr>
+    </w:p>
+    <w:p>
+      <w:pPr>
+        <w:ind w:left="360"/>
+        <w:rPr>
+          <w:b/>
+          <w:bCs/>
+        </w:rPr>
+      </w:pPr>
+    </w:p>
+    <w:p>
+      <w:pPr>
+        <w:ind w:left="360"/>
+        <w:rPr>
+          <w:b/>
+          <w:bCs/>
+        </w:rPr>
+      </w:pPr>
+      <w:r>
+        <w:rPr>
+          <w:b/>
+          <w:bCs/>
+        </w:rPr>
+        <w:lastRenderedPageBreak/>
+        <w:t>Opis elementów:</w:t>
+      </w:r>
+    </w:p>
+    <w:tbl>
+      <w:tblPr>
+        <w:tblW w:w="0" w:type="auto"/>
+        <w:tblBorders>
+          <w:top w:val="single" w:sz="4" w:space="0" w:color="auto"/>
+          <w:left w:val="single" w:sz="4" w:space="0" w:color="auto"/>
+          <w:bottom w:val="single" w:sz="4" w:space="0" w:color="auto"/>
+          <w:right w:val="single" w:sz="4" w:space="0" w:color="auto"/>
+          <w:insideH w:val="single" w:sz="4" w:space="0" w:color="auto"/>
+          <w:insideV w:val="single" w:sz="4" w:space="0" w:color="auto"/>
+        </w:tblBorders>
+        <w:shd w:val="clear" w:color="auto" w:fill="FFFFFF" w:themeFill="background1"/>
+        <w:tblCellMar>
+          <w:top w:w="15" w:type="dxa"/>
+          <w:left w:w="15" w:type="dxa"/>
+          <w:bottom w:w="15" w:type="dxa"/>
+          <w:right w:w="15" w:type="dxa"/>
+        </w:tblCellMar>
+        <w:tblLook w:val="04A0" w:firstRow="1" w:lastRow="0" w:firstColumn="1" w:lastColumn="0" w:noHBand="0" w:noVBand="1"/>
+      </w:tblPr>
+      <w:tblGrid>
+        <w:gridCol w:w="2337"/>
+        <w:gridCol w:w="6682"/>
+      </w:tblGrid>
+      <w:tr>
+        <w:trPr>
+          <w:tblHeader/>
+        </w:trPr>
+        <w:tc>
+          <w:tcPr>
+            <w:tcW w:w="0" w:type="auto"/>
+            <w:shd w:val="clear" w:color="auto" w:fill="FFFFFF" w:themeFill="background1"/>
+            <w:noWrap/>
+            <w:tcMar>
+              <w:top w:w="75" w:type="dxa"/>
+              <w:left w:w="135" w:type="dxa"/>
+              <w:bottom w:w="75" w:type="dxa"/>
+              <w:right w:w="135" w:type="dxa"/>
+            </w:tcMar>
+            <w:hideMark/>
+          </w:tcPr>
+          <w:p>
+            <w:pPr>
+              <w:ind w:left="360"/>
+              <w:rPr>
+                <w:b/>
+                <w:bCs/>
+                <w:lang w:val="pl-PL"/>
+              </w:rPr>
+            </w:pPr>
+            <w:r>
+              <w:rPr>
+                <w:b/>
+                <w:bCs/>
+                <w:lang w:val="pl-PL"/>
+              </w:rPr>
+              <w:t>Stan</w:t>
+            </w:r>
+          </w:p>
+        </w:tc>
+        <w:tc>
+          <w:tcPr>
+            <w:tcW w:w="0" w:type="auto"/>
+            <w:shd w:val="clear" w:color="auto" w:fill="FFFFFF" w:themeFill="background1"/>
+            <w:noWrap/>
+            <w:tcMar>
+              <w:top w:w="75" w:type="dxa"/>
+              <w:left w:w="135" w:type="dxa"/>
+              <w:bottom w:w="75" w:type="dxa"/>
+              <w:right w:w="135" w:type="dxa"/>
+            </w:tcMar>
+            <w:hideMark/>
+          </w:tcPr>
+          <w:p>
+            <w:pPr>
+              <w:ind w:left="360"/>
+              <w:rPr>
+                <w:b/>
+                <w:bCs/>
+                <w:lang w:val="pl-PL"/>
+              </w:rPr>
+            </w:pPr>
+            <w:r>
+              <w:rPr>
+                <w:b/>
+                <w:bCs/>
+                <w:lang w:val="pl-PL"/>
+              </w:rPr>
+              <w:t>Opis</w:t>
+            </w:r>
+          </w:p>
+        </w:tc>
+      </w:tr>
+      <w:tr>
+        <w:tc>
+          <w:tcPr>
+            <w:tcW w:w="0" w:type="auto"/>
+            <w:shd w:val="clear" w:color="auto" w:fill="FFFFFF" w:themeFill="background1"/>
+            <w:tcMar>
+              <w:top w:w="75" w:type="dxa"/>
+              <w:left w:w="135" w:type="dxa"/>
+              <w:bottom w:w="75" w:type="dxa"/>
+              <w:right w:w="135" w:type="dxa"/>
+            </w:tcMar>
+            <w:hideMark/>
+          </w:tcPr>
+          <w:p>
+            <w:pPr>
+              <w:rPr>
+                <w:b/>
+                <w:bCs/>
+                <w:lang w:val="pl-PL"/>
+              </w:rPr>
+            </w:pPr>
+            <w:proofErr w:type="spellStart"/>
+            <w:r>
+              <w:rPr>
+                <w:b/>
+                <w:bCs/>
+                <w:lang w:val="pl-PL"/>
+              </w:rPr>
+              <w:t>Oczekujaca</w:t>
+            </w:r>
+            <w:proofErr w:type="spellEnd"/>
+          </w:p>
+        </w:tc>
+        <w:tc>
+          <w:tcPr>
+            <w:tcW w:w="0" w:type="auto"/>
+            <w:shd w:val="clear" w:color="auto" w:fill="FFFFFF" w:themeFill="background1"/>
+            <w:tcMar>
+              <w:top w:w="75" w:type="dxa"/>
+              <w:left w:w="135" w:type="dxa"/>
+              <w:bottom w:w="75" w:type="dxa"/>
+              <w:right w:w="135" w:type="dxa"/>
+            </w:tcMar>
+            <w:hideMark/>
+          </w:tcPr>
+          <w:p>
+            <w:pPr>
+              <w:ind w:left="360"/>
+              <w:rPr>
+                <w:lang w:val="pl-PL"/>
+              </w:rPr>
+            </w:pPr>
+            <w:r>
+              <w:rPr>
+                <w:lang w:val="pl-PL"/>
+              </w:rPr>
+              <w:t>Rezerwacja została złożona przez klienta i oczekuje na dzień wizyty. Stanowisko jest zarezerwowane, ale obsługa wizyty jeszcze się nie rozpoczęła.</w:t>
+            </w:r>
+          </w:p>
+        </w:tc>
+      </w:tr>
+      <w:tr>
+        <w:tc>
+          <w:tcPr>
+            <w:tcW w:w="0" w:type="auto"/>
+            <w:shd w:val="clear" w:color="auto" w:fill="FFFFFF" w:themeFill="background1"/>
+            <w:tcMar>
+              <w:top w:w="75" w:type="dxa"/>
+              <w:left w:w="135" w:type="dxa"/>
+              <w:bottom w:w="75" w:type="dxa"/>
+              <w:right w:w="135" w:type="dxa"/>
+            </w:tcMar>
+            <w:hideMark/>
+          </w:tcPr>
+          <w:p>
+            <w:pPr>
+              <w:rPr>
+                <w:b/>
+                <w:bCs/>
+                <w:lang w:val="pl-PL"/>
+              </w:rPr>
+            </w:pPr>
+            <w:proofErr w:type="spellStart"/>
+            <w:r>
+              <w:rPr>
+                <w:b/>
+                <w:bCs/>
+                <w:lang w:val="pl-PL"/>
+              </w:rPr>
+              <w:t>WymagaWeryfikacji</w:t>
+            </w:r>
+            <w:proofErr w:type="spellEnd"/>
+          </w:p>
+        </w:tc>
+        <w:tc>
+          <w:tcPr>
+            <w:tcW w:w="0" w:type="auto"/>
+            <w:shd w:val="clear" w:color="auto" w:fill="FFFFFF" w:themeFill="background1"/>
+            <w:tcMar>
+              <w:top w:w="75" w:type="dxa"/>
+              <w:left w:w="135" w:type="dxa"/>
+              <w:bottom w:w="75" w:type="dxa"/>
+              <w:right w:w="135" w:type="dxa"/>
+            </w:tcMar>
+            <w:hideMark/>
+          </w:tcPr>
+          <w:p>
+            <w:pPr>
+              <w:ind w:left="360"/>
+              <w:rPr>
+                <w:lang w:val="pl-PL"/>
+              </w:rPr>
+            </w:pPr>
+            <w:r>
+              <w:rPr>
+                <w:lang w:val="pl-PL"/>
+              </w:rPr>
+              <w:t>Rozpoczęto obsługę wizyty. Instruktor wybrał rezerwację do weryfikacji. Wymagane jest potwierdzenie tożsamości klienta na podstawie dokumentu (rodzaj, PESEL).</w:t>
+            </w:r>
+          </w:p>
+        </w:tc>
+      </w:tr>
+      <w:tr>
+        <w:tc>
+          <w:tcPr>
+            <w:tcW w:w="0" w:type="auto"/>
+            <w:shd w:val="clear" w:color="auto" w:fill="FFFFFF" w:themeFill="background1"/>
+            <w:tcMar>
+              <w:top w:w="75" w:type="dxa"/>
+              <w:left w:w="135" w:type="dxa"/>
+              <w:bottom w:w="75" w:type="dxa"/>
+              <w:right w:w="135" w:type="dxa"/>
+            </w:tcMar>
+            <w:hideMark/>
+          </w:tcPr>
+          <w:p>
+            <w:pPr>
+              <w:rPr>
+                <w:b/>
+                <w:bCs/>
+                <w:lang w:val="pl-PL"/>
+              </w:rPr>
+            </w:pPr>
+            <w:r>
+              <w:rPr>
+                <w:b/>
+                <w:bCs/>
+                <w:lang w:val="pl-PL"/>
+              </w:rPr>
+              <w:t>Zweryfikowana</w:t>
+            </w:r>
+          </w:p>
+        </w:tc>
+        <w:tc>
+          <w:tcPr>
+            <w:tcW w:w="0" w:type="auto"/>
+            <w:shd w:val="clear" w:color="auto" w:fill="FFFFFF" w:themeFill="background1"/>
+            <w:tcMar>
+              <w:top w:w="75" w:type="dxa"/>
+              <w:left w:w="135" w:type="dxa"/>
+              <w:bottom w:w="75" w:type="dxa"/>
+              <w:right w:w="135" w:type="dxa"/>
+            </w:tcMar>
+            <w:hideMark/>
+          </w:tcPr>
+          <w:p>
+            <w:pPr>
+              <w:ind w:left="360"/>
+              <w:rPr>
+                <w:lang w:val="pl-PL"/>
+              </w:rPr>
+            </w:pPr>
+            <w:r>
+              <w:rPr>
+                <w:lang w:val="pl-PL"/>
+              </w:rPr>
+              <w:t xml:space="preserve">Dokument klienta został zweryfikowany poprawnie. Rezerwacja ma status „zweryfikowany” i możliwe jest wykonanie </w:t>
+            </w:r>
+            <w:proofErr w:type="spellStart"/>
+            <w:r>
+              <w:rPr>
+                <w:lang w:val="pl-PL"/>
+              </w:rPr>
+              <w:t>check</w:t>
+            </w:r>
+            <w:proofErr w:type="spellEnd"/>
+            <w:r>
+              <w:rPr>
+                <w:lang w:val="pl-PL"/>
+              </w:rPr>
+              <w:t>-in.</w:t>
+            </w:r>
+          </w:p>
+        </w:tc>
+      </w:tr>
+      <w:tr>
+        <w:tc>
+          <w:tcPr>
+            <w:tcW w:w="0" w:type="auto"/>
+            <w:shd w:val="clear" w:color="auto" w:fill="FFFFFF" w:themeFill="background1"/>
+            <w:tcMar>
+              <w:top w:w="75" w:type="dxa"/>
+              <w:left w:w="135" w:type="dxa"/>
+              <w:bottom w:w="75" w:type="dxa"/>
+              <w:right w:w="135" w:type="dxa"/>
+            </w:tcMar>
+            <w:hideMark/>
+          </w:tcPr>
+          <w:p>
+            <w:pPr>
+              <w:rPr>
+                <w:b/>
+                <w:bCs/>
+                <w:lang w:val="pl-PL"/>
+              </w:rPr>
+            </w:pPr>
+            <w:proofErr w:type="spellStart"/>
+            <w:r>
+              <w:rPr>
+                <w:b/>
+                <w:bCs/>
+                <w:lang w:val="pl-PL"/>
+              </w:rPr>
+              <w:t>WTrakcieWizyty</w:t>
+            </w:r>
+            <w:proofErr w:type="spellEnd"/>
+          </w:p>
+        </w:tc>
+        <w:tc>
+          <w:tcPr>
+            <w:tcW w:w="0" w:type="auto"/>
+            <w:shd w:val="clear" w:color="auto" w:fill="FFFFFF" w:themeFill="background1"/>
+            <w:tcMar>
+              <w:top w:w="75" w:type="dxa"/>
+              <w:left w:w="135" w:type="dxa"/>
+              <w:bottom w:w="75" w:type="dxa"/>
+              <w:right w:w="135" w:type="dxa"/>
+            </w:tcMar>
+            <w:hideMark/>
+          </w:tcPr>
+          <w:p>
+            <w:pPr>
+              <w:ind w:left="360"/>
+              <w:rPr>
+                <w:lang w:val="pl-PL"/>
+              </w:rPr>
+            </w:pPr>
+            <w:r>
+              <w:rPr>
+                <w:lang w:val="pl-PL"/>
+              </w:rPr>
+              <w:t xml:space="preserve">Wykonano </w:t>
+            </w:r>
+            <w:proofErr w:type="spellStart"/>
+            <w:r>
+              <w:rPr>
+                <w:lang w:val="pl-PL"/>
+              </w:rPr>
+              <w:t>check</w:t>
+            </w:r>
+            <w:proofErr w:type="spellEnd"/>
+            <w:r>
+              <w:rPr>
+                <w:lang w:val="pl-PL"/>
+              </w:rPr>
+              <w:t xml:space="preserve">-in. Utworzono sesję strzelecką. Klient przebywa na stanowisku, trwa </w:t>
+            </w:r>
+            <w:r>
+              <w:rPr>
+                <w:lang w:val="pl-PL"/>
+              </w:rPr>
+              <w:t>sesja</w:t>
+            </w:r>
+            <w:r>
+              <w:rPr>
+                <w:lang w:val="pl-PL"/>
+              </w:rPr>
+              <w:t>.</w:t>
+            </w:r>
+          </w:p>
+        </w:tc>
+      </w:tr>
+      <w:tr>
+        <w:tc>
+          <w:tcPr>
+            <w:tcW w:w="0" w:type="auto"/>
+            <w:shd w:val="clear" w:color="auto" w:fill="FFFFFF" w:themeFill="background1"/>
+            <w:tcMar>
+              <w:top w:w="75" w:type="dxa"/>
+              <w:left w:w="135" w:type="dxa"/>
+              <w:bottom w:w="75" w:type="dxa"/>
+              <w:right w:w="135" w:type="dxa"/>
+            </w:tcMar>
+            <w:hideMark/>
+          </w:tcPr>
+          <w:p>
+            <w:pPr>
+              <w:rPr>
+                <w:b/>
+                <w:bCs/>
+                <w:lang w:val="pl-PL"/>
+              </w:rPr>
+            </w:pPr>
+            <w:proofErr w:type="spellStart"/>
+            <w:r>
+              <w:rPr>
+                <w:b/>
+                <w:bCs/>
+                <w:lang w:val="pl-PL"/>
+              </w:rPr>
+              <w:t>Zakonczona</w:t>
+            </w:r>
+            <w:proofErr w:type="spellEnd"/>
+          </w:p>
+        </w:tc>
+        <w:tc>
+          <w:tcPr>
+            <w:tcW w:w="0" w:type="auto"/>
+            <w:shd w:val="clear" w:color="auto" w:fill="FFFFFF" w:themeFill="background1"/>
+            <w:tcMar>
+              <w:top w:w="75" w:type="dxa"/>
+              <w:left w:w="135" w:type="dxa"/>
+              <w:bottom w:w="75" w:type="dxa"/>
+              <w:right w:w="135" w:type="dxa"/>
+            </w:tcMar>
+            <w:hideMark/>
+          </w:tcPr>
+          <w:p>
+            <w:pPr>
+              <w:ind w:left="360"/>
+              <w:rPr>
+                <w:lang w:val="pl-PL"/>
+              </w:rPr>
+            </w:pPr>
+            <w:r>
+              <w:rPr>
+                <w:lang w:val="pl-PL"/>
+              </w:rPr>
+              <w:t xml:space="preserve">Wykonano </w:t>
+            </w:r>
+            <w:proofErr w:type="spellStart"/>
+            <w:r>
+              <w:rPr>
+                <w:lang w:val="pl-PL"/>
+              </w:rPr>
+              <w:t>check</w:t>
+            </w:r>
+            <w:proofErr w:type="spellEnd"/>
+            <w:r>
+              <w:rPr>
+                <w:lang w:val="pl-PL"/>
+              </w:rPr>
+              <w:t xml:space="preserve">-out. Sesja strzelecka została rozliczona. Rezerwacja jest zamknięta </w:t>
+            </w:r>
+            <w:r>
+              <w:rPr>
+                <w:lang w:val="pl-PL"/>
+              </w:rPr>
+              <w:t>-</w:t>
+            </w:r>
+            <w:r>
+              <w:rPr>
+                <w:lang w:val="pl-PL"/>
+              </w:rPr>
+              <w:t xml:space="preserve"> stan końcowy.</w:t>
+            </w:r>
+          </w:p>
+        </w:tc>
+      </w:tr>
+      <w:tr>
+        <w:tc>
+          <w:tcPr>
+            <w:tcW w:w="0" w:type="auto"/>
+            <w:shd w:val="clear" w:color="auto" w:fill="FFFFFF" w:themeFill="background1"/>
+            <w:tcMar>
+              <w:top w:w="75" w:type="dxa"/>
+              <w:left w:w="135" w:type="dxa"/>
+              <w:bottom w:w="75" w:type="dxa"/>
+              <w:right w:w="135" w:type="dxa"/>
+            </w:tcMar>
+            <w:hideMark/>
+          </w:tcPr>
+          <w:p>
+            <w:pPr>
+              <w:rPr>
+                <w:b/>
+                <w:bCs/>
+                <w:lang w:val="pl-PL"/>
+              </w:rPr>
+            </w:pPr>
+            <w:r>
+              <w:rPr>
+                <w:b/>
+                <w:bCs/>
+                <w:lang w:val="pl-PL"/>
+              </w:rPr>
+              <w:t>Anulowana</w:t>
+            </w:r>
+          </w:p>
+        </w:tc>
+        <w:tc>
+          <w:tcPr>
+            <w:tcW w:w="0" w:type="auto"/>
+            <w:shd w:val="clear" w:color="auto" w:fill="FFFFFF" w:themeFill="background1"/>
+            <w:tcMar>
+              <w:top w:w="75" w:type="dxa"/>
+              <w:left w:w="135" w:type="dxa"/>
+              <w:bottom w:w="75" w:type="dxa"/>
+              <w:right w:w="135" w:type="dxa"/>
+            </w:tcMar>
+            <w:hideMark/>
+          </w:tcPr>
+          <w:p>
+            <w:pPr>
+              <w:ind w:left="360"/>
+              <w:rPr>
+                <w:lang w:val="pl-PL"/>
+              </w:rPr>
+            </w:pPr>
+            <w:r>
+              <w:rPr>
+                <w:lang w:val="pl-PL"/>
+              </w:rPr>
+              <w:t xml:space="preserve">Rezerwacja została anulowana przez klienta lub system przed rozpoczęciem wizyty </w:t>
+            </w:r>
+            <w:r>
+              <w:rPr>
+                <w:lang w:val="pl-PL"/>
+              </w:rPr>
+              <w:t>-</w:t>
+            </w:r>
+            <w:r>
+              <w:rPr>
+                <w:lang w:val="pl-PL"/>
+              </w:rPr>
+              <w:t xml:space="preserve"> stan końcowy.</w:t>
+            </w:r>
+          </w:p>
+        </w:tc>
+      </w:tr>
+    </w:tbl>
+    <w:p>
+      <w:pPr>
+        <w:ind w:left="360"/>
+        <w:rPr>
+          <w:b/>
+          <w:bCs/>
+        </w:rPr>
+      </w:pPr>
+    </w:p>
+    <w:p>
+      <w:pPr>
+        <w:ind w:left="360"/>
+        <w:rPr>
+          <w:b/>
+          <w:bCs/>
+        </w:rPr>
+      </w:pPr>
+    </w:p>
+    <w:p>
+      <w:pPr>
+        <w:ind w:left="360"/>
+        <w:rPr>
+          <w:b/>
+          <w:bCs/>
+        </w:rPr>
+      </w:pPr>
+    </w:p>
+    <w:p>
+      <w:pPr>
+        <w:ind w:left="360"/>
+        <w:rPr>
+          <w:b/>
+          <w:bCs/>
+        </w:rPr>
+      </w:pPr>
+    </w:p>
+    <w:p>
+      <w:pPr>
+        <w:ind w:left="360"/>
+        <w:rPr>
+          <w:b/>
+          <w:bCs/>
+        </w:rPr>
+      </w:pPr>
+    </w:p>
+    <w:p>
+      <w:pPr>
+        <w:ind w:left="360"/>
+        <w:rPr>
+          <w:b/>
+          <w:bCs/>
+        </w:rPr>
+      </w:pPr>
+    </w:p>
+    <w:p>
+      <w:pPr>
+        <w:ind w:left="360"/>
+        <w:rPr>
+          <w:b/>
+          <w:bCs/>
+        </w:rPr>
+      </w:pPr>
+    </w:p>
+    <w:p>
+      <w:pPr>
+        <w:ind w:left="360"/>
+        <w:rPr>
+          <w:b/>
+          <w:bCs/>
+        </w:rPr>
+      </w:pPr>
+    </w:p>
+    <w:p>
+      <w:pPr>
+        <w:ind w:left="360"/>
+        <w:rPr>
+          <w:b/>
+          <w:bCs/>
+        </w:rPr>
+      </w:pPr>
+    </w:p>
+    <w:p>
+      <w:pPr>
+        <w:ind w:left="360"/>
+        <w:rPr>
+          <w:b/>
+          <w:bCs/>
+        </w:rPr>
+      </w:pPr>
+    </w:p>
+    <w:p>
+      <w:pPr>
+        <w:ind w:left="360"/>
+        <w:rPr>
+          <w:b/>
+          <w:bCs/>
+        </w:rPr>
+      </w:pPr>
+    </w:p>
+    <w:p>
+      <w:pPr>
+        <w:ind w:left="360"/>
+        <w:rPr>
+          <w:b/>
+          <w:bCs/>
+        </w:rPr>
+      </w:pPr>
+    </w:p>
+    <w:p>
+      <w:pPr>
+        <w:ind w:left="360"/>
+        <w:rPr>
+          <w:b/>
+          <w:bCs/>
+        </w:rPr>
+      </w:pPr>
+    </w:p>
+    <w:p>
+      <w:pPr>
+        <w:ind w:left="360"/>
+        <w:rPr>
+          <w:b/>
+          <w:bCs/>
+        </w:rPr>
+      </w:pPr>
+    </w:p>
+    <w:p>
+      <w:pPr>
+        <w:ind w:left="360"/>
+        <w:rPr>
+          <w:b/>
+          <w:bCs/>
+        </w:rPr>
+      </w:pPr>
+    </w:p>
+    <w:p>
+      <w:pPr>
+        <w:ind w:left="360"/>
+        <w:rPr>
+          <w:b/>
+          <w:bCs/>
+        </w:rPr>
+      </w:pPr>
+    </w:p>
+    <w:p>
+      <w:pPr>
+        <w:ind w:left="360"/>
+        <w:rPr>
+          <w:b/>
+          <w:bCs/>
+        </w:rPr>
+      </w:pPr>
+    </w:p>
+    <w:p>
+      <w:pPr>
+        <w:ind w:left="360"/>
+        <w:rPr>
+          <w:b/>
+          <w:bCs/>
+        </w:rPr>
+      </w:pPr>
+    </w:p>
+    <w:p>
+      <w:pPr>
+        <w:ind w:left="360"/>
+        <w:rPr>
+          <w:b/>
+          <w:bCs/>
+        </w:rPr>
+      </w:pPr>
+    </w:p>
+    <w:p>
+      <w:pPr>
+        <w:ind w:left="360"/>
+        <w:rPr>
+          <w:b/>
+          <w:bCs/>
+        </w:rPr>
+      </w:pPr>
+    </w:p>
+    <w:p>
+      <w:pPr>
+        <w:ind w:left="360"/>
+        <w:rPr>
+          <w:b/>
+          <w:bCs/>
+        </w:rPr>
+      </w:pPr>
+    </w:p>
+    <w:p>
+      <w:pPr>
+        <w:ind w:left="360"/>
+        <w:rPr>
+          <w:b/>
+          <w:bCs/>
+        </w:rPr>
+      </w:pPr>
+    </w:p>
+    <w:p>
+      <w:pPr>
+        <w:ind w:left="360"/>
+        <w:rPr>
+          <w:b/>
+          <w:bCs/>
+        </w:rPr>
+      </w:pPr>
+    </w:p>
+    <w:p>
+      <w:pPr>
+        <w:ind w:left="360"/>
+        <w:rPr>
+          <w:b/>
+          <w:bCs/>
+        </w:rPr>
+      </w:pPr>
+    </w:p>
+    <w:p>
+      <w:pPr>
+        <w:ind w:left="360"/>
+        <w:rPr>
+          <w:b/>
+          <w:bCs/>
+        </w:rPr>
+      </w:pPr>
+    </w:p>
+    <w:p>
+      <w:pPr>
+        <w:pStyle w:val="Nagwek3"/>
+      </w:pPr>
+      <w:r>
+        <w:lastRenderedPageBreak/>
+        <w:t>7. Propozycja technologii informatycznych do wykorzystania</w:t>
+      </w:r>
+    </w:p>
+    <w:p>
+      <w:pPr>
+        <w:pStyle w:val="Nagwek4"/>
+      </w:pPr>
+      <w:r>
+        <w:t>7.1</w:t>
+      </w:r>
+      <w:r>
+        <w:t>.</w:t>
+      </w:r>
+      <w:r>
+        <w:t xml:space="preserve"> </w:t>
+      </w:r>
+      <w:r>
+        <w:t>Propozycja technologii</w:t>
+      </w:r>
+    </w:p>
+    <w:tbl>
+      <w:tblPr>
+        <w:tblW w:w="9634" w:type="dxa"/>
+        <w:tblBorders>
+          <w:top w:val="single" w:sz="4" w:space="0" w:color="auto"/>
+          <w:left w:val="single" w:sz="4" w:space="0" w:color="auto"/>
+          <w:bottom w:val="single" w:sz="4" w:space="0" w:color="auto"/>
+          <w:right w:val="single" w:sz="4" w:space="0" w:color="auto"/>
+          <w:insideH w:val="single" w:sz="4" w:space="0" w:color="auto"/>
+          <w:insideV w:val="single" w:sz="4" w:space="0" w:color="auto"/>
+        </w:tblBorders>
+        <w:shd w:val="clear" w:color="auto" w:fill="F8F8F8"/>
+        <w:tblCellMar>
+          <w:top w:w="15" w:type="dxa"/>
+          <w:left w:w="15" w:type="dxa"/>
+          <w:bottom w:w="15" w:type="dxa"/>
+          <w:right w:w="15" w:type="dxa"/>
+        </w:tblCellMar>
+        <w:tblLook w:val="04A0" w:firstRow="1" w:lastRow="0" w:firstColumn="1" w:lastColumn="0" w:noHBand="0" w:noVBand="1"/>
+      </w:tblPr>
+      <w:tblGrid>
+        <w:gridCol w:w="3964"/>
+        <w:gridCol w:w="5670"/>
+      </w:tblGrid>
+      <w:tr>
+        <w:trPr>
+          <w:tblHeader/>
+        </w:trPr>
+        <w:tc>
+          <w:tcPr>
+            <w:tcW w:w="3964" w:type="dxa"/>
+            <w:shd w:val="clear" w:color="auto" w:fill="F8F8F8"/>
+            <w:noWrap/>
+            <w:tcMar>
+              <w:top w:w="75" w:type="dxa"/>
+              <w:left w:w="135" w:type="dxa"/>
+              <w:bottom w:w="75" w:type="dxa"/>
+              <w:right w:w="135" w:type="dxa"/>
+            </w:tcMar>
+            <w:hideMark/>
+          </w:tcPr>
+          <w:p>
+            <w:pPr>
+              <w:rPr>
+                <w:b/>
+                <w:bCs/>
+                <w:lang w:val="pl-PL"/>
+              </w:rPr>
+            </w:pPr>
+            <w:r>
+              <w:rPr>
+                <w:b/>
+                <w:bCs/>
+                <w:lang w:val="pl-PL"/>
+              </w:rPr>
+              <w:t>Obszar</w:t>
+            </w:r>
+          </w:p>
+        </w:tc>
+        <w:tc>
+          <w:tcPr>
+            <w:tcW w:w="5670" w:type="dxa"/>
+            <w:shd w:val="clear" w:color="auto" w:fill="F8F8F8"/>
+            <w:noWrap/>
+            <w:tcMar>
+              <w:top w:w="75" w:type="dxa"/>
+              <w:left w:w="135" w:type="dxa"/>
+              <w:bottom w:w="75" w:type="dxa"/>
+              <w:right w:w="135" w:type="dxa"/>
+            </w:tcMar>
+            <w:hideMark/>
+          </w:tcPr>
+          <w:p>
+            <w:pPr>
+              <w:rPr>
+                <w:b/>
+                <w:bCs/>
+                <w:lang w:val="pl-PL"/>
+              </w:rPr>
+            </w:pPr>
+            <w:r>
+              <w:rPr>
+                <w:b/>
+                <w:bCs/>
+                <w:lang w:val="pl-PL"/>
+              </w:rPr>
+              <w:t>Technologia</w:t>
+            </w:r>
+          </w:p>
+        </w:tc>
+      </w:tr>
+      <w:tr>
+        <w:tc>
+          <w:tcPr>
+            <w:tcW w:w="3964" w:type="dxa"/>
+            <w:shd w:val="clear" w:color="auto" w:fill="F8F8F8"/>
+            <w:tcMar>
+              <w:top w:w="75" w:type="dxa"/>
+              <w:left w:w="135" w:type="dxa"/>
+              <w:bottom w:w="75" w:type="dxa"/>
+              <w:right w:w="135" w:type="dxa"/>
+            </w:tcMar>
+            <w:hideMark/>
+          </w:tcPr>
+          <w:p>
+            <w:pPr>
+              <w:rPr>
+                <w:lang w:val="pl-PL"/>
+              </w:rPr>
+            </w:pPr>
+            <w:r>
+              <w:rPr>
+                <w:sz w:val="21"/>
+                <w:szCs w:val="21"/>
+              </w:rPr>
+              <w:t>Aplikacja webowa (serwer)</w:t>
+            </w:r>
+          </w:p>
+        </w:tc>
+        <w:tc>
+          <w:tcPr>
+            <w:tcW w:w="5670" w:type="dxa"/>
+            <w:shd w:val="clear" w:color="auto" w:fill="F8F8F8"/>
+            <w:tcMar>
+              <w:top w:w="75" w:type="dxa"/>
+              <w:left w:w="135" w:type="dxa"/>
+              <w:bottom w:w="75" w:type="dxa"/>
+              <w:right w:w="135" w:type="dxa"/>
+            </w:tcMar>
+            <w:hideMark/>
+          </w:tcPr>
+          <w:p>
+            <w:pPr>
+              <w:rPr>
+                <w:lang w:val="pl-PL"/>
+              </w:rPr>
+            </w:pPr>
+            <w:r>
+              <w:rPr>
+                <w:rStyle w:val="font-semibold"/>
+                <w:sz w:val="21"/>
+                <w:szCs w:val="21"/>
+              </w:rPr>
+              <w:t xml:space="preserve">ASP.NET </w:t>
+            </w:r>
+            <w:proofErr w:type="spellStart"/>
+            <w:r>
+              <w:rPr>
+                <w:rStyle w:val="font-semibold"/>
+                <w:sz w:val="21"/>
+                <w:szCs w:val="21"/>
+              </w:rPr>
+              <w:t>Core</w:t>
+            </w:r>
+            <w:proofErr w:type="spellEnd"/>
+          </w:p>
+        </w:tc>
+      </w:tr>
+      <w:tr>
+        <w:tc>
+          <w:tcPr>
+            <w:tcW w:w="3964" w:type="dxa"/>
+            <w:shd w:val="clear" w:color="auto" w:fill="F8F8F8"/>
+            <w:tcMar>
+              <w:top w:w="75" w:type="dxa"/>
+              <w:left w:w="135" w:type="dxa"/>
+              <w:bottom w:w="75" w:type="dxa"/>
+              <w:right w:w="135" w:type="dxa"/>
+            </w:tcMar>
+            <w:hideMark/>
+          </w:tcPr>
+          <w:p>
+            <w:pPr>
+              <w:rPr>
+                <w:lang w:val="pl-PL"/>
+              </w:rPr>
+            </w:pPr>
+            <w:r>
+              <w:rPr>
+                <w:sz w:val="21"/>
+                <w:szCs w:val="21"/>
+              </w:rPr>
+              <w:t>Baza danych</w:t>
+            </w:r>
+          </w:p>
+        </w:tc>
+        <w:tc>
+          <w:tcPr>
+            <w:tcW w:w="5670" w:type="dxa"/>
+            <w:shd w:val="clear" w:color="auto" w:fill="F8F8F8"/>
+            <w:tcMar>
+              <w:top w:w="75" w:type="dxa"/>
+              <w:left w:w="135" w:type="dxa"/>
+              <w:bottom w:w="75" w:type="dxa"/>
+              <w:right w:w="135" w:type="dxa"/>
+            </w:tcMar>
+            <w:hideMark/>
+          </w:tcPr>
+          <w:p>
+            <w:pPr>
+              <w:rPr>
+                <w:lang w:val="pl-PL"/>
+              </w:rPr>
+            </w:pPr>
+            <w:r>
+              <w:rPr>
+                <w:rStyle w:val="font-semibold"/>
+                <w:sz w:val="21"/>
+                <w:szCs w:val="21"/>
+              </w:rPr>
+              <w:t>Microsoft SQL Server</w:t>
+            </w:r>
+          </w:p>
+        </w:tc>
+      </w:tr>
+      <w:tr>
+        <w:tc>
+          <w:tcPr>
+            <w:tcW w:w="3964" w:type="dxa"/>
+            <w:shd w:val="clear" w:color="auto" w:fill="F8F8F8"/>
+            <w:tcMar>
+              <w:top w:w="75" w:type="dxa"/>
+              <w:left w:w="135" w:type="dxa"/>
+              <w:bottom w:w="75" w:type="dxa"/>
+              <w:right w:w="135" w:type="dxa"/>
+            </w:tcMar>
+            <w:hideMark/>
+          </w:tcPr>
+          <w:p>
+            <w:pPr>
+              <w:rPr>
+                <w:lang w:val="pl-PL"/>
+              </w:rPr>
+            </w:pPr>
+            <w:r>
+              <w:rPr>
+                <w:sz w:val="21"/>
+                <w:szCs w:val="21"/>
+              </w:rPr>
+              <w:t>Środowisko programistyczne</w:t>
+            </w:r>
+          </w:p>
+        </w:tc>
+        <w:tc>
+          <w:tcPr>
+            <w:tcW w:w="5670" w:type="dxa"/>
+            <w:shd w:val="clear" w:color="auto" w:fill="F8F8F8"/>
+            <w:tcMar>
+              <w:top w:w="75" w:type="dxa"/>
+              <w:left w:w="135" w:type="dxa"/>
+              <w:bottom w:w="75" w:type="dxa"/>
+              <w:right w:w="135" w:type="dxa"/>
+            </w:tcMar>
+            <w:hideMark/>
+          </w:tcPr>
+          <w:p>
+            <w:pPr>
+              <w:rPr>
+                <w:lang w:val="pl-PL"/>
+              </w:rPr>
+            </w:pPr>
+            <w:r>
+              <w:rPr>
+                <w:rStyle w:val="font-semibold"/>
+                <w:sz w:val="21"/>
+                <w:szCs w:val="21"/>
+              </w:rPr>
+              <w:t>Microsoft Visual Studio</w:t>
+            </w:r>
+          </w:p>
+        </w:tc>
+      </w:tr>
+      <w:tr>
+        <w:tc>
+          <w:tcPr>
+            <w:tcW w:w="3964" w:type="dxa"/>
+            <w:shd w:val="clear" w:color="auto" w:fill="F8F8F8"/>
+            <w:tcMar>
+              <w:top w:w="75" w:type="dxa"/>
+              <w:left w:w="135" w:type="dxa"/>
+              <w:bottom w:w="75" w:type="dxa"/>
+              <w:right w:w="135" w:type="dxa"/>
+            </w:tcMar>
+            <w:hideMark/>
+          </w:tcPr>
+          <w:p>
+            <w:pPr>
+              <w:rPr>
+                <w:lang w:val="pl-PL"/>
+              </w:rPr>
+            </w:pPr>
+            <w:r>
+              <w:rPr>
+                <w:sz w:val="21"/>
+                <w:szCs w:val="21"/>
+              </w:rPr>
+              <w:t>Interfejs użytkownika</w:t>
+            </w:r>
+          </w:p>
+        </w:tc>
+        <w:tc>
+          <w:tcPr>
+            <w:tcW w:w="5670" w:type="dxa"/>
+            <w:shd w:val="clear" w:color="auto" w:fill="F8F8F8"/>
+            <w:tcMar>
+              <w:top w:w="75" w:type="dxa"/>
+              <w:left w:w="135" w:type="dxa"/>
+              <w:bottom w:w="75" w:type="dxa"/>
+              <w:right w:w="135" w:type="dxa"/>
+            </w:tcMar>
+            <w:hideMark/>
+          </w:tcPr>
+          <w:p>
+            <w:pPr>
+              <w:rPr>
+                <w:lang w:val="pl-PL"/>
+              </w:rPr>
+            </w:pPr>
+            <w:r>
+              <w:rPr>
+                <w:sz w:val="21"/>
+                <w:szCs w:val="21"/>
+              </w:rPr>
+              <w:t xml:space="preserve">Przeglądarka (Chrome / </w:t>
+            </w:r>
+            <w:proofErr w:type="spellStart"/>
+            <w:r>
+              <w:rPr>
+                <w:sz w:val="21"/>
+                <w:szCs w:val="21"/>
+              </w:rPr>
+              <w:t>Firefox</w:t>
+            </w:r>
+            <w:proofErr w:type="spellEnd"/>
+            <w:r>
+              <w:rPr>
+                <w:sz w:val="21"/>
+                <w:szCs w:val="21"/>
+              </w:rPr>
+              <w:t>)</w:t>
+            </w:r>
+          </w:p>
+        </w:tc>
+      </w:tr>
+    </w:tbl>
+    <w:p/>
+    <w:p>
+      <w:pPr>
+        <w:pStyle w:val="Nagwek4"/>
+      </w:pPr>
+      <w:r>
+        <w:t>7.2. Opis infrastruktury</w:t>
+      </w:r>
+    </w:p>
+    <w:p>
+      <w:pPr>
+        <w:rPr>
+          <w:lang w:val="pl-PL"/>
+        </w:rPr>
+      </w:pPr>
+      <w:r>
+        <w:rPr>
+          <w:lang w:val="pl-PL"/>
+        </w:rPr>
+        <w:t>System działa w architekturze klient</w:t>
+      </w:r>
+      <w:r>
+        <w:rPr>
+          <w:lang w:val="pl-PL"/>
+        </w:rPr>
+        <w:t>-</w:t>
+      </w:r>
+      <w:r>
+        <w:rPr>
+          <w:lang w:val="pl-PL"/>
+        </w:rPr>
+        <w:t>serwer z wydzielonym serwerem bazy danych.</w:t>
+      </w:r>
+    </w:p>
+    <w:p>
+      <w:pPr>
+        <w:rPr>
+          <w:lang w:val="pl-PL"/>
+        </w:rPr>
+      </w:pPr>
+      <w:r>
+        <w:rPr>
+          <w:b/>
+          <w:bCs/>
+          <w:lang w:val="pl-PL"/>
+        </w:rPr>
+        <w:t>Serwer bazy danych</w:t>
+      </w:r>
+      <w:r>
+        <w:rPr>
+          <w:lang w:val="pl-PL"/>
+        </w:rPr>
+        <w:t> (</w:t>
+      </w:r>
+      <w:r>
+        <w:rPr>
+          <w:lang w:val="pl-PL"/>
+        </w:rPr>
+        <w:t>8</w:t>
+      </w:r>
+      <w:r>
+        <w:rPr>
+          <w:lang w:val="pl-PL"/>
+        </w:rPr>
+        <w:t xml:space="preserve"> rdzeni CPU, </w:t>
+      </w:r>
+      <w:r>
+        <w:rPr>
+          <w:lang w:val="pl-PL"/>
+        </w:rPr>
+        <w:t>64</w:t>
+      </w:r>
+      <w:r>
+        <w:rPr>
+          <w:lang w:val="pl-PL"/>
+        </w:rPr>
+        <w:t xml:space="preserve"> GB RAM, SSD </w:t>
+      </w:r>
+      <w:r>
+        <w:rPr>
+          <w:lang w:val="pl-PL"/>
+        </w:rPr>
+        <w:t>4</w:t>
+      </w:r>
+      <w:r>
+        <w:rPr>
+          <w:lang w:val="pl-PL"/>
+        </w:rPr>
+        <w:t xml:space="preserve"> </w:t>
+      </w:r>
+      <w:r>
+        <w:rPr>
+          <w:lang w:val="pl-PL"/>
+        </w:rPr>
+        <w:t>T</w:t>
+      </w:r>
+      <w:r>
+        <w:rPr>
+          <w:lang w:val="pl-PL"/>
+        </w:rPr>
+        <w:t>B) przechowuje dane o rezerwacjach, klientach, sesjach i magazynie. Komunikacja z serwerem aplikacji przez Ethernet (LAN).</w:t>
+      </w:r>
+    </w:p>
+    <w:p>
+      <w:pPr>
+        <w:rPr>
+          <w:lang w:val="pl-PL"/>
+        </w:rPr>
+      </w:pPr>
+      <w:r>
+        <w:rPr>
+          <w:b/>
+          <w:bCs/>
+          <w:lang w:val="pl-PL"/>
+        </w:rPr>
+        <w:t>Serwer aplikacji</w:t>
+      </w:r>
+      <w:r>
+        <w:rPr>
+          <w:lang w:val="pl-PL"/>
+        </w:rPr>
+        <w:t xml:space="preserve"> (4 rdzenie CPU, </w:t>
+      </w:r>
+      <w:r>
+        <w:rPr>
+          <w:lang w:val="pl-PL"/>
+        </w:rPr>
+        <w:t>32</w:t>
+      </w:r>
+      <w:r>
+        <w:rPr>
+          <w:lang w:val="pl-PL"/>
+        </w:rPr>
+        <w:t xml:space="preserve"> GB RAM, SSD </w:t>
+      </w:r>
+      <w:r>
+        <w:rPr>
+          <w:lang w:val="pl-PL"/>
+        </w:rPr>
+        <w:t>1</w:t>
+      </w:r>
+      <w:r>
+        <w:rPr>
+          <w:lang w:val="pl-PL"/>
+        </w:rPr>
+        <w:t xml:space="preserve"> </w:t>
+      </w:r>
+      <w:r>
+        <w:rPr>
+          <w:lang w:val="pl-PL"/>
+        </w:rPr>
+        <w:t>T</w:t>
+      </w:r>
+      <w:r>
+        <w:rPr>
+          <w:lang w:val="pl-PL"/>
+        </w:rPr>
+        <w:t xml:space="preserve">B) </w:t>
+      </w:r>
+      <w:proofErr w:type="spellStart"/>
+      <w:r>
+        <w:rPr>
+          <w:lang w:val="pl-PL"/>
+        </w:rPr>
+        <w:t>hostuje</w:t>
+      </w:r>
+      <w:proofErr w:type="spellEnd"/>
+      <w:r>
+        <w:rPr>
+          <w:lang w:val="pl-PL"/>
+        </w:rPr>
+        <w:t xml:space="preserve"> aplikację webową ASP.NET </w:t>
+      </w:r>
+      <w:proofErr w:type="spellStart"/>
+      <w:r>
+        <w:rPr>
+          <w:lang w:val="pl-PL"/>
+        </w:rPr>
+        <w:t>Core</w:t>
+      </w:r>
+      <w:proofErr w:type="spellEnd"/>
+      <w:r>
+        <w:rPr>
+          <w:lang w:val="pl-PL"/>
+        </w:rPr>
+        <w:t>, udostępniając interfejsy </w:t>
+      </w:r>
+      <w:proofErr w:type="spellStart"/>
+      <w:r>
+        <w:rPr>
+          <w:lang w:val="pl-PL"/>
+        </w:rPr>
+        <w:t>I</w:t>
+      </w:r>
+      <w:r>
+        <w:rPr>
+          <w:lang w:val="pl-PL"/>
+        </w:rPr>
+        <w:t>Uzytkownik</w:t>
+      </w:r>
+      <w:proofErr w:type="spellEnd"/>
+      <w:r>
+        <w:rPr>
+          <w:lang w:val="pl-PL"/>
+        </w:rPr>
+        <w:t> i </w:t>
+      </w:r>
+      <w:proofErr w:type="spellStart"/>
+      <w:r>
+        <w:rPr>
+          <w:lang w:val="pl-PL"/>
+        </w:rPr>
+        <w:t>IInstruktor</w:t>
+      </w:r>
+      <w:proofErr w:type="spellEnd"/>
+      <w:r>
+        <w:rPr>
+          <w:lang w:val="pl-PL"/>
+        </w:rPr>
+        <w:t>.</w:t>
+      </w:r>
+    </w:p>
+    <w:p>
+      <w:pPr>
+        <w:rPr>
+          <w:lang w:val="pl-PL"/>
+        </w:rPr>
+      </w:pPr>
+      <w:r>
+        <w:rPr>
+          <w:b/>
+          <w:bCs/>
+          <w:lang w:val="pl-PL"/>
+        </w:rPr>
+        <w:t>Komputery instruktora [2]</w:t>
+      </w:r>
+      <w:r>
+        <w:rPr>
+          <w:lang w:val="pl-PL"/>
+        </w:rPr>
+        <w:t> </w:t>
+      </w:r>
+      <w:r>
+        <w:rPr>
+          <w:lang w:val="pl-PL"/>
+        </w:rPr>
+        <w:t>-</w:t>
+      </w:r>
+      <w:r>
+        <w:rPr>
+          <w:lang w:val="pl-PL"/>
+        </w:rPr>
+        <w:t xml:space="preserve"> panel w przeglądarce, połączenie z serwerem przez </w:t>
+      </w:r>
+      <w:r>
+        <w:rPr>
+          <w:lang w:val="pl-PL"/>
+        </w:rPr>
+        <w:t>Internet</w:t>
+      </w:r>
+      <w:r>
+        <w:rPr>
+          <w:lang w:val="pl-PL"/>
+        </w:rPr>
+        <w:t>.</w:t>
+      </w:r>
+    </w:p>
+    <w:p>
+      <w:pPr>
+        <w:rPr>
+          <w:lang w:val="pl-PL"/>
+        </w:rPr>
+      </w:pPr>
+      <w:r>
+        <w:rPr>
+          <w:b/>
+          <w:bCs/>
+          <w:lang w:val="pl-PL"/>
+        </w:rPr>
+        <w:t>Urządzenia klientów [1..*]</w:t>
+      </w:r>
+      <w:r>
+        <w:rPr>
+          <w:lang w:val="pl-PL"/>
+        </w:rPr>
+        <w:t> </w:t>
+      </w:r>
+      <w:r>
+        <w:rPr>
+          <w:lang w:val="pl-PL"/>
+        </w:rPr>
+        <w:t xml:space="preserve">- </w:t>
+      </w:r>
+      <w:r>
+        <w:rPr>
+          <w:lang w:val="pl-PL"/>
+        </w:rPr>
+        <w:t>rezerwacje przez przeglądarkę, połączenie przez Internet (HTTPS).</w:t>
+      </w:r>
+    </w:p>
+    <w:p>
+      <w:pPr>
+        <w:rPr>
+          <w:lang w:val="pl-PL"/>
+        </w:rPr>
+      </w:pPr>
+    </w:p>
+    <w:p>
+      <w:pPr>
+        <w:pStyle w:val="Nagwek4"/>
+        <w:rPr>
+          <w:lang w:val="pl-PL"/>
+        </w:rPr>
+      </w:pPr>
+      <w:r>
+        <w:rPr>
+          <w:lang w:val="pl-PL"/>
+        </w:rPr>
+        <w:t>7.3. Diagram wdrożenia</w:t>
+      </w:r>
+    </w:p>
+    <w:p>
+      <w:r>
+        <w:rPr>
+          <w:noProof/>
+        </w:rPr>
+        <w:drawing>
+          <wp:inline distT="0" distB="0" distL="0" distR="0" wp14:anchorId="686B21A3" wp14:editId="038ED007">
+            <wp:extent cx="5725160" cy="2989580"/>
+            <wp:effectExtent l="0" t="0" r="8890" b="1270"/>
+            <wp:docPr id="1965416409" name="Obraz 8"/>
+            <wp:cNvGraphicFramePr>
+              <a:graphicFrameLocks xmlns:a="http://schemas.openxmlformats.org/drawingml/2006/main" noChangeAspect="1"/>
+            </wp:cNvGraphicFramePr>
+            <a:graphic xmlns:a="http://schemas.openxmlformats.org/drawingml/2006/main">
+              <a:graphicData uri="http://schemas.openxmlformats.org/drawingml/2006/picture">
+                <pic:pic xmlns:pic="http://schemas.openxmlformats.org/drawingml/2006/picture">
+                  <pic:nvPicPr>
+                    <pic:cNvPr id="0" name="Picture 39"/>
+                    <pic:cNvPicPr>
+                      <a:picLocks noChangeAspect="1" noChangeArrowheads="1"/>
+                    </pic:cNvPicPr>
+                  </pic:nvPicPr>
+                  <pic:blipFill>
+                    <a:blip r:embed="rId22" cstate="print">
+                      <a:extLst>
+                        <a:ext uri="{28A0092B-C50C-407E-A947-70E740481C1C}">
+                          <a14:useLocalDpi xmlns:a14="http://schemas.microsoft.com/office/drawing/2010/main" val="0"/>
+                        </a:ext>
+                      </a:extLst>
+                    </a:blip>
+                    <a:srcRect/>
+                    <a:stretch>
+                      <a:fillRect/>
+                    </a:stretch>
+                  </pic:blipFill>
+                  <pic:spPr bwMode="auto">
+                    <a:xfrm>
+                      <a:off x="0" y="0"/>
+                      <a:ext cx="5725160" cy="2989580"/>
+                    </a:xfrm>
+                    <a:prstGeom prst="rect">
+                      <a:avLst/>
+                    </a:prstGeom>
+                    <a:noFill/>
+                    <a:ln>
+                      <a:noFill/>
+                    </a:ln>
+                  </pic:spPr>
+                </pic:pic>
+              </a:graphicData>
+            </a:graphic>
+          </wp:inline>
+        </w:drawing>
+      </w:r>
+    </w:p>
+    <w:p/>
+    <w:p>
+      <w:pPr>
+        <w:rPr>
+          <w:sz w:val="20"/>
+          <w:szCs w:val="20"/>
+          <w:lang w:val="pl-PL"/>
+        </w:rPr>
+      </w:pPr>
+      <w:proofErr w:type="spellStart"/>
+      <w:r>
+        <w:rPr>
+          <w:b/>
+          <w:bCs/>
+          <w:sz w:val="20"/>
+          <w:szCs w:val="20"/>
+          <w:lang w:val="pl-PL"/>
+        </w:rPr>
+        <w:t>BazaStrzelnicy</w:t>
+      </w:r>
+      <w:proofErr w:type="spellEnd"/>
+      <w:r>
+        <w:rPr>
+          <w:sz w:val="20"/>
+          <w:szCs w:val="20"/>
+          <w:lang w:val="pl-PL"/>
+        </w:rPr>
+        <w:t xml:space="preserve"> - p</w:t>
+      </w:r>
+      <w:r>
+        <w:rPr>
+          <w:sz w:val="20"/>
+          <w:szCs w:val="20"/>
+          <w:lang w:val="pl-PL"/>
+        </w:rPr>
+        <w:t>rzechowuje dane systemu (SQL Server)</w:t>
+      </w:r>
+      <w:r>
+        <w:rPr>
+          <w:sz w:val="20"/>
+          <w:szCs w:val="20"/>
+          <w:lang w:val="pl-PL"/>
+        </w:rPr>
+        <w:t>.</w:t>
+      </w:r>
+    </w:p>
+    <w:p>
+      <w:pPr>
+        <w:rPr>
+          <w:sz w:val="20"/>
+          <w:szCs w:val="20"/>
+          <w:lang w:val="pl-PL"/>
+        </w:rPr>
+      </w:pPr>
+      <w:proofErr w:type="spellStart"/>
+      <w:r>
+        <w:rPr>
+          <w:b/>
+          <w:bCs/>
+          <w:sz w:val="20"/>
+          <w:szCs w:val="20"/>
+          <w:lang w:val="pl-PL"/>
+        </w:rPr>
+        <w:t>IOdczyt</w:t>
+      </w:r>
+      <w:proofErr w:type="spellEnd"/>
+      <w:r>
+        <w:rPr>
+          <w:b/>
+          <w:bCs/>
+          <w:sz w:val="20"/>
+          <w:szCs w:val="20"/>
+          <w:lang w:val="pl-PL"/>
+        </w:rPr>
+        <w:t xml:space="preserve"> / </w:t>
+      </w:r>
+      <w:proofErr w:type="spellStart"/>
+      <w:r>
+        <w:rPr>
+          <w:b/>
+          <w:bCs/>
+          <w:sz w:val="20"/>
+          <w:szCs w:val="20"/>
+          <w:lang w:val="pl-PL"/>
+        </w:rPr>
+        <w:t>IZapis</w:t>
+      </w:r>
+      <w:proofErr w:type="spellEnd"/>
+      <w:r>
+        <w:rPr>
+          <w:sz w:val="20"/>
+          <w:szCs w:val="20"/>
+          <w:lang w:val="pl-PL"/>
+        </w:rPr>
+        <w:t xml:space="preserve"> - d</w:t>
+      </w:r>
+      <w:r>
+        <w:rPr>
+          <w:sz w:val="20"/>
+          <w:szCs w:val="20"/>
+          <w:lang w:val="pl-PL"/>
+        </w:rPr>
+        <w:t>ostęp do danych</w:t>
+      </w:r>
+      <w:r>
+        <w:rPr>
+          <w:sz w:val="20"/>
+          <w:szCs w:val="20"/>
+          <w:lang w:val="pl-PL"/>
+        </w:rPr>
+        <w:t>.</w:t>
+      </w:r>
+    </w:p>
+    <w:p>
+      <w:pPr>
+        <w:rPr>
+          <w:sz w:val="20"/>
+          <w:szCs w:val="20"/>
+          <w:lang w:val="pl-PL"/>
+        </w:rPr>
+      </w:pPr>
+      <w:proofErr w:type="spellStart"/>
+      <w:r>
+        <w:rPr>
+          <w:b/>
+          <w:bCs/>
+          <w:sz w:val="20"/>
+          <w:szCs w:val="20"/>
+          <w:lang w:val="pl-PL"/>
+        </w:rPr>
+        <w:t>IUzytkownik</w:t>
+      </w:r>
+      <w:proofErr w:type="spellEnd"/>
+      <w:r>
+        <w:rPr>
+          <w:sz w:val="20"/>
+          <w:szCs w:val="20"/>
+          <w:lang w:val="pl-PL"/>
+        </w:rPr>
+        <w:t xml:space="preserve"> - rezerwacje klienta.</w:t>
+      </w:r>
+    </w:p>
+    <w:p>
+      <w:pPr>
+        <w:rPr>
+          <w:sz w:val="20"/>
+          <w:szCs w:val="20"/>
+          <w:lang w:val="pl-PL"/>
+        </w:rPr>
+      </w:pPr>
+      <w:proofErr w:type="spellStart"/>
+      <w:r>
+        <w:rPr>
+          <w:b/>
+          <w:bCs/>
+          <w:sz w:val="20"/>
+          <w:szCs w:val="20"/>
+          <w:lang w:val="pl-PL"/>
+        </w:rPr>
+        <w:t>IInstruktor</w:t>
+      </w:r>
+      <w:proofErr w:type="spellEnd"/>
+      <w:r>
+        <w:rPr>
+          <w:sz w:val="20"/>
+          <w:szCs w:val="20"/>
+          <w:lang w:val="pl-PL"/>
+        </w:rPr>
+        <w:t xml:space="preserve"> – Obsługa wizyt, weryfikacja, </w:t>
+      </w:r>
+      <w:proofErr w:type="spellStart"/>
+      <w:r>
+        <w:rPr>
+          <w:sz w:val="20"/>
+          <w:szCs w:val="20"/>
+          <w:lang w:val="pl-PL"/>
+        </w:rPr>
+        <w:t>check</w:t>
+      </w:r>
+      <w:proofErr w:type="spellEnd"/>
+      <w:r>
+        <w:rPr>
+          <w:sz w:val="20"/>
+          <w:szCs w:val="20"/>
+          <w:lang w:val="pl-PL"/>
+        </w:rPr>
+        <w:t>-in.</w:t>
+      </w:r>
+    </w:p>
+    <w:p/>
+    <w:p/>
+    <w:p/>
     <w:sectPr>
       <w:pgSz w:w="11909" w:h="16834"/>
       <w:pgMar w:top="1440" w:right="1440" w:bottom="1440" w:left="1440" w:header="720" w:footer="720" w:gutter="0"/>
@@ -6945,6 +10729,119 @@
     </w:lvl>
   </w:abstractNum>
   <w:abstractNum w:abstractNumId="20" w15:restartNumberingAfterBreak="0">
+    <w:nsid w:val="569671F2"/>
+    <w:multiLevelType w:val="hybridMultilevel"/>
+    <w:tmpl w:val="5934BD68"/>
+    <w:lvl w:ilvl="0" w:tplc="04150001">
+      <w:start w:val="1"/>
+      <w:numFmt w:val="bullet"/>
+      <w:lvlText w:val=""/>
+      <w:lvlJc w:val="left"/>
+      <w:pPr>
+        <w:ind w:left="720" w:hanging="360"/>
+      </w:pPr>
+      <w:rPr>
+        <w:rFonts w:ascii="Symbol" w:hAnsi="Symbol" w:hint="default"/>
+      </w:rPr>
+    </w:lvl>
+    <w:lvl w:ilvl="1" w:tplc="04150003" w:tentative="1">
+      <w:start w:val="1"/>
+      <w:numFmt w:val="bullet"/>
+      <w:lvlText w:val="o"/>
+      <w:lvlJc w:val="left"/>
+      <w:pPr>
+        <w:ind w:left="1440" w:hanging="360"/>
+      </w:pPr>
+      <w:rPr>
+        <w:rFonts w:ascii="Courier New" w:hAnsi="Courier New" w:cs="Courier New" w:hint="default"/>
+      </w:rPr>
+    </w:lvl>
+    <w:lvl w:ilvl="2" w:tplc="04150005" w:tentative="1">
+      <w:start w:val="1"/>
+      <w:numFmt w:val="bullet"/>
+      <w:lvlText w:val=""/>
+      <w:lvlJc w:val="left"/>
+      <w:pPr>
+        <w:ind w:left="2160" w:hanging="360"/>
+      </w:pPr>
+      <w:rPr>
+        <w:rFonts w:ascii="Wingdings" w:hAnsi="Wingdings" w:hint="default"/>
+      </w:rPr>
+    </w:lvl>
+    <w:lvl w:ilvl="3" w:tplc="04150001" w:tentative="1">
+      <w:start w:val="1"/>
+      <w:numFmt w:val="bullet"/>
+      <w:lvlText w:val=""/>
+      <w:lvlJc w:val="left"/>
+      <w:pPr>
+        <w:ind w:left="2880" w:hanging="360"/>
+      </w:pPr>
+      <w:rPr>
+        <w:rFonts w:ascii="Symbol" w:hAnsi="Symbol" w:hint="default"/>
+      </w:rPr>
+    </w:lvl>
+    <w:lvl w:ilvl="4" w:tplc="04150003" w:tentative="1">
+      <w:start w:val="1"/>
+      <w:numFmt w:val="bullet"/>
+      <w:lvlText w:val="o"/>
+      <w:lvlJc w:val="left"/>
+      <w:pPr>
+        <w:ind w:left="3600" w:hanging="360"/>
+      </w:pPr>
+      <w:rPr>
+        <w:rFonts w:ascii="Courier New" w:hAnsi="Courier New" w:cs="Courier New" w:hint="default"/>
+      </w:rPr>
+    </w:lvl>
+    <w:lvl w:ilvl="5" w:tplc="04150005" w:tentative="1">
+      <w:start w:val="1"/>
+      <w:numFmt w:val="bullet"/>
+      <w:lvlText w:val=""/>
+      <w:lvlJc w:val="left"/>
+      <w:pPr>
+        <w:ind w:left="4320" w:hanging="360"/>
+      </w:pPr>
+      <w:rPr>
+        <w:rFonts w:ascii="Wingdings" w:hAnsi="Wingdings" w:hint="default"/>
+      </w:rPr>
+    </w:lvl>
+    <w:lvl w:ilvl="6" w:tplc="04150001" w:tentative="1">
+      <w:start w:val="1"/>
+      <w:numFmt w:val="bullet"/>
+      <w:lvlText w:val=""/>
+      <w:lvlJc w:val="left"/>
+      <w:pPr>
+        <w:ind w:left="5040" w:hanging="360"/>
+      </w:pPr>
+      <w:rPr>
+        <w:rFonts w:ascii="Symbol" w:hAnsi="Symbol" w:hint="default"/>
+      </w:rPr>
+    </w:lvl>
+    <w:lvl w:ilvl="7" w:tplc="04150003" w:tentative="1">
+      <w:start w:val="1"/>
+      <w:numFmt w:val="bullet"/>
+      <w:lvlText w:val="o"/>
+      <w:lvlJc w:val="left"/>
+      <w:pPr>
+        <w:ind w:left="5760" w:hanging="360"/>
+      </w:pPr>
+      <w:rPr>
+        <w:rFonts w:ascii="Courier New" w:hAnsi="Courier New" w:cs="Courier New" w:hint="default"/>
+      </w:rPr>
+    </w:lvl>
+    <w:lvl w:ilvl="8" w:tplc="04150005" w:tentative="1">
+      <w:start w:val="1"/>
+      <w:numFmt w:val="bullet"/>
+      <w:lvlText w:val=""/>
+      <w:lvlJc w:val="left"/>
+      <w:pPr>
+        <w:ind w:left="6480" w:hanging="360"/>
+      </w:pPr>
+      <w:rPr>
+        <w:rFonts w:ascii="Wingdings" w:hAnsi="Wingdings" w:hint="default"/>
+      </w:rPr>
+    </w:lvl>
+  </w:abstractNum>
+  <w:abstractNum w:abstractNumId="21" w15:restartNumberingAfterBreak="0">
     <w:nsid w:val="5E332311"/>
     <w:multiLevelType w:val="multilevel"/>
     <w:tmpl w:val="FD56597C"/>
@@ -7093,7 +10990,7 @@
       </w:rPr>
     </w:lvl>
   </w:abstractNum>
-  <w:abstractNum w:abstractNumId="21" w15:restartNumberingAfterBreak="0">
+  <w:abstractNum w:abstractNumId="22" w15:restartNumberingAfterBreak="0">
     <w:nsid w:val="64A67214"/>
     <w:multiLevelType w:val="multilevel"/>
     <w:tmpl w:val="5832EF0A"/>
@@ -7242,7 +11139,7 @@
       </w:rPr>
     </w:lvl>
   </w:abstractNum>
-  <w:abstractNum w:abstractNumId="22" w15:restartNumberingAfterBreak="0">
+  <w:abstractNum w:abstractNumId="23" w15:restartNumberingAfterBreak="0">
     <w:nsid w:val="66C25ECD"/>
     <w:multiLevelType w:val="multilevel"/>
     <w:tmpl w:val="64B00C14"/>
@@ -7391,7 +11288,7 @@
       </w:rPr>
     </w:lvl>
   </w:abstractNum>
-  <w:abstractNum w:abstractNumId="23" w15:restartNumberingAfterBreak="0">
+  <w:abstractNum w:abstractNumId="24" w15:restartNumberingAfterBreak="0">
     <w:nsid w:val="6753371C"/>
     <w:multiLevelType w:val="multilevel"/>
     <w:tmpl w:val="DFB22E06"/>
@@ -7540,7 +11437,7 @@
       </w:rPr>
     </w:lvl>
   </w:abstractNum>
-  <w:abstractNum w:abstractNumId="24" w15:restartNumberingAfterBreak="0">
+  <w:abstractNum w:abstractNumId="25" w15:restartNumberingAfterBreak="0">
     <w:nsid w:val="68780586"/>
     <w:multiLevelType w:val="multilevel"/>
     <w:tmpl w:val="0D98D3BC"/>
@@ -7689,7 +11586,7 @@
       </w:rPr>
     </w:lvl>
   </w:abstractNum>
-  <w:abstractNum w:abstractNumId="25" w15:restartNumberingAfterBreak="0">
+  <w:abstractNum w:abstractNumId="26" w15:restartNumberingAfterBreak="0">
     <w:nsid w:val="705C59C3"/>
     <w:multiLevelType w:val="multilevel"/>
     <w:tmpl w:val="A17CC40E"/>
@@ -7802,7 +11699,7 @@
       </w:rPr>
     </w:lvl>
   </w:abstractNum>
-  <w:abstractNum w:abstractNumId="26" w15:restartNumberingAfterBreak="0">
+  <w:abstractNum w:abstractNumId="27" w15:restartNumberingAfterBreak="0">
     <w:nsid w:val="7B83239D"/>
     <w:multiLevelType w:val="multilevel"/>
     <w:tmpl w:val="F7CE4D54"/>
@@ -7951,7 +11848,7 @@
       </w:rPr>
     </w:lvl>
   </w:abstractNum>
-  <w:abstractNum w:abstractNumId="27" w15:restartNumberingAfterBreak="0">
+  <w:abstractNum w:abstractNumId="28" w15:restartNumberingAfterBreak="0">
     <w:nsid w:val="7CAD52F7"/>
     <w:multiLevelType w:val="multilevel"/>
     <w:tmpl w:val="4844C838"/>
@@ -8068,10 +11965,10 @@
     <w:abstractNumId w:val="0"/>
   </w:num>
   <w:num w:numId="2" w16cid:durableId="1095515092">
-    <w:abstractNumId w:val="27"/>
+    <w:abstractNumId w:val="28"/>
   </w:num>
   <w:num w:numId="3" w16cid:durableId="1685980699">
-    <w:abstractNumId w:val="25"/>
+    <w:abstractNumId w:val="26"/>
   </w:num>
   <w:num w:numId="4" w16cid:durableId="1642424421">
     <w:abstractNumId w:val="13"/>
@@ -8092,7 +11989,7 @@
     <w:abstractNumId w:val="4"/>
   </w:num>
   <w:num w:numId="10" w16cid:durableId="1976793676">
-    <w:abstractNumId w:val="26"/>
+    <w:abstractNumId w:val="27"/>
   </w:num>
   <w:num w:numId="11" w16cid:durableId="1560284771">
     <w:abstractNumId w:val="9"/>
@@ -8107,7 +12004,7 @@
     <w:abstractNumId w:val="6"/>
   </w:num>
   <w:num w:numId="15" w16cid:durableId="1081415116">
-    <w:abstractNumId w:val="20"/>
+    <w:abstractNumId w:val="21"/>
   </w:num>
   <w:num w:numId="16" w16cid:durableId="914120843">
     <w:abstractNumId w:val="11"/>
@@ -8125,7 +12022,7 @@
     <w:abstractNumId w:val="17"/>
   </w:num>
   <w:num w:numId="21" w16cid:durableId="1999379974">
-    <w:abstractNumId w:val="23"/>
+    <w:abstractNumId w:val="24"/>
   </w:num>
   <w:num w:numId="22" w16cid:durableId="411659035">
     <w:abstractNumId w:val="8"/>
@@ -8137,16 +12034,19 @@
     <w:abstractNumId w:val="3"/>
   </w:num>
   <w:num w:numId="25" w16cid:durableId="1031496963">
-    <w:abstractNumId w:val="24"/>
+    <w:abstractNumId w:val="25"/>
   </w:num>
   <w:num w:numId="26" w16cid:durableId="1714421965">
-    <w:abstractNumId w:val="22"/>
+    <w:abstractNumId w:val="23"/>
   </w:num>
   <w:num w:numId="27" w16cid:durableId="1757942047">
-    <w:abstractNumId w:val="21"/>
+    <w:abstractNumId w:val="22"/>
   </w:num>
   <w:num w:numId="28" w16cid:durableId="1758751858">
     <w:abstractNumId w:val="2"/>
+  </w:num>
+  <w:num w:numId="29" w16cid:durableId="783353911">
+    <w:abstractNumId w:val="20"/>
   </w:num>
 </w:numbering>
 </file>
@@ -8549,6 +12449,7 @@
   <w:style w:type="paragraph" w:default="1" w:styleId="Normalny">
     <w:name w:val="Normal"/>
     <w:qFormat/>
+    <w:rsid w:val="00706768"/>
   </w:style>
   <w:style w:type="paragraph" w:styleId="Nagwek1">
     <w:name w:val="heading 1"/>
@@ -8609,7 +12510,6 @@
     <w:basedOn w:val="Normalny"/>
     <w:next w:val="Normalny"/>
     <w:uiPriority w:val="9"/>
-    <w:semiHidden/>
     <w:unhideWhenUsed/>
     <w:qFormat/>
     <w:pPr>
@@ -8665,7 +12565,6 @@
   <w:style w:type="character" w:default="1" w:styleId="Domylnaczcionkaakapitu">
     <w:name w:val="Default Paragraph Font"/>
     <w:uiPriority w:val="1"/>
-    <w:semiHidden/>
     <w:unhideWhenUsed/>
   </w:style>
   <w:style w:type="table" w:default="1" w:styleId="Standardowy">
@@ -8780,6 +12679,45 @@
     <w:name w:val="math-inline"/>
     <w:basedOn w:val="Domylnaczcionkaakapitu"/>
     <w:rsid w:val="00795694"/>
+  </w:style>
+  <w:style w:type="paragraph" w:styleId="Akapitzlist">
+    <w:name w:val="List Paragraph"/>
+    <w:basedOn w:val="Normalny"/>
+    <w:uiPriority w:val="34"/>
+    <w:qFormat/>
+    <w:rsid w:val="004662E7"/>
+    <w:pPr>
+      <w:ind w:left="720"/>
+      <w:contextualSpacing/>
+    </w:pPr>
+  </w:style>
+  <w:style w:type="character" w:styleId="Hipercze">
+    <w:name w:val="Hyperlink"/>
+    <w:basedOn w:val="Domylnaczcionkaakapitu"/>
+    <w:uiPriority w:val="99"/>
+    <w:unhideWhenUsed/>
+    <w:rsid w:val="004662E7"/>
+    <w:rPr>
+      <w:color w:val="0000FF" w:themeColor="hyperlink"/>
+      <w:u w:val="single"/>
+    </w:rPr>
+  </w:style>
+  <w:style w:type="character" w:styleId="Nierozpoznanawzmianka">
+    <w:name w:val="Unresolved Mention"/>
+    <w:basedOn w:val="Domylnaczcionkaakapitu"/>
+    <w:uiPriority w:val="99"/>
+    <w:semiHidden/>
+    <w:unhideWhenUsed/>
+    <w:rsid w:val="004662E7"/>
+    <w:rPr>
+      <w:color w:val="605E5C"/>
+      <w:shd w:val="clear" w:color="auto" w:fill="E1DFDD"/>
+    </w:rPr>
+  </w:style>
+  <w:style w:type="character" w:customStyle="1" w:styleId="font-semibold">
+    <w:name w:val="font-semibold"/>
+    <w:basedOn w:val="Domylnaczcionkaakapitu"/>
+    <w:rsid w:val="00BD5004"/>
   </w:style>
 </w:styles>
 </file>

</xml_diff>

<commit_message>
analiza ryzyka i diagram gantta
</commit_message>
<xml_diff>
--- a/Downloads/ProjektIO/Projekt IO.docx
+++ b/Downloads/ProjektIO/Projekt IO.docx
@@ -3523,6 +3523,7 @@
       </w:pPr>
       <w:r>
         <w:rPr>
+          <w:noProof/>
           <w:lang w:val="pl-PL"/>
         </w:rPr>
         <w:drawing>
@@ -6847,7 +6848,7 @@
     </w:p>
     <w:p>
       <w:pPr>
-        <w:pStyle w:val="Nagwek3"/>
+        <w:pStyle w:val="Nagwek2"/>
       </w:pPr>
       <w:r>
         <w:lastRenderedPageBreak/>
@@ -6856,7 +6857,7 @@
     </w:p>
     <w:p>
       <w:pPr>
-        <w:pStyle w:val="Nagwek4"/>
+        <w:pStyle w:val="Nagwek3"/>
       </w:pPr>
       <w:r>
         <w:t>7.1</w:t>
@@ -7219,7 +7220,7 @@
     <w:p/>
     <w:p>
       <w:pPr>
-        <w:pStyle w:val="Nagwek4"/>
+        <w:pStyle w:val="Nagwek3"/>
       </w:pPr>
       <w:r>
         <w:t>7.2. Opis infrastruktury</w:t>
@@ -7518,14 +7519,7 @@
     </w:p>
     <w:p>
       <w:pPr>
-        <w:rPr>
-          <w:lang w:val="pl-PL"/>
-        </w:rPr>
-      </w:pPr>
-    </w:p>
-    <w:p>
-      <w:pPr>
-        <w:pStyle w:val="Nagwek4"/>
+        <w:pStyle w:val="Nagwek3"/>
         <w:rPr>
           <w:lang w:val="pl-PL"/>
         </w:rPr>
@@ -7592,7 +7586,6 @@
         </w:drawing>
       </w:r>
     </w:p>
-    <w:p/>
     <w:p>
       <w:pPr>
         <w:rPr>
@@ -7781,8 +7774,2369 @@
         <w:t>-in.</w:t>
       </w:r>
     </w:p>
+    <w:p>
+      <w:pPr>
+        <w:pStyle w:val="Nagwek3"/>
+      </w:pPr>
+      <w:r>
+        <w:lastRenderedPageBreak/>
+        <w:t xml:space="preserve">8. Propozycja </w:t>
+      </w:r>
+      <w:r>
+        <w:t>planu</w:t>
+      </w:r>
+      <w:r>
+        <w:t xml:space="preserve"> pracy</w:t>
+      </w:r>
+    </w:p>
+    <w:p>
+      <w:r>
+        <w:t>Plan pracy obejmuje 6 etapów realizacji systemu zarządzania strzelnicą w okresie </w:t>
+      </w:r>
+      <w:r>
+        <w:rPr>
+          <w:b/>
+          <w:bCs/>
+        </w:rPr>
+        <w:t>15.06.2026–20.09.2026</w:t>
+      </w:r>
+      <w:r>
+        <w:t xml:space="preserve"> (14 tygodni). Harmonogram przedstawiono w formie diagramu Gantta, w którym jedna kolumna odpowiada jednemu tygodniowi. </w:t>
+      </w:r>
+    </w:p>
+    <w:p/>
+    <w:p>
+      <w:r>
+        <w:drawing>
+          <wp:inline distT="0" distB="0" distL="0" distR="0" wp14:anchorId="4FA8950A" wp14:editId="440FAD75">
+            <wp:extent cx="5733415" cy="4370705"/>
+            <wp:effectExtent l="0" t="0" r="635" b="0"/>
+            <wp:docPr id="560077463" name="Obraz 1"/>
+            <wp:cNvGraphicFramePr>
+              <a:graphicFrameLocks xmlns:a="http://schemas.openxmlformats.org/drawingml/2006/main" noChangeAspect="1"/>
+            </wp:cNvGraphicFramePr>
+            <a:graphic xmlns:a="http://schemas.openxmlformats.org/drawingml/2006/main">
+              <a:graphicData uri="http://schemas.openxmlformats.org/drawingml/2006/picture">
+                <pic:pic xmlns:pic="http://schemas.openxmlformats.org/drawingml/2006/picture">
+                  <pic:nvPicPr>
+                    <pic:cNvPr id="560077463" name=""/>
+                    <pic:cNvPicPr/>
+                  </pic:nvPicPr>
+                  <pic:blipFill>
+                    <a:blip r:embed="rId23"/>
+                    <a:stretch>
+                      <a:fillRect/>
+                    </a:stretch>
+                  </pic:blipFill>
+                  <pic:spPr>
+                    <a:xfrm>
+                      <a:off x="0" y="0"/>
+                      <a:ext cx="5733415" cy="4370705"/>
+                    </a:xfrm>
+                    <a:prstGeom prst="rect">
+                      <a:avLst/>
+                    </a:prstGeom>
+                  </pic:spPr>
+                </pic:pic>
+              </a:graphicData>
+            </a:graphic>
+          </wp:inline>
+        </w:drawing>
+      </w:r>
+    </w:p>
+    <w:p/>
+    <w:p>
+      <w:pPr>
+        <w:rPr>
+          <w:b/>
+          <w:bCs/>
+        </w:rPr>
+      </w:pPr>
+      <w:r>
+        <w:rPr>
+          <w:b/>
+          <w:bCs/>
+        </w:rPr>
+        <w:t>Skład zespołu</w:t>
+      </w:r>
+    </w:p>
+    <w:tbl>
+      <w:tblPr>
+        <w:tblW w:w="0" w:type="auto"/>
+        <w:tblBorders>
+          <w:top w:val="single" w:sz="4" w:space="0" w:color="auto"/>
+          <w:left w:val="single" w:sz="4" w:space="0" w:color="auto"/>
+          <w:bottom w:val="single" w:sz="4" w:space="0" w:color="auto"/>
+          <w:right w:val="single" w:sz="4" w:space="0" w:color="auto"/>
+          <w:insideH w:val="single" w:sz="4" w:space="0" w:color="auto"/>
+          <w:insideV w:val="single" w:sz="4" w:space="0" w:color="auto"/>
+        </w:tblBorders>
+        <w:shd w:val="clear" w:color="auto" w:fill="FFFFFF" w:themeFill="background1"/>
+        <w:tblCellMar>
+          <w:top w:w="15" w:type="dxa"/>
+          <w:left w:w="15" w:type="dxa"/>
+          <w:bottom w:w="15" w:type="dxa"/>
+          <w:right w:w="15" w:type="dxa"/>
+        </w:tblCellMar>
+        <w:tblLook w:val="04A0" w:firstRow="1" w:lastRow="0" w:firstColumn="1" w:lastColumn="0" w:noHBand="0" w:noVBand="1"/>
+      </w:tblPr>
+      <w:tblGrid>
+        <w:gridCol w:w="2309"/>
+        <w:gridCol w:w="6710"/>
+      </w:tblGrid>
+      <w:tr>
+        <w:trPr>
+          <w:tblHeader/>
+        </w:trPr>
+        <w:tc>
+          <w:tcPr>
+            <w:tcW w:w="0" w:type="auto"/>
+            <w:shd w:val="clear" w:color="auto" w:fill="FFFFFF" w:themeFill="background1"/>
+            <w:noWrap/>
+            <w:tcMar>
+              <w:top w:w="75" w:type="dxa"/>
+              <w:left w:w="135" w:type="dxa"/>
+              <w:bottom w:w="75" w:type="dxa"/>
+              <w:right w:w="135" w:type="dxa"/>
+            </w:tcMar>
+            <w:hideMark/>
+          </w:tcPr>
+          <w:p>
+            <w:pPr>
+              <w:rPr>
+                <w:b/>
+                <w:bCs/>
+                <w:lang w:val="pl-PL"/>
+              </w:rPr>
+            </w:pPr>
+            <w:r>
+              <w:rPr>
+                <w:b/>
+                <w:bCs/>
+                <w:lang w:val="pl-PL"/>
+              </w:rPr>
+              <w:t>Rola</w:t>
+            </w:r>
+          </w:p>
+        </w:tc>
+        <w:tc>
+          <w:tcPr>
+            <w:tcW w:w="0" w:type="auto"/>
+            <w:shd w:val="clear" w:color="auto" w:fill="FFFFFF" w:themeFill="background1"/>
+            <w:noWrap/>
+            <w:tcMar>
+              <w:top w:w="75" w:type="dxa"/>
+              <w:left w:w="135" w:type="dxa"/>
+              <w:bottom w:w="75" w:type="dxa"/>
+              <w:right w:w="135" w:type="dxa"/>
+            </w:tcMar>
+            <w:hideMark/>
+          </w:tcPr>
+          <w:p>
+            <w:pPr>
+              <w:rPr>
+                <w:b/>
+                <w:bCs/>
+                <w:lang w:val="pl-PL"/>
+              </w:rPr>
+            </w:pPr>
+            <w:r>
+              <w:rPr>
+                <w:b/>
+                <w:bCs/>
+                <w:lang w:val="pl-PL"/>
+              </w:rPr>
+              <w:t>Główne zadania</w:t>
+            </w:r>
+          </w:p>
+        </w:tc>
+      </w:tr>
+      <w:tr>
+        <w:tc>
+          <w:tcPr>
+            <w:tcW w:w="0" w:type="auto"/>
+            <w:shd w:val="clear" w:color="auto" w:fill="FFFFFF" w:themeFill="background1"/>
+            <w:tcMar>
+              <w:top w:w="75" w:type="dxa"/>
+              <w:left w:w="135" w:type="dxa"/>
+              <w:bottom w:w="75" w:type="dxa"/>
+              <w:right w:w="135" w:type="dxa"/>
+            </w:tcMar>
+            <w:hideMark/>
+          </w:tcPr>
+          <w:p>
+            <w:pPr>
+              <w:rPr>
+                <w:lang w:val="pl-PL"/>
+              </w:rPr>
+            </w:pPr>
+            <w:r>
+              <w:rPr>
+                <w:lang w:val="pl-PL"/>
+              </w:rPr>
+              <w:t>Analityk / koordynator</w:t>
+            </w:r>
+          </w:p>
+        </w:tc>
+        <w:tc>
+          <w:tcPr>
+            <w:tcW w:w="0" w:type="auto"/>
+            <w:shd w:val="clear" w:color="auto" w:fill="FFFFFF" w:themeFill="background1"/>
+            <w:tcMar>
+              <w:top w:w="75" w:type="dxa"/>
+              <w:left w:w="135" w:type="dxa"/>
+              <w:bottom w:w="75" w:type="dxa"/>
+              <w:right w:w="135" w:type="dxa"/>
+            </w:tcMar>
+            <w:hideMark/>
+          </w:tcPr>
+          <w:p>
+            <w:pPr>
+              <w:rPr>
+                <w:lang w:val="pl-PL"/>
+              </w:rPr>
+            </w:pPr>
+            <w:r>
+              <w:rPr>
+                <w:lang w:val="pl-PL"/>
+              </w:rPr>
+              <w:t>UML, wymagania, ryzyko, testy akceptacyjne, dokumentacja, szkolenie</w:t>
+            </w:r>
+          </w:p>
+        </w:tc>
+      </w:tr>
+      <w:tr>
+        <w:tc>
+          <w:tcPr>
+            <w:tcW w:w="0" w:type="auto"/>
+            <w:shd w:val="clear" w:color="auto" w:fill="FFFFFF" w:themeFill="background1"/>
+            <w:tcMar>
+              <w:top w:w="75" w:type="dxa"/>
+              <w:left w:w="135" w:type="dxa"/>
+              <w:bottom w:w="75" w:type="dxa"/>
+              <w:right w:w="135" w:type="dxa"/>
+            </w:tcMar>
+            <w:hideMark/>
+          </w:tcPr>
+          <w:p>
+            <w:pPr>
+              <w:rPr>
+                <w:lang w:val="pl-PL"/>
+              </w:rPr>
+            </w:pPr>
+            <w:r>
+              <w:rPr>
+                <w:lang w:val="pl-PL"/>
+              </w:rPr>
+              <w:t xml:space="preserve">Programista </w:t>
+            </w:r>
+            <w:proofErr w:type="spellStart"/>
+            <w:r>
+              <w:rPr>
+                <w:lang w:val="pl-PL"/>
+              </w:rPr>
+              <w:t>backend</w:t>
+            </w:r>
+            <w:proofErr w:type="spellEnd"/>
+          </w:p>
+        </w:tc>
+        <w:tc>
+          <w:tcPr>
+            <w:tcW w:w="0" w:type="auto"/>
+            <w:shd w:val="clear" w:color="auto" w:fill="FFFFFF" w:themeFill="background1"/>
+            <w:tcMar>
+              <w:top w:w="75" w:type="dxa"/>
+              <w:left w:w="135" w:type="dxa"/>
+              <w:bottom w:w="75" w:type="dxa"/>
+              <w:right w:w="135" w:type="dxa"/>
+            </w:tcMar>
+            <w:hideMark/>
+          </w:tcPr>
+          <w:p>
+            <w:pPr>
+              <w:rPr>
+                <w:lang w:val="pl-PL"/>
+              </w:rPr>
+            </w:pPr>
+            <w:r>
+              <w:rPr>
+                <w:lang w:val="pl-PL"/>
+              </w:rPr>
+              <w:t xml:space="preserve">ASP.NET </w:t>
+            </w:r>
+            <w:proofErr w:type="spellStart"/>
+            <w:r>
+              <w:rPr>
+                <w:lang w:val="pl-PL"/>
+              </w:rPr>
+              <w:t>Core</w:t>
+            </w:r>
+            <w:proofErr w:type="spellEnd"/>
+            <w:r>
+              <w:rPr>
+                <w:lang w:val="pl-PL"/>
+              </w:rPr>
+              <w:t>, baza danych, moduły domenowe, testy jednostkowe</w:t>
+            </w:r>
+          </w:p>
+        </w:tc>
+      </w:tr>
+      <w:tr>
+        <w:tc>
+          <w:tcPr>
+            <w:tcW w:w="0" w:type="auto"/>
+            <w:shd w:val="clear" w:color="auto" w:fill="FFFFFF" w:themeFill="background1"/>
+            <w:tcMar>
+              <w:top w:w="75" w:type="dxa"/>
+              <w:left w:w="135" w:type="dxa"/>
+              <w:bottom w:w="75" w:type="dxa"/>
+              <w:right w:w="135" w:type="dxa"/>
+            </w:tcMar>
+            <w:hideMark/>
+          </w:tcPr>
+          <w:p>
+            <w:pPr>
+              <w:rPr>
+                <w:lang w:val="pl-PL"/>
+              </w:rPr>
+            </w:pPr>
+            <w:r>
+              <w:rPr>
+                <w:lang w:val="pl-PL"/>
+              </w:rPr>
+              <w:t xml:space="preserve">Programista </w:t>
+            </w:r>
+            <w:proofErr w:type="spellStart"/>
+            <w:r>
+              <w:rPr>
+                <w:lang w:val="pl-PL"/>
+              </w:rPr>
+              <w:t>frontend</w:t>
+            </w:r>
+            <w:proofErr w:type="spellEnd"/>
+          </w:p>
+        </w:tc>
+        <w:tc>
+          <w:tcPr>
+            <w:tcW w:w="0" w:type="auto"/>
+            <w:shd w:val="clear" w:color="auto" w:fill="FFFFFF" w:themeFill="background1"/>
+            <w:tcMar>
+              <w:top w:w="75" w:type="dxa"/>
+              <w:left w:w="135" w:type="dxa"/>
+              <w:bottom w:w="75" w:type="dxa"/>
+              <w:right w:w="135" w:type="dxa"/>
+            </w:tcMar>
+            <w:hideMark/>
+          </w:tcPr>
+          <w:p>
+            <w:pPr>
+              <w:rPr>
+                <w:lang w:val="pl-PL"/>
+              </w:rPr>
+            </w:pPr>
+            <w:r>
+              <w:rPr>
+                <w:lang w:val="pl-PL"/>
+              </w:rPr>
+              <w:t>Panele klienta i instruktora, dokumentacja</w:t>
+            </w:r>
+          </w:p>
+        </w:tc>
+      </w:tr>
+      <w:tr>
+        <w:tc>
+          <w:tcPr>
+            <w:tcW w:w="0" w:type="auto"/>
+            <w:shd w:val="clear" w:color="auto" w:fill="FFFFFF" w:themeFill="background1"/>
+            <w:tcMar>
+              <w:top w:w="75" w:type="dxa"/>
+              <w:left w:w="135" w:type="dxa"/>
+              <w:bottom w:w="75" w:type="dxa"/>
+              <w:right w:w="135" w:type="dxa"/>
+            </w:tcMar>
+            <w:hideMark/>
+          </w:tcPr>
+          <w:p>
+            <w:pPr>
+              <w:rPr>
+                <w:lang w:val="pl-PL"/>
+              </w:rPr>
+            </w:pPr>
+            <w:r>
+              <w:rPr>
+                <w:lang w:val="pl-PL"/>
+              </w:rPr>
+              <w:t>Tester / administrator</w:t>
+            </w:r>
+          </w:p>
+        </w:tc>
+        <w:tc>
+          <w:tcPr>
+            <w:tcW w:w="0" w:type="auto"/>
+            <w:shd w:val="clear" w:color="auto" w:fill="FFFFFF" w:themeFill="background1"/>
+            <w:tcMar>
+              <w:top w:w="75" w:type="dxa"/>
+              <w:left w:w="135" w:type="dxa"/>
+              <w:bottom w:w="75" w:type="dxa"/>
+              <w:right w:w="135" w:type="dxa"/>
+            </w:tcMar>
+            <w:hideMark/>
+          </w:tcPr>
+          <w:p>
+            <w:pPr>
+              <w:rPr>
+                <w:lang w:val="pl-PL"/>
+              </w:rPr>
+            </w:pPr>
+            <w:r>
+              <w:rPr>
+                <w:lang w:val="pl-PL"/>
+              </w:rPr>
+              <w:t>Konfiguracja serwera, testy integracyjne i bezpieczeństwa, wdrożenie</w:t>
+            </w:r>
+          </w:p>
+        </w:tc>
+      </w:tr>
+    </w:tbl>
     <w:p/>
     <w:p/>
+    <w:p/>
+    <w:p/>
+    <w:p>
+      <w:pPr>
+        <w:rPr>
+          <w:b/>
+          <w:bCs/>
+        </w:rPr>
+      </w:pPr>
+      <w:r>
+        <w:rPr>
+          <w:b/>
+          <w:bCs/>
+        </w:rPr>
+        <w:lastRenderedPageBreak/>
+        <w:t>Etapy pracy</w:t>
+      </w:r>
+    </w:p>
+    <w:p/>
+    <w:tbl>
+      <w:tblPr>
+        <w:tblW w:w="0" w:type="auto"/>
+        <w:tblBorders>
+          <w:top w:val="single" w:sz="4" w:space="0" w:color="auto"/>
+          <w:left w:val="single" w:sz="4" w:space="0" w:color="auto"/>
+          <w:bottom w:val="single" w:sz="4" w:space="0" w:color="auto"/>
+          <w:right w:val="single" w:sz="4" w:space="0" w:color="auto"/>
+          <w:insideH w:val="single" w:sz="4" w:space="0" w:color="auto"/>
+          <w:insideV w:val="single" w:sz="4" w:space="0" w:color="auto"/>
+        </w:tblBorders>
+        <w:shd w:val="clear" w:color="auto" w:fill="FFFFFF" w:themeFill="background1"/>
+        <w:tblCellMar>
+          <w:top w:w="15" w:type="dxa"/>
+          <w:left w:w="15" w:type="dxa"/>
+          <w:bottom w:w="15" w:type="dxa"/>
+          <w:right w:w="15" w:type="dxa"/>
+        </w:tblCellMar>
+        <w:tblLook w:val="04A0" w:firstRow="1" w:lastRow="0" w:firstColumn="1" w:lastColumn="0" w:noHBand="0" w:noVBand="1"/>
+      </w:tblPr>
+      <w:tblGrid>
+        <w:gridCol w:w="600"/>
+        <w:gridCol w:w="1697"/>
+        <w:gridCol w:w="3664"/>
+        <w:gridCol w:w="3058"/>
+      </w:tblGrid>
+      <w:tr>
+        <w:trPr>
+          <w:tblHeader/>
+        </w:trPr>
+        <w:tc>
+          <w:tcPr>
+            <w:tcW w:w="0" w:type="auto"/>
+            <w:shd w:val="clear" w:color="auto" w:fill="FFFFFF" w:themeFill="background1"/>
+            <w:noWrap/>
+            <w:tcMar>
+              <w:top w:w="75" w:type="dxa"/>
+              <w:left w:w="135" w:type="dxa"/>
+              <w:bottom w:w="75" w:type="dxa"/>
+              <w:right w:w="135" w:type="dxa"/>
+            </w:tcMar>
+            <w:hideMark/>
+          </w:tcPr>
+          <w:p>
+            <w:pPr>
+              <w:rPr>
+                <w:b/>
+                <w:bCs/>
+                <w:lang w:val="pl-PL"/>
+              </w:rPr>
+            </w:pPr>
+            <w:r>
+              <w:rPr>
+                <w:b/>
+                <w:bCs/>
+                <w:lang w:val="pl-PL"/>
+              </w:rPr>
+              <w:t>Lp.</w:t>
+            </w:r>
+          </w:p>
+        </w:tc>
+        <w:tc>
+          <w:tcPr>
+            <w:tcW w:w="0" w:type="auto"/>
+            <w:shd w:val="clear" w:color="auto" w:fill="FFFFFF" w:themeFill="background1"/>
+            <w:noWrap/>
+            <w:tcMar>
+              <w:top w:w="75" w:type="dxa"/>
+              <w:left w:w="135" w:type="dxa"/>
+              <w:bottom w:w="75" w:type="dxa"/>
+              <w:right w:w="135" w:type="dxa"/>
+            </w:tcMar>
+            <w:hideMark/>
+          </w:tcPr>
+          <w:p>
+            <w:pPr>
+              <w:rPr>
+                <w:b/>
+                <w:bCs/>
+                <w:lang w:val="pl-PL"/>
+              </w:rPr>
+            </w:pPr>
+            <w:r>
+              <w:rPr>
+                <w:b/>
+                <w:bCs/>
+                <w:lang w:val="pl-PL"/>
+              </w:rPr>
+              <w:t>Etap</w:t>
+            </w:r>
+          </w:p>
+        </w:tc>
+        <w:tc>
+          <w:tcPr>
+            <w:tcW w:w="0" w:type="auto"/>
+            <w:shd w:val="clear" w:color="auto" w:fill="FFFFFF" w:themeFill="background1"/>
+            <w:noWrap/>
+            <w:tcMar>
+              <w:top w:w="75" w:type="dxa"/>
+              <w:left w:w="135" w:type="dxa"/>
+              <w:bottom w:w="75" w:type="dxa"/>
+              <w:right w:w="135" w:type="dxa"/>
+            </w:tcMar>
+            <w:hideMark/>
+          </w:tcPr>
+          <w:p>
+            <w:pPr>
+              <w:rPr>
+                <w:b/>
+                <w:bCs/>
+                <w:lang w:val="pl-PL"/>
+              </w:rPr>
+            </w:pPr>
+            <w:r>
+              <w:rPr>
+                <w:b/>
+                <w:bCs/>
+                <w:lang w:val="pl-PL"/>
+              </w:rPr>
+              <w:t>Części systemu / komponenty</w:t>
+            </w:r>
+          </w:p>
+        </w:tc>
+        <w:tc>
+          <w:tcPr>
+            <w:tcW w:w="0" w:type="auto"/>
+            <w:shd w:val="clear" w:color="auto" w:fill="FFFFFF" w:themeFill="background1"/>
+            <w:noWrap/>
+            <w:tcMar>
+              <w:top w:w="75" w:type="dxa"/>
+              <w:left w:w="135" w:type="dxa"/>
+              <w:bottom w:w="75" w:type="dxa"/>
+              <w:right w:w="135" w:type="dxa"/>
+            </w:tcMar>
+            <w:hideMark/>
+          </w:tcPr>
+          <w:p>
+            <w:pPr>
+              <w:rPr>
+                <w:b/>
+                <w:bCs/>
+                <w:lang w:val="pl-PL"/>
+              </w:rPr>
+            </w:pPr>
+            <w:r>
+              <w:rPr>
+                <w:b/>
+                <w:bCs/>
+                <w:lang w:val="pl-PL"/>
+              </w:rPr>
+              <w:t>Czas trwania [dni robocze]</w:t>
+            </w:r>
+          </w:p>
+        </w:tc>
+      </w:tr>
+      <w:tr>
+        <w:tc>
+          <w:tcPr>
+            <w:tcW w:w="0" w:type="auto"/>
+            <w:shd w:val="clear" w:color="auto" w:fill="FFFFFF" w:themeFill="background1"/>
+            <w:tcMar>
+              <w:top w:w="75" w:type="dxa"/>
+              <w:left w:w="135" w:type="dxa"/>
+              <w:bottom w:w="75" w:type="dxa"/>
+              <w:right w:w="135" w:type="dxa"/>
+            </w:tcMar>
+            <w:hideMark/>
+          </w:tcPr>
+          <w:p>
+            <w:pPr>
+              <w:rPr>
+                <w:lang w:val="pl-PL"/>
+              </w:rPr>
+            </w:pPr>
+            <w:r>
+              <w:rPr>
+                <w:b/>
+                <w:bCs/>
+                <w:lang w:val="pl-PL"/>
+              </w:rPr>
+              <w:t>1</w:t>
+            </w:r>
+          </w:p>
+        </w:tc>
+        <w:tc>
+          <w:tcPr>
+            <w:tcW w:w="0" w:type="auto"/>
+            <w:shd w:val="clear" w:color="auto" w:fill="FFFFFF" w:themeFill="background1"/>
+            <w:tcMar>
+              <w:top w:w="75" w:type="dxa"/>
+              <w:left w:w="135" w:type="dxa"/>
+              <w:bottom w:w="75" w:type="dxa"/>
+              <w:right w:w="135" w:type="dxa"/>
+            </w:tcMar>
+            <w:hideMark/>
+          </w:tcPr>
+          <w:p>
+            <w:pPr>
+              <w:rPr>
+                <w:lang w:val="pl-PL"/>
+              </w:rPr>
+            </w:pPr>
+            <w:r>
+              <w:rPr>
+                <w:lang w:val="pl-PL"/>
+              </w:rPr>
+              <w:t>Wizja systemu</w:t>
+            </w:r>
+          </w:p>
+        </w:tc>
+        <w:tc>
+          <w:tcPr>
+            <w:tcW w:w="0" w:type="auto"/>
+            <w:shd w:val="clear" w:color="auto" w:fill="FFFFFF" w:themeFill="background1"/>
+            <w:tcMar>
+              <w:top w:w="75" w:type="dxa"/>
+              <w:left w:w="135" w:type="dxa"/>
+              <w:bottom w:w="75" w:type="dxa"/>
+              <w:right w:w="135" w:type="dxa"/>
+            </w:tcMar>
+            <w:hideMark/>
+          </w:tcPr>
+          <w:p>
+            <w:pPr>
+              <w:rPr>
+                <w:lang w:val="pl-PL"/>
+              </w:rPr>
+            </w:pPr>
+            <w:r>
+              <w:rPr>
+                <w:lang w:val="pl-PL"/>
+              </w:rPr>
+              <w:t>Diagramy UML (klas, czynności, przebiegu, stanów, wdrożenia), opis wymagań</w:t>
+            </w:r>
+          </w:p>
+        </w:tc>
+        <w:tc>
+          <w:tcPr>
+            <w:tcW w:w="0" w:type="auto"/>
+            <w:shd w:val="clear" w:color="auto" w:fill="FFFFFF" w:themeFill="background1"/>
+            <w:tcMar>
+              <w:top w:w="75" w:type="dxa"/>
+              <w:left w:w="135" w:type="dxa"/>
+              <w:bottom w:w="75" w:type="dxa"/>
+              <w:right w:w="135" w:type="dxa"/>
+            </w:tcMar>
+            <w:hideMark/>
+          </w:tcPr>
+          <w:p>
+            <w:pPr>
+              <w:rPr>
+                <w:lang w:val="pl-PL"/>
+              </w:rPr>
+            </w:pPr>
+            <w:r>
+              <w:rPr>
+                <w:b/>
+                <w:bCs/>
+                <w:lang w:val="pl-PL"/>
+              </w:rPr>
+              <w:t>10</w:t>
+            </w:r>
+          </w:p>
+        </w:tc>
+      </w:tr>
+      <w:tr>
+        <w:tc>
+          <w:tcPr>
+            <w:tcW w:w="0" w:type="auto"/>
+            <w:shd w:val="clear" w:color="auto" w:fill="FFFFFF" w:themeFill="background1"/>
+            <w:tcMar>
+              <w:top w:w="75" w:type="dxa"/>
+              <w:left w:w="135" w:type="dxa"/>
+              <w:bottom w:w="75" w:type="dxa"/>
+              <w:right w:w="135" w:type="dxa"/>
+            </w:tcMar>
+            <w:hideMark/>
+          </w:tcPr>
+          <w:p>
+            <w:pPr>
+              <w:rPr>
+                <w:lang w:val="pl-PL"/>
+              </w:rPr>
+            </w:pPr>
+            <w:r>
+              <w:rPr>
+                <w:b/>
+                <w:bCs/>
+                <w:lang w:val="pl-PL"/>
+              </w:rPr>
+              <w:t>2</w:t>
+            </w:r>
+          </w:p>
+        </w:tc>
+        <w:tc>
+          <w:tcPr>
+            <w:tcW w:w="0" w:type="auto"/>
+            <w:shd w:val="clear" w:color="auto" w:fill="FFFFFF" w:themeFill="background1"/>
+            <w:tcMar>
+              <w:top w:w="75" w:type="dxa"/>
+              <w:left w:w="135" w:type="dxa"/>
+              <w:bottom w:w="75" w:type="dxa"/>
+              <w:right w:w="135" w:type="dxa"/>
+            </w:tcMar>
+            <w:hideMark/>
+          </w:tcPr>
+          <w:p>
+            <w:pPr>
+              <w:rPr>
+                <w:lang w:val="pl-PL"/>
+              </w:rPr>
+            </w:pPr>
+            <w:r>
+              <w:rPr>
+                <w:lang w:val="pl-PL"/>
+              </w:rPr>
+              <w:t>Planowanie projektu</w:t>
+            </w:r>
+          </w:p>
+        </w:tc>
+        <w:tc>
+          <w:tcPr>
+            <w:tcW w:w="0" w:type="auto"/>
+            <w:shd w:val="clear" w:color="auto" w:fill="FFFFFF" w:themeFill="background1"/>
+            <w:tcMar>
+              <w:top w:w="75" w:type="dxa"/>
+              <w:left w:w="135" w:type="dxa"/>
+              <w:bottom w:w="75" w:type="dxa"/>
+              <w:right w:w="135" w:type="dxa"/>
+            </w:tcMar>
+            <w:hideMark/>
+          </w:tcPr>
+          <w:p>
+            <w:pPr>
+              <w:rPr>
+                <w:lang w:val="pl-PL"/>
+              </w:rPr>
+            </w:pPr>
+            <w:r>
+              <w:rPr>
+                <w:lang w:val="pl-PL"/>
+              </w:rPr>
+              <w:t>Projekt </w:t>
+            </w:r>
+            <w:proofErr w:type="spellStart"/>
+            <w:r>
+              <w:rPr>
+                <w:lang w:val="pl-PL"/>
+              </w:rPr>
+              <w:t>BazaStrzelnicy</w:t>
+            </w:r>
+            <w:proofErr w:type="spellEnd"/>
+            <w:r>
+              <w:rPr>
+                <w:lang w:val="pl-PL"/>
+              </w:rPr>
+              <w:t> (SQL Server), analiza ryzyka, podział zadań</w:t>
+            </w:r>
+          </w:p>
+        </w:tc>
+        <w:tc>
+          <w:tcPr>
+            <w:tcW w:w="0" w:type="auto"/>
+            <w:shd w:val="clear" w:color="auto" w:fill="FFFFFF" w:themeFill="background1"/>
+            <w:tcMar>
+              <w:top w:w="75" w:type="dxa"/>
+              <w:left w:w="135" w:type="dxa"/>
+              <w:bottom w:w="75" w:type="dxa"/>
+              <w:right w:w="135" w:type="dxa"/>
+            </w:tcMar>
+            <w:hideMark/>
+          </w:tcPr>
+          <w:p>
+            <w:pPr>
+              <w:rPr>
+                <w:lang w:val="pl-PL"/>
+              </w:rPr>
+            </w:pPr>
+            <w:r>
+              <w:rPr>
+                <w:b/>
+                <w:bCs/>
+                <w:lang w:val="pl-PL"/>
+              </w:rPr>
+              <w:t>10</w:t>
+            </w:r>
+          </w:p>
+        </w:tc>
+      </w:tr>
+      <w:tr>
+        <w:tc>
+          <w:tcPr>
+            <w:tcW w:w="0" w:type="auto"/>
+            <w:shd w:val="clear" w:color="auto" w:fill="FFFFFF" w:themeFill="background1"/>
+            <w:tcMar>
+              <w:top w:w="75" w:type="dxa"/>
+              <w:left w:w="135" w:type="dxa"/>
+              <w:bottom w:w="75" w:type="dxa"/>
+              <w:right w:w="135" w:type="dxa"/>
+            </w:tcMar>
+            <w:hideMark/>
+          </w:tcPr>
+          <w:p>
+            <w:pPr>
+              <w:rPr>
+                <w:lang w:val="pl-PL"/>
+              </w:rPr>
+            </w:pPr>
+            <w:r>
+              <w:rPr>
+                <w:b/>
+                <w:bCs/>
+                <w:lang w:val="pl-PL"/>
+              </w:rPr>
+              <w:t>3</w:t>
+            </w:r>
+          </w:p>
+        </w:tc>
+        <w:tc>
+          <w:tcPr>
+            <w:tcW w:w="0" w:type="auto"/>
+            <w:shd w:val="clear" w:color="auto" w:fill="FFFFFF" w:themeFill="background1"/>
+            <w:tcMar>
+              <w:top w:w="75" w:type="dxa"/>
+              <w:left w:w="135" w:type="dxa"/>
+              <w:bottom w:w="75" w:type="dxa"/>
+              <w:right w:w="135" w:type="dxa"/>
+            </w:tcMar>
+            <w:hideMark/>
+          </w:tcPr>
+          <w:p>
+            <w:pPr>
+              <w:rPr>
+                <w:lang w:val="pl-PL"/>
+              </w:rPr>
+            </w:pPr>
+            <w:r>
+              <w:rPr>
+                <w:lang w:val="pl-PL"/>
+              </w:rPr>
+              <w:t>Realizacja</w:t>
+            </w:r>
+          </w:p>
+        </w:tc>
+        <w:tc>
+          <w:tcPr>
+            <w:tcW w:w="0" w:type="auto"/>
+            <w:shd w:val="clear" w:color="auto" w:fill="FFFFFF" w:themeFill="background1"/>
+            <w:tcMar>
+              <w:top w:w="75" w:type="dxa"/>
+              <w:left w:w="135" w:type="dxa"/>
+              <w:bottom w:w="75" w:type="dxa"/>
+              <w:right w:w="135" w:type="dxa"/>
+            </w:tcMar>
+            <w:hideMark/>
+          </w:tcPr>
+          <w:p>
+            <w:pPr>
+              <w:rPr>
+                <w:lang w:val="pl-PL"/>
+              </w:rPr>
+            </w:pPr>
+            <w:r>
+              <w:rPr>
+                <w:lang w:val="pl-PL"/>
+              </w:rPr>
+              <w:t xml:space="preserve">Aplikacja webowa (ASP.NET </w:t>
+            </w:r>
+            <w:proofErr w:type="spellStart"/>
+            <w:r>
+              <w:rPr>
+                <w:lang w:val="pl-PL"/>
+              </w:rPr>
+              <w:t>Core</w:t>
+            </w:r>
+            <w:proofErr w:type="spellEnd"/>
+            <w:r>
+              <w:rPr>
+                <w:lang w:val="pl-PL"/>
+              </w:rPr>
+              <w:t>): moduły użytkowników, rezerwacji, obsługi wizyt, sesji i magazynu; panele klienta i instruktora; konfiguracja serwera</w:t>
+            </w:r>
+          </w:p>
+        </w:tc>
+        <w:tc>
+          <w:tcPr>
+            <w:tcW w:w="0" w:type="auto"/>
+            <w:shd w:val="clear" w:color="auto" w:fill="FFFFFF" w:themeFill="background1"/>
+            <w:tcMar>
+              <w:top w:w="75" w:type="dxa"/>
+              <w:left w:w="135" w:type="dxa"/>
+              <w:bottom w:w="75" w:type="dxa"/>
+              <w:right w:w="135" w:type="dxa"/>
+            </w:tcMar>
+            <w:hideMark/>
+          </w:tcPr>
+          <w:p>
+            <w:pPr>
+              <w:rPr>
+                <w:lang w:val="pl-PL"/>
+              </w:rPr>
+            </w:pPr>
+            <w:r>
+              <w:rPr>
+                <w:b/>
+                <w:bCs/>
+                <w:lang w:val="pl-PL"/>
+              </w:rPr>
+              <w:t>30</w:t>
+            </w:r>
+          </w:p>
+        </w:tc>
+      </w:tr>
+      <w:tr>
+        <w:tc>
+          <w:tcPr>
+            <w:tcW w:w="0" w:type="auto"/>
+            <w:shd w:val="clear" w:color="auto" w:fill="FFFFFF" w:themeFill="background1"/>
+            <w:tcMar>
+              <w:top w:w="75" w:type="dxa"/>
+              <w:left w:w="135" w:type="dxa"/>
+              <w:bottom w:w="75" w:type="dxa"/>
+              <w:right w:w="135" w:type="dxa"/>
+            </w:tcMar>
+            <w:hideMark/>
+          </w:tcPr>
+          <w:p>
+            <w:pPr>
+              <w:rPr>
+                <w:lang w:val="pl-PL"/>
+              </w:rPr>
+            </w:pPr>
+            <w:r>
+              <w:rPr>
+                <w:b/>
+                <w:bCs/>
+                <w:lang w:val="pl-PL"/>
+              </w:rPr>
+              <w:t>4</w:t>
+            </w:r>
+          </w:p>
+        </w:tc>
+        <w:tc>
+          <w:tcPr>
+            <w:tcW w:w="0" w:type="auto"/>
+            <w:shd w:val="clear" w:color="auto" w:fill="FFFFFF" w:themeFill="background1"/>
+            <w:tcMar>
+              <w:top w:w="75" w:type="dxa"/>
+              <w:left w:w="135" w:type="dxa"/>
+              <w:bottom w:w="75" w:type="dxa"/>
+              <w:right w:w="135" w:type="dxa"/>
+            </w:tcMar>
+            <w:hideMark/>
+          </w:tcPr>
+          <w:p>
+            <w:pPr>
+              <w:rPr>
+                <w:lang w:val="pl-PL"/>
+              </w:rPr>
+            </w:pPr>
+            <w:r>
+              <w:rPr>
+                <w:lang w:val="pl-PL"/>
+              </w:rPr>
+              <w:t>Testy</w:t>
+            </w:r>
+          </w:p>
+        </w:tc>
+        <w:tc>
+          <w:tcPr>
+            <w:tcW w:w="0" w:type="auto"/>
+            <w:shd w:val="clear" w:color="auto" w:fill="FFFFFF" w:themeFill="background1"/>
+            <w:tcMar>
+              <w:top w:w="75" w:type="dxa"/>
+              <w:left w:w="135" w:type="dxa"/>
+              <w:bottom w:w="75" w:type="dxa"/>
+              <w:right w:w="135" w:type="dxa"/>
+            </w:tcMar>
+            <w:hideMark/>
+          </w:tcPr>
+          <w:p>
+            <w:pPr>
+              <w:rPr>
+                <w:lang w:val="pl-PL"/>
+              </w:rPr>
+            </w:pPr>
+            <w:r>
+              <w:rPr>
+                <w:lang w:val="pl-PL"/>
+              </w:rPr>
+              <w:t xml:space="preserve">Weryfikacja modułów </w:t>
+            </w:r>
+            <w:proofErr w:type="spellStart"/>
+            <w:r>
+              <w:rPr>
+                <w:lang w:val="pl-PL"/>
+              </w:rPr>
+              <w:t>backendu</w:t>
+            </w:r>
+            <w:proofErr w:type="spellEnd"/>
+            <w:r>
+              <w:rPr>
+                <w:lang w:val="pl-PL"/>
+              </w:rPr>
+              <w:t xml:space="preserve">, </w:t>
+            </w:r>
+            <w:proofErr w:type="spellStart"/>
+            <w:r>
+              <w:rPr>
+                <w:lang w:val="pl-PL"/>
+              </w:rPr>
+              <w:t>frontendu</w:t>
+            </w:r>
+            <w:proofErr w:type="spellEnd"/>
+            <w:r>
+              <w:rPr>
+                <w:lang w:val="pl-PL"/>
+              </w:rPr>
+              <w:t xml:space="preserve"> i integracji (</w:t>
+            </w:r>
+            <w:proofErr w:type="spellStart"/>
+            <w:r>
+              <w:rPr>
+                <w:lang w:val="pl-PL"/>
+              </w:rPr>
+              <w:t>IKlient</w:t>
+            </w:r>
+            <w:proofErr w:type="spellEnd"/>
+            <w:r>
+              <w:rPr>
+                <w:lang w:val="pl-PL"/>
+              </w:rPr>
+              <w:t>, </w:t>
+            </w:r>
+            <w:proofErr w:type="spellStart"/>
+            <w:r>
+              <w:rPr>
+                <w:lang w:val="pl-PL"/>
+              </w:rPr>
+              <w:t>IInstruktor</w:t>
+            </w:r>
+            <w:proofErr w:type="spellEnd"/>
+            <w:r>
+              <w:rPr>
+                <w:lang w:val="pl-PL"/>
+              </w:rPr>
+              <w:t>)</w:t>
+            </w:r>
+          </w:p>
+        </w:tc>
+        <w:tc>
+          <w:tcPr>
+            <w:tcW w:w="0" w:type="auto"/>
+            <w:shd w:val="clear" w:color="auto" w:fill="FFFFFF" w:themeFill="background1"/>
+            <w:tcMar>
+              <w:top w:w="75" w:type="dxa"/>
+              <w:left w:w="135" w:type="dxa"/>
+              <w:bottom w:w="75" w:type="dxa"/>
+              <w:right w:w="135" w:type="dxa"/>
+            </w:tcMar>
+            <w:hideMark/>
+          </w:tcPr>
+          <w:p>
+            <w:pPr>
+              <w:rPr>
+                <w:lang w:val="pl-PL"/>
+              </w:rPr>
+            </w:pPr>
+            <w:r>
+              <w:rPr>
+                <w:b/>
+                <w:bCs/>
+                <w:lang w:val="pl-PL"/>
+              </w:rPr>
+              <w:t>15</w:t>
+            </w:r>
+          </w:p>
+        </w:tc>
+      </w:tr>
+      <w:tr>
+        <w:tc>
+          <w:tcPr>
+            <w:tcW w:w="0" w:type="auto"/>
+            <w:shd w:val="clear" w:color="auto" w:fill="FFFFFF" w:themeFill="background1"/>
+            <w:tcMar>
+              <w:top w:w="75" w:type="dxa"/>
+              <w:left w:w="135" w:type="dxa"/>
+              <w:bottom w:w="75" w:type="dxa"/>
+              <w:right w:w="135" w:type="dxa"/>
+            </w:tcMar>
+            <w:hideMark/>
+          </w:tcPr>
+          <w:p>
+            <w:pPr>
+              <w:rPr>
+                <w:lang w:val="pl-PL"/>
+              </w:rPr>
+            </w:pPr>
+            <w:r>
+              <w:rPr>
+                <w:b/>
+                <w:bCs/>
+                <w:lang w:val="pl-PL"/>
+              </w:rPr>
+              <w:t>5</w:t>
+            </w:r>
+          </w:p>
+        </w:tc>
+        <w:tc>
+          <w:tcPr>
+            <w:tcW w:w="0" w:type="auto"/>
+            <w:shd w:val="clear" w:color="auto" w:fill="FFFFFF" w:themeFill="background1"/>
+            <w:tcMar>
+              <w:top w:w="75" w:type="dxa"/>
+              <w:left w:w="135" w:type="dxa"/>
+              <w:bottom w:w="75" w:type="dxa"/>
+              <w:right w:w="135" w:type="dxa"/>
+            </w:tcMar>
+            <w:hideMark/>
+          </w:tcPr>
+          <w:p>
+            <w:pPr>
+              <w:rPr>
+                <w:lang w:val="pl-PL"/>
+              </w:rPr>
+            </w:pPr>
+            <w:r>
+              <w:rPr>
+                <w:lang w:val="pl-PL"/>
+              </w:rPr>
+              <w:t>Wdrożenie i szkolenie</w:t>
+            </w:r>
+          </w:p>
+        </w:tc>
+        <w:tc>
+          <w:tcPr>
+            <w:tcW w:w="0" w:type="auto"/>
+            <w:shd w:val="clear" w:color="auto" w:fill="FFFFFF" w:themeFill="background1"/>
+            <w:tcMar>
+              <w:top w:w="75" w:type="dxa"/>
+              <w:left w:w="135" w:type="dxa"/>
+              <w:bottom w:w="75" w:type="dxa"/>
+              <w:right w:w="135" w:type="dxa"/>
+            </w:tcMar>
+            <w:hideMark/>
+          </w:tcPr>
+          <w:p>
+            <w:pPr>
+              <w:rPr>
+                <w:lang w:val="pl-PL"/>
+              </w:rPr>
+            </w:pPr>
+            <w:r>
+              <w:rPr>
+                <w:lang w:val="pl-PL"/>
+              </w:rPr>
+              <w:t>Wdrożenie na serwerze produkcyjnym, szkolenie instruktorów</w:t>
+            </w:r>
+          </w:p>
+        </w:tc>
+        <w:tc>
+          <w:tcPr>
+            <w:tcW w:w="0" w:type="auto"/>
+            <w:shd w:val="clear" w:color="auto" w:fill="FFFFFF" w:themeFill="background1"/>
+            <w:tcMar>
+              <w:top w:w="75" w:type="dxa"/>
+              <w:left w:w="135" w:type="dxa"/>
+              <w:bottom w:w="75" w:type="dxa"/>
+              <w:right w:w="135" w:type="dxa"/>
+            </w:tcMar>
+            <w:hideMark/>
+          </w:tcPr>
+          <w:p>
+            <w:pPr>
+              <w:rPr>
+                <w:lang w:val="pl-PL"/>
+              </w:rPr>
+            </w:pPr>
+            <w:r>
+              <w:rPr>
+                <w:b/>
+                <w:bCs/>
+                <w:lang w:val="pl-PL"/>
+              </w:rPr>
+              <w:t>10</w:t>
+            </w:r>
+          </w:p>
+        </w:tc>
+      </w:tr>
+      <w:tr>
+        <w:tc>
+          <w:tcPr>
+            <w:tcW w:w="0" w:type="auto"/>
+            <w:shd w:val="clear" w:color="auto" w:fill="FFFFFF" w:themeFill="background1"/>
+            <w:tcMar>
+              <w:top w:w="75" w:type="dxa"/>
+              <w:left w:w="135" w:type="dxa"/>
+              <w:bottom w:w="75" w:type="dxa"/>
+              <w:right w:w="135" w:type="dxa"/>
+            </w:tcMar>
+            <w:hideMark/>
+          </w:tcPr>
+          <w:p>
+            <w:pPr>
+              <w:rPr>
+                <w:lang w:val="pl-PL"/>
+              </w:rPr>
+            </w:pPr>
+            <w:r>
+              <w:rPr>
+                <w:b/>
+                <w:bCs/>
+                <w:lang w:val="pl-PL"/>
+              </w:rPr>
+              <w:t>6</w:t>
+            </w:r>
+          </w:p>
+        </w:tc>
+        <w:tc>
+          <w:tcPr>
+            <w:tcW w:w="0" w:type="auto"/>
+            <w:shd w:val="clear" w:color="auto" w:fill="FFFFFF" w:themeFill="background1"/>
+            <w:tcMar>
+              <w:top w:w="75" w:type="dxa"/>
+              <w:left w:w="135" w:type="dxa"/>
+              <w:bottom w:w="75" w:type="dxa"/>
+              <w:right w:w="135" w:type="dxa"/>
+            </w:tcMar>
+            <w:hideMark/>
+          </w:tcPr>
+          <w:p>
+            <w:pPr>
+              <w:rPr>
+                <w:lang w:val="pl-PL"/>
+              </w:rPr>
+            </w:pPr>
+            <w:r>
+              <w:rPr>
+                <w:lang w:val="pl-PL"/>
+              </w:rPr>
+              <w:t>Dokumentacja końcowa</w:t>
+            </w:r>
+          </w:p>
+        </w:tc>
+        <w:tc>
+          <w:tcPr>
+            <w:tcW w:w="0" w:type="auto"/>
+            <w:shd w:val="clear" w:color="auto" w:fill="FFFFFF" w:themeFill="background1"/>
+            <w:tcMar>
+              <w:top w:w="75" w:type="dxa"/>
+              <w:left w:w="135" w:type="dxa"/>
+              <w:bottom w:w="75" w:type="dxa"/>
+              <w:right w:w="135" w:type="dxa"/>
+            </w:tcMar>
+            <w:hideMark/>
+          </w:tcPr>
+          <w:p>
+            <w:pPr>
+              <w:rPr>
+                <w:lang w:val="pl-PL"/>
+              </w:rPr>
+            </w:pPr>
+            <w:r>
+              <w:rPr>
+                <w:lang w:val="pl-PL"/>
+              </w:rPr>
+              <w:t>Uzupełnienie dokumentacji projektu, poprawki po testach</w:t>
+            </w:r>
+          </w:p>
+        </w:tc>
+        <w:tc>
+          <w:tcPr>
+            <w:tcW w:w="0" w:type="auto"/>
+            <w:shd w:val="clear" w:color="auto" w:fill="FFFFFF" w:themeFill="background1"/>
+            <w:tcMar>
+              <w:top w:w="75" w:type="dxa"/>
+              <w:left w:w="135" w:type="dxa"/>
+              <w:bottom w:w="75" w:type="dxa"/>
+              <w:right w:w="135" w:type="dxa"/>
+            </w:tcMar>
+            <w:hideMark/>
+          </w:tcPr>
+          <w:p>
+            <w:pPr>
+              <w:rPr>
+                <w:lang w:val="pl-PL"/>
+              </w:rPr>
+            </w:pPr>
+            <w:r>
+              <w:rPr>
+                <w:b/>
+                <w:bCs/>
+                <w:lang w:val="pl-PL"/>
+              </w:rPr>
+              <w:t>15</w:t>
+            </w:r>
+          </w:p>
+        </w:tc>
+      </w:tr>
+    </w:tbl>
+    <w:p/>
+    <w:p>
+      <w:pPr>
+        <w:pStyle w:val="Nagwek3"/>
+      </w:pPr>
+      <w:r>
+        <w:t>9. Analiza ryzyka</w:t>
+      </w:r>
+    </w:p>
+    <w:p>
+      <w:pPr>
+        <w:rPr>
+          <w:b/>
+          <w:bCs/>
+          <w:sz w:val="24"/>
+          <w:szCs w:val="24"/>
+          <w:lang w:val="pl-PL"/>
+        </w:rPr>
+      </w:pPr>
+      <w:r>
+        <w:rPr>
+          <w:b/>
+          <w:bCs/>
+          <w:sz w:val="24"/>
+          <w:szCs w:val="24"/>
+          <w:lang w:val="pl-PL"/>
+        </w:rPr>
+        <w:t>Przewidywane zagrożenia:</w:t>
+      </w:r>
+    </w:p>
+    <w:p>
+      <w:pPr>
+        <w:rPr>
+          <w:b/>
+          <w:bCs/>
+          <w:sz w:val="24"/>
+          <w:szCs w:val="24"/>
+          <w:lang w:val="pl-PL"/>
+        </w:rPr>
+      </w:pPr>
+    </w:p>
+    <w:p>
+      <w:pPr>
+        <w:rPr>
+          <w:lang w:val="pl-PL"/>
+        </w:rPr>
+      </w:pPr>
+      <w:r>
+        <w:rPr>
+          <w:b/>
+          <w:bCs/>
+          <w:lang w:val="pl-PL"/>
+        </w:rPr>
+        <w:t>1. Błędna weryfikacja tożsamości klienta (np. nieprawidłowy PESEL, akceptacja fałszywego dokumentu)</w:t>
+      </w:r>
+    </w:p>
+    <w:p>
+      <w:pPr>
+        <w:numPr>
+          <w:ilvl w:val="0"/>
+          <w:numId w:val="30"/>
+        </w:numPr>
+        <w:rPr>
+          <w:lang w:val="pl-PL"/>
+        </w:rPr>
+      </w:pPr>
+      <w:r>
+        <w:rPr>
+          <w:b/>
+          <w:bCs/>
+          <w:lang w:val="pl-PL"/>
+        </w:rPr>
+        <w:t>Prawdopodobieństwo wystąpienia:</w:t>
+      </w:r>
+      <w:r>
+        <w:rPr>
+          <w:lang w:val="pl-PL"/>
+        </w:rPr>
+        <w:t> średnie</w:t>
+      </w:r>
+    </w:p>
+    <w:p>
+      <w:pPr>
+        <w:numPr>
+          <w:ilvl w:val="0"/>
+          <w:numId w:val="30"/>
+        </w:numPr>
+        <w:rPr>
+          <w:lang w:val="pl-PL"/>
+        </w:rPr>
+      </w:pPr>
+      <w:r>
+        <w:rPr>
+          <w:b/>
+          <w:bCs/>
+          <w:lang w:val="pl-PL"/>
+        </w:rPr>
+        <w:t>Stopień szkodliwości:</w:t>
+      </w:r>
+      <w:r>
+        <w:rPr>
+          <w:lang w:val="pl-PL"/>
+        </w:rPr>
+        <w:t> bardzo duży</w:t>
+      </w:r>
+    </w:p>
+    <w:p>
+      <w:pPr>
+        <w:numPr>
+          <w:ilvl w:val="0"/>
+          <w:numId w:val="30"/>
+        </w:numPr>
+        <w:rPr>
+          <w:lang w:val="pl-PL"/>
+        </w:rPr>
+      </w:pPr>
+      <w:r>
+        <w:rPr>
+          <w:b/>
+          <w:bCs/>
+          <w:lang w:val="pl-PL"/>
+        </w:rPr>
+        <w:t>Propozycja metod zapobiegania:</w:t>
+      </w:r>
+      <w:r>
+        <w:rPr>
+          <w:lang w:val="pl-PL"/>
+        </w:rPr>
+        <w:t xml:space="preserve"> walidacja numeru PESEL w systemie, obowiązkowe wypełnienie formularza weryfikacji, szkolenie instruktorów z procedur sprawdzania dokumentów, blokada </w:t>
+      </w:r>
+      <w:r>
+        <w:rPr>
+          <w:lang w:val="pl-PL"/>
+        </w:rPr>
+        <w:t xml:space="preserve">operacji </w:t>
+      </w:r>
+      <w:proofErr w:type="spellStart"/>
+      <w:r>
+        <w:rPr>
+          <w:lang w:val="pl-PL"/>
+        </w:rPr>
+        <w:t>check</w:t>
+      </w:r>
+      <w:proofErr w:type="spellEnd"/>
+      <w:r>
+        <w:rPr>
+          <w:lang w:val="pl-PL"/>
+        </w:rPr>
+        <w:t>-in do momentu pozytywnej weryfikacji</w:t>
+      </w:r>
+    </w:p>
+    <w:p>
+      <w:pPr>
+        <w:numPr>
+          <w:ilvl w:val="0"/>
+          <w:numId w:val="30"/>
+        </w:numPr>
+        <w:rPr>
+          <w:lang w:val="pl-PL"/>
+        </w:rPr>
+      </w:pPr>
+      <w:r>
+        <w:rPr>
+          <w:b/>
+          <w:bCs/>
+          <w:lang w:val="pl-PL"/>
+        </w:rPr>
+        <w:t>Plan awaryjny:</w:t>
+      </w:r>
+    </w:p>
+    <w:p>
+      <w:pPr>
+        <w:numPr>
+          <w:ilvl w:val="1"/>
+          <w:numId w:val="30"/>
+        </w:numPr>
+        <w:rPr>
+          <w:lang w:val="pl-PL"/>
+        </w:rPr>
+      </w:pPr>
+      <w:r>
+        <w:rPr>
+          <w:lang w:val="pl-PL"/>
+        </w:rPr>
+        <w:t>Wstrzymanie</w:t>
+      </w:r>
+      <w:r>
+        <w:rPr>
+          <w:lang w:val="pl-PL"/>
+        </w:rPr>
+        <w:t xml:space="preserve"> operacji</w:t>
+      </w:r>
+      <w:r>
+        <w:rPr>
+          <w:lang w:val="pl-PL"/>
+        </w:rPr>
+        <w:t xml:space="preserve"> </w:t>
+      </w:r>
+      <w:proofErr w:type="spellStart"/>
+      <w:r>
+        <w:rPr>
+          <w:lang w:val="pl-PL"/>
+        </w:rPr>
+        <w:t>check</w:t>
+      </w:r>
+      <w:proofErr w:type="spellEnd"/>
+      <w:r>
+        <w:rPr>
+          <w:lang w:val="pl-PL"/>
+        </w:rPr>
+        <w:t>-in klienta</w:t>
+      </w:r>
+    </w:p>
+    <w:p>
+      <w:pPr>
+        <w:numPr>
+          <w:ilvl w:val="1"/>
+          <w:numId w:val="30"/>
+        </w:numPr>
+        <w:rPr>
+          <w:lang w:val="pl-PL"/>
+        </w:rPr>
+      </w:pPr>
+      <w:r>
+        <w:rPr>
+          <w:lang w:val="pl-PL"/>
+        </w:rPr>
+        <w:t>Ponowna weryfikacja dokumentu przez instruktora</w:t>
+      </w:r>
+    </w:p>
+    <w:p>
+      <w:pPr>
+        <w:numPr>
+          <w:ilvl w:val="1"/>
+          <w:numId w:val="30"/>
+        </w:numPr>
+        <w:rPr>
+          <w:lang w:val="pl-PL"/>
+        </w:rPr>
+      </w:pPr>
+      <w:r>
+        <w:rPr>
+          <w:lang w:val="pl-PL"/>
+        </w:rPr>
+        <w:t>Zapis zdarzenia w logu systemowym</w:t>
+      </w:r>
+    </w:p>
+    <w:p>
+      <w:pPr>
+        <w:numPr>
+          <w:ilvl w:val="1"/>
+          <w:numId w:val="30"/>
+        </w:numPr>
+        <w:rPr>
+          <w:lang w:val="pl-PL"/>
+        </w:rPr>
+      </w:pPr>
+      <w:r>
+        <w:rPr>
+          <w:lang w:val="pl-PL"/>
+        </w:rPr>
+        <w:t>W przypadku wątpliwości — odmowa obsługi i zgłoszenie przełożonemu</w:t>
+      </w:r>
+    </w:p>
+    <w:p>
+      <w:pPr>
+        <w:ind w:left="1080"/>
+        <w:rPr>
+          <w:lang w:val="pl-PL"/>
+        </w:rPr>
+      </w:pPr>
+    </w:p>
+    <w:p>
+      <w:pPr>
+        <w:rPr>
+          <w:b/>
+          <w:bCs/>
+          <w:lang w:val="pl-PL"/>
+        </w:rPr>
+      </w:pPr>
+    </w:p>
+    <w:p>
+      <w:pPr>
+        <w:rPr>
+          <w:lang w:val="pl-PL"/>
+        </w:rPr>
+      </w:pPr>
+      <w:r>
+        <w:rPr>
+          <w:b/>
+          <w:bCs/>
+          <w:lang w:val="pl-PL"/>
+        </w:rPr>
+        <w:lastRenderedPageBreak/>
+        <w:t>2. Utrata lub uszkodzenie danych rezerwacji i sesji strzeleckich (awaria bazy SQL Server)</w:t>
+      </w:r>
+    </w:p>
+    <w:p>
+      <w:pPr>
+        <w:numPr>
+          <w:ilvl w:val="0"/>
+          <w:numId w:val="31"/>
+        </w:numPr>
+        <w:rPr>
+          <w:lang w:val="pl-PL"/>
+        </w:rPr>
+      </w:pPr>
+      <w:r>
+        <w:rPr>
+          <w:b/>
+          <w:bCs/>
+          <w:lang w:val="pl-PL"/>
+        </w:rPr>
+        <w:t>Prawdopodobieństwo wystąpienia:</w:t>
+      </w:r>
+      <w:r>
+        <w:rPr>
+          <w:lang w:val="pl-PL"/>
+        </w:rPr>
+        <w:t> niskie</w:t>
+      </w:r>
+    </w:p>
+    <w:p>
+      <w:pPr>
+        <w:numPr>
+          <w:ilvl w:val="0"/>
+          <w:numId w:val="31"/>
+        </w:numPr>
+        <w:rPr>
+          <w:lang w:val="pl-PL"/>
+        </w:rPr>
+      </w:pPr>
+      <w:r>
+        <w:rPr>
+          <w:b/>
+          <w:bCs/>
+          <w:lang w:val="pl-PL"/>
+        </w:rPr>
+        <w:t>Stopień szkodliwości:</w:t>
+      </w:r>
+      <w:r>
+        <w:rPr>
+          <w:lang w:val="pl-PL"/>
+        </w:rPr>
+        <w:t> bardzo duży</w:t>
+      </w:r>
+    </w:p>
+    <w:p>
+      <w:pPr>
+        <w:numPr>
+          <w:ilvl w:val="0"/>
+          <w:numId w:val="31"/>
+        </w:numPr>
+        <w:rPr>
+          <w:lang w:val="pl-PL"/>
+        </w:rPr>
+      </w:pPr>
+      <w:r>
+        <w:rPr>
+          <w:b/>
+          <w:bCs/>
+          <w:lang w:val="pl-PL"/>
+        </w:rPr>
+        <w:t>Propozycja metod zapobiegania:</w:t>
+      </w:r>
+      <w:r>
+        <w:rPr>
+          <w:lang w:val="pl-PL"/>
+        </w:rPr>
+        <w:t> regularne tworzenie kopii zapasowych bazy danych, przechowywanie backupów na osobnym nośniku, testowe odtwarzanie kopii, stosowanie transakcji przy zmianie statusów rezerwacji</w:t>
+      </w:r>
+    </w:p>
+    <w:p>
+      <w:pPr>
+        <w:numPr>
+          <w:ilvl w:val="0"/>
+          <w:numId w:val="31"/>
+        </w:numPr>
+        <w:rPr>
+          <w:lang w:val="pl-PL"/>
+        </w:rPr>
+      </w:pPr>
+      <w:r>
+        <w:rPr>
+          <w:b/>
+          <w:bCs/>
+          <w:lang w:val="pl-PL"/>
+        </w:rPr>
+        <w:t>Plan awaryjny:</w:t>
+      </w:r>
+    </w:p>
+    <w:p>
+      <w:pPr>
+        <w:numPr>
+          <w:ilvl w:val="1"/>
+          <w:numId w:val="31"/>
+        </w:numPr>
+        <w:rPr>
+          <w:lang w:val="pl-PL"/>
+        </w:rPr>
+      </w:pPr>
+      <w:r>
+        <w:rPr>
+          <w:lang w:val="pl-PL"/>
+        </w:rPr>
+        <w:t>Ustalenie zakresu i momentu awarii</w:t>
+      </w:r>
+    </w:p>
+    <w:p>
+      <w:pPr>
+        <w:numPr>
+          <w:ilvl w:val="1"/>
+          <w:numId w:val="31"/>
+        </w:numPr>
+        <w:rPr>
+          <w:lang w:val="pl-PL"/>
+        </w:rPr>
+      </w:pPr>
+      <w:r>
+        <w:rPr>
+          <w:lang w:val="pl-PL"/>
+        </w:rPr>
+        <w:t>Przywrócenie bazy danych z ostatniej kopii zapasowej</w:t>
+      </w:r>
+    </w:p>
+    <w:p>
+      <w:pPr>
+        <w:numPr>
+          <w:ilvl w:val="1"/>
+          <w:numId w:val="31"/>
+        </w:numPr>
+        <w:rPr>
+          <w:lang w:val="pl-PL"/>
+        </w:rPr>
+      </w:pPr>
+      <w:r>
+        <w:rPr>
+          <w:lang w:val="pl-PL"/>
+        </w:rPr>
+        <w:t>Ręczne uzupełnienie brakujących danych na podstawie rejestru papierowego</w:t>
+      </w:r>
+    </w:p>
+    <w:p>
+      <w:pPr>
+        <w:numPr>
+          <w:ilvl w:val="1"/>
+          <w:numId w:val="31"/>
+        </w:numPr>
+        <w:rPr>
+          <w:lang w:val="pl-PL"/>
+        </w:rPr>
+      </w:pPr>
+      <w:r>
+        <w:rPr>
+          <w:lang w:val="pl-PL"/>
+        </w:rPr>
+        <w:t>Weryfikacja poprawności danych po przywróceniu</w:t>
+      </w:r>
+    </w:p>
+    <w:p/>
+    <w:p>
+      <w:pPr>
+        <w:rPr>
+          <w:lang w:val="pl-PL"/>
+        </w:rPr>
+      </w:pPr>
+      <w:r>
+        <w:rPr>
+          <w:b/>
+          <w:bCs/>
+          <w:lang w:val="pl-PL"/>
+        </w:rPr>
+        <w:t>4. Wyciek danych osobowych klientów (np. numer PESEL, dane kontaktowe)</w:t>
+      </w:r>
+    </w:p>
+    <w:p>
+      <w:pPr>
+        <w:numPr>
+          <w:ilvl w:val="0"/>
+          <w:numId w:val="32"/>
+        </w:numPr>
+        <w:rPr>
+          <w:lang w:val="pl-PL"/>
+        </w:rPr>
+      </w:pPr>
+      <w:r>
+        <w:rPr>
+          <w:b/>
+          <w:bCs/>
+          <w:lang w:val="pl-PL"/>
+        </w:rPr>
+        <w:t>Prawdopodobieństwo wystąpienia:</w:t>
+      </w:r>
+      <w:r>
+        <w:rPr>
+          <w:lang w:val="pl-PL"/>
+        </w:rPr>
+        <w:t> niskie</w:t>
+      </w:r>
+    </w:p>
+    <w:p>
+      <w:pPr>
+        <w:numPr>
+          <w:ilvl w:val="0"/>
+          <w:numId w:val="32"/>
+        </w:numPr>
+        <w:rPr>
+          <w:lang w:val="pl-PL"/>
+        </w:rPr>
+      </w:pPr>
+      <w:r>
+        <w:rPr>
+          <w:b/>
+          <w:bCs/>
+          <w:lang w:val="pl-PL"/>
+        </w:rPr>
+        <w:t>Stopień szkodliwości:</w:t>
+      </w:r>
+      <w:r>
+        <w:rPr>
+          <w:lang w:val="pl-PL"/>
+        </w:rPr>
+        <w:t> bardzo duży</w:t>
+      </w:r>
+    </w:p>
+    <w:p>
+      <w:pPr>
+        <w:numPr>
+          <w:ilvl w:val="0"/>
+          <w:numId w:val="32"/>
+        </w:numPr>
+        <w:rPr>
+          <w:lang w:val="pl-PL"/>
+        </w:rPr>
+      </w:pPr>
+      <w:r>
+        <w:rPr>
+          <w:b/>
+          <w:bCs/>
+          <w:lang w:val="pl-PL"/>
+        </w:rPr>
+        <w:t>Propozycja metod zapobiegania:</w:t>
+      </w:r>
+      <w:r>
+        <w:rPr>
+          <w:lang w:val="pl-PL"/>
+        </w:rPr>
+        <w:t> szyfrowanie połączeń HTTPS, uwierzytelnianie użytkowników, ograniczenie uprawnień (klient/instruktor/administrator), nadzór nad osobami z dostępem do bazy, regularna zmiana haseł administratorów</w:t>
+      </w:r>
+    </w:p>
+    <w:p>
+      <w:pPr>
+        <w:numPr>
+          <w:ilvl w:val="0"/>
+          <w:numId w:val="32"/>
+        </w:numPr>
+        <w:rPr>
+          <w:lang w:val="pl-PL"/>
+        </w:rPr>
+      </w:pPr>
+      <w:r>
+        <w:rPr>
+          <w:b/>
+          <w:bCs/>
+          <w:lang w:val="pl-PL"/>
+        </w:rPr>
+        <w:t>Plan awaryjny:</w:t>
+      </w:r>
+    </w:p>
+    <w:p>
+      <w:pPr>
+        <w:numPr>
+          <w:ilvl w:val="1"/>
+          <w:numId w:val="32"/>
+        </w:numPr>
+        <w:rPr>
+          <w:lang w:val="pl-PL"/>
+        </w:rPr>
+      </w:pPr>
+      <w:r>
+        <w:rPr>
+          <w:lang w:val="pl-PL"/>
+        </w:rPr>
+        <w:t>Odcięcie dostępu do systemu od strony zewnętrznej (jeśli to konieczne)</w:t>
+      </w:r>
+    </w:p>
+    <w:p>
+      <w:pPr>
+        <w:numPr>
+          <w:ilvl w:val="1"/>
+          <w:numId w:val="32"/>
+        </w:numPr>
+        <w:rPr>
+          <w:lang w:val="pl-PL"/>
+        </w:rPr>
+      </w:pPr>
+      <w:r>
+        <w:rPr>
+          <w:lang w:val="pl-PL"/>
+        </w:rPr>
+        <w:t>Ustalenie źródła i zakresu wycieku</w:t>
+      </w:r>
+    </w:p>
+    <w:p>
+      <w:pPr>
+        <w:numPr>
+          <w:ilvl w:val="1"/>
+          <w:numId w:val="32"/>
+        </w:numPr>
+        <w:rPr>
+          <w:lang w:val="pl-PL"/>
+        </w:rPr>
+      </w:pPr>
+      <w:r>
+        <w:rPr>
+          <w:lang w:val="pl-PL"/>
+        </w:rPr>
+        <w:t>Współpraca z administratorem IT</w:t>
+      </w:r>
+    </w:p>
+    <w:p>
+      <w:pPr>
+        <w:numPr>
+          <w:ilvl w:val="1"/>
+          <w:numId w:val="32"/>
+        </w:numPr>
+        <w:rPr>
+          <w:lang w:val="pl-PL"/>
+        </w:rPr>
+      </w:pPr>
+      <w:r>
+        <w:rPr>
+          <w:lang w:val="pl-PL"/>
+        </w:rPr>
+        <w:t>Zmiana haseł i zabezpieczenie podatnych elementów systemu</w:t>
+      </w:r>
+    </w:p>
+    <w:p>
+      <w:pPr>
+        <w:ind w:left="1080"/>
+        <w:rPr>
+          <w:lang w:val="pl-PL"/>
+        </w:rPr>
+      </w:pPr>
+    </w:p>
+    <w:p>
+      <w:pPr>
+        <w:rPr>
+          <w:lang w:val="pl-PL"/>
+        </w:rPr>
+      </w:pPr>
+      <w:r>
+        <w:rPr>
+          <w:b/>
+          <w:bCs/>
+          <w:lang w:val="pl-PL"/>
+        </w:rPr>
+        <w:t>6. Rozbieżność danych magazynowych (amunicja, broń) z rzeczywistym stanem po sesji</w:t>
+      </w:r>
+    </w:p>
+    <w:p>
+      <w:pPr>
+        <w:numPr>
+          <w:ilvl w:val="0"/>
+          <w:numId w:val="33"/>
+        </w:numPr>
+        <w:rPr>
+          <w:lang w:val="pl-PL"/>
+        </w:rPr>
+      </w:pPr>
+      <w:r>
+        <w:rPr>
+          <w:b/>
+          <w:bCs/>
+          <w:lang w:val="pl-PL"/>
+        </w:rPr>
+        <w:t>Prawdopodobieństwo wystąpienia:</w:t>
+      </w:r>
+      <w:r>
+        <w:rPr>
+          <w:lang w:val="pl-PL"/>
+        </w:rPr>
+        <w:t> średnie</w:t>
+      </w:r>
+    </w:p>
+    <w:p>
+      <w:pPr>
+        <w:numPr>
+          <w:ilvl w:val="0"/>
+          <w:numId w:val="33"/>
+        </w:numPr>
+        <w:rPr>
+          <w:lang w:val="pl-PL"/>
+        </w:rPr>
+      </w:pPr>
+      <w:r>
+        <w:rPr>
+          <w:b/>
+          <w:bCs/>
+          <w:lang w:val="pl-PL"/>
+        </w:rPr>
+        <w:t>Stopień szkodliwości:</w:t>
+      </w:r>
+      <w:r>
+        <w:rPr>
+          <w:lang w:val="pl-PL"/>
+        </w:rPr>
+        <w:t> duży</w:t>
+      </w:r>
+    </w:p>
+    <w:p>
+      <w:pPr>
+        <w:numPr>
+          <w:ilvl w:val="0"/>
+          <w:numId w:val="33"/>
+        </w:numPr>
+        <w:rPr>
+          <w:lang w:val="pl-PL"/>
+        </w:rPr>
+      </w:pPr>
+      <w:r>
+        <w:rPr>
+          <w:b/>
+          <w:bCs/>
+          <w:lang w:val="pl-PL"/>
+        </w:rPr>
+        <w:t>Propozycja metod zapobiegania:</w:t>
+      </w:r>
+      <w:r>
+        <w:rPr>
+          <w:lang w:val="pl-PL"/>
+        </w:rPr>
+        <w:t xml:space="preserve"> obowiązkowe podawanie zużycia amunicji przy </w:t>
+      </w:r>
+      <w:proofErr w:type="spellStart"/>
+      <w:r>
+        <w:rPr>
+          <w:lang w:val="pl-PL"/>
+        </w:rPr>
+        <w:t>check</w:t>
+      </w:r>
+      <w:proofErr w:type="spellEnd"/>
+      <w:r>
+        <w:rPr>
+          <w:lang w:val="pl-PL"/>
+        </w:rPr>
+        <w:t>-out, powiązanie zużycia z obiektem </w:t>
+      </w:r>
+      <w:proofErr w:type="spellStart"/>
+      <w:r>
+        <w:rPr>
+          <w:lang w:val="pl-PL"/>
+        </w:rPr>
+        <w:t>SesjaStrzelecka</w:t>
+      </w:r>
+      <w:proofErr w:type="spellEnd"/>
+      <w:r>
+        <w:rPr>
+          <w:lang w:val="pl-PL"/>
+        </w:rPr>
+        <w:t>, okresowe kontrole magazynowe, walidacja wprowadzanych danych</w:t>
+      </w:r>
+    </w:p>
+    <w:p>
+      <w:pPr>
+        <w:numPr>
+          <w:ilvl w:val="0"/>
+          <w:numId w:val="33"/>
+        </w:numPr>
+        <w:rPr>
+          <w:lang w:val="pl-PL"/>
+        </w:rPr>
+      </w:pPr>
+      <w:r>
+        <w:rPr>
+          <w:b/>
+          <w:bCs/>
+          <w:lang w:val="pl-PL"/>
+        </w:rPr>
+        <w:t>Plan awaryjny:</w:t>
+      </w:r>
+    </w:p>
+    <w:p>
+      <w:pPr>
+        <w:numPr>
+          <w:ilvl w:val="1"/>
+          <w:numId w:val="33"/>
+        </w:numPr>
+        <w:rPr>
+          <w:lang w:val="pl-PL"/>
+        </w:rPr>
+      </w:pPr>
+      <w:r>
+        <w:rPr>
+          <w:lang w:val="pl-PL"/>
+        </w:rPr>
+        <w:t>Wstrzymanie wydawania sprzętu do czasu wyjaśnienia</w:t>
+      </w:r>
+    </w:p>
+    <w:p>
+      <w:pPr>
+        <w:numPr>
+          <w:ilvl w:val="1"/>
+          <w:numId w:val="33"/>
+        </w:numPr>
+        <w:rPr>
+          <w:lang w:val="pl-PL"/>
+        </w:rPr>
+      </w:pPr>
+      <w:r>
+        <w:rPr>
+          <w:lang w:val="pl-PL"/>
+        </w:rPr>
+        <w:t>Inwentaryzacja manualna magazynu</w:t>
+      </w:r>
+    </w:p>
+    <w:p>
+      <w:pPr>
+        <w:numPr>
+          <w:ilvl w:val="1"/>
+          <w:numId w:val="33"/>
+        </w:numPr>
+        <w:rPr>
+          <w:lang w:val="pl-PL"/>
+        </w:rPr>
+      </w:pPr>
+      <w:r>
+        <w:rPr>
+          <w:lang w:val="pl-PL"/>
+        </w:rPr>
+        <w:t>Korekta stanów w systemie</w:t>
+      </w:r>
+    </w:p>
+    <w:p>
+      <w:pPr>
+        <w:numPr>
+          <w:ilvl w:val="1"/>
+          <w:numId w:val="33"/>
+        </w:numPr>
+        <w:rPr>
+          <w:lang w:val="pl-PL"/>
+        </w:rPr>
+      </w:pPr>
+      <w:r>
+        <w:rPr>
+          <w:lang w:val="pl-PL"/>
+        </w:rPr>
+        <w:t>Analiza przyczyny rozbieżności</w:t>
+      </w:r>
+    </w:p>
+    <w:p>
+      <w:pPr>
+        <w:ind w:left="1080"/>
+        <w:rPr>
+          <w:lang w:val="pl-PL"/>
+        </w:rPr>
+      </w:pPr>
+    </w:p>
+    <w:p>
+      <w:pPr>
+        <w:rPr>
+          <w:lang w:val="pl-PL"/>
+        </w:rPr>
+      </w:pPr>
+      <w:r>
+        <w:rPr>
+          <w:b/>
+          <w:bCs/>
+          <w:lang w:val="pl-PL"/>
+        </w:rPr>
+        <w:t>7. Brak połączenia sieciowego między stacją instruktora a serwerem (awaria LAN)</w:t>
+      </w:r>
+    </w:p>
+    <w:p>
+      <w:pPr>
+        <w:numPr>
+          <w:ilvl w:val="0"/>
+          <w:numId w:val="34"/>
+        </w:numPr>
+        <w:rPr>
+          <w:lang w:val="pl-PL"/>
+        </w:rPr>
+      </w:pPr>
+      <w:r>
+        <w:rPr>
+          <w:b/>
+          <w:bCs/>
+          <w:lang w:val="pl-PL"/>
+        </w:rPr>
+        <w:t>Prawdopodobieństwo wystąpienia:</w:t>
+      </w:r>
+      <w:r>
+        <w:rPr>
+          <w:lang w:val="pl-PL"/>
+        </w:rPr>
+        <w:t> niskie</w:t>
+      </w:r>
+    </w:p>
+    <w:p>
+      <w:pPr>
+        <w:numPr>
+          <w:ilvl w:val="0"/>
+          <w:numId w:val="34"/>
+        </w:numPr>
+        <w:rPr>
+          <w:lang w:val="pl-PL"/>
+        </w:rPr>
+      </w:pPr>
+      <w:r>
+        <w:rPr>
+          <w:b/>
+          <w:bCs/>
+          <w:lang w:val="pl-PL"/>
+        </w:rPr>
+        <w:t>Stopień szkodliwości:</w:t>
+      </w:r>
+      <w:r>
+        <w:rPr>
+          <w:lang w:val="pl-PL"/>
+        </w:rPr>
+        <w:t> średni</w:t>
+      </w:r>
+    </w:p>
+    <w:p>
+      <w:pPr>
+        <w:numPr>
+          <w:ilvl w:val="0"/>
+          <w:numId w:val="34"/>
+        </w:numPr>
+        <w:rPr>
+          <w:lang w:val="pl-PL"/>
+        </w:rPr>
+      </w:pPr>
+      <w:r>
+        <w:rPr>
+          <w:b/>
+          <w:bCs/>
+          <w:lang w:val="pl-PL"/>
+        </w:rPr>
+        <w:t>Propozycja metod zapobiegania:</w:t>
+      </w:r>
+      <w:r>
+        <w:rPr>
+          <w:lang w:val="pl-PL"/>
+        </w:rPr>
+        <w:t> utrzymanie stabilnej sieci lokalnej Ethernet, okresowa kontrola łączności przed otwarciem strzelnicy, dokumentacja procedur awaryjnych</w:t>
+      </w:r>
+    </w:p>
+    <w:p>
+      <w:pPr>
+        <w:numPr>
+          <w:ilvl w:val="0"/>
+          <w:numId w:val="34"/>
+        </w:numPr>
+        <w:rPr>
+          <w:lang w:val="pl-PL"/>
+        </w:rPr>
+      </w:pPr>
+      <w:r>
+        <w:rPr>
+          <w:b/>
+          <w:bCs/>
+          <w:lang w:val="pl-PL"/>
+        </w:rPr>
+        <w:t>Plan awaryjny:</w:t>
+      </w:r>
+    </w:p>
+    <w:p>
+      <w:pPr>
+        <w:numPr>
+          <w:ilvl w:val="1"/>
+          <w:numId w:val="34"/>
+        </w:numPr>
+        <w:rPr>
+          <w:lang w:val="pl-PL"/>
+        </w:rPr>
+      </w:pPr>
+      <w:r>
+        <w:rPr>
+          <w:lang w:val="pl-PL"/>
+        </w:rPr>
+        <w:t>Sprawdzenie stanu sieci i urządzeń sieciowych</w:t>
+      </w:r>
+    </w:p>
+    <w:p>
+      <w:pPr>
+        <w:numPr>
+          <w:ilvl w:val="1"/>
+          <w:numId w:val="34"/>
+        </w:numPr>
+        <w:rPr>
+          <w:lang w:val="pl-PL"/>
+        </w:rPr>
+      </w:pPr>
+      <w:r>
+        <w:rPr>
+          <w:lang w:val="pl-PL"/>
+        </w:rPr>
+        <w:t>Przejście na obsługę manualną do czasu przywrócenia łączności</w:t>
+      </w:r>
+    </w:p>
+    <w:p>
+      <w:pPr>
+        <w:numPr>
+          <w:ilvl w:val="1"/>
+          <w:numId w:val="34"/>
+        </w:numPr>
+        <w:rPr>
+          <w:lang w:val="pl-PL"/>
+        </w:rPr>
+      </w:pPr>
+      <w:r>
+        <w:rPr>
+          <w:lang w:val="pl-PL"/>
+        </w:rPr>
+        <w:t>Uzupełnienie danych w systemie po przywróceniu połączenia</w:t>
+      </w:r>
+    </w:p>
     <w:p/>
     <w:sectPr>
       <w:pgSz w:w="11909" w:h="16834"/>
@@ -8655,6 +11009,151 @@
     </w:lvl>
   </w:abstractNum>
   <w:abstractNum w:abstractNumId="6" w15:restartNumberingAfterBreak="0">
+    <w:nsid w:val="0DEE2795"/>
+    <w:multiLevelType w:val="multilevel"/>
+    <w:tmpl w:val="8216258A"/>
+    <w:lvl w:ilvl="0">
+      <w:start w:val="1"/>
+      <w:numFmt w:val="bullet"/>
+      <w:lvlText w:val=""/>
+      <w:lvlJc w:val="left"/>
+      <w:pPr>
+        <w:tabs>
+          <w:tab w:val="num" w:pos="720"/>
+        </w:tabs>
+        <w:ind w:left="720" w:hanging="360"/>
+      </w:pPr>
+      <w:rPr>
+        <w:rFonts w:ascii="Symbol" w:hAnsi="Symbol" w:hint="default"/>
+        <w:sz w:val="20"/>
+      </w:rPr>
+    </w:lvl>
+    <w:lvl w:ilvl="1">
+      <w:start w:val="1"/>
+      <w:numFmt w:val="decimal"/>
+      <w:lvlText w:val="%2."/>
+      <w:lvlJc w:val="left"/>
+      <w:pPr>
+        <w:tabs>
+          <w:tab w:val="num" w:pos="1440"/>
+        </w:tabs>
+        <w:ind w:left="1440" w:hanging="360"/>
+      </w:pPr>
+    </w:lvl>
+    <w:lvl w:ilvl="2" w:tentative="1">
+      <w:start w:val="1"/>
+      <w:numFmt w:val="bullet"/>
+      <w:lvlText w:val=""/>
+      <w:lvlJc w:val="left"/>
+      <w:pPr>
+        <w:tabs>
+          <w:tab w:val="num" w:pos="2160"/>
+        </w:tabs>
+        <w:ind w:left="2160" w:hanging="360"/>
+      </w:pPr>
+      <w:rPr>
+        <w:rFonts w:ascii="Symbol" w:hAnsi="Symbol" w:hint="default"/>
+        <w:sz w:val="20"/>
+      </w:rPr>
+    </w:lvl>
+    <w:lvl w:ilvl="3" w:tentative="1">
+      <w:start w:val="1"/>
+      <w:numFmt w:val="bullet"/>
+      <w:lvlText w:val=""/>
+      <w:lvlJc w:val="left"/>
+      <w:pPr>
+        <w:tabs>
+          <w:tab w:val="num" w:pos="2880"/>
+        </w:tabs>
+        <w:ind w:left="2880" w:hanging="360"/>
+      </w:pPr>
+      <w:rPr>
+        <w:rFonts w:ascii="Symbol" w:hAnsi="Symbol" w:hint="default"/>
+        <w:sz w:val="20"/>
+      </w:rPr>
+    </w:lvl>
+    <w:lvl w:ilvl="4" w:tentative="1">
+      <w:start w:val="1"/>
+      <w:numFmt w:val="bullet"/>
+      <w:lvlText w:val=""/>
+      <w:lvlJc w:val="left"/>
+      <w:pPr>
+        <w:tabs>
+          <w:tab w:val="num" w:pos="3600"/>
+        </w:tabs>
+        <w:ind w:left="3600" w:hanging="360"/>
+      </w:pPr>
+      <w:rPr>
+        <w:rFonts w:ascii="Symbol" w:hAnsi="Symbol" w:hint="default"/>
+        <w:sz w:val="20"/>
+      </w:rPr>
+    </w:lvl>
+    <w:lvl w:ilvl="5" w:tentative="1">
+      <w:start w:val="1"/>
+      <w:numFmt w:val="bullet"/>
+      <w:lvlText w:val=""/>
+      <w:lvlJc w:val="left"/>
+      <w:pPr>
+        <w:tabs>
+          <w:tab w:val="num" w:pos="4320"/>
+        </w:tabs>
+        <w:ind w:left="4320" w:hanging="360"/>
+      </w:pPr>
+      <w:rPr>
+        <w:rFonts w:ascii="Symbol" w:hAnsi="Symbol" w:hint="default"/>
+        <w:sz w:val="20"/>
+      </w:rPr>
+    </w:lvl>
+    <w:lvl w:ilvl="6" w:tentative="1">
+      <w:start w:val="1"/>
+      <w:numFmt w:val="bullet"/>
+      <w:lvlText w:val=""/>
+      <w:lvlJc w:val="left"/>
+      <w:pPr>
+        <w:tabs>
+          <w:tab w:val="num" w:pos="5040"/>
+        </w:tabs>
+        <w:ind w:left="5040" w:hanging="360"/>
+      </w:pPr>
+      <w:rPr>
+        <w:rFonts w:ascii="Symbol" w:hAnsi="Symbol" w:hint="default"/>
+        <w:sz w:val="20"/>
+      </w:rPr>
+    </w:lvl>
+    <w:lvl w:ilvl="7" w:tentative="1">
+      <w:start w:val="1"/>
+      <w:numFmt w:val="bullet"/>
+      <w:lvlText w:val=""/>
+      <w:lvlJc w:val="left"/>
+      <w:pPr>
+        <w:tabs>
+          <w:tab w:val="num" w:pos="5760"/>
+        </w:tabs>
+        <w:ind w:left="5760" w:hanging="360"/>
+      </w:pPr>
+      <w:rPr>
+        <w:rFonts w:ascii="Symbol" w:hAnsi="Symbol" w:hint="default"/>
+        <w:sz w:val="20"/>
+      </w:rPr>
+    </w:lvl>
+    <w:lvl w:ilvl="8" w:tentative="1">
+      <w:start w:val="1"/>
+      <w:numFmt w:val="bullet"/>
+      <w:lvlText w:val=""/>
+      <w:lvlJc w:val="left"/>
+      <w:pPr>
+        <w:tabs>
+          <w:tab w:val="num" w:pos="6480"/>
+        </w:tabs>
+        <w:ind w:left="6480" w:hanging="360"/>
+      </w:pPr>
+      <w:rPr>
+        <w:rFonts w:ascii="Symbol" w:hAnsi="Symbol" w:hint="default"/>
+        <w:sz w:val="20"/>
+      </w:rPr>
+    </w:lvl>
+  </w:abstractNum>
+  <w:abstractNum w:abstractNumId="7" w15:restartNumberingAfterBreak="0">
     <w:nsid w:val="110E6C06"/>
     <w:multiLevelType w:val="multilevel"/>
     <w:tmpl w:val="FA2064DE"/>
@@ -8803,7 +11302,7 @@
       </w:rPr>
     </w:lvl>
   </w:abstractNum>
-  <w:abstractNum w:abstractNumId="7" w15:restartNumberingAfterBreak="0">
+  <w:abstractNum w:abstractNumId="8" w15:restartNumberingAfterBreak="0">
     <w:nsid w:val="125B5BE0"/>
     <w:multiLevelType w:val="multilevel"/>
     <w:tmpl w:val="EC8AE780"/>
@@ -8952,7 +11451,7 @@
       </w:rPr>
     </w:lvl>
   </w:abstractNum>
-  <w:abstractNum w:abstractNumId="8" w15:restartNumberingAfterBreak="0">
+  <w:abstractNum w:abstractNumId="9" w15:restartNumberingAfterBreak="0">
     <w:nsid w:val="14704865"/>
     <w:multiLevelType w:val="multilevel"/>
     <w:tmpl w:val="3AB47482"/>
@@ -9101,7 +11600,7 @@
       </w:rPr>
     </w:lvl>
   </w:abstractNum>
-  <w:abstractNum w:abstractNumId="9" w15:restartNumberingAfterBreak="0">
+  <w:abstractNum w:abstractNumId="10" w15:restartNumberingAfterBreak="0">
     <w:nsid w:val="155A5289"/>
     <w:multiLevelType w:val="multilevel"/>
     <w:tmpl w:val="5754B56E"/>
@@ -9250,7 +11749,7 @@
       </w:rPr>
     </w:lvl>
   </w:abstractNum>
-  <w:abstractNum w:abstractNumId="10" w15:restartNumberingAfterBreak="0">
+  <w:abstractNum w:abstractNumId="11" w15:restartNumberingAfterBreak="0">
     <w:nsid w:val="1B9016D0"/>
     <w:multiLevelType w:val="multilevel"/>
     <w:tmpl w:val="BE428F12"/>
@@ -9395,7 +11894,7 @@
       </w:rPr>
     </w:lvl>
   </w:abstractNum>
-  <w:abstractNum w:abstractNumId="11" w15:restartNumberingAfterBreak="0">
+  <w:abstractNum w:abstractNumId="12" w15:restartNumberingAfterBreak="0">
     <w:nsid w:val="2C0876D3"/>
     <w:multiLevelType w:val="multilevel"/>
     <w:tmpl w:val="851E5E6A"/>
@@ -9544,7 +12043,7 @@
       </w:rPr>
     </w:lvl>
   </w:abstractNum>
-  <w:abstractNum w:abstractNumId="12" w15:restartNumberingAfterBreak="0">
+  <w:abstractNum w:abstractNumId="13" w15:restartNumberingAfterBreak="0">
     <w:nsid w:val="2CA15019"/>
     <w:multiLevelType w:val="multilevel"/>
     <w:tmpl w:val="1F2AD544"/>
@@ -9693,7 +12192,7 @@
       </w:rPr>
     </w:lvl>
   </w:abstractNum>
-  <w:abstractNum w:abstractNumId="13" w15:restartNumberingAfterBreak="0">
+  <w:abstractNum w:abstractNumId="14" w15:restartNumberingAfterBreak="0">
     <w:nsid w:val="2D751BDF"/>
     <w:multiLevelType w:val="multilevel"/>
     <w:tmpl w:val="FE7A3A3E"/>
@@ -9842,7 +12341,7 @@
       </w:rPr>
     </w:lvl>
   </w:abstractNum>
-  <w:abstractNum w:abstractNumId="14" w15:restartNumberingAfterBreak="0">
+  <w:abstractNum w:abstractNumId="15" w15:restartNumberingAfterBreak="0">
     <w:nsid w:val="2F482656"/>
     <w:multiLevelType w:val="multilevel"/>
     <w:tmpl w:val="E960CF18"/>
@@ -9991,7 +12490,7 @@
       </w:rPr>
     </w:lvl>
   </w:abstractNum>
-  <w:abstractNum w:abstractNumId="15" w15:restartNumberingAfterBreak="0">
+  <w:abstractNum w:abstractNumId="16" w15:restartNumberingAfterBreak="0">
     <w:nsid w:val="36761323"/>
     <w:multiLevelType w:val="multilevel"/>
     <w:tmpl w:val="9B3A65EE"/>
@@ -10140,7 +12639,7 @@
       </w:rPr>
     </w:lvl>
   </w:abstractNum>
-  <w:abstractNum w:abstractNumId="16" w15:restartNumberingAfterBreak="0">
+  <w:abstractNum w:abstractNumId="17" w15:restartNumberingAfterBreak="0">
     <w:nsid w:val="384E59F2"/>
     <w:multiLevelType w:val="multilevel"/>
     <w:tmpl w:val="E6804330"/>
@@ -10285,7 +12784,297 @@
       </w:rPr>
     </w:lvl>
   </w:abstractNum>
-  <w:abstractNum w:abstractNumId="17" w15:restartNumberingAfterBreak="0">
+  <w:abstractNum w:abstractNumId="18" w15:restartNumberingAfterBreak="0">
+    <w:nsid w:val="4282426B"/>
+    <w:multiLevelType w:val="multilevel"/>
+    <w:tmpl w:val="66D67DB8"/>
+    <w:lvl w:ilvl="0">
+      <w:start w:val="1"/>
+      <w:numFmt w:val="bullet"/>
+      <w:lvlText w:val=""/>
+      <w:lvlJc w:val="left"/>
+      <w:pPr>
+        <w:tabs>
+          <w:tab w:val="num" w:pos="720"/>
+        </w:tabs>
+        <w:ind w:left="720" w:hanging="360"/>
+      </w:pPr>
+      <w:rPr>
+        <w:rFonts w:ascii="Symbol" w:hAnsi="Symbol" w:hint="default"/>
+        <w:sz w:val="20"/>
+      </w:rPr>
+    </w:lvl>
+    <w:lvl w:ilvl="1">
+      <w:start w:val="1"/>
+      <w:numFmt w:val="decimal"/>
+      <w:lvlText w:val="%2."/>
+      <w:lvlJc w:val="left"/>
+      <w:pPr>
+        <w:tabs>
+          <w:tab w:val="num" w:pos="1440"/>
+        </w:tabs>
+        <w:ind w:left="1440" w:hanging="360"/>
+      </w:pPr>
+    </w:lvl>
+    <w:lvl w:ilvl="2" w:tentative="1">
+      <w:start w:val="1"/>
+      <w:numFmt w:val="bullet"/>
+      <w:lvlText w:val=""/>
+      <w:lvlJc w:val="left"/>
+      <w:pPr>
+        <w:tabs>
+          <w:tab w:val="num" w:pos="2160"/>
+        </w:tabs>
+        <w:ind w:left="2160" w:hanging="360"/>
+      </w:pPr>
+      <w:rPr>
+        <w:rFonts w:ascii="Symbol" w:hAnsi="Symbol" w:hint="default"/>
+        <w:sz w:val="20"/>
+      </w:rPr>
+    </w:lvl>
+    <w:lvl w:ilvl="3" w:tentative="1">
+      <w:start w:val="1"/>
+      <w:numFmt w:val="bullet"/>
+      <w:lvlText w:val=""/>
+      <w:lvlJc w:val="left"/>
+      <w:pPr>
+        <w:tabs>
+          <w:tab w:val="num" w:pos="2880"/>
+        </w:tabs>
+        <w:ind w:left="2880" w:hanging="360"/>
+      </w:pPr>
+      <w:rPr>
+        <w:rFonts w:ascii="Symbol" w:hAnsi="Symbol" w:hint="default"/>
+        <w:sz w:val="20"/>
+      </w:rPr>
+    </w:lvl>
+    <w:lvl w:ilvl="4" w:tentative="1">
+      <w:start w:val="1"/>
+      <w:numFmt w:val="bullet"/>
+      <w:lvlText w:val=""/>
+      <w:lvlJc w:val="left"/>
+      <w:pPr>
+        <w:tabs>
+          <w:tab w:val="num" w:pos="3600"/>
+        </w:tabs>
+        <w:ind w:left="3600" w:hanging="360"/>
+      </w:pPr>
+      <w:rPr>
+        <w:rFonts w:ascii="Symbol" w:hAnsi="Symbol" w:hint="default"/>
+        <w:sz w:val="20"/>
+      </w:rPr>
+    </w:lvl>
+    <w:lvl w:ilvl="5" w:tentative="1">
+      <w:start w:val="1"/>
+      <w:numFmt w:val="bullet"/>
+      <w:lvlText w:val=""/>
+      <w:lvlJc w:val="left"/>
+      <w:pPr>
+        <w:tabs>
+          <w:tab w:val="num" w:pos="4320"/>
+        </w:tabs>
+        <w:ind w:left="4320" w:hanging="360"/>
+      </w:pPr>
+      <w:rPr>
+        <w:rFonts w:ascii="Symbol" w:hAnsi="Symbol" w:hint="default"/>
+        <w:sz w:val="20"/>
+      </w:rPr>
+    </w:lvl>
+    <w:lvl w:ilvl="6" w:tentative="1">
+      <w:start w:val="1"/>
+      <w:numFmt w:val="bullet"/>
+      <w:lvlText w:val=""/>
+      <w:lvlJc w:val="left"/>
+      <w:pPr>
+        <w:tabs>
+          <w:tab w:val="num" w:pos="5040"/>
+        </w:tabs>
+        <w:ind w:left="5040" w:hanging="360"/>
+      </w:pPr>
+      <w:rPr>
+        <w:rFonts w:ascii="Symbol" w:hAnsi="Symbol" w:hint="default"/>
+        <w:sz w:val="20"/>
+      </w:rPr>
+    </w:lvl>
+    <w:lvl w:ilvl="7" w:tentative="1">
+      <w:start w:val="1"/>
+      <w:numFmt w:val="bullet"/>
+      <w:lvlText w:val=""/>
+      <w:lvlJc w:val="left"/>
+      <w:pPr>
+        <w:tabs>
+          <w:tab w:val="num" w:pos="5760"/>
+        </w:tabs>
+        <w:ind w:left="5760" w:hanging="360"/>
+      </w:pPr>
+      <w:rPr>
+        <w:rFonts w:ascii="Symbol" w:hAnsi="Symbol" w:hint="default"/>
+        <w:sz w:val="20"/>
+      </w:rPr>
+    </w:lvl>
+    <w:lvl w:ilvl="8" w:tentative="1">
+      <w:start w:val="1"/>
+      <w:numFmt w:val="bullet"/>
+      <w:lvlText w:val=""/>
+      <w:lvlJc w:val="left"/>
+      <w:pPr>
+        <w:tabs>
+          <w:tab w:val="num" w:pos="6480"/>
+        </w:tabs>
+        <w:ind w:left="6480" w:hanging="360"/>
+      </w:pPr>
+      <w:rPr>
+        <w:rFonts w:ascii="Symbol" w:hAnsi="Symbol" w:hint="default"/>
+        <w:sz w:val="20"/>
+      </w:rPr>
+    </w:lvl>
+  </w:abstractNum>
+  <w:abstractNum w:abstractNumId="19" w15:restartNumberingAfterBreak="0">
+    <w:nsid w:val="4A6427E9"/>
+    <w:multiLevelType w:val="multilevel"/>
+    <w:tmpl w:val="A26CB370"/>
+    <w:lvl w:ilvl="0">
+      <w:start w:val="1"/>
+      <w:numFmt w:val="bullet"/>
+      <w:lvlText w:val=""/>
+      <w:lvlJc w:val="left"/>
+      <w:pPr>
+        <w:tabs>
+          <w:tab w:val="num" w:pos="720"/>
+        </w:tabs>
+        <w:ind w:left="720" w:hanging="360"/>
+      </w:pPr>
+      <w:rPr>
+        <w:rFonts w:ascii="Symbol" w:hAnsi="Symbol" w:hint="default"/>
+        <w:sz w:val="20"/>
+      </w:rPr>
+    </w:lvl>
+    <w:lvl w:ilvl="1">
+      <w:start w:val="1"/>
+      <w:numFmt w:val="decimal"/>
+      <w:lvlText w:val="%2."/>
+      <w:lvlJc w:val="left"/>
+      <w:pPr>
+        <w:tabs>
+          <w:tab w:val="num" w:pos="1440"/>
+        </w:tabs>
+        <w:ind w:left="1440" w:hanging="360"/>
+      </w:pPr>
+    </w:lvl>
+    <w:lvl w:ilvl="2" w:tentative="1">
+      <w:start w:val="1"/>
+      <w:numFmt w:val="bullet"/>
+      <w:lvlText w:val=""/>
+      <w:lvlJc w:val="left"/>
+      <w:pPr>
+        <w:tabs>
+          <w:tab w:val="num" w:pos="2160"/>
+        </w:tabs>
+        <w:ind w:left="2160" w:hanging="360"/>
+      </w:pPr>
+      <w:rPr>
+        <w:rFonts w:ascii="Symbol" w:hAnsi="Symbol" w:hint="default"/>
+        <w:sz w:val="20"/>
+      </w:rPr>
+    </w:lvl>
+    <w:lvl w:ilvl="3" w:tentative="1">
+      <w:start w:val="1"/>
+      <w:numFmt w:val="bullet"/>
+      <w:lvlText w:val=""/>
+      <w:lvlJc w:val="left"/>
+      <w:pPr>
+        <w:tabs>
+          <w:tab w:val="num" w:pos="2880"/>
+        </w:tabs>
+        <w:ind w:left="2880" w:hanging="360"/>
+      </w:pPr>
+      <w:rPr>
+        <w:rFonts w:ascii="Symbol" w:hAnsi="Symbol" w:hint="default"/>
+        <w:sz w:val="20"/>
+      </w:rPr>
+    </w:lvl>
+    <w:lvl w:ilvl="4" w:tentative="1">
+      <w:start w:val="1"/>
+      <w:numFmt w:val="bullet"/>
+      <w:lvlText w:val=""/>
+      <w:lvlJc w:val="left"/>
+      <w:pPr>
+        <w:tabs>
+          <w:tab w:val="num" w:pos="3600"/>
+        </w:tabs>
+        <w:ind w:left="3600" w:hanging="360"/>
+      </w:pPr>
+      <w:rPr>
+        <w:rFonts w:ascii="Symbol" w:hAnsi="Symbol" w:hint="default"/>
+        <w:sz w:val="20"/>
+      </w:rPr>
+    </w:lvl>
+    <w:lvl w:ilvl="5" w:tentative="1">
+      <w:start w:val="1"/>
+      <w:numFmt w:val="bullet"/>
+      <w:lvlText w:val=""/>
+      <w:lvlJc w:val="left"/>
+      <w:pPr>
+        <w:tabs>
+          <w:tab w:val="num" w:pos="4320"/>
+        </w:tabs>
+        <w:ind w:left="4320" w:hanging="360"/>
+      </w:pPr>
+      <w:rPr>
+        <w:rFonts w:ascii="Symbol" w:hAnsi="Symbol" w:hint="default"/>
+        <w:sz w:val="20"/>
+      </w:rPr>
+    </w:lvl>
+    <w:lvl w:ilvl="6" w:tentative="1">
+      <w:start w:val="1"/>
+      <w:numFmt w:val="bullet"/>
+      <w:lvlText w:val=""/>
+      <w:lvlJc w:val="left"/>
+      <w:pPr>
+        <w:tabs>
+          <w:tab w:val="num" w:pos="5040"/>
+        </w:tabs>
+        <w:ind w:left="5040" w:hanging="360"/>
+      </w:pPr>
+      <w:rPr>
+        <w:rFonts w:ascii="Symbol" w:hAnsi="Symbol" w:hint="default"/>
+        <w:sz w:val="20"/>
+      </w:rPr>
+    </w:lvl>
+    <w:lvl w:ilvl="7" w:tentative="1">
+      <w:start w:val="1"/>
+      <w:numFmt w:val="bullet"/>
+      <w:lvlText w:val=""/>
+      <w:lvlJc w:val="left"/>
+      <w:pPr>
+        <w:tabs>
+          <w:tab w:val="num" w:pos="5760"/>
+        </w:tabs>
+        <w:ind w:left="5760" w:hanging="360"/>
+      </w:pPr>
+      <w:rPr>
+        <w:rFonts w:ascii="Symbol" w:hAnsi="Symbol" w:hint="default"/>
+        <w:sz w:val="20"/>
+      </w:rPr>
+    </w:lvl>
+    <w:lvl w:ilvl="8" w:tentative="1">
+      <w:start w:val="1"/>
+      <w:numFmt w:val="bullet"/>
+      <w:lvlText w:val=""/>
+      <w:lvlJc w:val="left"/>
+      <w:pPr>
+        <w:tabs>
+          <w:tab w:val="num" w:pos="6480"/>
+        </w:tabs>
+        <w:ind w:left="6480" w:hanging="360"/>
+      </w:pPr>
+      <w:rPr>
+        <w:rFonts w:ascii="Symbol" w:hAnsi="Symbol" w:hint="default"/>
+        <w:sz w:val="20"/>
+      </w:rPr>
+    </w:lvl>
+  </w:abstractNum>
+  <w:abstractNum w:abstractNumId="20" w15:restartNumberingAfterBreak="0">
     <w:nsid w:val="50366D62"/>
     <w:multiLevelType w:val="multilevel"/>
     <w:tmpl w:val="4364DAF2"/>
@@ -10434,7 +13223,7 @@
       </w:rPr>
     </w:lvl>
   </w:abstractNum>
-  <w:abstractNum w:abstractNumId="18" w15:restartNumberingAfterBreak="0">
+  <w:abstractNum w:abstractNumId="21" w15:restartNumberingAfterBreak="0">
     <w:nsid w:val="51185237"/>
     <w:multiLevelType w:val="multilevel"/>
     <w:tmpl w:val="E6804330"/>
@@ -10579,7 +13368,7 @@
       </w:rPr>
     </w:lvl>
   </w:abstractNum>
-  <w:abstractNum w:abstractNumId="19" w15:restartNumberingAfterBreak="0">
+  <w:abstractNum w:abstractNumId="22" w15:restartNumberingAfterBreak="0">
     <w:nsid w:val="525B3D4A"/>
     <w:multiLevelType w:val="multilevel"/>
     <w:tmpl w:val="1DB86164"/>
@@ -10728,7 +13517,7 @@
       </w:rPr>
     </w:lvl>
   </w:abstractNum>
-  <w:abstractNum w:abstractNumId="20" w15:restartNumberingAfterBreak="0">
+  <w:abstractNum w:abstractNumId="23" w15:restartNumberingAfterBreak="0">
     <w:nsid w:val="569671F2"/>
     <w:multiLevelType w:val="hybridMultilevel"/>
     <w:tmpl w:val="5934BD68"/>
@@ -10841,7 +13630,7 @@
       </w:rPr>
     </w:lvl>
   </w:abstractNum>
-  <w:abstractNum w:abstractNumId="21" w15:restartNumberingAfterBreak="0">
+  <w:abstractNum w:abstractNumId="24" w15:restartNumberingAfterBreak="0">
     <w:nsid w:val="5E332311"/>
     <w:multiLevelType w:val="multilevel"/>
     <w:tmpl w:val="FD56597C"/>
@@ -10990,7 +13779,7 @@
       </w:rPr>
     </w:lvl>
   </w:abstractNum>
-  <w:abstractNum w:abstractNumId="22" w15:restartNumberingAfterBreak="0">
+  <w:abstractNum w:abstractNumId="25" w15:restartNumberingAfterBreak="0">
     <w:nsid w:val="64A67214"/>
     <w:multiLevelType w:val="multilevel"/>
     <w:tmpl w:val="5832EF0A"/>
@@ -11139,7 +13928,7 @@
       </w:rPr>
     </w:lvl>
   </w:abstractNum>
-  <w:abstractNum w:abstractNumId="23" w15:restartNumberingAfterBreak="0">
+  <w:abstractNum w:abstractNumId="26" w15:restartNumberingAfterBreak="0">
     <w:nsid w:val="66C25ECD"/>
     <w:multiLevelType w:val="multilevel"/>
     <w:tmpl w:val="64B00C14"/>
@@ -11288,7 +14077,7 @@
       </w:rPr>
     </w:lvl>
   </w:abstractNum>
-  <w:abstractNum w:abstractNumId="24" w15:restartNumberingAfterBreak="0">
+  <w:abstractNum w:abstractNumId="27" w15:restartNumberingAfterBreak="0">
     <w:nsid w:val="6753371C"/>
     <w:multiLevelType w:val="multilevel"/>
     <w:tmpl w:val="DFB22E06"/>
@@ -11437,7 +14226,7 @@
       </w:rPr>
     </w:lvl>
   </w:abstractNum>
-  <w:abstractNum w:abstractNumId="25" w15:restartNumberingAfterBreak="0">
+  <w:abstractNum w:abstractNumId="28" w15:restartNumberingAfterBreak="0">
     <w:nsid w:val="68780586"/>
     <w:multiLevelType w:val="multilevel"/>
     <w:tmpl w:val="0D98D3BC"/>
@@ -11586,7 +14375,7 @@
       </w:rPr>
     </w:lvl>
   </w:abstractNum>
-  <w:abstractNum w:abstractNumId="26" w15:restartNumberingAfterBreak="0">
+  <w:abstractNum w:abstractNumId="29" w15:restartNumberingAfterBreak="0">
     <w:nsid w:val="705C59C3"/>
     <w:multiLevelType w:val="multilevel"/>
     <w:tmpl w:val="A17CC40E"/>
@@ -11699,7 +14488,297 @@
       </w:rPr>
     </w:lvl>
   </w:abstractNum>
-  <w:abstractNum w:abstractNumId="27" w15:restartNumberingAfterBreak="0">
+  <w:abstractNum w:abstractNumId="30" w15:restartNumberingAfterBreak="0">
+    <w:nsid w:val="72306529"/>
+    <w:multiLevelType w:val="multilevel"/>
+    <w:tmpl w:val="56CAF630"/>
+    <w:lvl w:ilvl="0">
+      <w:start w:val="1"/>
+      <w:numFmt w:val="bullet"/>
+      <w:lvlText w:val=""/>
+      <w:lvlJc w:val="left"/>
+      <w:pPr>
+        <w:tabs>
+          <w:tab w:val="num" w:pos="720"/>
+        </w:tabs>
+        <w:ind w:left="720" w:hanging="360"/>
+      </w:pPr>
+      <w:rPr>
+        <w:rFonts w:ascii="Symbol" w:hAnsi="Symbol" w:hint="default"/>
+        <w:sz w:val="20"/>
+      </w:rPr>
+    </w:lvl>
+    <w:lvl w:ilvl="1">
+      <w:start w:val="1"/>
+      <w:numFmt w:val="decimal"/>
+      <w:lvlText w:val="%2."/>
+      <w:lvlJc w:val="left"/>
+      <w:pPr>
+        <w:tabs>
+          <w:tab w:val="num" w:pos="1440"/>
+        </w:tabs>
+        <w:ind w:left="1440" w:hanging="360"/>
+      </w:pPr>
+    </w:lvl>
+    <w:lvl w:ilvl="2" w:tentative="1">
+      <w:start w:val="1"/>
+      <w:numFmt w:val="bullet"/>
+      <w:lvlText w:val=""/>
+      <w:lvlJc w:val="left"/>
+      <w:pPr>
+        <w:tabs>
+          <w:tab w:val="num" w:pos="2160"/>
+        </w:tabs>
+        <w:ind w:left="2160" w:hanging="360"/>
+      </w:pPr>
+      <w:rPr>
+        <w:rFonts w:ascii="Symbol" w:hAnsi="Symbol" w:hint="default"/>
+        <w:sz w:val="20"/>
+      </w:rPr>
+    </w:lvl>
+    <w:lvl w:ilvl="3" w:tentative="1">
+      <w:start w:val="1"/>
+      <w:numFmt w:val="bullet"/>
+      <w:lvlText w:val=""/>
+      <w:lvlJc w:val="left"/>
+      <w:pPr>
+        <w:tabs>
+          <w:tab w:val="num" w:pos="2880"/>
+        </w:tabs>
+        <w:ind w:left="2880" w:hanging="360"/>
+      </w:pPr>
+      <w:rPr>
+        <w:rFonts w:ascii="Symbol" w:hAnsi="Symbol" w:hint="default"/>
+        <w:sz w:val="20"/>
+      </w:rPr>
+    </w:lvl>
+    <w:lvl w:ilvl="4" w:tentative="1">
+      <w:start w:val="1"/>
+      <w:numFmt w:val="bullet"/>
+      <w:lvlText w:val=""/>
+      <w:lvlJc w:val="left"/>
+      <w:pPr>
+        <w:tabs>
+          <w:tab w:val="num" w:pos="3600"/>
+        </w:tabs>
+        <w:ind w:left="3600" w:hanging="360"/>
+      </w:pPr>
+      <w:rPr>
+        <w:rFonts w:ascii="Symbol" w:hAnsi="Symbol" w:hint="default"/>
+        <w:sz w:val="20"/>
+      </w:rPr>
+    </w:lvl>
+    <w:lvl w:ilvl="5" w:tentative="1">
+      <w:start w:val="1"/>
+      <w:numFmt w:val="bullet"/>
+      <w:lvlText w:val=""/>
+      <w:lvlJc w:val="left"/>
+      <w:pPr>
+        <w:tabs>
+          <w:tab w:val="num" w:pos="4320"/>
+        </w:tabs>
+        <w:ind w:left="4320" w:hanging="360"/>
+      </w:pPr>
+      <w:rPr>
+        <w:rFonts w:ascii="Symbol" w:hAnsi="Symbol" w:hint="default"/>
+        <w:sz w:val="20"/>
+      </w:rPr>
+    </w:lvl>
+    <w:lvl w:ilvl="6" w:tentative="1">
+      <w:start w:val="1"/>
+      <w:numFmt w:val="bullet"/>
+      <w:lvlText w:val=""/>
+      <w:lvlJc w:val="left"/>
+      <w:pPr>
+        <w:tabs>
+          <w:tab w:val="num" w:pos="5040"/>
+        </w:tabs>
+        <w:ind w:left="5040" w:hanging="360"/>
+      </w:pPr>
+      <w:rPr>
+        <w:rFonts w:ascii="Symbol" w:hAnsi="Symbol" w:hint="default"/>
+        <w:sz w:val="20"/>
+      </w:rPr>
+    </w:lvl>
+    <w:lvl w:ilvl="7" w:tentative="1">
+      <w:start w:val="1"/>
+      <w:numFmt w:val="bullet"/>
+      <w:lvlText w:val=""/>
+      <w:lvlJc w:val="left"/>
+      <w:pPr>
+        <w:tabs>
+          <w:tab w:val="num" w:pos="5760"/>
+        </w:tabs>
+        <w:ind w:left="5760" w:hanging="360"/>
+      </w:pPr>
+      <w:rPr>
+        <w:rFonts w:ascii="Symbol" w:hAnsi="Symbol" w:hint="default"/>
+        <w:sz w:val="20"/>
+      </w:rPr>
+    </w:lvl>
+    <w:lvl w:ilvl="8" w:tentative="1">
+      <w:start w:val="1"/>
+      <w:numFmt w:val="bullet"/>
+      <w:lvlText w:val=""/>
+      <w:lvlJc w:val="left"/>
+      <w:pPr>
+        <w:tabs>
+          <w:tab w:val="num" w:pos="6480"/>
+        </w:tabs>
+        <w:ind w:left="6480" w:hanging="360"/>
+      </w:pPr>
+      <w:rPr>
+        <w:rFonts w:ascii="Symbol" w:hAnsi="Symbol" w:hint="default"/>
+        <w:sz w:val="20"/>
+      </w:rPr>
+    </w:lvl>
+  </w:abstractNum>
+  <w:abstractNum w:abstractNumId="31" w15:restartNumberingAfterBreak="0">
+    <w:nsid w:val="73AF583E"/>
+    <w:multiLevelType w:val="multilevel"/>
+    <w:tmpl w:val="336AB5A0"/>
+    <w:lvl w:ilvl="0">
+      <w:start w:val="1"/>
+      <w:numFmt w:val="bullet"/>
+      <w:lvlText w:val=""/>
+      <w:lvlJc w:val="left"/>
+      <w:pPr>
+        <w:tabs>
+          <w:tab w:val="num" w:pos="720"/>
+        </w:tabs>
+        <w:ind w:left="720" w:hanging="360"/>
+      </w:pPr>
+      <w:rPr>
+        <w:rFonts w:ascii="Symbol" w:hAnsi="Symbol" w:hint="default"/>
+        <w:sz w:val="20"/>
+      </w:rPr>
+    </w:lvl>
+    <w:lvl w:ilvl="1">
+      <w:start w:val="1"/>
+      <w:numFmt w:val="decimal"/>
+      <w:lvlText w:val="%2."/>
+      <w:lvlJc w:val="left"/>
+      <w:pPr>
+        <w:tabs>
+          <w:tab w:val="num" w:pos="1440"/>
+        </w:tabs>
+        <w:ind w:left="1440" w:hanging="360"/>
+      </w:pPr>
+    </w:lvl>
+    <w:lvl w:ilvl="2" w:tentative="1">
+      <w:start w:val="1"/>
+      <w:numFmt w:val="bullet"/>
+      <w:lvlText w:val=""/>
+      <w:lvlJc w:val="left"/>
+      <w:pPr>
+        <w:tabs>
+          <w:tab w:val="num" w:pos="2160"/>
+        </w:tabs>
+        <w:ind w:left="2160" w:hanging="360"/>
+      </w:pPr>
+      <w:rPr>
+        <w:rFonts w:ascii="Symbol" w:hAnsi="Symbol" w:hint="default"/>
+        <w:sz w:val="20"/>
+      </w:rPr>
+    </w:lvl>
+    <w:lvl w:ilvl="3" w:tentative="1">
+      <w:start w:val="1"/>
+      <w:numFmt w:val="bullet"/>
+      <w:lvlText w:val=""/>
+      <w:lvlJc w:val="left"/>
+      <w:pPr>
+        <w:tabs>
+          <w:tab w:val="num" w:pos="2880"/>
+        </w:tabs>
+        <w:ind w:left="2880" w:hanging="360"/>
+      </w:pPr>
+      <w:rPr>
+        <w:rFonts w:ascii="Symbol" w:hAnsi="Symbol" w:hint="default"/>
+        <w:sz w:val="20"/>
+      </w:rPr>
+    </w:lvl>
+    <w:lvl w:ilvl="4" w:tentative="1">
+      <w:start w:val="1"/>
+      <w:numFmt w:val="bullet"/>
+      <w:lvlText w:val=""/>
+      <w:lvlJc w:val="left"/>
+      <w:pPr>
+        <w:tabs>
+          <w:tab w:val="num" w:pos="3600"/>
+        </w:tabs>
+        <w:ind w:left="3600" w:hanging="360"/>
+      </w:pPr>
+      <w:rPr>
+        <w:rFonts w:ascii="Symbol" w:hAnsi="Symbol" w:hint="default"/>
+        <w:sz w:val="20"/>
+      </w:rPr>
+    </w:lvl>
+    <w:lvl w:ilvl="5" w:tentative="1">
+      <w:start w:val="1"/>
+      <w:numFmt w:val="bullet"/>
+      <w:lvlText w:val=""/>
+      <w:lvlJc w:val="left"/>
+      <w:pPr>
+        <w:tabs>
+          <w:tab w:val="num" w:pos="4320"/>
+        </w:tabs>
+        <w:ind w:left="4320" w:hanging="360"/>
+      </w:pPr>
+      <w:rPr>
+        <w:rFonts w:ascii="Symbol" w:hAnsi="Symbol" w:hint="default"/>
+        <w:sz w:val="20"/>
+      </w:rPr>
+    </w:lvl>
+    <w:lvl w:ilvl="6" w:tentative="1">
+      <w:start w:val="1"/>
+      <w:numFmt w:val="bullet"/>
+      <w:lvlText w:val=""/>
+      <w:lvlJc w:val="left"/>
+      <w:pPr>
+        <w:tabs>
+          <w:tab w:val="num" w:pos="5040"/>
+        </w:tabs>
+        <w:ind w:left="5040" w:hanging="360"/>
+      </w:pPr>
+      <w:rPr>
+        <w:rFonts w:ascii="Symbol" w:hAnsi="Symbol" w:hint="default"/>
+        <w:sz w:val="20"/>
+      </w:rPr>
+    </w:lvl>
+    <w:lvl w:ilvl="7" w:tentative="1">
+      <w:start w:val="1"/>
+      <w:numFmt w:val="bullet"/>
+      <w:lvlText w:val=""/>
+      <w:lvlJc w:val="left"/>
+      <w:pPr>
+        <w:tabs>
+          <w:tab w:val="num" w:pos="5760"/>
+        </w:tabs>
+        <w:ind w:left="5760" w:hanging="360"/>
+      </w:pPr>
+      <w:rPr>
+        <w:rFonts w:ascii="Symbol" w:hAnsi="Symbol" w:hint="default"/>
+        <w:sz w:val="20"/>
+      </w:rPr>
+    </w:lvl>
+    <w:lvl w:ilvl="8" w:tentative="1">
+      <w:start w:val="1"/>
+      <w:numFmt w:val="bullet"/>
+      <w:lvlText w:val=""/>
+      <w:lvlJc w:val="left"/>
+      <w:pPr>
+        <w:tabs>
+          <w:tab w:val="num" w:pos="6480"/>
+        </w:tabs>
+        <w:ind w:left="6480" w:hanging="360"/>
+      </w:pPr>
+      <w:rPr>
+        <w:rFonts w:ascii="Symbol" w:hAnsi="Symbol" w:hint="default"/>
+        <w:sz w:val="20"/>
+      </w:rPr>
+    </w:lvl>
+  </w:abstractNum>
+  <w:abstractNum w:abstractNumId="32" w15:restartNumberingAfterBreak="0">
     <w:nsid w:val="7B83239D"/>
     <w:multiLevelType w:val="multilevel"/>
     <w:tmpl w:val="F7CE4D54"/>
@@ -11848,7 +14927,7 @@
       </w:rPr>
     </w:lvl>
   </w:abstractNum>
-  <w:abstractNum w:abstractNumId="28" w15:restartNumberingAfterBreak="0">
+  <w:abstractNum w:abstractNumId="33" w15:restartNumberingAfterBreak="0">
     <w:nsid w:val="7CAD52F7"/>
     <w:multiLevelType w:val="multilevel"/>
     <w:tmpl w:val="4844C838"/>
@@ -11965,88 +15044,103 @@
     <w:abstractNumId w:val="0"/>
   </w:num>
   <w:num w:numId="2" w16cid:durableId="1095515092">
-    <w:abstractNumId w:val="28"/>
+    <w:abstractNumId w:val="33"/>
   </w:num>
   <w:num w:numId="3" w16cid:durableId="1685980699">
-    <w:abstractNumId w:val="26"/>
+    <w:abstractNumId w:val="29"/>
   </w:num>
   <w:num w:numId="4" w16cid:durableId="1642424421">
-    <w:abstractNumId w:val="13"/>
+    <w:abstractNumId w:val="14"/>
   </w:num>
   <w:num w:numId="5" w16cid:durableId="871652371">
-    <w:abstractNumId w:val="14"/>
+    <w:abstractNumId w:val="15"/>
   </w:num>
   <w:num w:numId="6" w16cid:durableId="152574065">
     <w:abstractNumId w:val="5"/>
   </w:num>
   <w:num w:numId="7" w16cid:durableId="1809665043">
-    <w:abstractNumId w:val="19"/>
+    <w:abstractNumId w:val="22"/>
   </w:num>
   <w:num w:numId="8" w16cid:durableId="85539847">
-    <w:abstractNumId w:val="12"/>
+    <w:abstractNumId w:val="13"/>
   </w:num>
   <w:num w:numId="9" w16cid:durableId="1909992907">
     <w:abstractNumId w:val="4"/>
   </w:num>
   <w:num w:numId="10" w16cid:durableId="1976793676">
-    <w:abstractNumId w:val="27"/>
+    <w:abstractNumId w:val="32"/>
   </w:num>
   <w:num w:numId="11" w16cid:durableId="1560284771">
-    <w:abstractNumId w:val="9"/>
+    <w:abstractNumId w:val="10"/>
   </w:num>
   <w:num w:numId="12" w16cid:durableId="1788234374">
+    <w:abstractNumId w:val="8"/>
+  </w:num>
+  <w:num w:numId="13" w16cid:durableId="439910382">
+    <w:abstractNumId w:val="11"/>
+  </w:num>
+  <w:num w:numId="14" w16cid:durableId="220094796">
     <w:abstractNumId w:val="7"/>
   </w:num>
-  <w:num w:numId="13" w16cid:durableId="439910382">
-    <w:abstractNumId w:val="10"/>
-  </w:num>
-  <w:num w:numId="14" w16cid:durableId="220094796">
-    <w:abstractNumId w:val="6"/>
-  </w:num>
   <w:num w:numId="15" w16cid:durableId="1081415116">
-    <w:abstractNumId w:val="21"/>
+    <w:abstractNumId w:val="24"/>
   </w:num>
   <w:num w:numId="16" w16cid:durableId="914120843">
-    <w:abstractNumId w:val="11"/>
+    <w:abstractNumId w:val="12"/>
   </w:num>
   <w:num w:numId="17" w16cid:durableId="1522746502">
     <w:abstractNumId w:val="1"/>
   </w:num>
   <w:num w:numId="18" w16cid:durableId="58404851">
-    <w:abstractNumId w:val="16"/>
+    <w:abstractNumId w:val="17"/>
   </w:num>
   <w:num w:numId="19" w16cid:durableId="1383409678">
-    <w:abstractNumId w:val="18"/>
+    <w:abstractNumId w:val="21"/>
   </w:num>
   <w:num w:numId="20" w16cid:durableId="209615472">
-    <w:abstractNumId w:val="17"/>
+    <w:abstractNumId w:val="20"/>
   </w:num>
   <w:num w:numId="21" w16cid:durableId="1999379974">
-    <w:abstractNumId w:val="24"/>
+    <w:abstractNumId w:val="27"/>
   </w:num>
   <w:num w:numId="22" w16cid:durableId="411659035">
-    <w:abstractNumId w:val="8"/>
+    <w:abstractNumId w:val="9"/>
   </w:num>
   <w:num w:numId="23" w16cid:durableId="2099397295">
-    <w:abstractNumId w:val="15"/>
+    <w:abstractNumId w:val="16"/>
   </w:num>
   <w:num w:numId="24" w16cid:durableId="1138493796">
     <w:abstractNumId w:val="3"/>
   </w:num>
   <w:num w:numId="25" w16cid:durableId="1031496963">
-    <w:abstractNumId w:val="25"/>
+    <w:abstractNumId w:val="28"/>
   </w:num>
   <w:num w:numId="26" w16cid:durableId="1714421965">
-    <w:abstractNumId w:val="23"/>
+    <w:abstractNumId w:val="26"/>
   </w:num>
   <w:num w:numId="27" w16cid:durableId="1757942047">
-    <w:abstractNumId w:val="22"/>
+    <w:abstractNumId w:val="25"/>
   </w:num>
   <w:num w:numId="28" w16cid:durableId="1758751858">
     <w:abstractNumId w:val="2"/>
   </w:num>
   <w:num w:numId="29" w16cid:durableId="783353911">
-    <w:abstractNumId w:val="20"/>
+    <w:abstractNumId w:val="23"/>
+  </w:num>
+  <w:num w:numId="30" w16cid:durableId="1022975581">
+    <w:abstractNumId w:val="18"/>
+  </w:num>
+  <w:num w:numId="31" w16cid:durableId="815030463">
+    <w:abstractNumId w:val="19"/>
+  </w:num>
+  <w:num w:numId="32" w16cid:durableId="590314998">
+    <w:abstractNumId w:val="30"/>
+  </w:num>
+  <w:num w:numId="33" w16cid:durableId="935094875">
+    <w:abstractNumId w:val="31"/>
+  </w:num>
+  <w:num w:numId="34" w16cid:durableId="1399285488">
+    <w:abstractNumId w:val="6"/>
   </w:num>
 </w:numbering>
 </file>

</xml_diff>

<commit_message>
dodaanie diagramu czynnosci, interakcji i punkt 6
</commit_message>
<xml_diff>
--- a/Downloads/ProjektIO/Projekt IO.docx
+++ b/Downloads/ProjektIO/Projekt IO.docx
@@ -1,6 +1,6 @@
 
 <file path=word/document.xml><?xml version="1.0" encoding="utf-8"?>
-<w:document xmlns:wpc="http://schemas.microsoft.com/office/word/2010/wordprocessingCanvas" xmlns:cx="http://schemas.microsoft.com/office/drawing/2014/chartex" xmlns:cx1="http://schemas.microsoft.com/office/drawing/2015/9/8/chartex" xmlns:cx2="http://schemas.microsoft.com/office/drawing/2015/10/21/chartex" xmlns:cx3="http://schemas.microsoft.com/office/drawing/2016/5/9/chartex" xmlns:cx4="http://schemas.microsoft.com/office/drawing/2016/5/10/chartex" xmlns:cx5="http://schemas.microsoft.com/office/drawing/2016/5/11/chartex" xmlns:cx6="http://schemas.microsoft.com/office/drawing/2016/5/12/chartex" xmlns:cx7="http://schemas.microsoft.com/office/drawing/2016/5/13/chartex" xmlns:cx8="http://schemas.microsoft.com/office/drawing/2016/5/14/chartex" xmlns:mc="http://schemas.openxmlformats.org/markup-compatibility/2006" xmlns:aink="http://schemas.microsoft.com/office/drawing/2016/ink" xmlns:am3d="http://schemas.microsoft.com/office/drawing/2017/model3d" xmlns:o="urn:schemas-microsoft-com:office:office" xmlns:oel="http://schemas.microsoft.com/office/2019/extlst" xmlns:r="http://schemas.openxmlformats.org/officeDocument/2006/relationships" xmlns:m="http://schemas.openxmlformats.org/officeDocument/2006/math" xmlns:v="urn:schemas-microsoft-com:vml" xmlns:wp14="http://schemas.microsoft.com/office/word/2010/wordprocessingDrawing" xmlns:wp="http://schemas.openxmlformats.org/drawingml/2006/wordprocessingDrawing" xmlns:w10="urn:schemas-microsoft-com:office:word" xmlns:w="http://schemas.openxmlformats.org/wordprocessingml/2006/main" xmlns:w14="http://schemas.microsoft.com/office/word/2010/wordml" xmlns:w15="http://schemas.microsoft.com/office/word/2012/wordml" xmlns:w16cex="http://schemas.microsoft.com/office/word/2018/wordml/cex" xmlns:w16cid="http://schemas.microsoft.com/office/word/2016/wordml/cid" xmlns:w16="http://schemas.microsoft.com/office/word/2018/wordml" xmlns:w16du="http://schemas.microsoft.com/office/word/2023/wordml/word16du" xmlns:w16sdtdh="http://schemas.microsoft.com/office/word/2020/wordml/sdtdatahash" xmlns:w16sdtfl="http://schemas.microsoft.com/office/word/2024/wordml/sdtformatlock" xmlns:w16se="http://schemas.microsoft.com/office/word/2015/wordml/symex" xmlns:wpg="http://schemas.microsoft.com/office/word/2010/wordprocessingGroup" xmlns:wpi="http://schemas.microsoft.com/office/word/2010/wordprocessingInk" xmlns:wne="http://schemas.microsoft.com/office/word/2006/wordml" xmlns:wps="http://schemas.microsoft.com/office/word/2010/wordprocessingShape" mc:Ignorable="w14 w15 w16se w16cid w16 w16cex w16sdtdh w16sdtfl w16du wp14">
+<w:document xmlns:wpc="http://schemas.microsoft.com/office/word/2010/wordprocessingCanvas" xmlns:mc="http://schemas.openxmlformats.org/markup-compatibility/2006" xmlns:o="urn:schemas-microsoft-com:office:office" xmlns:r="http://schemas.openxmlformats.org/officeDocument/2006/relationships" xmlns:m="http://schemas.openxmlformats.org/officeDocument/2006/math" xmlns:v="urn:schemas-microsoft-com:vml" xmlns:wp14="http://schemas.microsoft.com/office/word/2010/wordprocessingDrawing" xmlns:wp="http://schemas.openxmlformats.org/drawingml/2006/wordprocessingDrawing" xmlns:w10="urn:schemas-microsoft-com:office:word" xmlns:w="http://schemas.openxmlformats.org/wordprocessingml/2006/main" xmlns:w14="http://schemas.microsoft.com/office/word/2010/wordml" xmlns:w15="http://schemas.microsoft.com/office/word/2012/wordml" xmlns:wpg="http://schemas.microsoft.com/office/word/2010/wordprocessingGroup" xmlns:wpi="http://schemas.microsoft.com/office/word/2010/wordprocessingInk" xmlns:wne="http://schemas.microsoft.com/office/word/2006/wordml" xmlns:wps="http://schemas.microsoft.com/office/word/2010/wordprocessingShape" mc:Ignorable="w14 w15 wp14">
   <w:body>
     <w:p>
       <w:pPr>
@@ -63,7 +63,10 @@
         <w:t>cyfryzacja i automatyzacja procesów operacyjnych strzelnicy</w:t>
       </w:r>
       <w:r>
-        <w:t>, co ma prowadzić do skrócenia czasu obsługi klienta, optymalizacji zarządzania zasobami (broń, amunicja) oraz zwiększenia zaangażowania użytkowników poprzez udostępnienie im ich statystyk treningowych.</w:t>
+        <w:t xml:space="preserve">, co ma prowadzić do skrócenia czasu obsługi klienta, optymalizacji zarządzania zasobami (broń, amunicja) oraz zwiększenia </w:t>
+      </w:r>
+      <w:r>
+        <w:t>zaangażowania użytkowników poprzez udostępnienie im ich statystyk treningowych.</w:t>
       </w:r>
     </w:p>
     <w:p>
@@ -119,7 +122,10 @@
         <w:t>Zarządzanie zasobami (ERP):</w:t>
       </w:r>
       <w:r>
-        <w:t xml:space="preserve"> Ewidencja jednostek broni, monitorowanie stanów amunicji i automatyczne powiadomienia o serwisowaniu.</w:t>
+        <w:t xml:space="preserve"> Ewidencja jednostek broni, monitorowanie stanów amunicji i automatyczne powiadomienia o serwis</w:t>
+      </w:r>
+      <w:r>
+        <w:t>owaniu.</w:t>
       </w:r>
     </w:p>
     <w:p>
@@ -172,7 +178,10 @@
         <w:t>Analityka i bezpieczeństwo:</w:t>
       </w:r>
       <w:r>
-        <w:t xml:space="preserve"> Generowanie obowiązkowych rejestrów strzelań oraz zbieranie danych o postępach (celność, historia wizyt).</w:t>
+        <w:t xml:space="preserve"> Generowanie obowiązkowych rejestrów strzelań oraz zbieranie danych o postępach (celność, historia w</w:t>
+      </w:r>
+      <w:r>
+        <w:t>izyt).</w:t>
       </w:r>
     </w:p>
     <w:p>
@@ -252,7 +261,16 @@
           <w:sz w:val="34"/>
           <w:szCs w:val="34"/>
         </w:rPr>
-        <w:t>2. Przewidywane korzyści z wdrożenia</w:t>
+        <w:t>2. Przewidywane korzyści z wdroż</w:t>
+      </w:r>
+      <w:r>
+        <w:rPr>
+          <w:b/>
+          <w:bCs/>
+          <w:sz w:val="34"/>
+          <w:szCs w:val="34"/>
+        </w:rPr>
+        <w:t>enia</w:t>
       </w:r>
     </w:p>
     <w:p>
@@ -324,7 +342,10 @@
         <w:t>Optymalizacja kosztów serwisu:</w:t>
       </w:r>
       <w:r>
-        <w:t xml:space="preserve"> Wydłużenie żywotności broni dzięki regularnej konserwacji opartej na rzeczywistym przebiegu (liczba wystrzelonych naboi), a nie na "wyczuciu".</w:t>
+        <w:t xml:space="preserve"> Wydłużenie żywotności broni dzięki regularnej konserwacji opartej </w:t>
+      </w:r>
+      <w:r>
+        <w:t>na rzeczywistym przebiegu (liczba wystrzelonych naboi), a nie na "wyczuciu".</w:t>
       </w:r>
     </w:p>
     <w:p>
@@ -386,7 +407,14 @@
           <w:b/>
           <w:bCs/>
         </w:rPr>
-        <w:t>Poprawa bezpieczeństwa:</w:t>
+        <w:t>Poprawa be</w:t>
+      </w:r>
+      <w:r>
+        <w:rPr>
+          <w:b/>
+          <w:bCs/>
+        </w:rPr>
+        <w:t>zpieczeństwa:</w:t>
       </w:r>
       <w:r>
         <w:t xml:space="preserve"> Pewność, że każda broń w rękach klienta jest sprawna i po przeglądzie.</w:t>
@@ -606,7 +634,13 @@
               <w:rPr>
                 <w:color w:val="1F1F1F"/>
               </w:rPr>
-              <w:t>Wydzielone stanowisko lub tor, na którym odbywa się strzelanie. Obiekt rezerwacji w systemie.</w:t>
+              <w:t xml:space="preserve">Wydzielone stanowisko lub tor, na którym odbywa się </w:t>
+            </w:r>
+            <w:r>
+              <w:rPr>
+                <w:color w:val="1F1F1F"/>
+              </w:rPr>
+              <w:t>strzelanie. Obiekt rezerwacji w systemie.</w:t>
             </w:r>
           </w:p>
         </w:tc>
@@ -744,7 +778,13 @@
               <w:rPr>
                 <w:color w:val="1F1F1F"/>
               </w:rPr>
-              <w:t>Próg przebiegu (np. co 500 strzałów), po którym system blokuje broń do czasu potwierdzenia serwisu przez instruktora.</w:t>
+              <w:t xml:space="preserve">Próg przebiegu (np. co 500 strzałów), po którym system blokuje broń do czasu </w:t>
+            </w:r>
+            <w:r>
+              <w:rPr>
+                <w:color w:val="1F1F1F"/>
+              </w:rPr>
+              <w:t>potwierdzenia serwisu przez instruktora.</w:t>
             </w:r>
           </w:p>
         </w:tc>
@@ -882,7 +922,13 @@
               <w:rPr>
                 <w:color w:val="1F1F1F"/>
               </w:rPr>
-              <w:t>Najmniejsza mierzalna część zapasu (sztuka). System operuje na opakowaniach, ale rozlicza sztuki.</w:t>
+              <w:t xml:space="preserve">Najmniejsza mierzalna część zapasu (sztuka). System operuje na opakowaniach, </w:t>
+            </w:r>
+            <w:r>
+              <w:rPr>
+                <w:color w:val="1F1F1F"/>
+              </w:rPr>
+              <w:t>ale rozlicza sztuki.</w:t>
             </w:r>
           </w:p>
         </w:tc>
@@ -1048,7 +1094,13 @@
               <w:rPr>
                 <w:color w:val="1F1F1F"/>
               </w:rPr>
-              <w:t>Procesy rozpoczęcia i zakończenia wizyty, podczas których następuje weryfikacja dokumentów i rozliczenie zużytych zasobów.</w:t>
+              <w:t>Procesy rozpoczęcia i zakończenia wizyty, podczas których następuje wery</w:t>
+            </w:r>
+            <w:r>
+              <w:rPr>
+                <w:color w:val="1F1F1F"/>
+              </w:rPr>
+              <w:t>fikacja dokumentów i rozliczenie zużytych zasobów.</w:t>
             </w:r>
           </w:p>
         </w:tc>
@@ -1077,6 +1129,7 @@
       <w:r>
         <w:rPr>
           <w:noProof/>
+          <w:lang w:val="pl-PL"/>
         </w:rPr>
         <w:drawing>
           <wp:inline distT="114300" distB="114300" distL="114300" distR="114300" wp14:anchorId="54386489" wp14:editId="1275AE32">
@@ -1119,6 +1172,7 @@
       <w:r>
         <w:rPr>
           <w:noProof/>
+          <w:lang w:val="pl-PL"/>
         </w:rPr>
         <w:drawing>
           <wp:inline distT="114300" distB="114300" distL="114300" distR="114300" wp14:anchorId="47A86026" wp14:editId="217D5D2F">
@@ -1161,6 +1215,7 @@
       <w:r>
         <w:rPr>
           <w:noProof/>
+          <w:lang w:val="pl-PL"/>
         </w:rPr>
         <w:lastRenderedPageBreak/>
         <w:drawing>
@@ -1204,6 +1259,7 @@
       <w:r>
         <w:rPr>
           <w:noProof/>
+          <w:lang w:val="pl-PL"/>
         </w:rPr>
         <w:drawing>
           <wp:inline distT="114300" distB="114300" distL="114300" distR="114300" wp14:anchorId="722FC6B0" wp14:editId="2DE63531">
@@ -1246,6 +1302,7 @@
       <w:r>
         <w:rPr>
           <w:noProof/>
+          <w:lang w:val="pl-PL"/>
         </w:rPr>
         <w:lastRenderedPageBreak/>
         <w:drawing>
@@ -1289,6 +1346,7 @@
       <w:r>
         <w:rPr>
           <w:noProof/>
+          <w:lang w:val="pl-PL"/>
         </w:rPr>
         <w:drawing>
           <wp:inline distT="114300" distB="114300" distL="114300" distR="114300" wp14:anchorId="52AD62B6" wp14:editId="60B0D06F">
@@ -1331,6 +1389,7 @@
       <w:r>
         <w:rPr>
           <w:noProof/>
+          <w:lang w:val="pl-PL"/>
         </w:rPr>
         <w:lastRenderedPageBreak/>
         <w:drawing>
@@ -1374,6 +1433,7 @@
       <w:r>
         <w:rPr>
           <w:noProof/>
+          <w:lang w:val="pl-PL"/>
         </w:rPr>
         <w:drawing>
           <wp:inline distT="114300" distB="114300" distL="114300" distR="114300" wp14:anchorId="6945424A" wp14:editId="210CF55D">
@@ -1416,6 +1476,7 @@
       <w:r>
         <w:rPr>
           <w:noProof/>
+          <w:lang w:val="pl-PL"/>
         </w:rPr>
         <w:lastRenderedPageBreak/>
         <w:drawing>
@@ -1459,6 +1520,7 @@
       <w:r>
         <w:rPr>
           <w:noProof/>
+          <w:lang w:val="pl-PL"/>
         </w:rPr>
         <w:drawing>
           <wp:inline distT="114300" distB="114300" distL="114300" distR="114300" wp14:anchorId="099DD603" wp14:editId="0727D522">
@@ -1534,6 +1596,7 @@
       <w:r>
         <w:rPr>
           <w:noProof/>
+          <w:lang w:val="pl-PL"/>
         </w:rPr>
         <w:drawing>
           <wp:inline distT="0" distB="0" distL="0" distR="0" wp14:anchorId="6B260CED" wp14:editId="680481FC">
@@ -3387,6 +3450,7 @@
       <w:r>
         <w:rPr>
           <w:noProof/>
+          <w:lang w:val="pl-PL"/>
         </w:rPr>
         <w:drawing>
           <wp:inline distT="0" distB="0" distL="0" distR="0" wp14:anchorId="62A6F070" wp14:editId="3B5C66BA">
@@ -3578,6 +3642,143 @@
     </w:p>
     <w:p/>
     <w:p/>
+    <w:p>
+      <w:pPr>
+        <w:rPr>
+          <w:b/>
+          <w:bCs/>
+        </w:rPr>
+      </w:pPr>
+    </w:p>
+    <w:p>
+      <w:pPr>
+        <w:rPr>
+          <w:b/>
+          <w:bCs/>
+        </w:rPr>
+      </w:pPr>
+    </w:p>
+    <w:p>
+      <w:pPr>
+        <w:rPr>
+          <w:b/>
+          <w:bCs/>
+        </w:rPr>
+      </w:pPr>
+    </w:p>
+    <w:p>
+      <w:pPr>
+        <w:rPr>
+          <w:b/>
+          <w:bCs/>
+        </w:rPr>
+      </w:pPr>
+    </w:p>
+    <w:p>
+      <w:pPr>
+        <w:rPr>
+          <w:b/>
+          <w:bCs/>
+        </w:rPr>
+      </w:pPr>
+    </w:p>
+    <w:p>
+      <w:pPr>
+        <w:rPr>
+          <w:b/>
+          <w:bCs/>
+        </w:rPr>
+      </w:pPr>
+    </w:p>
+    <w:p>
+      <w:pPr>
+        <w:rPr>
+          <w:b/>
+          <w:bCs/>
+        </w:rPr>
+      </w:pPr>
+    </w:p>
+    <w:p>
+      <w:pPr>
+        <w:rPr>
+          <w:b/>
+          <w:bCs/>
+        </w:rPr>
+      </w:pPr>
+    </w:p>
+    <w:p>
+      <w:pPr>
+        <w:rPr>
+          <w:b/>
+          <w:bCs/>
+        </w:rPr>
+      </w:pPr>
+      <w:r>
+        <w:rPr>
+          <w:b/>
+          <w:bCs/>
+        </w:rPr>
+        <w:lastRenderedPageBreak/>
+        <w:t>Kacper Gołowacz</w:t>
+      </w:r>
+    </w:p>
+    <w:p>
+      <w:pPr>
+        <w:pStyle w:val="Akapitzlist"/>
+        <w:numPr>
+          <w:ilvl w:val="0"/>
+          <w:numId w:val="29"/>
+        </w:numPr>
+      </w:pPr>
+      <w:r>
+        <w:t>Kontrola Użytkowników</w:t>
+      </w:r>
+    </w:p>
+    <w:p/>
+    <w:p/>
+    <w:p>
+      <w:r>
+        <w:rPr>
+          <w:noProof/>
+          <w:lang w:val="pl-PL"/>
+        </w:rPr>
+        <w:drawing>
+          <wp:inline distT="0" distB="0" distL="0" distR="0" wp14:anchorId="3BAA3FDF" wp14:editId="0D611FE9">
+            <wp:extent cx="3990975" cy="4703146"/>
+            <wp:effectExtent l="0" t="0" r="0" b="2540"/>
+            <wp:docPr id="2" name="Obraz 2"/>
+            <wp:cNvGraphicFramePr>
+              <a:graphicFrameLocks xmlns:a="http://schemas.openxmlformats.org/drawingml/2006/main" noChangeAspect="1"/>
+            </wp:cNvGraphicFramePr>
+            <a:graphic xmlns:a="http://schemas.openxmlformats.org/drawingml/2006/main">
+              <a:graphicData uri="http://schemas.openxmlformats.org/drawingml/2006/picture">
+                <pic:pic xmlns:pic="http://schemas.openxmlformats.org/drawingml/2006/picture">
+                  <pic:nvPicPr>
+                    <pic:cNvPr id="1" name=""/>
+                    <pic:cNvPicPr/>
+                  </pic:nvPicPr>
+                  <pic:blipFill>
+                    <a:blip r:embed="rId18"/>
+                    <a:stretch>
+                      <a:fillRect/>
+                    </a:stretch>
+                  </pic:blipFill>
+                  <pic:spPr>
+                    <a:xfrm>
+                      <a:off x="0" y="0"/>
+                      <a:ext cx="4002422" cy="4716636"/>
+                    </a:xfrm>
+                    <a:prstGeom prst="rect">
+                      <a:avLst/>
+                    </a:prstGeom>
+                  </pic:spPr>
+                </pic:pic>
+              </a:graphicData>
+            </a:graphic>
+          </wp:inline>
+        </w:drawing>
+      </w:r>
+    </w:p>
     <w:p/>
     <w:p/>
     <w:p/>
@@ -3587,36 +3788,37 @@
         <w:pStyle w:val="Nagwek2"/>
       </w:pPr>
       <w:r>
+        <w:t>4.</w:t>
+      </w:r>
+      <w:r>
+        <w:t>3</w:t>
+      </w:r>
+      <w:r>
+        <w:t>. Diagramy interakcji z opisem tekstowym komunikatów</w:t>
+      </w:r>
+    </w:p>
+    <w:p>
+      <w:pPr>
+        <w:rPr>
+          <w:b/>
+          <w:bCs/>
+        </w:rPr>
+      </w:pPr>
+      <w:r>
+        <w:rPr>
+          <w:b/>
+          <w:bCs/>
+        </w:rPr>
+        <w:t>Igor Wróblewski</w:t>
+      </w:r>
+    </w:p>
+    <w:p>
+      <w:r>
+        <w:rPr>
+          <w:noProof/>
+          <w:lang w:val="pl-PL"/>
+        </w:rPr>
         <w:lastRenderedPageBreak/>
-        <w:t>4.</w:t>
-      </w:r>
-      <w:r>
-        <w:t>3</w:t>
-      </w:r>
-      <w:r>
-        <w:t>. Diagramy interakcji z opisem tekstowym komunikatów</w:t>
-      </w:r>
-    </w:p>
-    <w:p>
-      <w:pPr>
-        <w:rPr>
-          <w:b/>
-          <w:bCs/>
-        </w:rPr>
-      </w:pPr>
-      <w:r>
-        <w:rPr>
-          <w:b/>
-          <w:bCs/>
-        </w:rPr>
-        <w:t>Igor Wróblewski</w:t>
-      </w:r>
-    </w:p>
-    <w:p>
-      <w:r>
-        <w:rPr>
-          <w:noProof/>
-        </w:rPr>
         <w:drawing>
           <wp:inline distT="0" distB="0" distL="0" distR="0" wp14:anchorId="00E1434D" wp14:editId="6938D168">
             <wp:extent cx="5733415" cy="2947670"/>
@@ -3633,7 +3835,7 @@
                     <pic:cNvPicPr/>
                   </pic:nvPicPr>
                   <pic:blipFill>
-                    <a:blip r:embed="rId18"/>
+                    <a:blip r:embed="rId19"/>
                     <a:stretch>
                       <a:fillRect/>
                     </a:stretch>
@@ -4190,7 +4392,6 @@
           <w:b/>
           <w:bCs/>
         </w:rPr>
-        <w:lastRenderedPageBreak/>
         <w:t>Opis:</w:t>
       </w:r>
       <w:r>
@@ -4284,6 +4485,7 @@
           <w:b/>
           <w:bCs/>
         </w:rPr>
+        <w:lastRenderedPageBreak/>
         <w:t>Typ komunikatu:</w:t>
       </w:r>
       <w:r>
@@ -4686,7 +4888,6 @@
           <w:b/>
           <w:bCs/>
         </w:rPr>
-        <w:lastRenderedPageBreak/>
         <w:t>Wojciech Cimochowski</w:t>
       </w:r>
     </w:p>
@@ -4714,7 +4915,9 @@
       <w:r>
         <w:rPr>
           <w:noProof/>
-        </w:rPr>
+          <w:lang w:val="pl-PL"/>
+        </w:rPr>
+        <w:lastRenderedPageBreak/>
         <w:drawing>
           <wp:inline distT="0" distB="0" distL="0" distR="0" wp14:anchorId="009C8796" wp14:editId="264CA7CC">
             <wp:extent cx="5727700" cy="6203315"/>
@@ -4733,7 +4936,7 @@
                     </pic:cNvPicPr>
                   </pic:nvPicPr>
                   <pic:blipFill>
-                    <a:blip r:embed="rId19">
+                    <a:blip r:embed="rId20">
                       <a:extLst>
                         <a:ext uri="{28A0092B-C50C-407E-A947-70E740481C1C}">
                           <a14:useLocalDpi xmlns:a14="http://schemas.microsoft.com/office/drawing/2010/main" val="0"/>
@@ -4942,458 +5145,963 @@
           <w:bCs/>
           <w:lang w:val="pl-PL"/>
         </w:rPr>
+        <w:t>Komunikat 3:</w:t>
+      </w:r>
+      <w:r>
+        <w:rPr>
+          <w:lang w:val="pl-PL"/>
+        </w:rPr>
+        <w:t> Aktor wywołuje na obiekcie instruktor metodę</w:t>
+      </w:r>
+      <w:r>
+        <w:rPr>
+          <w:lang w:val="pl-PL"/>
+        </w:rPr>
+        <w:br/>
+      </w:r>
+      <w:proofErr w:type="spellStart"/>
+      <w:r>
+        <w:rPr>
+          <w:lang w:val="pl-PL"/>
+        </w:rPr>
+        <w:t>weryfikujDokument</w:t>
+      </w:r>
+      <w:proofErr w:type="spellEnd"/>
+      <w:r>
+        <w:rPr>
+          <w:lang w:val="pl-PL"/>
+        </w:rPr>
+        <w:t>(klient, rodzaj, PESEL).</w:t>
+      </w:r>
+    </w:p>
+    <w:p>
+      <w:pPr>
+        <w:rPr>
+          <w:lang w:val="pl-PL"/>
+        </w:rPr>
+      </w:pPr>
+      <w:r>
+        <w:rPr>
+          <w:lang w:val="pl-PL"/>
+        </w:rPr>
+        <w:t>Weryfikacja przebiega w gałęzi alt:</w:t>
+      </w:r>
+    </w:p>
+    <w:p>
+      <w:pPr>
+        <w:rPr>
+          <w:lang w:val="pl-PL"/>
+        </w:rPr>
+      </w:pPr>
+      <w:r>
+        <w:rPr>
+          <w:b/>
+          <w:bCs/>
+          <w:lang w:val="pl-PL"/>
+        </w:rPr>
+        <w:lastRenderedPageBreak/>
+        <w:t>Gałąź [z błędami]:</w:t>
+      </w:r>
+    </w:p>
+    <w:p>
+      <w:pPr>
+        <w:rPr>
+          <w:lang w:val="pl-PL"/>
+        </w:rPr>
+      </w:pPr>
+      <w:r>
+        <w:rPr>
+          <w:b/>
+          <w:bCs/>
+          <w:lang w:val="pl-PL"/>
+        </w:rPr>
+        <w:t>Komunikat 4:</w:t>
+      </w:r>
+      <w:r>
+        <w:rPr>
+          <w:lang w:val="pl-PL"/>
+        </w:rPr>
+        <w:t> Obiekt instruktor zwraca wartość </w:t>
+      </w:r>
+      <w:proofErr w:type="spellStart"/>
+      <w:r>
+        <w:rPr>
+          <w:lang w:val="pl-PL"/>
+        </w:rPr>
+        <w:t>false</w:t>
+      </w:r>
+      <w:proofErr w:type="spellEnd"/>
+      <w:r>
+        <w:rPr>
+          <w:lang w:val="pl-PL"/>
+        </w:rPr>
+        <w:t>. System informuje o błędach w formularzu; instruktor poprawia dane i pętla się powtarza.</w:t>
+      </w:r>
+    </w:p>
+    <w:p>
+      <w:pPr>
+        <w:rPr>
+          <w:lang w:val="pl-PL"/>
+        </w:rPr>
+      </w:pPr>
+      <w:r>
+        <w:rPr>
+          <w:b/>
+          <w:bCs/>
+          <w:lang w:val="pl-PL"/>
+        </w:rPr>
+        <w:t>Gałąź [poprawne]:</w:t>
+      </w:r>
+    </w:p>
+    <w:p>
+      <w:pPr>
+        <w:rPr>
+          <w:lang w:val="pl-PL"/>
+        </w:rPr>
+      </w:pPr>
+      <w:r>
+        <w:rPr>
+          <w:lang w:val="pl-PL"/>
+        </w:rPr>
+        <w:t>Wewnątrz </w:t>
+      </w:r>
+      <w:proofErr w:type="spellStart"/>
+      <w:r>
+        <w:rPr>
+          <w:lang w:val="pl-PL"/>
+        </w:rPr>
+        <w:t>weryfikujDokument</w:t>
+      </w:r>
+      <w:proofErr w:type="spellEnd"/>
+      <w:r>
+        <w:rPr>
+          <w:lang w:val="pl-PL"/>
+        </w:rPr>
+        <w:t> ustawiany jest atrybut </w:t>
+      </w:r>
+      <w:proofErr w:type="spellStart"/>
+      <w:r>
+        <w:rPr>
+          <w:lang w:val="pl-PL"/>
+        </w:rPr>
+        <w:t>Status_weryfikacji</w:t>
+      </w:r>
+      <w:proofErr w:type="spellEnd"/>
+      <w:r>
+        <w:rPr>
+          <w:lang w:val="pl-PL"/>
+        </w:rPr>
+        <w:t> klienta na </w:t>
+      </w:r>
+      <w:proofErr w:type="spellStart"/>
+      <w:r>
+        <w:rPr>
+          <w:lang w:val="pl-PL"/>
+        </w:rPr>
+        <w:t>true</w:t>
+      </w:r>
+      <w:proofErr w:type="spellEnd"/>
+      <w:r>
+        <w:rPr>
+          <w:lang w:val="pl-PL"/>
+        </w:rPr>
+        <w:t>.</w:t>
+      </w:r>
+    </w:p>
+    <w:p>
+      <w:pPr>
+        <w:rPr>
+          <w:lang w:val="pl-PL"/>
+        </w:rPr>
+      </w:pPr>
+      <w:r>
+        <w:rPr>
+          <w:b/>
+          <w:bCs/>
+          <w:lang w:val="pl-PL"/>
+        </w:rPr>
+        <w:t>Komunikat 5:</w:t>
+      </w:r>
+      <w:r>
+        <w:rPr>
+          <w:lang w:val="pl-PL"/>
+        </w:rPr>
+        <w:t> Obiekt instruktor wywołuje na rezerwacja metodę </w:t>
+      </w:r>
+      <w:proofErr w:type="spellStart"/>
+      <w:r>
+        <w:rPr>
+          <w:lang w:val="pl-PL"/>
+        </w:rPr>
+        <w:t>zmienStatus</w:t>
+      </w:r>
+      <w:proofErr w:type="spellEnd"/>
+      <w:r>
+        <w:rPr>
+          <w:lang w:val="pl-PL"/>
+        </w:rPr>
+        <w:t>("zweryfikowany").</w:t>
+      </w:r>
+    </w:p>
+    <w:p>
+      <w:pPr>
+        <w:rPr>
+          <w:lang w:val="pl-PL"/>
+        </w:rPr>
+      </w:pPr>
+      <w:r>
+        <w:rPr>
+          <w:b/>
+          <w:bCs/>
+          <w:lang w:val="pl-PL"/>
+        </w:rPr>
+        <w:t>Komunikat 6:</w:t>
+      </w:r>
+      <w:r>
+        <w:rPr>
+          <w:lang w:val="pl-PL"/>
+        </w:rPr>
+        <w:t> Obiekt instruktor zwraca wartość </w:t>
+      </w:r>
+      <w:proofErr w:type="spellStart"/>
+      <w:r>
+        <w:rPr>
+          <w:lang w:val="pl-PL"/>
+        </w:rPr>
+        <w:t>true</w:t>
+      </w:r>
+      <w:proofErr w:type="spellEnd"/>
+      <w:r>
+        <w:rPr>
+          <w:lang w:val="pl-PL"/>
+        </w:rPr>
+        <w:t>. Rezerwacja zostaje zweryfikowana; pętla się kończy.</w:t>
+      </w:r>
+    </w:p>
+    <w:p>
+      <w:pPr>
+        <w:rPr>
+          <w:lang w:val="pl-PL"/>
+        </w:rPr>
+      </w:pPr>
+    </w:p>
+    <w:p>
+      <w:pPr>
+        <w:rPr>
+          <w:lang w:val="de-DE"/>
+        </w:rPr>
+      </w:pPr>
+      <w:r>
+        <w:rPr>
+          <w:b/>
+          <w:bCs/>
+          <w:lang w:val="de-DE"/>
+        </w:rPr>
+        <w:t>3. Check-in</w:t>
+      </w:r>
+    </w:p>
+    <w:p>
+      <w:pPr>
+        <w:rPr>
+          <w:lang w:val="de-DE"/>
+        </w:rPr>
+      </w:pPr>
+      <w:r>
+        <w:rPr>
+          <w:lang w:val="de-DE"/>
+        </w:rPr>
+        <w:t xml:space="preserve">Instruktor </w:t>
+      </w:r>
+      <w:proofErr w:type="spellStart"/>
+      <w:r>
+        <w:rPr>
+          <w:lang w:val="de-DE"/>
+        </w:rPr>
+        <w:t>klika</w:t>
+      </w:r>
+      <w:proofErr w:type="spellEnd"/>
+      <w:r>
+        <w:rPr>
+          <w:lang w:val="de-DE"/>
+        </w:rPr>
+        <w:t xml:space="preserve"> </w:t>
+      </w:r>
+      <w:proofErr w:type="spellStart"/>
+      <w:r>
+        <w:rPr>
+          <w:lang w:val="de-DE"/>
+        </w:rPr>
+        <w:t>przycisk</w:t>
+      </w:r>
+      <w:proofErr w:type="spellEnd"/>
+      <w:r>
+        <w:rPr>
+          <w:lang w:val="de-DE"/>
+        </w:rPr>
+        <w:t xml:space="preserve"> „Check-in”.</w:t>
+      </w:r>
+    </w:p>
+    <w:p>
+      <w:pPr>
+        <w:rPr>
+          <w:lang w:val="pl-PL"/>
+        </w:rPr>
+      </w:pPr>
+      <w:r>
+        <w:rPr>
+          <w:b/>
+          <w:bCs/>
+          <w:lang w:val="pl-PL"/>
+        </w:rPr>
+        <w:t>Komunikat 7:</w:t>
+      </w:r>
+      <w:r>
+        <w:rPr>
+          <w:lang w:val="pl-PL"/>
+        </w:rPr>
+        <w:t> Aktor wywołuje na obiekcie instruktor metodę </w:t>
+      </w:r>
+      <w:proofErr w:type="spellStart"/>
+      <w:r>
+        <w:rPr>
+          <w:lang w:val="pl-PL"/>
+        </w:rPr>
+        <w:t>wykonajCheckIn</w:t>
+      </w:r>
+      <w:proofErr w:type="spellEnd"/>
+      <w:r>
+        <w:rPr>
+          <w:lang w:val="pl-PL"/>
+        </w:rPr>
+        <w:t>(rezerwacja).</w:t>
+      </w:r>
+    </w:p>
+    <w:p>
+      <w:pPr>
+        <w:rPr>
+          <w:lang w:val="pl-PL"/>
+        </w:rPr>
+      </w:pPr>
+      <w:r>
+        <w:rPr>
+          <w:b/>
+          <w:bCs/>
+          <w:lang w:val="pl-PL"/>
+        </w:rPr>
+        <w:t>Komunikat 8:</w:t>
+      </w:r>
+      <w:r>
+        <w:rPr>
+          <w:lang w:val="pl-PL"/>
+        </w:rPr>
+        <w:t> Obiekt instruktor tworzy nowy obiekt </w:t>
+      </w:r>
+      <w:proofErr w:type="spellStart"/>
+      <w:r>
+        <w:rPr>
+          <w:lang w:val="pl-PL"/>
+        </w:rPr>
+        <w:t>sesja:SesjaStrzelecka</w:t>
+      </w:r>
+      <w:proofErr w:type="spellEnd"/>
+      <w:r>
+        <w:rPr>
+          <w:lang w:val="pl-PL"/>
+        </w:rPr>
+        <w:t> (&lt;&lt;</w:t>
+      </w:r>
+      <w:proofErr w:type="spellStart"/>
+      <w:r>
+        <w:rPr>
+          <w:lang w:val="pl-PL"/>
+        </w:rPr>
+        <w:t>create</w:t>
+      </w:r>
+      <w:proofErr w:type="spellEnd"/>
+      <w:r>
+        <w:rPr>
+          <w:lang w:val="pl-PL"/>
+        </w:rPr>
+        <w:t>&gt;&gt;).</w:t>
+      </w:r>
+    </w:p>
+    <w:p>
+      <w:pPr>
+        <w:rPr>
+          <w:lang w:val="pl-PL"/>
+        </w:rPr>
+      </w:pPr>
+      <w:r>
+        <w:rPr>
+          <w:b/>
+          <w:bCs/>
+          <w:lang w:val="pl-PL"/>
+        </w:rPr>
+        <w:t>Komunikat 9:</w:t>
+      </w:r>
+      <w:r>
+        <w:rPr>
+          <w:lang w:val="pl-PL"/>
+        </w:rPr>
+        <w:t> Obiekt instruktor wywołuje na rezerwacja metodę </w:t>
+      </w:r>
+      <w:proofErr w:type="spellStart"/>
+      <w:r>
+        <w:rPr>
+          <w:lang w:val="pl-PL"/>
+        </w:rPr>
+        <w:t>zmienStatus</w:t>
+      </w:r>
+      <w:proofErr w:type="spellEnd"/>
+      <w:r>
+        <w:rPr>
+          <w:lang w:val="pl-PL"/>
+        </w:rPr>
+        <w:t>("w trakcie wizyty").</w:t>
+      </w:r>
+    </w:p>
+    <w:p>
+      <w:pPr>
+        <w:rPr>
+          <w:lang w:val="pl-PL"/>
+        </w:rPr>
+      </w:pPr>
+      <w:r>
+        <w:rPr>
+          <w:b/>
+          <w:bCs/>
+          <w:lang w:val="pl-PL"/>
+        </w:rPr>
+        <w:t>Komunikat 10 (zwrot):</w:t>
+      </w:r>
+      <w:r>
+        <w:rPr>
+          <w:lang w:val="pl-PL"/>
+        </w:rPr>
+        <w:t xml:space="preserve"> Obiekt instruktor zwraca utworzony obiekt sesja do aktora. </w:t>
+      </w:r>
+      <w:proofErr w:type="spellStart"/>
+      <w:r>
+        <w:rPr>
+          <w:lang w:val="pl-PL"/>
+        </w:rPr>
+        <w:t>Check</w:t>
+      </w:r>
+      <w:proofErr w:type="spellEnd"/>
+      <w:r>
+        <w:rPr>
+          <w:lang w:val="pl-PL"/>
+        </w:rPr>
+        <w:t>-in zostaje zakończony; rozpoczyna się sesja strzelecka.</w:t>
+      </w:r>
+    </w:p>
+    <w:p/>
+    <w:p/>
+    <w:p>
+      <w:pPr>
+        <w:rPr>
+          <w:b/>
+          <w:bCs/>
+        </w:rPr>
+      </w:pPr>
+      <w:r>
+        <w:rPr>
+          <w:b/>
+          <w:bCs/>
+        </w:rPr>
+        <w:t>Kacper Gołowacz</w:t>
+      </w:r>
+    </w:p>
+    <w:p/>
+    <w:p>
+      <w:r>
+        <w:lastRenderedPageBreak/>
+        <w:drawing>
+          <wp:inline distT="0" distB="0" distL="0" distR="0" wp14:anchorId="6ED49875" wp14:editId="0303B37F">
+            <wp:extent cx="5248894" cy="5831394"/>
+            <wp:effectExtent l="0" t="0" r="9525" b="0"/>
+            <wp:docPr id="12" name="Obraz 12"/>
+            <wp:cNvGraphicFramePr>
+              <a:graphicFrameLocks xmlns:a="http://schemas.openxmlformats.org/drawingml/2006/main" noChangeAspect="1"/>
+            </wp:cNvGraphicFramePr>
+            <a:graphic xmlns:a="http://schemas.openxmlformats.org/drawingml/2006/main">
+              <a:graphicData uri="http://schemas.openxmlformats.org/drawingml/2006/picture">
+                <pic:pic xmlns:pic="http://schemas.openxmlformats.org/drawingml/2006/picture">
+                  <pic:nvPicPr>
+                    <pic:cNvPr id="1" name=""/>
+                    <pic:cNvPicPr/>
+                  </pic:nvPicPr>
+                  <pic:blipFill>
+                    <a:blip r:embed="rId21"/>
+                    <a:stretch>
+                      <a:fillRect/>
+                    </a:stretch>
+                  </pic:blipFill>
+                  <pic:spPr>
+                    <a:xfrm>
+                      <a:off x="0" y="0"/>
+                      <a:ext cx="5308760" cy="5897904"/>
+                    </a:xfrm>
+                    <a:prstGeom prst="rect">
+                      <a:avLst/>
+                    </a:prstGeom>
+                  </pic:spPr>
+                </pic:pic>
+              </a:graphicData>
+            </a:graphic>
+          </wp:inline>
+        </w:drawing>
+      </w:r>
+    </w:p>
+    <w:p/>
+    <w:p/>
+    <w:p>
+      <w:pPr>
+        <w:rPr>
+          <w:b/>
+        </w:rPr>
+      </w:pPr>
+      <w:r>
+        <w:rPr>
+          <w:b/>
+        </w:rPr>
+        <w:t>1. Pobranie listy użytkowników</w:t>
+      </w:r>
+    </w:p>
+    <w:p>
+      <w:r>
+        <w:t>Administrator chce wyświetlić listę użytkowników systemu.</w:t>
+      </w:r>
+    </w:p>
+    <w:p/>
+    <w:p>
+      <w:r>
+        <w:rPr>
+          <w:b/>
+        </w:rPr>
+        <w:t>Komunikat 1:</w:t>
+      </w:r>
+      <w:r>
+        <w:t xml:space="preserve"> Aktor wywołuje na obiekcie </w:t>
+      </w:r>
+      <w:proofErr w:type="spellStart"/>
+      <w:r>
+        <w:t>admin:Administrator</w:t>
+      </w:r>
+      <w:proofErr w:type="spellEnd"/>
+      <w:r>
+        <w:t xml:space="preserve"> met</w:t>
+      </w:r>
+      <w:r>
+        <w:t xml:space="preserve">odę </w:t>
+      </w:r>
+      <w:proofErr w:type="spellStart"/>
+      <w:r>
+        <w:t>pobierzListeUzytkownikow</w:t>
+      </w:r>
+      <w:proofErr w:type="spellEnd"/>
+      <w:r>
+        <w:t>().</w:t>
+      </w:r>
+    </w:p>
+    <w:p>
+      <w:r>
+        <w:rPr>
+          <w:b/>
+        </w:rPr>
+        <w:t>Komunikat 2 (zwrot):</w:t>
+      </w:r>
+      <w:r>
+        <w:t xml:space="preserve"> Obiekt </w:t>
+      </w:r>
+      <w:proofErr w:type="spellStart"/>
+      <w:r>
+        <w:t>admin:Administrator</w:t>
+      </w:r>
+      <w:proofErr w:type="spellEnd"/>
+      <w:r>
+        <w:t xml:space="preserve"> zwraca listę uż</w:t>
+      </w:r>
+      <w:r>
+        <w:t>ytkowników (</w:t>
+      </w:r>
+      <w:proofErr w:type="spellStart"/>
+      <w:r>
+        <w:t>listaUzytkownikow</w:t>
+      </w:r>
+      <w:proofErr w:type="spellEnd"/>
+      <w:r>
+        <w:t>).</w:t>
+      </w:r>
+    </w:p>
+    <w:p>
+      <w:r>
+        <w:t>System wyświetla tabelę z listą wszystkich zarejestrowanych osób.</w:t>
+      </w:r>
+    </w:p>
+    <w:p/>
+    <w:p>
+      <w:r>
+        <w:rPr>
+          <w:b/>
+        </w:rPr>
+        <w:t>2. Filtrowanie listy</w:t>
+      </w:r>
+      <w:r>
+        <w:t xml:space="preserve"> — fragment </w:t>
+      </w:r>
+      <w:proofErr w:type="spellStart"/>
+      <w:r>
+        <w:t>opt</w:t>
+      </w:r>
+      <w:proofErr w:type="spellEnd"/>
+      <w:r>
+        <w:t xml:space="preserve"> [filtr != </w:t>
+      </w:r>
+      <w:proofErr w:type="spellStart"/>
+      <w:r>
+        <w:t>null</w:t>
+      </w:r>
+      <w:proofErr w:type="spellEnd"/>
+      <w:r>
+        <w:t>]</w:t>
+      </w:r>
+    </w:p>
+    <w:p>
+      <w:r>
+        <w:t>Krok opcjonalny, wykonywany tylko wtedy, gdy określono kryteria filtrowania (filtr nie jest pusty).</w:t>
+      </w:r>
+    </w:p>
+    <w:p/>
+    <w:p>
+      <w:pPr>
+        <w:rPr>
+          <w:b/>
+        </w:rPr>
+      </w:pPr>
+    </w:p>
+    <w:p>
+      <w:r>
+        <w:rPr>
+          <w:b/>
+        </w:rPr>
         <w:lastRenderedPageBreak/>
         <w:t>Komunikat 3:</w:t>
       </w:r>
       <w:r>
-        <w:rPr>
-          <w:lang w:val="pl-PL"/>
-        </w:rPr>
-        <w:t> Aktor wywołuje na obiekcie instruktor metodę</w:t>
-      </w:r>
-      <w:r>
-        <w:rPr>
-          <w:lang w:val="pl-PL"/>
-        </w:rPr>
-        <w:br/>
+        <w:t xml:space="preserve"> Aktor wywołuje na obiekcie </w:t>
       </w:r>
       <w:proofErr w:type="spellStart"/>
       <w:r>
-        <w:rPr>
-          <w:lang w:val="pl-PL"/>
-        </w:rPr>
-        <w:t>weryfikujDokument</w:t>
+        <w:t>admin:Administrat</w:t>
+      </w:r>
+      <w:r>
+        <w:t>or</w:t>
       </w:r>
       <w:proofErr w:type="spellEnd"/>
       <w:r>
-        <w:rPr>
-          <w:lang w:val="pl-PL"/>
-        </w:rPr>
-        <w:t>(klient, rodzaj, PESEL).</w:t>
-      </w:r>
-    </w:p>
-    <w:p>
-      <w:pPr>
-        <w:rPr>
-          <w:lang w:val="pl-PL"/>
-        </w:rPr>
-      </w:pPr>
-      <w:r>
-        <w:rPr>
-          <w:lang w:val="pl-PL"/>
-        </w:rPr>
-        <w:t>Weryfikacja przebiega w gałęzi alt:</w:t>
-      </w:r>
-    </w:p>
-    <w:p>
-      <w:pPr>
-        <w:rPr>
-          <w:lang w:val="pl-PL"/>
-        </w:rPr>
-      </w:pPr>
-      <w:r>
-        <w:rPr>
-          <w:b/>
-          <w:bCs/>
-          <w:lang w:val="pl-PL"/>
-        </w:rPr>
-        <w:t>Gałąź [z błędami]:</w:t>
-      </w:r>
-    </w:p>
-    <w:p>
-      <w:pPr>
-        <w:rPr>
-          <w:lang w:val="pl-PL"/>
-        </w:rPr>
-      </w:pPr>
-      <w:r>
-        <w:rPr>
-          <w:b/>
-          <w:bCs/>
-          <w:lang w:val="pl-PL"/>
-        </w:rPr>
-        <w:t>Komunikat 4:</w:t>
-      </w:r>
-      <w:r>
-        <w:rPr>
-          <w:lang w:val="pl-PL"/>
-        </w:rPr>
-        <w:t> Obiekt instruktor zwraca wartość </w:t>
+        <w:t xml:space="preserve"> metodę </w:t>
       </w:r>
       <w:proofErr w:type="spellStart"/>
       <w:r>
-        <w:rPr>
-          <w:lang w:val="pl-PL"/>
-        </w:rPr>
-        <w:t>false</w:t>
+        <w:t>filtrujTabele</w:t>
       </w:r>
       <w:proofErr w:type="spellEnd"/>
       <w:r>
-        <w:rPr>
-          <w:lang w:val="pl-PL"/>
-        </w:rPr>
-        <w:t>. System informuje o błędach w formularzu; instruktor poprawia dane i pętla się powtarza.</w:t>
-      </w:r>
-    </w:p>
-    <w:p>
-      <w:pPr>
-        <w:rPr>
-          <w:lang w:val="pl-PL"/>
-        </w:rPr>
-      </w:pPr>
-      <w:r>
-        <w:rPr>
-          <w:b/>
-          <w:bCs/>
-          <w:lang w:val="pl-PL"/>
-        </w:rPr>
-        <w:t>Gałąź [poprawne]:</w:t>
-      </w:r>
-    </w:p>
-    <w:p>
-      <w:pPr>
-        <w:rPr>
-          <w:lang w:val="pl-PL"/>
-        </w:rPr>
-      </w:pPr>
-      <w:r>
-        <w:rPr>
-          <w:lang w:val="pl-PL"/>
-        </w:rPr>
-        <w:t>Wewnątrz </w:t>
+        <w:t>(filtr).</w:t>
+      </w:r>
+    </w:p>
+    <w:p>
+      <w:r>
+        <w:rPr>
+          <w:b/>
+        </w:rPr>
+        <w:t>Komunikat 4 (zwrot):</w:t>
+      </w:r>
+      <w:r>
+        <w:t xml:space="preserve"> Obiekt </w:t>
       </w:r>
       <w:proofErr w:type="spellStart"/>
       <w:r>
-        <w:rPr>
-          <w:lang w:val="pl-PL"/>
-        </w:rPr>
-        <w:t>weryfikujDokument</w:t>
+        <w:t>admin:Administrator</w:t>
       </w:r>
       <w:proofErr w:type="spellEnd"/>
       <w:r>
-        <w:rPr>
-          <w:lang w:val="pl-PL"/>
-        </w:rPr>
-        <w:t> ustawiany jest atrybut </w:t>
+        <w:t xml:space="preserve"> zwraca przefiltrowa</w:t>
+      </w:r>
+      <w:r>
+        <w:t>ną listę (</w:t>
       </w:r>
       <w:proofErr w:type="spellStart"/>
       <w:r>
-        <w:rPr>
-          <w:lang w:val="pl-PL"/>
-        </w:rPr>
-        <w:t>Status_weryfikacji</w:t>
+        <w:t>przefiltrowanaLista</w:t>
       </w:r>
       <w:proofErr w:type="spellEnd"/>
       <w:r>
-        <w:rPr>
-          <w:lang w:val="pl-PL"/>
-        </w:rPr>
-        <w:t> klienta na </w:t>
+        <w:t>).</w:t>
+      </w:r>
+    </w:p>
+    <w:p>
+      <w:r>
+        <w:t>Administrator przechodzi do edycji konta i modyfikuje uprawnienia.</w:t>
+      </w:r>
+    </w:p>
+    <w:p/>
+    <w:p>
+      <w:r>
+        <w:rPr>
+          <w:b/>
+        </w:rPr>
+        <w:t>3. Zapis lub odrzucenie zmian</w:t>
+      </w:r>
+      <w:r>
+        <w:t xml:space="preserve"> — fragment alt</w:t>
+      </w:r>
+    </w:p>
+    <w:p>
+      <w:r>
+        <w:t>Przebieg procesu zależy od decyzji Administratora w gałęziach alt:</w:t>
+      </w:r>
+    </w:p>
+    <w:p/>
+    <w:p>
+      <w:pPr>
+        <w:rPr>
+          <w:b/>
+        </w:rPr>
+      </w:pPr>
+      <w:r>
+        <w:rPr>
+          <w:b/>
+        </w:rPr>
+        <w:t>Gałąź [Zatwierdzenie zmian]:</w:t>
+      </w:r>
+    </w:p>
+    <w:p>
+      <w:r>
+        <w:rPr>
+          <w:b/>
+        </w:rPr>
+        <w:t>Komunikat 5:</w:t>
+      </w:r>
+      <w:r>
+        <w:t xml:space="preserve"> Aktor wywołuje na obiekcie </w:t>
       </w:r>
       <w:proofErr w:type="spellStart"/>
       <w:r>
-        <w:rPr>
-          <w:lang w:val="pl-PL"/>
-        </w:rPr>
+        <w:t>admin:Administrator</w:t>
+      </w:r>
+      <w:proofErr w:type="spellEnd"/>
+      <w:r>
+        <w:t xml:space="preserve"> metodę </w:t>
+      </w:r>
+      <w:proofErr w:type="spellStart"/>
+      <w:r>
+        <w:t>zatwierdzZmianyKonta</w:t>
+      </w:r>
+      <w:proofErr w:type="spellEnd"/>
+      <w:r>
+        <w:t>(</w:t>
+      </w:r>
+      <w:proofErr w:type="spellStart"/>
+      <w:r>
+        <w:t>wybra</w:t>
+      </w:r>
+      <w:r>
+        <w:t>nyUzytkownik</w:t>
+      </w:r>
+      <w:proofErr w:type="spellEnd"/>
+      <w:r>
+        <w:t>).</w:t>
+      </w:r>
+    </w:p>
+    <w:p>
+      <w:r>
+        <w:rPr>
+          <w:b/>
+        </w:rPr>
+        <w:t>Komunikat 6:</w:t>
+      </w:r>
+      <w:r>
+        <w:t xml:space="preserve"> Obiekt </w:t>
+      </w:r>
+      <w:proofErr w:type="spellStart"/>
+      <w:r>
+        <w:t>admin:Administrator</w:t>
+      </w:r>
+      <w:proofErr w:type="spellEnd"/>
+      <w:r>
+        <w:t xml:space="preserve"> wywołuje na obiekcie </w:t>
+      </w:r>
+      <w:proofErr w:type="spellStart"/>
+      <w:r>
+        <w:t>użytkownik:Użytkownik</w:t>
+      </w:r>
+      <w:proofErr w:type="spellEnd"/>
+      <w:r>
+        <w:t xml:space="preserve"> metodę </w:t>
+      </w:r>
+      <w:proofErr w:type="spellStart"/>
+      <w:r>
+        <w:t>aktualizujStan</w:t>
+      </w:r>
+      <w:proofErr w:type="spellEnd"/>
+      <w:r>
+        <w:t>()</w:t>
+      </w:r>
+      <w:r>
+        <w:t>, aby zapisać nowe uprawnienia.</w:t>
+      </w:r>
+    </w:p>
+    <w:p>
+      <w:r>
+        <w:rPr>
+          <w:b/>
+        </w:rPr>
+        <w:t>Komunikat 7 (zwrot):</w:t>
+      </w:r>
+      <w:r>
+        <w:t xml:space="preserve"> Obiekt </w:t>
+      </w:r>
+      <w:proofErr w:type="spellStart"/>
+      <w:r>
+        <w:t>użytkownik:Użytkownik</w:t>
+      </w:r>
+      <w:proofErr w:type="spellEnd"/>
+      <w:r>
+        <w:t xml:space="preserve"> zwraca potwierdzenie wykonania operacji do obiektu </w:t>
+      </w:r>
+      <w:proofErr w:type="spellStart"/>
+      <w:r>
+        <w:t>admin:Administrator</w:t>
+      </w:r>
+      <w:proofErr w:type="spellEnd"/>
+      <w:r>
+        <w:t>.</w:t>
+      </w:r>
+    </w:p>
+    <w:p>
+      <w:r>
+        <w:rPr>
+          <w:b/>
+        </w:rPr>
+        <w:t>Komunikat 8 (zwrot):</w:t>
+      </w:r>
+      <w:r>
+        <w:t xml:space="preserve"> Obiekt </w:t>
+      </w:r>
+      <w:proofErr w:type="spellStart"/>
+      <w:r>
+        <w:t>admin:Administrator</w:t>
+      </w:r>
+      <w:proofErr w:type="spellEnd"/>
+      <w:r>
+        <w:t xml:space="preserve"> zwraca wartość </w:t>
+      </w:r>
+      <w:proofErr w:type="spellStart"/>
+      <w:r>
         <w:t>true</w:t>
       </w:r>
       <w:proofErr w:type="spellEnd"/>
       <w:r>
-        <w:rPr>
-          <w:lang w:val="pl-PL"/>
-        </w:rPr>
-        <w:t>.</w:t>
-      </w:r>
-    </w:p>
-    <w:p>
-      <w:pPr>
-        <w:rPr>
-          <w:lang w:val="pl-PL"/>
-        </w:rPr>
-      </w:pPr>
-      <w:r>
-        <w:rPr>
-          <w:b/>
-          <w:bCs/>
-          <w:lang w:val="pl-PL"/>
-        </w:rPr>
-        <w:t>Komunikat 5:</w:t>
-      </w:r>
-      <w:r>
-        <w:rPr>
-          <w:lang w:val="pl-PL"/>
-        </w:rPr>
-        <w:t> Obiekt instruktor wywołuje na rezerwacja metodę </w:t>
-      </w:r>
-      <w:proofErr w:type="spellStart"/>
-      <w:r>
-        <w:rPr>
-          <w:lang w:val="pl-PL"/>
-        </w:rPr>
-        <w:t>zmienStatus</w:t>
-      </w:r>
-      <w:proofErr w:type="spellEnd"/>
-      <w:r>
-        <w:rPr>
-          <w:lang w:val="pl-PL"/>
-        </w:rPr>
-        <w:t>("zweryfikowany").</w:t>
-      </w:r>
-    </w:p>
-    <w:p>
-      <w:pPr>
-        <w:rPr>
-          <w:lang w:val="pl-PL"/>
-        </w:rPr>
-      </w:pPr>
-      <w:r>
-        <w:rPr>
-          <w:b/>
-          <w:bCs/>
-          <w:lang w:val="pl-PL"/>
-        </w:rPr>
-        <w:t>Komunikat 6:</w:t>
-      </w:r>
-      <w:r>
-        <w:rPr>
-          <w:lang w:val="pl-PL"/>
-        </w:rPr>
-        <w:t> Obiekt instruktor zwraca wartość </w:t>
-      </w:r>
-      <w:proofErr w:type="spellStart"/>
-      <w:r>
-        <w:rPr>
-          <w:lang w:val="pl-PL"/>
-        </w:rPr>
-        <w:t>true</w:t>
-      </w:r>
-      <w:proofErr w:type="spellEnd"/>
-      <w:r>
-        <w:rPr>
-          <w:lang w:val="pl-PL"/>
-        </w:rPr>
-        <w:t>. Rezerwacja zostaje zweryfikowana; pętla się kończy.</w:t>
-      </w:r>
-    </w:p>
-    <w:p>
-      <w:pPr>
-        <w:rPr>
-          <w:lang w:val="pl-PL"/>
-        </w:rPr>
-      </w:pPr>
-    </w:p>
-    <w:p>
-      <w:pPr>
-        <w:rPr>
-          <w:lang w:val="pl-PL"/>
-        </w:rPr>
-      </w:pPr>
-      <w:r>
-        <w:rPr>
-          <w:b/>
-          <w:bCs/>
-          <w:lang w:val="pl-PL"/>
-        </w:rPr>
-        <w:t xml:space="preserve">3. </w:t>
-      </w:r>
-      <w:proofErr w:type="spellStart"/>
-      <w:r>
-        <w:rPr>
-          <w:b/>
-          <w:bCs/>
-          <w:lang w:val="pl-PL"/>
-        </w:rPr>
-        <w:t>Check</w:t>
-      </w:r>
-      <w:proofErr w:type="spellEnd"/>
-      <w:r>
-        <w:rPr>
-          <w:b/>
-          <w:bCs/>
-          <w:lang w:val="pl-PL"/>
-        </w:rPr>
-        <w:t>-in</w:t>
-      </w:r>
-    </w:p>
-    <w:p>
-      <w:pPr>
-        <w:rPr>
-          <w:lang w:val="pl-PL"/>
-        </w:rPr>
-      </w:pPr>
-      <w:r>
-        <w:rPr>
-          <w:lang w:val="pl-PL"/>
-        </w:rPr>
-        <w:t>Instruktor klika przycisk „</w:t>
-      </w:r>
-      <w:proofErr w:type="spellStart"/>
-      <w:r>
-        <w:rPr>
-          <w:lang w:val="pl-PL"/>
-        </w:rPr>
-        <w:t>Check</w:t>
-      </w:r>
-      <w:proofErr w:type="spellEnd"/>
-      <w:r>
-        <w:rPr>
-          <w:lang w:val="pl-PL"/>
-        </w:rPr>
-        <w:t>-in”.</w:t>
-      </w:r>
-    </w:p>
-    <w:p>
-      <w:pPr>
-        <w:rPr>
-          <w:lang w:val="pl-PL"/>
-        </w:rPr>
-      </w:pPr>
-      <w:r>
-        <w:rPr>
-          <w:b/>
-          <w:bCs/>
-          <w:lang w:val="pl-PL"/>
-        </w:rPr>
-        <w:t>Komunikat 7:</w:t>
-      </w:r>
-      <w:r>
-        <w:rPr>
-          <w:lang w:val="pl-PL"/>
-        </w:rPr>
-        <w:t> Aktor wywołuje na obiekcie instruktor metodę </w:t>
-      </w:r>
-      <w:proofErr w:type="spellStart"/>
-      <w:r>
-        <w:rPr>
-          <w:lang w:val="pl-PL"/>
-        </w:rPr>
-        <w:t>wykonajCheckIn</w:t>
-      </w:r>
-      <w:proofErr w:type="spellEnd"/>
-      <w:r>
-        <w:rPr>
-          <w:lang w:val="pl-PL"/>
-        </w:rPr>
-        <w:t>(rezerwacja).</w:t>
-      </w:r>
-    </w:p>
-    <w:p>
-      <w:pPr>
-        <w:rPr>
-          <w:lang w:val="pl-PL"/>
-        </w:rPr>
-      </w:pPr>
-      <w:r>
-        <w:rPr>
-          <w:b/>
-          <w:bCs/>
-          <w:lang w:val="pl-PL"/>
-        </w:rPr>
-        <w:t>Komunikat 8:</w:t>
-      </w:r>
-      <w:r>
-        <w:rPr>
-          <w:lang w:val="pl-PL"/>
-        </w:rPr>
-        <w:t> Obiekt instruktor tworzy nowy obiekt </w:t>
-      </w:r>
-      <w:proofErr w:type="spellStart"/>
-      <w:r>
-        <w:rPr>
-          <w:lang w:val="pl-PL"/>
-        </w:rPr>
-        <w:t>sesja:SesjaStrzelecka</w:t>
-      </w:r>
-      <w:proofErr w:type="spellEnd"/>
-      <w:r>
-        <w:rPr>
-          <w:lang w:val="pl-PL"/>
-        </w:rPr>
-        <w:t> (&lt;&lt;</w:t>
-      </w:r>
-      <w:proofErr w:type="spellStart"/>
-      <w:r>
-        <w:rPr>
-          <w:lang w:val="pl-PL"/>
-        </w:rPr>
-        <w:t>create</w:t>
-      </w:r>
-      <w:proofErr w:type="spellEnd"/>
-      <w:r>
-        <w:rPr>
-          <w:lang w:val="pl-PL"/>
-        </w:rPr>
-        <w:t>&gt;&gt;).</w:t>
-      </w:r>
-    </w:p>
-    <w:p>
-      <w:pPr>
-        <w:rPr>
-          <w:lang w:val="pl-PL"/>
-        </w:rPr>
-      </w:pPr>
-      <w:r>
-        <w:rPr>
-          <w:b/>
-          <w:bCs/>
-          <w:lang w:val="pl-PL"/>
-        </w:rPr>
-        <w:t>Komunikat 9:</w:t>
-      </w:r>
-      <w:r>
-        <w:rPr>
-          <w:lang w:val="pl-PL"/>
-        </w:rPr>
-        <w:t> Obiekt instruktor wywołuje na rezerwacja metodę </w:t>
-      </w:r>
-      <w:proofErr w:type="spellStart"/>
-      <w:r>
-        <w:rPr>
-          <w:lang w:val="pl-PL"/>
-        </w:rPr>
-        <w:t>zmienStatus</w:t>
-      </w:r>
-      <w:proofErr w:type="spellEnd"/>
-      <w:r>
-        <w:rPr>
-          <w:lang w:val="pl-PL"/>
-        </w:rPr>
-        <w:t>("w trakcie wizyty").</w:t>
-      </w:r>
-    </w:p>
-    <w:p>
-      <w:pPr>
-        <w:rPr>
-          <w:lang w:val="pl-PL"/>
-        </w:rPr>
-      </w:pPr>
-      <w:r>
-        <w:rPr>
-          <w:b/>
-          <w:bCs/>
-          <w:lang w:val="pl-PL"/>
-        </w:rPr>
-        <w:t>Komunikat 10 (zwrot):</w:t>
-      </w:r>
-      <w:r>
-        <w:rPr>
-          <w:lang w:val="pl-PL"/>
-        </w:rPr>
-        <w:t xml:space="preserve"> Obiekt instruktor zwraca utworzony obiekt sesja do aktora. </w:t>
-      </w:r>
-      <w:proofErr w:type="spellStart"/>
-      <w:r>
-        <w:rPr>
-          <w:lang w:val="pl-PL"/>
-        </w:rPr>
-        <w:t>Check</w:t>
-      </w:r>
-      <w:proofErr w:type="spellEnd"/>
-      <w:r>
-        <w:rPr>
-          <w:lang w:val="pl-PL"/>
-        </w:rPr>
-        <w:t>-in zostaje zakończony; rozpoczyna się sesja strzelecka.</w:t>
+        <w:t xml:space="preserve"> do aktora. Zmiany zostały pomyślnie zapisane.</w:t>
+      </w:r>
+    </w:p>
+    <w:p/>
+    <w:p>
+      <w:pPr>
+        <w:rPr>
+          <w:b/>
+        </w:rPr>
+      </w:pPr>
+      <w:r>
+        <w:rPr>
+          <w:b/>
+        </w:rPr>
+        <w:t>Gałąź [Anulowanie]:</w:t>
+      </w:r>
+    </w:p>
+    <w:p>
+      <w:r>
+        <w:t>Administrator rezygnuje z zatwierdzenia zmian. Brak dodatkowych komunikatów – operacja zostaje przerwana, a uprawnienia użytkownika pozostają bez zmian.</w:t>
+      </w:r>
+    </w:p>
+    <w:p/>
+    <w:p/>
+    <w:p/>
+    <w:p/>
+    <w:p/>
+    <w:p/>
+    <w:p/>
+    <w:p/>
+    <w:p/>
+    <w:p/>
+    <w:p/>
+    <w:p/>
+    <w:p/>
+    <w:p/>
+    <w:p/>
+    <w:p/>
+    <w:p/>
+    <w:p>
+      <w:pPr>
+        <w:pStyle w:val="Nagwek2"/>
+      </w:pPr>
+      <w:r>
+        <w:t>5.1.Diagram klas</w:t>
+      </w:r>
+    </w:p>
+    <w:p/>
+    <w:p>
+      <w:r>
+        <w:rPr>
+          <w:noProof/>
+          <w:lang w:val="pl-PL"/>
+        </w:rPr>
+        <w:lastRenderedPageBreak/>
+        <w:drawing>
+          <wp:inline distT="0" distB="0" distL="0" distR="0" wp14:anchorId="7849F836" wp14:editId="293D503A">
+            <wp:extent cx="5733415" cy="3727450"/>
+            <wp:effectExtent l="0" t="0" r="635" b="6350"/>
+            <wp:docPr id="2118031314" name="Obraz 1"/>
+            <wp:cNvGraphicFramePr>
+              <a:graphicFrameLocks xmlns:a="http://schemas.openxmlformats.org/drawingml/2006/main" noChangeAspect="1"/>
+            </wp:cNvGraphicFramePr>
+            <a:graphic xmlns:a="http://schemas.openxmlformats.org/drawingml/2006/main">
+              <a:graphicData uri="http://schemas.openxmlformats.org/drawingml/2006/picture">
+                <pic:pic xmlns:pic="http://schemas.openxmlformats.org/drawingml/2006/picture">
+                  <pic:nvPicPr>
+                    <pic:cNvPr id="2118031314" name=""/>
+                    <pic:cNvPicPr/>
+                  </pic:nvPicPr>
+                  <pic:blipFill>
+                    <a:blip r:embed="rId22"/>
+                    <a:stretch>
+                      <a:fillRect/>
+                    </a:stretch>
+                  </pic:blipFill>
+                  <pic:spPr>
+                    <a:xfrm>
+                      <a:off x="0" y="0"/>
+                      <a:ext cx="5733415" cy="3727450"/>
+                    </a:xfrm>
+                    <a:prstGeom prst="rect">
+                      <a:avLst/>
+                    </a:prstGeom>
+                  </pic:spPr>
+                </pic:pic>
+              </a:graphicData>
+            </a:graphic>
+          </wp:inline>
+        </w:drawing>
+      </w:r>
+    </w:p>
+    <w:p>
+      <w:pPr>
+        <w:pStyle w:val="Nagwek3"/>
+      </w:pPr>
+      <w:r>
+        <w:t>5.2. Uporządkowany alfabetycznie wykaz wszystkich klas</w:t>
       </w:r>
     </w:p>
     <w:p/>
@@ -5415,97 +6123,11 @@
     <w:p/>
     <w:p/>
     <w:p/>
-    <w:p/>
-    <w:p/>
-    <w:p/>
-    <w:p/>
-    <w:p/>
-    <w:p/>
-    <w:p>
-      <w:pPr>
-        <w:pStyle w:val="Nagwek2"/>
-      </w:pPr>
-      <w:r>
-        <w:lastRenderedPageBreak/>
-        <w:t>5.1.Diagram klas</w:t>
-      </w:r>
-    </w:p>
-    <w:p/>
-    <w:p>
-      <w:r>
-        <w:rPr>
-          <w:noProof/>
-        </w:rPr>
-        <w:drawing>
-          <wp:inline distT="0" distB="0" distL="0" distR="0" wp14:anchorId="7849F836" wp14:editId="293D503A">
-            <wp:extent cx="5733415" cy="3727450"/>
-            <wp:effectExtent l="0" t="0" r="635" b="6350"/>
-            <wp:docPr id="2118031314" name="Obraz 1"/>
-            <wp:cNvGraphicFramePr>
-              <a:graphicFrameLocks xmlns:a="http://schemas.openxmlformats.org/drawingml/2006/main" noChangeAspect="1"/>
-            </wp:cNvGraphicFramePr>
-            <a:graphic xmlns:a="http://schemas.openxmlformats.org/drawingml/2006/main">
-              <a:graphicData uri="http://schemas.openxmlformats.org/drawingml/2006/picture">
-                <pic:pic xmlns:pic="http://schemas.openxmlformats.org/drawingml/2006/picture">
-                  <pic:nvPicPr>
-                    <pic:cNvPr id="2118031314" name=""/>
-                    <pic:cNvPicPr/>
-                  </pic:nvPicPr>
-                  <pic:blipFill>
-                    <a:blip r:embed="rId20"/>
-                    <a:stretch>
-                      <a:fillRect/>
-                    </a:stretch>
-                  </pic:blipFill>
-                  <pic:spPr>
-                    <a:xfrm>
-                      <a:off x="0" y="0"/>
-                      <a:ext cx="5733415" cy="3727450"/>
-                    </a:xfrm>
-                    <a:prstGeom prst="rect">
-                      <a:avLst/>
-                    </a:prstGeom>
-                  </pic:spPr>
-                </pic:pic>
-              </a:graphicData>
-            </a:graphic>
-          </wp:inline>
-        </w:drawing>
-      </w:r>
-    </w:p>
     <w:p>
       <w:pPr>
         <w:pStyle w:val="Nagwek3"/>
       </w:pPr>
       <w:r>
-        <w:t>5.2. Uporządkowany alfabetycznie wykaz wszystkich klas</w:t>
-      </w:r>
-    </w:p>
-    <w:p/>
-    <w:p/>
-    <w:p/>
-    <w:p/>
-    <w:p/>
-    <w:p/>
-    <w:p/>
-    <w:p/>
-    <w:p/>
-    <w:p/>
-    <w:p/>
-    <w:p/>
-    <w:p/>
-    <w:p/>
-    <w:p/>
-    <w:p/>
-    <w:p/>
-    <w:p/>
-    <w:p/>
-    <w:p>
-      <w:pPr>
-        <w:pStyle w:val="Nagwek3"/>
-      </w:pPr>
-      <w:r>
-        <w:lastRenderedPageBreak/>
         <w:t>5.3. Diagramy stanów</w:t>
       </w:r>
     </w:p>
@@ -5896,7 +6518,6 @@
           <w:b/>
           <w:bCs/>
         </w:rPr>
-        <w:lastRenderedPageBreak/>
         <w:t>Wojciech Cimochowski</w:t>
       </w:r>
     </w:p>
@@ -5929,7 +6550,9 @@
           <w:b/>
           <w:bCs/>
           <w:noProof/>
-        </w:rPr>
+          <w:lang w:val="pl-PL"/>
+        </w:rPr>
+        <w:lastRenderedPageBreak/>
         <w:drawing>
           <wp:inline distT="0" distB="0" distL="0" distR="0" wp14:anchorId="4B4B123D" wp14:editId="4A3BCBAF">
             <wp:extent cx="5727700" cy="6496050"/>
@@ -5948,7 +6571,7 @@
                     </pic:cNvPicPr>
                   </pic:nvPicPr>
                   <pic:blipFill>
-                    <a:blip r:embed="rId21">
+                    <a:blip r:embed="rId23">
                       <a:extLst>
                         <a:ext uri="{28A0092B-C50C-407E-A947-70E740481C1C}">
                           <a14:useLocalDpi xmlns:a14="http://schemas.microsoft.com/office/drawing/2010/main" val="0"/>
@@ -5991,6 +6614,20 @@
     </w:p>
     <w:p>
       <w:pPr>
+        <w:pStyle w:val="Nagwek2"/>
+      </w:pPr>
+      <w:r>
+        <w:t>6</w:t>
+      </w:r>
+      <w:r>
+        <w:t xml:space="preserve">. </w:t>
+      </w:r>
+      <w:r>
+        <w:t>Wymagania niefunkcjonalne dla bazy danych</w:t>
+      </w:r>
+    </w:p>
+    <w:p>
+      <w:pPr>
         <w:ind w:left="360"/>
         <w:rPr>
           <w:b/>
@@ -6000,6 +6637,285 @@
     </w:p>
     <w:p>
       <w:pPr>
+        <w:pStyle w:val="Nagwek3"/>
+      </w:pPr>
+      <w:r>
+        <w:lastRenderedPageBreak/>
+        <w:t>6</w:t>
+      </w:r>
+      <w:r>
+        <w:t xml:space="preserve">.1. </w:t>
+      </w:r>
+      <w:r>
+        <w:t>Oszacowanie wielkości bazy danych</w:t>
+      </w:r>
+    </w:p>
+    <w:p>
+      <w:pPr>
+        <w:pStyle w:val="Nagwek3"/>
+        <w:rPr>
+          <w:color w:val="auto"/>
+          <w:sz w:val="22"/>
+          <w:szCs w:val="22"/>
+        </w:rPr>
+      </w:pPr>
+      <w:r>
+        <w:rPr>
+          <w:color w:val="auto"/>
+          <w:sz w:val="22"/>
+          <w:szCs w:val="22"/>
+        </w:rPr>
+        <w:t xml:space="preserve">System obsługuje strzelnicę z kilkoma osiami strzeleckimi i nieznaną z góry liczbą klientów dziennie. Najaktywniej zapełnianą tabelą będzie Rezerwacja, ponieważ każda wizyta generuje nowy rekord. Podobnie tabele </w:t>
+      </w:r>
+      <w:proofErr w:type="spellStart"/>
+      <w:r>
+        <w:rPr>
+          <w:color w:val="auto"/>
+          <w:sz w:val="22"/>
+          <w:szCs w:val="22"/>
+        </w:rPr>
+        <w:t>SesjaStrzelecka</w:t>
+      </w:r>
+      <w:proofErr w:type="spellEnd"/>
+      <w:r>
+        <w:rPr>
+          <w:color w:val="auto"/>
+          <w:sz w:val="22"/>
+          <w:szCs w:val="22"/>
+        </w:rPr>
+        <w:t xml:space="preserve"> i </w:t>
+      </w:r>
+      <w:proofErr w:type="spellStart"/>
+      <w:r>
+        <w:rPr>
+          <w:color w:val="auto"/>
+          <w:sz w:val="22"/>
+          <w:szCs w:val="22"/>
+        </w:rPr>
+        <w:t>SzczegolyZuzycia</w:t>
+      </w:r>
+      <w:proofErr w:type="spellEnd"/>
+      <w:r>
+        <w:rPr>
+          <w:color w:val="auto"/>
+          <w:sz w:val="22"/>
+          <w:szCs w:val="22"/>
+        </w:rPr>
+        <w:t xml:space="preserve"> będą regularnie uzupełniane przy każdej odbytej wizyty. Tabele </w:t>
+      </w:r>
+      <w:proofErr w:type="spellStart"/>
+      <w:r>
+        <w:rPr>
+          <w:color w:val="auto"/>
+          <w:sz w:val="22"/>
+          <w:szCs w:val="22"/>
+        </w:rPr>
+        <w:t>EgzemplarzBroni</w:t>
+      </w:r>
+      <w:proofErr w:type="spellEnd"/>
+      <w:r>
+        <w:rPr>
+          <w:color w:val="auto"/>
+          <w:sz w:val="22"/>
+          <w:szCs w:val="22"/>
+        </w:rPr>
+        <w:t xml:space="preserve"> i </w:t>
+      </w:r>
+      <w:proofErr w:type="spellStart"/>
+      <w:r>
+        <w:rPr>
+          <w:color w:val="auto"/>
+          <w:sz w:val="22"/>
+          <w:szCs w:val="22"/>
+        </w:rPr>
+        <w:t>AmunicjaMagazyn</w:t>
+      </w:r>
+      <w:proofErr w:type="spellEnd"/>
+      <w:r>
+        <w:rPr>
+          <w:color w:val="auto"/>
+          <w:sz w:val="22"/>
+          <w:szCs w:val="22"/>
+        </w:rPr>
+        <w:t xml:space="preserve"> będą natomiast małe i stosunkowo statyczne, ponieważ liczba egzemplarzy broni i typów amunicji na strzelnicy zmienia się rzadko. Tabele </w:t>
+      </w:r>
+      <w:proofErr w:type="spellStart"/>
+      <w:r>
+        <w:rPr>
+          <w:color w:val="auto"/>
+          <w:sz w:val="22"/>
+          <w:szCs w:val="22"/>
+        </w:rPr>
+        <w:t>Uzytkownik</w:t>
+      </w:r>
+      <w:proofErr w:type="spellEnd"/>
+      <w:r>
+        <w:rPr>
+          <w:color w:val="auto"/>
+          <w:sz w:val="22"/>
+          <w:szCs w:val="22"/>
+        </w:rPr>
+        <w:t xml:space="preserve"> i Klient będą rosły stopniowo wraz z rejestracją nowych osób.</w:t>
+      </w:r>
+    </w:p>
+    <w:p>
+      <w:pPr>
+        <w:pStyle w:val="Nagwek3"/>
+        <w:rPr>
+          <w:color w:val="auto"/>
+          <w:sz w:val="22"/>
+          <w:szCs w:val="22"/>
+        </w:rPr>
+      </w:pPr>
+      <w:r>
+        <w:rPr>
+          <w:color w:val="auto"/>
+          <w:sz w:val="22"/>
+          <w:szCs w:val="22"/>
+        </w:rPr>
+        <w:t>Biorąc pod uwagę charakter danych tekstowych i liczbowych przechowywanych w systemie oraz dostępną przestrzeń dyskową serwera wynoszącą 4 TB, baza danych nie zbliży się do jej zapełnienia w żadnym przewidywalnym horyzoncie czasowym działania strzelnicy.</w:t>
+      </w:r>
+    </w:p>
+    <w:p>
+      <w:pPr>
+        <w:pStyle w:val="Nagwek3"/>
+      </w:pPr>
+      <w:bookmarkStart w:id="9" w:name="_GoBack"/>
+      <w:bookmarkEnd w:id="9"/>
+      <w:r>
+        <w:t>6.2</w:t>
+      </w:r>
+      <w:r>
+        <w:t xml:space="preserve">. </w:t>
+      </w:r>
+      <w:r>
+        <w:t>Propozycja wymaganych czasów odpowiedzi</w:t>
+      </w:r>
+    </w:p>
+    <w:p/>
+    <w:p>
+      <w:r>
+        <w:rPr>
+          <w:b/>
+        </w:rPr>
+        <w:t>Operacje wykonywane</w:t>
+      </w:r>
+      <w:r>
+        <w:t xml:space="preserve"> przez klienta takie jak składanie rezerwacji i przeglądanie statystyk powinny kończyć się w czasie do 2 sekund.</w:t>
+      </w:r>
+    </w:p>
+    <w:p>
+      <w:r>
+        <w:rPr>
+          <w:b/>
+        </w:rPr>
+        <w:t>Operacje krytyczne</w:t>
+      </w:r>
+      <w:r>
+        <w:t xml:space="preserve"> po stronie instruktora takie jak weryfikacja dokumentu i wykonanie </w:t>
+      </w:r>
+      <w:proofErr w:type="spellStart"/>
+      <w:r>
+        <w:t>check</w:t>
+      </w:r>
+      <w:proofErr w:type="spellEnd"/>
+      <w:r>
+        <w:t>-in powinny być realizowane w czasie do 1 sekundy, ponieważ wykonywane są przy obecności klienta i bezpośrednio wpływają na przepustowość strzelnicy.</w:t>
+      </w:r>
+    </w:p>
+    <w:p>
+      <w:r>
+        <w:rPr>
+          <w:b/>
+        </w:rPr>
+        <w:t>Operacje administracyjne</w:t>
+      </w:r>
+      <w:r>
+        <w:t xml:space="preserve"> takie jak filtrowanie użytkowników i generowanie raportów mogą trwać</w:t>
+      </w:r>
+      <w:r>
+        <w:t xml:space="preserve"> do 5 sekund ze względu na ich okazjonalny</w:t>
+      </w:r>
+      <w:r>
+        <w:t xml:space="preserve"> charakter.</w:t>
+      </w:r>
+    </w:p>
+    <w:p>
+      <w:pPr>
+        <w:pStyle w:val="Nagwek3"/>
+      </w:pPr>
+      <w:r>
+        <w:t>6.3</w:t>
+      </w:r>
+      <w:r>
+        <w:t xml:space="preserve">. </w:t>
+      </w:r>
+      <w:r>
+        <w:t>Oszacowanie ilości i typów potrzebnych stanowisk pracy użytkowników systemu</w:t>
+      </w:r>
+    </w:p>
+    <w:p/>
+    <w:p>
+      <w:pPr>
+        <w:rPr>
+          <w:b/>
+        </w:rPr>
+      </w:pPr>
+      <w:r>
+        <w:rPr>
+          <w:b/>
+        </w:rPr>
+        <w:t>W systemie wyróżnia się trzy typy stanowisk.</w:t>
+      </w:r>
+    </w:p>
+    <w:p>
+      <w:r>
+        <w:rPr>
+          <w:b/>
+        </w:rPr>
+        <w:t>Stanowisko klienta</w:t>
+      </w:r>
+      <w:r>
+        <w:t xml:space="preserve"> nie wymaga żadnego dedykowanego sprzętu. Klient korzysta z własnego urządzenia przez przeglądarkę internetową. Liczba stanowisk jest nieograniczona.</w:t>
+      </w:r>
+    </w:p>
+    <w:p>
+      <w:r>
+        <w:rPr>
+          <w:b/>
+        </w:rPr>
+        <w:t>Stanowisko instruktora</w:t>
+      </w:r>
+      <w:r>
+        <w:t xml:space="preserve"> to tablet lub terminal przy każdej osi strzeleckiej podłączony do sieci LAN. Dla strzelnicy kilkustanowiskowej potrzebne są 2 do 5 urządzeń.</w:t>
+      </w:r>
+    </w:p>
+    <w:p>
+      <w:r>
+        <w:rPr>
+          <w:b/>
+        </w:rPr>
+        <w:t>Stanowisko administratora</w:t>
+      </w:r>
+      <w:r>
+        <w:t xml:space="preserve"> to jeden komputer stacjonarny lub laptop w biurze strzelnicy, z dostępem do sieci lokalnej i serwera bazy danych.</w:t>
+      </w:r>
+    </w:p>
+    <w:p>
+      <w:r>
+        <w:t>Łącznie strzelnica potrzebuje od 3 do 6 fizycznych stanowisk pracy po stronie personelu.</w:t>
+      </w:r>
+    </w:p>
+    <w:p>
+      <w:pPr>
+        <w:rPr>
+          <w:b/>
+          <w:bCs/>
+        </w:rPr>
+      </w:pPr>
+    </w:p>
+    <w:p>
+      <w:pPr>
         <w:ind w:left="360"/>
         <w:rPr>
           <w:b/>
@@ -6033,57 +6949,11 @@
           <w:bCs/>
         </w:rPr>
       </w:pPr>
-    </w:p>
-    <w:p>
-      <w:pPr>
-        <w:ind w:left="360"/>
-        <w:rPr>
-          <w:b/>
-          <w:bCs/>
-        </w:rPr>
-      </w:pPr>
-    </w:p>
-    <w:p>
-      <w:pPr>
-        <w:ind w:left="360"/>
-        <w:rPr>
-          <w:b/>
-          <w:bCs/>
-        </w:rPr>
-      </w:pPr>
-    </w:p>
-    <w:p>
-      <w:pPr>
-        <w:ind w:left="360"/>
-        <w:rPr>
-          <w:b/>
-          <w:bCs/>
-        </w:rPr>
-      </w:pPr>
-    </w:p>
-    <w:p>
-      <w:pPr>
-        <w:ind w:left="360"/>
-        <w:rPr>
-          <w:b/>
-          <w:bCs/>
-        </w:rPr>
-      </w:pPr>
-    </w:p>
-    <w:p>
-      <w:pPr>
-        <w:ind w:left="360"/>
-        <w:rPr>
-          <w:b/>
-          <w:bCs/>
-        </w:rPr>
-      </w:pPr>
-      <w:r>
-        <w:rPr>
-          <w:b/>
-          <w:bCs/>
-        </w:rPr>
-        <w:lastRenderedPageBreak/>
+      <w:r>
+        <w:rPr>
+          <w:b/>
+          <w:bCs/>
+        </w:rPr>
         <w:t>Opis elementów:</w:t>
       </w:r>
     </w:p>
@@ -6269,6 +7139,7 @@
                 <w:bCs/>
                 <w:lang w:val="pl-PL"/>
               </w:rPr>
+              <w:lastRenderedPageBreak/>
               <w:t>WymagaWeryfikacji</w:t>
             </w:r>
             <w:proofErr w:type="spellEnd"/>
@@ -7535,6 +8406,7 @@
       <w:r>
         <w:rPr>
           <w:noProof/>
+          <w:lang w:val="pl-PL"/>
         </w:rPr>
         <w:drawing>
           <wp:inline distT="0" distB="0" distL="0" distR="0" wp14:anchorId="686B21A3" wp14:editId="038ED007">
@@ -7554,7 +8426,7 @@
                     </pic:cNvPicPr>
                   </pic:nvPicPr>
                   <pic:blipFill>
-                    <a:blip r:embed="rId22" cstate="print">
+                    <a:blip r:embed="rId24" cstate="print">
                       <a:extLst>
                         <a:ext uri="{28A0092B-C50C-407E-A947-70E740481C1C}">
                           <a14:useLocalDpi xmlns:a14="http://schemas.microsoft.com/office/drawing/2010/main" val="0"/>
@@ -7807,6 +8679,10 @@
     <w:p/>
     <w:p>
       <w:r>
+        <w:rPr>
+          <w:noProof/>
+          <w:lang w:val="pl-PL"/>
+        </w:rPr>
         <w:drawing>
           <wp:inline distT="0" distB="0" distL="0" distR="0" wp14:anchorId="4FA8950A" wp14:editId="440FAD75">
             <wp:extent cx="5733415" cy="4370705"/>
@@ -7823,7 +8699,7 @@
                     <pic:cNvPicPr/>
                   </pic:nvPicPr>
                   <pic:blipFill>
-                    <a:blip r:embed="rId23"/>
+                    <a:blip r:embed="rId25"/>
                     <a:stretch>
                       <a:fillRect/>
                     </a:stretch>
@@ -10149,7 +11025,7 @@
 </file>
 
 <file path=word/numbering.xml><?xml version="1.0" encoding="utf-8"?>
-<w:numbering xmlns:wpc="http://schemas.microsoft.com/office/word/2010/wordprocessingCanvas" xmlns:cx="http://schemas.microsoft.com/office/drawing/2014/chartex" xmlns:cx1="http://schemas.microsoft.com/office/drawing/2015/9/8/chartex" xmlns:cx2="http://schemas.microsoft.com/office/drawing/2015/10/21/chartex" xmlns:cx3="http://schemas.microsoft.com/office/drawing/2016/5/9/chartex" xmlns:cx4="http://schemas.microsoft.com/office/drawing/2016/5/10/chartex" xmlns:cx5="http://schemas.microsoft.com/office/drawing/2016/5/11/chartex" xmlns:cx6="http://schemas.microsoft.com/office/drawing/2016/5/12/chartex" xmlns:cx7="http://schemas.microsoft.com/office/drawing/2016/5/13/chartex" xmlns:cx8="http://schemas.microsoft.com/office/drawing/2016/5/14/chartex" xmlns:mc="http://schemas.openxmlformats.org/markup-compatibility/2006" xmlns:aink="http://schemas.microsoft.com/office/drawing/2016/ink" xmlns:am3d="http://schemas.microsoft.com/office/drawing/2017/model3d" xmlns:o="urn:schemas-microsoft-com:office:office" xmlns:oel="http://schemas.microsoft.com/office/2019/extlst" xmlns:r="http://schemas.openxmlformats.org/officeDocument/2006/relationships" xmlns:m="http://schemas.openxmlformats.org/officeDocument/2006/math" xmlns:v="urn:schemas-microsoft-com:vml" xmlns:wp14="http://schemas.microsoft.com/office/word/2010/wordprocessingDrawing" xmlns:wp="http://schemas.openxmlformats.org/drawingml/2006/wordprocessingDrawing" xmlns:w10="urn:schemas-microsoft-com:office:word" xmlns:w="http://schemas.openxmlformats.org/wordprocessingml/2006/main" xmlns:w14="http://schemas.microsoft.com/office/word/2010/wordml" xmlns:w15="http://schemas.microsoft.com/office/word/2012/wordml" xmlns:w16cex="http://schemas.microsoft.com/office/word/2018/wordml/cex" xmlns:w16cid="http://schemas.microsoft.com/office/word/2016/wordml/cid" xmlns:w16="http://schemas.microsoft.com/office/word/2018/wordml" xmlns:w16du="http://schemas.microsoft.com/office/word/2023/wordml/word16du" xmlns:w16sdtdh="http://schemas.microsoft.com/office/word/2020/wordml/sdtdatahash" xmlns:w16sdtfl="http://schemas.microsoft.com/office/word/2024/wordml/sdtformatlock" xmlns:w16se="http://schemas.microsoft.com/office/word/2015/wordml/symex" xmlns:wpg="http://schemas.microsoft.com/office/word/2010/wordprocessingGroup" xmlns:wpi="http://schemas.microsoft.com/office/word/2010/wordprocessingInk" xmlns:wne="http://schemas.microsoft.com/office/word/2006/wordml" xmlns:wps="http://schemas.microsoft.com/office/word/2010/wordprocessingShape" mc:Ignorable="w14 w15 w16se w16cid w16 w16cex w16sdtdh w16sdtfl w16du wp14">
+<w:numbering xmlns:wpc="http://schemas.microsoft.com/office/word/2010/wordprocessingCanvas" xmlns:mc="http://schemas.openxmlformats.org/markup-compatibility/2006" xmlns:o="urn:schemas-microsoft-com:office:office" xmlns:r="http://schemas.openxmlformats.org/officeDocument/2006/relationships" xmlns:m="http://schemas.openxmlformats.org/officeDocument/2006/math" xmlns:v="urn:schemas-microsoft-com:vml" xmlns:wp14="http://schemas.microsoft.com/office/word/2010/wordprocessingDrawing" xmlns:wp="http://schemas.openxmlformats.org/drawingml/2006/wordprocessingDrawing" xmlns:w10="urn:schemas-microsoft-com:office:word" xmlns:w="http://schemas.openxmlformats.org/wordprocessingml/2006/main" xmlns:w14="http://schemas.microsoft.com/office/word/2010/wordml" xmlns:w15="http://schemas.microsoft.com/office/word/2012/wordml" xmlns:wpg="http://schemas.microsoft.com/office/word/2010/wordprocessingGroup" xmlns:wpi="http://schemas.microsoft.com/office/word/2010/wordprocessingInk" xmlns:wne="http://schemas.microsoft.com/office/word/2006/wordml" xmlns:wps="http://schemas.microsoft.com/office/word/2010/wordprocessingShape" mc:Ignorable="w14 w15 wp14">
   <w:abstractNum w:abstractNumId="0" w15:restartNumberingAfterBreak="0">
     <w:nsid w:val="02A64850"/>
     <w:multiLevelType w:val="multilevel"/>
@@ -15040,113 +15916,113 @@
       </w:rPr>
     </w:lvl>
   </w:abstractNum>
-  <w:num w:numId="1" w16cid:durableId="887839754">
+  <w:num w:numId="1">
     <w:abstractNumId w:val="0"/>
   </w:num>
-  <w:num w:numId="2" w16cid:durableId="1095515092">
+  <w:num w:numId="2">
     <w:abstractNumId w:val="33"/>
   </w:num>
-  <w:num w:numId="3" w16cid:durableId="1685980699">
+  <w:num w:numId="3">
     <w:abstractNumId w:val="29"/>
   </w:num>
-  <w:num w:numId="4" w16cid:durableId="1642424421">
+  <w:num w:numId="4">
     <w:abstractNumId w:val="14"/>
   </w:num>
-  <w:num w:numId="5" w16cid:durableId="871652371">
+  <w:num w:numId="5">
     <w:abstractNumId w:val="15"/>
   </w:num>
-  <w:num w:numId="6" w16cid:durableId="152574065">
+  <w:num w:numId="6">
     <w:abstractNumId w:val="5"/>
   </w:num>
-  <w:num w:numId="7" w16cid:durableId="1809665043">
+  <w:num w:numId="7">
     <w:abstractNumId w:val="22"/>
   </w:num>
-  <w:num w:numId="8" w16cid:durableId="85539847">
+  <w:num w:numId="8">
     <w:abstractNumId w:val="13"/>
   </w:num>
-  <w:num w:numId="9" w16cid:durableId="1909992907">
+  <w:num w:numId="9">
     <w:abstractNumId w:val="4"/>
   </w:num>
-  <w:num w:numId="10" w16cid:durableId="1976793676">
+  <w:num w:numId="10">
     <w:abstractNumId w:val="32"/>
   </w:num>
-  <w:num w:numId="11" w16cid:durableId="1560284771">
+  <w:num w:numId="11">
     <w:abstractNumId w:val="10"/>
   </w:num>
-  <w:num w:numId="12" w16cid:durableId="1788234374">
+  <w:num w:numId="12">
     <w:abstractNumId w:val="8"/>
   </w:num>
-  <w:num w:numId="13" w16cid:durableId="439910382">
+  <w:num w:numId="13">
     <w:abstractNumId w:val="11"/>
   </w:num>
-  <w:num w:numId="14" w16cid:durableId="220094796">
+  <w:num w:numId="14">
     <w:abstractNumId w:val="7"/>
   </w:num>
-  <w:num w:numId="15" w16cid:durableId="1081415116">
+  <w:num w:numId="15">
     <w:abstractNumId w:val="24"/>
   </w:num>
-  <w:num w:numId="16" w16cid:durableId="914120843">
+  <w:num w:numId="16">
     <w:abstractNumId w:val="12"/>
   </w:num>
-  <w:num w:numId="17" w16cid:durableId="1522746502">
+  <w:num w:numId="17">
     <w:abstractNumId w:val="1"/>
   </w:num>
-  <w:num w:numId="18" w16cid:durableId="58404851">
+  <w:num w:numId="18">
     <w:abstractNumId w:val="17"/>
   </w:num>
-  <w:num w:numId="19" w16cid:durableId="1383409678">
+  <w:num w:numId="19">
     <w:abstractNumId w:val="21"/>
   </w:num>
-  <w:num w:numId="20" w16cid:durableId="209615472">
+  <w:num w:numId="20">
     <w:abstractNumId w:val="20"/>
   </w:num>
-  <w:num w:numId="21" w16cid:durableId="1999379974">
+  <w:num w:numId="21">
     <w:abstractNumId w:val="27"/>
   </w:num>
-  <w:num w:numId="22" w16cid:durableId="411659035">
+  <w:num w:numId="22">
     <w:abstractNumId w:val="9"/>
   </w:num>
-  <w:num w:numId="23" w16cid:durableId="2099397295">
+  <w:num w:numId="23">
     <w:abstractNumId w:val="16"/>
   </w:num>
-  <w:num w:numId="24" w16cid:durableId="1138493796">
+  <w:num w:numId="24">
     <w:abstractNumId w:val="3"/>
   </w:num>
-  <w:num w:numId="25" w16cid:durableId="1031496963">
+  <w:num w:numId="25">
     <w:abstractNumId w:val="28"/>
   </w:num>
-  <w:num w:numId="26" w16cid:durableId="1714421965">
+  <w:num w:numId="26">
     <w:abstractNumId w:val="26"/>
   </w:num>
-  <w:num w:numId="27" w16cid:durableId="1757942047">
+  <w:num w:numId="27">
     <w:abstractNumId w:val="25"/>
   </w:num>
-  <w:num w:numId="28" w16cid:durableId="1758751858">
+  <w:num w:numId="28">
     <w:abstractNumId w:val="2"/>
   </w:num>
-  <w:num w:numId="29" w16cid:durableId="783353911">
+  <w:num w:numId="29">
     <w:abstractNumId w:val="23"/>
   </w:num>
-  <w:num w:numId="30" w16cid:durableId="1022975581">
+  <w:num w:numId="30">
     <w:abstractNumId w:val="18"/>
   </w:num>
-  <w:num w:numId="31" w16cid:durableId="815030463">
+  <w:num w:numId="31">
     <w:abstractNumId w:val="19"/>
   </w:num>
-  <w:num w:numId="32" w16cid:durableId="590314998">
+  <w:num w:numId="32">
     <w:abstractNumId w:val="30"/>
   </w:num>
-  <w:num w:numId="33" w16cid:durableId="935094875">
+  <w:num w:numId="33">
     <w:abstractNumId w:val="31"/>
   </w:num>
-  <w:num w:numId="34" w16cid:durableId="1399285488">
+  <w:num w:numId="34">
     <w:abstractNumId w:val="6"/>
   </w:num>
 </w:numbering>
 </file>
 
 <file path=word/styles.xml><?xml version="1.0" encoding="utf-8"?>
-<w:styles xmlns:mc="http://schemas.openxmlformats.org/markup-compatibility/2006" xmlns:r="http://schemas.openxmlformats.org/officeDocument/2006/relationships" xmlns:w="http://schemas.openxmlformats.org/wordprocessingml/2006/main" xmlns:w14="http://schemas.microsoft.com/office/word/2010/wordml" xmlns:w15="http://schemas.microsoft.com/office/word/2012/wordml" xmlns:w16cex="http://schemas.microsoft.com/office/word/2018/wordml/cex" xmlns:w16cid="http://schemas.microsoft.com/office/word/2016/wordml/cid" xmlns:w16="http://schemas.microsoft.com/office/word/2018/wordml" xmlns:w16du="http://schemas.microsoft.com/office/word/2023/wordml/word16du" xmlns:w16sdtdh="http://schemas.microsoft.com/office/word/2020/wordml/sdtdatahash" xmlns:w16sdtfl="http://schemas.microsoft.com/office/word/2024/wordml/sdtformatlock" xmlns:w16se="http://schemas.microsoft.com/office/word/2015/wordml/symex" mc:Ignorable="w14 w15 w16se w16cid w16 w16cex w16sdtdh w16sdtfl w16du">
+<w:styles xmlns:mc="http://schemas.openxmlformats.org/markup-compatibility/2006" xmlns:r="http://schemas.openxmlformats.org/officeDocument/2006/relationships" xmlns:w="http://schemas.openxmlformats.org/wordprocessingml/2006/main" xmlns:w14="http://schemas.microsoft.com/office/word/2010/wordml" xmlns:w15="http://schemas.microsoft.com/office/word/2012/wordml" mc:Ignorable="w14 w15">
   <w:docDefaults>
     <w:rPrDefault>
       <w:rPr>
@@ -15162,7 +16038,7 @@
       </w:pPr>
     </w:pPrDefault>
   </w:docDefaults>
-  <w:latentStyles w:defLockedState="0" w:defUIPriority="99" w:defSemiHidden="0" w:defUnhideWhenUsed="0" w:defQFormat="0" w:count="376">
+  <w:latentStyles w:defLockedState="0" w:defUIPriority="99" w:defSemiHidden="0" w:defUnhideWhenUsed="0" w:defQFormat="0" w:count="371">
     <w:lsdException w:name="Normal" w:uiPriority="0" w:qFormat="1"/>
     <w:lsdException w:name="heading 1" w:uiPriority="9" w:qFormat="1"/>
     <w:lsdException w:name="heading 2" w:semiHidden="1" w:uiPriority="9" w:unhideWhenUsed="1" w:qFormat="1"/>
@@ -15534,11 +16410,6 @@
     <w:lsdException w:name="List Table 5 Dark Accent 6" w:uiPriority="50"/>
     <w:lsdException w:name="List Table 6 Colorful Accent 6" w:uiPriority="51"/>
     <w:lsdException w:name="List Table 7 Colorful Accent 6" w:uiPriority="52"/>
-    <w:lsdException w:name="Mention" w:semiHidden="1" w:unhideWhenUsed="1"/>
-    <w:lsdException w:name="Smart Hyperlink" w:semiHidden="1" w:unhideWhenUsed="1"/>
-    <w:lsdException w:name="Hashtag" w:semiHidden="1" w:unhideWhenUsed="1"/>
-    <w:lsdException w:name="Unresolved Mention" w:semiHidden="1" w:unhideWhenUsed="1"/>
-    <w:lsdException w:name="Smart Link" w:semiHidden="1" w:unhideWhenUsed="1"/>
   </w:latentStyles>
   <w:style w:type="paragraph" w:default="1" w:styleId="Normalny">
     <w:name w:val="Normal"/>
@@ -15659,6 +16530,7 @@
   <w:style w:type="character" w:default="1" w:styleId="Domylnaczcionkaakapitu">
     <w:name w:val="Default Paragraph Font"/>
     <w:uiPriority w:val="1"/>
+    <w:semiHidden/>
     <w:unhideWhenUsed/>
   </w:style>
   <w:style w:type="table" w:default="1" w:styleId="Standardowy">
@@ -15796,7 +16668,7 @@
       <w:u w:val="single"/>
     </w:rPr>
   </w:style>
-  <w:style w:type="character" w:styleId="Nierozpoznanawzmianka">
+  <w:style w:type="character" w:customStyle="1" w:styleId="UnresolvedMention">
     <w:name w:val="Unresolved Mention"/>
     <w:basedOn w:val="Domylnaczcionkaakapitu"/>
     <w:uiPriority w:val="99"/>

</xml_diff>

<commit_message>
diagram pakietow i poprawki
</commit_message>
<xml_diff>
--- a/Downloads/ProjektIO/Projekt IO.docx
+++ b/Downloads/ProjektIO/Projekt IO.docx
@@ -291,17 +291,6 @@
         </w:rPr>
         <w:t xml:space="preserve">Wykonujący Projekt: </w:t>
       </w:r>
-      <w:r>
-        <w:rPr>
-          <w:rFonts w:ascii="Arial" w:hAnsi="Arial" w:cs="Arial"/>
-          <w:b/>
-          <w:bCs/>
-          <w:sz w:val="28"/>
-          <w:szCs w:val="28"/>
-          <w:lang w:val="pl-PL"/>
-        </w:rPr>
-        <w:t>Igor Wróblewski</w:t>
-      </w:r>
     </w:p>
     <w:p>
       <w:pPr>
@@ -310,9 +299,8 @@
         <w:ind w:left="2268" w:hanging="2268"/>
         <w:rPr>
           <w:rFonts w:ascii="Arial" w:hAnsi="Arial" w:cs="Arial"/>
-          <w:b/>
-          <w:sz w:val="26"/>
-          <w:szCs w:val="26"/>
+          <w:i/>
+          <w:iCs/>
           <w:lang w:val="pl-PL"/>
         </w:rPr>
       </w:pPr>
@@ -320,11 +308,12 @@
         <w:rPr>
           <w:rFonts w:ascii="Arial" w:hAnsi="Arial" w:cs="Arial"/>
           <w:b/>
-          <w:sz w:val="26"/>
-          <w:szCs w:val="26"/>
-          <w:lang w:val="pl-PL"/>
-        </w:rPr>
-        <w:t xml:space="preserve">                                    Wojtek Cimochowski</w:t>
+          <w:bCs/>
+          <w:i/>
+          <w:iCs/>
+          <w:lang w:val="pl-PL"/>
+        </w:rPr>
+        <w:t>Igor Wróblewski</w:t>
       </w:r>
     </w:p>
     <w:p>
@@ -335,44 +324,40 @@
         <w:rPr>
           <w:rFonts w:ascii="Arial" w:hAnsi="Arial" w:cs="Arial"/>
           <w:b/>
-          <w:bCs/>
-          <w:sz w:val="26"/>
-          <w:szCs w:val="26"/>
-          <w:lang w:val="pl-PL"/>
-        </w:rPr>
-      </w:pPr>
-      <w:r>
-        <w:rPr>
-          <w:rFonts w:ascii="Arial" w:hAnsi="Arial" w:cs="Arial"/>
           <w:i/>
           <w:iCs/>
-          <w:sz w:val="26"/>
-          <w:szCs w:val="26"/>
-          <w:lang w:val="pl-PL"/>
-        </w:rPr>
-        <w:tab/>
-      </w:r>
+          <w:lang w:val="pl-PL"/>
+        </w:rPr>
+      </w:pPr>
       <w:r>
         <w:rPr>
           <w:rFonts w:ascii="Arial" w:hAnsi="Arial" w:cs="Arial"/>
+          <w:b/>
           <w:i/>
           <w:iCs/>
-          <w:sz w:val="26"/>
-          <w:szCs w:val="26"/>
-          <w:lang w:val="pl-PL"/>
-        </w:rPr>
-        <w:t xml:space="preserve">     </w:t>
+          <w:lang w:val="pl-PL"/>
+        </w:rPr>
+        <w:t>Woj</w:t>
       </w:r>
       <w:r>
         <w:rPr>
           <w:rFonts w:ascii="Arial" w:hAnsi="Arial" w:cs="Arial"/>
           <w:b/>
-          <w:bCs/>
-          <w:sz w:val="26"/>
-          <w:szCs w:val="26"/>
-          <w:lang w:val="pl-PL"/>
-        </w:rPr>
-        <w:t>Kacper Gołowacz</w:t>
+          <w:i/>
+          <w:iCs/>
+          <w:lang w:val="pl-PL"/>
+        </w:rPr>
+        <w:t>ciech</w:t>
+      </w:r>
+      <w:r>
+        <w:rPr>
+          <w:rFonts w:ascii="Arial" w:hAnsi="Arial" w:cs="Arial"/>
+          <w:b/>
+          <w:i/>
+          <w:iCs/>
+          <w:lang w:val="pl-PL"/>
+        </w:rPr>
+        <w:t xml:space="preserve"> Cimochowski</w:t>
       </w:r>
     </w:p>
     <w:p>
@@ -384,17 +369,55 @@
           <w:rFonts w:ascii="Arial" w:hAnsi="Arial" w:cs="Arial"/>
           <w:b/>
           <w:bCs/>
-          <w:sz w:val="26"/>
-          <w:szCs w:val="26"/>
-          <w:lang w:val="pl-PL"/>
-        </w:rPr>
-      </w:pPr>
+          <w:i/>
+          <w:iCs/>
+          <w:lang w:val="pl-PL"/>
+        </w:rPr>
+      </w:pPr>
+      <w:r>
+        <w:rPr>
+          <w:rFonts w:ascii="Arial" w:hAnsi="Arial" w:cs="Arial"/>
+          <w:b/>
+          <w:bCs/>
+          <w:i/>
+          <w:iCs/>
+          <w:lang w:val="pl-PL"/>
+        </w:rPr>
+        <w:t xml:space="preserve">Kacper </w:t>
+      </w:r>
+      <w:proofErr w:type="spellStart"/>
+      <w:r>
+        <w:rPr>
+          <w:rFonts w:ascii="Arial" w:hAnsi="Arial" w:cs="Arial"/>
+          <w:b/>
+          <w:bCs/>
+          <w:i/>
+          <w:iCs/>
+          <w:lang w:val="pl-PL"/>
+        </w:rPr>
+        <w:t>Gołowacz</w:t>
+      </w:r>
+      <w:proofErr w:type="spellEnd"/>
     </w:p>
     <w:p>
       <w:pPr>
         <w:pStyle w:val="Standard"/>
         <w:spacing w:line="360" w:lineRule="auto"/>
         <w:ind w:left="2268" w:hanging="2268"/>
+        <w:rPr>
+          <w:rFonts w:ascii="Arial" w:hAnsi="Arial" w:cs="Arial"/>
+          <w:b/>
+          <w:bCs/>
+          <w:sz w:val="26"/>
+          <w:szCs w:val="26"/>
+          <w:lang w:val="pl-PL"/>
+        </w:rPr>
+      </w:pPr>
+    </w:p>
+    <w:p>
+      <w:pPr>
+        <w:pStyle w:val="Standard"/>
+        <w:spacing w:line="360" w:lineRule="auto"/>
         <w:rPr>
           <w:rFonts w:ascii="Arial" w:hAnsi="Arial" w:cs="Arial"/>
           <w:b/>
@@ -563,9 +586,170 @@
     </w:p>
     <w:p>
       <w:pPr>
-        <w:jc w:val="center"/>
-      </w:pPr>
-    </w:p>
+        <w:pStyle w:val="Standard"/>
+        <w:spacing w:line="360" w:lineRule="auto"/>
+        <w:ind w:left="2268" w:hanging="2268"/>
+        <w:rPr>
+          <w:rFonts w:ascii="Arial" w:hAnsi="Arial" w:cs="Arial"/>
+          <w:b/>
+          <w:bCs/>
+          <w:sz w:val="26"/>
+          <w:szCs w:val="26"/>
+          <w:lang w:val="pl-PL"/>
+        </w:rPr>
+      </w:pPr>
+      <w:r>
+        <w:rPr>
+          <w:rFonts w:ascii="Arial" w:hAnsi="Arial" w:cs="Arial"/>
+          <w:b/>
+          <w:bCs/>
+          <w:sz w:val="26"/>
+          <w:szCs w:val="26"/>
+          <w:lang w:val="pl-PL"/>
+        </w:rPr>
+        <w:t>Podział pracy:</w:t>
+      </w:r>
+    </w:p>
+    <w:p>
+      <w:pPr>
+        <w:pStyle w:val="Standard"/>
+        <w:spacing w:line="360" w:lineRule="auto"/>
+        <w:ind w:left="2268" w:hanging="2268"/>
+        <w:rPr>
+          <w:rFonts w:ascii="Arial" w:hAnsi="Arial" w:cs="Arial"/>
+          <w:i/>
+          <w:iCs/>
+          <w:sz w:val="28"/>
+          <w:szCs w:val="28"/>
+          <w:lang w:val="pl-PL"/>
+        </w:rPr>
+      </w:pPr>
+      <w:r>
+        <w:rPr>
+          <w:rFonts w:ascii="Arial" w:hAnsi="Arial" w:cs="Arial"/>
+          <w:b/>
+          <w:bCs/>
+          <w:i/>
+          <w:iCs/>
+          <w:sz w:val="28"/>
+          <w:szCs w:val="28"/>
+          <w:lang w:val="pl-PL"/>
+        </w:rPr>
+        <w:t>Igor Wróblewski</w:t>
+      </w:r>
+      <w:r>
+        <w:rPr>
+          <w:rFonts w:ascii="Arial" w:hAnsi="Arial" w:cs="Arial"/>
+          <w:b/>
+          <w:bCs/>
+          <w:i/>
+          <w:iCs/>
+          <w:sz w:val="28"/>
+          <w:szCs w:val="28"/>
+          <w:lang w:val="pl-PL"/>
+        </w:rPr>
+        <w:t xml:space="preserve"> – 34%</w:t>
+      </w:r>
+    </w:p>
+    <w:p>
+      <w:pPr>
+        <w:pStyle w:val="Standard"/>
+        <w:spacing w:line="360" w:lineRule="auto"/>
+        <w:ind w:left="2268" w:hanging="2268"/>
+        <w:rPr>
+          <w:rFonts w:ascii="Arial" w:hAnsi="Arial" w:cs="Arial"/>
+          <w:b/>
+          <w:i/>
+          <w:iCs/>
+          <w:sz w:val="26"/>
+          <w:szCs w:val="26"/>
+          <w:lang w:val="pl-PL"/>
+        </w:rPr>
+      </w:pPr>
+      <w:r>
+        <w:rPr>
+          <w:rFonts w:ascii="Arial" w:hAnsi="Arial" w:cs="Arial"/>
+          <w:b/>
+          <w:i/>
+          <w:iCs/>
+          <w:sz w:val="26"/>
+          <w:szCs w:val="26"/>
+          <w:lang w:val="pl-PL"/>
+        </w:rPr>
+        <w:t>Wojciech Cimochowski</w:t>
+      </w:r>
+      <w:r>
+        <w:rPr>
+          <w:rFonts w:ascii="Arial" w:hAnsi="Arial" w:cs="Arial"/>
+          <w:b/>
+          <w:i/>
+          <w:iCs/>
+          <w:sz w:val="26"/>
+          <w:szCs w:val="26"/>
+          <w:lang w:val="pl-PL"/>
+        </w:rPr>
+        <w:t xml:space="preserve"> – 34% </w:t>
+      </w:r>
+    </w:p>
+    <w:p>
+      <w:pPr>
+        <w:pStyle w:val="Standard"/>
+        <w:spacing w:line="360" w:lineRule="auto"/>
+        <w:ind w:left="2268" w:hanging="2268"/>
+        <w:rPr>
+          <w:rFonts w:ascii="Arial" w:hAnsi="Arial" w:cs="Arial"/>
+          <w:b/>
+          <w:bCs/>
+          <w:i/>
+          <w:iCs/>
+          <w:sz w:val="26"/>
+          <w:szCs w:val="26"/>
+          <w:lang w:val="pl-PL"/>
+        </w:rPr>
+      </w:pPr>
+      <w:r>
+        <w:rPr>
+          <w:rFonts w:ascii="Arial" w:hAnsi="Arial" w:cs="Arial"/>
+          <w:b/>
+          <w:bCs/>
+          <w:i/>
+          <w:iCs/>
+          <w:sz w:val="26"/>
+          <w:szCs w:val="26"/>
+          <w:lang w:val="pl-PL"/>
+        </w:rPr>
+        <w:t xml:space="preserve">Kacper </w:t>
+      </w:r>
+      <w:proofErr w:type="spellStart"/>
+      <w:r>
+        <w:rPr>
+          <w:rFonts w:ascii="Arial" w:hAnsi="Arial" w:cs="Arial"/>
+          <w:b/>
+          <w:bCs/>
+          <w:i/>
+          <w:iCs/>
+          <w:sz w:val="26"/>
+          <w:szCs w:val="26"/>
+          <w:lang w:val="pl-PL"/>
+        </w:rPr>
+        <w:t>Gołowacz</w:t>
+      </w:r>
+      <w:proofErr w:type="spellEnd"/>
+      <w:r>
+        <w:rPr>
+          <w:rFonts w:ascii="Arial" w:hAnsi="Arial" w:cs="Arial"/>
+          <w:b/>
+          <w:bCs/>
+          <w:i/>
+          <w:iCs/>
+          <w:sz w:val="26"/>
+          <w:szCs w:val="26"/>
+          <w:lang w:val="pl-PL"/>
+        </w:rPr>
+        <w:t xml:space="preserve"> – 34%</w:t>
+      </w:r>
+    </w:p>
+    <w:p/>
     <w:p>
       <w:pPr>
         <w:pStyle w:val="Nagwek2"/>
@@ -643,6 +827,7 @@
           <w:sz w:val="26"/>
           <w:szCs w:val="26"/>
         </w:rPr>
+        <w:lastRenderedPageBreak/>
         <w:t>Zakres systemu</w:t>
       </w:r>
     </w:p>
@@ -685,8 +870,23 @@
           <w:b/>
           <w:bCs/>
         </w:rPr>
-        <w:lastRenderedPageBreak/>
-        <w:t>Obsługa klienta (CRM/Booking):</w:t>
+        <w:t>Obsługa klienta (CRM/</w:t>
+      </w:r>
+      <w:proofErr w:type="spellStart"/>
+      <w:r>
+        <w:rPr>
+          <w:b/>
+          <w:bCs/>
+        </w:rPr>
+        <w:t>Booking</w:t>
+      </w:r>
+      <w:proofErr w:type="spellEnd"/>
+      <w:r>
+        <w:rPr>
+          <w:b/>
+          <w:bCs/>
+        </w:rPr>
+        <w:t>):</w:t>
       </w:r>
       <w:r>
         <w:t xml:space="preserve"> System rezerwacji online, weryfikacja tożsamości na miejscu oraz panel osobisty strzelca.</w:t>
@@ -834,7 +1034,15 @@
         <w:t>Zwiększenie przepustowości:</w:t>
       </w:r>
       <w:r>
-        <w:t xml:space="preserve"> Skrócenie czasu odprawy klienta (check-in) o np. 40% dzięki wcześniejszej rezerwacji danych w systemie.</w:t>
+        <w:t xml:space="preserve"> Skrócenie czasu odprawy klienta (</w:t>
+      </w:r>
+      <w:proofErr w:type="spellStart"/>
+      <w:r>
+        <w:t>check</w:t>
+      </w:r>
+      <w:proofErr w:type="spellEnd"/>
+      <w:r>
+        <w:t>-in) o np. 40% dzięki wcześniejszej rezerwacji danych w systemie.</w:t>
       </w:r>
     </w:p>
     <w:p>
@@ -959,13 +1167,32 @@
     </w:p>
     <w:p>
       <w:pPr>
+        <w:spacing w:after="240"/>
+      </w:pPr>
+    </w:p>
+    <w:p>
+      <w:pPr>
+        <w:spacing w:after="240"/>
+      </w:pPr>
+    </w:p>
+    <w:p>
+      <w:pPr>
         <w:pStyle w:val="Nagwek2"/>
         <w:spacing w:before="240" w:after="240"/>
       </w:pPr>
       <w:bookmarkStart w:id="6" w:name="_hev6j5i0hsa8" w:colFirst="0" w:colLast="0"/>
       <w:bookmarkEnd w:id="6"/>
       <w:r>
-        <w:t xml:space="preserve">3. Słownik terminów (Business Glossary) </w:t>
+        <w:lastRenderedPageBreak/>
+        <w:t xml:space="preserve">3. Słownik terminów (Business </w:t>
+      </w:r>
+      <w:proofErr w:type="spellStart"/>
+      <w:r>
+        <w:t>Glossary</w:t>
+      </w:r>
+      <w:proofErr w:type="spellEnd"/>
+      <w:r>
+        <w:t xml:space="preserve">) </w:t>
       </w:r>
     </w:p>
     <w:tbl>
@@ -1163,7 +1390,6 @@
                 <w:bCs/>
                 <w:color w:val="1F1F1F"/>
               </w:rPr>
-              <w:lastRenderedPageBreak/>
               <w:t>Przebieg broni</w:t>
             </w:r>
           </w:p>
@@ -1503,13 +1729,41 @@
                 <w:color w:val="1F1F1F"/>
               </w:rPr>
             </w:pPr>
+            <w:proofErr w:type="spellStart"/>
             <w:r>
               <w:rPr>
                 <w:b/>
                 <w:bCs/>
                 <w:color w:val="1F1F1F"/>
               </w:rPr>
-              <w:t>Check-in / Check-out</w:t>
+              <w:t>Check</w:t>
+            </w:r>
+            <w:proofErr w:type="spellEnd"/>
+            <w:r>
+              <w:rPr>
+                <w:b/>
+                <w:bCs/>
+                <w:color w:val="1F1F1F"/>
+              </w:rPr>
+              <w:t xml:space="preserve">-in / </w:t>
+            </w:r>
+            <w:proofErr w:type="spellStart"/>
+            <w:r>
+              <w:rPr>
+                <w:b/>
+                <w:bCs/>
+                <w:color w:val="1F1F1F"/>
+              </w:rPr>
+              <w:t>Check</w:t>
+            </w:r>
+            <w:proofErr w:type="spellEnd"/>
+            <w:r>
+              <w:rPr>
+                <w:b/>
+                <w:bCs/>
+                <w:color w:val="1F1F1F"/>
+              </w:rPr>
+              <w:t>-out</w:t>
             </w:r>
           </w:p>
         </w:tc>
@@ -1586,6 +1840,9 @@
     </w:p>
     <w:p>
       <w:r>
+        <w:rPr>
+          <w:noProof/>
+        </w:rPr>
         <w:drawing>
           <wp:inline distT="0" distB="0" distL="0" distR="0" wp14:anchorId="0C6C239C" wp14:editId="5CBD8BE3">
             <wp:extent cx="5733415" cy="3825240"/>
@@ -1769,7 +2026,21 @@
         <w:rPr>
           <w:lang w:val="pl-PL"/>
         </w:rPr>
-        <w:t>), przeprowadzeniu procesu check-in (</w:t>
+        <w:t xml:space="preserve">), przeprowadzeniu procesu </w:t>
+      </w:r>
+      <w:proofErr w:type="spellStart"/>
+      <w:r>
+        <w:rPr>
+          <w:lang w:val="pl-PL"/>
+        </w:rPr>
+        <w:t>check</w:t>
+      </w:r>
+      <w:proofErr w:type="spellEnd"/>
+      <w:r>
+        <w:rPr>
+          <w:lang w:val="pl-PL"/>
+        </w:rPr>
+        <w:t>-in (</w:t>
       </w:r>
       <w:r>
         <w:rPr>
@@ -2543,7 +2814,21 @@
         <w:rPr>
           <w:lang w:val="pl-PL"/>
         </w:rPr>
-        <w:t>Instruktor inicjuje sesję strzelecką, klikając przycisk "Check-in".</w:t>
+        <w:t>Instruktor inicjuje sesję strzelecką, klikając przycisk "</w:t>
+      </w:r>
+      <w:proofErr w:type="spellStart"/>
+      <w:r>
+        <w:rPr>
+          <w:lang w:val="pl-PL"/>
+        </w:rPr>
+        <w:t>Check</w:t>
+      </w:r>
+      <w:proofErr w:type="spellEnd"/>
+      <w:r>
+        <w:rPr>
+          <w:lang w:val="pl-PL"/>
+        </w:rPr>
+        <w:t>-in".</w:t>
       </w:r>
     </w:p>
     <w:p>
@@ -2825,6 +3110,15 @@
     </w:p>
     <w:p>
       <w:pPr>
+        <w:rPr>
+          <w:b/>
+          <w:bCs/>
+          <w:lang w:val="pl-PL"/>
+        </w:rPr>
+      </w:pPr>
+    </w:p>
+    <w:p>
+      <w:pPr>
         <w:pStyle w:val="Nagwek3"/>
         <w:rPr>
           <w:lang w:val="pl-PL"/>
@@ -2834,6 +3128,7 @@
         <w:rPr>
           <w:lang w:val="pl-PL"/>
         </w:rPr>
+        <w:lastRenderedPageBreak/>
         <w:t>Opis przypadku użycia "kontrola użytkowników"</w:t>
       </w:r>
     </w:p>
@@ -2866,7 +3161,6 @@
         <w:rPr>
           <w:lang w:val="pl-PL"/>
         </w:rPr>
-        <w:lastRenderedPageBreak/>
         <w:t xml:space="preserve">Administrator </w:t>
       </w:r>
     </w:p>
@@ -3460,8 +3754,13 @@
         <w:pStyle w:val="Legenda"/>
         <w:jc w:val="center"/>
       </w:pPr>
-      <w:r>
-        <w:t xml:space="preserve">Figure </w:t>
+      <w:proofErr w:type="spellStart"/>
+      <w:r>
+        <w:t>Figure</w:t>
+      </w:r>
+      <w:proofErr w:type="spellEnd"/>
+      <w:r>
+        <w:t xml:space="preserve"> </w:t>
       </w:r>
       <w:r>
         <w:rPr>
@@ -3534,8 +3833,13 @@
           <w:numId w:val="29"/>
         </w:numPr>
       </w:pPr>
-      <w:r>
-        <w:t>Potwiedzenie przybycia</w:t>
+      <w:proofErr w:type="spellStart"/>
+      <w:r>
+        <w:t>Potwiedzenie</w:t>
+      </w:r>
+      <w:proofErr w:type="spellEnd"/>
+      <w:r>
+        <w:t xml:space="preserve"> przybycia</w:t>
       </w:r>
     </w:p>
     <w:p>
@@ -3550,10 +3854,10 @@
           <w:lang w:val="pl-PL"/>
         </w:rPr>
         <w:drawing>
-          <wp:inline distT="0" distB="0" distL="0" distR="0" wp14:anchorId="6FA5D7EA" wp14:editId="289433A6">
-            <wp:extent cx="5733415" cy="6621780"/>
-            <wp:effectExtent l="0" t="0" r="635" b="7620"/>
-            <wp:docPr id="1283055645" name="Obraz 2"/>
+          <wp:inline distT="0" distB="0" distL="0" distR="0" wp14:anchorId="37F7FE08" wp14:editId="484B8510">
+            <wp:extent cx="5727700" cy="5986780"/>
+            <wp:effectExtent l="0" t="0" r="6350" b="0"/>
+            <wp:docPr id="543360618" name="Obraz 2"/>
             <wp:cNvGraphicFramePr>
               <a:graphicFrameLocks xmlns:a="http://schemas.openxmlformats.org/drawingml/2006/main" noChangeAspect="1"/>
             </wp:cNvGraphicFramePr>
@@ -3561,7 +3865,7 @@
               <a:graphicData uri="http://schemas.openxmlformats.org/drawingml/2006/picture">
                 <pic:pic xmlns:pic="http://schemas.openxmlformats.org/drawingml/2006/picture">
                   <pic:nvPicPr>
-                    <pic:cNvPr id="0" name="Picture 6"/>
+                    <pic:cNvPr id="0" name="Picture 2"/>
                     <pic:cNvPicPr>
                       <a:picLocks noChangeAspect="1" noChangeArrowheads="1"/>
                     </pic:cNvPicPr>
@@ -3582,7 +3886,7 @@
                   <pic:spPr bwMode="auto">
                     <a:xfrm>
                       <a:off x="0" y="0"/>
-                      <a:ext cx="5733415" cy="6621780"/>
+                      <a:ext cx="5727700" cy="5986780"/>
                     </a:xfrm>
                     <a:prstGeom prst="rect">
                       <a:avLst/>
@@ -3672,14 +3976,47 @@
           <w:bCs/>
         </w:rPr>
       </w:pPr>
+    </w:p>
+    <w:p>
+      <w:pPr>
+        <w:rPr>
+          <w:b/>
+          <w:bCs/>
+        </w:rPr>
+      </w:pPr>
+    </w:p>
+    <w:p>
+      <w:pPr>
+        <w:rPr>
+          <w:b/>
+          <w:bCs/>
+        </w:rPr>
+      </w:pPr>
+    </w:p>
+    <w:p>
+      <w:pPr>
+        <w:rPr>
+          <w:b/>
+          <w:bCs/>
+        </w:rPr>
+      </w:pPr>
       <w:r>
         <w:rPr>
           <w:b/>
           <w:bCs/>
         </w:rPr>
         <w:lastRenderedPageBreak/>
-        <w:t>Kacper Gołowacz</w:t>
-      </w:r>
+        <w:t xml:space="preserve">Kacper </w:t>
+      </w:r>
+      <w:proofErr w:type="spellStart"/>
+      <w:r>
+        <w:rPr>
+          <w:b/>
+          <w:bCs/>
+        </w:rPr>
+        <w:t>Gołowacz</w:t>
+      </w:r>
+      <w:proofErr w:type="spellEnd"/>
     </w:p>
     <w:p>
       <w:pPr>
@@ -3742,11 +4079,23 @@
     <w:p/>
     <w:p/>
     <w:p/>
+    <w:p/>
+    <w:p/>
+    <w:p/>
+    <w:p/>
+    <w:p/>
+    <w:p/>
+    <w:p/>
+    <w:p/>
+    <w:p/>
+    <w:p/>
+    <w:p/>
     <w:p>
       <w:pPr>
         <w:pStyle w:val="Nagwek2"/>
       </w:pPr>
       <w:r>
+        <w:lastRenderedPageBreak/>
         <w:t>4.</w:t>
       </w:r>
       <w:r>
@@ -3777,7 +4126,6 @@
           <w:noProof/>
           <w:lang w:val="pl-PL"/>
         </w:rPr>
-        <w:lastRenderedPageBreak/>
         <w:drawing>
           <wp:inline distT="0" distB="0" distL="0" distR="0" wp14:anchorId="00E1434D" wp14:editId="6938D168">
             <wp:extent cx="5733415" cy="2947670"/>
@@ -3843,7 +4191,23 @@
           <w:rStyle w:val="math-inline"/>
           <w:rFonts w:ascii="Arial" w:hAnsi="Arial" w:cs="Arial"/>
         </w:rPr>
-        <w:t>$\rightarrow$</w:t>
+        <w:t>$\</w:t>
+      </w:r>
+      <w:proofErr w:type="spellStart"/>
+      <w:r>
+        <w:rPr>
+          <w:rStyle w:val="math-inline"/>
+          <w:rFonts w:ascii="Arial" w:hAnsi="Arial" w:cs="Arial"/>
+        </w:rPr>
+        <w:t>rightarrow</w:t>
+      </w:r>
+      <w:proofErr w:type="spellEnd"/>
+      <w:r>
+        <w:rPr>
+          <w:rStyle w:val="math-inline"/>
+          <w:rFonts w:ascii="Arial" w:hAnsi="Arial" w:cs="Arial"/>
+        </w:rPr>
+        <w:t>$</w:t>
       </w:r>
       <w:r>
         <w:rPr>
@@ -3933,7 +4297,23 @@
           <w:rStyle w:val="math-inline"/>
           <w:rFonts w:ascii="Arial" w:hAnsi="Arial" w:cs="Arial"/>
         </w:rPr>
-        <w:t>$\rightarrow$</w:t>
+        <w:t>$\</w:t>
+      </w:r>
+      <w:proofErr w:type="spellStart"/>
+      <w:r>
+        <w:rPr>
+          <w:rStyle w:val="math-inline"/>
+          <w:rFonts w:ascii="Arial" w:hAnsi="Arial" w:cs="Arial"/>
+        </w:rPr>
+        <w:t>rightarrow</w:t>
+      </w:r>
+      <w:proofErr w:type="spellEnd"/>
+      <w:r>
+        <w:rPr>
+          <w:rStyle w:val="math-inline"/>
+          <w:rFonts w:ascii="Arial" w:hAnsi="Arial" w:cs="Arial"/>
+        </w:rPr>
+        <w:t>$</w:t>
       </w:r>
       <w:r>
         <w:rPr>
@@ -3966,7 +4346,21 @@
         <w:rPr>
           <w:rFonts w:ascii="Arial" w:hAnsi="Arial" w:cs="Arial"/>
         </w:rPr>
-        <w:t xml:space="preserve"> Synchroniczny / Tworzący (Create)</w:t>
+        <w:t xml:space="preserve"> Synchroniczny / Tworzący (</w:t>
+      </w:r>
+      <w:proofErr w:type="spellStart"/>
+      <w:r>
+        <w:rPr>
+          <w:rFonts w:ascii="Arial" w:hAnsi="Arial" w:cs="Arial"/>
+        </w:rPr>
+        <w:t>Create</w:t>
+      </w:r>
+      <w:proofErr w:type="spellEnd"/>
+      <w:r>
+        <w:rPr>
+          <w:rFonts w:ascii="Arial" w:hAnsi="Arial" w:cs="Arial"/>
+        </w:rPr>
+        <w:t>)</w:t>
       </w:r>
     </w:p>
     <w:p>
@@ -4023,7 +4417,23 @@
           <w:rStyle w:val="math-inline"/>
           <w:rFonts w:ascii="Arial" w:hAnsi="Arial" w:cs="Arial"/>
         </w:rPr>
-        <w:t>$\rightarrow$</w:t>
+        <w:t>$\</w:t>
+      </w:r>
+      <w:proofErr w:type="spellStart"/>
+      <w:r>
+        <w:rPr>
+          <w:rStyle w:val="math-inline"/>
+          <w:rFonts w:ascii="Arial" w:hAnsi="Arial" w:cs="Arial"/>
+        </w:rPr>
+        <w:t>rightarrow</w:t>
+      </w:r>
+      <w:proofErr w:type="spellEnd"/>
+      <w:r>
+        <w:rPr>
+          <w:rStyle w:val="math-inline"/>
+          <w:rFonts w:ascii="Arial" w:hAnsi="Arial" w:cs="Arial"/>
+        </w:rPr>
+        <w:t>$</w:t>
       </w:r>
       <w:r>
         <w:rPr>
@@ -4113,7 +4523,23 @@
           <w:rStyle w:val="math-inline"/>
           <w:rFonts w:ascii="Arial" w:hAnsi="Arial" w:cs="Arial"/>
         </w:rPr>
-        <w:t>$\rightarrow$</w:t>
+        <w:t>$\</w:t>
+      </w:r>
+      <w:proofErr w:type="spellStart"/>
+      <w:r>
+        <w:rPr>
+          <w:rStyle w:val="math-inline"/>
+          <w:rFonts w:ascii="Arial" w:hAnsi="Arial" w:cs="Arial"/>
+        </w:rPr>
+        <w:t>rightarrow</w:t>
+      </w:r>
+      <w:proofErr w:type="spellEnd"/>
+      <w:r>
+        <w:rPr>
+          <w:rStyle w:val="math-inline"/>
+          <w:rFonts w:ascii="Arial" w:hAnsi="Arial" w:cs="Arial"/>
+        </w:rPr>
+        <w:t>$</w:t>
       </w:r>
       <w:r>
         <w:rPr>
@@ -4203,7 +4629,23 @@
           <w:rStyle w:val="math-inline"/>
           <w:rFonts w:ascii="Arial" w:hAnsi="Arial" w:cs="Arial"/>
         </w:rPr>
-        <w:t>$\rightarrow$</w:t>
+        <w:t>$\</w:t>
+      </w:r>
+      <w:proofErr w:type="spellStart"/>
+      <w:r>
+        <w:rPr>
+          <w:rStyle w:val="math-inline"/>
+          <w:rFonts w:ascii="Arial" w:hAnsi="Arial" w:cs="Arial"/>
+        </w:rPr>
+        <w:t>rightarrow</w:t>
+      </w:r>
+      <w:proofErr w:type="spellEnd"/>
+      <w:r>
+        <w:rPr>
+          <w:rStyle w:val="math-inline"/>
+          <w:rFonts w:ascii="Arial" w:hAnsi="Arial" w:cs="Arial"/>
+        </w:rPr>
+        <w:t>$</w:t>
       </w:r>
       <w:r>
         <w:rPr>
@@ -4257,13 +4699,28 @@
           <w:b/>
           <w:bCs/>
         </w:rPr>
+        <w:lastRenderedPageBreak/>
         <w:t>Opis:</w:t>
       </w:r>
       <w:r>
         <w:rPr>
           <w:rFonts w:ascii="Arial" w:hAnsi="Arial" w:cs="Arial"/>
         </w:rPr>
-        <w:t xml:space="preserve"> Serwer przekazuje żądanie zapisu danych do bazy PostgreSQL, aby zaktualizować profil klienta.</w:t>
+        <w:t xml:space="preserve"> Serwer przekazuje żądanie zapisu danych do bazy </w:t>
+      </w:r>
+      <w:proofErr w:type="spellStart"/>
+      <w:r>
+        <w:rPr>
+          <w:rFonts w:ascii="Arial" w:hAnsi="Arial" w:cs="Arial"/>
+        </w:rPr>
+        <w:t>PostgreSQL</w:t>
+      </w:r>
+      <w:proofErr w:type="spellEnd"/>
+      <w:r>
+        <w:rPr>
+          <w:rFonts w:ascii="Arial" w:hAnsi="Arial" w:cs="Arial"/>
+        </w:rPr>
+        <w:t>, aby zaktualizować profil klienta.</w:t>
       </w:r>
     </w:p>
     <w:p>
@@ -4293,7 +4750,23 @@
           <w:rStyle w:val="math-inline"/>
           <w:rFonts w:ascii="Arial" w:hAnsi="Arial" w:cs="Arial"/>
         </w:rPr>
-        <w:t>$\rightarrow$</w:t>
+        <w:t>$\</w:t>
+      </w:r>
+      <w:proofErr w:type="spellStart"/>
+      <w:r>
+        <w:rPr>
+          <w:rStyle w:val="math-inline"/>
+          <w:rFonts w:ascii="Arial" w:hAnsi="Arial" w:cs="Arial"/>
+        </w:rPr>
+        <w:t>rightarrow</w:t>
+      </w:r>
+      <w:proofErr w:type="spellEnd"/>
+      <w:r>
+        <w:rPr>
+          <w:rStyle w:val="math-inline"/>
+          <w:rFonts w:ascii="Arial" w:hAnsi="Arial" w:cs="Arial"/>
+        </w:rPr>
+        <w:t>$</w:t>
       </w:r>
       <w:r>
         <w:rPr>
@@ -4320,7 +4793,6 @@
           <w:b/>
           <w:bCs/>
         </w:rPr>
-        <w:lastRenderedPageBreak/>
         <w:t>Typ komunikatu:</w:t>
       </w:r>
       <w:r>
@@ -4384,7 +4856,23 @@
           <w:rStyle w:val="math-inline"/>
           <w:rFonts w:ascii="Arial" w:hAnsi="Arial" w:cs="Arial"/>
         </w:rPr>
-        <w:t>$\rightarrow$</w:t>
+        <w:t>$\</w:t>
+      </w:r>
+      <w:proofErr w:type="spellStart"/>
+      <w:r>
+        <w:rPr>
+          <w:rStyle w:val="math-inline"/>
+          <w:rFonts w:ascii="Arial" w:hAnsi="Arial" w:cs="Arial"/>
+        </w:rPr>
+        <w:t>rightarrow</w:t>
+      </w:r>
+      <w:proofErr w:type="spellEnd"/>
+      <w:r>
+        <w:rPr>
+          <w:rStyle w:val="math-inline"/>
+          <w:rFonts w:ascii="Arial" w:hAnsi="Arial" w:cs="Arial"/>
+        </w:rPr>
+        <w:t>$</w:t>
       </w:r>
       <w:r>
         <w:rPr>
@@ -4474,7 +4962,23 @@
           <w:rStyle w:val="math-inline"/>
           <w:rFonts w:ascii="Arial" w:hAnsi="Arial" w:cs="Arial"/>
         </w:rPr>
-        <w:t>$\rightarrow$</w:t>
+        <w:t>$\</w:t>
+      </w:r>
+      <w:proofErr w:type="spellStart"/>
+      <w:r>
+        <w:rPr>
+          <w:rStyle w:val="math-inline"/>
+          <w:rFonts w:ascii="Arial" w:hAnsi="Arial" w:cs="Arial"/>
+        </w:rPr>
+        <w:t>rightarrow</w:t>
+      </w:r>
+      <w:proofErr w:type="spellEnd"/>
+      <w:r>
+        <w:rPr>
+          <w:rStyle w:val="math-inline"/>
+          <w:rFonts w:ascii="Arial" w:hAnsi="Arial" w:cs="Arial"/>
+        </w:rPr>
+        <w:t>$</w:t>
       </w:r>
       <w:r>
         <w:rPr>
@@ -4507,7 +5011,21 @@
         <w:rPr>
           <w:rFonts w:ascii="Arial" w:hAnsi="Arial" w:cs="Arial"/>
         </w:rPr>
-        <w:t xml:space="preserve"> Zwrotny / Niszczący (Destroy)</w:t>
+        <w:t xml:space="preserve"> Zwrotny / Niszczący (</w:t>
+      </w:r>
+      <w:proofErr w:type="spellStart"/>
+      <w:r>
+        <w:rPr>
+          <w:rFonts w:ascii="Arial" w:hAnsi="Arial" w:cs="Arial"/>
+        </w:rPr>
+        <w:t>Destroy</w:t>
+      </w:r>
+      <w:proofErr w:type="spellEnd"/>
+      <w:r>
+        <w:rPr>
+          <w:rFonts w:ascii="Arial" w:hAnsi="Arial" w:cs="Arial"/>
+        </w:rPr>
+        <w:t>)</w:t>
       </w:r>
     </w:p>
     <w:p>
@@ -4564,7 +5082,23 @@
           <w:rStyle w:val="math-inline"/>
           <w:rFonts w:ascii="Arial" w:hAnsi="Arial" w:cs="Arial"/>
         </w:rPr>
-        <w:t>$\rightarrow$</w:t>
+        <w:t>$\</w:t>
+      </w:r>
+      <w:proofErr w:type="spellStart"/>
+      <w:r>
+        <w:rPr>
+          <w:rStyle w:val="math-inline"/>
+          <w:rFonts w:ascii="Arial" w:hAnsi="Arial" w:cs="Arial"/>
+        </w:rPr>
+        <w:t>rightarrow</w:t>
+      </w:r>
+      <w:proofErr w:type="spellEnd"/>
+      <w:r>
+        <w:rPr>
+          <w:rStyle w:val="math-inline"/>
+          <w:rFonts w:ascii="Arial" w:hAnsi="Arial" w:cs="Arial"/>
+        </w:rPr>
+        <w:t>$</w:t>
       </w:r>
       <w:r>
         <w:rPr>
@@ -4661,6 +5195,7 @@
           <w:b/>
           <w:bCs/>
         </w:rPr>
+        <w:lastRenderedPageBreak/>
         <w:t>Wojciech Cimochowski</w:t>
       </w:r>
     </w:p>
@@ -4690,7 +5225,6 @@
           <w:noProof/>
           <w:lang w:val="pl-PL"/>
         </w:rPr>
-        <w:lastRenderedPageBreak/>
         <w:drawing>
           <wp:inline distT="0" distB="0" distL="0" distR="0" wp14:anchorId="009C8796" wp14:editId="264CA7CC">
             <wp:extent cx="5727700" cy="6203315"/>
@@ -4787,7 +5321,21 @@
         <w:rPr>
           <w:lang w:val="pl-PL"/>
         </w:rPr>
-        <w:t> Aktor wywołuje na obiekcie rezerwacja metodę pobierzKlienta().</w:t>
+        <w:t> Aktor wywołuje na obiekcie rezerwacja metodę </w:t>
+      </w:r>
+      <w:proofErr w:type="spellStart"/>
+      <w:r>
+        <w:rPr>
+          <w:lang w:val="pl-PL"/>
+        </w:rPr>
+        <w:t>pobierzKlienta</w:t>
+      </w:r>
+      <w:proofErr w:type="spellEnd"/>
+      <w:r>
+        <w:rPr>
+          <w:lang w:val="pl-PL"/>
+        </w:rPr>
+        <w:t>().</w:t>
       </w:r>
     </w:p>
     <w:p>
@@ -4849,7 +5397,21 @@
         <w:rPr>
           <w:lang w:val="pl-PL"/>
         </w:rPr>
-        <w:t> — fragment loop [dopóki dane niepoprawne]</w:t>
+        <w:t> — fragment </w:t>
+      </w:r>
+      <w:proofErr w:type="spellStart"/>
+      <w:r>
+        <w:rPr>
+          <w:lang w:val="pl-PL"/>
+        </w:rPr>
+        <w:t>loop</w:t>
+      </w:r>
+      <w:proofErr w:type="spellEnd"/>
+      <w:r>
+        <w:rPr>
+          <w:lang w:val="pl-PL"/>
+        </w:rPr>
+        <w:t xml:space="preserve"> [dopóki dane niepoprawne]</w:t>
       </w:r>
     </w:p>
     <w:p>
@@ -4890,6 +5452,7 @@
           <w:bCs/>
           <w:lang w:val="pl-PL"/>
         </w:rPr>
+        <w:lastRenderedPageBreak/>
         <w:t>Komunikat 3:</w:t>
       </w:r>
       <w:r>
@@ -4903,7 +5466,20 @@
           <w:lang w:val="pl-PL"/>
         </w:rPr>
         <w:br/>
-        <w:t>weryfikujDokument(klient, rodzaj, PESEL).</w:t>
+      </w:r>
+      <w:proofErr w:type="spellStart"/>
+      <w:r>
+        <w:rPr>
+          <w:lang w:val="pl-PL"/>
+        </w:rPr>
+        <w:t>weryfikujDokument</w:t>
+      </w:r>
+      <w:proofErr w:type="spellEnd"/>
+      <w:r>
+        <w:rPr>
+          <w:lang w:val="pl-PL"/>
+        </w:rPr>
+        <w:t>(klient, rodzaj, PESEL).</w:t>
       </w:r>
     </w:p>
     <w:p>
@@ -4931,7 +5507,6 @@
           <w:bCs/>
           <w:lang w:val="pl-PL"/>
         </w:rPr>
-        <w:lastRenderedPageBreak/>
         <w:t>Gałąź [z błędami]:</w:t>
       </w:r>
     </w:p>
@@ -4953,7 +5528,21 @@
         <w:rPr>
           <w:lang w:val="pl-PL"/>
         </w:rPr>
-        <w:t> Obiekt instruktor zwraca wartość false. System informuje o błędach w formularzu; instruktor poprawia dane i pętla się powtarza.</w:t>
+        <w:t> Obiekt instruktor zwraca wartość </w:t>
+      </w:r>
+      <w:proofErr w:type="spellStart"/>
+      <w:r>
+        <w:rPr>
+          <w:lang w:val="pl-PL"/>
+        </w:rPr>
+        <w:t>false</w:t>
+      </w:r>
+      <w:proofErr w:type="spellEnd"/>
+      <w:r>
+        <w:rPr>
+          <w:lang w:val="pl-PL"/>
+        </w:rPr>
+        <w:t>. System informuje o błędach w formularzu; instruktor poprawia dane i pętla się powtarza.</w:t>
       </w:r>
     </w:p>
     <w:p>
@@ -4981,7 +5570,49 @@
         <w:rPr>
           <w:lang w:val="pl-PL"/>
         </w:rPr>
-        <w:t>Wewnątrz weryfikujDokument ustawiany jest atrybut Status_weryfikacji klienta na true.</w:t>
+        <w:t>Wewnątrz </w:t>
+      </w:r>
+      <w:proofErr w:type="spellStart"/>
+      <w:r>
+        <w:rPr>
+          <w:lang w:val="pl-PL"/>
+        </w:rPr>
+        <w:t>weryfikujDokument</w:t>
+      </w:r>
+      <w:proofErr w:type="spellEnd"/>
+      <w:r>
+        <w:rPr>
+          <w:lang w:val="pl-PL"/>
+        </w:rPr>
+        <w:t> ustawiany jest atrybut </w:t>
+      </w:r>
+      <w:proofErr w:type="spellStart"/>
+      <w:r>
+        <w:rPr>
+          <w:lang w:val="pl-PL"/>
+        </w:rPr>
+        <w:t>Status_weryfikacji</w:t>
+      </w:r>
+      <w:proofErr w:type="spellEnd"/>
+      <w:r>
+        <w:rPr>
+          <w:lang w:val="pl-PL"/>
+        </w:rPr>
+        <w:t> klienta na </w:t>
+      </w:r>
+      <w:proofErr w:type="spellStart"/>
+      <w:r>
+        <w:rPr>
+          <w:lang w:val="pl-PL"/>
+        </w:rPr>
+        <w:t>true</w:t>
+      </w:r>
+      <w:proofErr w:type="spellEnd"/>
+      <w:r>
+        <w:rPr>
+          <w:lang w:val="pl-PL"/>
+        </w:rPr>
+        <w:t>.</w:t>
       </w:r>
     </w:p>
     <w:p>
@@ -5002,7 +5633,21 @@
         <w:rPr>
           <w:lang w:val="pl-PL"/>
         </w:rPr>
-        <w:t> Obiekt instruktor wywołuje na rezerwacja metodę zmienStatus("zweryfikowany").</w:t>
+        <w:t> Obiekt instruktor wywołuje na rezerwacja metodę </w:t>
+      </w:r>
+      <w:proofErr w:type="spellStart"/>
+      <w:r>
+        <w:rPr>
+          <w:lang w:val="pl-PL"/>
+        </w:rPr>
+        <w:t>zmienStatus</w:t>
+      </w:r>
+      <w:proofErr w:type="spellEnd"/>
+      <w:r>
+        <w:rPr>
+          <w:lang w:val="pl-PL"/>
+        </w:rPr>
+        <w:t>("zweryfikowany").</w:t>
       </w:r>
     </w:p>
     <w:p>
@@ -5023,7 +5668,21 @@
         <w:rPr>
           <w:lang w:val="pl-PL"/>
         </w:rPr>
-        <w:t> Obiekt instruktor zwraca wartość true. Rezerwacja zostaje zweryfikowana; pętla się kończy.</w:t>
+        <w:t> Obiekt instruktor zwraca wartość </w:t>
+      </w:r>
+      <w:proofErr w:type="spellStart"/>
+      <w:r>
+        <w:rPr>
+          <w:lang w:val="pl-PL"/>
+        </w:rPr>
+        <w:t>true</w:t>
+      </w:r>
+      <w:proofErr w:type="spellEnd"/>
+      <w:r>
+        <w:rPr>
+          <w:lang w:val="pl-PL"/>
+        </w:rPr>
+        <w:t>. Rezerwacja zostaje zweryfikowana; pętla się kończy.</w:t>
       </w:r>
     </w:p>
     <w:p>
@@ -5058,7 +5717,35 @@
         <w:rPr>
           <w:lang w:val="de-DE"/>
         </w:rPr>
-        <w:t>Instruktor klika przycisk „Check-in”.</w:t>
+        <w:t xml:space="preserve">Instruktor </w:t>
+      </w:r>
+      <w:proofErr w:type="spellStart"/>
+      <w:r>
+        <w:rPr>
+          <w:lang w:val="de-DE"/>
+        </w:rPr>
+        <w:t>klika</w:t>
+      </w:r>
+      <w:proofErr w:type="spellEnd"/>
+      <w:r>
+        <w:rPr>
+          <w:lang w:val="de-DE"/>
+        </w:rPr>
+        <w:t xml:space="preserve"> </w:t>
+      </w:r>
+      <w:proofErr w:type="spellStart"/>
+      <w:r>
+        <w:rPr>
+          <w:lang w:val="de-DE"/>
+        </w:rPr>
+        <w:t>przycisk</w:t>
+      </w:r>
+      <w:proofErr w:type="spellEnd"/>
+      <w:r>
+        <w:rPr>
+          <w:lang w:val="de-DE"/>
+        </w:rPr>
+        <w:t xml:space="preserve"> „Check-in”.</w:t>
       </w:r>
     </w:p>
     <w:p>
@@ -5079,7 +5766,21 @@
         <w:rPr>
           <w:lang w:val="pl-PL"/>
         </w:rPr>
-        <w:t> Aktor wywołuje na obiekcie instruktor metodę wykonajCheckIn(rezerwacja).</w:t>
+        <w:t> Aktor wywołuje na obiekcie instruktor metodę </w:t>
+      </w:r>
+      <w:proofErr w:type="spellStart"/>
+      <w:r>
+        <w:rPr>
+          <w:lang w:val="pl-PL"/>
+        </w:rPr>
+        <w:t>wykonajCheckIn</w:t>
+      </w:r>
+      <w:proofErr w:type="spellEnd"/>
+      <w:r>
+        <w:rPr>
+          <w:lang w:val="pl-PL"/>
+        </w:rPr>
+        <w:t>(rezerwacja).</w:t>
       </w:r>
     </w:p>
     <w:p>
@@ -5100,7 +5801,35 @@
         <w:rPr>
           <w:lang w:val="pl-PL"/>
         </w:rPr>
-        <w:t> Obiekt instruktor tworzy nowy obiekt sesja:SesjaStrzelecka (&lt;&lt;create&gt;&gt;).</w:t>
+        <w:t> Obiekt instruktor tworzy nowy obiekt </w:t>
+      </w:r>
+      <w:proofErr w:type="spellStart"/>
+      <w:r>
+        <w:rPr>
+          <w:lang w:val="pl-PL"/>
+        </w:rPr>
+        <w:t>sesja:SesjaStrzelecka</w:t>
+      </w:r>
+      <w:proofErr w:type="spellEnd"/>
+      <w:r>
+        <w:rPr>
+          <w:lang w:val="pl-PL"/>
+        </w:rPr>
+        <w:t> (&lt;&lt;</w:t>
+      </w:r>
+      <w:proofErr w:type="spellStart"/>
+      <w:r>
+        <w:rPr>
+          <w:lang w:val="pl-PL"/>
+        </w:rPr>
+        <w:t>create</w:t>
+      </w:r>
+      <w:proofErr w:type="spellEnd"/>
+      <w:r>
+        <w:rPr>
+          <w:lang w:val="pl-PL"/>
+        </w:rPr>
+        <w:t>&gt;&gt;).</w:t>
       </w:r>
     </w:p>
     <w:p>
@@ -5121,7 +5850,21 @@
         <w:rPr>
           <w:lang w:val="pl-PL"/>
         </w:rPr>
-        <w:t> Obiekt instruktor wywołuje na rezerwacja metodę zmienStatus("w trakcie wizyty").</w:t>
+        <w:t> Obiekt instruktor wywołuje na rezerwacja metodę </w:t>
+      </w:r>
+      <w:proofErr w:type="spellStart"/>
+      <w:r>
+        <w:rPr>
+          <w:lang w:val="pl-PL"/>
+        </w:rPr>
+        <w:t>zmienStatus</w:t>
+      </w:r>
+      <w:proofErr w:type="spellEnd"/>
+      <w:r>
+        <w:rPr>
+          <w:lang w:val="pl-PL"/>
+        </w:rPr>
+        <w:t>("w trakcie wizyty").</w:t>
       </w:r>
     </w:p>
     <w:p>
@@ -5142,34 +5885,82 @@
         <w:rPr>
           <w:lang w:val="pl-PL"/>
         </w:rPr>
-        <w:t> Obiekt instruktor zwraca utworzony obiekt sesja do aktora. Check-in zostaje zakończony; rozpoczyna się sesja strzelecka.</w:t>
+        <w:t xml:space="preserve"> Obiekt instruktor zwraca utworzony obiekt sesja do aktora. </w:t>
+      </w:r>
+      <w:proofErr w:type="spellStart"/>
+      <w:r>
+        <w:rPr>
+          <w:lang w:val="pl-PL"/>
+        </w:rPr>
+        <w:t>Check</w:t>
+      </w:r>
+      <w:proofErr w:type="spellEnd"/>
+      <w:r>
+        <w:rPr>
+          <w:lang w:val="pl-PL"/>
+        </w:rPr>
+        <w:t>-in zostaje zakończony; rozpoczyna się sesja strzelecka.</w:t>
       </w:r>
     </w:p>
     <w:p/>
     <w:p/>
-    <w:p>
-      <w:pPr>
-        <w:rPr>
-          <w:b/>
-          <w:bCs/>
-        </w:rPr>
-      </w:pPr>
-      <w:r>
-        <w:rPr>
-          <w:b/>
-          <w:bCs/>
-        </w:rPr>
-        <w:t>Kacper Gołowacz</w:t>
-      </w:r>
-    </w:p>
     <w:p/>
+    <w:p/>
+    <w:p/>
+    <w:p/>
+    <w:p/>
+    <w:p/>
+    <w:p/>
+    <w:p/>
+    <w:p/>
+    <w:p/>
+    <w:p/>
+    <w:p/>
+    <w:p/>
+    <w:p/>
+    <w:p/>
+    <w:p/>
+    <w:p/>
+    <w:p/>
+    <w:p/>
+    <w:p/>
+    <w:p/>
+    <w:p/>
+    <w:p/>
+    <w:p/>
+    <w:p/>
+    <w:p>
+      <w:pPr>
+        <w:rPr>
+          <w:b/>
+          <w:bCs/>
+        </w:rPr>
+      </w:pPr>
+      <w:r>
+        <w:rPr>
+          <w:b/>
+          <w:bCs/>
+        </w:rPr>
+        <w:lastRenderedPageBreak/>
+        <w:t xml:space="preserve">Kacper </w:t>
+      </w:r>
+      <w:proofErr w:type="spellStart"/>
+      <w:r>
+        <w:rPr>
+          <w:b/>
+          <w:bCs/>
+        </w:rPr>
+        <w:t>Gołowacz</w:t>
+      </w:r>
+      <w:proofErr w:type="spellEnd"/>
+    </w:p>
+    <w:p/>
     <w:p>
       <w:r>
         <w:rPr>
           <w:noProof/>
           <w:lang w:val="pl-PL"/>
         </w:rPr>
-        <w:lastRenderedPageBreak/>
         <w:drawing>
           <wp:inline distT="0" distB="0" distL="0" distR="0" wp14:anchorId="6ED49875" wp14:editId="0303B37F">
             <wp:extent cx="5248894" cy="5831394"/>
@@ -5236,10 +6027,26 @@
         <w:t>Komunikat 1:</w:t>
       </w:r>
       <w:r>
-        <w:t xml:space="preserve"> Aktor wywołuje na obiekcie admin:Administrator met</w:t>
-      </w:r>
-      <w:r>
-        <w:t>odę pobierzListeUzytkownikow().</w:t>
+        <w:t xml:space="preserve"> Aktor wywołuje na obiekcie </w:t>
+      </w:r>
+      <w:proofErr w:type="spellStart"/>
+      <w:r>
+        <w:t>admin:Administrator</w:t>
+      </w:r>
+      <w:proofErr w:type="spellEnd"/>
+      <w:r>
+        <w:t xml:space="preserve"> met</w:t>
+      </w:r>
+      <w:r>
+        <w:t xml:space="preserve">odę </w:t>
+      </w:r>
+      <w:proofErr w:type="spellStart"/>
+      <w:r>
+        <w:t>pobierzListeUzytkownikow</w:t>
+      </w:r>
+      <w:proofErr w:type="spellEnd"/>
+      <w:r>
+        <w:t>().</w:t>
       </w:r>
     </w:p>
     <w:p>
@@ -5250,10 +6057,26 @@
         <w:t>Komunikat 2 (zwrot):</w:t>
       </w:r>
       <w:r>
-        <w:t xml:space="preserve"> Obiekt admin:Administrator zwraca listę uż</w:t>
-      </w:r>
-      <w:r>
-        <w:t>ytkowników (listaUzytkownikow).</w:t>
+        <w:t xml:space="preserve"> Obiekt </w:t>
+      </w:r>
+      <w:proofErr w:type="spellStart"/>
+      <w:r>
+        <w:t>admin:Administrator</w:t>
+      </w:r>
+      <w:proofErr w:type="spellEnd"/>
+      <w:r>
+        <w:t xml:space="preserve"> zwraca listę uż</w:t>
+      </w:r>
+      <w:r>
+        <w:t>ytkowników (</w:t>
+      </w:r>
+      <w:proofErr w:type="spellStart"/>
+      <w:r>
+        <w:t>listaUzytkownikow</w:t>
+      </w:r>
+      <w:proofErr w:type="spellEnd"/>
+      <w:r>
+        <w:t>).</w:t>
       </w:r>
     </w:p>
     <w:p>
@@ -5270,7 +6093,23 @@
         <w:t>2. Filtrowanie listy</w:t>
       </w:r>
       <w:r>
-        <w:t xml:space="preserve"> — fragment opt [filtr != null]</w:t>
+        <w:t xml:space="preserve"> — fragment </w:t>
+      </w:r>
+      <w:proofErr w:type="spellStart"/>
+      <w:r>
+        <w:t>opt</w:t>
+      </w:r>
+      <w:proofErr w:type="spellEnd"/>
+      <w:r>
+        <w:t xml:space="preserve"> [filtr != </w:t>
+      </w:r>
+      <w:proofErr w:type="spellStart"/>
+      <w:r>
+        <w:t>null</w:t>
+      </w:r>
+      <w:proofErr w:type="spellEnd"/>
+      <w:r>
+        <w:t>]</w:t>
       </w:r>
     </w:p>
     <w:p>
@@ -5291,14 +6130,29 @@
         <w:rPr>
           <w:b/>
         </w:rPr>
-        <w:lastRenderedPageBreak/>
         <w:t>Komunikat 3:</w:t>
       </w:r>
       <w:r>
-        <w:t xml:space="preserve"> Aktor wywołuje na obiekcie admin:Administrat</w:t>
-      </w:r>
-      <w:r>
-        <w:t>or metodę filtrujTabele(filtr).</w:t>
+        <w:t xml:space="preserve"> Aktor wywołuje na obiekcie </w:t>
+      </w:r>
+      <w:proofErr w:type="spellStart"/>
+      <w:r>
+        <w:t>admin:Administrat</w:t>
+      </w:r>
+      <w:r>
+        <w:t>or</w:t>
+      </w:r>
+      <w:proofErr w:type="spellEnd"/>
+      <w:r>
+        <w:t xml:space="preserve"> metodę </w:t>
+      </w:r>
+      <w:proofErr w:type="spellStart"/>
+      <w:r>
+        <w:t>filtrujTabele</w:t>
+      </w:r>
+      <w:proofErr w:type="spellEnd"/>
+      <w:r>
+        <w:t>(filtr).</w:t>
       </w:r>
     </w:p>
     <w:p>
@@ -5309,10 +6163,26 @@
         <w:t>Komunikat 4 (zwrot):</w:t>
       </w:r>
       <w:r>
-        <w:t xml:space="preserve"> Obiekt admin:Administrator zwraca przefiltrowa</w:t>
-      </w:r>
-      <w:r>
-        <w:t>ną listę (przefiltrowanaLista).</w:t>
+        <w:t xml:space="preserve"> Obiekt </w:t>
+      </w:r>
+      <w:proofErr w:type="spellStart"/>
+      <w:r>
+        <w:t>admin:Administrator</w:t>
+      </w:r>
+      <w:proofErr w:type="spellEnd"/>
+      <w:r>
+        <w:t xml:space="preserve"> zwraca przefiltrowa</w:t>
+      </w:r>
+      <w:r>
+        <w:t>ną listę (</w:t>
+      </w:r>
+      <w:proofErr w:type="spellStart"/>
+      <w:r>
+        <w:t>przefiltrowanaLista</w:t>
+      </w:r>
+      <w:proofErr w:type="spellEnd"/>
+      <w:r>
+        <w:t>).</w:t>
       </w:r>
     </w:p>
     <w:p>
@@ -5359,10 +6229,34 @@
         <w:t>Komunikat 5:</w:t>
       </w:r>
       <w:r>
-        <w:t xml:space="preserve"> Aktor wywołuje na obiekcie admin:Administrator metodę zatwierdzZmianyKonta(wybra</w:t>
-      </w:r>
-      <w:r>
-        <w:t>nyUzytkownik).</w:t>
+        <w:t xml:space="preserve"> Aktor wywołuje na obiekcie </w:t>
+      </w:r>
+      <w:proofErr w:type="spellStart"/>
+      <w:r>
+        <w:t>admin:Administrator</w:t>
+      </w:r>
+      <w:proofErr w:type="spellEnd"/>
+      <w:r>
+        <w:t xml:space="preserve"> metodę </w:t>
+      </w:r>
+      <w:proofErr w:type="spellStart"/>
+      <w:r>
+        <w:t>zatwierdzZmianyKonta</w:t>
+      </w:r>
+      <w:proofErr w:type="spellEnd"/>
+      <w:r>
+        <w:t>(</w:t>
+      </w:r>
+      <w:proofErr w:type="spellStart"/>
+      <w:r>
+        <w:t>wybra</w:t>
+      </w:r>
+      <w:r>
+        <w:t>nyUzytkownik</w:t>
+      </w:r>
+      <w:proofErr w:type="spellEnd"/>
+      <w:r>
+        <w:t>).</w:t>
       </w:r>
     </w:p>
     <w:p>
@@ -5373,7 +6267,31 @@
         <w:t>Komunikat 6:</w:t>
       </w:r>
       <w:r>
-        <w:t xml:space="preserve"> Obiekt admin:Administrator wywołuje na obiekcie użytkownik:Użytkownik metodę aktualizujStan()</w:t>
+        <w:t xml:space="preserve"> Obiekt </w:t>
+      </w:r>
+      <w:proofErr w:type="spellStart"/>
+      <w:r>
+        <w:t>admin:Administrator</w:t>
+      </w:r>
+      <w:proofErr w:type="spellEnd"/>
+      <w:r>
+        <w:t xml:space="preserve"> wywołuje na obiekcie </w:t>
+      </w:r>
+      <w:proofErr w:type="spellStart"/>
+      <w:r>
+        <w:t>użytkownik:Użytkownik</w:t>
+      </w:r>
+      <w:proofErr w:type="spellEnd"/>
+      <w:r>
+        <w:t xml:space="preserve"> metodę </w:t>
+      </w:r>
+      <w:proofErr w:type="spellStart"/>
+      <w:r>
+        <w:t>aktualizujStan</w:t>
+      </w:r>
+      <w:proofErr w:type="spellEnd"/>
+      <w:r>
+        <w:t>()</w:t>
       </w:r>
       <w:r>
         <w:t>, aby zapisać nowe uprawnienia.</w:t>
@@ -5387,10 +6305,23 @@
         <w:t>Komunikat 7 (zwrot):</w:t>
       </w:r>
       <w:r>
-        <w:t xml:space="preserve"> Obiekt użytkownik:Użytkownik zwraca potwierdzenie wykonania operacji do obiektu </w:t>
-      </w:r>
-      <w:r>
-        <w:t>admin:Administrator.</w:t>
+        <w:t xml:space="preserve"> Obiekt </w:t>
+      </w:r>
+      <w:proofErr w:type="spellStart"/>
+      <w:r>
+        <w:t>użytkownik:Użytkownik</w:t>
+      </w:r>
+      <w:proofErr w:type="spellEnd"/>
+      <w:r>
+        <w:t xml:space="preserve"> zwraca potwierdzenie wykonania operacji do obiektu </w:t>
+      </w:r>
+      <w:proofErr w:type="spellStart"/>
+      <w:r>
+        <w:t>admin:Administrator</w:t>
+      </w:r>
+      <w:proofErr w:type="spellEnd"/>
+      <w:r>
+        <w:t>.</w:t>
       </w:r>
     </w:p>
     <w:p>
@@ -5401,7 +6332,23 @@
         <w:t>Komunikat 8 (zwrot):</w:t>
       </w:r>
       <w:r>
-        <w:t xml:space="preserve"> Obiekt admin:Administrator zwraca wartość true do aktora. Zmiany zostały pomyślnie zapisane.</w:t>
+        <w:t xml:space="preserve"> Obiekt </w:t>
+      </w:r>
+      <w:proofErr w:type="spellStart"/>
+      <w:r>
+        <w:t>admin:Administrator</w:t>
+      </w:r>
+      <w:proofErr w:type="spellEnd"/>
+      <w:r>
+        <w:t xml:space="preserve"> zwraca wartość </w:t>
+      </w:r>
+      <w:proofErr w:type="spellStart"/>
+      <w:r>
+        <w:t>true</w:t>
+      </w:r>
+      <w:proofErr w:type="spellEnd"/>
+      <w:r>
+        <w:t xml:space="preserve"> do aktora. Zmiany zostały pomyślnie zapisane.</w:t>
       </w:r>
     </w:p>
     <w:p/>
@@ -5425,23 +6372,437 @@
     </w:p>
     <w:p/>
     <w:p/>
+    <w:p>
+      <w:pPr>
+        <w:pStyle w:val="Nagwek2"/>
+      </w:pPr>
+      <w:r>
+        <w:lastRenderedPageBreak/>
+        <w:t>5.0. Diagram pakietów – proponowana architektura systemu</w:t>
+      </w:r>
+    </w:p>
+    <w:p>
+      <w:r>
+        <w:rPr>
+          <w:noProof/>
+        </w:rPr>
+        <w:drawing>
+          <wp:inline distT="0" distB="0" distL="0" distR="0" wp14:anchorId="01A65595" wp14:editId="4CC555FA">
+            <wp:extent cx="5725160" cy="4169410"/>
+            <wp:effectExtent l="0" t="0" r="8890" b="2540"/>
+            <wp:docPr id="1578474584" name="Obraz 1"/>
+            <wp:cNvGraphicFramePr>
+              <a:graphicFrameLocks xmlns:a="http://schemas.openxmlformats.org/drawingml/2006/main" noChangeAspect="1"/>
+            </wp:cNvGraphicFramePr>
+            <a:graphic xmlns:a="http://schemas.openxmlformats.org/drawingml/2006/main">
+              <a:graphicData uri="http://schemas.openxmlformats.org/drawingml/2006/picture">
+                <pic:pic xmlns:pic="http://schemas.openxmlformats.org/drawingml/2006/picture">
+                  <pic:nvPicPr>
+                    <pic:cNvPr id="0" name="Picture 1"/>
+                    <pic:cNvPicPr>
+                      <a:picLocks noChangeAspect="1" noChangeArrowheads="1"/>
+                    </pic:cNvPicPr>
+                  </pic:nvPicPr>
+                  <pic:blipFill>
+                    <a:blip r:embed="rId14">
+                      <a:extLst>
+                        <a:ext uri="{28A0092B-C50C-407E-A947-70E740481C1C}">
+                          <a14:useLocalDpi xmlns:a14="http://schemas.microsoft.com/office/drawing/2010/main" val="0"/>
+                        </a:ext>
+                      </a:extLst>
+                    </a:blip>
+                    <a:srcRect/>
+                    <a:stretch>
+                      <a:fillRect/>
+                    </a:stretch>
+                  </pic:blipFill>
+                  <pic:spPr bwMode="auto">
+                    <a:xfrm>
+                      <a:off x="0" y="0"/>
+                      <a:ext cx="5725160" cy="4169410"/>
+                    </a:xfrm>
+                    <a:prstGeom prst="rect">
+                      <a:avLst/>
+                    </a:prstGeom>
+                    <a:noFill/>
+                    <a:ln>
+                      <a:noFill/>
+                    </a:ln>
+                  </pic:spPr>
+                </pic:pic>
+              </a:graphicData>
+            </a:graphic>
+          </wp:inline>
+        </w:drawing>
+      </w:r>
+    </w:p>
+    <w:p>
+      <w:pPr>
+        <w:rPr>
+          <w:b/>
+          <w:bCs/>
+          <w:lang w:val="pl-PL"/>
+        </w:rPr>
+      </w:pPr>
+      <w:r>
+        <w:rPr>
+          <w:b/>
+          <w:bCs/>
+          <w:lang w:val="pl-PL"/>
+        </w:rPr>
+        <w:t>Przeznaczenie diagramu</w:t>
+      </w:r>
+    </w:p>
+    <w:p>
+      <w:pPr>
+        <w:rPr>
+          <w:lang w:val="pl-PL"/>
+        </w:rPr>
+      </w:pPr>
+      <w:r>
+        <w:rPr>
+          <w:lang w:val="pl-PL"/>
+        </w:rPr>
+        <w:t>Diagram pakietów przedstawia </w:t>
+      </w:r>
+      <w:r>
+        <w:rPr>
+          <w:b/>
+          <w:bCs/>
+          <w:lang w:val="pl-PL"/>
+        </w:rPr>
+        <w:t>logiczną strukturę systemu zarządzania strzelnicą</w:t>
+      </w:r>
+      <w:r>
+        <w:rPr>
+          <w:lang w:val="pl-PL"/>
+        </w:rPr>
+        <w:t> oraz </w:t>
+      </w:r>
+      <w:r>
+        <w:rPr>
+          <w:b/>
+          <w:bCs/>
+          <w:lang w:val="pl-PL"/>
+        </w:rPr>
+        <w:t>zależności między jego modułami</w:t>
+      </w:r>
+      <w:r>
+        <w:rPr>
+          <w:lang w:val="pl-PL"/>
+        </w:rPr>
+        <w:t>. Pakiety grupują powiązane elementy systemu (klasy, komponenty) według odpowiedzialności. Diagram uzupełnia diagram klas (co modelujemy) oraz diagram wdrożenia (gdzie elementy działają fizycznie).</w:t>
+      </w:r>
+    </w:p>
+    <w:p>
+      <w:pPr>
+        <w:rPr>
+          <w:lang w:val="pl-PL"/>
+        </w:rPr>
+      </w:pPr>
+    </w:p>
+    <w:p>
+      <w:pPr>
+        <w:rPr>
+          <w:b/>
+          <w:bCs/>
+          <w:lang w:val="pl-PL"/>
+        </w:rPr>
+      </w:pPr>
+      <w:r>
+        <w:rPr>
+          <w:b/>
+          <w:bCs/>
+          <w:lang w:val="pl-PL"/>
+        </w:rPr>
+        <w:t>Pakiet prezentacja</w:t>
+      </w:r>
+    </w:p>
+    <w:p>
+      <w:pPr>
+        <w:rPr>
+          <w:lang w:val="pl-PL"/>
+        </w:rPr>
+      </w:pPr>
+      <w:r>
+        <w:rPr>
+          <w:lang w:val="pl-PL"/>
+        </w:rPr>
+        <w:t>Warstwa odpowiedzialna za </w:t>
+      </w:r>
+      <w:r>
+        <w:rPr>
+          <w:b/>
+          <w:bCs/>
+          <w:lang w:val="pl-PL"/>
+        </w:rPr>
+        <w:t>interakcję z użytkownikiem</w:t>
+      </w:r>
+      <w:r>
+        <w:rPr>
+          <w:lang w:val="pl-PL"/>
+        </w:rPr>
+        <w:t> w przeglądarce internetowej.</w:t>
+      </w:r>
+      <w:r>
+        <w:rPr>
+          <w:lang w:val="pl-PL"/>
+        </w:rPr>
+        <w:t xml:space="preserve"> </w:t>
+      </w:r>
+      <w:r>
+        <w:t>Warstwa prezentacji </w:t>
+      </w:r>
+      <w:r>
+        <w:rPr>
+          <w:b/>
+          <w:bCs/>
+        </w:rPr>
+        <w:t>nie zawiera logiki biznesowej</w:t>
+      </w:r>
+      <w:r>
+        <w:t> </w:t>
+      </w:r>
+      <w:r>
+        <w:t>-</w:t>
+      </w:r>
+      <w:r>
+        <w:t xml:space="preserve"> przekazuje żądania do warstwy aplikacji.</w:t>
+      </w:r>
+    </w:p>
+    <w:p>
+      <w:pPr>
+        <w:rPr>
+          <w:lang w:val="pl-PL"/>
+        </w:rPr>
+      </w:pPr>
+    </w:p>
+    <w:p>
+      <w:pPr>
+        <w:rPr>
+          <w:b/>
+          <w:bCs/>
+          <w:lang w:val="pl-PL"/>
+        </w:rPr>
+      </w:pPr>
+      <w:r>
+        <w:rPr>
+          <w:b/>
+          <w:bCs/>
+          <w:lang w:val="pl-PL"/>
+        </w:rPr>
+        <w:t>Pakiet aplikacja</w:t>
+      </w:r>
+    </w:p>
+    <w:p>
+      <w:pPr>
+        <w:rPr>
+          <w:lang w:val="pl-PL"/>
+        </w:rPr>
+      </w:pPr>
+      <w:r>
+        <w:rPr>
+          <w:lang w:val="pl-PL"/>
+        </w:rPr>
+        <w:t>Warstwa </w:t>
+      </w:r>
+      <w:r>
+        <w:rPr>
+          <w:b/>
+          <w:bCs/>
+          <w:lang w:val="pl-PL"/>
+        </w:rPr>
+        <w:t>logiki systemu</w:t>
+      </w:r>
+      <w:r>
+        <w:rPr>
+          <w:lang w:val="pl-PL"/>
+        </w:rPr>
+        <w:t>, hostowana na serwerze aplikacyjnym.</w:t>
+      </w:r>
+      <w:r>
+        <w:rPr>
+          <w:rFonts w:ascii="Segoe UI" w:hAnsi="Segoe UI" w:cs="Segoe UI"/>
+          <w:sz w:val="21"/>
+          <w:szCs w:val="21"/>
+          <w:shd w:val="clear" w:color="auto" w:fill="F8F8F8"/>
+        </w:rPr>
+        <w:t xml:space="preserve"> </w:t>
+      </w:r>
+      <w:r>
+        <w:t>Koordynuje operacje między interfejsem użytkownika a modelem domenowym i bazą danych.</w:t>
+      </w:r>
+    </w:p>
+    <w:p>
+      <w:pPr>
+        <w:rPr>
+          <w:lang w:val="pl-PL"/>
+        </w:rPr>
+      </w:pPr>
+    </w:p>
+    <w:p>
+      <w:pPr>
+        <w:rPr>
+          <w:b/>
+          <w:bCs/>
+          <w:lang w:val="pl-PL"/>
+        </w:rPr>
+      </w:pPr>
+      <w:r>
+        <w:rPr>
+          <w:b/>
+          <w:bCs/>
+          <w:lang w:val="pl-PL"/>
+        </w:rPr>
+        <w:t>Pakiet domena</w:t>
+      </w:r>
+    </w:p>
+    <w:p>
+      <w:pPr>
+        <w:rPr>
+          <w:lang w:val="pl-PL"/>
+        </w:rPr>
+      </w:pPr>
+      <w:r>
+        <w:rPr>
+          <w:lang w:val="pl-PL"/>
+        </w:rPr>
+        <w:t>Warstwa </w:t>
+      </w:r>
+      <w:r>
+        <w:rPr>
+          <w:b/>
+          <w:bCs/>
+          <w:lang w:val="pl-PL"/>
+        </w:rPr>
+        <w:t>modelu biznesowego</w:t>
+      </w:r>
+      <w:r>
+        <w:rPr>
+          <w:lang w:val="pl-PL"/>
+        </w:rPr>
+        <w:t> </w:t>
+      </w:r>
+      <w:r>
+        <w:rPr>
+          <w:lang w:val="pl-PL"/>
+        </w:rPr>
+        <w:t>-</w:t>
+      </w:r>
+      <w:r>
+        <w:rPr>
+          <w:lang w:val="pl-PL"/>
+        </w:rPr>
+        <w:t xml:space="preserve"> klasy domenowe z diagramu klas, opisujące reguły i obiekty strzelnicy.</w:t>
+      </w:r>
+      <w:r>
+        <w:rPr>
+          <w:rFonts w:ascii="Segoe UI" w:hAnsi="Segoe UI" w:cs="Segoe UI"/>
+          <w:sz w:val="21"/>
+          <w:szCs w:val="21"/>
+          <w:shd w:val="clear" w:color="auto" w:fill="F8F8F8"/>
+        </w:rPr>
+        <w:t xml:space="preserve"> </w:t>
+      </w:r>
+      <w:r>
+        <w:t>Pakiet domena jest </w:t>
+      </w:r>
+      <w:r>
+        <w:rPr>
+          <w:b/>
+          <w:bCs/>
+        </w:rPr>
+        <w:t>niezależny od warstwy prezentacji</w:t>
+      </w:r>
+      <w:r>
+        <w:t> </w:t>
+      </w:r>
+      <w:r>
+        <w:t>-</w:t>
+      </w:r>
+      <w:r>
+        <w:t xml:space="preserve"> opisuje logikę biznesową, nie sposób wyświetlania danych.</w:t>
+      </w:r>
+    </w:p>
+    <w:p>
+      <w:pPr>
+        <w:rPr>
+          <w:lang w:val="pl-PL"/>
+        </w:rPr>
+      </w:pPr>
+    </w:p>
+    <w:p>
+      <w:pPr>
+        <w:rPr>
+          <w:b/>
+          <w:bCs/>
+          <w:lang w:val="pl-PL"/>
+        </w:rPr>
+      </w:pPr>
+      <w:r>
+        <w:rPr>
+          <w:b/>
+          <w:bCs/>
+          <w:lang w:val="pl-PL"/>
+        </w:rPr>
+        <w:t>Pakiet dane</w:t>
+      </w:r>
+    </w:p>
+    <w:p>
+      <w:pPr>
+        <w:rPr>
+          <w:lang w:val="pl-PL"/>
+        </w:rPr>
+      </w:pPr>
+      <w:r>
+        <w:rPr>
+          <w:lang w:val="pl-PL"/>
+        </w:rPr>
+        <w:t>Warstwa </w:t>
+      </w:r>
+      <w:r>
+        <w:rPr>
+          <w:b/>
+          <w:bCs/>
+          <w:lang w:val="pl-PL"/>
+        </w:rPr>
+        <w:t>trwałego przechowywania danych</w:t>
+      </w:r>
+      <w:r>
+        <w:rPr>
+          <w:lang w:val="pl-PL"/>
+        </w:rPr>
+        <w:t>.</w:t>
+      </w:r>
+      <w:r>
+        <w:rPr>
+          <w:rFonts w:ascii="Segoe UI" w:hAnsi="Segoe UI" w:cs="Segoe UI"/>
+          <w:sz w:val="21"/>
+          <w:szCs w:val="21"/>
+          <w:shd w:val="clear" w:color="auto" w:fill="F8F8F8"/>
+        </w:rPr>
+        <w:t xml:space="preserve"> </w:t>
+      </w:r>
+      <w:r>
+        <w:t>Obiekty z pakietu domena są mapowane na tabele w bazie danych.</w:t>
+      </w:r>
+    </w:p>
+    <w:p>
+      <w:pPr>
+        <w:pStyle w:val="Nagwek2"/>
+      </w:pPr>
+      <w:r>
+        <w:lastRenderedPageBreak/>
+        <w:t>5.1.Diagram klas</w:t>
+      </w:r>
+    </w:p>
     <w:p/>
     <w:p>
-      <w:pPr>
-        <w:pStyle w:val="Nagwek2"/>
-      </w:pPr>
-      <w:r>
-        <w:t>5.1.Diagram klas</w:t>
-      </w:r>
-    </w:p>
-    <w:p/>
-    <w:p>
       <w:r>
         <w:rPr>
           <w:noProof/>
           <w:lang w:val="pl-PL"/>
         </w:rPr>
-        <w:lastRenderedPageBreak/>
         <w:drawing>
           <wp:inline distT="0" distB="0" distL="0" distR="0" wp14:anchorId="4845213D" wp14:editId="63E5565C">
             <wp:extent cx="5733415" cy="4048125"/>
@@ -5458,7 +6819,7 @@
                     <pic:cNvPicPr/>
                   </pic:nvPicPr>
                   <pic:blipFill>
-                    <a:blip r:embed="rId14"/>
+                    <a:blip r:embed="rId15"/>
                     <a:stretch>
                       <a:fillRect/>
                     </a:stretch>
@@ -5522,7 +6883,15 @@
         <w:t xml:space="preserve"> </w:t>
       </w:r>
       <w:r>
-        <w:t>Klasa dziedzicząca po Uzytkownik. Reprezentuje pracownika z najwyższymi uprawnieniami, odpowiedzialnego za podgląd i zarządzanie kontami wszystkich osób w systemie.</w:t>
+        <w:t xml:space="preserve">Klasa dziedzicząca po </w:t>
+      </w:r>
+      <w:proofErr w:type="spellStart"/>
+      <w:r>
+        <w:t>Uzytkownik</w:t>
+      </w:r>
+      <w:proofErr w:type="spellEnd"/>
+      <w:r>
+        <w:t>. Reprezentuje pracownika z najwyższymi uprawnieniami, odpowiedzialnego za podgląd i zarządzanie kontami wszystkich osób w systemie.</w:t>
       </w:r>
     </w:p>
     <w:p>
@@ -5537,7 +6906,15 @@
         <w:t>Atrybuty:</w:t>
       </w:r>
       <w:r>
-        <w:t xml:space="preserve"> Dziedziczy podstawowe atrybuty logowania z klasy nadrzędnej Uzytkownik.</w:t>
+        <w:t xml:space="preserve"> Dziedziczy podstawowe atrybuty logowania z klasy nadrzędnej </w:t>
+      </w:r>
+      <w:proofErr w:type="spellStart"/>
+      <w:r>
+        <w:t>Uzytkownik</w:t>
+      </w:r>
+      <w:proofErr w:type="spellEnd"/>
+      <w:r>
+        <w:t>.</w:t>
       </w:r>
     </w:p>
     <w:p>
@@ -5568,7 +6945,23 @@
         <w:t xml:space="preserve"> </w:t>
       </w:r>
       <w:r>
-        <w:t>+ pobierzListeUzytkownikow(): List&lt;Uzytkownik&gt; – Zwraca pełną listę wszystkich zarejestrowanych kont z bazy danych.</w:t>
+        <w:t xml:space="preserve">+ </w:t>
+      </w:r>
+      <w:proofErr w:type="spellStart"/>
+      <w:r>
+        <w:t>pobierzListeUzytkownikow</w:t>
+      </w:r>
+      <w:proofErr w:type="spellEnd"/>
+      <w:r>
+        <w:t>(): List&lt;</w:t>
+      </w:r>
+      <w:proofErr w:type="spellStart"/>
+      <w:r>
+        <w:t>Uzytkownik</w:t>
+      </w:r>
+      <w:proofErr w:type="spellEnd"/>
+      <w:r>
+        <w:t>&gt; – Zwraca pełną listę wszystkich zarejestrowanych kont z bazy danych.</w:t>
       </w:r>
     </w:p>
     <w:p>
@@ -5587,7 +6980,23 @@
         <w:t xml:space="preserve"> </w:t>
       </w:r>
       <w:r>
-        <w:t>+ filtrujTabele(filtr): List&lt;Uzytkownik&gt; – Pozwala na wyszukiwanie konkretnych osób (np. po nazwisku lub roli) na liście.</w:t>
+        <w:t xml:space="preserve">+ </w:t>
+      </w:r>
+      <w:proofErr w:type="spellStart"/>
+      <w:r>
+        <w:t>filtrujTabele</w:t>
+      </w:r>
+      <w:proofErr w:type="spellEnd"/>
+      <w:r>
+        <w:t>(filtr): List&lt;</w:t>
+      </w:r>
+      <w:proofErr w:type="spellStart"/>
+      <w:r>
+        <w:t>Uzytkownik</w:t>
+      </w:r>
+      <w:proofErr w:type="spellEnd"/>
+      <w:r>
+        <w:t>&gt; – Pozwala na wyszukiwanie konkretnych osób (np. po nazwisku lub roli) na liście.</w:t>
       </w:r>
     </w:p>
     <w:p>
@@ -5606,7 +7015,31 @@
         <w:t xml:space="preserve"> </w:t>
       </w:r>
       <w:r>
-        <w:t>+ zatwierdzZamianyKonta(uzytkownik): Boolean – Zapisuje w bazie zmodyfikowane dane lub zmienione uprawnienia konkretnego użytkownika.</w:t>
+        <w:t xml:space="preserve">+ </w:t>
+      </w:r>
+      <w:proofErr w:type="spellStart"/>
+      <w:r>
+        <w:t>zatwierdzZamianyKonta</w:t>
+      </w:r>
+      <w:proofErr w:type="spellEnd"/>
+      <w:r>
+        <w:t>(</w:t>
+      </w:r>
+      <w:proofErr w:type="spellStart"/>
+      <w:r>
+        <w:t>uzytkownik</w:t>
+      </w:r>
+      <w:proofErr w:type="spellEnd"/>
+      <w:r>
+        <w:t xml:space="preserve">): </w:t>
+      </w:r>
+      <w:proofErr w:type="spellStart"/>
+      <w:r>
+        <w:t>Boolean</w:t>
+      </w:r>
+      <w:proofErr w:type="spellEnd"/>
+      <w:r>
+        <w:t xml:space="preserve"> – Zapisuje w bazie zmodyfikowane dane lub zmienione uprawnienia konkretnego użytkownika.</w:t>
       </w:r>
     </w:p>
     <w:p>
@@ -5621,6 +7054,7 @@
           <w:szCs w:val="24"/>
         </w:rPr>
       </w:pPr>
+      <w:proofErr w:type="spellStart"/>
       <w:r>
         <w:rPr>
           <w:sz w:val="24"/>
@@ -5628,6 +7062,7 @@
         </w:rPr>
         <w:t>AmunicjaMagazyn</w:t>
       </w:r>
+      <w:proofErr w:type="spellEnd"/>
     </w:p>
     <w:p>
       <w:pPr>
@@ -5671,8 +7106,21 @@
       <w:r>
         <w:t xml:space="preserve">- </w:t>
       </w:r>
-      <w:r>
-        <w:t>iloscSztuk: Integer – Wskazuje, ile fizycznie sztuk znajduje się na stanie.</w:t>
+      <w:proofErr w:type="spellStart"/>
+      <w:r>
+        <w:t>iloscSztuk</w:t>
+      </w:r>
+      <w:proofErr w:type="spellEnd"/>
+      <w:r>
+        <w:t xml:space="preserve">: </w:t>
+      </w:r>
+      <w:proofErr w:type="spellStart"/>
+      <w:r>
+        <w:t>Integer</w:t>
+      </w:r>
+      <w:proofErr w:type="spellEnd"/>
+      <w:r>
+        <w:t xml:space="preserve"> – Wskazuje, ile fizycznie sztuk znajduje się na stanie.</w:t>
       </w:r>
     </w:p>
     <w:p>
@@ -5692,13 +7140,46 @@
         <w:pStyle w:val="Akapitzlist"/>
       </w:pPr>
       <w:r>
+        <w:lastRenderedPageBreak/>
         <w:t>-</w:t>
       </w:r>
       <w:r>
         <w:t xml:space="preserve"> </w:t>
       </w:r>
       <w:r>
-        <w:t>+ odejmijAmunicje(ilosc: Integer): Boolean – Pomniejsza stan magazynowy o liczbę naboi zużytych podczas zakończonej sesji strzeleckiej.</w:t>
+        <w:t xml:space="preserve">+ </w:t>
+      </w:r>
+      <w:proofErr w:type="spellStart"/>
+      <w:r>
+        <w:t>odejmijAmunicje</w:t>
+      </w:r>
+      <w:proofErr w:type="spellEnd"/>
+      <w:r>
+        <w:t>(</w:t>
+      </w:r>
+      <w:proofErr w:type="spellStart"/>
+      <w:r>
+        <w:t>ilosc</w:t>
+      </w:r>
+      <w:proofErr w:type="spellEnd"/>
+      <w:r>
+        <w:t xml:space="preserve">: </w:t>
+      </w:r>
+      <w:proofErr w:type="spellStart"/>
+      <w:r>
+        <w:t>Integer</w:t>
+      </w:r>
+      <w:proofErr w:type="spellEnd"/>
+      <w:r>
+        <w:t xml:space="preserve">): </w:t>
+      </w:r>
+      <w:proofErr w:type="spellStart"/>
+      <w:r>
+        <w:t>Boolean</w:t>
+      </w:r>
+      <w:proofErr w:type="spellEnd"/>
+      <w:r>
+        <w:t xml:space="preserve"> – Pomniejsza stan magazynowy o liczbę naboi zużytych podczas zakończonej sesji strzeleckiej.</w:t>
       </w:r>
     </w:p>
     <w:p>
@@ -5713,6 +7194,7 @@
           <w:szCs w:val="24"/>
         </w:rPr>
       </w:pPr>
+      <w:proofErr w:type="spellStart"/>
       <w:r>
         <w:rPr>
           <w:sz w:val="24"/>
@@ -5720,6 +7202,7 @@
         </w:rPr>
         <w:t>EgzemplarzBroni</w:t>
       </w:r>
+      <w:proofErr w:type="spellEnd"/>
     </w:p>
     <w:p>
       <w:pPr>
@@ -5733,7 +7216,6 @@
         </w:rPr>
       </w:pPr>
       <w:r>
-        <w:lastRenderedPageBreak/>
         <w:t>Opis:</w:t>
       </w:r>
       <w:r>
@@ -5773,8 +7255,13 @@
         </w:rPr>
         <w:t xml:space="preserve"> </w:t>
       </w:r>
-      <w:r>
-        <w:t>nrSeryjny: String – Unikalny identyfikator wybity na broni.</w:t>
+      <w:proofErr w:type="spellStart"/>
+      <w:r>
+        <w:t>nrSeryjny</w:t>
+      </w:r>
+      <w:proofErr w:type="spellEnd"/>
+      <w:r>
+        <w:t>: String – Unikalny identyfikator wybity na broni.</w:t>
       </w:r>
     </w:p>
     <w:p>
@@ -5792,8 +7279,21 @@
         </w:rPr>
         <w:t xml:space="preserve"> </w:t>
       </w:r>
-      <w:r>
-        <w:t>aktualnyPrzebieg: Integer – Sumaryczna liczba wystrzelonych z tej broni naboi.</w:t>
+      <w:proofErr w:type="spellStart"/>
+      <w:r>
+        <w:t>aktualnyPrzebieg</w:t>
+      </w:r>
+      <w:proofErr w:type="spellEnd"/>
+      <w:r>
+        <w:t xml:space="preserve">: </w:t>
+      </w:r>
+      <w:proofErr w:type="spellStart"/>
+      <w:r>
+        <w:t>Integer</w:t>
+      </w:r>
+      <w:proofErr w:type="spellEnd"/>
+      <w:r>
+        <w:t xml:space="preserve"> – Sumaryczna liczba wystrzelonych z tej broni naboi.</w:t>
       </w:r>
     </w:p>
     <w:p>
@@ -5819,7 +7319,39 @@
         <w:t xml:space="preserve"> </w:t>
       </w:r>
       <w:r>
-        <w:t>+ aktualizujPrzebieg(ilosc: Integer): void – Dopisuje nową liczbę oddanych strzałów do ogólnego przebiegu danej jednostki po treningu.</w:t>
+        <w:t xml:space="preserve">+ </w:t>
+      </w:r>
+      <w:proofErr w:type="spellStart"/>
+      <w:r>
+        <w:t>aktualizujPrzebieg</w:t>
+      </w:r>
+      <w:proofErr w:type="spellEnd"/>
+      <w:r>
+        <w:t>(</w:t>
+      </w:r>
+      <w:proofErr w:type="spellStart"/>
+      <w:r>
+        <w:t>ilosc</w:t>
+      </w:r>
+      <w:proofErr w:type="spellEnd"/>
+      <w:r>
+        <w:t xml:space="preserve">: </w:t>
+      </w:r>
+      <w:proofErr w:type="spellStart"/>
+      <w:r>
+        <w:t>Integer</w:t>
+      </w:r>
+      <w:proofErr w:type="spellEnd"/>
+      <w:r>
+        <w:t xml:space="preserve">): </w:t>
+      </w:r>
+      <w:proofErr w:type="spellStart"/>
+      <w:r>
+        <w:t>void</w:t>
+      </w:r>
+      <w:proofErr w:type="spellEnd"/>
+      <w:r>
+        <w:t xml:space="preserve"> – Dopisuje nową liczbę oddanych strzałów do ogólnego przebiegu danej jednostki po treningu.</w:t>
       </w:r>
     </w:p>
     <w:p>
@@ -5857,7 +7389,15 @@
         <w:t>:</w:t>
       </w:r>
       <w:r>
-        <w:t xml:space="preserve"> Klasa dziedzicząca po Uzytkownik. Reprezentuje pracownika obsługi, który ma uprawnienia do prowadzenia strzelania i weryfikacji tożsamości.</w:t>
+        <w:t xml:space="preserve"> Klasa dziedzicząca po </w:t>
+      </w:r>
+      <w:proofErr w:type="spellStart"/>
+      <w:r>
+        <w:t>Uzytkownik</w:t>
+      </w:r>
+      <w:proofErr w:type="spellEnd"/>
+      <w:r>
+        <w:t>. Reprezentuje pracownika obsługi, który ma uprawnienia do prowadzenia strzelania i weryfikacji tożsamości.</w:t>
       </w:r>
     </w:p>
     <w:p>
@@ -5887,8 +7427,13 @@
         </w:rPr>
         <w:t xml:space="preserve"> </w:t>
       </w:r>
-      <w:r>
-        <w:t>NrLegitymacji: string – Zapisany numer uprawnień państwowych/związkowych pracownika.</w:t>
+      <w:proofErr w:type="spellStart"/>
+      <w:r>
+        <w:t>NrLegitymacji</w:t>
+      </w:r>
+      <w:proofErr w:type="spellEnd"/>
+      <w:r>
+        <w:t>: string – Zapisany numer uprawnień państwowych/związkowych pracownika.</w:t>
       </w:r>
     </w:p>
     <w:p>
@@ -5919,7 +7464,23 @@
         <w:t xml:space="preserve"> </w:t>
       </w:r>
       <w:r>
-        <w:t>+ weryfikujDokument(klient: Klient, rodzaj: String, pesel: string): Boolean – Waliduje tożsamość klienta, przyjmując jako argumenty konkretne dane z okazanego dokumentu (w tym numer PESEL).</w:t>
+        <w:t xml:space="preserve">+ </w:t>
+      </w:r>
+      <w:proofErr w:type="spellStart"/>
+      <w:r>
+        <w:t>weryfikujDokument</w:t>
+      </w:r>
+      <w:proofErr w:type="spellEnd"/>
+      <w:r>
+        <w:t xml:space="preserve">(klient: Klient, rodzaj: String, pesel: string): </w:t>
+      </w:r>
+      <w:proofErr w:type="spellStart"/>
+      <w:r>
+        <w:t>Boolean</w:t>
+      </w:r>
+      <w:proofErr w:type="spellEnd"/>
+      <w:r>
+        <w:t xml:space="preserve"> – Waliduje tożsamość klienta, przyjmując jako argumenty konkretne dane z okazanego dokumentu (w tym numer PESEL).</w:t>
       </w:r>
     </w:p>
     <w:p>
@@ -5938,7 +7499,23 @@
         <w:t xml:space="preserve"> </w:t>
       </w:r>
       <w:r>
-        <w:t>+ wykonajCheckIn(Rezerwacja): SesjaStrzelecka – Przekształca oczekującą rezerwację w trwający trening na osi strzeleckiej.</w:t>
+        <w:t xml:space="preserve">+ </w:t>
+      </w:r>
+      <w:proofErr w:type="spellStart"/>
+      <w:r>
+        <w:t>wykonajCheckIn</w:t>
+      </w:r>
+      <w:proofErr w:type="spellEnd"/>
+      <w:r>
+        <w:t xml:space="preserve">(Rezerwacja): </w:t>
+      </w:r>
+      <w:proofErr w:type="spellStart"/>
+      <w:r>
+        <w:t>SesjaStrzelecka</w:t>
+      </w:r>
+      <w:proofErr w:type="spellEnd"/>
+      <w:r>
+        <w:t xml:space="preserve"> – Przekształca oczekującą rezerwację w trwający trening na osi strzeleckiej.</w:t>
       </w:r>
     </w:p>
     <w:p>
@@ -5957,7 +7534,31 @@
         <w:t xml:space="preserve"> </w:t>
       </w:r>
       <w:r>
-        <w:t>+ wykonajCheckOut(SesjaStrzelecka, wyniki): void – Zamyka sesję, przekazując wyniki do rozliczenia kosztów i zasobów.</w:t>
+        <w:t xml:space="preserve">+ </w:t>
+      </w:r>
+      <w:proofErr w:type="spellStart"/>
+      <w:r>
+        <w:t>wykonajCheckOut</w:t>
+      </w:r>
+      <w:proofErr w:type="spellEnd"/>
+      <w:r>
+        <w:t>(</w:t>
+      </w:r>
+      <w:proofErr w:type="spellStart"/>
+      <w:r>
+        <w:t>SesjaStrzelecka</w:t>
+      </w:r>
+      <w:proofErr w:type="spellEnd"/>
+      <w:r>
+        <w:t xml:space="preserve">, wyniki): </w:t>
+      </w:r>
+      <w:proofErr w:type="spellStart"/>
+      <w:r>
+        <w:t>void</w:t>
+      </w:r>
+      <w:proofErr w:type="spellEnd"/>
+      <w:r>
+        <w:t xml:space="preserve"> – Zamyka sesję, przekazując wyniki do rozliczenia kosztów i zasobów.</w:t>
       </w:r>
     </w:p>
     <w:p>
@@ -5992,7 +7593,15 @@
         <w:t>Opis:</w:t>
       </w:r>
       <w:r>
-        <w:t xml:space="preserve"> Klasa dziedzicząca po Uzytkownik. Główny aktor korzystający z usług strzelnicy, dokonujący rezerwacji i budujący swoją historię.</w:t>
+        <w:t xml:space="preserve"> Klasa dziedzicząca po </w:t>
+      </w:r>
+      <w:proofErr w:type="spellStart"/>
+      <w:r>
+        <w:t>Uzytkownik</w:t>
+      </w:r>
+      <w:proofErr w:type="spellEnd"/>
+      <w:r>
+        <w:t>. Główny aktor korzystający z usług strzelnicy, dokonujący rezerwacji i budujący swoją historię.</w:t>
       </w:r>
     </w:p>
     <w:p>
@@ -6022,8 +7631,13 @@
         </w:rPr>
         <w:t xml:space="preserve"> </w:t>
       </w:r>
-      <w:r>
-        <w:t>Imie: String – Imię klienta.</w:t>
+      <w:proofErr w:type="spellStart"/>
+      <w:r>
+        <w:t>Imie</w:t>
+      </w:r>
+      <w:proofErr w:type="spellEnd"/>
+      <w:r>
+        <w:t>: String – Imię klienta.</w:t>
       </w:r>
     </w:p>
     <w:p>
@@ -6079,8 +7693,21 @@
         </w:rPr>
         <w:t xml:space="preserve"> </w:t>
       </w:r>
-      <w:r>
-        <w:t>Status_weryfikacji: Boolean – Flaga informująca, czy instruktor autoryzował tę osobę.</w:t>
+      <w:proofErr w:type="spellStart"/>
+      <w:r>
+        <w:t>Status_weryfikacji</w:t>
+      </w:r>
+      <w:proofErr w:type="spellEnd"/>
+      <w:r>
+        <w:t xml:space="preserve">: </w:t>
+      </w:r>
+      <w:proofErr w:type="spellStart"/>
+      <w:r>
+        <w:t>Boolean</w:t>
+      </w:r>
+      <w:proofErr w:type="spellEnd"/>
+      <w:r>
+        <w:t xml:space="preserve"> – Flaga informująca, czy instruktor autoryzował tę osobę.</w:t>
       </w:r>
     </w:p>
     <w:p>
@@ -6110,8 +7737,13 @@
         </w:rPr>
         <w:t xml:space="preserve"> </w:t>
       </w:r>
-      <w:r>
-        <w:t>zlozRezerwacja(data, stanowisko): Rezerwacja – Inicjuje proces rezerwowania wolnego toru w wybranym terminie.</w:t>
+      <w:proofErr w:type="spellStart"/>
+      <w:r>
+        <w:t>zlozRezerwacja</w:t>
+      </w:r>
+      <w:proofErr w:type="spellEnd"/>
+      <w:r>
+        <w:t>(data, stanowisko): Rezerwacja – Inicjuje proces rezerwowania wolnego toru w wybranym terminie.</w:t>
       </w:r>
     </w:p>
     <w:p>
@@ -6126,6 +7758,7 @@
           <w:szCs w:val="24"/>
         </w:rPr>
       </w:pPr>
+      <w:proofErr w:type="spellStart"/>
       <w:r>
         <w:rPr>
           <w:sz w:val="24"/>
@@ -6133,6 +7766,7 @@
         </w:rPr>
         <w:t>Placowka</w:t>
       </w:r>
+      <w:proofErr w:type="spellEnd"/>
     </w:p>
     <w:p>
       <w:pPr>
@@ -6227,7 +7861,23 @@
         <w:t xml:space="preserve"> </w:t>
       </w:r>
       <w:r>
-        <w:t>+ dodajDoMagazynu(Egzemplarz broni): void – Dopisuje nowo zakupioną sztukę uzbrojenia do inwentarza tej konkretnej lokalizacji.</w:t>
+        <w:t xml:space="preserve">+ </w:t>
+      </w:r>
+      <w:proofErr w:type="spellStart"/>
+      <w:r>
+        <w:t>dodajDoMagazynu</w:t>
+      </w:r>
+      <w:proofErr w:type="spellEnd"/>
+      <w:r>
+        <w:t xml:space="preserve">(Egzemplarz broni): </w:t>
+      </w:r>
+      <w:proofErr w:type="spellStart"/>
+      <w:r>
+        <w:t>void</w:t>
+      </w:r>
+      <w:proofErr w:type="spellEnd"/>
+      <w:r>
+        <w:t xml:space="preserve"> – Dopisuje nowo zakupioną sztukę uzbrojenia do inwentarza tej konkretnej lokalizacji.</w:t>
       </w:r>
     </w:p>
     <w:p>
@@ -6259,6 +7909,7 @@
         </w:numPr>
       </w:pPr>
       <w:r>
+        <w:lastRenderedPageBreak/>
         <w:t>Opis:</w:t>
       </w:r>
       <w:r>
@@ -6285,7 +7936,6 @@
         </w:rPr>
       </w:pPr>
       <w:r>
-        <w:lastRenderedPageBreak/>
         <w:t>-</w:t>
       </w:r>
       <w:r>
@@ -6300,7 +7950,21 @@
         <w:rPr>
           <w:lang w:val="pl-PL"/>
         </w:rPr>
-        <w:t xml:space="preserve">data: date – Zaplanowany dzień wizyty na strzelnicy. </w:t>
+        <w:t xml:space="preserve">data: </w:t>
+      </w:r>
+      <w:proofErr w:type="spellStart"/>
+      <w:r>
+        <w:rPr>
+          <w:lang w:val="pl-PL"/>
+        </w:rPr>
+        <w:t>date</w:t>
+      </w:r>
+      <w:proofErr w:type="spellEnd"/>
+      <w:r>
+        <w:rPr>
+          <w:lang w:val="pl-PL"/>
+        </w:rPr>
+        <w:t xml:space="preserve"> – Zaplanowany dzień wizyty na strzelnicy. </w:t>
       </w:r>
     </w:p>
     <w:p>
@@ -6350,7 +8014,23 @@
         <w:t xml:space="preserve"> </w:t>
       </w:r>
       <w:r>
-        <w:t>+ pobierzKlienta(): void – Zwraca dane osoby, która dokonała rezerwacji w celu jej weryfikacji przy stanowisku instruktora.</w:t>
+        <w:t xml:space="preserve">+ </w:t>
+      </w:r>
+      <w:proofErr w:type="spellStart"/>
+      <w:r>
+        <w:t>pobierzKlienta</w:t>
+      </w:r>
+      <w:proofErr w:type="spellEnd"/>
+      <w:r>
+        <w:t xml:space="preserve">(): </w:t>
+      </w:r>
+      <w:proofErr w:type="spellStart"/>
+      <w:r>
+        <w:t>void</w:t>
+      </w:r>
+      <w:proofErr w:type="spellEnd"/>
+      <w:r>
+        <w:t xml:space="preserve"> – Zwraca dane osoby, która dokonała rezerwacji w celu jej weryfikacji przy stanowisku instruktora.</w:t>
       </w:r>
     </w:p>
     <w:p>
@@ -6369,7 +8049,31 @@
         <w:t xml:space="preserve"> </w:t>
       </w:r>
       <w:r>
-        <w:t>+ zmienStatus(): void – Modyfikuje etap rezerwacji w cyklu życia wizyty (np. przy autoryzacji "Check-in").</w:t>
+        <w:t xml:space="preserve">+ </w:t>
+      </w:r>
+      <w:proofErr w:type="spellStart"/>
+      <w:r>
+        <w:t>zmienStatus</w:t>
+      </w:r>
+      <w:proofErr w:type="spellEnd"/>
+      <w:r>
+        <w:t xml:space="preserve">(): </w:t>
+      </w:r>
+      <w:proofErr w:type="spellStart"/>
+      <w:r>
+        <w:t>void</w:t>
+      </w:r>
+      <w:proofErr w:type="spellEnd"/>
+      <w:r>
+        <w:t xml:space="preserve"> – Modyfikuje etap rezerwacji w cyklu życia wizyty (np. przy autoryzacji "</w:t>
+      </w:r>
+      <w:proofErr w:type="spellStart"/>
+      <w:r>
+        <w:t>Check</w:t>
+      </w:r>
+      <w:proofErr w:type="spellEnd"/>
+      <w:r>
+        <w:t>-in").</w:t>
       </w:r>
     </w:p>
     <w:p>
@@ -6384,6 +8088,7 @@
           <w:szCs w:val="24"/>
         </w:rPr>
       </w:pPr>
+      <w:proofErr w:type="spellStart"/>
       <w:r>
         <w:rPr>
           <w:sz w:val="24"/>
@@ -6391,6 +8096,7 @@
         </w:rPr>
         <w:t>SesjaStrzelecka</w:t>
       </w:r>
+      <w:proofErr w:type="spellEnd"/>
     </w:p>
     <w:p>
       <w:pPr>
@@ -6437,8 +8143,21 @@
         </w:rPr>
         <w:t xml:space="preserve"> </w:t>
       </w:r>
-      <w:r>
-        <w:t>czasRozpoczecia: DateTime – Rzeczywisty czas wejścia na tor.</w:t>
+      <w:proofErr w:type="spellStart"/>
+      <w:r>
+        <w:t>czasRozpoczecia</w:t>
+      </w:r>
+      <w:proofErr w:type="spellEnd"/>
+      <w:r>
+        <w:t xml:space="preserve">: </w:t>
+      </w:r>
+      <w:proofErr w:type="spellStart"/>
+      <w:r>
+        <w:t>DateTime</w:t>
+      </w:r>
+      <w:proofErr w:type="spellEnd"/>
+      <w:r>
+        <w:t xml:space="preserve"> – Rzeczywisty czas wejścia na tor.</w:t>
       </w:r>
     </w:p>
     <w:p>
@@ -6456,8 +8175,21 @@
         </w:rPr>
         <w:t xml:space="preserve"> </w:t>
       </w:r>
-      <w:r>
-        <w:t>czasZakonczenia: DateTime – Rzeczywisty czas zakończenia treningu.</w:t>
+      <w:proofErr w:type="spellStart"/>
+      <w:r>
+        <w:t>czasZakonczenia</w:t>
+      </w:r>
+      <w:proofErr w:type="spellEnd"/>
+      <w:r>
+        <w:t xml:space="preserve">: </w:t>
+      </w:r>
+      <w:proofErr w:type="spellStart"/>
+      <w:r>
+        <w:t>DateTime</w:t>
+      </w:r>
+      <w:proofErr w:type="spellEnd"/>
+      <w:r>
+        <w:t xml:space="preserve"> – Rzeczywisty czas zakończenia treningu.</w:t>
       </w:r>
     </w:p>
     <w:p>
@@ -6487,8 +8219,21 @@
         </w:rPr>
         <w:t xml:space="preserve"> </w:t>
       </w:r>
-      <w:r>
-        <w:t>podliczSesje(): void – Agreguje zgromadzone logi o amunicji i podsumowuje całościowe statystyki wizyty.</w:t>
+      <w:proofErr w:type="spellStart"/>
+      <w:r>
+        <w:t>podliczSesje</w:t>
+      </w:r>
+      <w:proofErr w:type="spellEnd"/>
+      <w:r>
+        <w:t xml:space="preserve">(): </w:t>
+      </w:r>
+      <w:proofErr w:type="spellStart"/>
+      <w:r>
+        <w:t>void</w:t>
+      </w:r>
+      <w:proofErr w:type="spellEnd"/>
+      <w:r>
+        <w:t xml:space="preserve"> – Agreguje zgromadzone logi o amunicji i podsumowuje całościowe statystyki wizyty.</w:t>
       </w:r>
     </w:p>
     <w:p>
@@ -6554,7 +8299,15 @@
         <w:t xml:space="preserve"> </w:t>
       </w:r>
       <w:r>
-        <w:t>numer: Integer – Identyfikator liczbowy toru na osi (np. 1, 2, 3).</w:t>
+        <w:t xml:space="preserve">numer: </w:t>
+      </w:r>
+      <w:proofErr w:type="spellStart"/>
+      <w:r>
+        <w:t>Integer</w:t>
+      </w:r>
+      <w:proofErr w:type="spellEnd"/>
+      <w:r>
+        <w:t xml:space="preserve"> – Identyfikator liczbowy toru na osi (np. 1, 2, 3).</w:t>
       </w:r>
     </w:p>
     <w:p>
@@ -6572,8 +8325,21 @@
         </w:rPr>
         <w:t xml:space="preserve"> </w:t>
       </w:r>
-      <w:r>
-        <w:t>dystansMetry: Integer – Maksymalna użyteczna odległość toru do tarcz.</w:t>
+      <w:proofErr w:type="spellStart"/>
+      <w:r>
+        <w:t>dystansMetry</w:t>
+      </w:r>
+      <w:proofErr w:type="spellEnd"/>
+      <w:r>
+        <w:t xml:space="preserve">: </w:t>
+      </w:r>
+      <w:proofErr w:type="spellStart"/>
+      <w:r>
+        <w:t>Integer</w:t>
+      </w:r>
+      <w:proofErr w:type="spellEnd"/>
+      <w:r>
+        <w:t xml:space="preserve"> – Maksymalna użyteczna odległość toru do tarcz.</w:t>
       </w:r>
     </w:p>
     <w:p>
@@ -6604,7 +8370,23 @@
         <w:t xml:space="preserve"> </w:t>
       </w:r>
       <w:r>
-        <w:t>+ sprawdzDostepnosc(): Boolean – Weryfikuje w harmonogramie, czy dany tor nie jest już zablokowany przez inną rezerwację.</w:t>
+        <w:t xml:space="preserve">+ </w:t>
+      </w:r>
+      <w:proofErr w:type="spellStart"/>
+      <w:r>
+        <w:t>sprawdzDostepnosc</w:t>
+      </w:r>
+      <w:proofErr w:type="spellEnd"/>
+      <w:r>
+        <w:t xml:space="preserve">(): </w:t>
+      </w:r>
+      <w:proofErr w:type="spellStart"/>
+      <w:r>
+        <w:t>Boolean</w:t>
+      </w:r>
+      <w:proofErr w:type="spellEnd"/>
+      <w:r>
+        <w:t xml:space="preserve"> – Weryfikuje w harmonogramie, czy dany tor nie jest już zablokowany przez inną rezerwację.</w:t>
       </w:r>
     </w:p>
     <w:p>
@@ -6619,6 +8401,7 @@
           <w:szCs w:val="24"/>
         </w:rPr>
       </w:pPr>
+      <w:proofErr w:type="spellStart"/>
       <w:r>
         <w:rPr>
           <w:sz w:val="24"/>
@@ -6626,6 +8409,7 @@
         </w:rPr>
         <w:t>SzczegolyZuzycia</w:t>
       </w:r>
+      <w:proofErr w:type="spellEnd"/>
     </w:p>
     <w:p>
       <w:pPr>
@@ -6669,8 +8453,21 @@
         </w:rPr>
         <w:t xml:space="preserve"> </w:t>
       </w:r>
-      <w:r>
-        <w:t>iloscAmunicji: Integer – Konkretna wartość wystrzelonych naboi na danym etapie.</w:t>
+      <w:proofErr w:type="spellStart"/>
+      <w:r>
+        <w:t>iloscAmunicji</w:t>
+      </w:r>
+      <w:proofErr w:type="spellEnd"/>
+      <w:r>
+        <w:t xml:space="preserve">: </w:t>
+      </w:r>
+      <w:proofErr w:type="spellStart"/>
+      <w:r>
+        <w:t>Integer</w:t>
+      </w:r>
+      <w:proofErr w:type="spellEnd"/>
+      <w:r>
+        <w:t xml:space="preserve"> – Konkretna wartość wystrzelonych naboi na danym etapie.</w:t>
       </w:r>
     </w:p>
     <w:p>
@@ -6688,8 +8485,21 @@
         </w:rPr>
         <w:t xml:space="preserve"> </w:t>
       </w:r>
-      <w:r>
-        <w:t>celnoscProcent: Float – Wynik procentowy celności dla danej konfiguracji.</w:t>
+      <w:proofErr w:type="spellStart"/>
+      <w:r>
+        <w:t>celnoscProcent</w:t>
+      </w:r>
+      <w:proofErr w:type="spellEnd"/>
+      <w:r>
+        <w:t xml:space="preserve">: </w:t>
+      </w:r>
+      <w:proofErr w:type="spellStart"/>
+      <w:r>
+        <w:t>Float</w:t>
+      </w:r>
+      <w:proofErr w:type="spellEnd"/>
+      <w:r>
+        <w:t xml:space="preserve"> – Wynik procentowy celności dla danej konfiguracji.</w:t>
       </w:r>
     </w:p>
     <w:p>
@@ -6720,7 +8530,31 @@
         <w:t xml:space="preserve"> </w:t>
       </w:r>
       <w:r>
-        <w:t>+ generujLog(): void – Tworzy niemutowalny wpis techniczny w systemie w celu zaktualizowania ogólnych statystyk przebiegu i zasobów.</w:t>
+        <w:t xml:space="preserve">+ </w:t>
+      </w:r>
+      <w:proofErr w:type="spellStart"/>
+      <w:r>
+        <w:t>generujLog</w:t>
+      </w:r>
+      <w:proofErr w:type="spellEnd"/>
+      <w:r>
+        <w:t xml:space="preserve">(): </w:t>
+      </w:r>
+      <w:proofErr w:type="spellStart"/>
+      <w:r>
+        <w:t>void</w:t>
+      </w:r>
+      <w:proofErr w:type="spellEnd"/>
+      <w:r>
+        <w:t xml:space="preserve"> – Tworzy </w:t>
+      </w:r>
+      <w:proofErr w:type="spellStart"/>
+      <w:r>
+        <w:t>niemutowalny</w:t>
+      </w:r>
+      <w:proofErr w:type="spellEnd"/>
+      <w:r>
+        <w:t xml:space="preserve"> wpis techniczny w systemie w celu zaktualizowania ogólnych statystyk przebiegu i zasobów.</w:t>
       </w:r>
     </w:p>
     <w:p>
@@ -6735,6 +8569,7 @@
           <w:szCs w:val="24"/>
         </w:rPr>
       </w:pPr>
+      <w:proofErr w:type="spellStart"/>
       <w:r>
         <w:rPr>
           <w:sz w:val="24"/>
@@ -6742,6 +8577,7 @@
         </w:rPr>
         <w:t>Uzytkownik</w:t>
       </w:r>
+      <w:proofErr w:type="spellEnd"/>
     </w:p>
     <w:p>
       <w:pPr>
@@ -6823,8 +8659,13 @@
         </w:rPr>
         <w:t xml:space="preserve"> </w:t>
       </w:r>
-      <w:r>
-        <w:t>Haslo: String – Przechowywany klucz dostępu (szyfrowany).</w:t>
+      <w:proofErr w:type="spellStart"/>
+      <w:r>
+        <w:t>Haslo</w:t>
+      </w:r>
+      <w:proofErr w:type="spellEnd"/>
+      <w:r>
+        <w:t>: String – Przechowywany klucz dostępu (szyfrowany).</w:t>
       </w:r>
     </w:p>
     <w:p>
@@ -6855,7 +8696,15 @@
         <w:t xml:space="preserve"> </w:t>
       </w:r>
       <w:r>
-        <w:t>+ zaloguj(): Boolean – Sprawdza poprawność przesłanych danych uwierzytelniających i przyznaje dostęp do odpowiedniego modułu aplikacji.</w:t>
+        <w:t xml:space="preserve">+ zaloguj(): </w:t>
+      </w:r>
+      <w:proofErr w:type="spellStart"/>
+      <w:r>
+        <w:t>Boolean</w:t>
+      </w:r>
+      <w:proofErr w:type="spellEnd"/>
+      <w:r>
+        <w:t xml:space="preserve"> – Sprawdza poprawność przesłanych danych uwierzytelniających i przyznaje dostęp do odpowiedniego modułu aplikacji.</w:t>
       </w:r>
     </w:p>
     <w:p>
@@ -6863,6 +8712,7 @@
         <w:pStyle w:val="Nagwek3"/>
       </w:pPr>
       <w:r>
+        <w:lastRenderedPageBreak/>
         <w:t>5.3. Diagramy stanów</w:t>
       </w:r>
     </w:p>
@@ -6894,9 +8744,9 @@
         </w:rPr>
       </w:pPr>
       <w:r>
-        <w:lastRenderedPageBreak/>
         <w:t xml:space="preserve">Diagram stanów dla klasy </w:t>
       </w:r>
+      <w:proofErr w:type="spellStart"/>
       <w:r>
         <w:t>Sesj</w:t>
       </w:r>
@@ -6909,6 +8759,7 @@
       <w:r>
         <w:t>a</w:t>
       </w:r>
+      <w:proofErr w:type="spellEnd"/>
     </w:p>
     <w:p>
       <w:pPr>
@@ -6948,7 +8799,7 @@
                     <pic:cNvPicPr/>
                   </pic:nvPicPr>
                   <pic:blipFill>
-                    <a:blip r:embed="rId15"/>
+                    <a:blip r:embed="rId16"/>
                     <a:stretch>
                       <a:fillRect/>
                     </a:stretch>
@@ -7129,7 +8980,7 @@
                     </pic:cNvPicPr>
                   </pic:nvPicPr>
                   <pic:blipFill>
-                    <a:blip r:embed="rId16">
+                    <a:blip r:embed="rId17">
                       <a:extLst>
                         <a:ext uri="{28A0092B-C50C-407E-A947-70E740481C1C}">
                           <a14:useLocalDpi xmlns:a14="http://schemas.microsoft.com/office/drawing/2010/main" val="0"/>
@@ -7173,8 +9024,17 @@
           <w:b/>
           <w:bCs/>
         </w:rPr>
-        <w:t>Kacper Gołowacz</w:t>
-      </w:r>
+        <w:t xml:space="preserve">Kacper </w:t>
+      </w:r>
+      <w:proofErr w:type="spellStart"/>
+      <w:r>
+        <w:rPr>
+          <w:b/>
+          <w:bCs/>
+        </w:rPr>
+        <w:t>Gołowacz</w:t>
+      </w:r>
+      <w:proofErr w:type="spellEnd"/>
     </w:p>
     <w:p>
       <w:pPr>
@@ -7229,7 +9089,7 @@
                     <pic:cNvPicPr/>
                   </pic:nvPicPr>
                   <pic:blipFill>
-                    <a:blip r:embed="rId17"/>
+                    <a:blip r:embed="rId18"/>
                     <a:stretch>
                       <a:fillRect/>
                     </a:stretch>
@@ -7281,7 +9141,7 @@
                     <pic:cNvPicPr preferRelativeResize="0"/>
                   </pic:nvPicPr>
                   <pic:blipFill>
-                    <a:blip r:embed="rId18"/>
+                    <a:blip r:embed="rId19"/>
                     <a:srcRect/>
                     <a:stretch>
                       <a:fillRect/>
@@ -7325,7 +9185,7 @@
                     <pic:cNvPicPr preferRelativeResize="0"/>
                   </pic:nvPicPr>
                   <pic:blipFill>
-                    <a:blip r:embed="rId19"/>
+                    <a:blip r:embed="rId20"/>
                     <a:srcRect/>
                     <a:stretch>
                       <a:fillRect/>
@@ -7368,7 +9228,7 @@
                     <pic:cNvPicPr preferRelativeResize="0"/>
                   </pic:nvPicPr>
                   <pic:blipFill>
-                    <a:blip r:embed="rId20"/>
+                    <a:blip r:embed="rId21"/>
                     <a:srcRect/>
                     <a:stretch>
                       <a:fillRect/>
@@ -7412,7 +9272,7 @@
                     <pic:cNvPicPr preferRelativeResize="0"/>
                   </pic:nvPicPr>
                   <pic:blipFill>
-                    <a:blip r:embed="rId21"/>
+                    <a:blip r:embed="rId22"/>
                     <a:srcRect/>
                     <a:stretch>
                       <a:fillRect/>
@@ -7455,7 +9315,7 @@
                     <pic:cNvPicPr preferRelativeResize="0"/>
                   </pic:nvPicPr>
                   <pic:blipFill>
-                    <a:blip r:embed="rId22"/>
+                    <a:blip r:embed="rId23"/>
                     <a:srcRect/>
                     <a:stretch>
                       <a:fillRect/>
@@ -7499,7 +9359,7 @@
                     <pic:cNvPicPr preferRelativeResize="0"/>
                   </pic:nvPicPr>
                   <pic:blipFill>
-                    <a:blip r:embed="rId23"/>
+                    <a:blip r:embed="rId24"/>
                     <a:srcRect/>
                     <a:stretch>
                       <a:fillRect/>
@@ -7542,7 +9402,7 @@
                     <pic:cNvPicPr preferRelativeResize="0"/>
                   </pic:nvPicPr>
                   <pic:blipFill>
-                    <a:blip r:embed="rId24"/>
+                    <a:blip r:embed="rId25"/>
                     <a:srcRect/>
                     <a:stretch>
                       <a:fillRect/>
@@ -7586,7 +9446,7 @@
                     <pic:cNvPicPr preferRelativeResize="0"/>
                   </pic:nvPicPr>
                   <pic:blipFill>
-                    <a:blip r:embed="rId25"/>
+                    <a:blip r:embed="rId26"/>
                     <a:srcRect/>
                     <a:stretch>
                       <a:fillRect/>
@@ -7629,7 +9489,7 @@
                     <pic:cNvPicPr preferRelativeResize="0"/>
                   </pic:nvPicPr>
                   <pic:blipFill>
-                    <a:blip r:embed="rId26"/>
+                    <a:blip r:embed="rId27"/>
                     <a:srcRect/>
                     <a:stretch>
                       <a:fillRect/>
@@ -7673,7 +9533,7 @@
                     <pic:cNvPicPr preferRelativeResize="0"/>
                   </pic:nvPicPr>
                   <pic:blipFill>
-                    <a:blip r:embed="rId27"/>
+                    <a:blip r:embed="rId28"/>
                     <a:srcRect/>
                     <a:stretch>
                       <a:fillRect/>
@@ -7745,24 +9605,114 @@
           <w:sz w:val="22"/>
           <w:szCs w:val="22"/>
         </w:rPr>
-        <w:t>System obsługuje strzelnicę z kilkoma osiami strzeleckimi i nieznaną z góry liczbą klientów dziennie. Najaktywniej zapełnianą tabelą będzie Rezerwacja, ponieważ każda wizyta generuje nowy rekord. Podobnie tabele SesjaStrzelecka i SzczegolyZuzycia będą regularnie uzupełniane przy każdej odbytej wizyty. Tabele EgzemplarzBroni i AmunicjaMagazyn będą natomiast małe i stosunkowo statyczne, ponieważ liczba egzemplarzy broni i typów amunicji na strzelnicy zmienia się rzadko. Tabele Uzytkownik i Klient będą rosły stopniowo wraz z rejestracją nowych osób.</w:t>
-      </w:r>
-    </w:p>
-    <w:p>
-      <w:pPr>
-        <w:pStyle w:val="Nagwek3"/>
+        <w:t xml:space="preserve">System obsługuje strzelnicę z kilkoma osiami strzeleckimi i nieznaną z góry liczbą klientów dziennie. Najaktywniej zapełnianą tabelą będzie Rezerwacja, ponieważ każda wizyta generuje nowy rekord. Podobnie tabele </w:t>
+      </w:r>
+      <w:proofErr w:type="spellStart"/>
+      <w:r>
         <w:rPr>
           <w:color w:val="auto"/>
           <w:sz w:val="22"/>
           <w:szCs w:val="22"/>
         </w:rPr>
-      </w:pPr>
+        <w:t>SesjaStrzelecka</w:t>
+      </w:r>
+      <w:proofErr w:type="spellEnd"/>
       <w:r>
         <w:rPr>
           <w:color w:val="auto"/>
           <w:sz w:val="22"/>
           <w:szCs w:val="22"/>
         </w:rPr>
+        <w:t xml:space="preserve"> i </w:t>
+      </w:r>
+      <w:proofErr w:type="spellStart"/>
+      <w:r>
+        <w:rPr>
+          <w:color w:val="auto"/>
+          <w:sz w:val="22"/>
+          <w:szCs w:val="22"/>
+        </w:rPr>
+        <w:t>SzczegolyZuzycia</w:t>
+      </w:r>
+      <w:proofErr w:type="spellEnd"/>
+      <w:r>
+        <w:rPr>
+          <w:color w:val="auto"/>
+          <w:sz w:val="22"/>
+          <w:szCs w:val="22"/>
+        </w:rPr>
+        <w:t xml:space="preserve"> będą regularnie uzupełniane przy każdej odbytej wizyty. Tabele </w:t>
+      </w:r>
+      <w:proofErr w:type="spellStart"/>
+      <w:r>
+        <w:rPr>
+          <w:color w:val="auto"/>
+          <w:sz w:val="22"/>
+          <w:szCs w:val="22"/>
+        </w:rPr>
+        <w:t>EgzemplarzBroni</w:t>
+      </w:r>
+      <w:proofErr w:type="spellEnd"/>
+      <w:r>
+        <w:rPr>
+          <w:color w:val="auto"/>
+          <w:sz w:val="22"/>
+          <w:szCs w:val="22"/>
+        </w:rPr>
+        <w:t xml:space="preserve"> i </w:t>
+      </w:r>
+      <w:proofErr w:type="spellStart"/>
+      <w:r>
+        <w:rPr>
+          <w:color w:val="auto"/>
+          <w:sz w:val="22"/>
+          <w:szCs w:val="22"/>
+        </w:rPr>
+        <w:t>AmunicjaMagazyn</w:t>
+      </w:r>
+      <w:proofErr w:type="spellEnd"/>
+      <w:r>
+        <w:rPr>
+          <w:color w:val="auto"/>
+          <w:sz w:val="22"/>
+          <w:szCs w:val="22"/>
+        </w:rPr>
+        <w:t xml:space="preserve"> będą natomiast małe i stosunkowo statyczne, ponieważ liczba egzemplarzy broni i typów amunicji na strzelnicy zmienia się rzadko. Tabele </w:t>
+      </w:r>
+      <w:proofErr w:type="spellStart"/>
+      <w:r>
+        <w:rPr>
+          <w:color w:val="auto"/>
+          <w:sz w:val="22"/>
+          <w:szCs w:val="22"/>
+        </w:rPr>
+        <w:t>Uzytkownik</w:t>
+      </w:r>
+      <w:proofErr w:type="spellEnd"/>
+      <w:r>
+        <w:rPr>
+          <w:color w:val="auto"/>
+          <w:sz w:val="22"/>
+          <w:szCs w:val="22"/>
+        </w:rPr>
+        <w:t xml:space="preserve"> i Klient będą rosły stopniowo wraz z rejestracją nowych osób.</w:t>
+      </w:r>
+    </w:p>
+    <w:p>
+      <w:pPr>
+        <w:pStyle w:val="Nagwek3"/>
+        <w:rPr>
+          <w:color w:val="auto"/>
+          <w:sz w:val="22"/>
+          <w:szCs w:val="22"/>
+        </w:rPr>
+      </w:pPr>
+      <w:r>
+        <w:rPr>
+          <w:color w:val="auto"/>
+          <w:sz w:val="22"/>
+          <w:szCs w:val="22"/>
+        </w:rPr>
         <w:t>Biorąc pod uwagę charakter danych tekstowych i liczbowych przechowywanych w systemie oraz dostępną przestrzeń dyskową serwera wynoszącą 4 TB, baza danych nie zbliży się do jej zapełnienia w żadnym przewidywalnym horyzoncie czasowym działania strzelnicy.</w:t>
       </w:r>
     </w:p>
@@ -7794,7 +9744,15 @@
         <w:t>Operacje krytyczne</w:t>
       </w:r>
       <w:r>
-        <w:t xml:space="preserve"> po stronie instruktora takie jak weryfikacja dokumentu i wykonanie check-in powinny być realizowane w czasie do 1 sekundy, ponieważ wykonywane są przy obecności klienta i bezpośrednio wpływają na przepustowość strzelnicy.</w:t>
+        <w:t xml:space="preserve"> po stronie instruktora takie jak weryfikacja dokumentu i wykonanie </w:t>
+      </w:r>
+      <w:proofErr w:type="spellStart"/>
+      <w:r>
+        <w:t>check</w:t>
+      </w:r>
+      <w:proofErr w:type="spellEnd"/>
+      <w:r>
+        <w:t>-in powinny być realizowane w czasie do 1 sekundy, ponieważ wykonywane są przy obecności klienta i bezpośrednio wpływają na przepustowość strzelnicy.</w:t>
       </w:r>
     </w:p>
     <w:p>
@@ -8037,6 +9995,7 @@
                 <w:lang w:val="pl-PL"/>
               </w:rPr>
             </w:pPr>
+            <w:proofErr w:type="spellStart"/>
             <w:r>
               <w:rPr>
                 <w:b/>
@@ -8045,6 +10004,7 @@
               </w:rPr>
               <w:t>Oczekujaca</w:t>
             </w:r>
+            <w:proofErr w:type="spellEnd"/>
           </w:p>
         </w:tc>
         <w:tc>
@@ -8096,6 +10056,7 @@
                 <w:lang w:val="pl-PL"/>
               </w:rPr>
             </w:pPr>
+            <w:proofErr w:type="spellStart"/>
             <w:r>
               <w:rPr>
                 <w:b/>
@@ -8104,6 +10065,7 @@
               </w:rPr>
               <w:t>WymagaWeryfikacji</w:t>
             </w:r>
+            <w:proofErr w:type="spellEnd"/>
           </w:p>
         </w:tc>
         <w:tc>
@@ -8188,7 +10150,21 @@
               <w:rPr>
                 <w:lang w:val="pl-PL"/>
               </w:rPr>
-              <w:t>Dokument klienta został zweryfikowany poprawnie. Rezerwacja ma status „zweryfikowany” i możliwe jest wykonanie check-in.</w:t>
+              <w:t xml:space="preserve">Dokument klienta został zweryfikowany poprawnie. Rezerwacja ma status „zweryfikowany” i możliwe jest wykonanie </w:t>
+            </w:r>
+            <w:proofErr w:type="spellStart"/>
+            <w:r>
+              <w:rPr>
+                <w:lang w:val="pl-PL"/>
+              </w:rPr>
+              <w:t>check</w:t>
+            </w:r>
+            <w:proofErr w:type="spellEnd"/>
+            <w:r>
+              <w:rPr>
+                <w:lang w:val="pl-PL"/>
+              </w:rPr>
+              <w:t>-in.</w:t>
             </w:r>
           </w:p>
         </w:tc>
@@ -8214,6 +10190,7 @@
                 <w:lang w:val="pl-PL"/>
               </w:rPr>
             </w:pPr>
+            <w:proofErr w:type="spellStart"/>
             <w:r>
               <w:rPr>
                 <w:b/>
@@ -8222,6 +10199,7 @@
               </w:rPr>
               <w:t>WTrakcieWizyty</w:t>
             </w:r>
+            <w:proofErr w:type="spellEnd"/>
           </w:p>
         </w:tc>
         <w:tc>
@@ -8247,7 +10225,21 @@
               <w:rPr>
                 <w:lang w:val="pl-PL"/>
               </w:rPr>
-              <w:t xml:space="preserve">Wykonano check-in. Utworzono sesję strzelecką. Klient przebywa na stanowisku, trwa </w:t>
+              <w:t xml:space="preserve">Wykonano </w:t>
+            </w:r>
+            <w:proofErr w:type="spellStart"/>
+            <w:r>
+              <w:rPr>
+                <w:lang w:val="pl-PL"/>
+              </w:rPr>
+              <w:t>check</w:t>
+            </w:r>
+            <w:proofErr w:type="spellEnd"/>
+            <w:r>
+              <w:rPr>
+                <w:lang w:val="pl-PL"/>
+              </w:rPr>
+              <w:t xml:space="preserve">-in. Utworzono sesję strzelecką. Klient przebywa na stanowisku, trwa </w:t>
             </w:r>
             <w:r>
               <w:rPr>
@@ -8285,6 +10277,7 @@
                 <w:lang w:val="pl-PL"/>
               </w:rPr>
             </w:pPr>
+            <w:proofErr w:type="spellStart"/>
             <w:r>
               <w:rPr>
                 <w:b/>
@@ -8293,6 +10286,7 @@
               </w:rPr>
               <w:t>Zakonczona</w:t>
             </w:r>
+            <w:proofErr w:type="spellEnd"/>
           </w:p>
         </w:tc>
         <w:tc>
@@ -8318,7 +10312,21 @@
               <w:rPr>
                 <w:lang w:val="pl-PL"/>
               </w:rPr>
-              <w:t xml:space="preserve">Wykonano check-out. Sesja strzelecka została rozliczona. Rezerwacja jest zamknięta </w:t>
+              <w:t xml:space="preserve">Wykonano </w:t>
+            </w:r>
+            <w:proofErr w:type="spellStart"/>
+            <w:r>
+              <w:rPr>
+                <w:lang w:val="pl-PL"/>
+              </w:rPr>
+              <w:t>check</w:t>
+            </w:r>
+            <w:proofErr w:type="spellEnd"/>
+            <w:r>
+              <w:rPr>
+                <w:lang w:val="pl-PL"/>
+              </w:rPr>
+              <w:t xml:space="preserve">-out. Sesja strzelecka została rozliczona. Rezerwacja jest zamknięta </w:t>
             </w:r>
             <w:r>
               <w:rPr>
@@ -8481,162 +10489,10 @@
     </w:p>
     <w:p>
       <w:pPr>
-        <w:ind w:left="360"/>
-        <w:rPr>
-          <w:b/>
-          <w:bCs/>
-        </w:rPr>
-      </w:pPr>
-    </w:p>
-    <w:p>
-      <w:pPr>
-        <w:ind w:left="360"/>
-        <w:rPr>
-          <w:b/>
-          <w:bCs/>
-        </w:rPr>
-      </w:pPr>
-    </w:p>
-    <w:p>
-      <w:pPr>
-        <w:ind w:left="360"/>
-        <w:rPr>
-          <w:b/>
-          <w:bCs/>
-        </w:rPr>
-      </w:pPr>
-    </w:p>
-    <w:p>
-      <w:pPr>
-        <w:ind w:left="360"/>
-        <w:rPr>
-          <w:b/>
-          <w:bCs/>
-        </w:rPr>
-      </w:pPr>
-    </w:p>
-    <w:p>
-      <w:pPr>
-        <w:ind w:left="360"/>
-        <w:rPr>
-          <w:b/>
-          <w:bCs/>
-        </w:rPr>
-      </w:pPr>
-    </w:p>
-    <w:p>
-      <w:pPr>
-        <w:ind w:left="360"/>
-        <w:rPr>
-          <w:b/>
-          <w:bCs/>
-        </w:rPr>
-      </w:pPr>
-    </w:p>
-    <w:p>
-      <w:pPr>
-        <w:ind w:left="360"/>
-        <w:rPr>
-          <w:b/>
-          <w:bCs/>
-        </w:rPr>
-      </w:pPr>
-    </w:p>
-    <w:p>
-      <w:pPr>
-        <w:ind w:left="360"/>
-        <w:rPr>
-          <w:b/>
-          <w:bCs/>
-        </w:rPr>
-      </w:pPr>
-    </w:p>
-    <w:p>
-      <w:pPr>
-        <w:ind w:left="360"/>
-        <w:rPr>
-          <w:b/>
-          <w:bCs/>
-        </w:rPr>
-      </w:pPr>
-    </w:p>
-    <w:p>
-      <w:pPr>
-        <w:ind w:left="360"/>
-        <w:rPr>
-          <w:b/>
-          <w:bCs/>
-        </w:rPr>
-      </w:pPr>
-    </w:p>
-    <w:p>
-      <w:pPr>
-        <w:ind w:left="360"/>
-        <w:rPr>
-          <w:b/>
-          <w:bCs/>
-        </w:rPr>
-      </w:pPr>
-    </w:p>
-    <w:p>
-      <w:pPr>
-        <w:ind w:left="360"/>
-        <w:rPr>
-          <w:b/>
-          <w:bCs/>
-        </w:rPr>
-      </w:pPr>
-    </w:p>
-    <w:p>
-      <w:pPr>
-        <w:ind w:left="360"/>
-        <w:rPr>
-          <w:b/>
-          <w:bCs/>
-        </w:rPr>
-      </w:pPr>
-    </w:p>
-    <w:p>
-      <w:pPr>
-        <w:ind w:left="360"/>
-        <w:rPr>
-          <w:b/>
-          <w:bCs/>
-        </w:rPr>
-      </w:pPr>
-    </w:p>
-    <w:p>
-      <w:pPr>
-        <w:ind w:left="360"/>
-        <w:rPr>
-          <w:b/>
-          <w:bCs/>
-        </w:rPr>
-      </w:pPr>
-    </w:p>
-    <w:p>
-      <w:pPr>
-        <w:ind w:left="360"/>
-        <w:rPr>
-          <w:b/>
-          <w:bCs/>
-        </w:rPr>
-      </w:pPr>
-    </w:p>
-    <w:p>
-      <w:pPr>
-        <w:ind w:left="360"/>
-        <w:rPr>
-          <w:b/>
-          <w:bCs/>
-        </w:rPr>
-      </w:pPr>
-    </w:p>
-    <w:p>
-      <w:pPr>
         <w:pStyle w:val="Nagwek2"/>
       </w:pPr>
       <w:r>
+        <w:lastRenderedPageBreak/>
         <w:t>7. Propozycja technologii informatycznych do wykorzystania</w:t>
       </w:r>
     </w:p>
@@ -8800,8 +10656,18 @@
                 <w:sz w:val="21"/>
                 <w:szCs w:val="21"/>
               </w:rPr>
-              <w:t>ASP.NET Core</w:t>
+              <w:t xml:space="preserve">ASP.NET </w:t>
             </w:r>
+            <w:proofErr w:type="spellStart"/>
+            <w:r>
+              <w:rPr>
+                <w:rStyle w:val="font-semibold"/>
+                <w:sz w:val="21"/>
+                <w:szCs w:val="21"/>
+              </w:rPr>
+              <w:t>Core</w:t>
+            </w:r>
+            <w:proofErr w:type="spellEnd"/>
           </w:p>
         </w:tc>
       </w:tr>
@@ -8970,7 +10836,23 @@
                 <w:sz w:val="21"/>
                 <w:szCs w:val="21"/>
               </w:rPr>
-              <w:t>Przeglądarka (Chrome / Firefox)</w:t>
+              <w:t xml:space="preserve">Przeglądarka (Chrome / </w:t>
+            </w:r>
+            <w:proofErr w:type="spellStart"/>
+            <w:r>
+              <w:rPr>
+                <w:sz w:val="21"/>
+                <w:szCs w:val="21"/>
+              </w:rPr>
+              <w:t>Firefox</w:t>
+            </w:r>
+            <w:proofErr w:type="spellEnd"/>
+            <w:r>
+              <w:rPr>
+                <w:sz w:val="21"/>
+                <w:szCs w:val="21"/>
+              </w:rPr>
+              <w:t>)</w:t>
             </w:r>
           </w:p>
         </w:tc>
@@ -9133,7 +11015,42 @@
         <w:rPr>
           <w:lang w:val="pl-PL"/>
         </w:rPr>
-        <w:t>B) hostuje aplikację webową ASP.NET Core, udostępniając interfejsy I</w:t>
+        <w:t xml:space="preserve">B) </w:t>
+      </w:r>
+      <w:proofErr w:type="spellStart"/>
+      <w:r>
+        <w:rPr>
+          <w:lang w:val="pl-PL"/>
+        </w:rPr>
+        <w:t>hostuje</w:t>
+      </w:r>
+      <w:proofErr w:type="spellEnd"/>
+      <w:r>
+        <w:rPr>
+          <w:lang w:val="pl-PL"/>
+        </w:rPr>
+        <w:t xml:space="preserve"> aplikację webową ASP.NET </w:t>
+      </w:r>
+      <w:proofErr w:type="spellStart"/>
+      <w:r>
+        <w:rPr>
+          <w:lang w:val="pl-PL"/>
+        </w:rPr>
+        <w:t>Core</w:t>
+      </w:r>
+      <w:proofErr w:type="spellEnd"/>
+      <w:r>
+        <w:rPr>
+          <w:lang w:val="pl-PL"/>
+        </w:rPr>
+        <w:t>, udostępniając interfejsy </w:t>
+      </w:r>
+      <w:proofErr w:type="spellStart"/>
+      <w:r>
+        <w:rPr>
+          <w:lang w:val="pl-PL"/>
+        </w:rPr>
+        <w:t>I</w:t>
       </w:r>
       <w:r>
         <w:rPr>
@@ -9141,11 +11058,26 @@
         </w:rPr>
         <w:t>Uzytkownik</w:t>
       </w:r>
-      <w:r>
-        <w:rPr>
-          <w:lang w:val="pl-PL"/>
-        </w:rPr>
-        <w:t> i IInstruktor.</w:t>
+      <w:proofErr w:type="spellEnd"/>
+      <w:r>
+        <w:rPr>
+          <w:lang w:val="pl-PL"/>
+        </w:rPr>
+        <w:t> i </w:t>
+      </w:r>
+      <w:proofErr w:type="spellStart"/>
+      <w:r>
+        <w:rPr>
+          <w:lang w:val="pl-PL"/>
+        </w:rPr>
+        <w:t>IInstruktor</w:t>
+      </w:r>
+      <w:proofErr w:type="spellEnd"/>
+      <w:r>
+        <w:rPr>
+          <w:lang w:val="pl-PL"/>
+        </w:rPr>
+        <w:t>.</w:t>
       </w:r>
     </w:p>
     <w:p>
@@ -9237,7 +11169,6 @@
         <w:rPr>
           <w:lang w:val="pl-PL"/>
         </w:rPr>
-        <w:lastRenderedPageBreak/>
         <w:t>7.3. Diagram wdrożenia</w:t>
       </w:r>
     </w:p>
@@ -9265,7 +11196,7 @@
                     </pic:cNvPicPr>
                   </pic:nvPicPr>
                   <pic:blipFill>
-                    <a:blip r:embed="rId28" cstate="print">
+                    <a:blip r:embed="rId29" cstate="print">
                       <a:extLst>
                         <a:ext uri="{28A0092B-C50C-407E-A947-70E740481C1C}">
                           <a14:useLocalDpi xmlns:a14="http://schemas.microsoft.com/office/drawing/2010/main" val="0"/>
@@ -9305,6 +11236,7 @@
           <w:lang w:val="pl-PL"/>
         </w:rPr>
       </w:pPr>
+      <w:proofErr w:type="spellStart"/>
       <w:r>
         <w:rPr>
           <w:b/>
@@ -9315,6 +11247,7 @@
         </w:rPr>
         <w:t>BazaStrzelnicy</w:t>
       </w:r>
+      <w:proofErr w:type="spellEnd"/>
       <w:r>
         <w:rPr>
           <w:sz w:val="20"/>
@@ -9348,6 +11281,7 @@
           <w:lang w:val="pl-PL"/>
         </w:rPr>
       </w:pPr>
+      <w:proofErr w:type="spellStart"/>
       <w:r>
         <w:rPr>
           <w:b/>
@@ -9356,85 +11290,130 @@
           <w:szCs w:val="20"/>
           <w:lang w:val="pl-PL"/>
         </w:rPr>
-        <w:t>IOdczyt / IZapis</w:t>
-      </w:r>
-      <w:r>
-        <w:rPr>
+        <w:t>IOdczyt</w:t>
+      </w:r>
+      <w:proofErr w:type="spellEnd"/>
+      <w:r>
+        <w:rPr>
+          <w:b/>
+          <w:bCs/>
           <w:sz w:val="20"/>
           <w:szCs w:val="20"/>
           <w:lang w:val="pl-PL"/>
         </w:rPr>
-        <w:t xml:space="preserve"> - d</w:t>
-      </w:r>
-      <w:r>
-        <w:rPr>
+        <w:t xml:space="preserve"> / </w:t>
+      </w:r>
+      <w:proofErr w:type="spellStart"/>
+      <w:r>
+        <w:rPr>
+          <w:b/>
+          <w:bCs/>
           <w:sz w:val="20"/>
           <w:szCs w:val="20"/>
           <w:lang w:val="pl-PL"/>
         </w:rPr>
-        <w:t>ostęp do danych</w:t>
-      </w:r>
+        <w:t>IZapis</w:t>
+      </w:r>
+      <w:proofErr w:type="spellEnd"/>
       <w:r>
         <w:rPr>
           <w:sz w:val="20"/>
           <w:szCs w:val="20"/>
           <w:lang w:val="pl-PL"/>
         </w:rPr>
-        <w:t>.</w:t>
-      </w:r>
-    </w:p>
-    <w:p>
-      <w:pPr>
+        <w:t xml:space="preserve"> - d</w:t>
+      </w:r>
+      <w:r>
         <w:rPr>
           <w:sz w:val="20"/>
           <w:szCs w:val="20"/>
           <w:lang w:val="pl-PL"/>
         </w:rPr>
-      </w:pPr>
-      <w:r>
-        <w:rPr>
-          <w:b/>
-          <w:bCs/>
+        <w:t>ostęp do danych</w:t>
+      </w:r>
+      <w:r>
+        <w:rPr>
           <w:sz w:val="20"/>
           <w:szCs w:val="20"/>
           <w:lang w:val="pl-PL"/>
         </w:rPr>
-        <w:t>IUzytkownik</w:t>
-      </w:r>
-      <w:r>
+        <w:t>.</w:t>
+      </w:r>
+    </w:p>
+    <w:p>
+      <w:pPr>
         <w:rPr>
           <w:sz w:val="20"/>
           <w:szCs w:val="20"/>
           <w:lang w:val="pl-PL"/>
         </w:rPr>
-        <w:t xml:space="preserve"> - rezerwacje klienta.</w:t>
-      </w:r>
-    </w:p>
-    <w:p>
-      <w:pPr>
-        <w:rPr>
+      </w:pPr>
+      <w:proofErr w:type="spellStart"/>
+      <w:r>
+        <w:rPr>
+          <w:b/>
+          <w:bCs/>
           <w:sz w:val="20"/>
           <w:szCs w:val="20"/>
           <w:lang w:val="pl-PL"/>
         </w:rPr>
-      </w:pPr>
-      <w:r>
-        <w:rPr>
-          <w:b/>
-          <w:bCs/>
+        <w:t>IUzytkownik</w:t>
+      </w:r>
+      <w:proofErr w:type="spellEnd"/>
+      <w:r>
+        <w:rPr>
           <w:sz w:val="20"/>
           <w:szCs w:val="20"/>
           <w:lang w:val="pl-PL"/>
         </w:rPr>
-        <w:t>IInstruktor</w:t>
-      </w:r>
-      <w:r>
+        <w:t xml:space="preserve"> - rezerwacje klienta.</w:t>
+      </w:r>
+    </w:p>
+    <w:p>
+      <w:pPr>
         <w:rPr>
           <w:sz w:val="20"/>
           <w:szCs w:val="20"/>
           <w:lang w:val="pl-PL"/>
         </w:rPr>
-        <w:t xml:space="preserve"> – Obsługa wizyt, weryfikacja, check-in.</w:t>
+      </w:pPr>
+      <w:proofErr w:type="spellStart"/>
+      <w:r>
+        <w:rPr>
+          <w:b/>
+          <w:bCs/>
+          <w:sz w:val="20"/>
+          <w:szCs w:val="20"/>
+          <w:lang w:val="pl-PL"/>
+        </w:rPr>
+        <w:t>IInstruktor</w:t>
+      </w:r>
+      <w:proofErr w:type="spellEnd"/>
+      <w:r>
+        <w:rPr>
+          <w:sz w:val="20"/>
+          <w:szCs w:val="20"/>
+          <w:lang w:val="pl-PL"/>
+        </w:rPr>
+        <w:t xml:space="preserve"> – Obsługa wizyt, weryfikacja, </w:t>
+      </w:r>
+      <w:proofErr w:type="spellStart"/>
+      <w:r>
+        <w:rPr>
+          <w:sz w:val="20"/>
+          <w:szCs w:val="20"/>
+          <w:lang w:val="pl-PL"/>
+        </w:rPr>
+        <w:t>check</w:t>
+      </w:r>
+      <w:proofErr w:type="spellEnd"/>
+      <w:r>
+        <w:rPr>
+          <w:sz w:val="20"/>
+          <w:szCs w:val="20"/>
+          <w:lang w:val="pl-PL"/>
+        </w:rPr>
+        <w:t>-in.</w:t>
       </w:r>
     </w:p>
     <w:p>
@@ -9442,6 +11421,7 @@
         <w:pStyle w:val="Nagwek3"/>
       </w:pPr>
       <w:r>
+        <w:lastRenderedPageBreak/>
         <w:t xml:space="preserve">8. Propozycja </w:t>
       </w:r>
       <w:r>
@@ -9473,7 +11453,6 @@
           <w:noProof/>
           <w:lang w:val="pl-PL"/>
         </w:rPr>
-        <w:lastRenderedPageBreak/>
         <w:drawing>
           <wp:inline distT="0" distB="0" distL="0" distR="0" wp14:anchorId="4FA8950A" wp14:editId="440FAD75">
             <wp:extent cx="5733415" cy="4370705"/>
@@ -9490,7 +11469,7 @@
                     <pic:cNvPicPr/>
                   </pic:nvPicPr>
                   <pic:blipFill>
-                    <a:blip r:embed="rId29"/>
+                    <a:blip r:embed="rId30"/>
                     <a:stretch>
                       <a:fillRect/>
                     </a:stretch>
@@ -9695,8 +11674,16 @@
               <w:rPr>
                 <w:lang w:val="pl-PL"/>
               </w:rPr>
-              <w:t>Programista backend</w:t>
+              <w:t xml:space="preserve">Programista </w:t>
             </w:r>
+            <w:proofErr w:type="spellStart"/>
+            <w:r>
+              <w:rPr>
+                <w:lang w:val="pl-PL"/>
+              </w:rPr>
+              <w:t>backend</w:t>
+            </w:r>
+            <w:proofErr w:type="spellEnd"/>
           </w:p>
         </w:tc>
         <w:tc>
@@ -9721,7 +11708,21 @@
               <w:rPr>
                 <w:lang w:val="pl-PL"/>
               </w:rPr>
-              <w:t>ASP.NET Core, baza danych, moduły domenowe, testy jednostkowe</w:t>
+              <w:t xml:space="preserve">ASP.NET </w:t>
+            </w:r>
+            <w:proofErr w:type="spellStart"/>
+            <w:r>
+              <w:rPr>
+                <w:lang w:val="pl-PL"/>
+              </w:rPr>
+              <w:t>Core</w:t>
+            </w:r>
+            <w:proofErr w:type="spellEnd"/>
+            <w:r>
+              <w:rPr>
+                <w:lang w:val="pl-PL"/>
+              </w:rPr>
+              <w:t>, baza danych, moduły domenowe, testy jednostkowe</w:t>
             </w:r>
           </w:p>
         </w:tc>
@@ -9749,8 +11750,16 @@
               <w:rPr>
                 <w:lang w:val="pl-PL"/>
               </w:rPr>
-              <w:t>Programista frontend</w:t>
+              <w:t xml:space="preserve">Programista </w:t>
             </w:r>
+            <w:proofErr w:type="spellStart"/>
+            <w:r>
+              <w:rPr>
+                <w:lang w:val="pl-PL"/>
+              </w:rPr>
+              <w:t>frontend</w:t>
+            </w:r>
+            <w:proofErr w:type="spellEnd"/>
           </w:p>
         </w:tc>
         <w:tc>
@@ -9839,6 +11848,12 @@
     <w:p/>
     <w:p/>
     <w:p/>
+    <w:p/>
+    <w:p/>
+    <w:p/>
+    <w:p/>
+    <w:p/>
+    <w:p/>
     <w:p>
       <w:pPr>
         <w:rPr>
@@ -9912,7 +11927,6 @@
                 <w:bCs/>
                 <w:lang w:val="pl-PL"/>
               </w:rPr>
-              <w:lastRenderedPageBreak/>
               <w:t>Lp.</w:t>
             </w:r>
           </w:p>
@@ -10198,7 +12212,21 @@
               <w:rPr>
                 <w:lang w:val="pl-PL"/>
               </w:rPr>
-              <w:t>Projekt BazaStrzelnicy (SQL Server), analiza ryzyka, podział zadań</w:t>
+              <w:t>Projekt </w:t>
+            </w:r>
+            <w:proofErr w:type="spellStart"/>
+            <w:r>
+              <w:rPr>
+                <w:lang w:val="pl-PL"/>
+              </w:rPr>
+              <w:t>BazaStrzelnicy</w:t>
+            </w:r>
+            <w:proofErr w:type="spellEnd"/>
+            <w:r>
+              <w:rPr>
+                <w:lang w:val="pl-PL"/>
+              </w:rPr>
+              <w:t> (SQL Server), analiza ryzyka, podział zadań</w:t>
             </w:r>
           </w:p>
         </w:tc>
@@ -10308,7 +12336,21 @@
               <w:rPr>
                 <w:lang w:val="pl-PL"/>
               </w:rPr>
-              <w:t>Aplikacja webowa (ASP.NET Core): moduły użytkowników, rezerwacji, obsługi wizyt, sesji i magazynu; panele klienta i instruktora; konfiguracja serwera</w:t>
+              <w:t xml:space="preserve">Aplikacja webowa (ASP.NET </w:t>
+            </w:r>
+            <w:proofErr w:type="spellStart"/>
+            <w:r>
+              <w:rPr>
+                <w:lang w:val="pl-PL"/>
+              </w:rPr>
+              <w:t>Core</w:t>
+            </w:r>
+            <w:proofErr w:type="spellEnd"/>
+            <w:r>
+              <w:rPr>
+                <w:lang w:val="pl-PL"/>
+              </w:rPr>
+              <w:t>): moduły użytkowników, rezerwacji, obsługi wizyt, sesji i magazynu; panele klienta i instruktora; konfiguracja serwera</w:t>
             </w:r>
           </w:p>
         </w:tc>
@@ -10418,7 +12460,63 @@
               <w:rPr>
                 <w:lang w:val="pl-PL"/>
               </w:rPr>
-              <w:t>Weryfikacja modułów backendu, frontendu i integracji (IKlient, IInstruktor)</w:t>
+              <w:t xml:space="preserve">Weryfikacja modułów </w:t>
+            </w:r>
+            <w:proofErr w:type="spellStart"/>
+            <w:r>
+              <w:rPr>
+                <w:lang w:val="pl-PL"/>
+              </w:rPr>
+              <w:t>backendu</w:t>
+            </w:r>
+            <w:proofErr w:type="spellEnd"/>
+            <w:r>
+              <w:rPr>
+                <w:lang w:val="pl-PL"/>
+              </w:rPr>
+              <w:t xml:space="preserve">, </w:t>
+            </w:r>
+            <w:proofErr w:type="spellStart"/>
+            <w:r>
+              <w:rPr>
+                <w:lang w:val="pl-PL"/>
+              </w:rPr>
+              <w:t>frontendu</w:t>
+            </w:r>
+            <w:proofErr w:type="spellEnd"/>
+            <w:r>
+              <w:rPr>
+                <w:lang w:val="pl-PL"/>
+              </w:rPr>
+              <w:t xml:space="preserve"> i integracji (</w:t>
+            </w:r>
+            <w:proofErr w:type="spellStart"/>
+            <w:r>
+              <w:rPr>
+                <w:lang w:val="pl-PL"/>
+              </w:rPr>
+              <w:t>IKlient</w:t>
+            </w:r>
+            <w:proofErr w:type="spellEnd"/>
+            <w:r>
+              <w:rPr>
+                <w:lang w:val="pl-PL"/>
+              </w:rPr>
+              <w:t>, </w:t>
+            </w:r>
+            <w:proofErr w:type="spellStart"/>
+            <w:r>
+              <w:rPr>
+                <w:lang w:val="pl-PL"/>
+              </w:rPr>
+              <w:t>IInstruktor</w:t>
+            </w:r>
+            <w:proofErr w:type="spellEnd"/>
+            <w:r>
+              <w:rPr>
+                <w:lang w:val="pl-PL"/>
+              </w:rPr>
+              <w:t>)</w:t>
             </w:r>
           </w:p>
         </w:tc>
@@ -10808,11 +12906,19 @@
         </w:rPr>
         <w:t xml:space="preserve">operacji </w:t>
       </w:r>
-      <w:r>
-        <w:rPr>
-          <w:lang w:val="pl-PL"/>
-        </w:rPr>
-        <w:t>check-in do momentu pozytywnej weryfikacji</w:t>
+      <w:proofErr w:type="spellStart"/>
+      <w:r>
+        <w:rPr>
+          <w:lang w:val="pl-PL"/>
+        </w:rPr>
+        <w:t>check</w:t>
+      </w:r>
+      <w:proofErr w:type="spellEnd"/>
+      <w:r>
+        <w:rPr>
+          <w:lang w:val="pl-PL"/>
+        </w:rPr>
+        <w:t>-in do momentu pozytywnej weryfikacji</w:t>
       </w:r>
     </w:p>
     <w:p>
@@ -10860,7 +12966,21 @@
         <w:rPr>
           <w:lang w:val="pl-PL"/>
         </w:rPr>
-        <w:t xml:space="preserve"> check-in klienta</w:t>
+        <w:t xml:space="preserve"> </w:t>
+      </w:r>
+      <w:proofErr w:type="spellStart"/>
+      <w:r>
+        <w:rPr>
+          <w:lang w:val="pl-PL"/>
+        </w:rPr>
+        <w:t>check</w:t>
+      </w:r>
+      <w:proofErr w:type="spellEnd"/>
+      <w:r>
+        <w:rPr>
+          <w:lang w:val="pl-PL"/>
+        </w:rPr>
+        <w:t>-in klienta</w:t>
       </w:r>
     </w:p>
     <w:p>
@@ -10877,6 +12997,7 @@
         <w:rPr>
           <w:lang w:val="pl-PL"/>
         </w:rPr>
+        <w:lastRenderedPageBreak/>
         <w:t>Ponowna weryfikacja dokumentu przez instruktora</w:t>
       </w:r>
     </w:p>
@@ -10987,7 +13108,6 @@
           <w:bCs/>
           <w:lang w:val="pl-PL"/>
         </w:rPr>
-        <w:lastRenderedPageBreak/>
         <w:t>Stopień szkodliwości:</w:t>
       </w:r>
       <w:r>
@@ -11382,7 +13502,35 @@
         <w:rPr>
           <w:lang w:val="pl-PL"/>
         </w:rPr>
-        <w:t> obowiązkowe podawanie zużycia amunicji przy check-out, powiązanie zużycia z obiektem SesjaStrzelecka, okresowe kontrole magazynowe, walidacja wprowadzanych danych</w:t>
+        <w:t xml:space="preserve"> obowiązkowe podawanie zużycia amunicji przy </w:t>
+      </w:r>
+      <w:proofErr w:type="spellStart"/>
+      <w:r>
+        <w:rPr>
+          <w:lang w:val="pl-PL"/>
+        </w:rPr>
+        <w:t>check</w:t>
+      </w:r>
+      <w:proofErr w:type="spellEnd"/>
+      <w:r>
+        <w:rPr>
+          <w:lang w:val="pl-PL"/>
+        </w:rPr>
+        <w:t>-out, powiązanie zużycia z obiektem </w:t>
+      </w:r>
+      <w:proofErr w:type="spellStart"/>
+      <w:r>
+        <w:rPr>
+          <w:lang w:val="pl-PL"/>
+        </w:rPr>
+        <w:t>SesjaStrzelecka</w:t>
+      </w:r>
+      <w:proofErr w:type="spellEnd"/>
+      <w:r>
+        <w:rPr>
+          <w:lang w:val="pl-PL"/>
+        </w:rPr>
+        <w:t>, okresowe kontrole magazynowe, walidacja wprowadzanych danych</w:t>
       </w:r>
     </w:p>
     <w:p>
@@ -11561,6 +13709,7 @@
           <w:bCs/>
           <w:lang w:val="pl-PL"/>
         </w:rPr>
+        <w:lastRenderedPageBreak/>
         <w:t>Propozycja metod zapobiegania:</w:t>
       </w:r>
       <w:r>
@@ -11645,7 +13794,6 @@
         <w:pStyle w:val="Nagwek3"/>
       </w:pPr>
       <w:r>
-        <w:lastRenderedPageBreak/>
         <w:t xml:space="preserve">10. Kosztorys realizacji </w:t>
       </w:r>
       <w:r>
@@ -11727,7 +13875,15 @@
           </w:tcPr>
           <w:p>
             <w:r>
-              <w:t>Czas (Rbg)</w:t>
+              <w:t>Czas (</w:t>
+            </w:r>
+            <w:proofErr w:type="spellStart"/>
+            <w:r>
+              <w:t>Rbg</w:t>
+            </w:r>
+            <w:proofErr w:type="spellEnd"/>
+            <w:r>
+              <w:t>)</w:t>
             </w:r>
           </w:p>
         </w:tc>
@@ -11863,7 +14019,23 @@
           </w:tcPr>
           <w:p>
             <w:r>
-              <w:t>Interfejs instruktora, weryfikacja tożsamości (PESEL), procesy Check-in oraz Check-out.</w:t>
+              <w:t xml:space="preserve">Interfejs instruktora, weryfikacja tożsamości (PESEL), procesy </w:t>
+            </w:r>
+            <w:proofErr w:type="spellStart"/>
+            <w:r>
+              <w:t>Check</w:t>
+            </w:r>
+            <w:proofErr w:type="spellEnd"/>
+            <w:r>
+              <w:t xml:space="preserve">-in oraz </w:t>
+            </w:r>
+            <w:proofErr w:type="spellStart"/>
+            <w:r>
+              <w:t>Check</w:t>
+            </w:r>
+            <w:proofErr w:type="spellEnd"/>
+            <w:r>
+              <w:t>-out.</w:t>
             </w:r>
           </w:p>
         </w:tc>
@@ -11912,7 +14084,15 @@
           </w:tcPr>
           <w:p>
             <w:r>
-              <w:t>Ewidencja i aktualizacja przebiegu egzemplarzy broni, stany magazynowe amunicji, triggery bazy danych.</w:t>
+              <w:t xml:space="preserve">Ewidencja i aktualizacja przebiegu egzemplarzy broni, stany magazynowe amunicji, </w:t>
+            </w:r>
+            <w:proofErr w:type="spellStart"/>
+            <w:r>
+              <w:t>triggery</w:t>
+            </w:r>
+            <w:proofErr w:type="spellEnd"/>
+            <w:r>
+              <w:t xml:space="preserve"> bazy danych.</w:t>
             </w:r>
           </w:p>
         </w:tc>
@@ -11961,7 +14141,15 @@
           </w:tcPr>
           <w:p>
             <w:r>
-              <w:t>Konfiguracja serwera aplikacji, wdrożenie bazy PostgreSQL, mechanizmy szyfrowania danych wrażliwych.</w:t>
+              <w:t xml:space="preserve">Konfiguracja serwera aplikacji, wdrożenie bazy </w:t>
+            </w:r>
+            <w:proofErr w:type="spellStart"/>
+            <w:r>
+              <w:t>PostgreSQL</w:t>
+            </w:r>
+            <w:proofErr w:type="spellEnd"/>
+            <w:r>
+              <w:t>, mechanizmy szyfrowania danych wrażliwych.</w:t>
             </w:r>
           </w:p>
         </w:tc>
@@ -12048,6 +14236,7 @@
           </w:tcPr>
           <w:p>
             <w:r>
+              <w:lastRenderedPageBreak/>
               <w:t>RAZEM:</w:t>
             </w:r>
           </w:p>
@@ -12193,7 +14382,6 @@
           <w:sz w:val="24"/>
           <w:szCs w:val="24"/>
         </w:rPr>
-        <w:lastRenderedPageBreak/>
         <w:t>Warunki płatności</w:t>
       </w:r>
     </w:p>
@@ -19423,7 +21611,6 @@
   <w:style w:type="character" w:default="1" w:styleId="Domylnaczcionkaakapitu">
     <w:name w:val="Default Paragraph Font"/>
     <w:uiPriority w:val="1"/>
-    <w:semiHidden/>
     <w:unhideWhenUsed/>
   </w:style>
   <w:style w:type="table" w:default="1" w:styleId="Standardowy">
@@ -19786,7 +21973,7 @@
   </w:font>
   <w:font w:name="Courier New">
     <w:panose1 w:val="02070309020205020404"/>
-    <w:charset w:val="EE"/>
+    <w:charset w:val="00"/>
     <w:family w:val="modern"/>
     <w:pitch w:val="fixed"/>
     <w:sig w:usb0="E0002EFF" w:usb1="C0007843" w:usb2="00000009" w:usb3="00000000" w:csb0="000001FF" w:csb1="00000000"/>
@@ -19823,6 +22010,13 @@
     <w:family w:val="roman"/>
     <w:pitch w:val="variable"/>
     <w:sig w:usb0="E00006FF" w:usb1="420024FF" w:usb2="02000000" w:usb3="00000000" w:csb0="0000019F" w:csb1="00000000"/>
+  </w:font>
+  <w:font w:name="Segoe UI">
+    <w:panose1 w:val="020B0502040204020203"/>
+    <w:charset w:val="00"/>
+    <w:family w:val="swiss"/>
+    <w:pitch w:val="variable"/>
+    <w:sig w:usb0="E4002EFF" w:usb1="C000E47F" w:usb2="00000009" w:usb3="00000000" w:csb0="000001FF" w:csb1="00000000"/>
   </w:font>
   <w:font w:name="Calibri">
     <w:panose1 w:val="020F0502020204030204"/>
@@ -19871,8 +22065,10 @@
     <w:rsid w:val="006506DB"/>
     <w:rsid w:val="00664E6A"/>
     <w:rsid w:val="009307A9"/>
+    <w:rsid w:val="009B089A"/>
     <w:rsid w:val="00C027C6"/>
     <w:rsid w:val="00D14333"/>
+    <w:rsid w:val="00D971FE"/>
     <w:rsid w:val="00F03CE9"/>
   </w:rsids>
   <m:mathPr>

</xml_diff>

<commit_message>
d czynnosci i stanow poprawione
</commit_message>
<xml_diff>
--- a/Downloads/ProjektIO/Projekt IO.docx
+++ b/Downloads/ProjektIO/Projekt IO.docx
@@ -1,6 +1,6 @@
 
 <file path=word/document.xml><?xml version="1.0" encoding="utf-8"?>
-<w:document xmlns:wpc="http://schemas.microsoft.com/office/word/2010/wordprocessingCanvas" xmlns:cx="http://schemas.microsoft.com/office/drawing/2014/chartex" xmlns:cx1="http://schemas.microsoft.com/office/drawing/2015/9/8/chartex" xmlns:cx2="http://schemas.microsoft.com/office/drawing/2015/10/21/chartex" xmlns:cx3="http://schemas.microsoft.com/office/drawing/2016/5/9/chartex" xmlns:cx4="http://schemas.microsoft.com/office/drawing/2016/5/10/chartex" xmlns:cx5="http://schemas.microsoft.com/office/drawing/2016/5/11/chartex" xmlns:cx6="http://schemas.microsoft.com/office/drawing/2016/5/12/chartex" xmlns:cx7="http://schemas.microsoft.com/office/drawing/2016/5/13/chartex" xmlns:cx8="http://schemas.microsoft.com/office/drawing/2016/5/14/chartex" xmlns:mc="http://schemas.openxmlformats.org/markup-compatibility/2006" xmlns:aink="http://schemas.microsoft.com/office/drawing/2016/ink" xmlns:am3d="http://schemas.microsoft.com/office/drawing/2017/model3d" xmlns:o="urn:schemas-microsoft-com:office:office" xmlns:oel="http://schemas.microsoft.com/office/2019/extlst" xmlns:r="http://schemas.openxmlformats.org/officeDocument/2006/relationships" xmlns:m="http://schemas.openxmlformats.org/officeDocument/2006/math" xmlns:v="urn:schemas-microsoft-com:vml" xmlns:wp14="http://schemas.microsoft.com/office/word/2010/wordprocessingDrawing" xmlns:wp="http://schemas.openxmlformats.org/drawingml/2006/wordprocessingDrawing" xmlns:w10="urn:schemas-microsoft-com:office:word" xmlns:w="http://schemas.openxmlformats.org/wordprocessingml/2006/main" xmlns:w14="http://schemas.microsoft.com/office/word/2010/wordml" xmlns:w15="http://schemas.microsoft.com/office/word/2012/wordml" xmlns:w16cex="http://schemas.microsoft.com/office/word/2018/wordml/cex" xmlns:w16cid="http://schemas.microsoft.com/office/word/2016/wordml/cid" xmlns:w16="http://schemas.microsoft.com/office/word/2018/wordml" xmlns:w16du="http://schemas.microsoft.com/office/word/2023/wordml/word16du" xmlns:w16sdtdh="http://schemas.microsoft.com/office/word/2020/wordml/sdtdatahash" xmlns:w16sdtfl="http://schemas.microsoft.com/office/word/2024/wordml/sdtformatlock" xmlns:w16se="http://schemas.microsoft.com/office/word/2015/wordml/symex" xmlns:wpg="http://schemas.microsoft.com/office/word/2010/wordprocessingGroup" xmlns:wpi="http://schemas.microsoft.com/office/word/2010/wordprocessingInk" xmlns:wne="http://schemas.microsoft.com/office/word/2006/wordml" xmlns:wps="http://schemas.microsoft.com/office/word/2010/wordprocessingShape" mc:Ignorable="w14 w15 w16se w16cid w16 w16cex w16sdtdh w16sdtfl w16du wp14">
+<w:document xmlns:wpc="http://schemas.microsoft.com/office/word/2010/wordprocessingCanvas" xmlns:mc="http://schemas.openxmlformats.org/markup-compatibility/2006" xmlns:o="urn:schemas-microsoft-com:office:office" xmlns:r="http://schemas.openxmlformats.org/officeDocument/2006/relationships" xmlns:m="http://schemas.openxmlformats.org/officeDocument/2006/math" xmlns:v="urn:schemas-microsoft-com:vml" xmlns:wp14="http://schemas.microsoft.com/office/word/2010/wordprocessingDrawing" xmlns:wp="http://schemas.openxmlformats.org/drawingml/2006/wordprocessingDrawing" xmlns:w10="urn:schemas-microsoft-com:office:word" xmlns:w="http://schemas.openxmlformats.org/wordprocessingml/2006/main" xmlns:w14="http://schemas.microsoft.com/office/word/2010/wordml" xmlns:w15="http://schemas.microsoft.com/office/word/2012/wordml" xmlns:wpg="http://schemas.microsoft.com/office/word/2010/wordprocessingGroup" xmlns:wpi="http://schemas.microsoft.com/office/word/2010/wordprocessingInk" xmlns:wne="http://schemas.microsoft.com/office/word/2006/wordml" xmlns:wps="http://schemas.microsoft.com/office/word/2010/wordprocessingShape" mc:Ignorable="w14 w15 wp14">
   <w:body>
     <w:p>
       <w:pPr>
@@ -199,6 +199,7 @@
             <w:listItem w:displayText="Zbiory przybliżone" w:value="Zbiory przybliżone"/>
           </w:comboBox>
         </w:sdtPr>
+        <w:sdtEndPr/>
         <w:sdtContent>
           <w:r>
             <w:rPr>
@@ -390,8 +391,20 @@
           <w:iCs/>
           <w:lang w:val="pl-PL"/>
         </w:rPr>
-        <w:t xml:space="preserve"> Cimochowski</w:t>
-      </w:r>
+        <w:t xml:space="preserve"> </w:t>
+      </w:r>
+      <w:proofErr w:type="spellStart"/>
+      <w:r>
+        <w:rPr>
+          <w:rFonts w:ascii="Arial" w:hAnsi="Arial" w:cs="Arial"/>
+          <w:b/>
+          <w:i/>
+          <w:iCs/>
+          <w:lang w:val="pl-PL"/>
+        </w:rPr>
+        <w:t>Cimochowski</w:t>
+      </w:r>
+      <w:proofErr w:type="spellEnd"/>
       <w:r>
         <w:rPr>
           <w:rFonts w:ascii="Arial" w:hAnsi="Arial" w:cs="Arial"/>
@@ -559,6 +572,7 @@
             <w:listItem w:displayText="Informatyka i Ekonometria" w:value="Informatyka i Ekonometria"/>
           </w:comboBox>
         </w:sdtPr>
+        <w:sdtEndPr/>
         <w:sdtContent>
           <w:r>
             <w:rPr>
@@ -635,6 +649,7 @@
             <w:listItem w:displayText="PS11" w:value="PS11"/>
           </w:comboBox>
         </w:sdtPr>
+        <w:sdtEndPr/>
         <w:sdtContent>
           <w:r>
             <w:rPr>
@@ -739,8 +754,22 @@
           <w:szCs w:val="26"/>
           <w:lang w:val="pl-PL"/>
         </w:rPr>
-        <w:t>Wojciech Cimochowski</w:t>
-      </w:r>
+        <w:t xml:space="preserve">Wojciech </w:t>
+      </w:r>
+      <w:proofErr w:type="spellStart"/>
+      <w:r>
+        <w:rPr>
+          <w:rFonts w:ascii="Arial" w:hAnsi="Arial" w:cs="Arial"/>
+          <w:b/>
+          <w:i/>
+          <w:iCs/>
+          <w:sz w:val="26"/>
+          <w:szCs w:val="26"/>
+          <w:lang w:val="pl-PL"/>
+        </w:rPr>
+        <w:t>Cimochowski</w:t>
+      </w:r>
+      <w:proofErr w:type="spellEnd"/>
       <w:r>
         <w:rPr>
           <w:rFonts w:ascii="Arial" w:hAnsi="Arial" w:cs="Arial"/>
@@ -967,7 +996,23 @@
           <w:b/>
           <w:bCs/>
         </w:rPr>
-        <w:t>Obsługa klienta (CRM/Booking):</w:t>
+        <w:t>Obsługa klienta (CRM/</w:t>
+      </w:r>
+      <w:proofErr w:type="spellStart"/>
+      <w:r>
+        <w:rPr>
+          <w:b/>
+          <w:bCs/>
+        </w:rPr>
+        <w:t>Booking</w:t>
+      </w:r>
+      <w:proofErr w:type="spellEnd"/>
+      <w:r>
+        <w:rPr>
+          <w:b/>
+          <w:bCs/>
+        </w:rPr>
+        <w:t>):</w:t>
       </w:r>
       <w:r>
         <w:t xml:space="preserve"> System rezerwacji online, weryfikacja tożsamości na miejscu oraz panel osobisty strzelca.</w:t>
@@ -1041,8 +1086,17 @@
           <w:b/>
           <w:bCs/>
         </w:rPr>
-        <w:t>Właściciela/Admina</w:t>
-      </w:r>
+        <w:t>Właściciela/</w:t>
+      </w:r>
+      <w:proofErr w:type="spellStart"/>
+      <w:r>
+        <w:rPr>
+          <w:b/>
+          <w:bCs/>
+        </w:rPr>
+        <w:t>Admina</w:t>
+      </w:r>
+      <w:proofErr w:type="spellEnd"/>
       <w:r>
         <w:t xml:space="preserve"> (zarządzanie biznesem). </w:t>
       </w:r>
@@ -1115,7 +1169,15 @@
         <w:t>Zwiększenie przepustowości:</w:t>
       </w:r>
       <w:r>
-        <w:t xml:space="preserve"> Skrócenie czasu odprawy klienta (check-in) o np. 40% dzięki wcześniejszej rezerwacji danych w systemie.</w:t>
+        <w:t xml:space="preserve"> Skrócenie czasu odprawy klienta (</w:t>
+      </w:r>
+      <w:proofErr w:type="spellStart"/>
+      <w:r>
+        <w:t>check</w:t>
+      </w:r>
+      <w:proofErr w:type="spellEnd"/>
+      <w:r>
+        <w:t>-in) o np. 40% dzięki wcześniejszej rezerwacji danych w systemie.</w:t>
       </w:r>
     </w:p>
     <w:p>
@@ -1257,7 +1319,15 @@
       <w:bookmarkEnd w:id="6"/>
       <w:r>
         <w:lastRenderedPageBreak/>
-        <w:t xml:space="preserve">3. Słownik terminów (Business Glossary) </w:t>
+        <w:t xml:space="preserve">3. Słownik terminów (Business </w:t>
+      </w:r>
+      <w:proofErr w:type="spellStart"/>
+      <w:r>
+        <w:t>Glossary</w:t>
+      </w:r>
+      <w:proofErr w:type="spellEnd"/>
+      <w:r>
+        <w:t xml:space="preserve">) </w:t>
       </w:r>
     </w:p>
     <w:tbl>
@@ -1794,13 +1864,41 @@
                 <w:color w:val="1F1F1F"/>
               </w:rPr>
             </w:pPr>
+            <w:proofErr w:type="spellStart"/>
             <w:r>
               <w:rPr>
                 <w:b/>
                 <w:bCs/>
                 <w:color w:val="1F1F1F"/>
               </w:rPr>
-              <w:t>Check-in / Check-out</w:t>
+              <w:t>Check</w:t>
+            </w:r>
+            <w:proofErr w:type="spellEnd"/>
+            <w:r>
+              <w:rPr>
+                <w:b/>
+                <w:bCs/>
+                <w:color w:val="1F1F1F"/>
+              </w:rPr>
+              <w:t xml:space="preserve">-in / </w:t>
+            </w:r>
+            <w:proofErr w:type="spellStart"/>
+            <w:r>
+              <w:rPr>
+                <w:b/>
+                <w:bCs/>
+                <w:color w:val="1F1F1F"/>
+              </w:rPr>
+              <w:t>Check</w:t>
+            </w:r>
+            <w:proofErr w:type="spellEnd"/>
+            <w:r>
+              <w:rPr>
+                <w:b/>
+                <w:bCs/>
+                <w:color w:val="1F1F1F"/>
+              </w:rPr>
+              <w:t>-out</w:t>
             </w:r>
           </w:p>
         </w:tc>
@@ -1879,6 +1977,7 @@
       <w:r>
         <w:rPr>
           <w:noProof/>
+          <w:lang w:val="pl-PL"/>
         </w:rPr>
         <w:drawing>
           <wp:inline distT="0" distB="0" distL="0" distR="0" wp14:anchorId="0C6C239C" wp14:editId="5CBD8BE3">
@@ -2063,7 +2162,21 @@
         <w:rPr>
           <w:lang w:val="pl-PL"/>
         </w:rPr>
-        <w:t>), przeprowadzeniu procesu check-in (</w:t>
+        <w:t xml:space="preserve">), przeprowadzeniu procesu </w:t>
+      </w:r>
+      <w:proofErr w:type="spellStart"/>
+      <w:r>
+        <w:rPr>
+          <w:lang w:val="pl-PL"/>
+        </w:rPr>
+        <w:t>check</w:t>
+      </w:r>
+      <w:proofErr w:type="spellEnd"/>
+      <w:r>
+        <w:rPr>
+          <w:lang w:val="pl-PL"/>
+        </w:rPr>
+        <w:t>-in (</w:t>
       </w:r>
       <w:r>
         <w:rPr>
@@ -2837,7 +2950,21 @@
         <w:rPr>
           <w:lang w:val="pl-PL"/>
         </w:rPr>
-        <w:t>Instruktor inicjuje sesję strzelecką, klikając przycisk "Check-in".</w:t>
+        <w:t>Instruktor inicjuje sesję strzelecką, klikając przycisk "</w:t>
+      </w:r>
+      <w:proofErr w:type="spellStart"/>
+      <w:r>
+        <w:rPr>
+          <w:lang w:val="pl-PL"/>
+        </w:rPr>
+        <w:t>Check</w:t>
+      </w:r>
+      <w:proofErr w:type="spellEnd"/>
+      <w:r>
+        <w:rPr>
+          <w:lang w:val="pl-PL"/>
+        </w:rPr>
+        <w:t>-in".</w:t>
       </w:r>
     </w:p>
     <w:p>
@@ -3202,7 +3329,21 @@
         <w:rPr>
           <w:lang w:val="pl-PL"/>
         </w:rPr>
-        <w:t xml:space="preserve">System wyświetla panel "Użytkownicy" zawierający ogólne statystyki kont (np. Łącznie, Admini, Instruktorzy, Klienci, Zweryfikowani, Do weryfikacji). </w:t>
+        <w:t xml:space="preserve">System wyświetla panel "Użytkownicy" zawierający ogólne statystyki kont (np. Łącznie, </w:t>
+      </w:r>
+      <w:proofErr w:type="spellStart"/>
+      <w:r>
+        <w:rPr>
+          <w:lang w:val="pl-PL"/>
+        </w:rPr>
+        <w:t>Admini</w:t>
+      </w:r>
+      <w:proofErr w:type="spellEnd"/>
+      <w:r>
+        <w:rPr>
+          <w:lang w:val="pl-PL"/>
+        </w:rPr>
+        <w:t xml:space="preserve">, Instruktorzy, Klienci, Zweryfikowani, Do weryfikacji). </w:t>
       </w:r>
     </w:p>
     <w:p>
@@ -3763,8 +3904,13 @@
         <w:pStyle w:val="Legenda"/>
         <w:jc w:val="center"/>
       </w:pPr>
-      <w:r>
-        <w:t xml:space="preserve">Figure </w:t>
+      <w:proofErr w:type="spellStart"/>
+      <w:r>
+        <w:t>Figure</w:t>
+      </w:r>
+      <w:proofErr w:type="spellEnd"/>
+      <w:r>
+        <w:t xml:space="preserve"> </w:t>
       </w:r>
       <w:r>
         <w:rPr>
@@ -3826,8 +3972,17 @@
           <w:bCs/>
         </w:rPr>
         <w:lastRenderedPageBreak/>
-        <w:t>Wojciech Cimochowski</w:t>
-      </w:r>
+        <w:t xml:space="preserve">Wojciech </w:t>
+      </w:r>
+      <w:proofErr w:type="spellStart"/>
+      <w:r>
+        <w:rPr>
+          <w:b/>
+          <w:bCs/>
+        </w:rPr>
+        <w:t>Cimochowski</w:t>
+      </w:r>
+      <w:proofErr w:type="spellEnd"/>
     </w:p>
     <w:p>
       <w:pPr>
@@ -3837,8 +3992,13 @@
           <w:numId w:val="29"/>
         </w:numPr>
       </w:pPr>
-      <w:r>
-        <w:t>Potwiedzenie przybycia</w:t>
+      <w:proofErr w:type="spellStart"/>
+      <w:r>
+        <w:t>Potwiedzenie</w:t>
+      </w:r>
+      <w:proofErr w:type="spellEnd"/>
+      <w:r>
+        <w:t xml:space="preserve"> przybycia</w:t>
       </w:r>
     </w:p>
     <w:p>
@@ -4029,10 +4189,10 @@
           <w:lang w:val="pl-PL"/>
         </w:rPr>
         <w:drawing>
-          <wp:inline distT="0" distB="0" distL="0" distR="0" wp14:anchorId="3BAA3FDF" wp14:editId="0D611FE9">
-            <wp:extent cx="3990975" cy="4703146"/>
-            <wp:effectExtent l="0" t="0" r="0" b="2540"/>
-            <wp:docPr id="2" name="Obraz 2"/>
+          <wp:inline distT="0" distB="0" distL="0" distR="0" wp14:anchorId="13197E1E" wp14:editId="54080FFA">
+            <wp:extent cx="4267200" cy="5008344"/>
+            <wp:effectExtent l="0" t="0" r="0" b="1905"/>
+            <wp:docPr id="4" name="Obraz 4"/>
             <wp:cNvGraphicFramePr>
               <a:graphicFrameLocks xmlns:a="http://schemas.openxmlformats.org/drawingml/2006/main" noChangeAspect="1"/>
             </wp:cNvGraphicFramePr>
@@ -4052,7 +4212,7 @@
                   <pic:spPr>
                     <a:xfrm>
                       <a:off x="0" y="0"/>
-                      <a:ext cx="4002422" cy="4716636"/>
+                      <a:ext cx="4319512" cy="5069741"/>
                     </a:xfrm>
                     <a:prstGeom prst="rect">
                       <a:avLst/>
@@ -4181,7 +4341,23 @@
           <w:rStyle w:val="math-inline"/>
           <w:rFonts w:ascii="Arial" w:hAnsi="Arial" w:cs="Arial"/>
         </w:rPr>
-        <w:t>$\rightarrow$</w:t>
+        <w:t>$\</w:t>
+      </w:r>
+      <w:proofErr w:type="spellStart"/>
+      <w:r>
+        <w:rPr>
+          <w:rStyle w:val="math-inline"/>
+          <w:rFonts w:ascii="Arial" w:hAnsi="Arial" w:cs="Arial"/>
+        </w:rPr>
+        <w:t>rightarrow</w:t>
+      </w:r>
+      <w:proofErr w:type="spellEnd"/>
+      <w:r>
+        <w:rPr>
+          <w:rStyle w:val="math-inline"/>
+          <w:rFonts w:ascii="Arial" w:hAnsi="Arial" w:cs="Arial"/>
+        </w:rPr>
+        <w:t>$</w:t>
       </w:r>
       <w:r>
         <w:rPr>
@@ -4271,7 +4447,23 @@
           <w:rStyle w:val="math-inline"/>
           <w:rFonts w:ascii="Arial" w:hAnsi="Arial" w:cs="Arial"/>
         </w:rPr>
-        <w:t>$\rightarrow$</w:t>
+        <w:t>$\</w:t>
+      </w:r>
+      <w:proofErr w:type="spellStart"/>
+      <w:r>
+        <w:rPr>
+          <w:rStyle w:val="math-inline"/>
+          <w:rFonts w:ascii="Arial" w:hAnsi="Arial" w:cs="Arial"/>
+        </w:rPr>
+        <w:t>rightarrow</w:t>
+      </w:r>
+      <w:proofErr w:type="spellEnd"/>
+      <w:r>
+        <w:rPr>
+          <w:rStyle w:val="math-inline"/>
+          <w:rFonts w:ascii="Arial" w:hAnsi="Arial" w:cs="Arial"/>
+        </w:rPr>
+        <w:t>$</w:t>
       </w:r>
       <w:r>
         <w:rPr>
@@ -4304,7 +4496,21 @@
         <w:rPr>
           <w:rFonts w:ascii="Arial" w:hAnsi="Arial" w:cs="Arial"/>
         </w:rPr>
-        <w:t xml:space="preserve"> Synchroniczny / Tworzący (Create)</w:t>
+        <w:t xml:space="preserve"> Synchroniczny / Tworzący (</w:t>
+      </w:r>
+      <w:proofErr w:type="spellStart"/>
+      <w:r>
+        <w:rPr>
+          <w:rFonts w:ascii="Arial" w:hAnsi="Arial" w:cs="Arial"/>
+        </w:rPr>
+        <w:t>Create</w:t>
+      </w:r>
+      <w:proofErr w:type="spellEnd"/>
+      <w:r>
+        <w:rPr>
+          <w:rFonts w:ascii="Arial" w:hAnsi="Arial" w:cs="Arial"/>
+        </w:rPr>
+        <w:t>)</w:t>
       </w:r>
     </w:p>
     <w:p>
@@ -4361,7 +4567,23 @@
           <w:rStyle w:val="math-inline"/>
           <w:rFonts w:ascii="Arial" w:hAnsi="Arial" w:cs="Arial"/>
         </w:rPr>
-        <w:t>$\rightarrow$</w:t>
+        <w:t>$\</w:t>
+      </w:r>
+      <w:proofErr w:type="spellStart"/>
+      <w:r>
+        <w:rPr>
+          <w:rStyle w:val="math-inline"/>
+          <w:rFonts w:ascii="Arial" w:hAnsi="Arial" w:cs="Arial"/>
+        </w:rPr>
+        <w:t>rightarrow</w:t>
+      </w:r>
+      <w:proofErr w:type="spellEnd"/>
+      <w:r>
+        <w:rPr>
+          <w:rStyle w:val="math-inline"/>
+          <w:rFonts w:ascii="Arial" w:hAnsi="Arial" w:cs="Arial"/>
+        </w:rPr>
+        <w:t>$</w:t>
       </w:r>
       <w:r>
         <w:rPr>
@@ -4451,7 +4673,23 @@
           <w:rStyle w:val="math-inline"/>
           <w:rFonts w:ascii="Arial" w:hAnsi="Arial" w:cs="Arial"/>
         </w:rPr>
-        <w:t>$\rightarrow$</w:t>
+        <w:t>$\</w:t>
+      </w:r>
+      <w:proofErr w:type="spellStart"/>
+      <w:r>
+        <w:rPr>
+          <w:rStyle w:val="math-inline"/>
+          <w:rFonts w:ascii="Arial" w:hAnsi="Arial" w:cs="Arial"/>
+        </w:rPr>
+        <w:t>rightarrow</w:t>
+      </w:r>
+      <w:proofErr w:type="spellEnd"/>
+      <w:r>
+        <w:rPr>
+          <w:rStyle w:val="math-inline"/>
+          <w:rFonts w:ascii="Arial" w:hAnsi="Arial" w:cs="Arial"/>
+        </w:rPr>
+        <w:t>$</w:t>
       </w:r>
       <w:r>
         <w:rPr>
@@ -4541,7 +4779,23 @@
           <w:rStyle w:val="math-inline"/>
           <w:rFonts w:ascii="Arial" w:hAnsi="Arial" w:cs="Arial"/>
         </w:rPr>
-        <w:t>$\rightarrow$</w:t>
+        <w:t>$\</w:t>
+      </w:r>
+      <w:proofErr w:type="spellStart"/>
+      <w:r>
+        <w:rPr>
+          <w:rStyle w:val="math-inline"/>
+          <w:rFonts w:ascii="Arial" w:hAnsi="Arial" w:cs="Arial"/>
+        </w:rPr>
+        <w:t>rightarrow</w:t>
+      </w:r>
+      <w:proofErr w:type="spellEnd"/>
+      <w:r>
+        <w:rPr>
+          <w:rStyle w:val="math-inline"/>
+          <w:rFonts w:ascii="Arial" w:hAnsi="Arial" w:cs="Arial"/>
+        </w:rPr>
+        <w:t>$</w:t>
       </w:r>
       <w:r>
         <w:rPr>
@@ -4602,7 +4856,21 @@
         <w:rPr>
           <w:rFonts w:ascii="Arial" w:hAnsi="Arial" w:cs="Arial"/>
         </w:rPr>
-        <w:t xml:space="preserve"> Serwer przekazuje żądanie zapisu danych do bazy PostgreSQL, aby zaktualizować profil klienta.</w:t>
+        <w:t xml:space="preserve"> Serwer przekazuje żądanie zapisu danych do bazy </w:t>
+      </w:r>
+      <w:proofErr w:type="spellStart"/>
+      <w:r>
+        <w:rPr>
+          <w:rFonts w:ascii="Arial" w:hAnsi="Arial" w:cs="Arial"/>
+        </w:rPr>
+        <w:t>PostgreSQL</w:t>
+      </w:r>
+      <w:proofErr w:type="spellEnd"/>
+      <w:r>
+        <w:rPr>
+          <w:rFonts w:ascii="Arial" w:hAnsi="Arial" w:cs="Arial"/>
+        </w:rPr>
+        <w:t>, aby zaktualizować profil klienta.</w:t>
       </w:r>
     </w:p>
     <w:p>
@@ -4632,7 +4900,23 @@
           <w:rStyle w:val="math-inline"/>
           <w:rFonts w:ascii="Arial" w:hAnsi="Arial" w:cs="Arial"/>
         </w:rPr>
-        <w:t>$\rightarrow$</w:t>
+        <w:t>$\</w:t>
+      </w:r>
+      <w:proofErr w:type="spellStart"/>
+      <w:r>
+        <w:rPr>
+          <w:rStyle w:val="math-inline"/>
+          <w:rFonts w:ascii="Arial" w:hAnsi="Arial" w:cs="Arial"/>
+        </w:rPr>
+        <w:t>rightarrow</w:t>
+      </w:r>
+      <w:proofErr w:type="spellEnd"/>
+      <w:r>
+        <w:rPr>
+          <w:rStyle w:val="math-inline"/>
+          <w:rFonts w:ascii="Arial" w:hAnsi="Arial" w:cs="Arial"/>
+        </w:rPr>
+        <w:t>$</w:t>
       </w:r>
       <w:r>
         <w:rPr>
@@ -4722,7 +5006,23 @@
           <w:rStyle w:val="math-inline"/>
           <w:rFonts w:ascii="Arial" w:hAnsi="Arial" w:cs="Arial"/>
         </w:rPr>
-        <w:t>$\rightarrow$</w:t>
+        <w:t>$\</w:t>
+      </w:r>
+      <w:proofErr w:type="spellStart"/>
+      <w:r>
+        <w:rPr>
+          <w:rStyle w:val="math-inline"/>
+          <w:rFonts w:ascii="Arial" w:hAnsi="Arial" w:cs="Arial"/>
+        </w:rPr>
+        <w:t>rightarrow</w:t>
+      </w:r>
+      <w:proofErr w:type="spellEnd"/>
+      <w:r>
+        <w:rPr>
+          <w:rStyle w:val="math-inline"/>
+          <w:rFonts w:ascii="Arial" w:hAnsi="Arial" w:cs="Arial"/>
+        </w:rPr>
+        <w:t>$</w:t>
       </w:r>
       <w:r>
         <w:rPr>
@@ -4812,7 +5112,23 @@
           <w:rStyle w:val="math-inline"/>
           <w:rFonts w:ascii="Arial" w:hAnsi="Arial" w:cs="Arial"/>
         </w:rPr>
-        <w:t>$\rightarrow$</w:t>
+        <w:t>$\</w:t>
+      </w:r>
+      <w:proofErr w:type="spellStart"/>
+      <w:r>
+        <w:rPr>
+          <w:rStyle w:val="math-inline"/>
+          <w:rFonts w:ascii="Arial" w:hAnsi="Arial" w:cs="Arial"/>
+        </w:rPr>
+        <w:t>rightarrow</w:t>
+      </w:r>
+      <w:proofErr w:type="spellEnd"/>
+      <w:r>
+        <w:rPr>
+          <w:rStyle w:val="math-inline"/>
+          <w:rFonts w:ascii="Arial" w:hAnsi="Arial" w:cs="Arial"/>
+        </w:rPr>
+        <w:t>$</w:t>
       </w:r>
       <w:r>
         <w:rPr>
@@ -4845,7 +5161,21 @@
         <w:rPr>
           <w:rFonts w:ascii="Arial" w:hAnsi="Arial" w:cs="Arial"/>
         </w:rPr>
-        <w:t xml:space="preserve"> Zwrotny / Niszczący (Destroy)</w:t>
+        <w:t xml:space="preserve"> Zwrotny / Niszczący (</w:t>
+      </w:r>
+      <w:proofErr w:type="spellStart"/>
+      <w:r>
+        <w:rPr>
+          <w:rFonts w:ascii="Arial" w:hAnsi="Arial" w:cs="Arial"/>
+        </w:rPr>
+        <w:t>Destroy</w:t>
+      </w:r>
+      <w:proofErr w:type="spellEnd"/>
+      <w:r>
+        <w:rPr>
+          <w:rFonts w:ascii="Arial" w:hAnsi="Arial" w:cs="Arial"/>
+        </w:rPr>
+        <w:t>)</w:t>
       </w:r>
     </w:p>
     <w:p>
@@ -4902,7 +5232,23 @@
           <w:rStyle w:val="math-inline"/>
           <w:rFonts w:ascii="Arial" w:hAnsi="Arial" w:cs="Arial"/>
         </w:rPr>
-        <w:t>$\rightarrow$</w:t>
+        <w:t>$\</w:t>
+      </w:r>
+      <w:proofErr w:type="spellStart"/>
+      <w:r>
+        <w:rPr>
+          <w:rStyle w:val="math-inline"/>
+          <w:rFonts w:ascii="Arial" w:hAnsi="Arial" w:cs="Arial"/>
+        </w:rPr>
+        <w:t>rightarrow</w:t>
+      </w:r>
+      <w:proofErr w:type="spellEnd"/>
+      <w:r>
+        <w:rPr>
+          <w:rStyle w:val="math-inline"/>
+          <w:rFonts w:ascii="Arial" w:hAnsi="Arial" w:cs="Arial"/>
+        </w:rPr>
+        <w:t>$</w:t>
       </w:r>
       <w:r>
         <w:rPr>
@@ -5000,8 +5346,17 @@
           <w:bCs/>
         </w:rPr>
         <w:lastRenderedPageBreak/>
-        <w:t>Wojciech Cimochowski</w:t>
-      </w:r>
+        <w:t xml:space="preserve">Wojciech </w:t>
+      </w:r>
+      <w:proofErr w:type="spellStart"/>
+      <w:r>
+        <w:rPr>
+          <w:b/>
+          <w:bCs/>
+        </w:rPr>
+        <w:t>Cimochowski</w:t>
+      </w:r>
+      <w:proofErr w:type="spellEnd"/>
     </w:p>
     <w:p>
       <w:pPr>
@@ -5125,7 +5480,21 @@
         <w:rPr>
           <w:lang w:val="pl-PL"/>
         </w:rPr>
-        <w:t> Aktor wywołuje na obiekcie rezerwacja metodę pobierzKlienta().</w:t>
+        <w:t> Aktor wywołuje na obiekcie rezerwacja metodę </w:t>
+      </w:r>
+      <w:proofErr w:type="spellStart"/>
+      <w:r>
+        <w:rPr>
+          <w:lang w:val="pl-PL"/>
+        </w:rPr>
+        <w:t>pobierzKlienta</w:t>
+      </w:r>
+      <w:proofErr w:type="spellEnd"/>
+      <w:r>
+        <w:rPr>
+          <w:lang w:val="pl-PL"/>
+        </w:rPr>
+        <w:t>().</w:t>
       </w:r>
     </w:p>
     <w:p>
@@ -5187,7 +5556,21 @@
         <w:rPr>
           <w:lang w:val="pl-PL"/>
         </w:rPr>
-        <w:t> — fragment loop [dopóki dane niepoprawne]</w:t>
+        <w:t> — fragment </w:t>
+      </w:r>
+      <w:proofErr w:type="spellStart"/>
+      <w:r>
+        <w:rPr>
+          <w:lang w:val="pl-PL"/>
+        </w:rPr>
+        <w:t>loop</w:t>
+      </w:r>
+      <w:proofErr w:type="spellEnd"/>
+      <w:r>
+        <w:rPr>
+          <w:lang w:val="pl-PL"/>
+        </w:rPr>
+        <w:t xml:space="preserve"> [dopóki dane niepoprawne]</w:t>
       </w:r>
     </w:p>
     <w:p>
@@ -5242,7 +5625,20 @@
           <w:lang w:val="pl-PL"/>
         </w:rPr>
         <w:br/>
-        <w:t>weryfikujDokument(klient, rodzaj, PESEL).</w:t>
+      </w:r>
+      <w:proofErr w:type="spellStart"/>
+      <w:r>
+        <w:rPr>
+          <w:lang w:val="pl-PL"/>
+        </w:rPr>
+        <w:t>weryfikujDokument</w:t>
+      </w:r>
+      <w:proofErr w:type="spellEnd"/>
+      <w:r>
+        <w:rPr>
+          <w:lang w:val="pl-PL"/>
+        </w:rPr>
+        <w:t>(klient, rodzaj, PESEL).</w:t>
       </w:r>
     </w:p>
     <w:p>
@@ -5291,7 +5687,21 @@
         <w:rPr>
           <w:lang w:val="pl-PL"/>
         </w:rPr>
-        <w:t> Obiekt instruktor zwraca wartość false. System informuje o błędach w formularzu; instruktor poprawia dane i pętla się powtarza.</w:t>
+        <w:t> Obiekt instruktor zwraca wartość </w:t>
+      </w:r>
+      <w:proofErr w:type="spellStart"/>
+      <w:r>
+        <w:rPr>
+          <w:lang w:val="pl-PL"/>
+        </w:rPr>
+        <w:t>false</w:t>
+      </w:r>
+      <w:proofErr w:type="spellEnd"/>
+      <w:r>
+        <w:rPr>
+          <w:lang w:val="pl-PL"/>
+        </w:rPr>
+        <w:t>. System informuje o błędach w formularzu; instruktor poprawia dane i pętla się powtarza.</w:t>
       </w:r>
     </w:p>
     <w:p>
@@ -5319,7 +5729,49 @@
         <w:rPr>
           <w:lang w:val="pl-PL"/>
         </w:rPr>
-        <w:t>Wewnątrz weryfikujDokument ustawiany jest atrybut Status_weryfikacji klienta na true.</w:t>
+        <w:t>Wewnątrz </w:t>
+      </w:r>
+      <w:proofErr w:type="spellStart"/>
+      <w:r>
+        <w:rPr>
+          <w:lang w:val="pl-PL"/>
+        </w:rPr>
+        <w:t>weryfikujDokument</w:t>
+      </w:r>
+      <w:proofErr w:type="spellEnd"/>
+      <w:r>
+        <w:rPr>
+          <w:lang w:val="pl-PL"/>
+        </w:rPr>
+        <w:t> ustawiany jest atrybut </w:t>
+      </w:r>
+      <w:proofErr w:type="spellStart"/>
+      <w:r>
+        <w:rPr>
+          <w:lang w:val="pl-PL"/>
+        </w:rPr>
+        <w:t>Status_weryfikacji</w:t>
+      </w:r>
+      <w:proofErr w:type="spellEnd"/>
+      <w:r>
+        <w:rPr>
+          <w:lang w:val="pl-PL"/>
+        </w:rPr>
+        <w:t> klienta na </w:t>
+      </w:r>
+      <w:proofErr w:type="spellStart"/>
+      <w:r>
+        <w:rPr>
+          <w:lang w:val="pl-PL"/>
+        </w:rPr>
+        <w:t>true</w:t>
+      </w:r>
+      <w:proofErr w:type="spellEnd"/>
+      <w:r>
+        <w:rPr>
+          <w:lang w:val="pl-PL"/>
+        </w:rPr>
+        <w:t>.</w:t>
       </w:r>
     </w:p>
     <w:p>
@@ -5340,7 +5792,21 @@
         <w:rPr>
           <w:lang w:val="pl-PL"/>
         </w:rPr>
-        <w:t> Obiekt instruktor wywołuje na rezerwacja metodę zmienStatus("zweryfikowany").</w:t>
+        <w:t> Obiekt instruktor wywołuje na rezerwacja metodę </w:t>
+      </w:r>
+      <w:proofErr w:type="spellStart"/>
+      <w:r>
+        <w:rPr>
+          <w:lang w:val="pl-PL"/>
+        </w:rPr>
+        <w:t>zmienStatus</w:t>
+      </w:r>
+      <w:proofErr w:type="spellEnd"/>
+      <w:r>
+        <w:rPr>
+          <w:lang w:val="pl-PL"/>
+        </w:rPr>
+        <w:t>("zweryfikowany").</w:t>
       </w:r>
     </w:p>
     <w:p>
@@ -5361,7 +5827,21 @@
         <w:rPr>
           <w:lang w:val="pl-PL"/>
         </w:rPr>
-        <w:t> Obiekt instruktor zwraca wartość true. Rezerwacja zostaje zweryfikowana; pętla się kończy.</w:t>
+        <w:t> Obiekt instruktor zwraca wartość </w:t>
+      </w:r>
+      <w:proofErr w:type="spellStart"/>
+      <w:r>
+        <w:rPr>
+          <w:lang w:val="pl-PL"/>
+        </w:rPr>
+        <w:t>true</w:t>
+      </w:r>
+      <w:proofErr w:type="spellEnd"/>
+      <w:r>
+        <w:rPr>
+          <w:lang w:val="pl-PL"/>
+        </w:rPr>
+        <w:t>. Rezerwacja zostaje zweryfikowana; pętla się kończy.</w:t>
       </w:r>
     </w:p>
     <w:p>
@@ -5396,7 +5876,35 @@
         <w:rPr>
           <w:lang w:val="de-DE"/>
         </w:rPr>
-        <w:t>Instruktor klika przycisk „Check-in”.</w:t>
+        <w:t xml:space="preserve">Instruktor </w:t>
+      </w:r>
+      <w:proofErr w:type="spellStart"/>
+      <w:r>
+        <w:rPr>
+          <w:lang w:val="de-DE"/>
+        </w:rPr>
+        <w:t>klika</w:t>
+      </w:r>
+      <w:proofErr w:type="spellEnd"/>
+      <w:r>
+        <w:rPr>
+          <w:lang w:val="de-DE"/>
+        </w:rPr>
+        <w:t xml:space="preserve"> </w:t>
+      </w:r>
+      <w:proofErr w:type="spellStart"/>
+      <w:r>
+        <w:rPr>
+          <w:lang w:val="de-DE"/>
+        </w:rPr>
+        <w:t>przycisk</w:t>
+      </w:r>
+      <w:proofErr w:type="spellEnd"/>
+      <w:r>
+        <w:rPr>
+          <w:lang w:val="de-DE"/>
+        </w:rPr>
+        <w:t xml:space="preserve"> „Check-in”.</w:t>
       </w:r>
     </w:p>
     <w:p>
@@ -5417,7 +5925,21 @@
         <w:rPr>
           <w:lang w:val="pl-PL"/>
         </w:rPr>
-        <w:t> Aktor wywołuje na obiekcie instruktor metodę wykonajCheckIn(rezerwacja).</w:t>
+        <w:t> Aktor wywołuje na obiekcie instruktor metodę </w:t>
+      </w:r>
+      <w:proofErr w:type="spellStart"/>
+      <w:r>
+        <w:rPr>
+          <w:lang w:val="pl-PL"/>
+        </w:rPr>
+        <w:t>wykonajCheckIn</w:t>
+      </w:r>
+      <w:proofErr w:type="spellEnd"/>
+      <w:r>
+        <w:rPr>
+          <w:lang w:val="pl-PL"/>
+        </w:rPr>
+        <w:t>(rezerwacja).</w:t>
       </w:r>
     </w:p>
     <w:p>
@@ -5438,7 +5960,35 @@
         <w:rPr>
           <w:lang w:val="pl-PL"/>
         </w:rPr>
-        <w:t> Obiekt instruktor tworzy nowy obiekt sesja:SesjaStrzelecka (&lt;&lt;create&gt;&gt;).</w:t>
+        <w:t> Obiekt instruktor tworzy nowy obiekt </w:t>
+      </w:r>
+      <w:proofErr w:type="spellStart"/>
+      <w:r>
+        <w:rPr>
+          <w:lang w:val="pl-PL"/>
+        </w:rPr>
+        <w:t>sesja:SesjaStrzelecka</w:t>
+      </w:r>
+      <w:proofErr w:type="spellEnd"/>
+      <w:r>
+        <w:rPr>
+          <w:lang w:val="pl-PL"/>
+        </w:rPr>
+        <w:t> (&lt;&lt;</w:t>
+      </w:r>
+      <w:proofErr w:type="spellStart"/>
+      <w:r>
+        <w:rPr>
+          <w:lang w:val="pl-PL"/>
+        </w:rPr>
+        <w:t>create</w:t>
+      </w:r>
+      <w:proofErr w:type="spellEnd"/>
+      <w:r>
+        <w:rPr>
+          <w:lang w:val="pl-PL"/>
+        </w:rPr>
+        <w:t>&gt;&gt;).</w:t>
       </w:r>
     </w:p>
     <w:p>
@@ -5459,7 +6009,21 @@
         <w:rPr>
           <w:lang w:val="pl-PL"/>
         </w:rPr>
-        <w:t> Obiekt instruktor wywołuje na rezerwacja metodę zmienStatus("w trakcie wizyty").</w:t>
+        <w:t> Obiekt instruktor wywołuje na rezerwacja metodę </w:t>
+      </w:r>
+      <w:proofErr w:type="spellStart"/>
+      <w:r>
+        <w:rPr>
+          <w:lang w:val="pl-PL"/>
+        </w:rPr>
+        <w:t>zmienStatus</w:t>
+      </w:r>
+      <w:proofErr w:type="spellEnd"/>
+      <w:r>
+        <w:rPr>
+          <w:lang w:val="pl-PL"/>
+        </w:rPr>
+        <w:t>("w trakcie wizyty").</w:t>
       </w:r>
     </w:p>
     <w:p>
@@ -5480,7 +6044,21 @@
         <w:rPr>
           <w:lang w:val="pl-PL"/>
         </w:rPr>
-        <w:t> Obiekt instruktor zwraca utworzony obiekt sesja do aktora. Check-in zostaje zakończony; rozpoczyna się sesja strzelecka.</w:t>
+        <w:t xml:space="preserve"> Obiekt instruktor zwraca utworzony obiekt sesja do aktora. </w:t>
+      </w:r>
+      <w:proofErr w:type="spellStart"/>
+      <w:r>
+        <w:rPr>
+          <w:lang w:val="pl-PL"/>
+        </w:rPr>
+        <w:t>Check</w:t>
+      </w:r>
+      <w:proofErr w:type="spellEnd"/>
+      <w:r>
+        <w:rPr>
+          <w:lang w:val="pl-PL"/>
+        </w:rPr>
+        <w:t>-in zostaje zakończony; rozpoczyna się sesja strzelecka.</w:t>
       </w:r>
     </w:p>
     <w:p/>
@@ -5599,10 +6177,26 @@
         <w:t>Komunikat 1:</w:t>
       </w:r>
       <w:r>
-        <w:t xml:space="preserve"> Aktor wywołuje na obiekcie admin:Administrator met</w:t>
-      </w:r>
-      <w:r>
-        <w:t>odę pobierzListeUzytkownikow().</w:t>
+        <w:t xml:space="preserve"> Aktor wywołuje na obiekcie </w:t>
+      </w:r>
+      <w:proofErr w:type="spellStart"/>
+      <w:r>
+        <w:t>admin:Administrator</w:t>
+      </w:r>
+      <w:proofErr w:type="spellEnd"/>
+      <w:r>
+        <w:t xml:space="preserve"> met</w:t>
+      </w:r>
+      <w:r>
+        <w:t xml:space="preserve">odę </w:t>
+      </w:r>
+      <w:proofErr w:type="spellStart"/>
+      <w:r>
+        <w:t>pobierzListeUzytkownikow</w:t>
+      </w:r>
+      <w:proofErr w:type="spellEnd"/>
+      <w:r>
+        <w:t>().</w:t>
       </w:r>
     </w:p>
     <w:p>
@@ -5613,10 +6207,26 @@
         <w:t>Komunikat 2 (zwrot):</w:t>
       </w:r>
       <w:r>
-        <w:t xml:space="preserve"> Obiekt admin:Administrator zwraca listę uż</w:t>
-      </w:r>
-      <w:r>
-        <w:t>ytkowników (listaUzytkownikow).</w:t>
+        <w:t xml:space="preserve"> Obiekt </w:t>
+      </w:r>
+      <w:proofErr w:type="spellStart"/>
+      <w:r>
+        <w:t>admin:Administrator</w:t>
+      </w:r>
+      <w:proofErr w:type="spellEnd"/>
+      <w:r>
+        <w:t xml:space="preserve"> zwraca listę uż</w:t>
+      </w:r>
+      <w:r>
+        <w:t>ytkowników (</w:t>
+      </w:r>
+      <w:proofErr w:type="spellStart"/>
+      <w:r>
+        <w:t>listaUzytkownikow</w:t>
+      </w:r>
+      <w:proofErr w:type="spellEnd"/>
+      <w:r>
+        <w:t>).</w:t>
       </w:r>
     </w:p>
     <w:p>
@@ -5633,7 +6243,23 @@
         <w:t>2. Filtrowanie listy</w:t>
       </w:r>
       <w:r>
-        <w:t xml:space="preserve"> — fragment opt [filtr != null]</w:t>
+        <w:t xml:space="preserve"> — fragment </w:t>
+      </w:r>
+      <w:proofErr w:type="spellStart"/>
+      <w:r>
+        <w:t>opt</w:t>
+      </w:r>
+      <w:proofErr w:type="spellEnd"/>
+      <w:r>
+        <w:t xml:space="preserve"> [filtr != </w:t>
+      </w:r>
+      <w:proofErr w:type="spellStart"/>
+      <w:r>
+        <w:t>null</w:t>
+      </w:r>
+      <w:proofErr w:type="spellEnd"/>
+      <w:r>
+        <w:t>]</w:t>
       </w:r>
     </w:p>
     <w:p>
@@ -5657,10 +6283,26 @@
         <w:t>Komunikat 3:</w:t>
       </w:r>
       <w:r>
-        <w:t xml:space="preserve"> Aktor wywołuje na obiekcie admin:Administrat</w:t>
-      </w:r>
-      <w:r>
-        <w:t>or metodę filtrujTabele(filtr).</w:t>
+        <w:t xml:space="preserve"> Aktor wywołuje na obiekcie </w:t>
+      </w:r>
+      <w:proofErr w:type="spellStart"/>
+      <w:r>
+        <w:t>admin:Administrat</w:t>
+      </w:r>
+      <w:r>
+        <w:t>or</w:t>
+      </w:r>
+      <w:proofErr w:type="spellEnd"/>
+      <w:r>
+        <w:t xml:space="preserve"> metodę </w:t>
+      </w:r>
+      <w:proofErr w:type="spellStart"/>
+      <w:r>
+        <w:t>filtrujTabele</w:t>
+      </w:r>
+      <w:proofErr w:type="spellEnd"/>
+      <w:r>
+        <w:t>(filtr).</w:t>
       </w:r>
     </w:p>
     <w:p>
@@ -5671,10 +6313,26 @@
         <w:t>Komunikat 4 (zwrot):</w:t>
       </w:r>
       <w:r>
-        <w:t xml:space="preserve"> Obiekt admin:Administrator zwraca przefiltrowa</w:t>
-      </w:r>
-      <w:r>
-        <w:t>ną listę (przefiltrowanaLista).</w:t>
+        <w:t xml:space="preserve"> Obiekt </w:t>
+      </w:r>
+      <w:proofErr w:type="spellStart"/>
+      <w:r>
+        <w:t>admin:Administrator</w:t>
+      </w:r>
+      <w:proofErr w:type="spellEnd"/>
+      <w:r>
+        <w:t xml:space="preserve"> zwraca przefiltrowa</w:t>
+      </w:r>
+      <w:r>
+        <w:t>ną listę (</w:t>
+      </w:r>
+      <w:proofErr w:type="spellStart"/>
+      <w:r>
+        <w:t>przefiltrowanaLista</w:t>
+      </w:r>
+      <w:proofErr w:type="spellEnd"/>
+      <w:r>
+        <w:t>).</w:t>
       </w:r>
     </w:p>
     <w:p>
@@ -5721,10 +6379,34 @@
         <w:t>Komunikat 5:</w:t>
       </w:r>
       <w:r>
-        <w:t xml:space="preserve"> Aktor wywołuje na obiekcie admin:Administrator metodę zatwierdzZmianyKonta(wybra</w:t>
-      </w:r>
-      <w:r>
-        <w:t>nyUzytkownik).</w:t>
+        <w:t xml:space="preserve"> Aktor wywołuje na obiekcie </w:t>
+      </w:r>
+      <w:proofErr w:type="spellStart"/>
+      <w:r>
+        <w:t>admin:Administrator</w:t>
+      </w:r>
+      <w:proofErr w:type="spellEnd"/>
+      <w:r>
+        <w:t xml:space="preserve"> metodę </w:t>
+      </w:r>
+      <w:proofErr w:type="spellStart"/>
+      <w:r>
+        <w:t>zatwierdzZmianyKonta</w:t>
+      </w:r>
+      <w:proofErr w:type="spellEnd"/>
+      <w:r>
+        <w:t>(</w:t>
+      </w:r>
+      <w:proofErr w:type="spellStart"/>
+      <w:r>
+        <w:t>wybra</w:t>
+      </w:r>
+      <w:r>
+        <w:t>nyUzytkownik</w:t>
+      </w:r>
+      <w:proofErr w:type="spellEnd"/>
+      <w:r>
+        <w:t>).</w:t>
       </w:r>
     </w:p>
     <w:p>
@@ -5735,7 +6417,31 @@
         <w:t>Komunikat 6:</w:t>
       </w:r>
       <w:r>
-        <w:t xml:space="preserve"> Obiekt admin:Administrator wywołuje na obiekcie użytkownik:Użytkownik metodę aktualizujStan()</w:t>
+        <w:t xml:space="preserve"> Obiekt </w:t>
+      </w:r>
+      <w:proofErr w:type="spellStart"/>
+      <w:r>
+        <w:t>admin:Administrator</w:t>
+      </w:r>
+      <w:proofErr w:type="spellEnd"/>
+      <w:r>
+        <w:t xml:space="preserve"> wywołuje na obiekcie </w:t>
+      </w:r>
+      <w:proofErr w:type="spellStart"/>
+      <w:r>
+        <w:t>użytkownik:Użytkownik</w:t>
+      </w:r>
+      <w:proofErr w:type="spellEnd"/>
+      <w:r>
+        <w:t xml:space="preserve"> metodę </w:t>
+      </w:r>
+      <w:proofErr w:type="spellStart"/>
+      <w:r>
+        <w:t>aktualizujStan</w:t>
+      </w:r>
+      <w:proofErr w:type="spellEnd"/>
+      <w:r>
+        <w:t>()</w:t>
       </w:r>
       <w:r>
         <w:t>, aby zapisać nowe uprawnienia.</w:t>
@@ -5749,10 +6455,23 @@
         <w:t>Komunikat 7 (zwrot):</w:t>
       </w:r>
       <w:r>
-        <w:t xml:space="preserve"> Obiekt użytkownik:Użytkownik zwraca potwierdzenie wykonania operacji do obiektu </w:t>
-      </w:r>
-      <w:r>
-        <w:t>admin:Administrator.</w:t>
+        <w:t xml:space="preserve"> Obiekt </w:t>
+      </w:r>
+      <w:proofErr w:type="spellStart"/>
+      <w:r>
+        <w:t>użytkownik:Użytkownik</w:t>
+      </w:r>
+      <w:proofErr w:type="spellEnd"/>
+      <w:r>
+        <w:t xml:space="preserve"> zwraca potwierdzenie wykonania operacji do obiektu </w:t>
+      </w:r>
+      <w:proofErr w:type="spellStart"/>
+      <w:r>
+        <w:t>admin:Administrator</w:t>
+      </w:r>
+      <w:proofErr w:type="spellEnd"/>
+      <w:r>
+        <w:t>.</w:t>
       </w:r>
     </w:p>
     <w:p>
@@ -5763,7 +6482,23 @@
         <w:t>Komunikat 8 (zwrot):</w:t>
       </w:r>
       <w:r>
-        <w:t xml:space="preserve"> Obiekt admin:Administrator zwraca wartość true do aktora. Zmiany zostały pomyślnie zapisane.</w:t>
+        <w:t xml:space="preserve"> Obiekt </w:t>
+      </w:r>
+      <w:proofErr w:type="spellStart"/>
+      <w:r>
+        <w:t>admin:Administrator</w:t>
+      </w:r>
+      <w:proofErr w:type="spellEnd"/>
+      <w:r>
+        <w:t xml:space="preserve"> zwraca wartość </w:t>
+      </w:r>
+      <w:proofErr w:type="spellStart"/>
+      <w:r>
+        <w:t>true</w:t>
+      </w:r>
+      <w:proofErr w:type="spellEnd"/>
+      <w:r>
+        <w:t xml:space="preserve"> do aktora. Zmiany zostały pomyślnie zapisane.</w:t>
       </w:r>
     </w:p>
     <w:p/>
@@ -5800,6 +6535,7 @@
       <w:r>
         <w:rPr>
           <w:noProof/>
+          <w:lang w:val="pl-PL"/>
         </w:rPr>
         <w:drawing>
           <wp:inline distT="0" distB="0" distL="0" distR="0" wp14:anchorId="01A65595" wp14:editId="4CC555FA">
@@ -6298,7 +7034,15 @@
         <w:t xml:space="preserve"> </w:t>
       </w:r>
       <w:r>
-        <w:t>Klasa dziedzicząca po Uzytkownik. Reprezentuje pracownika z najwyższymi uprawnieniami, odpowiedzialnego za podgląd i zarządzanie kontami wszystkich osób w systemie.</w:t>
+        <w:t xml:space="preserve">Klasa dziedzicząca po </w:t>
+      </w:r>
+      <w:proofErr w:type="spellStart"/>
+      <w:r>
+        <w:t>Uzytkownik</w:t>
+      </w:r>
+      <w:proofErr w:type="spellEnd"/>
+      <w:r>
+        <w:t>. Reprezentuje pracownika z najwyższymi uprawnieniami, odpowiedzialnego za podgląd i zarządzanie kontami wszystkich osób w systemie.</w:t>
       </w:r>
     </w:p>
     <w:p>
@@ -6313,7 +7057,15 @@
         <w:t>Atrybuty:</w:t>
       </w:r>
       <w:r>
-        <w:t xml:space="preserve"> Dziedziczy podstawowe atrybuty logowania z klasy nadrzędnej Uzytkownik.</w:t>
+        <w:t xml:space="preserve"> Dziedziczy podstawowe atrybuty logowania z klasy nadrzędnej </w:t>
+      </w:r>
+      <w:proofErr w:type="spellStart"/>
+      <w:r>
+        <w:t>Uzytkownik</w:t>
+      </w:r>
+      <w:proofErr w:type="spellEnd"/>
+      <w:r>
+        <w:t>.</w:t>
       </w:r>
     </w:p>
     <w:p>
@@ -6344,7 +7096,23 @@
         <w:t xml:space="preserve"> </w:t>
       </w:r>
       <w:r>
-        <w:t>+ pobierzListeUzytkownikow(): List&lt;Uzytkownik&gt; – Zwraca pełną listę wszystkich zarejestrowanych kont z bazy danych.</w:t>
+        <w:t xml:space="preserve">+ </w:t>
+      </w:r>
+      <w:proofErr w:type="spellStart"/>
+      <w:r>
+        <w:t>pobierzListeUzytkownikow</w:t>
+      </w:r>
+      <w:proofErr w:type="spellEnd"/>
+      <w:r>
+        <w:t>(): List&lt;</w:t>
+      </w:r>
+      <w:proofErr w:type="spellStart"/>
+      <w:r>
+        <w:t>Uzytkownik</w:t>
+      </w:r>
+      <w:proofErr w:type="spellEnd"/>
+      <w:r>
+        <w:t>&gt; – Zwraca pełną listę wszystkich zarejestrowanych kont z bazy danych.</w:t>
       </w:r>
     </w:p>
     <w:p>
@@ -6363,7 +7131,23 @@
         <w:t xml:space="preserve"> </w:t>
       </w:r>
       <w:r>
-        <w:t>+ filtrujTabele(filtr): List&lt;Uzytkownik&gt; – Pozwala na wyszukiwanie konkretnych osób (np. po nazwisku lub roli) na liście.</w:t>
+        <w:t xml:space="preserve">+ </w:t>
+      </w:r>
+      <w:proofErr w:type="spellStart"/>
+      <w:r>
+        <w:t>filtrujTabele</w:t>
+      </w:r>
+      <w:proofErr w:type="spellEnd"/>
+      <w:r>
+        <w:t>(filtr): List&lt;</w:t>
+      </w:r>
+      <w:proofErr w:type="spellStart"/>
+      <w:r>
+        <w:t>Uzytkownik</w:t>
+      </w:r>
+      <w:proofErr w:type="spellEnd"/>
+      <w:r>
+        <w:t>&gt; – Pozwala na wyszukiwanie konkretnych osób (np. po nazwisku lub roli) na liście.</w:t>
       </w:r>
     </w:p>
     <w:p>
@@ -6382,7 +7166,31 @@
         <w:t xml:space="preserve"> </w:t>
       </w:r>
       <w:r>
-        <w:t>+ zatwierdzZamianyKonta(uzytkownik): Boolean – Zapisuje w bazie zmodyfikowane dane lub zmienione uprawnienia konkretnego użytkownika.</w:t>
+        <w:t xml:space="preserve">+ </w:t>
+      </w:r>
+      <w:proofErr w:type="spellStart"/>
+      <w:r>
+        <w:t>zatwierdzZamianyKonta</w:t>
+      </w:r>
+      <w:proofErr w:type="spellEnd"/>
+      <w:r>
+        <w:t>(</w:t>
+      </w:r>
+      <w:proofErr w:type="spellStart"/>
+      <w:r>
+        <w:t>uzytkownik</w:t>
+      </w:r>
+      <w:proofErr w:type="spellEnd"/>
+      <w:r>
+        <w:t xml:space="preserve">): </w:t>
+      </w:r>
+      <w:proofErr w:type="spellStart"/>
+      <w:r>
+        <w:t>Boolean</w:t>
+      </w:r>
+      <w:proofErr w:type="spellEnd"/>
+      <w:r>
+        <w:t xml:space="preserve"> – Zapisuje w bazie zmodyfikowane dane lub zmienione uprawnienia konkretnego użytkownika.</w:t>
       </w:r>
     </w:p>
     <w:p>
@@ -6397,6 +7205,7 @@
           <w:szCs w:val="24"/>
         </w:rPr>
       </w:pPr>
+      <w:proofErr w:type="spellStart"/>
       <w:r>
         <w:rPr>
           <w:sz w:val="24"/>
@@ -6404,6 +7213,7 @@
         </w:rPr>
         <w:t>AmunicjaMagazyn</w:t>
       </w:r>
+      <w:proofErr w:type="spellEnd"/>
     </w:p>
     <w:p>
       <w:pPr>
@@ -6447,8 +7257,21 @@
       <w:r>
         <w:t xml:space="preserve">- </w:t>
       </w:r>
-      <w:r>
-        <w:t>iloscSztuk: Integer – Wskazuje, ile fizycznie sztuk znajduje się na stanie.</w:t>
+      <w:proofErr w:type="spellStart"/>
+      <w:r>
+        <w:t>iloscSztuk</w:t>
+      </w:r>
+      <w:proofErr w:type="spellEnd"/>
+      <w:r>
+        <w:t xml:space="preserve">: </w:t>
+      </w:r>
+      <w:proofErr w:type="spellStart"/>
+      <w:r>
+        <w:t>Integer</w:t>
+      </w:r>
+      <w:proofErr w:type="spellEnd"/>
+      <w:r>
+        <w:t xml:space="preserve"> – Wskazuje, ile fizycznie sztuk znajduje się na stanie.</w:t>
       </w:r>
     </w:p>
     <w:p>
@@ -6475,7 +7298,39 @@
         <w:t xml:space="preserve"> </w:t>
       </w:r>
       <w:r>
-        <w:t>+ odejmijAmunicje(ilosc: Integer): Boolean – Pomniejsza stan magazynowy o liczbę naboi zużytych podczas zakończonej sesji strzeleckiej.</w:t>
+        <w:t xml:space="preserve">+ </w:t>
+      </w:r>
+      <w:proofErr w:type="spellStart"/>
+      <w:r>
+        <w:t>odejmijAmunicje</w:t>
+      </w:r>
+      <w:proofErr w:type="spellEnd"/>
+      <w:r>
+        <w:t>(</w:t>
+      </w:r>
+      <w:proofErr w:type="spellStart"/>
+      <w:r>
+        <w:t>ilosc</w:t>
+      </w:r>
+      <w:proofErr w:type="spellEnd"/>
+      <w:r>
+        <w:t xml:space="preserve">: </w:t>
+      </w:r>
+      <w:proofErr w:type="spellStart"/>
+      <w:r>
+        <w:t>Integer</w:t>
+      </w:r>
+      <w:proofErr w:type="spellEnd"/>
+      <w:r>
+        <w:t xml:space="preserve">): </w:t>
+      </w:r>
+      <w:proofErr w:type="spellStart"/>
+      <w:r>
+        <w:t>Boolean</w:t>
+      </w:r>
+      <w:proofErr w:type="spellEnd"/>
+      <w:r>
+        <w:t xml:space="preserve"> – Pomniejsza stan magazynowy o liczbę naboi zużytych podczas zakończonej sesji strzeleckiej.</w:t>
       </w:r>
     </w:p>
     <w:p>
@@ -6490,6 +7345,7 @@
           <w:szCs w:val="24"/>
         </w:rPr>
       </w:pPr>
+      <w:proofErr w:type="spellStart"/>
       <w:r>
         <w:rPr>
           <w:sz w:val="24"/>
@@ -6497,6 +7353,7 @@
         </w:rPr>
         <w:t>EgzemplarzBroni</w:t>
       </w:r>
+      <w:proofErr w:type="spellEnd"/>
     </w:p>
     <w:p>
       <w:pPr>
@@ -6549,8 +7406,13 @@
         </w:rPr>
         <w:t xml:space="preserve"> </w:t>
       </w:r>
-      <w:r>
-        <w:t>nrSeryjny: String – Unikalny identyfikator wybity na broni.</w:t>
+      <w:proofErr w:type="spellStart"/>
+      <w:r>
+        <w:t>nrSeryjny</w:t>
+      </w:r>
+      <w:proofErr w:type="spellEnd"/>
+      <w:r>
+        <w:t>: String – Unikalny identyfikator wybity na broni.</w:t>
       </w:r>
     </w:p>
     <w:p>
@@ -6568,8 +7430,21 @@
         </w:rPr>
         <w:t xml:space="preserve"> </w:t>
       </w:r>
-      <w:r>
-        <w:t>aktualnyPrzebieg: Integer – Sumaryczna liczba wystrzelonych z tej broni naboi.</w:t>
+      <w:proofErr w:type="spellStart"/>
+      <w:r>
+        <w:t>aktualnyPrzebieg</w:t>
+      </w:r>
+      <w:proofErr w:type="spellEnd"/>
+      <w:r>
+        <w:t xml:space="preserve">: </w:t>
+      </w:r>
+      <w:proofErr w:type="spellStart"/>
+      <w:r>
+        <w:t>Integer</w:t>
+      </w:r>
+      <w:proofErr w:type="spellEnd"/>
+      <w:r>
+        <w:t xml:space="preserve"> – Sumaryczna liczba wystrzelonych z tej broni naboi.</w:t>
       </w:r>
     </w:p>
     <w:p>
@@ -6595,7 +7470,39 @@
         <w:t xml:space="preserve"> </w:t>
       </w:r>
       <w:r>
-        <w:t>+ aktualizujPrzebieg(ilosc: Integer): void – Dopisuje nową liczbę oddanych strzałów do ogólnego przebiegu danej jednostki po treningu.</w:t>
+        <w:t xml:space="preserve">+ </w:t>
+      </w:r>
+      <w:proofErr w:type="spellStart"/>
+      <w:r>
+        <w:t>aktualizujPrzebieg</w:t>
+      </w:r>
+      <w:proofErr w:type="spellEnd"/>
+      <w:r>
+        <w:t>(</w:t>
+      </w:r>
+      <w:proofErr w:type="spellStart"/>
+      <w:r>
+        <w:t>ilosc</w:t>
+      </w:r>
+      <w:proofErr w:type="spellEnd"/>
+      <w:r>
+        <w:t xml:space="preserve">: </w:t>
+      </w:r>
+      <w:proofErr w:type="spellStart"/>
+      <w:r>
+        <w:t>Integer</w:t>
+      </w:r>
+      <w:proofErr w:type="spellEnd"/>
+      <w:r>
+        <w:t xml:space="preserve">): </w:t>
+      </w:r>
+      <w:proofErr w:type="spellStart"/>
+      <w:r>
+        <w:t>void</w:t>
+      </w:r>
+      <w:proofErr w:type="spellEnd"/>
+      <w:r>
+        <w:t xml:space="preserve"> – Dopisuje nową liczbę oddanych strzałów do ogólnego przebiegu danej jednostki po treningu.</w:t>
       </w:r>
     </w:p>
     <w:p>
@@ -6633,7 +7540,15 @@
         <w:t>:</w:t>
       </w:r>
       <w:r>
-        <w:t xml:space="preserve"> Klasa dziedzicząca po Uzytkownik. Reprezentuje pracownika obsługi, który ma uprawnienia do prowadzenia strzelania i weryfikacji tożsamości.</w:t>
+        <w:t xml:space="preserve"> Klasa dziedzicząca po </w:t>
+      </w:r>
+      <w:proofErr w:type="spellStart"/>
+      <w:r>
+        <w:t>Uzytkownik</w:t>
+      </w:r>
+      <w:proofErr w:type="spellEnd"/>
+      <w:r>
+        <w:t>. Reprezentuje pracownika obsługi, który ma uprawnienia do prowadzenia strzelania i weryfikacji tożsamości.</w:t>
       </w:r>
     </w:p>
     <w:p>
@@ -6663,8 +7578,13 @@
         </w:rPr>
         <w:t xml:space="preserve"> </w:t>
       </w:r>
-      <w:r>
-        <w:t>NrLegitymacji: string – Zapisany numer uprawnień państwowych/związkowych pracownika.</w:t>
+      <w:proofErr w:type="spellStart"/>
+      <w:r>
+        <w:t>NrLegitymacji</w:t>
+      </w:r>
+      <w:proofErr w:type="spellEnd"/>
+      <w:r>
+        <w:t>: string – Zapisany numer uprawnień państwowych/związkowych pracownika.</w:t>
       </w:r>
     </w:p>
     <w:p>
@@ -6695,7 +7615,23 @@
         <w:t xml:space="preserve"> </w:t>
       </w:r>
       <w:r>
-        <w:t>+ weryfikujDokument(klient: Klient, rodzaj: String, pesel: string): Boolean – Waliduje tożsamość klienta, przyjmując jako argumenty konkretne dane z okazanego dokumentu (w tym numer PESEL).</w:t>
+        <w:t xml:space="preserve">+ </w:t>
+      </w:r>
+      <w:proofErr w:type="spellStart"/>
+      <w:r>
+        <w:t>weryfikujDokument</w:t>
+      </w:r>
+      <w:proofErr w:type="spellEnd"/>
+      <w:r>
+        <w:t xml:space="preserve">(klient: Klient, rodzaj: String, pesel: string): </w:t>
+      </w:r>
+      <w:proofErr w:type="spellStart"/>
+      <w:r>
+        <w:t>Boolean</w:t>
+      </w:r>
+      <w:proofErr w:type="spellEnd"/>
+      <w:r>
+        <w:t xml:space="preserve"> – Waliduje tożsamość klienta, przyjmując jako argumenty konkretne dane z okazanego dokumentu (w tym numer PESEL).</w:t>
       </w:r>
     </w:p>
     <w:p>
@@ -6714,7 +7650,23 @@
         <w:t xml:space="preserve"> </w:t>
       </w:r>
       <w:r>
-        <w:t>+ wykonajCheckIn(Rezerwacja): SesjaStrzelecka – Przekształca oczekującą rezerwację w trwający trening na osi strzeleckiej.</w:t>
+        <w:t xml:space="preserve">+ </w:t>
+      </w:r>
+      <w:proofErr w:type="spellStart"/>
+      <w:r>
+        <w:t>wykonajCheckIn</w:t>
+      </w:r>
+      <w:proofErr w:type="spellEnd"/>
+      <w:r>
+        <w:t xml:space="preserve">(Rezerwacja): </w:t>
+      </w:r>
+      <w:proofErr w:type="spellStart"/>
+      <w:r>
+        <w:t>SesjaStrzelecka</w:t>
+      </w:r>
+      <w:proofErr w:type="spellEnd"/>
+      <w:r>
+        <w:t xml:space="preserve"> – Przekształca oczekującą rezerwację w trwający trening na osi strzeleckiej.</w:t>
       </w:r>
     </w:p>
     <w:p>
@@ -6733,7 +7685,31 @@
         <w:t xml:space="preserve"> </w:t>
       </w:r>
       <w:r>
-        <w:t>+ wykonajCheckOut(SesjaStrzelecka, wyniki): void – Zamyka sesję, przekazując wyniki do rozliczenia kosztów i zasobów.</w:t>
+        <w:t xml:space="preserve">+ </w:t>
+      </w:r>
+      <w:proofErr w:type="spellStart"/>
+      <w:r>
+        <w:t>wykonajCheckOut</w:t>
+      </w:r>
+      <w:proofErr w:type="spellEnd"/>
+      <w:r>
+        <w:t>(</w:t>
+      </w:r>
+      <w:proofErr w:type="spellStart"/>
+      <w:r>
+        <w:t>SesjaStrzelecka</w:t>
+      </w:r>
+      <w:proofErr w:type="spellEnd"/>
+      <w:r>
+        <w:t xml:space="preserve">, wyniki): </w:t>
+      </w:r>
+      <w:proofErr w:type="spellStart"/>
+      <w:r>
+        <w:t>void</w:t>
+      </w:r>
+      <w:proofErr w:type="spellEnd"/>
+      <w:r>
+        <w:t xml:space="preserve"> – Zamyka sesję, przekazując wyniki do rozliczenia kosztów i zasobów.</w:t>
       </w:r>
     </w:p>
     <w:p>
@@ -6768,7 +7744,15 @@
         <w:t>Opis:</w:t>
       </w:r>
       <w:r>
-        <w:t xml:space="preserve"> Klasa dziedzicząca po Uzytkownik. Główny aktor korzystający z usług strzelnicy, dokonujący rezerwacji i budujący swoją historię.</w:t>
+        <w:t xml:space="preserve"> Klasa dziedzicząca po </w:t>
+      </w:r>
+      <w:proofErr w:type="spellStart"/>
+      <w:r>
+        <w:t>Uzytkownik</w:t>
+      </w:r>
+      <w:proofErr w:type="spellEnd"/>
+      <w:r>
+        <w:t>. Główny aktor korzystający z usług strzelnicy, dokonujący rezerwacji i budujący swoją historię.</w:t>
       </w:r>
     </w:p>
     <w:p>
@@ -6798,8 +7782,13 @@
         </w:rPr>
         <w:t xml:space="preserve"> </w:t>
       </w:r>
-      <w:r>
-        <w:t>Imie: String – Imię klienta.</w:t>
+      <w:proofErr w:type="spellStart"/>
+      <w:r>
+        <w:t>Imie</w:t>
+      </w:r>
+      <w:proofErr w:type="spellEnd"/>
+      <w:r>
+        <w:t>: String – Imię klienta.</w:t>
       </w:r>
     </w:p>
     <w:p>
@@ -6855,8 +7844,21 @@
         </w:rPr>
         <w:t xml:space="preserve"> </w:t>
       </w:r>
-      <w:r>
-        <w:t>Status_weryfikacji: Boolean – Flaga informująca, czy instruktor autoryzował tę osobę.</w:t>
+      <w:proofErr w:type="spellStart"/>
+      <w:r>
+        <w:t>Status_weryfikacji</w:t>
+      </w:r>
+      <w:proofErr w:type="spellEnd"/>
+      <w:r>
+        <w:t xml:space="preserve">: </w:t>
+      </w:r>
+      <w:proofErr w:type="spellStart"/>
+      <w:r>
+        <w:t>Boolean</w:t>
+      </w:r>
+      <w:proofErr w:type="spellEnd"/>
+      <w:r>
+        <w:t xml:space="preserve"> – Flaga informująca, czy instruktor autoryzował tę osobę.</w:t>
       </w:r>
     </w:p>
     <w:p>
@@ -6886,8 +7888,13 @@
         </w:rPr>
         <w:t xml:space="preserve"> </w:t>
       </w:r>
-      <w:r>
-        <w:t>zlozRezerwacja(data, stanowisko): Rezerwacja – Inicjuje proces rezerwowania wolnego toru w wybranym terminie.</w:t>
+      <w:proofErr w:type="spellStart"/>
+      <w:r>
+        <w:t>zlozRezerwacja</w:t>
+      </w:r>
+      <w:proofErr w:type="spellEnd"/>
+      <w:r>
+        <w:t>(data, stanowisko): Rezerwacja – Inicjuje proces rezerwowania wolnego toru w wybranym terminie.</w:t>
       </w:r>
     </w:p>
     <w:p>
@@ -6902,6 +7909,7 @@
           <w:szCs w:val="24"/>
         </w:rPr>
       </w:pPr>
+      <w:proofErr w:type="spellStart"/>
       <w:r>
         <w:rPr>
           <w:sz w:val="24"/>
@@ -6909,6 +7917,7 @@
         </w:rPr>
         <w:t>Placowka</w:t>
       </w:r>
+      <w:proofErr w:type="spellEnd"/>
     </w:p>
     <w:p>
       <w:pPr>
@@ -7003,7 +8012,23 @@
         <w:t xml:space="preserve"> </w:t>
       </w:r>
       <w:r>
-        <w:t>+ dodajDoMagazynu(Egzemplarz broni): void – Dopisuje nowo zakupioną sztukę uzbrojenia do inwentarza tej konkretnej lokalizacji.</w:t>
+        <w:t xml:space="preserve">+ </w:t>
+      </w:r>
+      <w:proofErr w:type="spellStart"/>
+      <w:r>
+        <w:t>dodajDoMagazynu</w:t>
+      </w:r>
+      <w:proofErr w:type="spellEnd"/>
+      <w:r>
+        <w:t xml:space="preserve">(Egzemplarz broni): </w:t>
+      </w:r>
+      <w:proofErr w:type="spellStart"/>
+      <w:r>
+        <w:t>void</w:t>
+      </w:r>
+      <w:proofErr w:type="spellEnd"/>
+      <w:r>
+        <w:t xml:space="preserve"> – Dopisuje nowo zakupioną sztukę uzbrojenia do inwentarza tej konkretnej lokalizacji.</w:t>
       </w:r>
     </w:p>
     <w:p>
@@ -7076,7 +8101,21 @@
         <w:rPr>
           <w:lang w:val="pl-PL"/>
         </w:rPr>
-        <w:t xml:space="preserve">data: date – Zaplanowany dzień wizyty na strzelnicy. </w:t>
+        <w:t xml:space="preserve">data: </w:t>
+      </w:r>
+      <w:proofErr w:type="spellStart"/>
+      <w:r>
+        <w:rPr>
+          <w:lang w:val="pl-PL"/>
+        </w:rPr>
+        <w:t>date</w:t>
+      </w:r>
+      <w:proofErr w:type="spellEnd"/>
+      <w:r>
+        <w:rPr>
+          <w:lang w:val="pl-PL"/>
+        </w:rPr>
+        <w:t xml:space="preserve"> – Zaplanowany dzień wizyty na strzelnicy. </w:t>
       </w:r>
     </w:p>
     <w:p>
@@ -7126,7 +8165,23 @@
         <w:t xml:space="preserve"> </w:t>
       </w:r>
       <w:r>
-        <w:t>+ pobierzKlienta(): void – Zwraca dane osoby, która dokonała rezerwacji w celu jej weryfikacji przy stanowisku instruktora.</w:t>
+        <w:t xml:space="preserve">+ </w:t>
+      </w:r>
+      <w:proofErr w:type="spellStart"/>
+      <w:r>
+        <w:t>pobierzKlienta</w:t>
+      </w:r>
+      <w:proofErr w:type="spellEnd"/>
+      <w:r>
+        <w:t xml:space="preserve">(): </w:t>
+      </w:r>
+      <w:proofErr w:type="spellStart"/>
+      <w:r>
+        <w:t>void</w:t>
+      </w:r>
+      <w:proofErr w:type="spellEnd"/>
+      <w:r>
+        <w:t xml:space="preserve"> – Zwraca dane osoby, która dokonała rezerwacji w celu jej weryfikacji przy stanowisku instruktora.</w:t>
       </w:r>
     </w:p>
     <w:p>
@@ -7145,7 +8200,31 @@
         <w:t xml:space="preserve"> </w:t>
       </w:r>
       <w:r>
-        <w:t>+ zmienStatus(): void – Modyfikuje etap rezerwacji w cyklu życia wizyty (np. przy autoryzacji "Check-in").</w:t>
+        <w:t xml:space="preserve">+ </w:t>
+      </w:r>
+      <w:proofErr w:type="spellStart"/>
+      <w:r>
+        <w:t>zmienStatus</w:t>
+      </w:r>
+      <w:proofErr w:type="spellEnd"/>
+      <w:r>
+        <w:t xml:space="preserve">(): </w:t>
+      </w:r>
+      <w:proofErr w:type="spellStart"/>
+      <w:r>
+        <w:t>void</w:t>
+      </w:r>
+      <w:proofErr w:type="spellEnd"/>
+      <w:r>
+        <w:t xml:space="preserve"> – Modyfikuje etap rezerwacji w cyklu życia wizyty (np. przy autoryzacji "</w:t>
+      </w:r>
+      <w:proofErr w:type="spellStart"/>
+      <w:r>
+        <w:t>Check</w:t>
+      </w:r>
+      <w:proofErr w:type="spellEnd"/>
+      <w:r>
+        <w:t>-in").</w:t>
       </w:r>
     </w:p>
     <w:p>
@@ -7160,6 +8239,7 @@
           <w:szCs w:val="24"/>
         </w:rPr>
       </w:pPr>
+      <w:proofErr w:type="spellStart"/>
       <w:r>
         <w:rPr>
           <w:sz w:val="24"/>
@@ -7167,6 +8247,7 @@
         </w:rPr>
         <w:t>SesjaStrzelecka</w:t>
       </w:r>
+      <w:proofErr w:type="spellEnd"/>
     </w:p>
     <w:p>
       <w:pPr>
@@ -7213,8 +8294,21 @@
         </w:rPr>
         <w:t xml:space="preserve"> </w:t>
       </w:r>
-      <w:r>
-        <w:t>czasRozpoczecia: DateTime – Rzeczywisty czas wejścia na tor.</w:t>
+      <w:proofErr w:type="spellStart"/>
+      <w:r>
+        <w:t>czasRozpoczecia</w:t>
+      </w:r>
+      <w:proofErr w:type="spellEnd"/>
+      <w:r>
+        <w:t xml:space="preserve">: </w:t>
+      </w:r>
+      <w:proofErr w:type="spellStart"/>
+      <w:r>
+        <w:t>DateTime</w:t>
+      </w:r>
+      <w:proofErr w:type="spellEnd"/>
+      <w:r>
+        <w:t xml:space="preserve"> – Rzeczywisty czas wejścia na tor.</w:t>
       </w:r>
     </w:p>
     <w:p>
@@ -7232,8 +8326,21 @@
         </w:rPr>
         <w:t xml:space="preserve"> </w:t>
       </w:r>
-      <w:r>
-        <w:t>czasZakonczenia: DateTime – Rzeczywisty czas zakończenia treningu.</w:t>
+      <w:proofErr w:type="spellStart"/>
+      <w:r>
+        <w:t>czasZakonczenia</w:t>
+      </w:r>
+      <w:proofErr w:type="spellEnd"/>
+      <w:r>
+        <w:t xml:space="preserve">: </w:t>
+      </w:r>
+      <w:proofErr w:type="spellStart"/>
+      <w:r>
+        <w:t>DateTime</w:t>
+      </w:r>
+      <w:proofErr w:type="spellEnd"/>
+      <w:r>
+        <w:t xml:space="preserve"> – Rzeczywisty czas zakończenia treningu.</w:t>
       </w:r>
     </w:p>
     <w:p>
@@ -7263,8 +8370,21 @@
         </w:rPr>
         <w:t xml:space="preserve"> </w:t>
       </w:r>
-      <w:r>
-        <w:t>podliczSesje(): void – Agreguje zgromadzone logi o amunicji i podsumowuje całościowe statystyki wizyty.</w:t>
+      <w:proofErr w:type="spellStart"/>
+      <w:r>
+        <w:t>podliczSesje</w:t>
+      </w:r>
+      <w:proofErr w:type="spellEnd"/>
+      <w:r>
+        <w:t xml:space="preserve">(): </w:t>
+      </w:r>
+      <w:proofErr w:type="spellStart"/>
+      <w:r>
+        <w:t>void</w:t>
+      </w:r>
+      <w:proofErr w:type="spellEnd"/>
+      <w:r>
+        <w:t xml:space="preserve"> – Agreguje zgromadzone logi o amunicji i podsumowuje całościowe statystyki wizyty.</w:t>
       </w:r>
     </w:p>
     <w:p>
@@ -7330,7 +8450,15 @@
         <w:t xml:space="preserve"> </w:t>
       </w:r>
       <w:r>
-        <w:t>numer: Integer – Identyfikator liczbowy toru na osi (np. 1, 2, 3).</w:t>
+        <w:t xml:space="preserve">numer: </w:t>
+      </w:r>
+      <w:proofErr w:type="spellStart"/>
+      <w:r>
+        <w:t>Integer</w:t>
+      </w:r>
+      <w:proofErr w:type="spellEnd"/>
+      <w:r>
+        <w:t xml:space="preserve"> – Identyfikator liczbowy toru na osi (np. 1, 2, 3).</w:t>
       </w:r>
     </w:p>
     <w:p>
@@ -7348,8 +8476,21 @@
         </w:rPr>
         <w:t xml:space="preserve"> </w:t>
       </w:r>
-      <w:r>
-        <w:t>dystansMetry: Integer – Maksymalna użyteczna odległość toru do tarcz.</w:t>
+      <w:proofErr w:type="spellStart"/>
+      <w:r>
+        <w:t>dystansMetry</w:t>
+      </w:r>
+      <w:proofErr w:type="spellEnd"/>
+      <w:r>
+        <w:t xml:space="preserve">: </w:t>
+      </w:r>
+      <w:proofErr w:type="spellStart"/>
+      <w:r>
+        <w:t>Integer</w:t>
+      </w:r>
+      <w:proofErr w:type="spellEnd"/>
+      <w:r>
+        <w:t xml:space="preserve"> – Maksymalna użyteczna odległość toru do tarcz.</w:t>
       </w:r>
     </w:p>
     <w:p>
@@ -7380,7 +8521,23 @@
         <w:t xml:space="preserve"> </w:t>
       </w:r>
       <w:r>
-        <w:t>+ sprawdzDostepnosc(): Boolean – Weryfikuje w harmonogramie, czy dany tor nie jest już zablokowany przez inną rezerwację.</w:t>
+        <w:t xml:space="preserve">+ </w:t>
+      </w:r>
+      <w:proofErr w:type="spellStart"/>
+      <w:r>
+        <w:t>sprawdzDostepnosc</w:t>
+      </w:r>
+      <w:proofErr w:type="spellEnd"/>
+      <w:r>
+        <w:t xml:space="preserve">(): </w:t>
+      </w:r>
+      <w:proofErr w:type="spellStart"/>
+      <w:r>
+        <w:t>Boolean</w:t>
+      </w:r>
+      <w:proofErr w:type="spellEnd"/>
+      <w:r>
+        <w:t xml:space="preserve"> – Weryfikuje w harmonogramie, czy dany tor nie jest już zablokowany przez inną rezerwację.</w:t>
       </w:r>
     </w:p>
     <w:p>
@@ -7395,6 +8552,7 @@
           <w:szCs w:val="24"/>
         </w:rPr>
       </w:pPr>
+      <w:proofErr w:type="spellStart"/>
       <w:r>
         <w:rPr>
           <w:sz w:val="24"/>
@@ -7402,6 +8560,7 @@
         </w:rPr>
         <w:t>SzczegolyZuzycia</w:t>
       </w:r>
+      <w:proofErr w:type="spellEnd"/>
     </w:p>
     <w:p>
       <w:pPr>
@@ -7445,8 +8604,21 @@
         </w:rPr>
         <w:t xml:space="preserve"> </w:t>
       </w:r>
-      <w:r>
-        <w:t>iloscAmunicji: Integer – Konkretna wartość wystrzelonych naboi na danym etapie.</w:t>
+      <w:proofErr w:type="spellStart"/>
+      <w:r>
+        <w:t>iloscAmunicji</w:t>
+      </w:r>
+      <w:proofErr w:type="spellEnd"/>
+      <w:r>
+        <w:t xml:space="preserve">: </w:t>
+      </w:r>
+      <w:proofErr w:type="spellStart"/>
+      <w:r>
+        <w:t>Integer</w:t>
+      </w:r>
+      <w:proofErr w:type="spellEnd"/>
+      <w:r>
+        <w:t xml:space="preserve"> – Konkretna wartość wystrzelonych naboi na danym etapie.</w:t>
       </w:r>
     </w:p>
     <w:p>
@@ -7464,8 +8636,21 @@
         </w:rPr>
         <w:t xml:space="preserve"> </w:t>
       </w:r>
-      <w:r>
-        <w:t>celnoscProcent: Float – Wynik procentowy celności dla danej konfiguracji.</w:t>
+      <w:proofErr w:type="spellStart"/>
+      <w:r>
+        <w:t>celnoscProcent</w:t>
+      </w:r>
+      <w:proofErr w:type="spellEnd"/>
+      <w:r>
+        <w:t xml:space="preserve">: </w:t>
+      </w:r>
+      <w:proofErr w:type="spellStart"/>
+      <w:r>
+        <w:t>Float</w:t>
+      </w:r>
+      <w:proofErr w:type="spellEnd"/>
+      <w:r>
+        <w:t xml:space="preserve"> – Wynik procentowy celności dla danej konfiguracji.</w:t>
       </w:r>
     </w:p>
     <w:p>
@@ -7496,7 +8681,31 @@
         <w:t xml:space="preserve"> </w:t>
       </w:r>
       <w:r>
-        <w:t>+ generujLog(): void – Tworzy niemutowalny wpis techniczny w systemie w celu zaktualizowania ogólnych statystyk przebiegu i zasobów.</w:t>
+        <w:t xml:space="preserve">+ </w:t>
+      </w:r>
+      <w:proofErr w:type="spellStart"/>
+      <w:r>
+        <w:t>generujLog</w:t>
+      </w:r>
+      <w:proofErr w:type="spellEnd"/>
+      <w:r>
+        <w:t xml:space="preserve">(): </w:t>
+      </w:r>
+      <w:proofErr w:type="spellStart"/>
+      <w:r>
+        <w:t>void</w:t>
+      </w:r>
+      <w:proofErr w:type="spellEnd"/>
+      <w:r>
+        <w:t xml:space="preserve"> – Tworzy </w:t>
+      </w:r>
+      <w:proofErr w:type="spellStart"/>
+      <w:r>
+        <w:t>niemutowalny</w:t>
+      </w:r>
+      <w:proofErr w:type="spellEnd"/>
+      <w:r>
+        <w:t xml:space="preserve"> wpis techniczny w systemie w celu zaktualizowania ogólnych statystyk przebiegu i zasobów.</w:t>
       </w:r>
     </w:p>
     <w:p>
@@ -7511,6 +8720,7 @@
           <w:szCs w:val="24"/>
         </w:rPr>
       </w:pPr>
+      <w:proofErr w:type="spellStart"/>
       <w:r>
         <w:rPr>
           <w:sz w:val="24"/>
@@ -7518,6 +8728,7 @@
         </w:rPr>
         <w:t>Uzytkownik</w:t>
       </w:r>
+      <w:proofErr w:type="spellEnd"/>
     </w:p>
     <w:p>
       <w:pPr>
@@ -7599,8 +8810,13 @@
         </w:rPr>
         <w:t xml:space="preserve"> </w:t>
       </w:r>
-      <w:r>
-        <w:t>Haslo: String – Przechowywany klucz dostępu (szyfrowany).</w:t>
+      <w:proofErr w:type="spellStart"/>
+      <w:r>
+        <w:t>Haslo</w:t>
+      </w:r>
+      <w:proofErr w:type="spellEnd"/>
+      <w:r>
+        <w:t>: String – Przechowywany klucz dostępu (szyfrowany).</w:t>
       </w:r>
     </w:p>
     <w:p>
@@ -7631,7 +8847,15 @@
         <w:t xml:space="preserve"> </w:t>
       </w:r>
       <w:r>
-        <w:t>+ zaloguj(): Boolean – Sprawdza poprawność przesłanych danych uwierzytelniających i przyznaje dostęp do odpowiedniego modułu aplikacji.</w:t>
+        <w:t xml:space="preserve">+ zaloguj(): </w:t>
+      </w:r>
+      <w:proofErr w:type="spellStart"/>
+      <w:r>
+        <w:t>Boolean</w:t>
+      </w:r>
+      <w:proofErr w:type="spellEnd"/>
+      <w:r>
+        <w:t xml:space="preserve"> – Sprawdza poprawność przesłanych danych uwierzytelniających i przyznaje dostęp do odpowiedniego modułu aplikacji.</w:t>
       </w:r>
     </w:p>
     <w:p>
@@ -7673,6 +8897,7 @@
       <w:r>
         <w:t xml:space="preserve">Diagram stanów dla klasy </w:t>
       </w:r>
+      <w:proofErr w:type="spellStart"/>
       <w:r>
         <w:t>Sesj</w:t>
       </w:r>
@@ -7685,6 +8910,7 @@
       <w:r>
         <w:t>a</w:t>
       </w:r>
+      <w:proofErr w:type="spellEnd"/>
     </w:p>
     <w:p>
       <w:pPr>
@@ -7853,8 +9079,17 @@
           <w:b/>
           <w:bCs/>
         </w:rPr>
-        <w:t>Wojciech Cimochowski</w:t>
-      </w:r>
+        <w:t xml:space="preserve">Wojciech </w:t>
+      </w:r>
+      <w:proofErr w:type="spellStart"/>
+      <w:r>
+        <w:rPr>
+          <w:b/>
+          <w:bCs/>
+        </w:rPr>
+        <w:t>Cimochowski</w:t>
+      </w:r>
+      <w:proofErr w:type="spellEnd"/>
     </w:p>
     <w:p>
       <w:pPr>
@@ -7990,10 +9225,10 @@
         </w:rPr>
         <w:lastRenderedPageBreak/>
         <w:drawing>
-          <wp:inline distT="0" distB="0" distL="0" distR="0" wp14:anchorId="286D5508" wp14:editId="4965F7D0">
-            <wp:extent cx="5733415" cy="4322445"/>
-            <wp:effectExtent l="0" t="0" r="635" b="1905"/>
-            <wp:docPr id="3" name="Obraz 3"/>
+          <wp:inline distT="0" distB="0" distL="0" distR="0" wp14:anchorId="7D13C7D6" wp14:editId="5D64DC04">
+            <wp:extent cx="5733415" cy="3396282"/>
+            <wp:effectExtent l="0" t="0" r="635" b="0"/>
+            <wp:docPr id="2" name="Obraz 2"/>
             <wp:cNvGraphicFramePr>
               <a:graphicFrameLocks xmlns:a="http://schemas.openxmlformats.org/drawingml/2006/main" noChangeAspect="1"/>
             </wp:cNvGraphicFramePr>
@@ -8013,7 +9248,7 @@
                   <pic:spPr>
                     <a:xfrm>
                       <a:off x="0" y="0"/>
-                      <a:ext cx="5733415" cy="4322445"/>
+                      <a:ext cx="5733415" cy="3396282"/>
                     </a:xfrm>
                     <a:prstGeom prst="rect">
                       <a:avLst/>
@@ -8025,6 +9260,8 @@
           </wp:inline>
         </w:drawing>
       </w:r>
+      <w:bookmarkStart w:id="9" w:name="_GoBack"/>
+      <w:bookmarkEnd w:id="9"/>
     </w:p>
     <w:p>
       <w:pPr>
@@ -8521,24 +9758,114 @@
           <w:sz w:val="22"/>
           <w:szCs w:val="22"/>
         </w:rPr>
-        <w:t>System obsługuje strzelnicę z kilkoma osiami strzeleckimi i nieznaną z góry liczbą klientów dziennie. Najaktywniej zapełnianą tabelą będzie Rezerwacja, ponieważ każda wizyta generuje nowy rekord. Podobnie tabele SesjaStrzelecka i SzczegolyZuzycia będą regularnie uzupełniane przy każdej odbytej wizyty. Tabele EgzemplarzBroni i AmunicjaMagazyn będą natomiast małe i stosunkowo statyczne, ponieważ liczba egzemplarzy broni i typów amunicji na strzelnicy zmienia się rzadko. Tabele Uzytkownik i Klient będą rosły stopniowo wraz z rejestracją nowych osób.</w:t>
-      </w:r>
-    </w:p>
-    <w:p>
-      <w:pPr>
-        <w:pStyle w:val="Nagwek3"/>
+        <w:t xml:space="preserve">System obsługuje strzelnicę z kilkoma osiami strzeleckimi i nieznaną z góry liczbą klientów dziennie. Najaktywniej zapełnianą tabelą będzie Rezerwacja, ponieważ każda wizyta generuje nowy rekord. Podobnie tabele </w:t>
+      </w:r>
+      <w:proofErr w:type="spellStart"/>
+      <w:r>
         <w:rPr>
           <w:color w:val="auto"/>
           <w:sz w:val="22"/>
           <w:szCs w:val="22"/>
         </w:rPr>
-      </w:pPr>
+        <w:t>SesjaStrzelecka</w:t>
+      </w:r>
+      <w:proofErr w:type="spellEnd"/>
       <w:r>
         <w:rPr>
           <w:color w:val="auto"/>
           <w:sz w:val="22"/>
           <w:szCs w:val="22"/>
         </w:rPr>
+        <w:t xml:space="preserve"> i </w:t>
+      </w:r>
+      <w:proofErr w:type="spellStart"/>
+      <w:r>
+        <w:rPr>
+          <w:color w:val="auto"/>
+          <w:sz w:val="22"/>
+          <w:szCs w:val="22"/>
+        </w:rPr>
+        <w:t>SzczegolyZuzycia</w:t>
+      </w:r>
+      <w:proofErr w:type="spellEnd"/>
+      <w:r>
+        <w:rPr>
+          <w:color w:val="auto"/>
+          <w:sz w:val="22"/>
+          <w:szCs w:val="22"/>
+        </w:rPr>
+        <w:t xml:space="preserve"> będą regularnie uzupełniane przy każdej odbytej wizyty. Tabele </w:t>
+      </w:r>
+      <w:proofErr w:type="spellStart"/>
+      <w:r>
+        <w:rPr>
+          <w:color w:val="auto"/>
+          <w:sz w:val="22"/>
+          <w:szCs w:val="22"/>
+        </w:rPr>
+        <w:t>EgzemplarzBroni</w:t>
+      </w:r>
+      <w:proofErr w:type="spellEnd"/>
+      <w:r>
+        <w:rPr>
+          <w:color w:val="auto"/>
+          <w:sz w:val="22"/>
+          <w:szCs w:val="22"/>
+        </w:rPr>
+        <w:t xml:space="preserve"> i </w:t>
+      </w:r>
+      <w:proofErr w:type="spellStart"/>
+      <w:r>
+        <w:rPr>
+          <w:color w:val="auto"/>
+          <w:sz w:val="22"/>
+          <w:szCs w:val="22"/>
+        </w:rPr>
+        <w:t>AmunicjaMagazyn</w:t>
+      </w:r>
+      <w:proofErr w:type="spellEnd"/>
+      <w:r>
+        <w:rPr>
+          <w:color w:val="auto"/>
+          <w:sz w:val="22"/>
+          <w:szCs w:val="22"/>
+        </w:rPr>
+        <w:t xml:space="preserve"> będą natomiast małe i stosunkowo statyczne, ponieważ liczba egzemplarzy broni i typów amunicji na strzelnicy zmienia się rzadko. Tabele </w:t>
+      </w:r>
+      <w:proofErr w:type="spellStart"/>
+      <w:r>
+        <w:rPr>
+          <w:color w:val="auto"/>
+          <w:sz w:val="22"/>
+          <w:szCs w:val="22"/>
+        </w:rPr>
+        <w:t>Uzytkownik</w:t>
+      </w:r>
+      <w:proofErr w:type="spellEnd"/>
+      <w:r>
+        <w:rPr>
+          <w:color w:val="auto"/>
+          <w:sz w:val="22"/>
+          <w:szCs w:val="22"/>
+        </w:rPr>
+        <w:t xml:space="preserve"> i Klient będą rosły stopniowo wraz z rejestracją nowych osób.</w:t>
+      </w:r>
+    </w:p>
+    <w:p>
+      <w:pPr>
+        <w:pStyle w:val="Nagwek3"/>
+        <w:rPr>
+          <w:color w:val="auto"/>
+          <w:sz w:val="22"/>
+          <w:szCs w:val="22"/>
+        </w:rPr>
+      </w:pPr>
+      <w:r>
+        <w:rPr>
+          <w:color w:val="auto"/>
+          <w:sz w:val="22"/>
+          <w:szCs w:val="22"/>
+        </w:rPr>
         <w:t>Biorąc pod uwagę charakter danych tekstowych i liczbowych przechowywanych w systemie oraz dostępną przestrzeń dyskową serwera wynoszącą 4 TB, baza danych nie zbliży się do jej zapełnienia w żadnym przewidywalnym horyzoncie czasowym działania strzelnicy.</w:t>
       </w:r>
     </w:p>
@@ -8570,7 +9897,15 @@
         <w:t>Operacje krytyczne</w:t>
       </w:r>
       <w:r>
-        <w:t xml:space="preserve"> po stronie instruktora takie jak weryfikacja dokumentu i wykonanie check-in powinny być realizowane w czasie do 1 sekundy, ponieważ wykonywane są przy obecności klienta i bezpośrednio wpływają na przepustowość strzelnicy.</w:t>
+        <w:t xml:space="preserve"> po stronie instruktora takie jak weryfikacja dokumentu i wykonanie </w:t>
+      </w:r>
+      <w:proofErr w:type="spellStart"/>
+      <w:r>
+        <w:t>check</w:t>
+      </w:r>
+      <w:proofErr w:type="spellEnd"/>
+      <w:r>
+        <w:t>-in powinny być realizowane w czasie do 1 sekundy, ponieważ wykonywane są przy obecności klienta i bezpośrednio wpływają na przepustowość strzelnicy.</w:t>
       </w:r>
     </w:p>
     <w:p>
@@ -8813,6 +10148,7 @@
                 <w:lang w:val="pl-PL"/>
               </w:rPr>
             </w:pPr>
+            <w:proofErr w:type="spellStart"/>
             <w:r>
               <w:rPr>
                 <w:b/>
@@ -8821,6 +10157,7 @@
               </w:rPr>
               <w:t>Oczekujaca</w:t>
             </w:r>
+            <w:proofErr w:type="spellEnd"/>
           </w:p>
         </w:tc>
         <w:tc>
@@ -8872,6 +10209,7 @@
                 <w:lang w:val="pl-PL"/>
               </w:rPr>
             </w:pPr>
+            <w:proofErr w:type="spellStart"/>
             <w:r>
               <w:rPr>
                 <w:b/>
@@ -8880,6 +10218,7 @@
               </w:rPr>
               <w:t>WymagaWeryfikacji</w:t>
             </w:r>
+            <w:proofErr w:type="spellEnd"/>
           </w:p>
         </w:tc>
         <w:tc>
@@ -8964,7 +10303,21 @@
               <w:rPr>
                 <w:lang w:val="pl-PL"/>
               </w:rPr>
-              <w:t>Dokument klienta został zweryfikowany poprawnie. Rezerwacja ma status „zweryfikowany” i możliwe jest wykonanie check-in.</w:t>
+              <w:t xml:space="preserve">Dokument klienta został zweryfikowany poprawnie. Rezerwacja ma status „zweryfikowany” i możliwe jest wykonanie </w:t>
+            </w:r>
+            <w:proofErr w:type="spellStart"/>
+            <w:r>
+              <w:rPr>
+                <w:lang w:val="pl-PL"/>
+              </w:rPr>
+              <w:t>check</w:t>
+            </w:r>
+            <w:proofErr w:type="spellEnd"/>
+            <w:r>
+              <w:rPr>
+                <w:lang w:val="pl-PL"/>
+              </w:rPr>
+              <w:t>-in.</w:t>
             </w:r>
           </w:p>
         </w:tc>
@@ -8990,6 +10343,7 @@
                 <w:lang w:val="pl-PL"/>
               </w:rPr>
             </w:pPr>
+            <w:proofErr w:type="spellStart"/>
             <w:r>
               <w:rPr>
                 <w:b/>
@@ -8998,6 +10352,7 @@
               </w:rPr>
               <w:t>WTrakcieWizyty</w:t>
             </w:r>
+            <w:proofErr w:type="spellEnd"/>
           </w:p>
         </w:tc>
         <w:tc>
@@ -9023,7 +10378,21 @@
               <w:rPr>
                 <w:lang w:val="pl-PL"/>
               </w:rPr>
-              <w:t xml:space="preserve">Wykonano check-in. Utworzono sesję strzelecką. Klient przebywa na stanowisku, trwa </w:t>
+              <w:t xml:space="preserve">Wykonano </w:t>
+            </w:r>
+            <w:proofErr w:type="spellStart"/>
+            <w:r>
+              <w:rPr>
+                <w:lang w:val="pl-PL"/>
+              </w:rPr>
+              <w:t>check</w:t>
+            </w:r>
+            <w:proofErr w:type="spellEnd"/>
+            <w:r>
+              <w:rPr>
+                <w:lang w:val="pl-PL"/>
+              </w:rPr>
+              <w:t xml:space="preserve">-in. Utworzono sesję strzelecką. Klient przebywa na stanowisku, trwa </w:t>
             </w:r>
             <w:r>
               <w:rPr>
@@ -9061,6 +10430,7 @@
                 <w:lang w:val="pl-PL"/>
               </w:rPr>
             </w:pPr>
+            <w:proofErr w:type="spellStart"/>
             <w:r>
               <w:rPr>
                 <w:b/>
@@ -9069,6 +10439,7 @@
               </w:rPr>
               <w:t>Zakonczona</w:t>
             </w:r>
+            <w:proofErr w:type="spellEnd"/>
           </w:p>
         </w:tc>
         <w:tc>
@@ -9094,7 +10465,21 @@
               <w:rPr>
                 <w:lang w:val="pl-PL"/>
               </w:rPr>
-              <w:t xml:space="preserve">Wykonano check-out. Sesja strzelecka została rozliczona. Rezerwacja jest zamknięta </w:t>
+              <w:t xml:space="preserve">Wykonano </w:t>
+            </w:r>
+            <w:proofErr w:type="spellStart"/>
+            <w:r>
+              <w:rPr>
+                <w:lang w:val="pl-PL"/>
+              </w:rPr>
+              <w:t>check</w:t>
+            </w:r>
+            <w:proofErr w:type="spellEnd"/>
+            <w:r>
+              <w:rPr>
+                <w:lang w:val="pl-PL"/>
+              </w:rPr>
+              <w:t xml:space="preserve">-out. Sesja strzelecka została rozliczona. Rezerwacja jest zamknięta </w:t>
             </w:r>
             <w:r>
               <w:rPr>
@@ -9424,8 +10809,18 @@
                 <w:sz w:val="21"/>
                 <w:szCs w:val="21"/>
               </w:rPr>
-              <w:t>ASP.NET Core</w:t>
+              <w:t xml:space="preserve">ASP.NET </w:t>
             </w:r>
+            <w:proofErr w:type="spellStart"/>
+            <w:r>
+              <w:rPr>
+                <w:rStyle w:val="font-semibold"/>
+                <w:sz w:val="21"/>
+                <w:szCs w:val="21"/>
+              </w:rPr>
+              <w:t>Core</w:t>
+            </w:r>
+            <w:proofErr w:type="spellEnd"/>
           </w:p>
         </w:tc>
       </w:tr>
@@ -9594,7 +10989,23 @@
                 <w:sz w:val="21"/>
                 <w:szCs w:val="21"/>
               </w:rPr>
-              <w:t>Przeglądarka (Chrome / Firefox)</w:t>
+              <w:t xml:space="preserve">Przeglądarka (Chrome / </w:t>
+            </w:r>
+            <w:proofErr w:type="spellStart"/>
+            <w:r>
+              <w:rPr>
+                <w:sz w:val="21"/>
+                <w:szCs w:val="21"/>
+              </w:rPr>
+              <w:t>Firefox</w:t>
+            </w:r>
+            <w:proofErr w:type="spellEnd"/>
+            <w:r>
+              <w:rPr>
+                <w:sz w:val="21"/>
+                <w:szCs w:val="21"/>
+              </w:rPr>
+              <w:t>)</w:t>
             </w:r>
           </w:p>
         </w:tc>
@@ -9757,7 +11168,42 @@
         <w:rPr>
           <w:lang w:val="pl-PL"/>
         </w:rPr>
-        <w:t>B) hostuje aplikację webową ASP.NET Core, udostępniając interfejsy I</w:t>
+        <w:t xml:space="preserve">B) </w:t>
+      </w:r>
+      <w:proofErr w:type="spellStart"/>
+      <w:r>
+        <w:rPr>
+          <w:lang w:val="pl-PL"/>
+        </w:rPr>
+        <w:t>hostuje</w:t>
+      </w:r>
+      <w:proofErr w:type="spellEnd"/>
+      <w:r>
+        <w:rPr>
+          <w:lang w:val="pl-PL"/>
+        </w:rPr>
+        <w:t xml:space="preserve"> aplikację webową ASP.NET </w:t>
+      </w:r>
+      <w:proofErr w:type="spellStart"/>
+      <w:r>
+        <w:rPr>
+          <w:lang w:val="pl-PL"/>
+        </w:rPr>
+        <w:t>Core</w:t>
+      </w:r>
+      <w:proofErr w:type="spellEnd"/>
+      <w:r>
+        <w:rPr>
+          <w:lang w:val="pl-PL"/>
+        </w:rPr>
+        <w:t>, udostępniając interfejsy </w:t>
+      </w:r>
+      <w:proofErr w:type="spellStart"/>
+      <w:r>
+        <w:rPr>
+          <w:lang w:val="pl-PL"/>
+        </w:rPr>
+        <w:t>I</w:t>
       </w:r>
       <w:r>
         <w:rPr>
@@ -9765,11 +11211,26 @@
         </w:rPr>
         <w:t>Uzytkownik</w:t>
       </w:r>
-      <w:r>
-        <w:rPr>
-          <w:lang w:val="pl-PL"/>
-        </w:rPr>
-        <w:t> i IInstruktor.</w:t>
+      <w:proofErr w:type="spellEnd"/>
+      <w:r>
+        <w:rPr>
+          <w:lang w:val="pl-PL"/>
+        </w:rPr>
+        <w:t> i </w:t>
+      </w:r>
+      <w:proofErr w:type="spellStart"/>
+      <w:r>
+        <w:rPr>
+          <w:lang w:val="pl-PL"/>
+        </w:rPr>
+        <w:t>IInstruktor</w:t>
+      </w:r>
+      <w:proofErr w:type="spellEnd"/>
+      <w:r>
+        <w:rPr>
+          <w:lang w:val="pl-PL"/>
+        </w:rPr>
+        <w:t>.</w:t>
       </w:r>
     </w:p>
     <w:p>
@@ -9928,6 +11389,7 @@
           <w:lang w:val="pl-PL"/>
         </w:rPr>
       </w:pPr>
+      <w:proofErr w:type="spellStart"/>
       <w:r>
         <w:rPr>
           <w:b/>
@@ -9938,6 +11400,7 @@
         </w:rPr>
         <w:t>BazaStrzelnicy</w:t>
       </w:r>
+      <w:proofErr w:type="spellEnd"/>
       <w:r>
         <w:rPr>
           <w:sz w:val="20"/>
@@ -9971,6 +11434,7 @@
           <w:lang w:val="pl-PL"/>
         </w:rPr>
       </w:pPr>
+      <w:proofErr w:type="spellStart"/>
       <w:r>
         <w:rPr>
           <w:b/>
@@ -9979,85 +11443,130 @@
           <w:szCs w:val="20"/>
           <w:lang w:val="pl-PL"/>
         </w:rPr>
-        <w:t>IOdczyt / IZapis</w:t>
-      </w:r>
-      <w:r>
-        <w:rPr>
+        <w:t>IOdczyt</w:t>
+      </w:r>
+      <w:proofErr w:type="spellEnd"/>
+      <w:r>
+        <w:rPr>
+          <w:b/>
+          <w:bCs/>
           <w:sz w:val="20"/>
           <w:szCs w:val="20"/>
           <w:lang w:val="pl-PL"/>
         </w:rPr>
-        <w:t xml:space="preserve"> - d</w:t>
-      </w:r>
-      <w:r>
-        <w:rPr>
+        <w:t xml:space="preserve"> / </w:t>
+      </w:r>
+      <w:proofErr w:type="spellStart"/>
+      <w:r>
+        <w:rPr>
+          <w:b/>
+          <w:bCs/>
           <w:sz w:val="20"/>
           <w:szCs w:val="20"/>
           <w:lang w:val="pl-PL"/>
         </w:rPr>
-        <w:t>ostęp do danych</w:t>
-      </w:r>
+        <w:t>IZapis</w:t>
+      </w:r>
+      <w:proofErr w:type="spellEnd"/>
       <w:r>
         <w:rPr>
           <w:sz w:val="20"/>
           <w:szCs w:val="20"/>
           <w:lang w:val="pl-PL"/>
         </w:rPr>
-        <w:t>.</w:t>
-      </w:r>
-    </w:p>
-    <w:p>
-      <w:pPr>
+        <w:t xml:space="preserve"> - d</w:t>
+      </w:r>
+      <w:r>
         <w:rPr>
           <w:sz w:val="20"/>
           <w:szCs w:val="20"/>
           <w:lang w:val="pl-PL"/>
         </w:rPr>
-      </w:pPr>
-      <w:r>
-        <w:rPr>
-          <w:b/>
-          <w:bCs/>
+        <w:t>ostęp do danych</w:t>
+      </w:r>
+      <w:r>
+        <w:rPr>
           <w:sz w:val="20"/>
           <w:szCs w:val="20"/>
           <w:lang w:val="pl-PL"/>
         </w:rPr>
-        <w:t>IUzytkownik</w:t>
-      </w:r>
-      <w:r>
+        <w:t>.</w:t>
+      </w:r>
+    </w:p>
+    <w:p>
+      <w:pPr>
         <w:rPr>
           <w:sz w:val="20"/>
           <w:szCs w:val="20"/>
           <w:lang w:val="pl-PL"/>
         </w:rPr>
-        <w:t xml:space="preserve"> - rezerwacje klienta.</w:t>
-      </w:r>
-    </w:p>
-    <w:p>
-      <w:pPr>
-        <w:rPr>
+      </w:pPr>
+      <w:proofErr w:type="spellStart"/>
+      <w:r>
+        <w:rPr>
+          <w:b/>
+          <w:bCs/>
           <w:sz w:val="20"/>
           <w:szCs w:val="20"/>
           <w:lang w:val="pl-PL"/>
         </w:rPr>
-      </w:pPr>
-      <w:r>
-        <w:rPr>
-          <w:b/>
-          <w:bCs/>
+        <w:t>IUzytkownik</w:t>
+      </w:r>
+      <w:proofErr w:type="spellEnd"/>
+      <w:r>
+        <w:rPr>
           <w:sz w:val="20"/>
           <w:szCs w:val="20"/>
           <w:lang w:val="pl-PL"/>
         </w:rPr>
-        <w:t>IInstruktor</w:t>
-      </w:r>
-      <w:r>
+        <w:t xml:space="preserve"> - rezerwacje klienta.</w:t>
+      </w:r>
+    </w:p>
+    <w:p>
+      <w:pPr>
         <w:rPr>
           <w:sz w:val="20"/>
           <w:szCs w:val="20"/>
           <w:lang w:val="pl-PL"/>
         </w:rPr>
-        <w:t xml:space="preserve"> – Obsługa wizyt, weryfikacja, check-in.</w:t>
+      </w:pPr>
+      <w:proofErr w:type="spellStart"/>
+      <w:r>
+        <w:rPr>
+          <w:b/>
+          <w:bCs/>
+          <w:sz w:val="20"/>
+          <w:szCs w:val="20"/>
+          <w:lang w:val="pl-PL"/>
+        </w:rPr>
+        <w:t>IInstruktor</w:t>
+      </w:r>
+      <w:proofErr w:type="spellEnd"/>
+      <w:r>
+        <w:rPr>
+          <w:sz w:val="20"/>
+          <w:szCs w:val="20"/>
+          <w:lang w:val="pl-PL"/>
+        </w:rPr>
+        <w:t xml:space="preserve"> – Obsługa wizyt, weryfikacja, </w:t>
+      </w:r>
+      <w:proofErr w:type="spellStart"/>
+      <w:r>
+        <w:rPr>
+          <w:sz w:val="20"/>
+          <w:szCs w:val="20"/>
+          <w:lang w:val="pl-PL"/>
+        </w:rPr>
+        <w:t>check</w:t>
+      </w:r>
+      <w:proofErr w:type="spellEnd"/>
+      <w:r>
+        <w:rPr>
+          <w:sz w:val="20"/>
+          <w:szCs w:val="20"/>
+          <w:lang w:val="pl-PL"/>
+        </w:rPr>
+        <w:t>-in.</w:t>
       </w:r>
     </w:p>
     <w:p>
@@ -10318,8 +11827,16 @@
               <w:rPr>
                 <w:lang w:val="pl-PL"/>
               </w:rPr>
-              <w:t>Programista backend</w:t>
+              <w:t xml:space="preserve">Programista </w:t>
             </w:r>
+            <w:proofErr w:type="spellStart"/>
+            <w:r>
+              <w:rPr>
+                <w:lang w:val="pl-PL"/>
+              </w:rPr>
+              <w:t>backend</w:t>
+            </w:r>
+            <w:proofErr w:type="spellEnd"/>
           </w:p>
         </w:tc>
         <w:tc>
@@ -10344,7 +11861,21 @@
               <w:rPr>
                 <w:lang w:val="pl-PL"/>
               </w:rPr>
-              <w:t>ASP.NET Core, baza danych, moduły domenowe, testy jednostkowe</w:t>
+              <w:t xml:space="preserve">ASP.NET </w:t>
+            </w:r>
+            <w:proofErr w:type="spellStart"/>
+            <w:r>
+              <w:rPr>
+                <w:lang w:val="pl-PL"/>
+              </w:rPr>
+              <w:t>Core</w:t>
+            </w:r>
+            <w:proofErr w:type="spellEnd"/>
+            <w:r>
+              <w:rPr>
+                <w:lang w:val="pl-PL"/>
+              </w:rPr>
+              <w:t>, baza danych, moduły domenowe, testy jednostkowe</w:t>
             </w:r>
           </w:p>
         </w:tc>
@@ -10372,8 +11903,16 @@
               <w:rPr>
                 <w:lang w:val="pl-PL"/>
               </w:rPr>
-              <w:t>Programista frontend</w:t>
+              <w:t xml:space="preserve">Programista </w:t>
             </w:r>
+            <w:proofErr w:type="spellStart"/>
+            <w:r>
+              <w:rPr>
+                <w:lang w:val="pl-PL"/>
+              </w:rPr>
+              <w:t>frontend</w:t>
+            </w:r>
+            <w:proofErr w:type="spellEnd"/>
           </w:p>
         </w:tc>
         <w:tc>
@@ -10826,7 +12365,21 @@
               <w:rPr>
                 <w:lang w:val="pl-PL"/>
               </w:rPr>
-              <w:t>Projekt BazaStrzelnicy (SQL Server), analiza ryzyka, podział zadań</w:t>
+              <w:t>Projekt </w:t>
+            </w:r>
+            <w:proofErr w:type="spellStart"/>
+            <w:r>
+              <w:rPr>
+                <w:lang w:val="pl-PL"/>
+              </w:rPr>
+              <w:t>BazaStrzelnicy</w:t>
+            </w:r>
+            <w:proofErr w:type="spellEnd"/>
+            <w:r>
+              <w:rPr>
+                <w:lang w:val="pl-PL"/>
+              </w:rPr>
+              <w:t> (SQL Server), analiza ryzyka, podział zadań</w:t>
             </w:r>
           </w:p>
         </w:tc>
@@ -10936,7 +12489,21 @@
               <w:rPr>
                 <w:lang w:val="pl-PL"/>
               </w:rPr>
-              <w:t>Aplikacja webowa (ASP.NET Core): moduły użytkowników, rezerwacji, obsługi wizyt, sesji i magazynu; panele klienta i instruktora; konfiguracja serwera</w:t>
+              <w:t xml:space="preserve">Aplikacja webowa (ASP.NET </w:t>
+            </w:r>
+            <w:proofErr w:type="spellStart"/>
+            <w:r>
+              <w:rPr>
+                <w:lang w:val="pl-PL"/>
+              </w:rPr>
+              <w:t>Core</w:t>
+            </w:r>
+            <w:proofErr w:type="spellEnd"/>
+            <w:r>
+              <w:rPr>
+                <w:lang w:val="pl-PL"/>
+              </w:rPr>
+              <w:t>): moduły użytkowników, rezerwacji, obsługi wizyt, sesji i magazynu; panele klienta i instruktora; konfiguracja serwera</w:t>
             </w:r>
           </w:p>
         </w:tc>
@@ -11046,7 +12613,63 @@
               <w:rPr>
                 <w:lang w:val="pl-PL"/>
               </w:rPr>
-              <w:t>Weryfikacja modułów backendu, frontendu i integracji (IKlient, IInstruktor)</w:t>
+              <w:t xml:space="preserve">Weryfikacja modułów </w:t>
+            </w:r>
+            <w:proofErr w:type="spellStart"/>
+            <w:r>
+              <w:rPr>
+                <w:lang w:val="pl-PL"/>
+              </w:rPr>
+              <w:t>backendu</w:t>
+            </w:r>
+            <w:proofErr w:type="spellEnd"/>
+            <w:r>
+              <w:rPr>
+                <w:lang w:val="pl-PL"/>
+              </w:rPr>
+              <w:t xml:space="preserve">, </w:t>
+            </w:r>
+            <w:proofErr w:type="spellStart"/>
+            <w:r>
+              <w:rPr>
+                <w:lang w:val="pl-PL"/>
+              </w:rPr>
+              <w:t>frontendu</w:t>
+            </w:r>
+            <w:proofErr w:type="spellEnd"/>
+            <w:r>
+              <w:rPr>
+                <w:lang w:val="pl-PL"/>
+              </w:rPr>
+              <w:t xml:space="preserve"> i integracji (</w:t>
+            </w:r>
+            <w:proofErr w:type="spellStart"/>
+            <w:r>
+              <w:rPr>
+                <w:lang w:val="pl-PL"/>
+              </w:rPr>
+              <w:t>IKlient</w:t>
+            </w:r>
+            <w:proofErr w:type="spellEnd"/>
+            <w:r>
+              <w:rPr>
+                <w:lang w:val="pl-PL"/>
+              </w:rPr>
+              <w:t>, </w:t>
+            </w:r>
+            <w:proofErr w:type="spellStart"/>
+            <w:r>
+              <w:rPr>
+                <w:lang w:val="pl-PL"/>
+              </w:rPr>
+              <w:t>IInstruktor</w:t>
+            </w:r>
+            <w:proofErr w:type="spellEnd"/>
+            <w:r>
+              <w:rPr>
+                <w:lang w:val="pl-PL"/>
+              </w:rPr>
+              <w:t>)</w:t>
             </w:r>
           </w:p>
         </w:tc>
@@ -11436,11 +13059,19 @@
         </w:rPr>
         <w:t xml:space="preserve">operacji </w:t>
       </w:r>
-      <w:r>
-        <w:rPr>
-          <w:lang w:val="pl-PL"/>
-        </w:rPr>
-        <w:t>check-in do momentu pozytywnej weryfikacji</w:t>
+      <w:proofErr w:type="spellStart"/>
+      <w:r>
+        <w:rPr>
+          <w:lang w:val="pl-PL"/>
+        </w:rPr>
+        <w:t>check</w:t>
+      </w:r>
+      <w:proofErr w:type="spellEnd"/>
+      <w:r>
+        <w:rPr>
+          <w:lang w:val="pl-PL"/>
+        </w:rPr>
+        <w:t>-in do momentu pozytywnej weryfikacji</w:t>
       </w:r>
     </w:p>
     <w:p>
@@ -11488,7 +13119,21 @@
         <w:rPr>
           <w:lang w:val="pl-PL"/>
         </w:rPr>
-        <w:t xml:space="preserve"> check-in klienta</w:t>
+        <w:t xml:space="preserve"> </w:t>
+      </w:r>
+      <w:proofErr w:type="spellStart"/>
+      <w:r>
+        <w:rPr>
+          <w:lang w:val="pl-PL"/>
+        </w:rPr>
+        <w:t>check</w:t>
+      </w:r>
+      <w:proofErr w:type="spellEnd"/>
+      <w:r>
+        <w:rPr>
+          <w:lang w:val="pl-PL"/>
+        </w:rPr>
+        <w:t>-in klienta</w:t>
       </w:r>
     </w:p>
     <w:p>
@@ -12010,7 +13655,35 @@
         <w:rPr>
           <w:lang w:val="pl-PL"/>
         </w:rPr>
-        <w:t> obowiązkowe podawanie zużycia amunicji przy check-out, powiązanie zużycia z obiektem SesjaStrzelecka, okresowe kontrole magazynowe, walidacja wprowadzanych danych</w:t>
+        <w:t xml:space="preserve"> obowiązkowe podawanie zużycia amunicji przy </w:t>
+      </w:r>
+      <w:proofErr w:type="spellStart"/>
+      <w:r>
+        <w:rPr>
+          <w:lang w:val="pl-PL"/>
+        </w:rPr>
+        <w:t>check</w:t>
+      </w:r>
+      <w:proofErr w:type="spellEnd"/>
+      <w:r>
+        <w:rPr>
+          <w:lang w:val="pl-PL"/>
+        </w:rPr>
+        <w:t>-out, powiązanie zużycia z obiektem </w:t>
+      </w:r>
+      <w:proofErr w:type="spellStart"/>
+      <w:r>
+        <w:rPr>
+          <w:lang w:val="pl-PL"/>
+        </w:rPr>
+        <w:t>SesjaStrzelecka</w:t>
+      </w:r>
+      <w:proofErr w:type="spellEnd"/>
+      <w:r>
+        <w:rPr>
+          <w:lang w:val="pl-PL"/>
+        </w:rPr>
+        <w:t>, okresowe kontrole magazynowe, walidacja wprowadzanych danych</w:t>
       </w:r>
     </w:p>
     <w:p>
@@ -12355,7 +14028,15 @@
           </w:tcPr>
           <w:p>
             <w:r>
-              <w:t>Czas (Rbg)</w:t>
+              <w:t>Czas (</w:t>
+            </w:r>
+            <w:proofErr w:type="spellStart"/>
+            <w:r>
+              <w:t>Rbg</w:t>
+            </w:r>
+            <w:proofErr w:type="spellEnd"/>
+            <w:r>
+              <w:t>)</w:t>
             </w:r>
           </w:p>
         </w:tc>
@@ -12491,7 +14172,23 @@
           </w:tcPr>
           <w:p>
             <w:r>
-              <w:t>Interfejs instruktora, weryfikacja tożsamości (PESEL), procesy Check-in oraz Check-out.</w:t>
+              <w:t xml:space="preserve">Interfejs instruktora, weryfikacja tożsamości (PESEL), procesy </w:t>
+            </w:r>
+            <w:proofErr w:type="spellStart"/>
+            <w:r>
+              <w:t>Check</w:t>
+            </w:r>
+            <w:proofErr w:type="spellEnd"/>
+            <w:r>
+              <w:t xml:space="preserve">-in oraz </w:t>
+            </w:r>
+            <w:proofErr w:type="spellStart"/>
+            <w:r>
+              <w:t>Check</w:t>
+            </w:r>
+            <w:proofErr w:type="spellEnd"/>
+            <w:r>
+              <w:t>-out.</w:t>
             </w:r>
           </w:p>
         </w:tc>
@@ -12540,7 +14237,15 @@
           </w:tcPr>
           <w:p>
             <w:r>
-              <w:t>Ewidencja i aktualizacja przebiegu egzemplarzy broni, stany magazynowe amunicji, triggery bazy danych.</w:t>
+              <w:t xml:space="preserve">Ewidencja i aktualizacja przebiegu egzemplarzy broni, stany magazynowe amunicji, </w:t>
+            </w:r>
+            <w:proofErr w:type="spellStart"/>
+            <w:r>
+              <w:t>triggery</w:t>
+            </w:r>
+            <w:proofErr w:type="spellEnd"/>
+            <w:r>
+              <w:t xml:space="preserve"> bazy danych.</w:t>
             </w:r>
           </w:p>
         </w:tc>
@@ -12589,7 +14294,15 @@
           </w:tcPr>
           <w:p>
             <w:r>
-              <w:t>Konfiguracja serwera aplikacji, wdrożenie bazy PostgreSQL, mechanizmy szyfrowania danych wrażliwych.</w:t>
+              <w:t xml:space="preserve">Konfiguracja serwera aplikacji, wdrożenie bazy </w:t>
+            </w:r>
+            <w:proofErr w:type="spellStart"/>
+            <w:r>
+              <w:t>PostgreSQL</w:t>
+            </w:r>
+            <w:proofErr w:type="spellEnd"/>
+            <w:r>
+              <w:t>, mechanizmy szyfrowania danych wrażliwych.</w:t>
             </w:r>
           </w:p>
         </w:tc>
@@ -12998,7 +14711,7 @@
 </file>
 
 <file path=word/numbering.xml><?xml version="1.0" encoding="utf-8"?>
-<w:numbering xmlns:wpc="http://schemas.microsoft.com/office/word/2010/wordprocessingCanvas" xmlns:cx="http://schemas.microsoft.com/office/drawing/2014/chartex" xmlns:cx1="http://schemas.microsoft.com/office/drawing/2015/9/8/chartex" xmlns:cx2="http://schemas.microsoft.com/office/drawing/2015/10/21/chartex" xmlns:cx3="http://schemas.microsoft.com/office/drawing/2016/5/9/chartex" xmlns:cx4="http://schemas.microsoft.com/office/drawing/2016/5/10/chartex" xmlns:cx5="http://schemas.microsoft.com/office/drawing/2016/5/11/chartex" xmlns:cx6="http://schemas.microsoft.com/office/drawing/2016/5/12/chartex" xmlns:cx7="http://schemas.microsoft.com/office/drawing/2016/5/13/chartex" xmlns:cx8="http://schemas.microsoft.com/office/drawing/2016/5/14/chartex" xmlns:mc="http://schemas.openxmlformats.org/markup-compatibility/2006" xmlns:aink="http://schemas.microsoft.com/office/drawing/2016/ink" xmlns:am3d="http://schemas.microsoft.com/office/drawing/2017/model3d" xmlns:o="urn:schemas-microsoft-com:office:office" xmlns:oel="http://schemas.microsoft.com/office/2019/extlst" xmlns:r="http://schemas.openxmlformats.org/officeDocument/2006/relationships" xmlns:m="http://schemas.openxmlformats.org/officeDocument/2006/math" xmlns:v="urn:schemas-microsoft-com:vml" xmlns:wp14="http://schemas.microsoft.com/office/word/2010/wordprocessingDrawing" xmlns:wp="http://schemas.openxmlformats.org/drawingml/2006/wordprocessingDrawing" xmlns:w10="urn:schemas-microsoft-com:office:word" xmlns:w="http://schemas.openxmlformats.org/wordprocessingml/2006/main" xmlns:w14="http://schemas.microsoft.com/office/word/2010/wordml" xmlns:w15="http://schemas.microsoft.com/office/word/2012/wordml" xmlns:w16cex="http://schemas.microsoft.com/office/word/2018/wordml/cex" xmlns:w16cid="http://schemas.microsoft.com/office/word/2016/wordml/cid" xmlns:w16="http://schemas.microsoft.com/office/word/2018/wordml" xmlns:w16du="http://schemas.microsoft.com/office/word/2023/wordml/word16du" xmlns:w16sdtdh="http://schemas.microsoft.com/office/word/2020/wordml/sdtdatahash" xmlns:w16sdtfl="http://schemas.microsoft.com/office/word/2024/wordml/sdtformatlock" xmlns:w16se="http://schemas.microsoft.com/office/word/2015/wordml/symex" xmlns:wpg="http://schemas.microsoft.com/office/word/2010/wordprocessingGroup" xmlns:wpi="http://schemas.microsoft.com/office/word/2010/wordprocessingInk" xmlns:wne="http://schemas.microsoft.com/office/word/2006/wordml" xmlns:wps="http://schemas.microsoft.com/office/word/2010/wordprocessingShape" mc:Ignorable="w14 w15 w16se w16cid w16 w16cex w16sdtdh w16sdtfl w16du wp14">
+<w:numbering xmlns:wpc="http://schemas.microsoft.com/office/word/2010/wordprocessingCanvas" xmlns:mc="http://schemas.openxmlformats.org/markup-compatibility/2006" xmlns:o="urn:schemas-microsoft-com:office:office" xmlns:r="http://schemas.openxmlformats.org/officeDocument/2006/relationships" xmlns:m="http://schemas.openxmlformats.org/officeDocument/2006/math" xmlns:v="urn:schemas-microsoft-com:vml" xmlns:wp14="http://schemas.microsoft.com/office/word/2010/wordprocessingDrawing" xmlns:wp="http://schemas.openxmlformats.org/drawingml/2006/wordprocessingDrawing" xmlns:w10="urn:schemas-microsoft-com:office:word" xmlns:w="http://schemas.openxmlformats.org/wordprocessingml/2006/main" xmlns:w14="http://schemas.microsoft.com/office/word/2010/wordml" xmlns:w15="http://schemas.microsoft.com/office/word/2012/wordml" xmlns:wpg="http://schemas.microsoft.com/office/word/2010/wordprocessingGroup" xmlns:wpi="http://schemas.microsoft.com/office/word/2010/wordprocessingInk" xmlns:wne="http://schemas.microsoft.com/office/word/2006/wordml" xmlns:wps="http://schemas.microsoft.com/office/word/2010/wordprocessingShape" mc:Ignorable="w14 w15 wp14">
   <w:abstractNum w:abstractNumId="0" w15:restartNumberingAfterBreak="0">
     <w:nsid w:val="02A64850"/>
     <w:multiLevelType w:val="multilevel"/>
@@ -19390,155 +21103,155 @@
       </w:rPr>
     </w:lvl>
   </w:abstractNum>
-  <w:num w:numId="1" w16cid:durableId="1294874061">
+  <w:num w:numId="1">
     <w:abstractNumId w:val="0"/>
   </w:num>
-  <w:num w:numId="2" w16cid:durableId="2049643592">
+  <w:num w:numId="2">
     <w:abstractNumId w:val="46"/>
   </w:num>
-  <w:num w:numId="3" w16cid:durableId="1268074232">
+  <w:num w:numId="3">
     <w:abstractNumId w:val="37"/>
   </w:num>
-  <w:num w:numId="4" w16cid:durableId="597906714">
+  <w:num w:numId="4">
     <w:abstractNumId w:val="17"/>
   </w:num>
-  <w:num w:numId="5" w16cid:durableId="2014648632">
+  <w:num w:numId="5">
     <w:abstractNumId w:val="18"/>
   </w:num>
-  <w:num w:numId="6" w16cid:durableId="726413930">
+  <w:num w:numId="6">
     <w:abstractNumId w:val="5"/>
   </w:num>
-  <w:num w:numId="7" w16cid:durableId="124473803">
+  <w:num w:numId="7">
     <w:abstractNumId w:val="28"/>
   </w:num>
-  <w:num w:numId="8" w16cid:durableId="312492535">
+  <w:num w:numId="8">
     <w:abstractNumId w:val="16"/>
   </w:num>
-  <w:num w:numId="9" w16cid:durableId="863976782">
+  <w:num w:numId="9">
     <w:abstractNumId w:val="4"/>
   </w:num>
-  <w:num w:numId="10" w16cid:durableId="442195422">
+  <w:num w:numId="10">
     <w:abstractNumId w:val="45"/>
   </w:num>
-  <w:num w:numId="11" w16cid:durableId="1776972351">
+  <w:num w:numId="11">
     <w:abstractNumId w:val="10"/>
   </w:num>
-  <w:num w:numId="12" w16cid:durableId="235167909">
+  <w:num w:numId="12">
     <w:abstractNumId w:val="8"/>
   </w:num>
-  <w:num w:numId="13" w16cid:durableId="1351443698">
+  <w:num w:numId="13">
     <w:abstractNumId w:val="12"/>
   </w:num>
-  <w:num w:numId="14" w16cid:durableId="763065300">
+  <w:num w:numId="14">
     <w:abstractNumId w:val="7"/>
   </w:num>
-  <w:num w:numId="15" w16cid:durableId="895969445">
+  <w:num w:numId="15">
     <w:abstractNumId w:val="30"/>
   </w:num>
-  <w:num w:numId="16" w16cid:durableId="705180605">
+  <w:num w:numId="16">
     <w:abstractNumId w:val="15"/>
   </w:num>
-  <w:num w:numId="17" w16cid:durableId="1744720534">
+  <w:num w:numId="17">
     <w:abstractNumId w:val="1"/>
   </w:num>
-  <w:num w:numId="18" w16cid:durableId="1247956473">
+  <w:num w:numId="18">
     <w:abstractNumId w:val="20"/>
   </w:num>
-  <w:num w:numId="19" w16cid:durableId="625814294">
+  <w:num w:numId="19">
     <w:abstractNumId w:val="27"/>
   </w:num>
-  <w:num w:numId="20" w16cid:durableId="1212964281">
+  <w:num w:numId="20">
     <w:abstractNumId w:val="25"/>
   </w:num>
-  <w:num w:numId="21" w16cid:durableId="634339861">
+  <w:num w:numId="21">
     <w:abstractNumId w:val="33"/>
   </w:num>
-  <w:num w:numId="22" w16cid:durableId="899825750">
+  <w:num w:numId="22">
     <w:abstractNumId w:val="9"/>
   </w:num>
-  <w:num w:numId="23" w16cid:durableId="329795844">
+  <w:num w:numId="23">
     <w:abstractNumId w:val="19"/>
   </w:num>
-  <w:num w:numId="24" w16cid:durableId="253441252">
+  <w:num w:numId="24">
     <w:abstractNumId w:val="3"/>
   </w:num>
-  <w:num w:numId="25" w16cid:durableId="419301944">
+  <w:num w:numId="25">
     <w:abstractNumId w:val="35"/>
   </w:num>
-  <w:num w:numId="26" w16cid:durableId="700083498">
+  <w:num w:numId="26">
     <w:abstractNumId w:val="32"/>
   </w:num>
-  <w:num w:numId="27" w16cid:durableId="1601377776">
+  <w:num w:numId="27">
     <w:abstractNumId w:val="31"/>
   </w:num>
-  <w:num w:numId="28" w16cid:durableId="738404125">
+  <w:num w:numId="28">
     <w:abstractNumId w:val="2"/>
   </w:num>
-  <w:num w:numId="29" w16cid:durableId="1373455190">
+  <w:num w:numId="29">
     <w:abstractNumId w:val="29"/>
   </w:num>
-  <w:num w:numId="30" w16cid:durableId="1868173167">
+  <w:num w:numId="30">
     <w:abstractNumId w:val="22"/>
   </w:num>
-  <w:num w:numId="31" w16cid:durableId="1846284911">
+  <w:num w:numId="31">
     <w:abstractNumId w:val="24"/>
   </w:num>
-  <w:num w:numId="32" w16cid:durableId="416288277">
+  <w:num w:numId="32">
     <w:abstractNumId w:val="38"/>
   </w:num>
-  <w:num w:numId="33" w16cid:durableId="624042789">
+  <w:num w:numId="33">
     <w:abstractNumId w:val="40"/>
   </w:num>
-  <w:num w:numId="34" w16cid:durableId="627903362">
+  <w:num w:numId="34">
     <w:abstractNumId w:val="6"/>
   </w:num>
-  <w:num w:numId="35" w16cid:durableId="1489321227">
+  <w:num w:numId="35">
     <w:abstractNumId w:val="23"/>
   </w:num>
-  <w:num w:numId="36" w16cid:durableId="503014435">
+  <w:num w:numId="36">
     <w:abstractNumId w:val="42"/>
   </w:num>
-  <w:num w:numId="37" w16cid:durableId="1022780703">
+  <w:num w:numId="37">
     <w:abstractNumId w:val="26"/>
   </w:num>
-  <w:num w:numId="38" w16cid:durableId="539393619">
+  <w:num w:numId="38">
     <w:abstractNumId w:val="39"/>
   </w:num>
-  <w:num w:numId="39" w16cid:durableId="30156968">
+  <w:num w:numId="39">
     <w:abstractNumId w:val="34"/>
   </w:num>
-  <w:num w:numId="40" w16cid:durableId="1666937038">
+  <w:num w:numId="40">
     <w:abstractNumId w:val="11"/>
   </w:num>
-  <w:num w:numId="41" w16cid:durableId="1497722300">
+  <w:num w:numId="41">
     <w:abstractNumId w:val="21"/>
   </w:num>
-  <w:num w:numId="42" w16cid:durableId="1806579168">
+  <w:num w:numId="42">
     <w:abstractNumId w:val="36"/>
   </w:num>
-  <w:num w:numId="43" w16cid:durableId="1084062682">
+  <w:num w:numId="43">
     <w:abstractNumId w:val="43"/>
   </w:num>
-  <w:num w:numId="44" w16cid:durableId="941035353">
+  <w:num w:numId="44">
     <w:abstractNumId w:val="13"/>
   </w:num>
-  <w:num w:numId="45" w16cid:durableId="794324996">
+  <w:num w:numId="45">
     <w:abstractNumId w:val="47"/>
   </w:num>
-  <w:num w:numId="46" w16cid:durableId="846823121">
+  <w:num w:numId="46">
     <w:abstractNumId w:val="41"/>
   </w:num>
-  <w:num w:numId="47" w16cid:durableId="233707924">
+  <w:num w:numId="47">
     <w:abstractNumId w:val="14"/>
   </w:num>
-  <w:num w:numId="48" w16cid:durableId="1508472367">
+  <w:num w:numId="48">
     <w:abstractNumId w:val="44"/>
   </w:num>
 </w:numbering>
 </file>
 
 <file path=word/styles.xml><?xml version="1.0" encoding="utf-8"?>
-<w:styles xmlns:mc="http://schemas.openxmlformats.org/markup-compatibility/2006" xmlns:r="http://schemas.openxmlformats.org/officeDocument/2006/relationships" xmlns:w="http://schemas.openxmlformats.org/wordprocessingml/2006/main" xmlns:w14="http://schemas.microsoft.com/office/word/2010/wordml" xmlns:w15="http://schemas.microsoft.com/office/word/2012/wordml" xmlns:w16cex="http://schemas.microsoft.com/office/word/2018/wordml/cex" xmlns:w16cid="http://schemas.microsoft.com/office/word/2016/wordml/cid" xmlns:w16="http://schemas.microsoft.com/office/word/2018/wordml" xmlns:w16du="http://schemas.microsoft.com/office/word/2023/wordml/word16du" xmlns:w16sdtdh="http://schemas.microsoft.com/office/word/2020/wordml/sdtdatahash" xmlns:w16sdtfl="http://schemas.microsoft.com/office/word/2024/wordml/sdtformatlock" xmlns:w16se="http://schemas.microsoft.com/office/word/2015/wordml/symex" mc:Ignorable="w14 w15 w16se w16cid w16 w16cex w16sdtdh w16sdtfl w16du">
+<w:styles xmlns:mc="http://schemas.openxmlformats.org/markup-compatibility/2006" xmlns:r="http://schemas.openxmlformats.org/officeDocument/2006/relationships" xmlns:w="http://schemas.openxmlformats.org/wordprocessingml/2006/main" xmlns:w14="http://schemas.microsoft.com/office/word/2010/wordml" xmlns:w15="http://schemas.microsoft.com/office/word/2012/wordml" mc:Ignorable="w14 w15">
   <w:docDefaults>
     <w:rPrDefault>
       <w:rPr>
@@ -19554,7 +21267,7 @@
       </w:pPr>
     </w:pPrDefault>
   </w:docDefaults>
-  <w:latentStyles w:defLockedState="0" w:defUIPriority="99" w:defSemiHidden="0" w:defUnhideWhenUsed="0" w:defQFormat="0" w:count="376">
+  <w:latentStyles w:defLockedState="0" w:defUIPriority="99" w:defSemiHidden="0" w:defUnhideWhenUsed="0" w:defQFormat="0" w:count="371">
     <w:lsdException w:name="Normal" w:uiPriority="0" w:qFormat="1"/>
     <w:lsdException w:name="heading 1" w:uiPriority="9" w:qFormat="1"/>
     <w:lsdException w:name="heading 2" w:semiHidden="1" w:uiPriority="9" w:unhideWhenUsed="1" w:qFormat="1"/>
@@ -19926,11 +21639,6 @@
     <w:lsdException w:name="List Table 5 Dark Accent 6" w:uiPriority="50"/>
     <w:lsdException w:name="List Table 6 Colorful Accent 6" w:uiPriority="51"/>
     <w:lsdException w:name="List Table 7 Colorful Accent 6" w:uiPriority="52"/>
-    <w:lsdException w:name="Mention" w:semiHidden="1" w:unhideWhenUsed="1"/>
-    <w:lsdException w:name="Smart Hyperlink" w:semiHidden="1" w:unhideWhenUsed="1"/>
-    <w:lsdException w:name="Hashtag" w:semiHidden="1" w:unhideWhenUsed="1"/>
-    <w:lsdException w:name="Unresolved Mention" w:semiHidden="1" w:unhideWhenUsed="1"/>
-    <w:lsdException w:name="Smart Link" w:semiHidden="1" w:unhideWhenUsed="1"/>
   </w:latentStyles>
   <w:style w:type="paragraph" w:default="1" w:styleId="Normalny">
     <w:name w:val="Normal"/>
@@ -20297,7 +22005,7 @@
 </file>
 
 <file path=word/glossary/document.xml><?xml version="1.0" encoding="utf-8"?>
-<w:glossaryDocument xmlns:wpc="http://schemas.microsoft.com/office/word/2010/wordprocessingCanvas" xmlns:cx="http://schemas.microsoft.com/office/drawing/2014/chartex" xmlns:cx1="http://schemas.microsoft.com/office/drawing/2015/9/8/chartex" xmlns:cx2="http://schemas.microsoft.com/office/drawing/2015/10/21/chartex" xmlns:cx3="http://schemas.microsoft.com/office/drawing/2016/5/9/chartex" xmlns:cx4="http://schemas.microsoft.com/office/drawing/2016/5/10/chartex" xmlns:cx5="http://schemas.microsoft.com/office/drawing/2016/5/11/chartex" xmlns:cx6="http://schemas.microsoft.com/office/drawing/2016/5/12/chartex" xmlns:cx7="http://schemas.microsoft.com/office/drawing/2016/5/13/chartex" xmlns:cx8="http://schemas.microsoft.com/office/drawing/2016/5/14/chartex" xmlns:mc="http://schemas.openxmlformats.org/markup-compatibility/2006" xmlns:aink="http://schemas.microsoft.com/office/drawing/2016/ink" xmlns:am3d="http://schemas.microsoft.com/office/drawing/2017/model3d" xmlns:o="urn:schemas-microsoft-com:office:office" xmlns:oel="http://schemas.microsoft.com/office/2019/extlst" xmlns:r="http://schemas.openxmlformats.org/officeDocument/2006/relationships" xmlns:m="http://schemas.openxmlformats.org/officeDocument/2006/math" xmlns:v="urn:schemas-microsoft-com:vml" xmlns:wp14="http://schemas.microsoft.com/office/word/2010/wordprocessingDrawing" xmlns:wp="http://schemas.openxmlformats.org/drawingml/2006/wordprocessingDrawing" xmlns:w10="urn:schemas-microsoft-com:office:word" xmlns:w="http://schemas.openxmlformats.org/wordprocessingml/2006/main" xmlns:w14="http://schemas.microsoft.com/office/word/2010/wordml" xmlns:w15="http://schemas.microsoft.com/office/word/2012/wordml" xmlns:w16cex="http://schemas.microsoft.com/office/word/2018/wordml/cex" xmlns:w16cid="http://schemas.microsoft.com/office/word/2016/wordml/cid" xmlns:w16="http://schemas.microsoft.com/office/word/2018/wordml" xmlns:w16du="http://schemas.microsoft.com/office/word/2023/wordml/word16du" xmlns:w16sdtdh="http://schemas.microsoft.com/office/word/2020/wordml/sdtdatahash" xmlns:w16sdtfl="http://schemas.microsoft.com/office/word/2024/wordml/sdtformatlock" xmlns:w16se="http://schemas.microsoft.com/office/word/2015/wordml/symex" xmlns:wpg="http://schemas.microsoft.com/office/word/2010/wordprocessingGroup" xmlns:wpi="http://schemas.microsoft.com/office/word/2010/wordprocessingInk" xmlns:wne="http://schemas.microsoft.com/office/word/2006/wordml" xmlns:wps="http://schemas.microsoft.com/office/word/2010/wordprocessingShape" mc:Ignorable="w14 w15 w16se w16cid w16 w16cex w16sdtdh w16sdtfl w16du wp14">
+<w:glossaryDocument xmlns:wpc="http://schemas.microsoft.com/office/word/2010/wordprocessingCanvas" xmlns:mc="http://schemas.openxmlformats.org/markup-compatibility/2006" xmlns:o="urn:schemas-microsoft-com:office:office" xmlns:r="http://schemas.openxmlformats.org/officeDocument/2006/relationships" xmlns:m="http://schemas.openxmlformats.org/officeDocument/2006/math" xmlns:v="urn:schemas-microsoft-com:vml" xmlns:wp14="http://schemas.microsoft.com/office/word/2010/wordprocessingDrawing" xmlns:wp="http://schemas.openxmlformats.org/drawingml/2006/wordprocessingDrawing" xmlns:w10="urn:schemas-microsoft-com:office:word" xmlns:w="http://schemas.openxmlformats.org/wordprocessingml/2006/main" xmlns:w14="http://schemas.microsoft.com/office/word/2010/wordml" xmlns:w15="http://schemas.microsoft.com/office/word/2012/wordml" xmlns:wpg="http://schemas.microsoft.com/office/word/2010/wordprocessingGroup" xmlns:wpi="http://schemas.microsoft.com/office/word/2010/wordprocessingInk" xmlns:wne="http://schemas.microsoft.com/office/word/2006/wordml" xmlns:wps="http://schemas.microsoft.com/office/word/2010/wordprocessingShape" mc:Ignorable="w14 w15 wp14">
   <w:docParts>
     <w:docPart>
       <w:docPartPr>
@@ -20397,10 +22105,10 @@
 </file>
 
 <file path=word/glossary/fontTable.xml><?xml version="1.0" encoding="utf-8"?>
-<w:fonts xmlns:mc="http://schemas.openxmlformats.org/markup-compatibility/2006" xmlns:r="http://schemas.openxmlformats.org/officeDocument/2006/relationships" xmlns:w="http://schemas.openxmlformats.org/wordprocessingml/2006/main" xmlns:w14="http://schemas.microsoft.com/office/word/2010/wordml" xmlns:w15="http://schemas.microsoft.com/office/word/2012/wordml" xmlns:w16cex="http://schemas.microsoft.com/office/word/2018/wordml/cex" xmlns:w16cid="http://schemas.microsoft.com/office/word/2016/wordml/cid" xmlns:w16="http://schemas.microsoft.com/office/word/2018/wordml" xmlns:w16du="http://schemas.microsoft.com/office/word/2023/wordml/word16du" xmlns:w16sdtdh="http://schemas.microsoft.com/office/word/2020/wordml/sdtdatahash" xmlns:w16sdtfl="http://schemas.microsoft.com/office/word/2024/wordml/sdtformatlock" xmlns:w16se="http://schemas.microsoft.com/office/word/2015/wordml/symex" mc:Ignorable="w14 w15 w16se w16cid w16 w16cex w16sdtdh w16sdtfl w16du">
+<w:fonts xmlns:mc="http://schemas.openxmlformats.org/markup-compatibility/2006" xmlns:r="http://schemas.openxmlformats.org/officeDocument/2006/relationships" xmlns:w="http://schemas.openxmlformats.org/wordprocessingml/2006/main" xmlns:w14="http://schemas.microsoft.com/office/word/2010/wordml" xmlns:w15="http://schemas.microsoft.com/office/word/2012/wordml" mc:Ignorable="w14 w15">
   <w:font w:name="Times New Roman">
     <w:panose1 w:val="02020603050405020304"/>
-    <w:charset w:val="00"/>
+    <w:charset w:val="EE"/>
     <w:family w:val="roman"/>
     <w:pitch w:val="variable"/>
     <w:sig w:usb0="E0002EFF" w:usb1="C000785B" w:usb2="00000009" w:usb3="00000000" w:csb0="000001FF" w:csb1="00000000"/>
@@ -20414,7 +22122,7 @@
   </w:font>
   <w:font w:name="Courier New">
     <w:panose1 w:val="02070309020205020404"/>
-    <w:charset w:val="00"/>
+    <w:charset w:val="EE"/>
     <w:family w:val="modern"/>
     <w:pitch w:val="fixed"/>
     <w:sig w:usb0="E0002EFF" w:usb1="C0007843" w:usb2="00000009" w:usb3="00000000" w:csb0="000001FF" w:csb1="00000000"/>
@@ -20428,7 +22136,7 @@
   </w:font>
   <w:font w:name="Arial">
     <w:panose1 w:val="020B0604020202020204"/>
-    <w:charset w:val="00"/>
+    <w:charset w:val="EE"/>
     <w:family w:val="swiss"/>
     <w:pitch w:val="variable"/>
     <w:sig w:usb0="E0002EFF" w:usb1="C000785B" w:usb2="00000009" w:usb3="00000000" w:csb0="000001FF" w:csb1="00000000"/>
@@ -20454,7 +22162,7 @@
   </w:font>
   <w:font w:name="Segoe UI">
     <w:panose1 w:val="020B0502040204020203"/>
-    <w:charset w:val="00"/>
+    <w:charset w:val="EE"/>
     <w:family w:val="swiss"/>
     <w:pitch w:val="variable"/>
     <w:sig w:usb0="E4002EFF" w:usb1="C000E47F" w:usb2="00000009" w:usb3="00000000" w:csb0="000001FF" w:csb1="00000000"/>
@@ -20464,25 +22172,20 @@
     <w:charset w:val="EE"/>
     <w:family w:val="swiss"/>
     <w:pitch w:val="variable"/>
-    <w:sig w:usb0="E4002EFF" w:usb1="C200247B" w:usb2="00000009" w:usb3="00000000" w:csb0="000001FF" w:csb1="00000000"/>
+    <w:sig w:usb0="E4002EFF" w:usb1="C000247B" w:usb2="00000009" w:usb3="00000000" w:csb0="000001FF" w:csb1="00000000"/>
   </w:font>
-  <w:font w:name="Aptos">
-    <w:charset w:val="00"/>
+  <w:font w:name="Calibri Light">
+    <w:panose1 w:val="020F0302020204030204"/>
+    <w:charset w:val="EE"/>
     <w:family w:val="swiss"/>
     <w:pitch w:val="variable"/>
-    <w:sig w:usb0="20000287" w:usb1="00000003" w:usb2="00000000" w:usb3="00000000" w:csb0="0000019F" w:csb1="00000000"/>
-  </w:font>
-  <w:font w:name="Aptos Display">
-    <w:charset w:val="00"/>
-    <w:family w:val="swiss"/>
-    <w:pitch w:val="variable"/>
-    <w:sig w:usb0="20000287" w:usb1="00000003" w:usb2="00000000" w:usb3="00000000" w:csb0="0000019F" w:csb1="00000000"/>
+    <w:sig w:usb0="E4002EFF" w:usb1="C000247B" w:usb2="00000009" w:usb3="00000000" w:csb0="000001FF" w:csb1="00000000"/>
   </w:font>
 </w:fonts>
 </file>
 
 <file path=word/glossary/settings.xml><?xml version="1.0" encoding="utf-8"?>
-<w:settings xmlns:mc="http://schemas.openxmlformats.org/markup-compatibility/2006" xmlns:o="urn:schemas-microsoft-com:office:office" xmlns:r="http://schemas.openxmlformats.org/officeDocument/2006/relationships" xmlns:m="http://schemas.openxmlformats.org/officeDocument/2006/math" xmlns:v="urn:schemas-microsoft-com:vml" xmlns:w10="urn:schemas-microsoft-com:office:word" xmlns:w="http://schemas.openxmlformats.org/wordprocessingml/2006/main" xmlns:w14="http://schemas.microsoft.com/office/word/2010/wordml" xmlns:w15="http://schemas.microsoft.com/office/word/2012/wordml" xmlns:w16cex="http://schemas.microsoft.com/office/word/2018/wordml/cex" xmlns:w16cid="http://schemas.microsoft.com/office/word/2016/wordml/cid" xmlns:w16="http://schemas.microsoft.com/office/word/2018/wordml" xmlns:w16du="http://schemas.microsoft.com/office/word/2023/wordml/word16du" xmlns:w16sdtdh="http://schemas.microsoft.com/office/word/2020/wordml/sdtdatahash" xmlns:w16sdtfl="http://schemas.microsoft.com/office/word/2024/wordml/sdtformatlock" xmlns:w16se="http://schemas.microsoft.com/office/word/2015/wordml/symex" xmlns:sl="http://schemas.openxmlformats.org/schemaLibrary/2006/main" mc:Ignorable="w14 w15 w16se w16cid w16 w16cex w16sdtdh w16sdtfl w16du">
+<w:settings xmlns:mc="http://schemas.openxmlformats.org/markup-compatibility/2006" xmlns:o="urn:schemas-microsoft-com:office:office" xmlns:r="http://schemas.openxmlformats.org/officeDocument/2006/relationships" xmlns:m="http://schemas.openxmlformats.org/officeDocument/2006/math" xmlns:v="urn:schemas-microsoft-com:vml" xmlns:w10="urn:schemas-microsoft-com:office:word" xmlns:w="http://schemas.openxmlformats.org/wordprocessingml/2006/main" xmlns:w14="http://schemas.microsoft.com/office/word/2010/wordml" xmlns:w15="http://schemas.microsoft.com/office/word/2012/wordml" xmlns:sl="http://schemas.openxmlformats.org/schemaLibrary/2006/main" mc:Ignorable="w14 w15">
   <w:view w:val="normal"/>
   <w:defaultTabStop w:val="708"/>
   <w:hyphenationZone w:val="425"/>
@@ -20494,11 +22197,11 @@
     <w:compatSetting w:name="enableOpenTypeFeatures" w:uri="http://schemas.microsoft.com/office/word" w:val="1"/>
     <w:compatSetting w:name="doNotFlipMirrorIndents" w:uri="http://schemas.microsoft.com/office/word" w:val="1"/>
     <w:compatSetting w:name="differentiateMultirowTableHeaders" w:uri="http://schemas.microsoft.com/office/word" w:val="1"/>
-    <w:compatSetting w:name="useWord2013TrackBottomHyphenation" w:uri="http://schemas.microsoft.com/office/word" w:val="1"/>
   </w:compat>
   <w:rsids>
     <w:rsidRoot w:val="00353EEB"/>
     <w:rsid w:val="000675BB"/>
+    <w:rsid w:val="000F2C3B"/>
     <w:rsid w:val="00112E9E"/>
     <w:rsid w:val="001B29CD"/>
     <w:rsid w:val="00320AE6"/>
@@ -20540,7 +22243,7 @@
 </file>
 
 <file path=word/glossary/styles.xml><?xml version="1.0" encoding="utf-8"?>
-<w:styles xmlns:mc="http://schemas.openxmlformats.org/markup-compatibility/2006" xmlns:r="http://schemas.openxmlformats.org/officeDocument/2006/relationships" xmlns:w="http://schemas.openxmlformats.org/wordprocessingml/2006/main" xmlns:w14="http://schemas.microsoft.com/office/word/2010/wordml" xmlns:w15="http://schemas.microsoft.com/office/word/2012/wordml" xmlns:w16cex="http://schemas.microsoft.com/office/word/2018/wordml/cex" xmlns:w16cid="http://schemas.microsoft.com/office/word/2016/wordml/cid" xmlns:w16="http://schemas.microsoft.com/office/word/2018/wordml" xmlns:w16du="http://schemas.microsoft.com/office/word/2023/wordml/word16du" xmlns:w16sdtdh="http://schemas.microsoft.com/office/word/2020/wordml/sdtdatahash" xmlns:w16sdtfl="http://schemas.microsoft.com/office/word/2024/wordml/sdtformatlock" xmlns:w16se="http://schemas.microsoft.com/office/word/2015/wordml/symex" mc:Ignorable="w14 w15 w16se w16cid w16 w16cex w16sdtdh w16sdtfl w16du">
+<w:styles xmlns:mc="http://schemas.openxmlformats.org/markup-compatibility/2006" xmlns:r="http://schemas.openxmlformats.org/officeDocument/2006/relationships" xmlns:w="http://schemas.openxmlformats.org/wordprocessingml/2006/main" xmlns:w14="http://schemas.microsoft.com/office/word/2010/wordml" xmlns:w15="http://schemas.microsoft.com/office/word/2012/wordml" mc:Ignorable="w14 w15">
   <w:docDefaults>
     <w:rPrDefault>
       <w:rPr>
@@ -20558,7 +22261,7 @@
       </w:pPr>
     </w:pPrDefault>
   </w:docDefaults>
-  <w:latentStyles w:defLockedState="0" w:defUIPriority="99" w:defSemiHidden="0" w:defUnhideWhenUsed="0" w:defQFormat="0" w:count="376">
+  <w:latentStyles w:defLockedState="0" w:defUIPriority="99" w:defSemiHidden="0" w:defUnhideWhenUsed="0" w:defQFormat="0" w:count="371">
     <w:lsdException w:name="Normal" w:uiPriority="0" w:qFormat="1"/>
     <w:lsdException w:name="heading 1" w:uiPriority="9" w:qFormat="1"/>
     <w:lsdException w:name="heading 2" w:semiHidden="1" w:uiPriority="9" w:unhideWhenUsed="1" w:qFormat="1"/>
@@ -20930,11 +22633,6 @@
     <w:lsdException w:name="List Table 5 Dark Accent 6" w:uiPriority="50"/>
     <w:lsdException w:name="List Table 6 Colorful Accent 6" w:uiPriority="51"/>
     <w:lsdException w:name="List Table 7 Colorful Accent 6" w:uiPriority="52"/>
-    <w:lsdException w:name="Mention" w:semiHidden="1" w:unhideWhenUsed="1"/>
-    <w:lsdException w:name="Smart Hyperlink" w:semiHidden="1" w:unhideWhenUsed="1"/>
-    <w:lsdException w:name="Hashtag" w:semiHidden="1" w:unhideWhenUsed="1"/>
-    <w:lsdException w:name="Unresolved Mention" w:semiHidden="1" w:unhideWhenUsed="1"/>
-    <w:lsdException w:name="Smart Link" w:semiHidden="1" w:unhideWhenUsed="1"/>
   </w:latentStyles>
   <w:style w:type="paragraph" w:default="1" w:styleId="Normalny">
     <w:name w:val="Normal"/>
@@ -21023,7 +22721,7 @@
 </file>
 
 <file path=word/glossary/webSettings.xml><?xml version="1.0" encoding="utf-8"?>
-<w:webSettings xmlns:mc="http://schemas.openxmlformats.org/markup-compatibility/2006" xmlns:r="http://schemas.openxmlformats.org/officeDocument/2006/relationships" xmlns:w="http://schemas.openxmlformats.org/wordprocessingml/2006/main" xmlns:w14="http://schemas.microsoft.com/office/word/2010/wordml" xmlns:w15="http://schemas.microsoft.com/office/word/2012/wordml" xmlns:w16cex="http://schemas.microsoft.com/office/word/2018/wordml/cex" xmlns:w16cid="http://schemas.microsoft.com/office/word/2016/wordml/cid" xmlns:w16="http://schemas.microsoft.com/office/word/2018/wordml" xmlns:w16du="http://schemas.microsoft.com/office/word/2023/wordml/word16du" xmlns:w16sdtdh="http://schemas.microsoft.com/office/word/2020/wordml/sdtdatahash" xmlns:w16sdtfl="http://schemas.microsoft.com/office/word/2024/wordml/sdtformatlock" xmlns:w16se="http://schemas.microsoft.com/office/word/2015/wordml/symex" mc:Ignorable="w14 w15 w16se w16cid w16 w16cex w16sdtdh w16sdtfl w16du">
+<w:webSettings xmlns:mc="http://schemas.openxmlformats.org/markup-compatibility/2006" xmlns:r="http://schemas.openxmlformats.org/officeDocument/2006/relationships" xmlns:w="http://schemas.openxmlformats.org/wordprocessingml/2006/main" xmlns:w14="http://schemas.microsoft.com/office/word/2010/wordml" xmlns:w15="http://schemas.microsoft.com/office/word/2012/wordml" mc:Ignorable="w14 w15">
   <w:optimizeForBrowser/>
   <w:allowPNG/>
 </w:webSettings>
@@ -21354,7 +23052,7 @@
 </file>
 
 <file path=customXml/itemProps1.xml><?xml version="1.0" encoding="utf-8"?>
-<ds:datastoreItem xmlns:ds="http://schemas.openxmlformats.org/officeDocument/2006/customXml" ds:itemID="{7105315F-FE39-4085-9237-32D32AB00E98}">
+<ds:datastoreItem xmlns:ds="http://schemas.openxmlformats.org/officeDocument/2006/customXml" ds:itemID="{018532E0-F853-414C-A487-BC7210264F8C}">
   <ds:schemaRefs>
     <ds:schemaRef ds:uri="http://schemas.openxmlformats.org/officeDocument/2006/bibliography"/>
   </ds:schemaRefs>

</xml_diff>